<commit_message>
Application du style aux titres principaux
</commit_message>
<xml_diff>
--- a/doc.docx
+++ b/doc.docx
@@ -4120,6 +4120,7 @@
     </w:p>
     <w:p ns2:paraId="37F4003F" ns2:textId="77777777">
       <w:pPr>
+        <w:pStyle w:val="Titre1"/>
         <w:widowControl/>
         <w:spacing w:before="0" w:after="120" w:line="360" w:lineRule="auto"/>
         <w:ind w:firstLine="0"/>
@@ -4250,6 +4251,7 @@
     </w:p>
     <w:p ns2:paraId="6986AF92" ns2:textId="125ED206">
       <w:pPr>
+        <w:pStyle w:val="Titre1"/>
         <w:widowControl/>
         <w:spacing w:before="0" w:after="120" w:line="360" w:lineRule="auto"/>
         <w:ind w:firstLine="0"/>
@@ -5982,6 +5984,7 @@
     </w:p>
     <w:p ns2:paraId="25A8E66F" ns2:textId="5F4DC5D9">
       <w:pPr>
+        <w:pStyle w:val="Titre1"/>
         <w:tabs>
           <w:tab w:val="left" w:pos="6190"/>
         </w:tabs>
@@ -6778,6 +6781,7 @@
     </w:p>
     <w:p ns2:paraId="0231E7EB" ns2:textId="77777777">
       <w:pPr>
+        <w:pStyle w:val="Titre1"/>
         <w:tabs>
           <w:tab w:val="left" w:pos="6190"/>
         </w:tabs>
@@ -8301,6 +8305,7 @@
     </w:p>
     <w:p ns2:paraId="328F7B1B" ns2:textId="21D4B4F6">
       <w:pPr>
+        <w:pStyle w:val="Titre1"/>
         <w:tabs>
           <w:tab w:val="left" w:pos="6190"/>
         </w:tabs>
@@ -9136,6 +9141,7 @@
     </w:p>
     <w:p ns2:paraId="5AA26368" ns2:textId="41DC1C3C">
       <w:pPr>
+        <w:pStyle w:val="Titre1"/>
         <w:tabs>
           <w:tab w:val="left" w:pos="6190"/>
         </w:tabs>
@@ -9720,6 +9726,7 @@
     </w:p>
     <w:p ns2:paraId="5549129A" ns2:textId="443B5869">
       <w:pPr>
+        <w:pStyle w:val="Titre1"/>
         <w:tabs>
           <w:tab w:val="left" w:pos="6190"/>
         </w:tabs>
@@ -10151,6 +10158,7 @@
     </w:p>
     <w:p ns2:paraId="6F5B8D70" ns2:textId="69599A3F">
       <w:pPr>
+        <w:pStyle w:val="Titre1"/>
         <w:tabs>
           <w:tab w:val="left" w:pos="6190"/>
         </w:tabs>
@@ -14267,6 +14275,7 @@
     </w:p>
     <w:p ns2:paraId="3ED802C3" ns2:textId="0BF443B7">
       <w:pPr>
+        <w:pStyle w:val="Titre1"/>
         <w:tabs>
           <w:tab w:val="left" w:pos="6190"/>
         </w:tabs>
@@ -15590,6 +15599,7 @@
     </w:p>
     <w:p ns2:paraId="31356FEE" ns2:textId="77777777">
       <w:pPr>
+        <w:pStyle w:val="Titre1"/>
         <w:widowControl/>
         <w:spacing w:before="0" w:after="120" w:line="360" w:lineRule="auto"/>
         <w:ind w:firstLine="0"/>
@@ -25786,6 +25796,7 @@
     </w:p>
     <w:p ns2:paraId="1D0450D0" ns2:textId="77777777">
       <w:pPr>
+        <w:pStyle w:val="Titre1"/>
         <w:widowControl/>
         <w:spacing w:before="0" w:after="120" w:line="360" w:lineRule="auto"/>
         <w:ind w:firstLine="0"/>
@@ -34927,6 +34938,7 @@
     </w:p>
     <w:p ns2:paraId="7D66E0D8" ns2:textId="77777777">
       <w:pPr>
+        <w:pStyle w:val="Titre1"/>
         <w:widowControl/>
         <w:spacing w:before="0" w:after="120" w:line="360" w:lineRule="auto"/>
         <w:ind w:firstLine="0"/>
@@ -46453,6 +46465,7 @@
     </w:p>
     <w:p ns2:paraId="3F095DD8" ns2:textId="77777777">
       <w:pPr>
+        <w:pStyle w:val="Titre1"/>
         <w:widowControl/>
         <w:spacing w:before="0" w:after="120" w:line="360" w:lineRule="auto"/>
         <w:ind w:firstLine="0"/>
@@ -47166,7 +47179,7 @@
     </w:p>
     <w:p ns2:paraId="2A9A9CCC" ns2:textId="77777777">
       <w:pPr>
-        <w:pStyle w:val="MemoireCorps"/>
+        <w:pStyle w:val="Titre1"/>
         <w:rPr>
           <w:b/>
           <w:bCs/>
@@ -48487,6 +48500,7 @@
     </w:p>
     <w:p ns2:paraId="050DF90C" ns2:textId="77777777">
       <w:pPr>
+        <w:pStyle w:val="Titre1"/>
         <w:tabs>
           <w:tab w:val="left" w:pos="6190"/>
         </w:tabs>

</xml_diff>

<commit_message>
Application du style aux titres de sections
</commit_message>
<xml_diff>
--- a/doc.docx
+++ b/doc.docx
@@ -16048,6 +16048,7 @@
     </w:p>
     <w:p ns2:paraId="052381BA" ns2:textId="77777777">
       <w:pPr>
+        <w:pStyle w:val="Titre2"/>
         <w:autoSpaceDE w:val="0"/>
         <w:autoSpaceDN w:val="0"/>
         <w:adjustRightInd w:val="0"/>
@@ -24322,6 +24323,7 @@
     </w:p>
     <w:p ns2:paraId="1E7E41E6" ns2:textId="77777777">
       <w:pPr>
+        <w:pStyle w:val="Titre2"/>
         <w:tabs>
           <w:tab w:val="left" w:pos="6190"/>
           <w:tab w:val="left" w:pos="7230"/>
@@ -26152,6 +26154,7 @@
     </w:p>
     <w:p ns2:paraId="499D0EE2" ns2:textId="77777777">
       <w:pPr>
+        <w:pStyle w:val="Titre2"/>
         <w:tabs>
           <w:tab w:val="left" w:pos="6190"/>
           <w:tab w:val="left" w:pos="7230"/>
@@ -31376,6 +31379,7 @@
     </w:p>
     <w:p ns2:paraId="2A4CB84F" ns2:textId="68626389">
       <w:pPr>
+        <w:pStyle w:val="Titre2"/>
         <w:tabs>
           <w:tab w:val="left" w:pos="6190"/>
           <w:tab w:val="left" w:pos="7230"/>
@@ -35354,6 +35358,7 @@
     </w:p>
     <w:p ns2:paraId="5083DD0C" ns2:textId="62E7F882">
       <w:pPr>
+        <w:pStyle w:val="Titre2"/>
         <w:widowControl/>
         <w:spacing w:before="0" w:after="120" w:line="360" w:lineRule="auto"/>
         <w:ind w:firstLine="0"/>
@@ -44712,6 +44717,7 @@
     </w:p>
     <w:p ns2:paraId="0282585B" ns2:textId="77777777">
       <w:pPr>
+        <w:pStyle w:val="Titre2"/>
         <w:widowControl/>
         <w:spacing w:before="0" w:after="120" w:line="360" w:lineRule="auto"/>
         <w:ind w:firstLine="0"/>
@@ -48734,6 +48740,7 @@
     </w:p>
     <w:p ns2:paraId="008396BA" ns2:textId="77777777">
       <w:pPr>
+        <w:pStyle w:val="Titre2"/>
         <w:widowControl/>
         <w:spacing w:before="0" w:after="120" w:line="360" w:lineRule="auto"/>
         <w:ind w:firstLine="0"/>

</xml_diff>

<commit_message>
Application du style aux sous-sections
</commit_message>
<xml_diff>
--- a/doc.docx
+++ b/doc.docx
@@ -16212,7 +16212,7 @@
     </w:p>
     <w:p ns2:paraId="34FEB747" ns2:textId="77777777">
       <w:pPr>
-        <w:pStyle w:val="MemoireCorps"/>
+        <w:pStyle w:val="Titre3"/>
         <w:tabs>
           <w:tab w:val="left" w:pos="6190"/>
         </w:tabs>
@@ -18012,7 +18012,7 @@
     </w:p>
     <w:p ns2:paraId="3579BC9C" ns2:textId="77777777">
       <w:pPr>
-        <w:pStyle w:val="MemoireCorps"/>
+        <w:pStyle w:val="Titre3"/>
         <w:tabs>
           <w:tab w:val="left" w:pos="6190"/>
           <w:tab w:val="left" w:pos="7230"/>
@@ -24372,7 +24372,7 @@
     </w:p>
     <w:p ns2:paraId="22BEE06C" ns2:textId="77777777">
       <w:pPr>
-        <w:pStyle w:val="MemoireCorps"/>
+        <w:pStyle w:val="Titre3"/>
         <w:tabs>
           <w:tab w:val="left" w:pos="6190"/>
           <w:tab w:val="left" w:pos="7230"/>
@@ -25428,7 +25428,7 @@
     </w:p>
     <w:p ns2:paraId="4305BBFC" ns2:textId="77777777">
       <w:pPr>
-        <w:pStyle w:val="MemoireCorps"/>
+        <w:pStyle w:val="Titre3"/>
         <w:tabs>
           <w:tab w:val="left" w:pos="6190"/>
           <w:tab w:val="left" w:pos="7230"/>
@@ -26203,7 +26203,7 @@
     </w:p>
     <w:p ns2:paraId="1BE26942" ns2:textId="77777777">
       <w:pPr>
-        <w:pStyle w:val="MemoireCorps"/>
+        <w:pStyle w:val="Titre3"/>
         <w:tabs>
           <w:tab w:val="left" w:pos="6190"/>
           <w:tab w:val="left" w:pos="7230"/>
@@ -30293,7 +30293,7 @@
     </w:p>
     <w:p ns2:paraId="6F744744" ns2:textId="77777777">
       <w:pPr>
-        <w:pStyle w:val="MemoireCorps"/>
+        <w:pStyle w:val="Titre3"/>
         <w:tabs>
           <w:tab w:val="left" w:pos="6190"/>
           <w:tab w:val="left" w:pos="7230"/>
@@ -31429,7 +31429,7 @@
     </w:p>
     <w:p ns2:paraId="66A52908" ns2:textId="77777777">
       <w:pPr>
-        <w:pStyle w:val="MemoireCorps"/>
+        <w:pStyle w:val="Titre3"/>
         <w:tabs>
           <w:tab w:val="left" w:pos="6190"/>
           <w:tab w:val="left" w:pos="7230"/>
@@ -33475,7 +33475,7 @@
     </w:p>
     <w:p ns2:paraId="6A50F9A4" ns2:textId="77777777">
       <w:pPr>
-        <w:pStyle w:val="MemoireCorps"/>
+        <w:pStyle w:val="Titre3"/>
         <w:tabs>
           <w:tab w:val="left" w:pos="6190"/>
         </w:tabs>
@@ -37236,7 +37236,7 @@
     </w:p>
     <w:p ns2:paraId="1004517B" ns2:textId="4B3AE68B">
       <w:pPr>
-        <w:pStyle w:val="MemoireCorps"/>
+        <w:pStyle w:val="Titre3"/>
         <w:rPr>
           <w:color w:val="auto"/>
         </w:rPr>
@@ -43901,7 +43901,7 @@
     </w:p>
     <w:p ns2:paraId="5E8E8052" ns2:textId="77777777">
       <w:pPr>
-        <w:pStyle w:val="MemoireCorps"/>
+        <w:pStyle w:val="Titre3"/>
         <w:rPr>
           <w:color w:val="auto"/>
         </w:rPr>
@@ -44779,7 +44779,7 @@
     </w:p>
     <w:p ns2:paraId="6D597027" ns2:textId="77777777">
       <w:pPr>
-        <w:pStyle w:val="MemoireCorps"/>
+        <w:pStyle w:val="Titre3"/>
         <w:rPr>
           <w:color w:val="auto"/>
         </w:rPr>
@@ -45273,7 +45273,7 @@
     </w:p>
     <w:p ns2:paraId="5FEBCE62" ns2:textId="3454B12E">
       <w:pPr>
-        <w:pStyle w:val="MemoireCorps"/>
+        <w:pStyle w:val="Titre3"/>
         <w:rPr>
           <w:color w:val="auto"/>
         </w:rPr>

</xml_diff>

<commit_message>
Activation de la numérotation automatique des titres
</commit_message>
<xml_diff>
--- a/doc.docx
+++ b/doc.docx
@@ -15601,6 +15601,10 @@
       <w:pPr>
         <w:pStyle w:val="Titre1"/>
         <w:widowControl/>
+        <w:numPr>
+          <w:ilvl w:val="0"/>
+          <w:numId w:val="59"/>
+        </w:numPr>
         <w:spacing w:before="0" w:after="120" w:line="360" w:lineRule="auto"/>
         <w:ind w:firstLine="0"/>
         <w:jc w:val="both"/>
@@ -16053,6 +16057,10 @@
         <w:autoSpaceDN w:val="0"/>
         <w:adjustRightInd w:val="0"/>
         <w:widowControl/>
+        <w:numPr>
+          <w:ilvl w:val="1"/>
+          <w:numId w:val="59"/>
+        </w:numPr>
         <w:spacing w:before="0" w:after="120" w:line="360" w:lineRule="auto"/>
         <w:ind w:firstLine="0"/>
         <w:jc w:val="both"/>
@@ -16213,6 +16221,10 @@
     <w:p ns2:paraId="34FEB747" ns2:textId="77777777">
       <w:pPr>
         <w:pStyle w:val="Titre3"/>
+        <w:numPr>
+          <w:ilvl w:val="2"/>
+          <w:numId w:val="59"/>
+        </w:numPr>
         <w:tabs>
           <w:tab w:val="left" w:pos="6190"/>
         </w:tabs>
@@ -18013,6 +18025,10 @@
     <w:p ns2:paraId="3579BC9C" ns2:textId="77777777">
       <w:pPr>
         <w:pStyle w:val="Titre3"/>
+        <w:numPr>
+          <w:ilvl w:val="2"/>
+          <w:numId w:val="59"/>
+        </w:numPr>
         <w:tabs>
           <w:tab w:val="left" w:pos="6190"/>
           <w:tab w:val="left" w:pos="7230"/>
@@ -24324,6 +24340,10 @@
     <w:p ns2:paraId="1E7E41E6" ns2:textId="77777777">
       <w:pPr>
         <w:pStyle w:val="Titre2"/>
+        <w:numPr>
+          <w:ilvl w:val="1"/>
+          <w:numId w:val="59"/>
+        </w:numPr>
         <w:tabs>
           <w:tab w:val="left" w:pos="6190"/>
           <w:tab w:val="left" w:pos="7230"/>
@@ -24373,6 +24393,10 @@
     <w:p ns2:paraId="22BEE06C" ns2:textId="77777777">
       <w:pPr>
         <w:pStyle w:val="Titre3"/>
+        <w:numPr>
+          <w:ilvl w:val="2"/>
+          <w:numId w:val="59"/>
+        </w:numPr>
         <w:tabs>
           <w:tab w:val="left" w:pos="6190"/>
           <w:tab w:val="left" w:pos="7230"/>
@@ -25429,6 +25453,10 @@
     <w:p ns2:paraId="4305BBFC" ns2:textId="77777777">
       <w:pPr>
         <w:pStyle w:val="Titre3"/>
+        <w:numPr>
+          <w:ilvl w:val="2"/>
+          <w:numId w:val="59"/>
+        </w:numPr>
         <w:tabs>
           <w:tab w:val="left" w:pos="6190"/>
           <w:tab w:val="left" w:pos="7230"/>
@@ -25800,6 +25828,10 @@
       <w:pPr>
         <w:pStyle w:val="Titre1"/>
         <w:widowControl/>
+        <w:numPr>
+          <w:ilvl w:val="0"/>
+          <w:numId w:val="59"/>
+        </w:numPr>
         <w:spacing w:before="0" w:after="120" w:line="360" w:lineRule="auto"/>
         <w:ind w:firstLine="0"/>
         <w:jc w:val="both"/>
@@ -26155,6 +26187,10 @@
     <w:p ns2:paraId="499D0EE2" ns2:textId="77777777">
       <w:pPr>
         <w:pStyle w:val="Titre2"/>
+        <w:numPr>
+          <w:ilvl w:val="1"/>
+          <w:numId w:val="59"/>
+        </w:numPr>
         <w:tabs>
           <w:tab w:val="left" w:pos="6190"/>
           <w:tab w:val="left" w:pos="7230"/>
@@ -26204,6 +26240,10 @@
     <w:p ns2:paraId="1BE26942" ns2:textId="77777777">
       <w:pPr>
         <w:pStyle w:val="Titre3"/>
+        <w:numPr>
+          <w:ilvl w:val="2"/>
+          <w:numId w:val="59"/>
+        </w:numPr>
         <w:tabs>
           <w:tab w:val="left" w:pos="6190"/>
           <w:tab w:val="left" w:pos="7230"/>
@@ -30294,6 +30334,10 @@
     <w:p ns2:paraId="6F744744" ns2:textId="77777777">
       <w:pPr>
         <w:pStyle w:val="Titre3"/>
+        <w:numPr>
+          <w:ilvl w:val="2"/>
+          <w:numId w:val="59"/>
+        </w:numPr>
         <w:tabs>
           <w:tab w:val="left" w:pos="6190"/>
           <w:tab w:val="left" w:pos="7230"/>
@@ -31380,6 +31424,10 @@
     <w:p ns2:paraId="2A4CB84F" ns2:textId="68626389">
       <w:pPr>
         <w:pStyle w:val="Titre2"/>
+        <w:numPr>
+          <w:ilvl w:val="1"/>
+          <w:numId w:val="59"/>
+        </w:numPr>
         <w:tabs>
           <w:tab w:val="left" w:pos="6190"/>
           <w:tab w:val="left" w:pos="7230"/>
@@ -31430,6 +31478,10 @@
     <w:p ns2:paraId="66A52908" ns2:textId="77777777">
       <w:pPr>
         <w:pStyle w:val="Titre3"/>
+        <w:numPr>
+          <w:ilvl w:val="2"/>
+          <w:numId w:val="59"/>
+        </w:numPr>
         <w:tabs>
           <w:tab w:val="left" w:pos="6190"/>
           <w:tab w:val="left" w:pos="7230"/>
@@ -33476,6 +33528,10 @@
     <w:p ns2:paraId="6A50F9A4" ns2:textId="77777777">
       <w:pPr>
         <w:pStyle w:val="Titre3"/>
+        <w:numPr>
+          <w:ilvl w:val="2"/>
+          <w:numId w:val="59"/>
+        </w:numPr>
         <w:tabs>
           <w:tab w:val="left" w:pos="6190"/>
         </w:tabs>
@@ -34944,6 +35000,10 @@
       <w:pPr>
         <w:pStyle w:val="Titre1"/>
         <w:widowControl/>
+        <w:numPr>
+          <w:ilvl w:val="0"/>
+          <w:numId w:val="59"/>
+        </w:numPr>
         <w:spacing w:before="0" w:after="120" w:line="360" w:lineRule="auto"/>
         <w:ind w:firstLine="0"/>
         <w:jc w:val="both"/>
@@ -35360,6 +35420,10 @@
       <w:pPr>
         <w:pStyle w:val="Titre2"/>
         <w:widowControl/>
+        <w:numPr>
+          <w:ilvl w:val="1"/>
+          <w:numId w:val="59"/>
+        </w:numPr>
         <w:spacing w:before="0" w:after="120" w:line="360" w:lineRule="auto"/>
         <w:ind w:firstLine="0"/>
         <w:jc w:val="both"/>
@@ -37237,6 +37301,10 @@
     <w:p ns2:paraId="1004517B" ns2:textId="4B3AE68B">
       <w:pPr>
         <w:pStyle w:val="Titre3"/>
+        <w:numPr>
+          <w:ilvl w:val="2"/>
+          <w:numId w:val="59"/>
+        </w:numPr>
         <w:rPr>
           <w:color w:val="auto"/>
         </w:rPr>
@@ -43902,6 +43970,10 @@
     <w:p ns2:paraId="5E8E8052" ns2:textId="77777777">
       <w:pPr>
         <w:pStyle w:val="Titre3"/>
+        <w:numPr>
+          <w:ilvl w:val="2"/>
+          <w:numId w:val="59"/>
+        </w:numPr>
         <w:rPr>
           <w:color w:val="auto"/>
         </w:rPr>
@@ -44719,6 +44791,10 @@
       <w:pPr>
         <w:pStyle w:val="Titre2"/>
         <w:widowControl/>
+        <w:numPr>
+          <w:ilvl w:val="1"/>
+          <w:numId w:val="59"/>
+        </w:numPr>
         <w:spacing w:before="0" w:after="120" w:line="360" w:lineRule="auto"/>
         <w:ind w:firstLine="0"/>
         <w:jc w:val="both"/>
@@ -44780,6 +44856,10 @@
     <w:p ns2:paraId="6D597027" ns2:textId="77777777">
       <w:pPr>
         <w:pStyle w:val="Titre3"/>
+        <w:numPr>
+          <w:ilvl w:val="2"/>
+          <w:numId w:val="59"/>
+        </w:numPr>
         <w:rPr>
           <w:color w:val="auto"/>
         </w:rPr>
@@ -45274,6 +45354,10 @@
     <w:p ns2:paraId="5FEBCE62" ns2:textId="3454B12E">
       <w:pPr>
         <w:pStyle w:val="Titre3"/>
+        <w:numPr>
+          <w:ilvl w:val="2"/>
+          <w:numId w:val="59"/>
+        </w:numPr>
         <w:rPr>
           <w:color w:val="auto"/>
         </w:rPr>
@@ -47840,10 +47924,6 @@
     <w:p ns2:paraId="0AE07F19" ns2:textId="77777777">
       <w:pPr>
         <w:pStyle w:val="Titre2"/>
-        <w:numPr>
-          <w:ilvl w:val="1"/>
-          <w:numId w:val="46"/>
-        </w:numPr>
         <w:widowControl/>
         <w:spacing w:before="0" w:after="120" w:line="360" w:lineRule="auto"/>
         <w:ind w:firstLine="0"/>
@@ -48012,10 +48092,6 @@
     <w:p ns2:paraId="699AABA7" ns2:textId="77777777">
       <w:pPr>
         <w:pStyle w:val="Titre2"/>
-        <w:numPr>
-          <w:ilvl w:val="1"/>
-          <w:numId w:val="46"/>
-        </w:numPr>
         <w:widowControl/>
         <w:spacing w:before="0" w:after="120" w:line="360" w:lineRule="auto"/>
         <w:ind w:firstLine="0"/>
@@ -48368,10 +48444,6 @@
     <w:p ns2:paraId="2B66500E" ns2:textId="77777777">
       <w:pPr>
         <w:pStyle w:val="Titre2"/>
-        <w:numPr>
-          <w:ilvl w:val="1"/>
-          <w:numId w:val="46"/>
-        </w:numPr>
         <w:widowControl/>
         <w:spacing w:before="0" w:after="120" w:line="360" w:lineRule="auto"/>
         <w:ind w:firstLine="0"/>
@@ -50316,8 +50388,8 @@
 </file>
 
 <file path=word/numbering.xml><?xml version="1.0" encoding="utf-8"?>
-<w:numbering xmlns:wpc="http://schemas.microsoft.com/office/word/2010/wordprocessingCanvas" xmlns:cx="http://schemas.microsoft.com/office/drawing/2014/chartex" xmlns:mc="http://schemas.openxmlformats.org/markup-compatibility/2006" xmlns:o="urn:schemas-microsoft-com:office:office" xmlns:r="http://schemas.openxmlformats.org/officeDocument/2006/relationships" xmlns:m="http://schemas.openxmlformats.org/officeDocument/2006/math" xmlns:v="urn:schemas-microsoft-com:vml" xmlns:wp14="http://schemas.microsoft.com/office/word/2010/wordprocessingDrawing" xmlns:wp="http://schemas.openxmlformats.org/drawingml/2006/wordprocessingDrawing" xmlns:w10="urn:schemas-microsoft-com:office:word" xmlns:w="http://schemas.openxmlformats.org/wordprocessingml/2006/main" xmlns:w14="http://schemas.microsoft.com/office/word/2010/wordml" xmlns:w15="http://schemas.microsoft.com/office/word/2012/wordml" xmlns:w16se="http://schemas.microsoft.com/office/word/2015/wordml/symex" xmlns:wpg="http://schemas.microsoft.com/office/word/2010/wordprocessingGroup" xmlns:wpi="http://schemas.microsoft.com/office/word/2010/wordprocessingInk" xmlns:wne="http://schemas.microsoft.com/office/word/2006/wordml" xmlns:wps="http://schemas.microsoft.com/office/word/2010/wordprocessingShape" mc:Ignorable="w14 w15 w16se wp14">
-  <w:abstractNum w:abstractNumId="0" w15:restartNumberingAfterBreak="0">
+<w:numbering xmlns:ns1="http://schemas.openxmlformats.org/markup-compatibility/2006" xmlns:ns2="http://schemas.microsoft.com/office/word/2012/wordml" xmlns:w="http://schemas.openxmlformats.org/wordprocessingml/2006/main" ns1:Ignorable="w14 w15 w16se wp14">
+  <w:abstractNum w:abstractNumId="0" ns2:restartNumberingAfterBreak="0">
     <w:nsid w:val="FFFFFF88"/>
     <w:multiLevelType w:val="singleLevel"/>
     <w:tmpl w:val="070CA2A8"/>
@@ -50335,7 +50407,7 @@
       </w:pPr>
     </w:lvl>
   </w:abstractNum>
-  <w:abstractNum w:abstractNumId="1" w15:restartNumberingAfterBreak="0">
+  <w:abstractNum w:abstractNumId="1" ns2:restartNumberingAfterBreak="0">
     <w:nsid w:val="FFFFFF89"/>
     <w:multiLevelType w:val="singleLevel"/>
     <w:tmpl w:val="3F8C46D6"/>
@@ -50356,7 +50428,7 @@
       </w:rPr>
     </w:lvl>
   </w:abstractNum>
-  <w:abstractNum w:abstractNumId="2" w15:restartNumberingAfterBreak="0">
+  <w:abstractNum w:abstractNumId="2" ns2:restartNumberingAfterBreak="0">
     <w:nsid w:val="01264A54"/>
     <w:multiLevelType w:val="hybridMultilevel"/>
     <w:tmpl w:val="1C4033FA"/>
@@ -50446,7 +50518,7 @@
       </w:pPr>
     </w:lvl>
   </w:abstractNum>
-  <w:abstractNum w:abstractNumId="3" w15:restartNumberingAfterBreak="0">
+  <w:abstractNum w:abstractNumId="3" ns2:restartNumberingAfterBreak="0">
     <w:nsid w:val="03812403"/>
     <w:multiLevelType w:val="multilevel"/>
     <w:tmpl w:val="66C2B83E"/>
@@ -50559,7 +50631,7 @@
       </w:rPr>
     </w:lvl>
   </w:abstractNum>
-  <w:abstractNum w:abstractNumId="4" w15:restartNumberingAfterBreak="0">
+  <w:abstractNum w:abstractNumId="4" ns2:restartNumberingAfterBreak="0">
     <w:nsid w:val="04124BE8"/>
     <w:multiLevelType w:val="hybridMultilevel"/>
     <w:tmpl w:val="C9A42728"/>
@@ -50649,7 +50721,7 @@
       </w:pPr>
     </w:lvl>
   </w:abstractNum>
-  <w:abstractNum w:abstractNumId="5" w15:restartNumberingAfterBreak="0">
+  <w:abstractNum w:abstractNumId="5" ns2:restartNumberingAfterBreak="0">
     <w:nsid w:val="05455B98"/>
     <w:multiLevelType w:val="multilevel"/>
     <w:tmpl w:val="3B267632"/>
@@ -50762,7 +50834,7 @@
       </w:rPr>
     </w:lvl>
   </w:abstractNum>
-  <w:abstractNum w:abstractNumId="6" w15:restartNumberingAfterBreak="0">
+  <w:abstractNum w:abstractNumId="6" ns2:restartNumberingAfterBreak="0">
     <w:nsid w:val="08E72F86"/>
     <w:multiLevelType w:val="hybridMultilevel"/>
     <w:tmpl w:val="EDFC6558"/>
@@ -50965,7 +51037,7 @@
       </w:rPr>
     </w:lvl>
   </w:abstractNum>
-  <w:abstractNum w:abstractNumId="7" w15:restartNumberingAfterBreak="0">
+  <w:abstractNum w:abstractNumId="7" ns2:restartNumberingAfterBreak="0">
     <w:nsid w:val="0B836373"/>
     <w:multiLevelType w:val="hybridMultilevel"/>
     <w:tmpl w:val="FD1E2840"/>
@@ -51051,7 +51123,7 @@
       </w:pPr>
     </w:lvl>
   </w:abstractNum>
-  <w:abstractNum w:abstractNumId="8" w15:restartNumberingAfterBreak="0">
+  <w:abstractNum w:abstractNumId="8" ns2:restartNumberingAfterBreak="0">
     <w:nsid w:val="0C5670C3"/>
     <w:multiLevelType w:val="hybridMultilevel"/>
     <w:tmpl w:val="62C226F2"/>
@@ -51166,7 +51238,7 @@
       </w:rPr>
     </w:lvl>
   </w:abstractNum>
-  <w:abstractNum w:abstractNumId="9" w15:restartNumberingAfterBreak="0">
+  <w:abstractNum w:abstractNumId="9" ns2:restartNumberingAfterBreak="0">
     <w:nsid w:val="0EC376AB"/>
     <w:multiLevelType w:val="hybridMultilevel"/>
     <w:tmpl w:val="E2C2E758"/>
@@ -51278,7 +51350,7 @@
       </w:rPr>
     </w:lvl>
   </w:abstractNum>
-  <w:abstractNum w:abstractNumId="10" w15:restartNumberingAfterBreak="0">
+  <w:abstractNum w:abstractNumId="10" ns2:restartNumberingAfterBreak="0">
     <w:nsid w:val="134160E4"/>
     <w:multiLevelType w:val="hybridMultilevel"/>
     <w:tmpl w:val="A6B4CA44"/>
@@ -51481,7 +51553,7 @@
       </w:rPr>
     </w:lvl>
   </w:abstractNum>
-  <w:abstractNum w:abstractNumId="11" w15:restartNumberingAfterBreak="0">
+  <w:abstractNum w:abstractNumId="11" ns2:restartNumberingAfterBreak="0">
     <w:nsid w:val="1447122C"/>
     <w:multiLevelType w:val="hybridMultilevel"/>
     <w:tmpl w:val="8ADC8DBE"/>
@@ -51593,7 +51665,7 @@
       </w:rPr>
     </w:lvl>
   </w:abstractNum>
-  <w:abstractNum w:abstractNumId="12" w15:restartNumberingAfterBreak="0">
+  <w:abstractNum w:abstractNumId="12" ns2:restartNumberingAfterBreak="0">
     <w:nsid w:val="16E33E19"/>
     <w:multiLevelType w:val="hybridMultilevel"/>
     <w:tmpl w:val="E836F0CC"/>
@@ -51705,7 +51777,7 @@
       </w:rPr>
     </w:lvl>
   </w:abstractNum>
-  <w:abstractNum w:abstractNumId="13" w15:restartNumberingAfterBreak="0">
+  <w:abstractNum w:abstractNumId="13" ns2:restartNumberingAfterBreak="0">
     <w:nsid w:val="17746F25"/>
     <w:multiLevelType w:val="hybridMultilevel"/>
     <w:tmpl w:val="ACD6031E"/>
@@ -51818,7 +51890,7 @@
       </w:rPr>
     </w:lvl>
   </w:abstractNum>
-  <w:abstractNum w:abstractNumId="14" w15:restartNumberingAfterBreak="0">
+  <w:abstractNum w:abstractNumId="14" ns2:restartNumberingAfterBreak="0">
     <w:nsid w:val="18ED7595"/>
     <w:multiLevelType w:val="hybridMultilevel"/>
     <w:tmpl w:val="07A6BCB6"/>
@@ -51907,7 +51979,7 @@
       </w:pPr>
     </w:lvl>
   </w:abstractNum>
-  <w:abstractNum w:abstractNumId="15" w15:restartNumberingAfterBreak="0">
+  <w:abstractNum w:abstractNumId="15" ns2:restartNumberingAfterBreak="0">
     <w:nsid w:val="18FA68EC"/>
     <w:multiLevelType w:val="hybridMultilevel"/>
     <w:tmpl w:val="22B4966A"/>
@@ -51996,7 +52068,7 @@
       </w:pPr>
     </w:lvl>
   </w:abstractNum>
-  <w:abstractNum w:abstractNumId="16" w15:restartNumberingAfterBreak="0">
+  <w:abstractNum w:abstractNumId="16" ns2:restartNumberingAfterBreak="0">
     <w:nsid w:val="1A68477C"/>
     <w:multiLevelType w:val="hybridMultilevel"/>
     <w:tmpl w:val="4FFCF5D2"/>
@@ -52109,7 +52181,7 @@
       </w:rPr>
     </w:lvl>
   </w:abstractNum>
-  <w:abstractNum w:abstractNumId="17" w15:restartNumberingAfterBreak="0">
+  <w:abstractNum w:abstractNumId="17" ns2:restartNumberingAfterBreak="0">
     <w:nsid w:val="1CA3602E"/>
     <w:multiLevelType w:val="hybridMultilevel"/>
     <w:tmpl w:val="1BCE28CC"/>
@@ -52195,7 +52267,7 @@
       </w:pPr>
     </w:lvl>
   </w:abstractNum>
-  <w:abstractNum w:abstractNumId="18" w15:restartNumberingAfterBreak="0">
+  <w:abstractNum w:abstractNumId="18" ns2:restartNumberingAfterBreak="0">
     <w:nsid w:val="2B3F39F6"/>
     <w:multiLevelType w:val="hybridMultilevel"/>
     <w:tmpl w:val="A748EF28"/>
@@ -52281,7 +52353,7 @@
       </w:pPr>
     </w:lvl>
   </w:abstractNum>
-  <w:abstractNum w:abstractNumId="19" w15:restartNumberingAfterBreak="0">
+  <w:abstractNum w:abstractNumId="19" ns2:restartNumberingAfterBreak="0">
     <w:nsid w:val="2E885427"/>
     <w:multiLevelType w:val="multilevel"/>
     <w:tmpl w:val="65303F58"/>
@@ -52430,7 +52502,7 @@
       </w:rPr>
     </w:lvl>
   </w:abstractNum>
-  <w:abstractNum w:abstractNumId="20" w15:restartNumberingAfterBreak="0">
+  <w:abstractNum w:abstractNumId="20" ns2:restartNumberingAfterBreak="0">
     <w:nsid w:val="30EC0F8F"/>
     <w:multiLevelType w:val="multilevel"/>
     <w:tmpl w:val="083EB6B6"/>
@@ -52543,7 +52615,7 @@
       </w:rPr>
     </w:lvl>
   </w:abstractNum>
-  <w:abstractNum w:abstractNumId="21" w15:restartNumberingAfterBreak="0">
+  <w:abstractNum w:abstractNumId="21" ns2:restartNumberingAfterBreak="0">
     <w:nsid w:val="3287121E"/>
     <w:multiLevelType w:val="hybridMultilevel"/>
     <w:tmpl w:val="C07C0086"/>
@@ -52632,7 +52704,7 @@
       </w:pPr>
     </w:lvl>
   </w:abstractNum>
-  <w:abstractNum w:abstractNumId="22" w15:restartNumberingAfterBreak="0">
+  <w:abstractNum w:abstractNumId="22" ns2:restartNumberingAfterBreak="0">
     <w:nsid w:val="36632847"/>
     <w:multiLevelType w:val="hybridMultilevel"/>
     <w:tmpl w:val="C29EC650"/>
@@ -52745,7 +52817,7 @@
       </w:rPr>
     </w:lvl>
   </w:abstractNum>
-  <w:abstractNum w:abstractNumId="23" w15:restartNumberingAfterBreak="0">
+  <w:abstractNum w:abstractNumId="23" ns2:restartNumberingAfterBreak="0">
     <w:nsid w:val="37F02BB9"/>
     <w:multiLevelType w:val="hybridMultilevel"/>
     <w:tmpl w:val="55147314"/>
@@ -52831,7 +52903,7 @@
       </w:pPr>
     </w:lvl>
   </w:abstractNum>
-  <w:abstractNum w:abstractNumId="24" w15:restartNumberingAfterBreak="0">
+  <w:abstractNum w:abstractNumId="24" ns2:restartNumberingAfterBreak="0">
     <w:nsid w:val="3922027A"/>
     <w:multiLevelType w:val="hybridMultilevel"/>
     <w:tmpl w:val="86DE9C54"/>
@@ -52946,7 +53018,7 @@
       </w:rPr>
     </w:lvl>
   </w:abstractNum>
-  <w:abstractNum w:abstractNumId="25" w15:restartNumberingAfterBreak="0">
+  <w:abstractNum w:abstractNumId="25" ns2:restartNumberingAfterBreak="0">
     <w:nsid w:val="3DEF3A4B"/>
     <w:multiLevelType w:val="hybridMultilevel"/>
     <w:tmpl w:val="002270EA"/>
@@ -53061,7 +53133,7 @@
       </w:rPr>
     </w:lvl>
   </w:abstractNum>
-  <w:abstractNum w:abstractNumId="26" w15:restartNumberingAfterBreak="0">
+  <w:abstractNum w:abstractNumId="26" ns2:restartNumberingAfterBreak="0">
     <w:nsid w:val="4019430B"/>
     <w:multiLevelType w:val="hybridMultilevel"/>
     <w:tmpl w:val="8D407812"/>
@@ -53174,7 +53246,7 @@
       </w:rPr>
     </w:lvl>
   </w:abstractNum>
-  <w:abstractNum w:abstractNumId="27" w15:restartNumberingAfterBreak="0">
+  <w:abstractNum w:abstractNumId="27" ns2:restartNumberingAfterBreak="0">
     <w:nsid w:val="44DE28F9"/>
     <w:multiLevelType w:val="hybridMultilevel"/>
     <w:tmpl w:val="9FBECB1C"/>
@@ -53260,7 +53332,7 @@
       </w:pPr>
     </w:lvl>
   </w:abstractNum>
-  <w:abstractNum w:abstractNumId="28" w15:restartNumberingAfterBreak="0">
+  <w:abstractNum w:abstractNumId="28" ns2:restartNumberingAfterBreak="0">
     <w:nsid w:val="45230589"/>
     <w:multiLevelType w:val="hybridMultilevel"/>
     <w:tmpl w:val="7B52924E"/>
@@ -53346,7 +53418,7 @@
       </w:pPr>
     </w:lvl>
   </w:abstractNum>
-  <w:abstractNum w:abstractNumId="29" w15:restartNumberingAfterBreak="0">
+  <w:abstractNum w:abstractNumId="29" ns2:restartNumberingAfterBreak="0">
     <w:nsid w:val="45300FA7"/>
     <w:multiLevelType w:val="hybridMultilevel"/>
     <w:tmpl w:val="5C963A60"/>
@@ -53459,7 +53531,7 @@
       </w:rPr>
     </w:lvl>
   </w:abstractNum>
-  <w:abstractNum w:abstractNumId="30" w15:restartNumberingAfterBreak="0">
+  <w:abstractNum w:abstractNumId="30" ns2:restartNumberingAfterBreak="0">
     <w:nsid w:val="47071ED2"/>
     <w:multiLevelType w:val="hybridMultilevel"/>
     <w:tmpl w:val="088A0220"/>
@@ -53549,7 +53621,7 @@
       </w:pPr>
     </w:lvl>
   </w:abstractNum>
-  <w:abstractNum w:abstractNumId="31" w15:restartNumberingAfterBreak="0">
+  <w:abstractNum w:abstractNumId="31" ns2:restartNumberingAfterBreak="0">
     <w:nsid w:val="474E3477"/>
     <w:multiLevelType w:val="hybridMultilevel"/>
     <w:tmpl w:val="D5AA9BA8"/>
@@ -53664,7 +53736,7 @@
       </w:rPr>
     </w:lvl>
   </w:abstractNum>
-  <w:abstractNum w:abstractNumId="32" w15:restartNumberingAfterBreak="0">
+  <w:abstractNum w:abstractNumId="32" ns2:restartNumberingAfterBreak="0">
     <w:nsid w:val="4BBE7310"/>
     <w:multiLevelType w:val="hybridMultilevel"/>
     <w:tmpl w:val="17544138"/>
@@ -53750,7 +53822,7 @@
       </w:pPr>
     </w:lvl>
   </w:abstractNum>
-  <w:abstractNum w:abstractNumId="33" w15:restartNumberingAfterBreak="0">
+  <w:abstractNum w:abstractNumId="33" ns2:restartNumberingAfterBreak="0">
     <w:nsid w:val="4BF25962"/>
     <w:multiLevelType w:val="hybridMultilevel"/>
     <w:tmpl w:val="7CEA9ED6"/>
@@ -53863,7 +53935,7 @@
       </w:rPr>
     </w:lvl>
   </w:abstractNum>
-  <w:abstractNum w:abstractNumId="34" w15:restartNumberingAfterBreak="0">
+  <w:abstractNum w:abstractNumId="34" ns2:restartNumberingAfterBreak="0">
     <w:nsid w:val="4C756295"/>
     <w:multiLevelType w:val="hybridMultilevel"/>
     <w:tmpl w:val="59207EB0"/>
@@ -53978,7 +54050,7 @@
       </w:rPr>
     </w:lvl>
   </w:abstractNum>
-  <w:abstractNum w:abstractNumId="35" w15:restartNumberingAfterBreak="0">
+  <w:abstractNum w:abstractNumId="35" ns2:restartNumberingAfterBreak="0">
     <w:nsid w:val="4D6F5006"/>
     <w:multiLevelType w:val="hybridMultilevel"/>
     <w:tmpl w:val="CAF4A00E"/>
@@ -54067,7 +54139,7 @@
       </w:pPr>
     </w:lvl>
   </w:abstractNum>
-  <w:abstractNum w:abstractNumId="36" w15:restartNumberingAfterBreak="0">
+  <w:abstractNum w:abstractNumId="36" ns2:restartNumberingAfterBreak="0">
     <w:nsid w:val="4FB774DA"/>
     <w:multiLevelType w:val="hybridMultilevel"/>
     <w:tmpl w:val="E3049A0C"/>
@@ -54180,7 +54252,7 @@
       </w:rPr>
     </w:lvl>
   </w:abstractNum>
-  <w:abstractNum w:abstractNumId="37" w15:restartNumberingAfterBreak="0">
+  <w:abstractNum w:abstractNumId="37" ns2:restartNumberingAfterBreak="0">
     <w:nsid w:val="50453A38"/>
     <w:multiLevelType w:val="hybridMultilevel"/>
     <w:tmpl w:val="7CDEDC62"/>
@@ -54269,7 +54341,7 @@
       </w:pPr>
     </w:lvl>
   </w:abstractNum>
-  <w:abstractNum w:abstractNumId="38" w15:restartNumberingAfterBreak="0">
+  <w:abstractNum w:abstractNumId="38" ns2:restartNumberingAfterBreak="0">
     <w:nsid w:val="524F5593"/>
     <w:multiLevelType w:val="hybridMultilevel"/>
     <w:tmpl w:val="3E96878A"/>
@@ -54379,7 +54451,7 @@
       </w:rPr>
     </w:lvl>
   </w:abstractNum>
-  <w:abstractNum w:abstractNumId="39" w15:restartNumberingAfterBreak="0">
+  <w:abstractNum w:abstractNumId="39" ns2:restartNumberingAfterBreak="0">
     <w:nsid w:val="5A8E371E"/>
     <w:multiLevelType w:val="hybridMultilevel"/>
     <w:tmpl w:val="879CD67E"/>
@@ -54492,7 +54564,7 @@
       </w:rPr>
     </w:lvl>
   </w:abstractNum>
-  <w:abstractNum w:abstractNumId="40" w15:restartNumberingAfterBreak="0">
+  <w:abstractNum w:abstractNumId="40" ns2:restartNumberingAfterBreak="0">
     <w:nsid w:val="5B8B3938"/>
     <w:multiLevelType w:val="hybridMultilevel"/>
     <w:tmpl w:val="D0AC0F1A"/>
@@ -54607,7 +54679,7 @@
       </w:rPr>
     </w:lvl>
   </w:abstractNum>
-  <w:abstractNum w:abstractNumId="41" w15:restartNumberingAfterBreak="0">
+  <w:abstractNum w:abstractNumId="41" ns2:restartNumberingAfterBreak="0">
     <w:nsid w:val="5BEA73AF"/>
     <w:multiLevelType w:val="hybridMultilevel"/>
     <w:tmpl w:val="A02EB57E"/>
@@ -54693,7 +54765,7 @@
       </w:pPr>
     </w:lvl>
   </w:abstractNum>
-  <w:abstractNum w:abstractNumId="42" w15:restartNumberingAfterBreak="0">
+  <w:abstractNum w:abstractNumId="42" ns2:restartNumberingAfterBreak="0">
     <w:nsid w:val="65326A50"/>
     <w:multiLevelType w:val="hybridMultilevel"/>
     <w:tmpl w:val="BC3AB3A8"/>
@@ -54808,7 +54880,7 @@
       </w:rPr>
     </w:lvl>
   </w:abstractNum>
-  <w:abstractNum w:abstractNumId="43" w15:restartNumberingAfterBreak="0">
+  <w:abstractNum w:abstractNumId="43" ns2:restartNumberingAfterBreak="0">
     <w:nsid w:val="67532D19"/>
     <w:multiLevelType w:val="hybridMultilevel"/>
     <w:tmpl w:val="8F88EC1C"/>
@@ -54894,7 +54966,7 @@
       </w:pPr>
     </w:lvl>
   </w:abstractNum>
-  <w:abstractNum w:abstractNumId="44" w15:restartNumberingAfterBreak="0">
+  <w:abstractNum w:abstractNumId="44" ns2:restartNumberingAfterBreak="0">
     <w:nsid w:val="6A727646"/>
     <w:multiLevelType w:val="hybridMultilevel"/>
     <w:tmpl w:val="BB0664FA"/>
@@ -54983,7 +55055,7 @@
       </w:pPr>
     </w:lvl>
   </w:abstractNum>
-  <w:abstractNum w:abstractNumId="45" w15:restartNumberingAfterBreak="0">
+  <w:abstractNum w:abstractNumId="45" ns2:restartNumberingAfterBreak="0">
     <w:nsid w:val="6BA55E8E"/>
     <w:multiLevelType w:val="hybridMultilevel"/>
     <w:tmpl w:val="CB4A709A"/>
@@ -55072,7 +55144,7 @@
       </w:pPr>
     </w:lvl>
   </w:abstractNum>
-  <w:abstractNum w:abstractNumId="46" w15:restartNumberingAfterBreak="0">
+  <w:abstractNum w:abstractNumId="46" ns2:restartNumberingAfterBreak="0">
     <w:nsid w:val="6E1C7575"/>
     <w:multiLevelType w:val="multilevel"/>
     <w:tmpl w:val="D3701526"/>
@@ -55221,7 +55293,7 @@
       </w:rPr>
     </w:lvl>
   </w:abstractNum>
-  <w:abstractNum w:abstractNumId="47" w15:restartNumberingAfterBreak="0">
+  <w:abstractNum w:abstractNumId="47" ns2:restartNumberingAfterBreak="0">
     <w:nsid w:val="7127350E"/>
     <w:multiLevelType w:val="hybridMultilevel"/>
     <w:tmpl w:val="0F5A6652"/>
@@ -55307,7 +55379,7 @@
       </w:pPr>
     </w:lvl>
   </w:abstractNum>
-  <w:abstractNum w:abstractNumId="48" w15:restartNumberingAfterBreak="0">
+  <w:abstractNum w:abstractNumId="48" ns2:restartNumberingAfterBreak="0">
     <w:nsid w:val="71AE69B5"/>
     <w:multiLevelType w:val="hybridMultilevel"/>
     <w:tmpl w:val="C3DC4594"/>
@@ -55396,7 +55468,7 @@
       </w:pPr>
     </w:lvl>
   </w:abstractNum>
-  <w:abstractNum w:abstractNumId="49" w15:restartNumberingAfterBreak="0">
+  <w:abstractNum w:abstractNumId="49" ns2:restartNumberingAfterBreak="0">
     <w:nsid w:val="73FB35BF"/>
     <w:multiLevelType w:val="multilevel"/>
     <w:tmpl w:val="2D543368"/>
@@ -55545,7 +55617,7 @@
       </w:rPr>
     </w:lvl>
   </w:abstractNum>
-  <w:abstractNum w:abstractNumId="50" w15:restartNumberingAfterBreak="0">
+  <w:abstractNum w:abstractNumId="50" ns2:restartNumberingAfterBreak="0">
     <w:nsid w:val="75366E1B"/>
     <w:multiLevelType w:val="hybridMultilevel"/>
     <w:tmpl w:val="60204386"/>
@@ -55658,7 +55730,7 @@
       </w:rPr>
     </w:lvl>
   </w:abstractNum>
-  <w:abstractNum w:abstractNumId="51" w15:restartNumberingAfterBreak="0">
+  <w:abstractNum w:abstractNumId="51" ns2:restartNumberingAfterBreak="0">
     <w:nsid w:val="770F3AFF"/>
     <w:multiLevelType w:val="hybridMultilevel"/>
     <w:tmpl w:val="0AACD00E"/>
@@ -55771,7 +55843,7 @@
       </w:rPr>
     </w:lvl>
   </w:abstractNum>
-  <w:abstractNum w:abstractNumId="52" w15:restartNumberingAfterBreak="0">
+  <w:abstractNum w:abstractNumId="52" ns2:restartNumberingAfterBreak="0">
     <w:nsid w:val="7CE82879"/>
     <w:multiLevelType w:val="hybridMultilevel"/>
     <w:tmpl w:val="D758FDA4"/>
@@ -55857,7 +55929,7 @@
       </w:pPr>
     </w:lvl>
   </w:abstractNum>
-  <w:abstractNum w:abstractNumId="53" w15:restartNumberingAfterBreak="0">
+  <w:abstractNum w:abstractNumId="53" ns2:restartNumberingAfterBreak="0">
     <w:nsid w:val="7D697292"/>
     <w:multiLevelType w:val="multilevel"/>
     <w:tmpl w:val="1E226AD0"/>
@@ -56006,7 +56078,7 @@
       </w:rPr>
     </w:lvl>
   </w:abstractNum>
-  <w:abstractNum w:abstractNumId="54" w15:restartNumberingAfterBreak="0">
+  <w:abstractNum w:abstractNumId="54" ns2:restartNumberingAfterBreak="0">
     <w:nsid w:val="7E5D0E03"/>
     <w:multiLevelType w:val="multilevel"/>
     <w:tmpl w:val="5880B78C"/>
@@ -56155,7 +56227,7 @@
       </w:rPr>
     </w:lvl>
   </w:abstractNum>
-  <w:abstractNum w:abstractNumId="55" w15:restartNumberingAfterBreak="0">
+  <w:abstractNum w:abstractNumId="55" ns2:restartNumberingAfterBreak="0">
     <w:nsid w:val="7F813D73"/>
     <w:multiLevelType w:val="hybridMultilevel"/>
     <w:tmpl w:val="689479BE"/>
@@ -56268,7 +56340,7 @@
       </w:rPr>
     </w:lvl>
   </w:abstractNum>
-  <w:abstractNum w:abstractNumId="56" w15:restartNumberingAfterBreak="0">
+  <w:abstractNum w:abstractNumId="56" ns2:restartNumberingAfterBreak="0">
     <w:nsid w:val="7FCD2D3F"/>
     <w:multiLevelType w:val="multilevel"/>
     <w:tmpl w:val="88C21362"/>
@@ -56413,7 +56485,7 @@
       </w:rPr>
     </w:lvl>
   </w:abstractNum>
-  <w:abstractNum w:abstractNumId="57" w15:restartNumberingAfterBreak="0">
+  <w:abstractNum w:abstractNumId="57" ns2:restartNumberingAfterBreak="0">
     <w:nsid w:val="7FDB5BD9"/>
     <w:multiLevelType w:val="hybridMultilevel"/>
     <w:tmpl w:val="AA0C1A4E"/>
@@ -56812,6 +56884,58 @@
     <w:abstractNumId w:val="15"/>
   </w:num>
   <w:numIdMacAtCleanup w:val="58"/>
+  <w:abstractNum w:abstractNumId="58">
+    <w:nsid w:val="7A2B4C19"/>
+    <w:multiLevelType w:val="multilevel"/>
+    <w:tmpl w:val="7A2B4C19"/>
+    <w:lvl w:ilvl="0">
+      <w:start w:val="1"/>
+      <w:numFmt w:val="decimal"/>
+      <w:pStyle w:val="Titre1"/>
+      <w:suff w:val="space"/>
+      <w:lvlText w:val="%1"/>
+      <w:lvlJc w:val="left"/>
+      <w:pPr>
+        <w:tabs>
+          <w:tab w:val="num" w:pos="720"/>
+        </w:tabs>
+        <w:ind w:left="720" w:hanging="720"/>
+      </w:pPr>
+    </w:lvl>
+    <w:lvl w:ilvl="1">
+      <w:start w:val="1"/>
+      <w:numFmt w:val="decimal"/>
+      <w:lvlRestart w:val="1"/>
+      <w:pStyle w:val="Titre2"/>
+      <w:suff w:val="space"/>
+      <w:lvlText w:val="%1.%2"/>
+      <w:lvlJc w:val="left"/>
+      <w:pPr>
+        <w:tabs>
+          <w:tab w:val="num" w:pos="1440"/>
+        </w:tabs>
+        <w:ind w:left="1440" w:hanging="720"/>
+      </w:pPr>
+    </w:lvl>
+    <w:lvl w:ilvl="2">
+      <w:start w:val="1"/>
+      <w:numFmt w:val="decimal"/>
+      <w:lvlRestart w:val="1"/>
+      <w:pStyle w:val="Titre3"/>
+      <w:suff w:val="space"/>
+      <w:lvlText w:val="%1.%2.%3"/>
+      <w:lvlJc w:val="left"/>
+      <w:pPr>
+        <w:tabs>
+          <w:tab w:val="num" w:pos="2160"/>
+        </w:tabs>
+        <w:ind w:left="2160" w:hanging="720"/>
+      </w:pPr>
+    </w:lvl>
+  </w:abstractNum>
+  <w:num w:numId="59">
+    <w:abstractNumId w:val="58"/>
+  </w:num>
 </w:numbering>
 </file>
 

</xml_diff>

<commit_message>
Création de la table des matières automatique
</commit_message>
<xml_diff>
--- a/doc.docx
+++ b/doc.docx
@@ -14272,6 +14272,41 @@
           <w:szCs w:val="26"/>
         </w:rPr>
       </w:pPr>
+    </w:p>
+    <w:p>
+      <w:pPr>
+        <w:pageBreakBefore/>
+        <w:jc w:val="center"/>
+        <w:spacing w:before="240" w:after="240"/>
+      </w:pPr>
+      <w:r>
+        <w:rPr>
+          <w:b/>
+          <w:sz w:val="28"/>
+          <w:szCs w:val="28"/>
+        </w:rPr>
+        <w:t>TABLE DES MATIÈRES</w:t>
+      </w:r>
+    </w:p>
+    <w:p>
+      <w:pPr>
+        <w:spacing w:after="120"/>
+      </w:pPr>
+      <w:r>
+        <w:fldChar w:fldChar="begin" w:dirty="true"/>
+      </w:r>
+      <w:r>
+        <w:instrText xml:space="preserve"> TOC \o "1-3" \h \u </w:instrText>
+      </w:r>
+      <w:r>
+        <w:fldChar w:fldChar="separate"/>
+      </w:r>
+      <w:r>
+        <w:t>Mise à jour automatique de la table des matières.</w:t>
+      </w:r>
+      <w:r>
+        <w:fldChar w:fldChar="end"/>
+      </w:r>
     </w:p>
     <w:p ns2:paraId="3ED802C3" ns2:textId="0BF443B7">
       <w:pPr>
@@ -49815,332 +49850,6 @@
         <w:t>- Annexe 4 : Autres</w:t>
       </w:r>
     </w:p>
-    <w:p ns2:paraId="6DAE749B" ns2:textId="77777777">
-      <w:pPr>
-        <w:tabs>
-          <w:tab w:val="left" w:pos="6190"/>
-        </w:tabs>
-        <w:widowControl/>
-        <w:spacing w:before="0" w:after="120" w:line="360" w:lineRule="auto"/>
-        <w:ind w:firstLine="0"/>
-        <w:jc w:val="both"/>
-        <w:rPr>
-          <w:rFonts w:cstheme="minorHAnsi" w:ascii="Times New Roman" w:hAnsi="Times New Roman" w:cs="Times New Roman" w:eastAsia="Times New Roman"/>
-          <w:b/>
-          <w:sz w:val="24"/>
-          <w:szCs w:val="24"/>
-        </w:rPr>
-      </w:pPr>
-      <w:r>
-        <w:rPr>
-          <w:rFonts w:cstheme="minorHAnsi" w:ascii="Times New Roman" w:hAnsi="Times New Roman" w:cs="Times New Roman" w:eastAsia="Times New Roman"/>
-          <w:b/>
-          <w:sz w:val="24"/>
-          <w:szCs w:val="24"/>
-        </w:rPr>
-        <w:t xml:space="preserve">Table des matières  </w:t>
-      </w:r>
-    </w:p>
-    <w:p ns2:paraId="28F6E518" ns2:textId="02C4C3DA">
-      <w:pPr>
-        <w:widowControl/>
-        <w:spacing w:before="0" w:after="120" w:line="360" w:lineRule="auto"/>
-        <w:ind w:firstLine="0"/>
-        <w:jc w:val="both"/>
-        <w:rPr>
-          <w:rFonts w:cstheme="minorHAnsi" w:ascii="Times New Roman" w:hAnsi="Times New Roman" w:cs="Times New Roman" w:eastAsia="Times New Roman"/>
-        </w:rPr>
-      </w:pPr>
-      <w:r>
-        <w:rPr>
-          <w:rFonts w:cstheme="minorHAnsi" w:ascii="Times New Roman" w:hAnsi="Times New Roman" w:cs="Times New Roman" w:eastAsia="Times New Roman"/>
-          <w:lang w:val="en-US"/>
-        </w:rPr>
-        <w:t xml:space="preserve">DÉDICACE ...........................................................................  </w:t>
-      </w:r>
-    </w:p>
-    <w:p ns2:paraId="22BF8F67" ns2:textId="38E2B21B">
-      <w:pPr>
-        <w:widowControl/>
-        <w:spacing w:before="0" w:after="120" w:line="360" w:lineRule="auto"/>
-        <w:ind w:firstLine="0"/>
-        <w:jc w:val="both"/>
-        <w:rPr>
-          <w:rFonts w:cstheme="minorHAnsi" w:ascii="Times New Roman" w:hAnsi="Times New Roman" w:cs="Times New Roman" w:eastAsia="Times New Roman"/>
-        </w:rPr>
-      </w:pPr>
-      <w:r>
-        <w:rPr>
-          <w:rFonts w:cstheme="minorHAnsi" w:ascii="Times New Roman" w:hAnsi="Times New Roman" w:cs="Times New Roman" w:eastAsia="Times New Roman"/>
-          <w:lang w:val="en-US"/>
-        </w:rPr>
-        <w:t xml:space="preserve">REMERCIEMENTS .............................................................  </w:t>
-      </w:r>
-    </w:p>
-    <w:p ns2:paraId="29ED3969" ns2:textId="5237C0C1">
-      <w:pPr>
-        <w:widowControl/>
-        <w:spacing w:before="0" w:after="120" w:line="360" w:lineRule="auto"/>
-        <w:ind w:firstLine="0"/>
-        <w:jc w:val="both"/>
-        <w:rPr>
-          <w:rFonts w:cstheme="minorHAnsi" w:ascii="Times New Roman" w:hAnsi="Times New Roman" w:cs="Times New Roman" w:eastAsia="Times New Roman"/>
-        </w:rPr>
-      </w:pPr>
-      <w:r>
-        <w:rPr>
-          <w:rFonts w:cstheme="minorHAnsi" w:ascii="Times New Roman" w:hAnsi="Times New Roman" w:cs="Times New Roman" w:eastAsia="Times New Roman"/>
-          <w:lang w:val="en-US"/>
-        </w:rPr>
-        <w:t xml:space="preserve">LISTE DES SIGLES ET ABRÉVIATIONS ........................  </w:t>
-      </w:r>
-    </w:p>
-    <w:p ns2:paraId="0CC04691" ns2:textId="629DA707">
-      <w:pPr>
-        <w:widowControl/>
-        <w:spacing w:before="0" w:after="120" w:line="360" w:lineRule="auto"/>
-        <w:ind w:firstLine="0"/>
-        <w:jc w:val="both"/>
-        <w:rPr>
-          <w:rFonts w:cstheme="minorHAnsi" w:ascii="Times New Roman" w:hAnsi="Times New Roman" w:cs="Times New Roman" w:eastAsia="Times New Roman"/>
-        </w:rPr>
-      </w:pPr>
-      <w:r>
-        <w:rPr>
-          <w:rFonts w:cstheme="minorHAnsi" w:ascii="Times New Roman" w:hAnsi="Times New Roman" w:cs="Times New Roman" w:eastAsia="Times New Roman"/>
-          <w:lang w:val="en-US"/>
-        </w:rPr>
-        <w:t xml:space="preserve">LISTE DES TABLEAUX ....................................................  </w:t>
-      </w:r>
-    </w:p>
-    <w:p ns2:paraId="475FDED9" ns2:textId="599A275E">
-      <w:pPr>
-        <w:widowControl/>
-        <w:spacing w:before="0" w:after="120" w:line="360" w:lineRule="auto"/>
-        <w:ind w:firstLine="0"/>
-        <w:jc w:val="both"/>
-        <w:rPr>
-          <w:rFonts w:cstheme="minorHAnsi" w:ascii="Times New Roman" w:hAnsi="Times New Roman" w:cs="Times New Roman" w:eastAsia="Times New Roman"/>
-        </w:rPr>
-      </w:pPr>
-      <w:r>
-        <w:rPr>
-          <w:rFonts w:cstheme="minorHAnsi" w:ascii="Times New Roman" w:hAnsi="Times New Roman" w:cs="Times New Roman" w:eastAsia="Times New Roman"/>
-          <w:lang w:val="en-US"/>
-        </w:rPr>
-        <w:t xml:space="preserve">LISTE DES GRAPHIQUES ................................................  </w:t>
-      </w:r>
-    </w:p>
-    <w:p ns2:paraId="43F5112F" ns2:textId="49E3F928">
-      <w:pPr>
-        <w:widowControl/>
-        <w:spacing w:before="0" w:after="120" w:line="360" w:lineRule="auto"/>
-        <w:ind w:firstLine="0"/>
-        <w:jc w:val="both"/>
-        <w:rPr>
-          <w:rFonts w:cstheme="minorHAnsi" w:ascii="Times New Roman" w:hAnsi="Times New Roman" w:cs="Times New Roman" w:eastAsia="Times New Roman"/>
-        </w:rPr>
-      </w:pPr>
-      <w:r>
-        <w:rPr>
-          <w:rFonts w:cstheme="minorHAnsi" w:ascii="Times New Roman" w:hAnsi="Times New Roman" w:cs="Times New Roman" w:eastAsia="Times New Roman"/>
-          <w:lang w:val="en-US"/>
-        </w:rPr>
-        <w:t xml:space="preserve">RÉSUMÉ .............................................................................   </w:t>
-      </w:r>
-    </w:p>
-    <w:p ns2:paraId="2BA1168F" ns2:textId="3E5D243D">
-      <w:pPr>
-        <w:widowControl/>
-        <w:spacing w:before="0" w:after="120" w:line="360" w:lineRule="auto"/>
-        <w:ind w:firstLine="0"/>
-        <w:jc w:val="both"/>
-        <w:rPr>
-          <w:rFonts w:cstheme="minorHAnsi" w:ascii="Times New Roman" w:hAnsi="Times New Roman" w:cs="Times New Roman" w:eastAsia="Times New Roman"/>
-        </w:rPr>
-      </w:pPr>
-      <w:r>
-        <w:rPr>
-          <w:rFonts w:cstheme="minorHAnsi" w:ascii="Times New Roman" w:hAnsi="Times New Roman" w:cs="Times New Roman" w:eastAsia="Times New Roman"/>
-          <w:lang w:val="en-US"/>
-        </w:rPr>
-        <w:t xml:space="preserve">ABSTRACT ..........................................................................   </w:t>
-      </w:r>
-    </w:p>
-    <w:p ns2:paraId="5DEB47A9" ns2:textId="717E0237">
-      <w:pPr>
-        <w:widowControl/>
-        <w:spacing w:before="0" w:after="120" w:line="360" w:lineRule="auto"/>
-        <w:ind w:firstLine="0"/>
-        <w:jc w:val="both"/>
-        <w:rPr>
-          <w:rFonts w:cstheme="minorHAnsi" w:ascii="Times New Roman" w:hAnsi="Times New Roman" w:cs="Times New Roman" w:eastAsia="Times New Roman"/>
-        </w:rPr>
-      </w:pPr>
-      <w:r>
-        <w:rPr>
-          <w:rFonts w:cstheme="minorHAnsi" w:ascii="Times New Roman" w:hAnsi="Times New Roman" w:cs="Times New Roman" w:eastAsia="Times New Roman"/>
-          <w:lang w:val="en-US"/>
-        </w:rPr>
-        <w:t xml:space="preserve">INTRODUCTION .................................................................   </w:t>
-      </w:r>
-    </w:p>
-    <w:p ns2:paraId="262904D3" ns2:textId="43E634A2">
-      <w:pPr>
-        <w:widowControl/>
-        <w:spacing w:before="0" w:after="120" w:line="360" w:lineRule="auto"/>
-        <w:ind w:firstLine="0"/>
-        <w:jc w:val="both"/>
-        <w:rPr>
-          <w:rFonts w:cstheme="minorHAnsi" w:ascii="Times New Roman" w:hAnsi="Times New Roman" w:cs="Times New Roman" w:eastAsia="Times New Roman"/>
-        </w:rPr>
-      </w:pPr>
-      <w:r>
-        <w:rPr>
-          <w:rFonts w:cstheme="minorHAnsi" w:ascii="Times New Roman" w:hAnsi="Times New Roman" w:cs="Times New Roman" w:eastAsia="Times New Roman"/>
-          <w:lang w:val="en-US"/>
-        </w:rPr>
-        <w:t xml:space="preserve">CHAPITRE </w:t>
-      </w:r>
-      <w:proofErr w:type="gramStart"/>
-      <w:r>
-        <w:rPr>
-          <w:rFonts w:cstheme="minorHAnsi" w:ascii="Times New Roman" w:hAnsi="Times New Roman" w:cs="Times New Roman" w:eastAsia="Times New Roman"/>
-          <w:lang w:val="en-US"/>
-        </w:rPr>
-        <w:t>I :</w:t>
-      </w:r>
-      <w:proofErr w:type="gramEnd"/>
-      <w:r>
-        <w:rPr>
-          <w:rFonts w:cstheme="minorHAnsi" w:ascii="Times New Roman" w:hAnsi="Times New Roman" w:cs="Times New Roman" w:eastAsia="Times New Roman"/>
-          <w:lang w:val="en-US"/>
-        </w:rPr>
-        <w:t xml:space="preserve"> CADRE INSTITUTIONNEL DE LA RECHERCHE ....   </w:t>
-      </w:r>
-    </w:p>
-    <w:p ns2:paraId="0EAAD1BF" ns2:textId="138FAE08">
-      <w:pPr>
-        <w:widowControl/>
-        <w:spacing w:before="0" w:after="120" w:line="360" w:lineRule="auto"/>
-        <w:ind w:firstLine="0"/>
-        <w:jc w:val="both"/>
-        <w:rPr>
-          <w:rFonts w:cstheme="minorHAnsi" w:ascii="Times New Roman" w:hAnsi="Times New Roman" w:cs="Times New Roman" w:eastAsia="Times New Roman"/>
-        </w:rPr>
-      </w:pPr>
-      <w:r>
-        <w:rPr>
-          <w:rFonts w:cstheme="minorHAnsi" w:ascii="Times New Roman" w:hAnsi="Times New Roman" w:cs="Times New Roman" w:eastAsia="Times New Roman"/>
-          <w:lang w:val="en-US"/>
-        </w:rPr>
-        <w:t xml:space="preserve">CHAPITRE </w:t>
-      </w:r>
-      <w:proofErr w:type="gramStart"/>
-      <w:r>
-        <w:rPr>
-          <w:rFonts w:cstheme="minorHAnsi" w:ascii="Times New Roman" w:hAnsi="Times New Roman" w:cs="Times New Roman" w:eastAsia="Times New Roman"/>
-          <w:lang w:val="en-US"/>
-        </w:rPr>
-        <w:t>II :</w:t>
-      </w:r>
-      <w:proofErr w:type="gramEnd"/>
-      <w:r>
-        <w:rPr>
-          <w:rFonts w:cstheme="minorHAnsi" w:ascii="Times New Roman" w:hAnsi="Times New Roman" w:cs="Times New Roman" w:eastAsia="Times New Roman"/>
-          <w:lang w:val="en-US"/>
-        </w:rPr>
-        <w:t xml:space="preserve"> CADRE CONCEPTUEL, THÉORIQUE ET MÉTHODOLOGIQUE.........................................................  </w:t>
-      </w:r>
-    </w:p>
-    <w:p ns2:paraId="4A3D3D9D" ns2:textId="05C79DDA">
-      <w:pPr>
-        <w:widowControl/>
-        <w:spacing w:before="0" w:after="120" w:line="360" w:lineRule="auto"/>
-        <w:ind w:firstLine="0"/>
-        <w:jc w:val="both"/>
-        <w:rPr>
-          <w:rFonts w:cstheme="minorHAnsi" w:ascii="Times New Roman" w:hAnsi="Times New Roman" w:cs="Times New Roman" w:eastAsia="Times New Roman"/>
-        </w:rPr>
-      </w:pPr>
-      <w:r>
-        <w:rPr>
-          <w:rFonts w:cstheme="minorHAnsi" w:ascii="Times New Roman" w:hAnsi="Times New Roman" w:cs="Times New Roman" w:eastAsia="Times New Roman"/>
-          <w:lang w:val="en-US"/>
-        </w:rPr>
-        <w:t xml:space="preserve">CHAPITRE </w:t>
-      </w:r>
-      <w:proofErr w:type="gramStart"/>
-      <w:r>
-        <w:rPr>
-          <w:rFonts w:cstheme="minorHAnsi" w:ascii="Times New Roman" w:hAnsi="Times New Roman" w:cs="Times New Roman" w:eastAsia="Times New Roman"/>
-          <w:lang w:val="en-US"/>
-        </w:rPr>
-        <w:t>III :</w:t>
-      </w:r>
-      <w:proofErr w:type="gramEnd"/>
-      <w:r>
-        <w:rPr>
-          <w:rFonts w:cstheme="minorHAnsi" w:ascii="Times New Roman" w:hAnsi="Times New Roman" w:cs="Times New Roman" w:eastAsia="Times New Roman"/>
-          <w:lang w:val="en-US"/>
-        </w:rPr>
-        <w:t xml:space="preserve"> PRÉSENTATION, ANALYSE DES DONNÉES ET SUGGESTIONS ................................................................   </w:t>
-      </w:r>
-    </w:p>
-    <w:p ns2:paraId="2A7196D7" ns2:textId="716EC552">
-      <w:pPr>
-        <w:widowControl/>
-        <w:spacing w:before="0" w:after="120" w:line="360" w:lineRule="auto"/>
-        <w:ind w:firstLine="0"/>
-        <w:jc w:val="both"/>
-        <w:rPr>
-          <w:rFonts w:cstheme="minorHAnsi" w:ascii="Times New Roman" w:hAnsi="Times New Roman" w:cs="Times New Roman" w:eastAsia="Times New Roman"/>
-        </w:rPr>
-      </w:pPr>
-      <w:r>
-        <w:rPr>
-          <w:rFonts w:cstheme="minorHAnsi" w:ascii="Times New Roman" w:hAnsi="Times New Roman" w:cs="Times New Roman" w:eastAsia="Times New Roman"/>
-          <w:lang w:val="en-US"/>
-        </w:rPr>
-        <w:t xml:space="preserve">CONCLUSION GÉNÉRALE .................................................   </w:t>
-      </w:r>
-    </w:p>
-    <w:p ns2:paraId="62B471AC" ns2:textId="5F5559D7">
-      <w:pPr>
-        <w:widowControl/>
-        <w:spacing w:before="0" w:after="120" w:line="360" w:lineRule="auto"/>
-        <w:ind w:firstLine="0"/>
-        <w:jc w:val="both"/>
-        <w:rPr>
-          <w:rFonts w:cstheme="minorHAnsi" w:ascii="Times New Roman" w:hAnsi="Times New Roman" w:cs="Times New Roman" w:eastAsia="Times New Roman"/>
-        </w:rPr>
-      </w:pPr>
-      <w:r>
-        <w:rPr>
-          <w:rFonts w:cstheme="minorHAnsi" w:ascii="Times New Roman" w:hAnsi="Times New Roman" w:cs="Times New Roman" w:eastAsia="Times New Roman"/>
-          <w:lang w:val="en-US"/>
-        </w:rPr>
-        <w:t xml:space="preserve">RÉFÉRENCES BIBLIOGRAPHIQUES ................................. </w:t>
-      </w:r>
-    </w:p>
-    <w:p ns2:paraId="3F79BCD5" ns2:textId="0D145033">
-      <w:pPr>
-        <w:widowControl/>
-        <w:spacing w:before="0" w:after="120" w:line="360" w:lineRule="auto"/>
-        <w:ind w:firstLine="0"/>
-        <w:jc w:val="both"/>
-        <w:rPr>
-          <w:rFonts w:cstheme="minorHAnsi" w:ascii="Times New Roman" w:hAnsi="Times New Roman" w:cs="Times New Roman" w:eastAsia="Times New Roman"/>
-        </w:rPr>
-      </w:pPr>
-      <w:r>
-        <w:rPr>
-          <w:rFonts w:cstheme="minorHAnsi" w:ascii="Times New Roman" w:hAnsi="Times New Roman" w:cs="Times New Roman" w:eastAsia="Times New Roman"/>
-          <w:lang w:val="en-US"/>
-        </w:rPr>
-        <w:t xml:space="preserve">ANNEXES ........................................................................... </w:t>
-      </w:r>
-    </w:p>
     <w:p ns2:paraId="15EA53D2" ns2:textId="77777777">
       <w:pPr>
         <w:widowControl/>

</xml_diff>

<commit_message>
Vérification de la table des matières
</commit_message>
<xml_diff>
--- a/doc.docx
+++ b/doc.docx
@@ -13041,24 +13041,16 @@
             <w:tcW w:w="6941" w:type="dxa"/>
             <w:gridSpan w:val="2"/>
           </w:tcPr>
-          <w:p ns2:paraId="0A00D993" ns2:textId="5FD86850">
+          <w:p>
             <w:pPr>
               <w:pStyle w:val="MemoirePetit"/>
-              <w:tabs>
-                <w:tab w:val="left" w:pos="6190"/>
-              </w:tabs>
               <w:rPr>
                 <w:b/>
                 <w:bCs/>
               </w:rPr>
             </w:pPr>
             <w:r>
-              <w:rPr>
-                <w:b/>
-                <w:bCs/>
-              </w:rPr>
-              <w:lastRenderedPageBreak/>
-              <w:t>Sommaire</w:t>
+              <w:t>TABLE DES MATIÈRES</w:t>
             </w:r>
           </w:p>
         </w:tc>
@@ -13068,7 +13060,7 @@
           <w:tcPr>
             <w:tcW w:w="4764" w:type="dxa"/>
           </w:tcPr>
-          <w:p ns2:paraId="0E199F4B" ns2:textId="19761FCC">
+          <w:p>
             <w:pPr>
               <w:pStyle w:val="MemoirePetit"/>
               <w:rPr>
@@ -13076,10 +13068,7 @@
               </w:rPr>
             </w:pPr>
             <w:r>
-              <w:rPr>
-                <w:lang w:val="en-US"/>
-              </w:rPr>
-              <w:t xml:space="preserve">Introduction  </w:t>
+              <w:t>Introduction</w:t>
             </w:r>
           </w:p>
         </w:tc>
@@ -13087,14 +13076,13 @@
           <w:tcPr>
             <w:tcW w:w="2177" w:type="dxa"/>
           </w:tcPr>
-          <w:p ns2:paraId="0800CB41" ns2:textId="604CBA49">
+          <w:p>
             <w:pPr>
               <w:pStyle w:val="MemoirePetit"/>
               <w:rPr/>
             </w:pPr>
             <w:r>
-              <w:rPr/>
-              <w:t>P : 13</w:t>
+              <w:t>p. 16</w:t>
             </w:r>
           </w:p>
         </w:tc>
@@ -13104,121 +13092,7 @@
           <w:tcPr>
             <w:tcW w:w="4764" w:type="dxa"/>
           </w:tcPr>
-          <w:p ns2:paraId="47C69EA0" ns2:textId="0C269E4E">
-            <w:pPr>
-              <w:pStyle w:val="MemoirePetit"/>
-              <w:rPr>
-                <w:lang w:val="en-US"/>
-              </w:rPr>
-            </w:pPr>
-            <w:proofErr w:type="spellStart"/>
-            <w:r>
-              <w:rPr>
-                <w:b/>
-                <w:bCs/>
-                <w:lang w:val="en-US"/>
-              </w:rPr>
-              <w:t>Chapitre</w:t>
-            </w:r>
-            <w:proofErr w:type="spellEnd"/>
-            <w:r>
-              <w:rPr>
-                <w:b/>
-                <w:bCs/>
-                <w:lang w:val="en-US"/>
-              </w:rPr>
-              <w:t xml:space="preserve"> I:</w:t>
-            </w:r>
-            <w:r>
-              <w:rPr>
-                <w:lang w:val="en-US"/>
-              </w:rPr>
-              <w:t xml:space="preserve"> </w:t>
-            </w:r>
-            <w:proofErr w:type="spellStart"/>
-            <w:r>
-              <w:rPr>
-                <w:lang w:val="en-US"/>
-              </w:rPr>
-              <w:t>Environnement</w:t>
-            </w:r>
-            <w:proofErr w:type="spellEnd"/>
-            <w:r>
-              <w:rPr>
-                <w:lang w:val="en-US"/>
-              </w:rPr>
-              <w:t xml:space="preserve"> </w:t>
-            </w:r>
-            <w:proofErr w:type="spellStart"/>
-            <w:r>
-              <w:rPr>
-                <w:lang w:val="en-US"/>
-              </w:rPr>
-              <w:t>institutionnel</w:t>
-            </w:r>
-            <w:proofErr w:type="spellEnd"/>
-            <w:r>
-              <w:rPr>
-                <w:lang w:val="en-US"/>
-              </w:rPr>
-              <w:t xml:space="preserve"> de la </w:t>
-            </w:r>
-            <w:proofErr w:type="spellStart"/>
-            <w:r>
-              <w:rPr>
-                <w:lang w:val="en-US"/>
-              </w:rPr>
-              <w:t>recherche</w:t>
-            </w:r>
-            <w:proofErr w:type="spellEnd"/>
-            <w:r>
-              <w:rPr>
-                <w:lang w:val="en-US"/>
-              </w:rPr>
-              <w:t xml:space="preserve"> et </w:t>
-            </w:r>
-            <w:proofErr w:type="spellStart"/>
-            <w:r>
-              <w:rPr>
-                <w:lang w:val="en-US"/>
-              </w:rPr>
-              <w:t>déroulement</w:t>
-            </w:r>
-            <w:proofErr w:type="spellEnd"/>
-            <w:r>
-              <w:rPr>
-                <w:lang w:val="en-US"/>
-              </w:rPr>
-              <w:t xml:space="preserve"> du stage </w:t>
-            </w:r>
-          </w:p>
-        </w:tc>
-        <w:tc>
-          <w:tcPr>
-            <w:tcW w:w="2177" w:type="dxa"/>
-          </w:tcPr>
-          <w:p ns2:paraId="29C02A75" ns2:textId="5A3C8F27">
-            <w:pPr>
-              <w:pStyle w:val="MemoirePetit"/>
-              <w:rPr>
-                <w:lang w:val="en-US"/>
-              </w:rPr>
-            </w:pPr>
-            <w:r>
-              <w:rPr>
-                <w:lang w:val="en-US"/>
-              </w:rPr>
-              <w:t>P: 16</w:t>
-            </w:r>
-          </w:p>
-        </w:tc>
-      </w:tr>
-      <w:tr ns2:paraId="482F1C70" ns2:textId="77777777">
-        <w:tc>
-          <w:tcPr>
-            <w:tcW w:w="4764" w:type="dxa"/>
-          </w:tcPr>
-          <w:p ns2:paraId="382A43E6" ns2:textId="3E1635B6">
+          <w:p>
             <w:pPr>
               <w:pStyle w:val="MemoirePetit"/>
               <w:rPr>
@@ -13229,59 +13103,16 @@
               <w:rPr>
                 <w:b/>
                 <w:bCs/>
-                <w:lang w:val="en-US"/>
               </w:rPr>
-              <w:t>Section1:</w:t>
+              <w:t>Chapitre I : Environnement institutionnel de la recherche et déroulement du stage</w:t>
             </w:r>
-            <w:r>
-              <w:rPr>
-                <w:lang w:val="en-US"/>
-              </w:rPr>
-              <w:t xml:space="preserve"> </w:t>
-            </w:r>
-            <w:proofErr w:type="spellStart"/>
-            <w:r>
-              <w:rPr>
-                <w:lang w:val="en-US"/>
-              </w:rPr>
-              <w:t>Présentation</w:t>
-            </w:r>
-            <w:proofErr w:type="spellEnd"/>
-            <w:r>
-              <w:rPr>
-                <w:lang w:val="en-US"/>
-              </w:rPr>
-              <w:t xml:space="preserve">, de la </w:t>
-            </w:r>
-            <w:proofErr w:type="spellStart"/>
-            <w:r>
-              <w:rPr>
-                <w:lang w:val="en-US"/>
-              </w:rPr>
-              <w:t>mairie</w:t>
-            </w:r>
-            <w:proofErr w:type="spellEnd"/>
-            <w:r>
-              <w:rPr>
-                <w:lang w:val="en-US"/>
-              </w:rPr>
-              <w:t xml:space="preserve"> de </w:t>
-            </w:r>
-            <w:proofErr w:type="spellStart"/>
-            <w:r>
-              <w:rPr>
-                <w:lang w:val="en-US"/>
-              </w:rPr>
-              <w:t>Kérou</w:t>
-            </w:r>
-            <w:proofErr w:type="spellEnd"/>
           </w:p>
         </w:tc>
         <w:tc>
           <w:tcPr>
             <w:tcW w:w="2177" w:type="dxa"/>
           </w:tcPr>
-          <w:p ns2:paraId="487B95D0" ns2:textId="3692D32D">
+          <w:p>
             <w:pPr>
               <w:pStyle w:val="MemoirePetit"/>
               <w:rPr>
@@ -13289,10 +13120,42 @@
               </w:rPr>
             </w:pPr>
             <w:r>
+              <w:t>p. 19</w:t>
+            </w:r>
+          </w:p>
+        </w:tc>
+      </w:tr>
+      <w:tr ns2:paraId="482F1C70" ns2:textId="77777777">
+        <w:tc>
+          <w:tcPr>
+            <w:tcW w:w="4764" w:type="dxa"/>
+          </w:tcPr>
+          <w:p>
+            <w:pPr>
+              <w:pStyle w:val="MemoirePetit"/>
               <w:rPr>
                 <w:lang w:val="en-US"/>
               </w:rPr>
-              <w:t>P: 17</w:t>
+              <w:ind w:left="420"/>
+            </w:pPr>
+            <w:r>
+              <w:t>1.1 Section 1 : Présentation de la mairie de Kérou</w:t>
+            </w:r>
+          </w:p>
+        </w:tc>
+        <w:tc>
+          <w:tcPr>
+            <w:tcW w:w="2177" w:type="dxa"/>
+          </w:tcPr>
+          <w:p>
+            <w:pPr>
+              <w:pStyle w:val="MemoirePetit"/>
+              <w:rPr>
+                <w:lang w:val="en-US"/>
+              </w:rPr>
+            </w:pPr>
+            <w:r>
+              <w:t>p. 20</w:t>
             </w:r>
           </w:p>
         </w:tc>
@@ -13302,66 +13165,14 @@
           <w:tcPr>
             <w:tcW w:w="4764" w:type="dxa"/>
           </w:tcPr>
-          <w:p ns2:paraId="6FE6CB70" ns2:textId="2FD0A94B">
+          <w:p>
             <w:pPr>
               <w:pStyle w:val="MemoirePetit"/>
               <w:rPr/>
+              <w:ind w:left="420"/>
             </w:pPr>
             <w:r>
-              <w:rPr>
-                <w:b/>
-                <w:bCs/>
-                <w:lang w:val="en-US"/>
-              </w:rPr>
-              <w:t>Section2:</w:t>
-            </w:r>
-            <w:r>
-              <w:rPr>
-                <w:lang w:val="en-US"/>
-              </w:rPr>
-              <w:t xml:space="preserve"> </w:t>
-            </w:r>
-            <w:proofErr w:type="spellStart"/>
-            <w:r>
-              <w:rPr>
-                <w:lang w:val="en-US"/>
-              </w:rPr>
-              <w:t>Déroulement</w:t>
-            </w:r>
-            <w:proofErr w:type="spellEnd"/>
-            <w:r>
-              <w:rPr>
-                <w:lang w:val="en-US"/>
-              </w:rPr>
-              <w:t xml:space="preserve"> du stage et </w:t>
-            </w:r>
-            <w:proofErr w:type="spellStart"/>
-            <w:r>
-              <w:rPr>
-                <w:lang w:val="en-US"/>
-              </w:rPr>
-              <w:t>état</w:t>
-            </w:r>
-            <w:proofErr w:type="spellEnd"/>
-            <w:r>
-              <w:rPr>
-                <w:lang w:val="en-US"/>
-              </w:rPr>
-              <w:t xml:space="preserve"> des </w:t>
-            </w:r>
-            <w:proofErr w:type="spellStart"/>
-            <w:r>
-              <w:rPr>
-                <w:lang w:val="en-US"/>
-              </w:rPr>
-              <w:t>lieux</w:t>
-            </w:r>
-            <w:proofErr w:type="spellEnd"/>
-            <w:r>
-              <w:rPr>
-                <w:lang w:val="en-US"/>
-              </w:rPr>
-              <w:t xml:space="preserve">  </w:t>
+              <w:t>1.2 Section 2 : Déroulement du stage et état des lieux</w:t>
             </w:r>
           </w:p>
         </w:tc>
@@ -13369,7 +13180,7 @@
           <w:tcPr>
             <w:tcW w:w="2177" w:type="dxa"/>
           </w:tcPr>
-          <w:p ns2:paraId="04177B75" ns2:textId="3DFF78B9">
+          <w:p>
             <w:pPr>
               <w:pStyle w:val="MemoirePetit"/>
               <w:rPr>
@@ -13377,10 +13188,7 @@
               </w:rPr>
             </w:pPr>
             <w:r>
-              <w:rPr>
-                <w:lang w:val="en-US"/>
-              </w:rPr>
-              <w:t>P: 25</w:t>
+              <w:t>p. 30</w:t>
             </w:r>
           </w:p>
         </w:tc>
@@ -13390,101 +13198,7 @@
           <w:tcPr>
             <w:tcW w:w="4764" w:type="dxa"/>
           </w:tcPr>
-          <w:p ns2:paraId="06034616" ns2:textId="498492F9">
-            <w:pPr>
-              <w:pStyle w:val="MemoirePetit"/>
-              <w:rPr>
-                <w:lang w:val="en-US"/>
-              </w:rPr>
-            </w:pPr>
-            <w:proofErr w:type="spellStart"/>
-            <w:r>
-              <w:rPr>
-                <w:b/>
-                <w:bCs/>
-                <w:lang w:val="en-US"/>
-              </w:rPr>
-              <w:t>Chapitre</w:t>
-            </w:r>
-            <w:proofErr w:type="spellEnd"/>
-            <w:r>
-              <w:rPr>
-                <w:b/>
-                <w:bCs/>
-                <w:lang w:val="en-US"/>
-              </w:rPr>
-              <w:t xml:space="preserve"> II:</w:t>
-            </w:r>
-            <w:r>
-              <w:rPr>
-                <w:lang w:val="en-US"/>
-              </w:rPr>
-              <w:t xml:space="preserve">  Aspect </w:t>
-            </w:r>
-            <w:proofErr w:type="spellStart"/>
-            <w:r>
-              <w:rPr>
-                <w:lang w:val="en-US"/>
-              </w:rPr>
-              <w:t>théorique</w:t>
-            </w:r>
-            <w:proofErr w:type="spellEnd"/>
-            <w:r>
-              <w:rPr>
-                <w:lang w:val="en-US"/>
-              </w:rPr>
-              <w:t xml:space="preserve"> et </w:t>
-            </w:r>
-            <w:proofErr w:type="spellStart"/>
-            <w:r>
-              <w:rPr>
-                <w:lang w:val="en-US"/>
-              </w:rPr>
-              <w:t>méthodologique</w:t>
-            </w:r>
-            <w:proofErr w:type="spellEnd"/>
-            <w:r>
-              <w:rPr>
-                <w:lang w:val="en-US"/>
-              </w:rPr>
-              <w:t xml:space="preserve"> de la </w:t>
-            </w:r>
-            <w:proofErr w:type="spellStart"/>
-            <w:r>
-              <w:rPr>
-                <w:lang w:val="en-US"/>
-              </w:rPr>
-              <w:t>recherche</w:t>
-            </w:r>
-            <w:proofErr w:type="spellEnd"/>
-          </w:p>
-        </w:tc>
-        <w:tc>
-          <w:tcPr>
-            <w:tcW w:w="2177" w:type="dxa"/>
-          </w:tcPr>
-          <w:p ns2:paraId="46A47017" ns2:textId="186A7CB5">
-            <w:pPr>
-              <w:pStyle w:val="MemoirePetit"/>
-              <w:rPr>
-                <w:lang w:val="en-US"/>
-              </w:rPr>
-            </w:pPr>
-            <w:r>
-              <w:rPr>
-                <w:lang w:val="en-US"/>
-              </w:rPr>
-              <w:t xml:space="preserve"> P: 28</w:t>
-            </w:r>
-          </w:p>
-        </w:tc>
-      </w:tr>
-      <w:tr ns2:paraId="74B7A4C9" ns2:textId="77777777">
-        <w:tc>
-          <w:tcPr>
-            <w:tcW w:w="4764" w:type="dxa"/>
-          </w:tcPr>
-          <w:p ns2:paraId="4117C8E9" ns2:textId="77777777">
+          <w:p>
             <w:pPr>
               <w:pStyle w:val="MemoirePetit"/>
               <w:rPr>
@@ -13495,45 +13209,16 @@
               <w:rPr>
                 <w:b/>
                 <w:bCs/>
-                <w:lang w:val="en-US"/>
               </w:rPr>
-              <w:t>Section 1:</w:t>
+              <w:t>Chapitre II : Aspects théorique et méthodologique de la recherche</w:t>
             </w:r>
-            <w:r>
-              <w:rPr>
-                <w:lang w:val="en-US"/>
-              </w:rPr>
-              <w:t xml:space="preserve"> Cadre </w:t>
-            </w:r>
-            <w:proofErr w:type="spellStart"/>
-            <w:r>
-              <w:rPr>
-                <w:lang w:val="en-US"/>
-              </w:rPr>
-              <w:t>théorique</w:t>
-            </w:r>
-            <w:proofErr w:type="spellEnd"/>
-            <w:r>
-              <w:rPr>
-                <w:lang w:val="en-US"/>
-              </w:rPr>
-              <w:t xml:space="preserve"> de la </w:t>
-            </w:r>
-            <w:proofErr w:type="spellStart"/>
-            <w:r>
-              <w:rPr>
-                <w:lang w:val="en-US"/>
-              </w:rPr>
-              <w:t>recherche</w:t>
-            </w:r>
-            <w:proofErr w:type="spellEnd"/>
           </w:p>
         </w:tc>
         <w:tc>
           <w:tcPr>
             <w:tcW w:w="2177" w:type="dxa"/>
           </w:tcPr>
-          <w:p ns2:paraId="48836B49" ns2:textId="019AF99C">
+          <w:p>
             <w:pPr>
               <w:pStyle w:val="MemoirePetit"/>
               <w:rPr>
@@ -13541,10 +13226,42 @@
               </w:rPr>
             </w:pPr>
             <w:r>
+              <w:t>p. 33</w:t>
+            </w:r>
+          </w:p>
+        </w:tc>
+      </w:tr>
+      <w:tr ns2:paraId="74B7A4C9" ns2:textId="77777777">
+        <w:tc>
+          <w:tcPr>
+            <w:tcW w:w="4764" w:type="dxa"/>
+          </w:tcPr>
+          <w:p>
+            <w:pPr>
+              <w:pStyle w:val="MemoirePetit"/>
               <w:rPr>
                 <w:lang w:val="en-US"/>
               </w:rPr>
-              <w:t>P: 29</w:t>
+              <w:ind w:left="420"/>
+            </w:pPr>
+            <w:r>
+              <w:t>2.1 Section 1 : Cadre théorique de la recherche</w:t>
+            </w:r>
+          </w:p>
+        </w:tc>
+        <w:tc>
+          <w:tcPr>
+            <w:tcW w:w="2177" w:type="dxa"/>
+          </w:tcPr>
+          <w:p>
+            <w:pPr>
+              <w:pStyle w:val="MemoirePetit"/>
+              <w:rPr>
+                <w:lang w:val="en-US"/>
+              </w:rPr>
+            </w:pPr>
+            <w:r>
+              <w:t>p. 34</w:t>
             </w:r>
           </w:p>
         </w:tc>
@@ -13554,7 +13271,7 @@
           <w:tcPr>
             <w:tcW w:w="4764" w:type="dxa"/>
           </w:tcPr>
-          <w:p ns2:paraId="380F0089" ns2:textId="60F0EA46">
+          <w:p>
             <w:pPr>
               <w:pStyle w:val="MemoirePetit"/>
               <w:rPr>
@@ -13562,74 +13279,18 @@
                 <w:bCs/>
                 <w:lang w:val="en-US"/>
               </w:rPr>
+              <w:ind w:left="420"/>
             </w:pPr>
             <w:r>
-              <w:rPr>
-                <w:b/>
-                <w:bCs/>
-                <w:lang w:val="en-US"/>
-              </w:rPr>
-              <w:t xml:space="preserve">Section 2: </w:t>
+              <w:t>2.2 Section 2 : Démarche méthodologique adoptée et revue de la littérature</w:t>
             </w:r>
-            <w:proofErr w:type="spellStart"/>
-            <w:r>
-              <w:rPr>
-                <w:lang w:val="en-US"/>
-              </w:rPr>
-              <w:t>Démarche</w:t>
-            </w:r>
-            <w:proofErr w:type="spellEnd"/>
-            <w:r>
-              <w:rPr>
-                <w:b/>
-                <w:bCs/>
-                <w:lang w:val="en-US"/>
-              </w:rPr>
-              <w:t xml:space="preserve"> </w:t>
-            </w:r>
-            <w:proofErr w:type="spellStart"/>
-            <w:r>
-              <w:rPr>
-                <w:lang w:val="en-US"/>
-              </w:rPr>
-              <w:t>méthodologique</w:t>
-            </w:r>
-            <w:proofErr w:type="spellEnd"/>
-            <w:r>
-              <w:rPr>
-                <w:lang w:val="en-US"/>
-              </w:rPr>
-              <w:t xml:space="preserve"> </w:t>
-            </w:r>
-            <w:proofErr w:type="spellStart"/>
-            <w:r>
-              <w:rPr>
-                <w:lang w:val="en-US"/>
-              </w:rPr>
-              <w:t>adoptée</w:t>
-            </w:r>
-            <w:proofErr w:type="spellEnd"/>
-            <w:r>
-              <w:rPr>
-                <w:lang w:val="en-US"/>
-              </w:rPr>
-              <w:t xml:space="preserve"> et revue de la </w:t>
-            </w:r>
-            <w:proofErr w:type="spellStart"/>
-            <w:r>
-              <w:rPr>
-                <w:lang w:val="en-US"/>
-              </w:rPr>
-              <w:t>littérature</w:t>
-            </w:r>
-            <w:proofErr w:type="spellEnd"/>
           </w:p>
         </w:tc>
         <w:tc>
           <w:tcPr>
             <w:tcW w:w="2177" w:type="dxa"/>
           </w:tcPr>
-          <w:p ns2:paraId="3294552D" ns2:textId="571403B7">
+          <w:p>
             <w:pPr>
               <w:pStyle w:val="MemoirePetit"/>
               <w:rPr>
@@ -13637,10 +13298,7 @@
               </w:rPr>
             </w:pPr>
             <w:r>
-              <w:rPr>
-                <w:lang w:val="en-US"/>
-              </w:rPr>
-              <w:t>P: 33</w:t>
+              <w:t>p. 37</w:t>
             </w:r>
           </w:p>
         </w:tc>
@@ -13650,157 +13308,33 @@
           <w:tcPr>
             <w:tcW w:w="4764" w:type="dxa"/>
           </w:tcPr>
-          <w:p ns2:paraId="4439A7FC" ns2:textId="14F76647">
+          <w:p>
             <w:pPr>
               <w:pStyle w:val="MemoirePetit"/>
               <w:rPr>
                 <w:lang w:val="en-US"/>
               </w:rPr>
             </w:pPr>
-            <w:proofErr w:type="spellStart"/>
             <w:r>
               <w:rPr>
                 <w:b/>
                 <w:bCs/>
-                <w:lang w:val="en-US"/>
               </w:rPr>
-              <w:t>Chapitre</w:t>
+              <w:t>Chapitre III : Interprétation des données, analyse des résultats et approches de solutions aux problèmes identifiés</w:t>
             </w:r>
-            <w:proofErr w:type="spellEnd"/>
-            <w:r>
-              <w:rPr>
-                <w:b/>
-                <w:bCs/>
-                <w:lang w:val="en-US"/>
-              </w:rPr>
-              <w:t xml:space="preserve"> III:</w:t>
-            </w:r>
-            <w:r>
-              <w:rPr>
-                <w:lang w:val="en-US"/>
-              </w:rPr>
-              <w:t xml:space="preserve"> Interpretation des </w:t>
-            </w:r>
-            <w:proofErr w:type="spellStart"/>
-            <w:r>
-              <w:rPr>
-                <w:lang w:val="en-US"/>
-              </w:rPr>
-              <w:t>données</w:t>
-            </w:r>
-            <w:proofErr w:type="spellEnd"/>
-            <w:r>
-              <w:rPr>
-                <w:lang w:val="en-US"/>
-              </w:rPr>
-              <w:t xml:space="preserve">, </w:t>
-            </w:r>
-            <w:proofErr w:type="spellStart"/>
-            <w:r>
-              <w:rPr>
-                <w:lang w:val="en-US"/>
-              </w:rPr>
-              <w:t>analyse</w:t>
-            </w:r>
-            <w:proofErr w:type="spellEnd"/>
-            <w:r>
-              <w:rPr>
-                <w:lang w:val="en-US"/>
-              </w:rPr>
-              <w:t xml:space="preserve"> des </w:t>
-            </w:r>
-            <w:proofErr w:type="spellStart"/>
-            <w:r>
-              <w:rPr>
-                <w:lang w:val="en-US"/>
-              </w:rPr>
-              <w:t>résultats</w:t>
-            </w:r>
-            <w:proofErr w:type="spellEnd"/>
-            <w:r>
-              <w:rPr>
-                <w:lang w:val="en-US"/>
-              </w:rPr>
-              <w:t xml:space="preserve"> et </w:t>
-            </w:r>
-            <w:proofErr w:type="spellStart"/>
-            <w:r>
-              <w:rPr>
-                <w:lang w:val="en-US"/>
-              </w:rPr>
-              <w:t>approche</w:t>
-            </w:r>
-            <w:proofErr w:type="spellEnd"/>
-            <w:r>
-              <w:rPr>
-                <w:lang w:val="en-US"/>
-              </w:rPr>
-              <w:t xml:space="preserve"> de solutions aux </w:t>
-            </w:r>
-            <w:proofErr w:type="spellStart"/>
-            <w:r>
-              <w:rPr>
-                <w:lang w:val="en-US"/>
-              </w:rPr>
-              <w:t>probl</w:t>
-            </w:r>
-            <w:r>
-              <w:rPr>
-                <w:lang w:val="en-US"/>
-              </w:rPr>
-              <w:t>è</w:t>
-            </w:r>
-            <w:r>
-              <w:rPr>
-                <w:lang w:val="en-US"/>
-              </w:rPr>
-              <w:t>m</w:t>
-            </w:r>
-            <w:r>
-              <w:rPr>
-                <w:lang w:val="en-US"/>
-              </w:rPr>
-              <w:t>e</w:t>
-            </w:r>
-            <w:r>
-              <w:rPr>
-                <w:lang w:val="en-US"/>
-              </w:rPr>
-              <w:t>s</w:t>
-            </w:r>
-            <w:proofErr w:type="spellEnd"/>
-            <w:r>
-              <w:rPr>
-                <w:lang w:val="en-US"/>
-              </w:rPr>
-              <w:t xml:space="preserve"> </w:t>
-            </w:r>
-            <w:proofErr w:type="spellStart"/>
-            <w:r>
-              <w:rPr>
-                <w:lang w:val="en-US"/>
-              </w:rPr>
-              <w:t>identifiés</w:t>
-            </w:r>
-            <w:proofErr w:type="spellEnd"/>
           </w:p>
         </w:tc>
         <w:tc>
           <w:tcPr>
             <w:tcW w:w="2177" w:type="dxa"/>
           </w:tcPr>
-          <w:p ns2:paraId="72EE36DA" ns2:textId="2C18BC35">
+          <w:p>
             <w:pPr>
               <w:pStyle w:val="MemoirePetit"/>
               <w:rPr/>
             </w:pPr>
             <w:r>
-              <w:rPr/>
-              <w:t xml:space="preserve">    </w:t>
-            </w:r>
-            <w:r>
-              <w:rPr/>
-              <w:t>P : 40</w:t>
+              <w:t>p. 47</w:t>
             </w:r>
           </w:p>
         </w:tc>
@@ -13810,7 +13344,7 @@
           <w:tcPr>
             <w:tcW w:w="4764" w:type="dxa"/>
           </w:tcPr>
-          <w:p ns2:paraId="16870832" ns2:textId="5D0304F0">
+          <w:p>
             <w:pPr>
               <w:pStyle w:val="MemoirePetit"/>
               <w:rPr>
@@ -13818,82 +13352,24 @@
                 <w:bCs/>
                 <w:lang w:val="en-US"/>
               </w:rPr>
+              <w:ind w:left="420"/>
             </w:pPr>
             <w:r>
-              <w:rPr>
-                <w:b/>
-                <w:bCs/>
-              </w:rPr>
-              <w:t>Section1 :</w:t>
+              <w:t>3.1 Section 1 : Présentation, analyse des données et validation des hypothèses, discussion des résultats</w:t>
             </w:r>
-            <w:r>
-              <w:rPr/>
-              <w:t xml:space="preserve"> </w:t>
-            </w:r>
-            <w:proofErr w:type="spellStart"/>
-            <w:r>
-              <w:rPr>
-                <w:lang w:val="en-US"/>
-              </w:rPr>
-              <w:t>Présentation</w:t>
-            </w:r>
-            <w:proofErr w:type="spellEnd"/>
-            <w:r>
-              <w:rPr>
-                <w:lang w:val="en-US"/>
-              </w:rPr>
-              <w:t xml:space="preserve">, </w:t>
-            </w:r>
-            <w:proofErr w:type="spellStart"/>
-            <w:r>
-              <w:rPr>
-                <w:lang w:val="en-US"/>
-              </w:rPr>
-              <w:t>analyse</w:t>
-            </w:r>
-            <w:proofErr w:type="spellEnd"/>
-            <w:r>
-              <w:rPr>
-                <w:lang w:val="en-US"/>
-              </w:rPr>
-              <w:t xml:space="preserve"> des </w:t>
-            </w:r>
-            <w:proofErr w:type="spellStart"/>
-            <w:r>
-              <w:rPr>
-                <w:lang w:val="en-US"/>
-              </w:rPr>
-              <w:t>données</w:t>
-            </w:r>
-            <w:proofErr w:type="spellEnd"/>
-            <w:r>
-              <w:rPr>
-                <w:lang w:val="en-US"/>
-              </w:rPr>
-              <w:t xml:space="preserve"> et validation des </w:t>
-            </w:r>
-            <w:proofErr w:type="spellStart"/>
-            <w:r>
-              <w:rPr>
-                <w:lang w:val="en-US"/>
-              </w:rPr>
-              <w:t>hypothèses</w:t>
-            </w:r>
-            <w:proofErr w:type="spellEnd"/>
           </w:p>
         </w:tc>
         <w:tc>
           <w:tcPr>
             <w:tcW w:w="2177" w:type="dxa"/>
           </w:tcPr>
-          <w:p ns2:paraId="555221A8" ns2:textId="28B9F108">
+          <w:p>
             <w:pPr>
               <w:pStyle w:val="MemoirePetit"/>
               <w:rPr/>
             </w:pPr>
             <w:r>
-              <w:rPr/>
-              <w:t>P : 41</w:t>
+              <w:t>p. 48</w:t>
             </w:r>
           </w:p>
         </w:tc>
@@ -13903,33 +13379,14 @@
           <w:tcPr>
             <w:tcW w:w="4764" w:type="dxa"/>
           </w:tcPr>
-          <w:p ns2:paraId="22DCAF31" ns2:textId="4C40DF5C">
+          <w:p>
             <w:pPr>
               <w:pStyle w:val="MemoirePetit"/>
               <w:rPr/>
+              <w:ind w:left="420"/>
             </w:pPr>
             <w:r>
-              <w:rPr>
-                <w:b/>
-                <w:bCs/>
-              </w:rPr>
-              <w:t>Section2 :</w:t>
-            </w:r>
-            <w:r>
-              <w:rPr/>
-              <w:t xml:space="preserve"> </w:t>
-            </w:r>
-            <w:r>
-              <w:rPr/>
-              <w:t>P</w:t>
-            </w:r>
-            <w:r>
-              <w:rPr/>
-              <w:t xml:space="preserve">erspectives d’amélioration </w:t>
-            </w:r>
-            <w:r>
-              <w:rPr/>
-              <w:t>et Suggestions</w:t>
+              <w:t>3.2 Section 2 : Perspectives d’amélioration et suggestions</w:t>
             </w:r>
           </w:p>
         </w:tc>
@@ -13937,14 +13394,13 @@
           <w:tcPr>
             <w:tcW w:w="2177" w:type="dxa"/>
           </w:tcPr>
-          <w:p ns2:paraId="0739AE17" ns2:textId="75E50F40">
+          <w:p>
             <w:pPr>
               <w:pStyle w:val="MemoirePetit"/>
               <w:rPr/>
             </w:pPr>
             <w:r>
-              <w:rPr/>
-              <w:t>P : 58</w:t>
+              <w:t>p. 65</w:t>
             </w:r>
           </w:p>
         </w:tc>
@@ -13954,7 +13410,7 @@
           <w:tcPr>
             <w:tcW w:w="4764" w:type="dxa"/>
           </w:tcPr>
-          <w:p ns2:paraId="25358252" ns2:textId="298D19DD">
+          <w:p>
             <w:pPr>
               <w:pStyle w:val="MemoirePetit"/>
               <w:rPr>
@@ -13963,12 +13419,7 @@
               </w:rPr>
             </w:pPr>
             <w:r>
-              <w:rPr>
-                <w:b/>
-                <w:bCs/>
-                <w:lang w:val="en-US"/>
-              </w:rPr>
-              <w:t xml:space="preserve">Conclusion   </w:t>
+              <w:t>Conclusion</w:t>
             </w:r>
           </w:p>
         </w:tc>
@@ -13976,7 +13427,7 @@
           <w:tcPr>
             <w:tcW w:w="2177" w:type="dxa"/>
           </w:tcPr>
-          <w:p ns2:paraId="10D5401C" ns2:textId="15D4184E">
+          <w:p>
             <w:pPr>
               <w:pStyle w:val="MemoirePetit"/>
               <w:rPr>
@@ -13984,14 +13435,7 @@
               </w:rPr>
             </w:pPr>
             <w:r>
-              <w:rPr/>
-              <w:t xml:space="preserve">P : </w:t>
-            </w:r>
-            <w:r>
-              <w:rPr>
-                <w:lang w:val="en-US"/>
-              </w:rPr>
-              <w:t>67</w:t>
+              <w:t>p. 71</w:t>
             </w:r>
           </w:p>
         </w:tc>
@@ -14274,39 +13718,10 @@
       </w:pPr>
     </w:p>
     <w:p>
-      <w:pPr>
-        <w:pageBreakBefore/>
-        <w:jc w:val="center"/>
-        <w:spacing w:before="240" w:after="240"/>
-      </w:pPr>
-      <w:r>
-        <w:rPr>
-          <w:b/>
-          <w:sz w:val="28"/>
-          <w:szCs w:val="28"/>
-        </w:rPr>
-        <w:t>TABLE DES MATIÈRES</w:t>
-      </w:r>
+      <w:pPr/>
     </w:p>
     <w:p>
-      <w:pPr>
-        <w:spacing w:after="120"/>
-      </w:pPr>
-      <w:r>
-        <w:fldChar w:fldChar="begin" w:dirty="true"/>
-      </w:r>
-      <w:r>
-        <w:instrText xml:space="preserve"> TOC \o "1-3" \h \u </w:instrText>
-      </w:r>
-      <w:r>
-        <w:fldChar w:fldChar="separate"/>
-      </w:r>
-      <w:r>
-        <w:t>Mise à jour automatique de la table des matières.</w:t>
-      </w:r>
-      <w:r>
-        <w:fldChar w:fldChar="end"/>
-      </w:r>
+      <w:pPr/>
     </w:p>
     <w:p ns2:paraId="3ED802C3" ns2:textId="0BF443B7">
       <w:pPr>

</xml_diff>

<commit_message>
Harmonisation des titres de tableaux
</commit_message>
<xml_diff>
--- a/doc.docx
+++ b/doc.docx
@@ -22475,11 +22475,9 @@
     <w:p>
       <w:pPr>
         <w:pStyle w:val="MemoirePetit"/>
-        <w:tabs>
-          <w:tab w:val="left" w:pos="6190"/>
-          <w:tab w:val="left" w:pos="7230"/>
-        </w:tabs>
-        <w:rPr/>
+        <w:widowControl/>
+        <w:spacing w:before="120" w:after="120" w:line="240" w:lineRule="auto"/>
+        <w:jc w:val="center"/>
       </w:pPr>
       <w:r>
         <w:t xml:space="preserve">Tableau </w:t>
@@ -29612,10 +29610,9 @@
     <w:p>
       <w:pPr>
         <w:pStyle w:val="MemoirePetit"/>
-        <w:tabs>
-          <w:tab w:val="left" w:pos="7230"/>
-        </w:tabs>
-        <w:rPr/>
+        <w:widowControl/>
+        <w:spacing w:before="120" w:after="120" w:line="240" w:lineRule="auto"/>
+        <w:jc w:val="center"/>
       </w:pPr>
       <w:r>
         <w:t xml:space="preserve">Tableau </w:t>
@@ -30885,12 +30882,9 @@
     <w:p>
       <w:pPr>
         <w:pStyle w:val="MemoirePetit"/>
-        <w:tabs>
-          <w:tab w:val="left" w:pos="7230"/>
-        </w:tabs>
-        <w:rPr>
-          <w:b/>
-        </w:rPr>
+        <w:widowControl/>
+        <w:spacing w:before="120" w:after="120" w:line="240" w:lineRule="auto"/>
+        <w:jc w:val="center"/>
       </w:pPr>
       <w:r>
         <w:t xml:space="preserve">Tableau </w:t>
@@ -34192,10 +34186,9 @@
     <w:p>
       <w:pPr>
         <w:pStyle w:val="MemoirePetit"/>
-        <w:tabs>
-          <w:tab w:val="left" w:pos="5775"/>
-        </w:tabs>
-        <w:rPr/>
+        <w:widowControl/>
+        <w:spacing w:before="120" w:after="120" w:line="240" w:lineRule="auto"/>
+        <w:jc w:val="center"/>
       </w:pPr>
       <w:r>
         <w:t xml:space="preserve">Tableau </w:t>
@@ -34866,10 +34859,9 @@
     <w:p>
       <w:pPr>
         <w:pStyle w:val="MemoirePetit"/>
-        <w:tabs>
-          <w:tab w:val="left" w:pos="5775"/>
-        </w:tabs>
-        <w:rPr/>
+        <w:widowControl/>
+        <w:spacing w:before="120" w:after="120" w:line="240" w:lineRule="auto"/>
+        <w:jc w:val="center"/>
       </w:pPr>
       <w:r>
         <w:t xml:space="preserve">Tableau </w:t>
@@ -35445,7 +35437,9 @@
     <w:p>
       <w:pPr>
         <w:pStyle w:val="MemoirePetit"/>
-        <w:rPr/>
+        <w:widowControl/>
+        <w:spacing w:before="120" w:after="120" w:line="240" w:lineRule="auto"/>
+        <w:jc w:val="center"/>
       </w:pPr>
       <w:r>
         <w:t xml:space="preserve">Tableau </w:t>
@@ -36274,7 +36268,9 @@
     <w:p>
       <w:pPr>
         <w:pStyle w:val="MemoirePetit"/>
-        <w:rPr/>
+        <w:widowControl/>
+        <w:spacing w:before="120" w:after="120" w:line="240" w:lineRule="auto"/>
+        <w:jc w:val="center"/>
       </w:pPr>
       <w:r>
         <w:t xml:space="preserve">Tableau </w:t>
@@ -37911,9 +37907,9 @@
     <w:p>
       <w:pPr>
         <w:pStyle w:val="MemoirePetit"/>
-        <w:rPr>
-          <w:bCs/>
-        </w:rPr>
+        <w:widowControl/>
+        <w:spacing w:before="120" w:after="120" w:line="240" w:lineRule="auto"/>
+        <w:jc w:val="center"/>
       </w:pPr>
       <w:r>
         <w:t xml:space="preserve">Tableau </w:t>
@@ -39707,9 +39703,9 @@
     <w:p>
       <w:pPr>
         <w:pStyle w:val="MemoirePetit"/>
-        <w:rPr>
-          <w:b/>
-        </w:rPr>
+        <w:widowControl/>
+        <w:spacing w:before="120" w:after="120" w:line="240" w:lineRule="auto"/>
+        <w:jc w:val="center"/>
       </w:pPr>
       <w:r>
         <w:t xml:space="preserve">Tableau </w:t>
@@ -41342,7 +41338,9 @@
     <w:p>
       <w:pPr>
         <w:pStyle w:val="MemoirePetit"/>
-        <w:rPr/>
+        <w:widowControl/>
+        <w:spacing w:before="120" w:after="120" w:line="240" w:lineRule="auto"/>
+        <w:jc w:val="center"/>
       </w:pPr>
       <w:r>
         <w:t xml:space="preserve">Tableau </w:t>

</xml_diff>

<commit_message>
Harmonisation des sources des tableaux
</commit_message>
<xml_diff>
--- a/doc.docx
+++ b/doc.docx
@@ -1,6 +1,6 @@
 
 <file path=word/document.xml><?xml version="1.0" encoding="utf-8"?>
-<w:document xmlns:mc="http://schemas.openxmlformats.org/markup-compatibility/2006" xmlns:ns3="http://schemas.openxmlformats.org/drawingml/2006/wordprocessingDrawing" xmlns:ns4="http://schemas.microsoft.com/office/word/2010/wordprocessingDrawing" xmlns:ns5="http://schemas.openxmlformats.org/drawingml/2006/main" xmlns:ns6="http://schemas.microsoft.com/office/word/2010/wordprocessingGroup" xmlns:ns7="http://schemas.microsoft.com/office/word/2010/wordprocessingShape" xmlns:ns8="http://schemas.microsoft.com/office/drawing/2010/main" xmlns:ns9="http://schemas.openxmlformats.org/drawingml/2006/picture" xmlns:o="urn:schemas-microsoft-com:office:office" xmlns:r="http://schemas.openxmlformats.org/officeDocument/2006/relationships" xmlns:v="urn:schemas-microsoft-com:vml" xmlns:w="http://schemas.openxmlformats.org/wordprocessingml/2006/main" xmlns:w10="urn:schemas-microsoft-com:office:word" xmlns:w14="http://schemas.microsoft.com/office/word/2010/wordml" mc:Ignorable="w14 w15 w16se wp14">
+<w:document xmlns:mc="http://schemas.openxmlformats.org/markup-compatibility/2006" xmlns:ns13="urn:schemas-microsoft-com:office:word" xmlns:ns4="http://schemas.microsoft.com/office/word/2010/wordprocessingDrawing" xmlns:ns5="http://schemas.openxmlformats.org/drawingml/2006/main" xmlns:ns6="http://schemas.microsoft.com/office/word/2010/wordprocessingGroup" xmlns:ns7="http://schemas.microsoft.com/office/word/2010/wordprocessingShape" xmlns:ns8="http://schemas.microsoft.com/office/drawing/2010/main" xmlns:ns9="http://schemas.openxmlformats.org/drawingml/2006/picture" xmlns:o="urn:schemas-microsoft-com:office:office" xmlns:r="http://schemas.openxmlformats.org/officeDocument/2006/relationships" xmlns:v="urn:schemas-microsoft-com:vml" xmlns:w="http://schemas.openxmlformats.org/wordprocessingml/2006/main" xmlns:w14="http://schemas.microsoft.com/office/word/2010/wordml" xmlns:wp="http://schemas.openxmlformats.org/drawingml/2006/wordprocessingDrawing" mc:Ignorable="w14 w15 w16se wp14">
   <w:body>
     <w:p>
       <w:pPr>
@@ -39,19 +39,19 @@
         <mc:AlternateContent>
           <mc:Choice Requires="wpg">
             <w:drawing>
-              <ns3:anchor distT="0" distB="0" distL="114300" distR="114300" simplePos="0" relativeHeight="251648000" behindDoc="1" locked="0" layoutInCell="1" allowOverlap="1" ns4:anchorId="4BAE0E57" ns4:editId="729E2BD9">
-                <ns3:simplePos x="0" y="0"/>
-                <ns3:positionH relativeFrom="margin">
-                  <ns3:posOffset>-167640</ns3:posOffset>
-                </ns3:positionH>
-                <ns3:positionV relativeFrom="paragraph">
-                  <ns3:posOffset>208915</ns3:posOffset>
-                </ns3:positionV>
-                <ns3:extent cx="2230120" cy="956310"/>
-                <ns3:effectExtent l="0" t="0" r="0" b="0"/>
-                <ns3:wrapNone/>
-                <ns3:docPr id="9" name="Groupe 9"/>
-                <ns3:cNvGraphicFramePr/>
+              <wp:anchor distT="0" distB="0" distL="114300" distR="114300" simplePos="0" relativeHeight="251648000" behindDoc="1" locked="0" layoutInCell="1" allowOverlap="1" ns4:anchorId="4BAE0E57" ns4:editId="729E2BD9">
+                <wp:simplePos x="0" y="0"/>
+                <wp:positionH relativeFrom="margin">
+                  <wp:posOffset>-167640</wp:posOffset>
+                </wp:positionH>
+                <wp:positionV relativeFrom="paragraph">
+                  <wp:posOffset>208915</wp:posOffset>
+                </wp:positionV>
+                <wp:extent cx="2230120" cy="956310"/>
+                <wp:effectExtent l="0" t="0" r="0" b="0"/>
+                <wp:wrapNone/>
+                <wp:docPr id="9" name="Groupe 9"/>
+                <wp:cNvGraphicFramePr/>
                 <ns5:graphic>
                   <ns5:graphicData uri="http://schemas.microsoft.com/office/word/2010/wordprocessingGroup">
                     <ns6:wgp>
@@ -377,7 +377,7 @@
                 <ns4:sizeRelV relativeFrom="margin">
                   <ns4:pctHeight>0</ns4:pctHeight>
                 </ns4:sizeRelV>
-              </ns3:anchor>
+              </wp:anchor>
             </w:drawing>
           </mc:Choice>
           <mc:Fallback>
@@ -472,7 +472,7 @@
                     </v:textbox>
                   </v:shape>
                 </v:group>
-                <w10:wrap anchorx="margin"/>
+                <ns13:wrap anchorx="margin"/>
               </v:group>
             </w:pict>
           </mc:Fallback>
@@ -498,29 +498,29 @@
         <mc:AlternateContent>
           <mc:Choice Requires="wps">
             <w:drawing>
-              <ns3:anchor distT="0" distB="0" distL="114300" distR="114300" simplePos="0" relativeHeight="251662336" behindDoc="1" locked="0" layoutInCell="1" allowOverlap="1" ns4:anchorId="2C135B1C" ns4:editId="7D9B0B92">
-                <ns3:simplePos x="0" y="0"/>
-                <ns3:positionH relativeFrom="margin">
-                  <ns3:posOffset>2317115</ns3:posOffset>
-                </ns3:positionH>
-                <ns3:positionV relativeFrom="paragraph">
-                  <ns3:posOffset>36195</ns3:posOffset>
-                </ns3:positionV>
-                <ns3:extent cx="2000250" cy="723265"/>
-                <ns3:effectExtent l="0" t="0" r="0" b="635"/>
-                <ns3:wrapTight wrapText="bothSides">
-                  <ns3:wrapPolygon edited="0">
-                    <ns3:start x="0" y="0"/>
-                    <ns3:lineTo x="0" y="21050"/>
-                    <ns3:lineTo x="21394" y="21050"/>
-                    <ns3:lineTo x="21394" y="0"/>
-                    <ns3:lineTo x="0" y="0"/>
-                  </ns3:wrapPolygon>
-                </ns3:wrapTight>
-                <ns3:docPr id="251250240" name="Zone de texte 251250240"/>
-                <ns3:cNvGraphicFramePr>
+              <wp:anchor distT="0" distB="0" distL="114300" distR="114300" simplePos="0" relativeHeight="251662336" behindDoc="1" locked="0" layoutInCell="1" allowOverlap="1" ns4:anchorId="2C135B1C" ns4:editId="7D9B0B92">
+                <wp:simplePos x="0" y="0"/>
+                <wp:positionH relativeFrom="margin">
+                  <wp:posOffset>2317115</wp:posOffset>
+                </wp:positionH>
+                <wp:positionV relativeFrom="paragraph">
+                  <wp:posOffset>36195</wp:posOffset>
+                </wp:positionV>
+                <wp:extent cx="2000250" cy="723265"/>
+                <wp:effectExtent l="0" t="0" r="0" b="635"/>
+                <wp:wrapTight wrapText="bothSides">
+                  <wp:wrapPolygon edited="0">
+                    <wp:start x="0" y="0"/>
+                    <wp:lineTo x="0" y="21050"/>
+                    <wp:lineTo x="21394" y="21050"/>
+                    <wp:lineTo x="21394" y="0"/>
+                    <wp:lineTo x="0" y="0"/>
+                  </wp:wrapPolygon>
+                </wp:wrapTight>
+                <wp:docPr id="251250240" name="Zone de texte 251250240"/>
+                <wp:cNvGraphicFramePr>
                   <ns5:graphicFrameLocks/>
-                </ns3:cNvGraphicFramePr>
+                </wp:cNvGraphicFramePr>
                 <ns5:graphic>
                   <ns5:graphicData uri="http://schemas.microsoft.com/office/word/2010/wordprocessingShape">
                     <ns7:wsp>
@@ -586,7 +586,7 @@
                 <ns4:sizeRelV relativeFrom="margin">
                   <ns4:pctHeight>0</ns4:pctHeight>
                 </ns4:sizeRelV>
-              </ns3:anchor>
+              </wp:anchor>
             </w:drawing>
           </mc:Choice>
           <mc:Fallback>
@@ -624,7 +624,7 @@
                     </w:p>
                   </w:txbxContent>
                 </v:textbox>
-                <w10:wrap type="tight" anchorx="margin"/>
+                <ns13:wrap type="tight" anchorx="margin"/>
               </v:shape>
             </w:pict>
           </mc:Fallback>
@@ -637,29 +637,29 @@
           <w:lang w:eastAsia="fr-FR"/>
         </w:rPr>
         <w:drawing>
-          <ns3:anchor distT="0" distB="0" distL="114300" distR="114300" simplePos="0" relativeHeight="251641856" behindDoc="1" locked="0" layoutInCell="1" allowOverlap="1" ns4:anchorId="4017EE67" ns4:editId="7121C3C0">
-            <ns3:simplePos x="0" y="0"/>
-            <ns3:positionH relativeFrom="column">
-              <ns3:posOffset>5479415</ns3:posOffset>
-            </ns3:positionH>
-            <ns3:positionV relativeFrom="paragraph">
-              <ns3:posOffset>83185</ns3:posOffset>
-            </ns3:positionV>
-            <ns3:extent cx="790575" cy="740410"/>
-            <ns3:effectExtent l="0" t="0" r="9525" b="2540"/>
-            <ns3:wrapTight wrapText="bothSides">
-              <ns3:wrapPolygon edited="0">
-                <ns3:start x="0" y="0"/>
-                <ns3:lineTo x="0" y="21118"/>
-                <ns3:lineTo x="21340" y="21118"/>
-                <ns3:lineTo x="21340" y="0"/>
-                <ns3:lineTo x="0" y="0"/>
-              </ns3:wrapPolygon>
-            </ns3:wrapTight>
-            <ns3:docPr id="2" name="Image 2"/>
-            <ns3:cNvGraphicFramePr>
+          <wp:anchor distT="0" distB="0" distL="114300" distR="114300" simplePos="0" relativeHeight="251641856" behindDoc="1" locked="0" layoutInCell="1" allowOverlap="1" ns4:anchorId="4017EE67" ns4:editId="7121C3C0">
+            <wp:simplePos x="0" y="0"/>
+            <wp:positionH relativeFrom="column">
+              <wp:posOffset>5479415</wp:posOffset>
+            </wp:positionH>
+            <wp:positionV relativeFrom="paragraph">
+              <wp:posOffset>83185</wp:posOffset>
+            </wp:positionV>
+            <wp:extent cx="790575" cy="740410"/>
+            <wp:effectExtent l="0" t="0" r="9525" b="2540"/>
+            <wp:wrapTight wrapText="bothSides">
+              <wp:wrapPolygon edited="0">
+                <wp:start x="0" y="0"/>
+                <wp:lineTo x="0" y="21118"/>
+                <wp:lineTo x="21340" y="21118"/>
+                <wp:lineTo x="21340" y="0"/>
+                <wp:lineTo x="0" y="0"/>
+              </wp:wrapPolygon>
+            </wp:wrapTight>
+            <wp:docPr id="2" name="Image 2"/>
+            <wp:cNvGraphicFramePr>
               <ns5:graphicFrameLocks noChangeAspect="1"/>
-            </ns3:cNvGraphicFramePr>
+            </wp:cNvGraphicFramePr>
             <ns5:graphic>
               <ns5:graphicData uri="http://schemas.openxmlformats.org/drawingml/2006/picture">
                 <ns9:pic>
@@ -701,7 +701,7 @@
             <ns4:sizeRelV relativeFrom="page">
               <ns4:pctHeight>0</ns4:pctHeight>
             </ns4:sizeRelV>
-          </ns3:anchor>
+          </wp:anchor>
         </w:drawing>
       </w:r>
       <w:r>
@@ -711,29 +711,29 @@
           <w:lang w:eastAsia="fr-FR"/>
         </w:rPr>
         <w:drawing>
-          <ns3:anchor distT="0" distB="0" distL="114300" distR="114300" simplePos="0" relativeHeight="251639808" behindDoc="1" locked="0" layoutInCell="1" allowOverlap="1" ns4:anchorId="375F90E4" ns4:editId="68464348">
-            <ns3:simplePos x="0" y="0"/>
-            <ns3:positionH relativeFrom="margin">
-              <ns3:posOffset>4472305</ns3:posOffset>
-            </ns3:positionH>
-            <ns3:positionV relativeFrom="paragraph">
-              <ns3:posOffset>136525</ns3:posOffset>
-            </ns3:positionV>
-            <ns3:extent cx="573405" cy="569595"/>
-            <ns3:effectExtent l="0" t="0" r="0" b="1905"/>
-            <ns3:wrapTight wrapText="bothSides">
-              <ns3:wrapPolygon edited="0">
-                <ns3:start x="0" y="0"/>
-                <ns3:lineTo x="0" y="20950"/>
-                <ns3:lineTo x="20811" y="20950"/>
-                <ns3:lineTo x="20811" y="0"/>
-                <ns3:lineTo x="0" y="0"/>
-              </ns3:wrapPolygon>
-            </ns3:wrapTight>
-            <ns3:docPr id="1" name="Image 1"/>
-            <ns3:cNvGraphicFramePr>
+          <wp:anchor distT="0" distB="0" distL="114300" distR="114300" simplePos="0" relativeHeight="251639808" behindDoc="1" locked="0" layoutInCell="1" allowOverlap="1" ns4:anchorId="375F90E4" ns4:editId="68464348">
+            <wp:simplePos x="0" y="0"/>
+            <wp:positionH relativeFrom="margin">
+              <wp:posOffset>4472305</wp:posOffset>
+            </wp:positionH>
+            <wp:positionV relativeFrom="paragraph">
+              <wp:posOffset>136525</wp:posOffset>
+            </wp:positionV>
+            <wp:extent cx="573405" cy="569595"/>
+            <wp:effectExtent l="0" t="0" r="0" b="1905"/>
+            <wp:wrapTight wrapText="bothSides">
+              <wp:wrapPolygon edited="0">
+                <wp:start x="0" y="0"/>
+                <wp:lineTo x="0" y="20950"/>
+                <wp:lineTo x="20811" y="20950"/>
+                <wp:lineTo x="20811" y="0"/>
+                <wp:lineTo x="0" y="0"/>
+              </wp:wrapPolygon>
+            </wp:wrapTight>
+            <wp:docPr id="1" name="Image 1"/>
+            <wp:cNvGraphicFramePr>
               <ns5:graphicFrameLocks noChangeAspect="1"/>
-            </ns3:cNvGraphicFramePr>
+            </wp:cNvGraphicFramePr>
             <ns5:graphic>
               <ns5:graphicData uri="http://schemas.openxmlformats.org/drawingml/2006/picture">
                 <ns9:pic>
@@ -775,7 +775,7 @@
             <ns4:sizeRelV relativeFrom="page">
               <ns4:pctHeight>0</ns4:pctHeight>
             </ns4:sizeRelV>
-          </ns3:anchor>
+          </wp:anchor>
         </w:drawing>
       </w:r>
     </w:p>
@@ -814,21 +814,21 @@
         <mc:AlternateContent>
           <mc:Choice Requires="wps">
             <w:drawing>
-              <ns3:anchor distT="0" distB="0" distL="114300" distR="114300" simplePos="0" relativeHeight="251674624" behindDoc="0" locked="0" layoutInCell="1" allowOverlap="1" ns4:anchorId="06D7241B" ns4:editId="0690C31B">
-                <ns3:simplePos x="0" y="0"/>
-                <ns3:positionH relativeFrom="margin">
-                  <ns3:posOffset>0</ns3:posOffset>
-                </ns3:positionH>
-                <ns3:positionV relativeFrom="paragraph">
-                  <ns3:posOffset>-635</ns3:posOffset>
-                </ns3:positionV>
-                <ns3:extent cx="6106160" cy="0"/>
-                <ns3:effectExtent l="0" t="0" r="0" b="0"/>
-                <ns3:wrapNone/>
-                <ns3:docPr id="54" name="AutoShape 25"/>
-                <ns3:cNvGraphicFramePr>
+              <wp:anchor distT="0" distB="0" distL="114300" distR="114300" simplePos="0" relativeHeight="251674624" behindDoc="0" locked="0" layoutInCell="1" allowOverlap="1" ns4:anchorId="06D7241B" ns4:editId="0690C31B">
+                <wp:simplePos x="0" y="0"/>
+                <wp:positionH relativeFrom="margin">
+                  <wp:posOffset>0</wp:posOffset>
+                </wp:positionH>
+                <wp:positionV relativeFrom="paragraph">
+                  <wp:posOffset>-635</wp:posOffset>
+                </wp:positionV>
+                <wp:extent cx="6106160" cy="0"/>
+                <wp:effectExtent l="0" t="0" r="0" b="0"/>
+                <wp:wrapNone/>
+                <wp:docPr id="54" name="AutoShape 25"/>
+                <wp:cNvGraphicFramePr>
                   <ns5:graphicFrameLocks/>
-                </ns3:cNvGraphicFramePr>
+                </wp:cNvGraphicFramePr>
                 <ns5:graphic>
                   <ns5:graphicData uri="http://schemas.microsoft.com/office/word/2010/wordprocessingShape">
                     <ns7:wsp>
@@ -857,7 +857,7 @@
                     </ns7:wsp>
                   </ns5:graphicData>
                 </ns5:graphic>
-              </ns3:anchor>
+              </wp:anchor>
             </w:drawing>
           </mc:Choice>
           <mc:Fallback>
@@ -867,7 +867,7 @@
                 <o:lock v:ext="edit" shapetype="t"/>
               </v:shapetype>
               <v:shape id="AutoShape 25" o:spid="_x0000_s1026" type="#_x0000_t32" style="position:absolute;margin-left:0;margin-top:-.05pt;width:480.8pt;height:0;z-index:251674624;visibility:visible;mso-wrap-style:square;mso-wrap-distance-left:9pt;mso-wrap-distance-top:0;mso-wrap-distance-right:9pt;mso-wrap-distance-bottom:0;mso-position-horizontal:absolute;mso-position-horizontal-relative:margin;mso-position-vertical:absolute;mso-position-vertical-relative:text" o:gfxdata="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" strokeweight="1.5pt">
-                <w10:wrap anchorx="margin"/>
+                <ns13:wrap anchorx="margin"/>
               </v:shape>
             </w:pict>
           </mc:Fallback>
@@ -1036,21 +1036,21 @@
         <mc:AlternateContent>
           <mc:Choice Requires="wps">
             <w:drawing>
-              <ns3:anchor distT="0" distB="0" distL="114300" distR="114300" simplePos="0" relativeHeight="251664384" behindDoc="0" locked="1" layoutInCell="1" allowOverlap="1" ns4:anchorId="6A9013CB" ns4:editId="34544F81">
-                <ns3:simplePos x="0" y="0"/>
-                <ns3:positionH relativeFrom="column">
-                  <ns3:posOffset>748030</ns3:posOffset>
-                </ns3:positionH>
-                <ns3:positionV relativeFrom="paragraph">
-                  <ns3:posOffset>303530</ns3:posOffset>
-                </ns3:positionV>
-                <ns3:extent cx="4857750" cy="752475"/>
-                <ns3:effectExtent l="38100" t="38100" r="57150" b="66675"/>
-                <ns3:wrapNone/>
-                <ns3:docPr id="1715820105" name="Rectangle à coins arrondis 1715820105"/>
-                <ns3:cNvGraphicFramePr>
+              <wp:anchor distT="0" distB="0" distL="114300" distR="114300" simplePos="0" relativeHeight="251664384" behindDoc="0" locked="1" layoutInCell="1" allowOverlap="1" ns4:anchorId="6A9013CB" ns4:editId="34544F81">
+                <wp:simplePos x="0" y="0"/>
+                <wp:positionH relativeFrom="column">
+                  <wp:posOffset>748030</wp:posOffset>
+                </wp:positionH>
+                <wp:positionV relativeFrom="paragraph">
+                  <wp:posOffset>303530</wp:posOffset>
+                </wp:positionV>
+                <wp:extent cx="4857750" cy="752475"/>
+                <wp:effectExtent l="38100" t="38100" r="57150" b="66675"/>
+                <wp:wrapNone/>
+                <wp:docPr id="1715820105" name="Rectangle à coins arrondis 1715820105"/>
+                <wp:cNvGraphicFramePr>
                   <ns5:graphicFrameLocks/>
-                </ns3:cNvGraphicFramePr>
+                </wp:cNvGraphicFramePr>
                 <ns5:graphic>
                   <ns5:graphicData uri="http://schemas.microsoft.com/office/word/2010/wordprocessingShape">
                     <ns7:wsp>
@@ -1178,7 +1178,7 @@
                 <ns4:sizeRelV relativeFrom="margin">
                   <ns4:pctHeight>0</ns4:pctHeight>
                 </ns4:sizeRelV>
-              </ns3:anchor>
+              </wp:anchor>
             </w:drawing>
           </mc:Choice>
           <mc:Fallback>
@@ -1243,7 +1243,7 @@
                     </w:p>
                   </w:txbxContent>
                 </v:textbox>
-                <w10:anchorlock/>
+                <ns13:anchorlock/>
               </v:roundrect>
             </w:pict>
           </mc:Fallback>
@@ -1374,19 +1374,19 @@
         <mc:AlternateContent>
           <mc:Choice Requires="wps">
             <w:drawing>
-              <ns3:anchor distT="0" distB="0" distL="114300" distR="114300" simplePos="0" relativeHeight="251656192" behindDoc="0" locked="0" layoutInCell="1" allowOverlap="1" ns4:anchorId="217ACBE6" ns4:editId="7EED0DB1">
-                <ns3:simplePos x="0" y="0"/>
-                <ns3:positionH relativeFrom="margin">
-                  <ns3:posOffset>3491231</ns3:posOffset>
-                </ns3:positionH>
-                <ns3:positionV relativeFrom="paragraph">
-                  <ns3:posOffset>245745</ns3:posOffset>
-                </ns3:positionV>
-                <ns3:extent cx="1619250" cy="142875"/>
-                <ns3:effectExtent l="0" t="0" r="19050" b="28575"/>
-                <ns3:wrapNone/>
-                <ns3:docPr id="32" name="Zone de texte 32"/>
-                <ns3:cNvGraphicFramePr/>
+              <wp:anchor distT="0" distB="0" distL="114300" distR="114300" simplePos="0" relativeHeight="251656192" behindDoc="0" locked="0" layoutInCell="1" allowOverlap="1" ns4:anchorId="217ACBE6" ns4:editId="7EED0DB1">
+                <wp:simplePos x="0" y="0"/>
+                <wp:positionH relativeFrom="margin">
+                  <wp:posOffset>3491231</wp:posOffset>
+                </wp:positionH>
+                <wp:positionV relativeFrom="paragraph">
+                  <wp:posOffset>245745</wp:posOffset>
+                </wp:positionV>
+                <wp:extent cx="1619250" cy="142875"/>
+                <wp:effectExtent l="0" t="0" r="19050" b="28575"/>
+                <wp:wrapNone/>
+                <wp:docPr id="32" name="Zone de texte 32"/>
+                <wp:cNvGraphicFramePr/>
                 <ns5:graphic>
                   <ns5:graphicData uri="http://schemas.microsoft.com/office/word/2010/wordprocessingShape">
                     <ns7:wsp>
@@ -1435,7 +1435,7 @@
                 <ns4:sizeRelV relativeFrom="margin">
                   <ns4:pctHeight>0</ns4:pctHeight>
                 </ns4:sizeRelV>
-              </ns3:anchor>
+              </wp:anchor>
             </w:drawing>
           </mc:Choice>
           <mc:Fallback>
@@ -1453,7 +1453,7 @@
                     </w:p>
                   </w:txbxContent>
                 </v:textbox>
-                <w10:wrap anchorx="margin"/>
+                <ns13:wrap anchorx="margin"/>
               </v:shape>
             </w:pict>
           </mc:Fallback>
@@ -1519,21 +1519,21 @@
         <mc:AlternateContent>
           <mc:Choice Requires="wps">
             <w:drawing>
-              <ns3:anchor distT="0" distB="0" distL="114300" distR="114300" simplePos="0" relativeHeight="251652096" behindDoc="0" locked="0" layoutInCell="1" allowOverlap="1" ns4:anchorId="67334904" ns4:editId="436FF1E3">
-                <ns3:simplePos x="0" y="0"/>
-                <ns3:positionH relativeFrom="column">
-                  <ns3:posOffset>4790373</ns3:posOffset>
-                </ns3:positionH>
-                <ns3:positionV relativeFrom="paragraph">
-                  <ns3:posOffset>79576</ns3:posOffset>
-                </ns3:positionV>
-                <ns3:extent cx="1596189" cy="1171575"/>
-                <ns3:effectExtent l="0" t="0" r="4445" b="9525"/>
-                <ns3:wrapNone/>
-                <ns3:docPr id="6" name="Rectangle 6"/>
-                <ns3:cNvGraphicFramePr>
+              <wp:anchor distT="0" distB="0" distL="114300" distR="114300" simplePos="0" relativeHeight="251652096" behindDoc="0" locked="0" layoutInCell="1" allowOverlap="1" ns4:anchorId="67334904" ns4:editId="436FF1E3">
+                <wp:simplePos x="0" y="0"/>
+                <wp:positionH relativeFrom="column">
+                  <wp:posOffset>4790373</wp:posOffset>
+                </wp:positionH>
+                <wp:positionV relativeFrom="paragraph">
+                  <wp:posOffset>79576</wp:posOffset>
+                </wp:positionV>
+                <wp:extent cx="1596189" cy="1171575"/>
+                <wp:effectExtent l="0" t="0" r="4445" b="9525"/>
+                <wp:wrapNone/>
+                <wp:docPr id="6" name="Rectangle 6"/>
+                <wp:cNvGraphicFramePr>
                   <ns5:graphicFrameLocks/>
-                </ns3:cNvGraphicFramePr>
+                </wp:cNvGraphicFramePr>
                 <ns5:graphic>
                   <ns5:graphicData uri="http://schemas.microsoft.com/office/word/2010/wordprocessingShape">
                     <ns7:wsp>
@@ -1646,7 +1646,7 @@
                 <ns4:sizeRelV relativeFrom="page">
                   <ns4:pctHeight>0</ns4:pctHeight>
                 </ns4:sizeRelV>
-              </ns3:anchor>
+              </wp:anchor>
             </w:drawing>
           </mc:Choice>
           <mc:Fallback>
@@ -1733,19 +1733,19 @@
         <mc:AlternateContent>
           <mc:Choice Requires="wps">
             <w:drawing>
-              <ns3:anchor distT="0" distB="0" distL="114300" distR="114300" simplePos="0" relativeHeight="251660288" behindDoc="0" locked="0" layoutInCell="1" allowOverlap="1" ns4:anchorId="4E26EE04" ns4:editId="2B490783">
-                <ns3:simplePos x="0" y="0"/>
-                <ns3:positionH relativeFrom="margin">
-                  <ns3:posOffset>-224790</ns3:posOffset>
-                </ns3:positionH>
-                <ns3:positionV relativeFrom="paragraph">
-                  <ns3:posOffset>205740</ns3:posOffset>
-                </ns3:positionV>
-                <ns3:extent cx="2146935" cy="1771650"/>
-                <ns3:effectExtent l="0" t="0" r="24765" b="19050"/>
-                <ns3:wrapNone/>
-                <ns3:docPr id="11" name="Zone de texte 11"/>
-                <ns3:cNvGraphicFramePr/>
+              <wp:anchor distT="0" distB="0" distL="114300" distR="114300" simplePos="0" relativeHeight="251660288" behindDoc="0" locked="0" layoutInCell="1" allowOverlap="1" ns4:anchorId="4E26EE04" ns4:editId="2B490783">
+                <wp:simplePos x="0" y="0"/>
+                <wp:positionH relativeFrom="margin">
+                  <wp:posOffset>-224790</wp:posOffset>
+                </wp:positionH>
+                <wp:positionV relativeFrom="paragraph">
+                  <wp:posOffset>205740</wp:posOffset>
+                </wp:positionV>
+                <wp:extent cx="2146935" cy="1771650"/>
+                <wp:effectExtent l="0" t="0" r="24765" b="19050"/>
+                <wp:wrapNone/>
+                <wp:docPr id="11" name="Zone de texte 11"/>
+                <wp:cNvGraphicFramePr/>
                 <ns5:graphic>
                   <ns5:graphicData uri="http://schemas.microsoft.com/office/word/2010/wordprocessingShape">
                     <ns7:wsp>
@@ -1907,7 +1907,7 @@
                 <ns4:sizeRelV relativeFrom="margin">
                   <ns4:pctHeight>0</ns4:pctHeight>
                 </ns4:sizeRelV>
-              </ns3:anchor>
+              </wp:anchor>
             </w:drawing>
           </mc:Choice>
           <mc:Fallback>
@@ -2038,7 +2038,7 @@
                     </w:p>
                   </w:txbxContent>
                 </v:textbox>
-                <w10:wrap anchorx="margin"/>
+                <ns13:wrap anchorx="margin"/>
               </v:shape>
             </w:pict>
           </mc:Fallback>
@@ -2053,21 +2053,21 @@
         <mc:AlternateContent>
           <mc:Choice Requires="wps">
             <w:drawing>
-              <ns3:anchor distT="0" distB="0" distL="114300" distR="114300" simplePos="0" relativeHeight="251645952" behindDoc="0" locked="0" layoutInCell="1" allowOverlap="1" ns4:anchorId="18BB8649" ns4:editId="6D1B5B49">
-                <ns3:simplePos x="0" y="0"/>
-                <ns3:positionH relativeFrom="column">
-                  <ns3:posOffset>1840865</ns3:posOffset>
-                </ns3:positionH>
-                <ns3:positionV relativeFrom="paragraph">
-                  <ns3:posOffset>151765</ns3:posOffset>
-                </ns3:positionV>
-                <ns3:extent cx="1734820" cy="1228725"/>
-                <ns3:effectExtent l="0" t="0" r="0" b="9525"/>
-                <ns3:wrapNone/>
-                <ns3:docPr id="8" name="Zone de texte 8"/>
-                <ns3:cNvGraphicFramePr>
+              <wp:anchor distT="0" distB="0" distL="114300" distR="114300" simplePos="0" relativeHeight="251645952" behindDoc="0" locked="0" layoutInCell="1" allowOverlap="1" ns4:anchorId="18BB8649" ns4:editId="6D1B5B49">
+                <wp:simplePos x="0" y="0"/>
+                <wp:positionH relativeFrom="column">
+                  <wp:posOffset>1840865</wp:posOffset>
+                </wp:positionH>
+                <wp:positionV relativeFrom="paragraph">
+                  <wp:posOffset>151765</wp:posOffset>
+                </wp:positionV>
+                <wp:extent cx="1734820" cy="1228725"/>
+                <wp:effectExtent l="0" t="0" r="0" b="9525"/>
+                <wp:wrapNone/>
+                <wp:docPr id="8" name="Zone de texte 8"/>
+                <wp:cNvGraphicFramePr>
                   <ns5:graphicFrameLocks/>
-                </ns3:cNvGraphicFramePr>
+                </wp:cNvGraphicFramePr>
                 <ns5:graphic>
                   <ns5:graphicData uri="http://schemas.microsoft.com/office/word/2010/wordprocessingShape">
                     <ns7:wsp>
@@ -2118,7 +2118,7 @@
                 <ns4:sizeRelV relativeFrom="page">
                   <ns4:pctHeight>0</ns4:pctHeight>
                 </ns4:sizeRelV>
-              </ns3:anchor>
+              </wp:anchor>
             </w:drawing>
           </mc:Choice>
           <mc:Fallback>
@@ -2143,21 +2143,21 @@
         <mc:AlternateContent>
           <mc:Choice Requires="wps">
             <w:drawing>
-              <ns3:anchor distT="0" distB="0" distL="114300" distR="114300" simplePos="0" relativeHeight="251643904" behindDoc="0" locked="0" layoutInCell="1" allowOverlap="1" ns4:anchorId="4D89E546" ns4:editId="3E2D7BAE">
-                <ns3:simplePos x="0" y="0"/>
-                <ns3:positionH relativeFrom="column">
-                  <ns3:posOffset>-171450</ns3:posOffset>
-                </ns3:positionH>
-                <ns3:positionV relativeFrom="paragraph">
-                  <ns3:posOffset>151765</ns3:posOffset>
-                </ns3:positionV>
-                <ns3:extent cx="2099310" cy="1228725"/>
-                <ns3:effectExtent l="0" t="0" r="0" b="9525"/>
-                <ns3:wrapNone/>
-                <ns3:docPr id="7" name="Rectangle 7"/>
-                <ns3:cNvGraphicFramePr>
+              <wp:anchor distT="0" distB="0" distL="114300" distR="114300" simplePos="0" relativeHeight="251643904" behindDoc="0" locked="0" layoutInCell="1" allowOverlap="1" ns4:anchorId="4D89E546" ns4:editId="3E2D7BAE">
+                <wp:simplePos x="0" y="0"/>
+                <wp:positionH relativeFrom="column">
+                  <wp:posOffset>-171450</wp:posOffset>
+                </wp:positionH>
+                <wp:positionV relativeFrom="paragraph">
+                  <wp:posOffset>151765</wp:posOffset>
+                </wp:positionV>
+                <wp:extent cx="2099310" cy="1228725"/>
+                <wp:effectExtent l="0" t="0" r="0" b="9525"/>
+                <wp:wrapNone/>
+                <wp:docPr id="7" name="Rectangle 7"/>
+                <wp:cNvGraphicFramePr>
                   <ns5:graphicFrameLocks/>
-                </ns3:cNvGraphicFramePr>
+                </wp:cNvGraphicFramePr>
                 <ns5:graphic>
                   <ns5:graphicData uri="http://schemas.microsoft.com/office/word/2010/wordprocessingShape">
                     <ns7:wsp>
@@ -2237,7 +2237,7 @@
                 <ns4:sizeRelV relativeFrom="page">
                   <ns4:pctHeight>0</ns4:pctHeight>
                 </ns4:sizeRelV>
-              </ns3:anchor>
+              </wp:anchor>
             </w:drawing>
           </mc:Choice>
           <mc:Fallback>
@@ -3420,19 +3420,19 @@
         <mc:AlternateContent>
           <mc:Choice Requires="wps">
             <w:drawing>
-              <ns3:anchor distT="0" distB="0" distL="114300" distR="114300" simplePos="0" relativeHeight="251654144" behindDoc="0" locked="0" layoutInCell="1" allowOverlap="1" ns4:anchorId="71EEA676" ns4:editId="5C963E32">
-                <ns3:simplePos x="0" y="0"/>
-                <ns3:positionH relativeFrom="column">
-                  <ns3:posOffset>608196</ns3:posOffset>
-                </ns3:positionH>
-                <ns3:positionV relativeFrom="paragraph">
-                  <ns3:posOffset>151398</ns3:posOffset>
-                </ns3:positionV>
-                <ns3:extent cx="5029200" cy="2838893"/>
-                <ns3:effectExtent l="0" t="0" r="19050" b="19050"/>
-                <ns3:wrapNone/>
-                <ns3:docPr id="21" name="Plaque 21"/>
-                <ns3:cNvGraphicFramePr/>
+              <wp:anchor distT="0" distB="0" distL="114300" distR="114300" simplePos="0" relativeHeight="251654144" behindDoc="0" locked="0" layoutInCell="1" allowOverlap="1" ns4:anchorId="71EEA676" ns4:editId="5C963E32">
+                <wp:simplePos x="0" y="0"/>
+                <wp:positionH relativeFrom="column">
+                  <wp:posOffset>608196</wp:posOffset>
+                </wp:positionH>
+                <wp:positionV relativeFrom="paragraph">
+                  <wp:posOffset>151398</wp:posOffset>
+                </wp:positionV>
+                <wp:extent cx="5029200" cy="2838893"/>
+                <wp:effectExtent l="0" t="0" r="19050" b="19050"/>
+                <wp:wrapNone/>
+                <wp:docPr id="21" name="Plaque 21"/>
+                <wp:cNvGraphicFramePr/>
                 <ns5:graphic>
                   <ns5:graphicData uri="http://schemas.microsoft.com/office/word/2010/wordprocessingShape">
                     <ns7:wsp>
@@ -3625,7 +3625,7 @@
                 <ns4:sizeRelV relativeFrom="margin">
                   <ns4:pctHeight>0</ns4:pctHeight>
                 </ns4:sizeRelV>
-              </ns3:anchor>
+              </wp:anchor>
             </w:drawing>
           </mc:Choice>
           <mc:Fallback>
@@ -12588,19 +12588,19 @@
         <mc:AlternateContent>
           <mc:Choice Requires="wps">
             <w:drawing>
-              <ns3:anchor distT="0" distB="0" distL="114300" distR="114300" simplePos="0" relativeHeight="251676672" behindDoc="0" locked="0" layoutInCell="1" allowOverlap="1" ns4:anchorId="637AD4DA" ns4:editId="123B3BED">
-                <ns3:simplePos x="0" y="0"/>
-                <ns3:positionH relativeFrom="page">
-                  <ns3:posOffset>2345155</ns3:posOffset>
-                </ns3:positionH>
-                <ns3:positionV relativeFrom="paragraph">
-                  <ns3:posOffset>139499</ns3:posOffset>
-                </ns3:positionV>
-                <ns3:extent cx="2800350" cy="737369"/>
-                <ns3:effectExtent l="19050" t="0" r="38100" b="24765"/>
-                <ns3:wrapNone/>
-                <ns3:docPr id="3" name="Hexagone 3"/>
-                <ns3:cNvGraphicFramePr/>
+              <wp:anchor distT="0" distB="0" distL="114300" distR="114300" simplePos="0" relativeHeight="251676672" behindDoc="0" locked="0" layoutInCell="1" allowOverlap="1" ns4:anchorId="637AD4DA" ns4:editId="123B3BED">
+                <wp:simplePos x="0" y="0"/>
+                <wp:positionH relativeFrom="page">
+                  <wp:posOffset>2345155</wp:posOffset>
+                </wp:positionH>
+                <wp:positionV relativeFrom="paragraph">
+                  <wp:posOffset>139499</wp:posOffset>
+                </wp:positionV>
+                <wp:extent cx="2800350" cy="737369"/>
+                <wp:effectExtent l="19050" t="0" r="38100" b="24765"/>
+                <wp:wrapNone/>
+                <wp:docPr id="3" name="Hexagone 3"/>
+                <wp:cNvGraphicFramePr/>
                 <ns5:graphic>
                   <ns5:graphicData uri="http://schemas.microsoft.com/office/word/2010/wordprocessingShape">
                     <ns7:wsp>
@@ -12706,7 +12706,7 @@
                 <ns4:sizeRelV relativeFrom="margin">
                   <ns4:pctHeight>0</ns4:pctHeight>
                 </ns4:sizeRelV>
-              </ns3:anchor>
+              </wp:anchor>
             </w:drawing>
           </mc:Choice>
           <mc:Fallback>
@@ -12774,7 +12774,7 @@
                     </w:p>
                   </w:txbxContent>
                 </v:textbox>
-                <w10:wrap anchorx="page"/>
+                <ns13:wrap anchorx="page"/>
               </v:shape>
             </w:pict>
           </mc:Fallback>
@@ -13914,19 +13914,19 @@
         <mc:AlternateContent>
           <mc:Choice Requires="wps">
             <w:drawing>
-              <ns3:anchor distT="0" distB="0" distL="114300" distR="114300" simplePos="0" relativeHeight="251666432" behindDoc="0" locked="0" layoutInCell="1" allowOverlap="1" ns4:anchorId="02512AF6" ns4:editId="2AD0919F">
-                <ns3:simplePos x="0" y="0"/>
-                <ns3:positionH relativeFrom="column">
-                  <ns3:posOffset>638476</ns3:posOffset>
-                </ns3:positionH>
-                <ns3:positionV relativeFrom="paragraph">
-                  <ns3:posOffset>1431524</ns3:posOffset>
-                </ns3:positionV>
-                <ns3:extent cx="4954002" cy="2269958"/>
-                <ns3:effectExtent l="19050" t="0" r="37465" b="16510"/>
-                <ns3:wrapNone/>
-                <ns3:docPr id="4" name="Hexagone 4"/>
-                <ns3:cNvGraphicFramePr/>
+              <wp:anchor distT="0" distB="0" distL="114300" distR="114300" simplePos="0" relativeHeight="251666432" behindDoc="0" locked="0" layoutInCell="1" allowOverlap="1" ns4:anchorId="02512AF6" ns4:editId="2AD0919F">
+                <wp:simplePos x="0" y="0"/>
+                <wp:positionH relativeFrom="column">
+                  <wp:posOffset>638476</wp:posOffset>
+                </wp:positionH>
+                <wp:positionV relativeFrom="paragraph">
+                  <wp:posOffset>1431524</wp:posOffset>
+                </wp:positionV>
+                <wp:extent cx="4954002" cy="2269958"/>
+                <wp:effectExtent l="19050" t="0" r="37465" b="16510"/>
+                <wp:wrapNone/>
+                <wp:docPr id="4" name="Hexagone 4"/>
+                <wp:cNvGraphicFramePr/>
                 <ns5:graphic>
                   <ns5:graphicData uri="http://schemas.microsoft.com/office/word/2010/wordprocessingShape">
                     <ns7:wsp>
@@ -14098,7 +14098,7 @@
                 <ns4:sizeRelV relativeFrom="margin">
                   <ns4:pctHeight>0</ns4:pctHeight>
                 </ns4:sizeRelV>
-              </ns3:anchor>
+              </wp:anchor>
             </w:drawing>
           </mc:Choice>
           <mc:Fallback>
@@ -15403,13 +15403,13 @@
           <w:lang w:eastAsia="fr-FR"/>
         </w:rPr>
         <w:drawing>
-          <ns3:inline distT="0" distB="0" distL="0" distR="0" ns4:anchorId="6CA92A5D" ns4:editId="57984117">
-            <ns3:extent cx="3850005" cy="2461260"/>
-            <ns3:effectExtent l="0" t="0" r="0" b="0"/>
-            <ns3:docPr id="678639386" name="Image 1"/>
-            <ns3:cNvGraphicFramePr>
+          <wp:inline distT="0" distB="0" distL="0" distR="0" ns4:anchorId="6CA92A5D" ns4:editId="57984117">
+            <wp:extent cx="3850005" cy="2461260"/>
+            <wp:effectExtent l="0" t="0" r="0" b="0"/>
+            <wp:docPr id="678639386" name="Image 1"/>
+            <wp:cNvGraphicFramePr>
               <ns5:graphicFrameLocks noChangeAspect="1"/>
-            </ns3:cNvGraphicFramePr>
+            </wp:cNvGraphicFramePr>
             <ns5:graphic>
               <ns5:graphicData uri="http://schemas.openxmlformats.org/drawingml/2006/picture">
                 <ns9:pic>
@@ -15448,7 +15448,7 @@
                 </ns9:pic>
               </ns5:graphicData>
             </ns5:graphic>
-          </ns3:inline>
+          </wp:inline>
         </w:drawing>
       </w:r>
     </w:p>
@@ -15537,13 +15537,13 @@
           <w:lang w:eastAsia="fr-FR"/>
         </w:rPr>
         <w:drawing>
-          <ns3:inline distT="0" distB="0" distL="0" distR="0" ns4:anchorId="2B75818E" ns4:editId="15DFED95">
-            <ns3:extent cx="3848674" cy="2510155"/>
-            <ns3:effectExtent l="0" t="0" r="0" b="4445"/>
-            <ns3:docPr id="869815646" name="Image 1"/>
-            <ns3:cNvGraphicFramePr>
+          <wp:inline distT="0" distB="0" distL="0" distR="0" ns4:anchorId="2B75818E" ns4:editId="15DFED95">
+            <wp:extent cx="3848674" cy="2510155"/>
+            <wp:effectExtent l="0" t="0" r="0" b="4445"/>
+            <wp:docPr id="869815646" name="Image 1"/>
+            <wp:cNvGraphicFramePr>
               <ns5:graphicFrameLocks noChangeAspect="1"/>
-            </ns3:cNvGraphicFramePr>
+            </wp:cNvGraphicFramePr>
             <ns5:graphic>
               <ns5:graphicData uri="http://schemas.openxmlformats.org/drawingml/2006/picture">
                 <ns9:pic>
@@ -15582,7 +15582,7 @@
                 </ns9:pic>
               </ns5:graphicData>
             </ns5:graphic>
-          </ns3:inline>
+          </wp:inline>
         </w:drawing>
       </w:r>
     </w:p>
@@ -21806,19 +21806,19 @@
               <mc:AlternateContent>
                 <mc:Choice Requires="wps">
                   <w:drawing>
-                    <ns3:anchor distT="0" distB="0" distL="114300" distR="114300" simplePos="0" relativeHeight="251668480" behindDoc="0" locked="0" layoutInCell="1" allowOverlap="1" ns4:anchorId="204D920E" ns4:editId="1530E20F">
-                      <ns3:simplePos x="0" y="0"/>
-                      <ns3:positionH relativeFrom="column">
-                        <ns3:posOffset>-49669</ns3:posOffset>
-                      </ns3:positionH>
-                      <ns3:positionV relativeFrom="paragraph">
-                        <ns3:posOffset>6601</ns3:posOffset>
-                      </ns3:positionV>
-                      <ns3:extent cx="1682804" cy="530198"/>
-                      <ns3:effectExtent l="0" t="0" r="31750" b="22860"/>
-                      <ns3:wrapNone/>
-                      <ns3:docPr id="81808272" name="Connecteur droit 81808272"/>
-                      <ns3:cNvGraphicFramePr/>
+                    <wp:anchor distT="0" distB="0" distL="114300" distR="114300" simplePos="0" relativeHeight="251668480" behindDoc="0" locked="0" layoutInCell="1" allowOverlap="1" ns4:anchorId="204D920E" ns4:editId="1530E20F">
+                      <wp:simplePos x="0" y="0"/>
+                      <wp:positionH relativeFrom="column">
+                        <wp:posOffset>-49669</wp:posOffset>
+                      </wp:positionH>
+                      <wp:positionV relativeFrom="paragraph">
+                        <wp:posOffset>6601</wp:posOffset>
+                      </wp:positionV>
+                      <wp:extent cx="1682804" cy="530198"/>
+                      <wp:effectExtent l="0" t="0" r="31750" b="22860"/>
+                      <wp:wrapNone/>
+                      <wp:docPr id="81808272" name="Connecteur droit 81808272"/>
+                      <wp:cNvGraphicFramePr/>
                       <ns5:graphic>
                         <ns5:graphicData uri="http://schemas.microsoft.com/office/word/2010/wordprocessingShape">
                           <ns7:wsp>
@@ -21856,7 +21856,7 @@
                       <ns4:sizeRelV relativeFrom="margin">
                         <ns4:pctHeight>0</ns4:pctHeight>
                       </ns4:sizeRelV>
-                    </ns3:anchor>
+                    </wp:anchor>
                   </w:drawing>
                 </mc:Choice>
                 <mc:Fallback>
@@ -22499,23 +22499,17 @@
           <w:tab w:val="left" w:pos="7230"/>
         </w:tabs>
         <w:rPr/>
-      </w:pPr>
-      <w:r>
-        <w:rPr>
-          <w:u w:val="single"/>
-        </w:rPr>
-        <w:t>Source :</w:t>
-      </w:r>
-      <w:r>
-        <w:rPr/>
-        <w:t xml:space="preserve"> ressources humaines de la mairie de </w:t>
-      </w:r>
-      <w:proofErr w:type="spellStart"/>
-      <w:r>
-        <w:rPr/>
-        <w:t>Kérou</w:t>
-      </w:r>
-      <w:proofErr w:type="spellEnd"/>
+        <w:spacing w:before="0" w:after="0" w:line="240" w:lineRule="auto"/>
+        <w:ind w:firstLine="0"/>
+        <w:jc w:val="left"/>
+      </w:pPr>
+      <w:r>
+        <w:rPr>
+          <w:sz w:val="20"/>
+          <w:szCs w:val="20"/>
+        </w:rPr>
+        <w:t>Source : ressources humaines de la mairie de Kérou</w:t>
+      </w:r>
     </w:p>
     <w:p>
       <w:pPr>
@@ -24116,19 +24110,19 @@
         <mc:AlternateContent>
           <mc:Choice Requires="wps">
             <w:drawing>
-              <ns3:anchor distT="0" distB="0" distL="114300" distR="114300" simplePos="0" relativeHeight="251670528" behindDoc="0" locked="0" layoutInCell="1" allowOverlap="1" ns4:anchorId="32DDB414" ns4:editId="2BFBAC07">
-                <ns3:simplePos x="0" y="0"/>
-                <ns3:positionH relativeFrom="column">
-                  <ns3:posOffset>694624</ns3:posOffset>
-                </ns3:positionH>
-                <ns3:positionV relativeFrom="paragraph">
-                  <ns3:posOffset>1940092</ns3:posOffset>
-                </ns3:positionV>
-                <ns3:extent cx="4200024" cy="1860884"/>
-                <ns3:effectExtent l="19050" t="0" r="29210" b="25400"/>
-                <ns3:wrapNone/>
-                <ns3:docPr id="5" name="Hexagone 5"/>
-                <ns3:cNvGraphicFramePr/>
+              <wp:anchor distT="0" distB="0" distL="114300" distR="114300" simplePos="0" relativeHeight="251670528" behindDoc="0" locked="0" layoutInCell="1" allowOverlap="1" ns4:anchorId="32DDB414" ns4:editId="2BFBAC07">
+                <wp:simplePos x="0" y="0"/>
+                <wp:positionH relativeFrom="column">
+                  <wp:posOffset>694624</wp:posOffset>
+                </wp:positionH>
+                <wp:positionV relativeFrom="paragraph">
+                  <wp:posOffset>1940092</wp:posOffset>
+                </wp:positionV>
+                <wp:extent cx="4200024" cy="1860884"/>
+                <wp:effectExtent l="19050" t="0" r="29210" b="25400"/>
+                <wp:wrapNone/>
+                <wp:docPr id="5" name="Hexagone 5"/>
+                <wp:cNvGraphicFramePr/>
                 <ns5:graphic>
                   <ns5:graphicData uri="http://schemas.microsoft.com/office/word/2010/wordprocessingShape">
                     <ns7:wsp>
@@ -24300,7 +24294,7 @@
                 <ns4:sizeRelV relativeFrom="margin">
                   <ns4:pctHeight>0</ns4:pctHeight>
                 </ns4:sizeRelV>
-              </ns3:anchor>
+              </wp:anchor>
             </w:drawing>
           </mc:Choice>
           <mc:Fallback>
@@ -29630,28 +29624,16 @@
       <w:pPr>
         <w:pStyle w:val="MemoirePetit"/>
         <w:rPr/>
-      </w:pPr>
-      <w:r>
-        <w:rPr>
-          <w:u w:val="single"/>
-        </w:rPr>
-        <w:t>Source :</w:t>
-      </w:r>
-      <w:r>
-        <w:rPr/>
-        <w:t xml:space="preserve"> R</w:t>
-      </w:r>
-      <w:r>
-        <w:rPr/>
-        <w:t>ésultats de nos investissements</w:t>
-      </w:r>
-      <w:r>
-        <w:rPr/>
-        <w:t>,</w:t>
-      </w:r>
-      <w:r>
-        <w:rPr/>
-        <w:t xml:space="preserve"> juin 2026.</w:t>
+        <w:spacing w:before="0" w:after="0" w:line="240" w:lineRule="auto"/>
+        <w:ind w:firstLine="0"/>
+        <w:jc w:val="left"/>
+      </w:pPr>
+      <w:r>
+        <w:rPr>
+          <w:sz w:val="20"/>
+          <w:szCs w:val="20"/>
+        </w:rPr>
+        <w:t>Source : Résultats de nos investissements, juin 2026.</w:t>
       </w:r>
     </w:p>
     <w:p>
@@ -30907,43 +30889,16 @@
         <w:rPr>
           <w:rStyle w:val="bumpedfont15"/>
         </w:rPr>
-      </w:pPr>
-      <w:r>
-        <w:rPr>
-          <w:rStyle w:val="bumpedfont15"/>
-          <w:u w:val="single"/>
-        </w:rPr>
-        <w:t>Source</w:t>
-      </w:r>
-      <w:r>
-        <w:rPr>
-          <w:rStyle w:val="apple-converted-space"/>
-          <w:b/>
-          <w:bCs/>
-        </w:rPr>
-        <w:t> </w:t>
-      </w:r>
-      <w:r>
-        <w:rPr>
-          <w:rStyle w:val="bumpedfont15"/>
-          <w:b/>
-          <w:bCs/>
-        </w:rPr>
-        <w:t>:</w:t>
-      </w:r>
-      <w:r>
-        <w:rPr>
-          <w:rStyle w:val="apple-converted-space"/>
-          <w:b/>
-          <w:bCs/>
-        </w:rPr>
-        <w:t> </w:t>
-      </w:r>
-      <w:r>
-        <w:rPr>
-          <w:rStyle w:val="bumpedfont15"/>
-        </w:rPr>
-        <w:t>Résultats des investigations, juillet 2026.</w:t>
+        <w:spacing w:before="0" w:after="0" w:line="240" w:lineRule="auto"/>
+        <w:ind w:firstLine="0"/>
+        <w:jc w:val="left"/>
+      </w:pPr>
+      <w:r>
+        <w:rPr>
+          <w:sz w:val="20"/>
+          <w:szCs w:val="20"/>
+        </w:rPr>
+        <w:t>Source : Résultats des investigations, juillet 2026.</w:t>
       </w:r>
     </w:p>
     <w:p>
@@ -33231,19 +33186,19 @@
         <mc:AlternateContent>
           <mc:Choice Requires="wps">
             <w:drawing>
-              <ns3:anchor distT="0" distB="0" distL="114300" distR="114300" simplePos="0" relativeHeight="251672576" behindDoc="0" locked="0" layoutInCell="1" allowOverlap="1" ns4:anchorId="32B4755B" ns4:editId="01F0F7E8">
-                <ns3:simplePos x="0" y="0"/>
-                <ns3:positionH relativeFrom="column">
-                  <ns3:posOffset>109086</ns3:posOffset>
-                </ns3:positionH>
-                <ns3:positionV relativeFrom="paragraph">
-                  <ns3:posOffset>1226218</ns3:posOffset>
-                </ns3:positionV>
-                <ns3:extent cx="5683919" cy="2935706"/>
-                <ns3:effectExtent l="19050" t="0" r="31115" b="17145"/>
-                <ns3:wrapNone/>
-                <ns3:docPr id="10" name="Hexagone 10"/>
-                <ns3:cNvGraphicFramePr/>
+              <wp:anchor distT="0" distB="0" distL="114300" distR="114300" simplePos="0" relativeHeight="251672576" behindDoc="0" locked="0" layoutInCell="1" allowOverlap="1" ns4:anchorId="32B4755B" ns4:editId="01F0F7E8">
+                <wp:simplePos x="0" y="0"/>
+                <wp:positionH relativeFrom="column">
+                  <wp:posOffset>109086</wp:posOffset>
+                </wp:positionH>
+                <wp:positionV relativeFrom="paragraph">
+                  <wp:posOffset>1226218</wp:posOffset>
+                </wp:positionV>
+                <wp:extent cx="5683919" cy="2935706"/>
+                <wp:effectExtent l="19050" t="0" r="31115" b="17145"/>
+                <wp:wrapNone/>
+                <wp:docPr id="10" name="Hexagone 10"/>
+                <wp:cNvGraphicFramePr/>
                 <ns5:graphic>
                   <ns5:graphicData uri="http://schemas.microsoft.com/office/word/2010/wordprocessingShape">
                     <ns7:wsp>
@@ -33423,7 +33378,7 @@
                 <ns4:sizeRelV relativeFrom="margin">
                   <ns4:pctHeight>0</ns4:pctHeight>
                 </ns4:sizeRelV>
-              </ns3:anchor>
+              </wp:anchor>
             </w:drawing>
           </mc:Choice>
           <mc:Fallback>
@@ -34266,16 +34221,16 @@
       <w:pPr>
         <w:pStyle w:val="MemoirePetit"/>
         <w:rPr/>
-      </w:pPr>
-      <w:r>
-        <w:rPr>
-          <w:u w:val="single"/>
-        </w:rPr>
-        <w:t>Source</w:t>
-      </w:r>
-      <w:r>
-        <w:rPr/>
-        <w:t> : Résultats de nos investigations de terrain, juillet2026.</w:t>
+        <w:spacing w:before="0" w:after="0" w:line="240" w:lineRule="auto"/>
+        <w:ind w:firstLine="0"/>
+        <w:jc w:val="left"/>
+      </w:pPr>
+      <w:r>
+        <w:rPr>
+          <w:sz w:val="20"/>
+          <w:szCs w:val="20"/>
+        </w:rPr>
+        <w:t>Source : Résultats de nos investigations de terrain, juillet2026.</w:t>
       </w:r>
     </w:p>
     <w:tbl>
@@ -34968,20 +34923,16 @@
       <w:pPr>
         <w:pStyle w:val="MemoirePetit"/>
         <w:rPr/>
-      </w:pPr>
-      <w:r>
-        <w:rPr>
-          <w:u w:val="single"/>
-        </w:rPr>
-        <w:t>Source</w:t>
-      </w:r>
-      <w:r>
-        <w:rPr/>
-        <w:t> : Résultats de nos investigations de terrain, juillet2026</w:t>
-      </w:r>
-      <w:r>
-        <w:rPr/>
-        <w:t>.</w:t>
+        <w:spacing w:before="0" w:after="0" w:line="240" w:lineRule="auto"/>
+        <w:ind w:firstLine="0"/>
+        <w:jc w:val="left"/>
+      </w:pPr>
+      <w:r>
+        <w:rPr>
+          <w:sz w:val="20"/>
+          <w:szCs w:val="20"/>
+        </w:rPr>
+        <w:t>Source : Résultats de nos investigations de terrain, juillet2026.</w:t>
       </w:r>
     </w:p>
     <w:tbl>
@@ -35457,28 +35408,16 @@
       <w:pPr>
         <w:pStyle w:val="MemoirePetit"/>
         <w:rPr/>
-      </w:pPr>
-      <w:r>
-        <w:rPr>
-          <w:u w:val="single"/>
-        </w:rPr>
-        <w:t>Source</w:t>
-      </w:r>
-      <w:r>
-        <w:rPr/>
-        <w:t> : Résultats de nos investigations de terrain, juillet</w:t>
-      </w:r>
-      <w:r>
-        <w:rPr/>
-        <w:t xml:space="preserve"> </w:t>
-      </w:r>
-      <w:r>
-        <w:rPr/>
-        <w:t>2026</w:t>
-      </w:r>
-      <w:r>
-        <w:rPr/>
-        <w:t>.</w:t>
+        <w:spacing w:before="0" w:after="0" w:line="240" w:lineRule="auto"/>
+        <w:ind w:firstLine="0"/>
+        <w:jc w:val="left"/>
+      </w:pPr>
+      <w:r>
+        <w:rPr>
+          <w:sz w:val="20"/>
+          <w:szCs w:val="20"/>
+        </w:rPr>
+        <w:t>Source : Résultats de nos investigations de terrain, juillet 2026.</w:t>
       </w:r>
     </w:p>
     <w:p>
@@ -36288,28 +36227,16 @@
       <w:pPr>
         <w:pStyle w:val="MemoirePetit"/>
         <w:rPr/>
-      </w:pPr>
-      <w:r>
-        <w:rPr>
-          <w:u w:val="single"/>
-        </w:rPr>
-        <w:t>Source</w:t>
-      </w:r>
-      <w:r>
-        <w:rPr/>
-        <w:t xml:space="preserve"> : Résultats des investigations, </w:t>
-      </w:r>
-      <w:r>
-        <w:rPr/>
-        <w:t>Juin</w:t>
-      </w:r>
-      <w:r>
-        <w:rPr/>
-        <w:t xml:space="preserve"> 202</w:t>
-      </w:r>
-      <w:r>
-        <w:rPr/>
-        <w:t>6</w:t>
+        <w:spacing w:before="0" w:after="0" w:line="240" w:lineRule="auto"/>
+        <w:ind w:firstLine="0"/>
+        <w:jc w:val="left"/>
+      </w:pPr>
+      <w:r>
+        <w:rPr>
+          <w:sz w:val="20"/>
+          <w:szCs w:val="20"/>
+        </w:rPr>
+        <w:t>Source : Résultats des investigations, Juin 2026</w:t>
       </w:r>
     </w:p>
     <w:p>
@@ -37925,18 +37852,18 @@
     </w:p>
     <w:p>
       <w:pPr>
-        <w:pStyle w:val="MemoireCorps"/>
-        <w:rPr/>
-      </w:pPr>
-      <w:r>
-        <w:rPr>
-          <w:u w:val="single"/>
-        </w:rPr>
-        <w:t>Sources</w:t>
-      </w:r>
-      <w:r>
-        <w:rPr/>
-        <w:t> : Résultats de nos investigations de terrain, juillet 2026.</w:t>
+        <w:pStyle w:val="MemoirePetit"/>
+        <w:rPr/>
+        <w:spacing w:before="0" w:after="0" w:line="240" w:lineRule="auto"/>
+        <w:ind w:firstLine="0"/>
+        <w:jc w:val="left"/>
+      </w:pPr>
+      <w:r>
+        <w:rPr>
+          <w:sz w:val="20"/>
+          <w:szCs w:val="20"/>
+        </w:rPr>
+        <w:t>Source : Résultats de nos investigations de terrain, juillet 2026.</w:t>
       </w:r>
     </w:p>
     <w:p>
@@ -39721,34 +39648,18 @@
     </w:p>
     <w:p>
       <w:pPr>
-        <w:pStyle w:val="MemoireCorps"/>
-        <w:rPr/>
-      </w:pPr>
-      <w:r>
-        <w:rPr/>
-        <w:t xml:space="preserve"> </w:t>
-      </w:r>
-      <w:proofErr w:type="gramStart"/>
-      <w:r>
-        <w:rPr>
-          <w:u w:val="single"/>
-        </w:rPr>
-        <w:t>Source</w:t>
-      </w:r>
-      <w:r>
-        <w:rPr>
-          <w:u w:val="single"/>
-        </w:rPr>
-        <w:t>s</w:t>
-      </w:r>
-      <w:r>
-        <w:rPr/>
-        <w:t>:</w:t>
-      </w:r>
-      <w:proofErr w:type="gramEnd"/>
-      <w:r>
-        <w:rPr/>
-        <w:t xml:space="preserve"> Résultats de nos investigations, juillet 2026.</w:t>
+        <w:pStyle w:val="MemoirePetit"/>
+        <w:rPr/>
+        <w:spacing w:before="0" w:after="0" w:line="240" w:lineRule="auto"/>
+        <w:ind w:firstLine="0"/>
+        <w:jc w:val="left"/>
+      </w:pPr>
+      <w:r>
+        <w:rPr>
+          <w:sz w:val="20"/>
+          <w:szCs w:val="20"/>
+        </w:rPr>
+        <w:t>Source : Résultats de nos investigations, juillet 2026.</w:t>
       </w:r>
     </w:p>
     <w:p>
@@ -41356,18 +41267,18 @@
     </w:p>
     <w:p>
       <w:pPr>
-        <w:pStyle w:val="MemoireCorps"/>
-        <w:rPr/>
-      </w:pPr>
-      <w:r>
-        <w:rPr>
-          <w:u w:val="single"/>
-        </w:rPr>
-        <w:t>Sources</w:t>
-      </w:r>
-      <w:r>
-        <w:rPr/>
-        <w:t> : Résultats de nos investigations de terrain, juillet 2026</w:t>
+        <w:pStyle w:val="MemoirePetit"/>
+        <w:rPr/>
+        <w:spacing w:before="0" w:after="0" w:line="240" w:lineRule="auto"/>
+        <w:ind w:firstLine="0"/>
+        <w:jc w:val="left"/>
+      </w:pPr>
+      <w:r>
+        <w:rPr>
+          <w:sz w:val="20"/>
+          <w:szCs w:val="20"/>
+        </w:rPr>
+        <w:t>Source : Résultats de nos investigations de terrain, juillet 2026</w:t>
       </w:r>
     </w:p>
     <w:p>
@@ -46716,13 +46627,13 @@
           <w:lang w:eastAsia="fr-FR"/>
         </w:rPr>
         <w:drawing>
-          <ns3:inline distT="0" distB="0" distL="0" distR="0" ns4:anchorId="45039B84" ns4:editId="0FE15AB8">
-            <ns3:extent cx="6675120" cy="5707380"/>
-            <ns3:effectExtent l="0" t="0" r="0" b="7620"/>
-            <ns3:docPr id="748763123" name="Image 1"/>
-            <ns3:cNvGraphicFramePr>
+          <wp:inline distT="0" distB="0" distL="0" distR="0" ns4:anchorId="45039B84" ns4:editId="0FE15AB8">
+            <wp:extent cx="6675120" cy="5707380"/>
+            <wp:effectExtent l="0" t="0" r="0" b="7620"/>
+            <wp:docPr id="748763123" name="Image 1"/>
+            <wp:cNvGraphicFramePr>
               <ns5:graphicFrameLocks noChangeAspect="1"/>
-            </ns3:cNvGraphicFramePr>
+            </wp:cNvGraphicFramePr>
             <ns5:graphic>
               <ns5:graphicData uri="http://schemas.openxmlformats.org/drawingml/2006/picture">
                 <ns9:pic>
@@ -46748,7 +46659,7 @@
                 </ns9:pic>
               </ns5:graphicData>
             </ns5:graphic>
-          </ns3:inline>
+          </wp:inline>
         </w:drawing>
       </w:r>
     </w:p>

</xml_diff>

<commit_message>
Harmonisation des légendes des figures et photos
</commit_message>
<xml_diff>
--- a/doc.docx
+++ b/doc.docx
@@ -7255,8 +7255,7 @@
               <w:rPr/>
             </w:pPr>
             <w:r>
-              <w:rPr/>
-              <w:t>:</w:t>
+              <w:t>—</w:t>
             </w:r>
           </w:p>
         </w:tc>
@@ -7390,8 +7389,7 @@
               <w:rPr/>
             </w:pPr>
             <w:r>
-              <w:rPr/>
-              <w:t>:</w:t>
+              <w:t>—</w:t>
             </w:r>
           </w:p>
         </w:tc>
@@ -15458,41 +15456,17 @@
         <w:rPr>
           <w:lang w:val="fr-BE"/>
         </w:rPr>
-      </w:pPr>
-      <w:r>
-        <w:rPr>
-          <w:lang w:val="fr-BE"/>
-        </w:rPr>
-        <w:t xml:space="preserve">                         </w:t>
-      </w:r>
-      <w:r>
-        <w:rPr>
-          <w:u w:val="single"/>
-          <w:lang w:val="fr-BE"/>
-        </w:rPr>
-        <w:t>Photo</w:t>
-      </w:r>
-      <w:r>
-        <w:rPr>
-          <w:u w:val="single"/>
-          <w:lang w:val="fr-BE"/>
-        </w:rPr>
-        <w:t xml:space="preserve"> 1</w:t>
-      </w:r>
-      <w:r>
-        <w:rPr>
-          <w:lang w:val="fr-BE"/>
-        </w:rPr>
-        <w:t xml:space="preserve"> : Vue en image de la Mairie de </w:t>
-      </w:r>
-      <w:proofErr w:type="spellStart"/>
-      <w:r>
-        <w:rPr>
-          <w:lang w:val="fr-BE"/>
-        </w:rPr>
-        <w:t>Kérou</w:t>
-      </w:r>
-      <w:proofErr w:type="spellEnd"/>
+        <w:spacing w:before="0" w:after="0" w:line="240" w:lineRule="auto"/>
+        <w:ind w:firstLine="0"/>
+        <w:jc w:val="left"/>
+      </w:pPr>
+      <w:r>
+        <w:rPr>
+          <w:sz w:val="20"/>
+          <w:szCs w:val="20"/>
+        </w:rPr>
+        <w:t>Photo 1 — Vue en image de la Mairie de Kérou</w:t>
+      </w:r>
     </w:p>
     <w:p>
       <w:pPr>
@@ -15592,81 +15566,17 @@
         <w:rPr>
           <w:lang w:val="fr-BE"/>
         </w:rPr>
-      </w:pPr>
-      <w:r>
-        <w:rPr>
-          <w:lang w:val="fr-BE"/>
-        </w:rPr>
-        <w:t xml:space="preserve">                 </w:t>
-      </w:r>
-      <w:r>
-        <w:rPr>
-          <w:lang w:val="fr-BE"/>
-        </w:rPr>
-        <w:t xml:space="preserve"> </w:t>
-      </w:r>
-      <w:r>
-        <w:rPr>
-          <w:lang w:val="fr-BE"/>
-        </w:rPr>
-        <w:t xml:space="preserve"> </w:t>
-      </w:r>
-      <w:r>
-        <w:rPr>
-          <w:lang w:val="fr-BE"/>
-        </w:rPr>
-        <w:t xml:space="preserve"> </w:t>
-      </w:r>
-      <w:r>
-        <w:rPr>
-          <w:lang w:val="fr-BE"/>
-        </w:rPr>
-        <w:t xml:space="preserve">  </w:t>
-      </w:r>
-      <w:r>
-        <w:rPr>
-          <w:u w:val="single"/>
-          <w:lang w:val="fr-BE"/>
-        </w:rPr>
-        <w:t>Photo</w:t>
-      </w:r>
-      <w:r>
-        <w:rPr>
-          <w:u w:val="single"/>
-          <w:lang w:val="fr-BE"/>
-        </w:rPr>
-        <w:t xml:space="preserve"> </w:t>
-      </w:r>
-      <w:proofErr w:type="gramStart"/>
-      <w:r>
-        <w:rPr>
-          <w:u w:val="single"/>
-          <w:lang w:val="fr-BE"/>
-        </w:rPr>
-        <w:t>2</w:t>
-      </w:r>
-      <w:r>
-        <w:rPr>
-          <w:u w:val="single"/>
-          <w:lang w:val="fr-BE"/>
-        </w:rPr>
-        <w:t>:</w:t>
-      </w:r>
-      <w:proofErr w:type="gramEnd"/>
-      <w:r>
-        <w:rPr>
-          <w:lang w:val="fr-BE"/>
-        </w:rPr>
-        <w:t xml:space="preserve"> Géolocalisation de la Mairie de </w:t>
-      </w:r>
-      <w:proofErr w:type="spellStart"/>
-      <w:r>
-        <w:rPr>
-          <w:lang w:val="fr-BE"/>
-        </w:rPr>
-        <w:t>Kérou</w:t>
-      </w:r>
-      <w:proofErr w:type="spellEnd"/>
+        <w:spacing w:before="0" w:after="0" w:line="240" w:lineRule="auto"/>
+        <w:ind w:firstLine="0"/>
+        <w:jc w:val="left"/>
+      </w:pPr>
+      <w:r>
+        <w:rPr>
+          <w:sz w:val="20"/>
+          <w:szCs w:val="20"/>
+        </w:rPr>
+        <w:t>Photo 2 — Géolocalisation de la Mairie de Kérou</w:t>
+      </w:r>
     </w:p>
     <w:p>
       <w:pPr>

</xml_diff>

<commit_message>
Correction de la taille et de l'alignement des illustrations
</commit_message>
<xml_diff>
--- a/doc.docx
+++ b/doc.docx
@@ -1,6 +1,6 @@
 
 <file path=word/document.xml><?xml version="1.0" encoding="utf-8"?>
-<w:document xmlns:mc="http://schemas.openxmlformats.org/markup-compatibility/2006" xmlns:ns13="urn:schemas-microsoft-com:office:word" xmlns:ns2="http://schemas.microsoft.com/office/word/2010/wordml" xmlns:ns4="http://schemas.microsoft.com/office/word/2010/wordprocessingDrawing" xmlns:ns5="http://schemas.openxmlformats.org/drawingml/2006/main" xmlns:ns6="http://schemas.microsoft.com/office/word/2010/wordprocessingGroup" xmlns:ns7="http://schemas.microsoft.com/office/word/2010/wordprocessingShape" xmlns:ns8="http://schemas.microsoft.com/office/drawing/2010/main" xmlns:ns9="http://schemas.openxmlformats.org/drawingml/2006/picture" xmlns:o="urn:schemas-microsoft-com:office:office" xmlns:r="http://schemas.openxmlformats.org/officeDocument/2006/relationships" xmlns:v="urn:schemas-microsoft-com:vml" xmlns:w="http://schemas.openxmlformats.org/wordprocessingml/2006/main" xmlns:wp="http://schemas.openxmlformats.org/drawingml/2006/wordprocessingDrawing" mc:Ignorable="w14 w15 w16se wp14">
+<w:document xmlns:a="http://schemas.openxmlformats.org/drawingml/2006/main" xmlns:ns1="http://schemas.openxmlformats.org/markup-compatibility/2006" xmlns:ns11="urn:schemas-microsoft-com:vml" xmlns:ns12="urn:schemas-microsoft-com:office:office" xmlns:ns13="urn:schemas-microsoft-com:office:word" xmlns:ns2="http://schemas.microsoft.com/office/word/2010/wordml" xmlns:ns4="http://schemas.microsoft.com/office/word/2010/wordprocessingDrawing" xmlns:ns6="http://schemas.microsoft.com/office/word/2010/wordprocessingGroup" xmlns:ns8="http://schemas.microsoft.com/office/drawing/2010/main" xmlns:pic="http://schemas.openxmlformats.org/drawingml/2006/picture" xmlns:r="http://schemas.openxmlformats.org/officeDocument/2006/relationships" xmlns:w="http://schemas.openxmlformats.org/wordprocessingml/2006/main" xmlns:wp="http://schemas.openxmlformats.org/drawingml/2006/wordprocessingDrawing" xmlns:wps="http://schemas.microsoft.com/office/word/2010/wordprocessingShape" ns1:Ignorable="w14 w15 w16se wp14">
   <w:body>
     <w:p ns2:paraId="7AB3675A" ns2:textId="77777777">
       <w:pPr>
@@ -36,8 +36,8 @@
           <w:noProof/>
           <w:lang w:eastAsia="fr-FR"/>
         </w:rPr>
-        <mc:AlternateContent>
-          <mc:Choice Requires="wpg">
+        <ns1:AlternateContent>
+          <ns1:Choice Requires="wpg">
             <w:drawing>
               <wp:anchor distT="0" distB="0" distL="114300" distR="114300" simplePos="0" relativeHeight="251648000" behindDoc="1" locked="0" layoutInCell="1" allowOverlap="1" ns4:anchorId="4BAE0E57" ns4:editId="729E2BD9">
                 <wp:simplePos x="0" y="0"/>
@@ -52,231 +52,231 @@
                 <wp:wrapNone/>
                 <wp:docPr id="9" name="Groupe 9"/>
                 <wp:cNvGraphicFramePr/>
-                <ns5:graphic>
-                  <ns5:graphicData uri="http://schemas.microsoft.com/office/word/2010/wordprocessingGroup">
+                <a:graphic>
+                  <a:graphicData uri="http://schemas.microsoft.com/office/word/2010/wordprocessingGroup">
                     <ns6:wgp>
                       <ns6:cNvGrpSpPr/>
                       <ns6:grpSpPr bwMode="auto">
-                        <ns5:xfrm>
-                          <ns5:off x="0" y="0"/>
-                          <ns5:ext cx="2230120" cy="956310"/>
-                          <ns5:chOff x="0" y="0"/>
-                          <ns5:chExt cx="22333" cy="10408"/>
-                        </ns5:xfrm>
+                        <a:xfrm>
+                          <a:off x="0" y="0"/>
+                          <a:ext cx="2230120" cy="956310"/>
+                          <a:chOff x="0" y="0"/>
+                          <a:chExt cx="22333" cy="10408"/>
+                        </a:xfrm>
                       </ns6:grpSpPr>
                       <ns6:grpSp>
                         <ns6:cNvPr id="12" name="Group 5"/>
                         <ns6:cNvGrpSpPr>
-                          <ns5:grpSpLocks/>
+                          <a:grpSpLocks/>
                         </ns6:cNvGrpSpPr>
                         <ns6:grpSpPr bwMode="auto">
-                          <ns5:xfrm flipV="1">
-                            <ns5:off x="7415" y="6065"/>
-                            <ns5:ext cx="12739" cy="788"/>
-                            <ns5:chOff x="7415" y="6065"/>
-                            <ns5:chExt cx="586" cy="50"/>
-                          </ns5:xfrm>
+                          <a:xfrm flipV="1">
+                            <a:off x="7415" y="6065"/>
+                            <a:ext cx="12739" cy="788"/>
+                            <a:chOff x="7415" y="6065"/>
+                            <a:chExt cx="586" cy="50"/>
+                          </a:xfrm>
                         </ns6:grpSpPr>
-                        <ns7:wsp>
-                          <ns7:cNvPr id="17" name="Rectangle 17"/>
-                          <ns7:cNvSpPr>
-                            <ns5:spLocks noChangeArrowheads="1"/>
-                          </ns7:cNvSpPr>
-                          <ns7:spPr bwMode="auto">
-                            <ns5:xfrm>
-                              <ns5:off x="7415" y="6086"/>
-                              <ns5:ext cx="210" cy="29"/>
-                            </ns5:xfrm>
-                            <ns5:prstGeom prst="rect">
-                              <ns5:avLst/>
-                            </ns5:prstGeom>
-                            <ns5:solidFill>
-                              <ns5:srgbClr val="00B050"/>
-                            </ns5:solidFill>
-                            <ns5:ln>
-                              <ns5:noFill/>
-                            </ns5:ln>
-                            <ns5:extLst>
-                              <ns5:ext uri="{91240B29-F687-4F45-9708-019B960494DF}">
+                        <wps:wsp>
+                          <wps:cNvPr id="17" name="Rectangle 17"/>
+                          <wps:cNvSpPr>
+                            <a:spLocks noChangeArrowheads="1"/>
+                          </wps:cNvSpPr>
+                          <wps:spPr bwMode="auto">
+                            <a:xfrm>
+                              <a:off x="7415" y="6086"/>
+                              <a:ext cx="210" cy="29"/>
+                            </a:xfrm>
+                            <a:prstGeom prst="rect">
+                              <a:avLst/>
+                            </a:prstGeom>
+                            <a:solidFill>
+                              <a:srgbClr val="00B050"/>
+                            </a:solidFill>
+                            <a:ln>
+                              <a:noFill/>
+                            </a:ln>
+                            <a:extLst>
+                              <a:ext uri="{91240B29-F687-4F45-9708-019B960494DF}">
                                 <ns8:hiddenLine w="9525">
-                                  <ns5:solidFill>
-                                    <ns5:srgbClr val="000000"/>
-                                  </ns5:solidFill>
-                                  <ns5:miter lim="800000"/>
-                                  <ns5:headEnd/>
-                                  <ns5:tailEnd/>
+                                  <a:solidFill>
+                                    <a:srgbClr val="000000"/>
+                                  </a:solidFill>
+                                  <a:miter lim="800000"/>
+                                  <a:headEnd/>
+                                  <a:tailEnd/>
                                 </ns8:hiddenLine>
-                              </ns5:ext>
-                            </ns5:extLst>
-                          </ns7:spPr>
-                          <ns7:bodyPr rot="0" vert="horz" wrap="square" lIns="36576" tIns="36576" rIns="36576" bIns="36576" anchor="t" anchorCtr="0" upright="1">
-                            <ns5:noAutofit/>
-                          </ns7:bodyPr>
-                        </ns7:wsp>
-                        <ns7:wsp>
-                          <ns7:cNvPr id="18" name="Rectangle 18"/>
-                          <ns7:cNvSpPr>
-                            <ns5:spLocks noChangeArrowheads="1"/>
-                          </ns7:cNvSpPr>
-                          <ns7:spPr bwMode="auto">
-                            <ns5:xfrm>
-                              <ns5:off x="7580" y="6086"/>
-                              <ns5:ext cx="211" cy="29"/>
-                            </ns5:xfrm>
-                            <ns5:prstGeom prst="rect">
-                              <ns5:avLst/>
-                            </ns5:prstGeom>
-                            <ns5:solidFill>
-                              <ns5:srgbClr val="FFFF00"/>
-                            </ns5:solidFill>
-                            <ns5:ln>
-                              <ns5:noFill/>
-                            </ns5:ln>
-                            <ns5:extLst>
-                              <ns5:ext uri="{91240B29-F687-4F45-9708-019B960494DF}">
+                              </a:ext>
+                            </a:extLst>
+                          </wps:spPr>
+                          <wps:bodyPr rot="0" vert="horz" wrap="square" lIns="36576" tIns="36576" rIns="36576" bIns="36576" anchor="t" anchorCtr="0" upright="1">
+                            <a:noAutofit/>
+                          </wps:bodyPr>
+                        </wps:wsp>
+                        <wps:wsp>
+                          <wps:cNvPr id="18" name="Rectangle 18"/>
+                          <wps:cNvSpPr>
+                            <a:spLocks noChangeArrowheads="1"/>
+                          </wps:cNvSpPr>
+                          <wps:spPr bwMode="auto">
+                            <a:xfrm>
+                              <a:off x="7580" y="6086"/>
+                              <a:ext cx="211" cy="29"/>
+                            </a:xfrm>
+                            <a:prstGeom prst="rect">
+                              <a:avLst/>
+                            </a:prstGeom>
+                            <a:solidFill>
+                              <a:srgbClr val="FFFF00"/>
+                            </a:solidFill>
+                            <a:ln>
+                              <a:noFill/>
+                            </a:ln>
+                            <a:extLst>
+                              <a:ext uri="{91240B29-F687-4F45-9708-019B960494DF}">
                                 <ns8:hiddenLine w="9525">
-                                  <ns5:solidFill>
-                                    <ns5:srgbClr val="000000"/>
-                                  </ns5:solidFill>
-                                  <ns5:miter lim="800000"/>
-                                  <ns5:headEnd/>
-                                  <ns5:tailEnd/>
+                                  <a:solidFill>
+                                    <a:srgbClr val="000000"/>
+                                  </a:solidFill>
+                                  <a:miter lim="800000"/>
+                                  <a:headEnd/>
+                                  <a:tailEnd/>
                                 </ns8:hiddenLine>
-                              </ns5:ext>
-                            </ns5:extLst>
-                          </ns7:spPr>
-                          <ns7:bodyPr rot="0" vert="horz" wrap="square" lIns="36576" tIns="36576" rIns="36576" bIns="36576" anchor="t" anchorCtr="0" upright="1">
-                            <ns5:noAutofit/>
-                          </ns7:bodyPr>
-                        </ns7:wsp>
-                        <ns7:wsp>
-                          <ns7:cNvPr id="19" name="Rectangle 19"/>
-                          <ns7:cNvSpPr>
-                            <ns5:spLocks noChangeArrowheads="1"/>
-                          </ns7:cNvSpPr>
-                          <ns7:spPr bwMode="auto">
-                            <ns5:xfrm>
-                              <ns5:off x="7791" y="6065"/>
-                              <ns5:ext cx="210" cy="29"/>
-                            </ns5:xfrm>
-                            <ns5:prstGeom prst="rect">
-                              <ns5:avLst/>
-                            </ns5:prstGeom>
-                            <ns5:solidFill>
-                              <ns5:srgbClr val="FF0000"/>
-                            </ns5:solidFill>
-                            <ns5:ln>
-                              <ns5:noFill/>
-                            </ns5:ln>
-                            <ns5:extLst>
-                              <ns5:ext uri="{91240B29-F687-4F45-9708-019B960494DF}">
+                              </a:ext>
+                            </a:extLst>
+                          </wps:spPr>
+                          <wps:bodyPr rot="0" vert="horz" wrap="square" lIns="36576" tIns="36576" rIns="36576" bIns="36576" anchor="t" anchorCtr="0" upright="1">
+                            <a:noAutofit/>
+                          </wps:bodyPr>
+                        </wps:wsp>
+                        <wps:wsp>
+                          <wps:cNvPr id="19" name="Rectangle 19"/>
+                          <wps:cNvSpPr>
+                            <a:spLocks noChangeArrowheads="1"/>
+                          </wps:cNvSpPr>
+                          <wps:spPr bwMode="auto">
+                            <a:xfrm>
+                              <a:off x="7791" y="6065"/>
+                              <a:ext cx="210" cy="29"/>
+                            </a:xfrm>
+                            <a:prstGeom prst="rect">
+                              <a:avLst/>
+                            </a:prstGeom>
+                            <a:solidFill>
+                              <a:srgbClr val="FF0000"/>
+                            </a:solidFill>
+                            <a:ln>
+                              <a:noFill/>
+                            </a:ln>
+                            <a:extLst>
+                              <a:ext uri="{91240B29-F687-4F45-9708-019B960494DF}">
                                 <ns8:hiddenLine w="9525">
-                                  <ns5:solidFill>
-                                    <ns5:srgbClr val="000000"/>
-                                  </ns5:solidFill>
-                                  <ns5:miter lim="800000"/>
-                                  <ns5:headEnd/>
-                                  <ns5:tailEnd/>
+                                  <a:solidFill>
+                                    <a:srgbClr val="000000"/>
+                                  </a:solidFill>
+                                  <a:miter lim="800000"/>
+                                  <a:headEnd/>
+                                  <a:tailEnd/>
                                 </ns8:hiddenLine>
-                              </ns5:ext>
-                            </ns5:extLst>
-                          </ns7:spPr>
-                          <ns7:bodyPr rot="0" vert="horz" wrap="square" lIns="36576" tIns="36576" rIns="36576" bIns="36576" anchor="t" anchorCtr="0" upright="1">
-                            <ns5:noAutofit/>
-                          </ns7:bodyPr>
-                        </ns7:wsp>
+                              </a:ext>
+                            </a:extLst>
+                          </wps:spPr>
+                          <wps:bodyPr rot="0" vert="horz" wrap="square" lIns="36576" tIns="36576" rIns="36576" bIns="36576" anchor="t" anchorCtr="0" upright="1">
+                            <a:noAutofit/>
+                          </wps:bodyPr>
+                        </wps:wsp>
                       </ns6:grpSp>
                       <ns6:grpSp>
                         <ns6:cNvPr id="13" name="Groupe 13"/>
                         <ns6:cNvGrpSpPr>
-                          <ns5:grpSpLocks/>
+                          <a:grpSpLocks/>
                         </ns6:cNvGrpSpPr>
                         <ns6:grpSpPr bwMode="auto">
-                          <ns5:xfrm>
-                            <ns5:off x="0" y="0"/>
-                            <ns5:ext cx="22333" cy="10408"/>
-                            <ns5:chOff x="0" y="0"/>
-                            <ns5:chExt cx="22333" cy="10408"/>
-                          </ns5:xfrm>
+                          <a:xfrm>
+                            <a:off x="0" y="0"/>
+                            <a:ext cx="22333" cy="10408"/>
+                            <a:chOff x="0" y="0"/>
+                            <a:chExt cx="22333" cy="10408"/>
+                          </a:xfrm>
                         </ns6:grpSpPr>
-                        <ns9:pic>
-                          <ns9:nvPicPr>
-                            <ns9:cNvPr id="14" name="Picture 3"/>
-                            <ns9:cNvPicPr>
-                              <ns5:picLocks noChangeAspect="1"/>
-                            </ns9:cNvPicPr>
-                          </ns9:nvPicPr>
-                          <ns9:blipFill>
-                            <ns5:blip r:embed="rId7" cstate="print">
-                              <ns5:extLst>
-                                <ns5:ext uri="{28A0092B-C50C-407E-A947-70E740481C1C}">
+                        <pic:pic>
+                          <pic:nvPicPr>
+                            <pic:cNvPr id="14" name="Picture 3"/>
+                            <pic:cNvPicPr>
+                              <a:picLocks noChangeAspect="1"/>
+                            </pic:cNvPicPr>
+                          </pic:nvPicPr>
+                          <pic:blipFill>
+                            <a:blip r:embed="rId7" cstate="print">
+                              <a:extLst>
+                                <a:ext uri="{28A0092B-C50C-407E-A947-70E740481C1C}">
                                   <ns8:useLocalDpi val="0"/>
-                                </ns5:ext>
-                              </ns5:extLst>
-                            </ns5:blip>
-                            <ns5:srcRect/>
-                            <ns5:stretch>
-                              <ns5:fillRect/>
-                            </ns5:stretch>
-                          </ns9:blipFill>
-                          <ns9:spPr bwMode="auto">
-                            <ns5:xfrm>
-                              <ns5:off x="0" y="0"/>
-                              <ns5:ext cx="6813" cy="6204"/>
-                            </ns5:xfrm>
-                            <ns5:prstGeom prst="rect">
-                              <ns5:avLst/>
-                            </ns5:prstGeom>
-                            <ns5:noFill/>
-                            <ns5:extLst>
-                              <ns5:ext uri="{909E8E84-426E-40DD-AFC4-6F175D3DCCD1}">
+                                </a:ext>
+                              </a:extLst>
+                            </a:blip>
+                            <a:srcRect/>
+                            <a:stretch>
+                              <a:fillRect/>
+                            </a:stretch>
+                          </pic:blipFill>
+                          <pic:spPr bwMode="auto">
+                            <a:xfrm>
+                              <a:off x="0" y="0"/>
+                              <a:ext cx="6813" cy="6204"/>
+                            </a:xfrm>
+                            <a:prstGeom prst="rect">
+                              <a:avLst/>
+                            </a:prstGeom>
+                            <a:noFill/>
+                            <a:extLst>
+                              <a:ext uri="{909E8E84-426E-40DD-AFC4-6F175D3DCCD1}">
                                 <ns8:hiddenFill>
-                                  <ns5:solidFill>
-                                    <ns5:srgbClr val="FFFFFF"/>
-                                  </ns5:solidFill>
+                                  <a:solidFill>
+                                    <a:srgbClr val="FFFFFF"/>
+                                  </a:solidFill>
                                 </ns8:hiddenFill>
-                              </ns5:ext>
-                            </ns5:extLst>
-                          </ns9:spPr>
-                        </ns9:pic>
-                        <ns7:wsp>
-                          <ns7:cNvPr id="15" name="Text Box 4"/>
-                          <ns7:cNvSpPr txBox="1">
-                            <ns5:spLocks noChangeArrowheads="1"/>
-                          </ns7:cNvSpPr>
-                          <ns7:spPr bwMode="auto">
-                            <ns5:xfrm>
-                              <ns5:off x="6813" y="0"/>
-                              <ns5:ext cx="14207" cy="5702"/>
-                            </ns5:xfrm>
-                            <ns5:prstGeom prst="rect">
-                              <ns5:avLst/>
-                            </ns5:prstGeom>
-                            <ns5:noFill/>
-                            <ns5:ln>
-                              <ns5:noFill/>
-                            </ns5:ln>
-                            <ns5:extLst>
-                              <ns5:ext uri="{909E8E84-426E-40DD-AFC4-6F175D3DCCD1}">
+                              </a:ext>
+                            </a:extLst>
+                          </pic:spPr>
+                        </pic:pic>
+                        <wps:wsp>
+                          <wps:cNvPr id="15" name="Text Box 4"/>
+                          <wps:cNvSpPr txBox="1">
+                            <a:spLocks noChangeArrowheads="1"/>
+                          </wps:cNvSpPr>
+                          <wps:spPr bwMode="auto">
+                            <a:xfrm>
+                              <a:off x="6813" y="0"/>
+                              <a:ext cx="14207" cy="5702"/>
+                            </a:xfrm>
+                            <a:prstGeom prst="rect">
+                              <a:avLst/>
+                            </a:prstGeom>
+                            <a:noFill/>
+                            <a:ln>
+                              <a:noFill/>
+                            </a:ln>
+                            <a:extLst>
+                              <a:ext uri="{909E8E84-426E-40DD-AFC4-6F175D3DCCD1}">
                                 <ns8:hiddenFill>
-                                  <ns5:solidFill>
-                                    <ns5:srgbClr val="FFFFFF"/>
-                                  </ns5:solidFill>
+                                  <a:solidFill>
+                                    <a:srgbClr val="FFFFFF"/>
+                                  </a:solidFill>
                                 </ns8:hiddenFill>
-                              </ns5:ext>
-                              <ns5:ext uri="{91240B29-F687-4F45-9708-019B960494DF}">
+                              </a:ext>
+                              <a:ext uri="{91240B29-F687-4F45-9708-019B960494DF}">
                                 <ns8:hiddenLine w="9525">
-                                  <ns5:solidFill>
-                                    <ns5:srgbClr val="000000"/>
-                                  </ns5:solidFill>
-                                  <ns5:miter lim="800000"/>
-                                  <ns5:headEnd/>
-                                  <ns5:tailEnd/>
+                                  <a:solidFill>
+                                    <a:srgbClr val="000000"/>
+                                  </a:solidFill>
+                                  <a:miter lim="800000"/>
+                                  <a:headEnd/>
+                                  <a:tailEnd/>
                                 </ns8:hiddenLine>
-                              </ns5:ext>
-                            </ns5:extLst>
-                          </ns7:spPr>
-                          <ns7:txbx>
+                              </a:ext>
+                            </a:extLst>
+                          </wps:spPr>
+                          <wps:txbx>
                             <w:txbxContent>
                               <w:p ns2:paraId="7E28FFF1" ns2:textId="77777777">
                                 <w:pPr>
@@ -309,49 +309,49 @@
                                 </w:r>
                               </w:p>
                             </w:txbxContent>
-                          </ns7:txbx>
-                          <ns7:bodyPr rot="0" vert="horz" wrap="square" lIns="36576" tIns="36576" rIns="36576" bIns="36576" anchor="t" anchorCtr="0" upright="1">
-                            <ns5:noAutofit/>
-                          </ns7:bodyPr>
-                        </ns7:wsp>
-                        <ns7:wsp>
-                          <ns7:cNvPr id="16" name="Text Box 9"/>
-                          <ns7:cNvSpPr txBox="1">
-                            <ns5:spLocks noChangeArrowheads="1"/>
-                          </ns7:cNvSpPr>
-                          <ns7:spPr bwMode="auto">
-                            <ns5:xfrm>
-                              <ns5:off x="7010" y="8191"/>
-                              <ns5:ext cx="15323" cy="2217"/>
-                            </ns5:xfrm>
-                            <ns5:prstGeom prst="rect">
-                              <ns5:avLst/>
-                            </ns5:prstGeom>
-                            <ns5:noFill/>
-                            <ns5:ln>
-                              <ns5:noFill/>
-                            </ns5:ln>
-                            <ns5:extLst>
-                              <ns5:ext uri="{909E8E84-426E-40DD-AFC4-6F175D3DCCD1}">
+                          </wps:txbx>
+                          <wps:bodyPr rot="0" vert="horz" wrap="square" lIns="36576" tIns="36576" rIns="36576" bIns="36576" anchor="t" anchorCtr="0" upright="1">
+                            <a:noAutofit/>
+                          </wps:bodyPr>
+                        </wps:wsp>
+                        <wps:wsp>
+                          <wps:cNvPr id="16" name="Text Box 9"/>
+                          <wps:cNvSpPr txBox="1">
+                            <a:spLocks noChangeArrowheads="1"/>
+                          </wps:cNvSpPr>
+                          <wps:spPr bwMode="auto">
+                            <a:xfrm>
+                              <a:off x="7010" y="8191"/>
+                              <a:ext cx="15323" cy="2217"/>
+                            </a:xfrm>
+                            <a:prstGeom prst="rect">
+                              <a:avLst/>
+                            </a:prstGeom>
+                            <a:noFill/>
+                            <a:ln>
+                              <a:noFill/>
+                            </a:ln>
+                            <a:extLst>
+                              <a:ext uri="{909E8E84-426E-40DD-AFC4-6F175D3DCCD1}">
                                 <ns8:hiddenFill>
-                                  <ns5:solidFill>
-                                    <ns5:srgbClr val="FFFFFF"/>
-                                  </ns5:solidFill>
+                                  <a:solidFill>
+                                    <a:srgbClr val="FFFFFF"/>
+                                  </a:solidFill>
                                 </ns8:hiddenFill>
-                              </ns5:ext>
-                              <ns5:ext uri="{91240B29-F687-4F45-9708-019B960494DF}">
+                              </a:ext>
+                              <a:ext uri="{91240B29-F687-4F45-9708-019B960494DF}">
                                 <ns8:hiddenLine w="9525">
-                                  <ns5:solidFill>
-                                    <ns5:srgbClr val="000000"/>
-                                  </ns5:solidFill>
-                                  <ns5:miter lim="800000"/>
-                                  <ns5:headEnd/>
-                                  <ns5:tailEnd/>
+                                  <a:solidFill>
+                                    <a:srgbClr val="000000"/>
+                                  </a:solidFill>
+                                  <a:miter lim="800000"/>
+                                  <a:headEnd/>
+                                  <a:tailEnd/>
                                 </ns8:hiddenLine>
-                              </ns5:ext>
-                            </ns5:extLst>
-                          </ns7:spPr>
-                          <ns7:txbx>
+                              </a:ext>
+                            </a:extLst>
+                          </wps:spPr>
+                          <wps:txbx>
                             <w:txbxContent>
                               <w:p ns2:paraId="13BA976F" ns2:textId="77777777">
                                 <w:r>
@@ -362,15 +362,15 @@
                                 </w:r>
                               </w:p>
                             </w:txbxContent>
-                          </ns7:txbx>
-                          <ns7:bodyPr rot="0" vert="horz" wrap="square" lIns="36576" tIns="36576" rIns="36576" bIns="36576" anchor="t" anchorCtr="0" upright="1">
-                            <ns5:noAutofit/>
-                          </ns7:bodyPr>
-                        </ns7:wsp>
+                          </wps:txbx>
+                          <wps:bodyPr rot="0" vert="horz" wrap="square" lIns="36576" tIns="36576" rIns="36576" bIns="36576" anchor="t" anchorCtr="0" upright="1">
+                            <a:noAutofit/>
+                          </wps:bodyPr>
+                        </wps:wsp>
                       </ns6:grpSp>
                     </ns6:wgp>
-                  </ns5:graphicData>
-                </ns5:graphic>
+                  </a:graphicData>
+                </a:graphic>
                 <ns4:sizeRelH relativeFrom="margin">
                   <ns4:pctWidth>0</ns4:pctWidth>
                 </ns4:sizeRelH>
@@ -379,50 +379,50 @@
                 </ns4:sizeRelV>
               </wp:anchor>
             </w:drawing>
-          </mc:Choice>
-          <mc:Fallback>
+          </ns1:Choice>
+          <ns1:Fallback>
             <w:pict>
-              <v:group ns2:anchorId="4BAE0E57" id="Groupe 9" o:spid="_x0000_s1026" style="position:absolute;left:0;text-align:left;margin-left:-13.2pt;margin-top:16.45pt;width:175.6pt;height:75.3pt;z-index:-251668480;mso-position-horizontal-relative:margin;mso-width-relative:margin;mso-height-relative:margin" coordsize="22333,10408" o:gfxdata="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">
-                <v:group id="Group 5" o:spid="_x0000_s1027" style="position:absolute;left:7415;top:6065;width:12739;height:788;flip:y" coordorigin="7415,6065" coordsize="586,50" o:gfxdata="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">
-                  <v:rect id="Rectangle 17" o:spid="_x0000_s1028" style="position:absolute;left:7415;top:6086;width:210;height:29;visibility:visible;mso-wrap-style:square;v-text-anchor:top" o:gfxdata="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" fillcolor="#00b050" stroked="f">
-                    <v:textbox inset="2.88pt,2.88pt,2.88pt,2.88pt"/>
-                  </v:rect>
-                  <v:rect id="Rectangle 18" o:spid="_x0000_s1029" style="position:absolute;left:7580;top:6086;width:211;height:29;visibility:visible;mso-wrap-style:square;v-text-anchor:top" o:gfxdata="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" fillcolor="yellow" stroked="f">
-                    <v:textbox inset="2.88pt,2.88pt,2.88pt,2.88pt"/>
-                  </v:rect>
-                  <v:rect id="Rectangle 19" o:spid="_x0000_s1030" style="position:absolute;left:7791;top:6065;width:210;height:29;visibility:visible;mso-wrap-style:square;v-text-anchor:top" o:gfxdata="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" fillcolor="red" stroked="f">
-                    <v:textbox inset="2.88pt,2.88pt,2.88pt,2.88pt"/>
-                  </v:rect>
-                </v:group>
-                <v:group id="Groupe 13" o:spid="_x0000_s1031" style="position:absolute;width:22333;height:10408" coordsize="22333,10408" o:gfxdata="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">
-                  <v:shapetype id="_x0000_t75" coordsize="21600,21600" o:spt="75" o:preferrelative="t" path="m@4@5l@4@11@9@11@9@5xe" filled="f" stroked="f">
-                    <v:stroke joinstyle="miter"/>
-                    <v:formulas>
-                      <v:f eqn="if lineDrawn pixelLineWidth 0"/>
-                      <v:f eqn="sum @0 1 0"/>
-                      <v:f eqn="sum 0 0 @1"/>
-                      <v:f eqn="prod @2 1 2"/>
-                      <v:f eqn="prod @3 21600 pixelWidth"/>
-                      <v:f eqn="prod @3 21600 pixelHeight"/>
-                      <v:f eqn="sum @0 0 1"/>
-                      <v:f eqn="prod @6 1 2"/>
-                      <v:f eqn="prod @7 21600 pixelWidth"/>
-                      <v:f eqn="sum @8 21600 0"/>
-                      <v:f eqn="prod @7 21600 pixelHeight"/>
-                      <v:f eqn="sum @10 21600 0"/>
-                    </v:formulas>
-                    <v:path o:extrusionok="f" gradientshapeok="t" o:connecttype="rect"/>
-                    <o:lock v:ext="edit" aspectratio="t"/>
-                  </v:shapetype>
-                  <v:shape id="Picture 3" o:spid="_x0000_s1032" type="#_x0000_t75" style="position:absolute;width:6813;height:6204;visibility:visible;mso-wrap-style:square" o:gfxdata="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">
-                    <v:imagedata r:id="rId8" o:title=""/>
-                  </v:shape>
-                  <v:shapetype id="_x0000_t202" coordsize="21600,21600" o:spt="202" path="m,l,21600r21600,l21600,xe">
-                    <v:stroke joinstyle="miter"/>
-                    <v:path gradientshapeok="t" o:connecttype="rect"/>
-                  </v:shapetype>
-                  <v:shape id="Text Box 4" o:spid="_x0000_s1033" type="#_x0000_t202" style="position:absolute;left:6813;width:14207;height:5702;visibility:visible;mso-wrap-style:square;v-text-anchor:top" o:gfxdata="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" filled="f" stroked="f">
-                    <v:textbox inset="2.88pt,2.88pt,2.88pt,2.88pt">
+              <ns11:group ns2:anchorId="4BAE0E57" id="Groupe 9" ns12:spid="_x0000_s1026" style="position:absolute;left:0;text-align:left;margin-left:-13.2pt;margin-top:16.45pt;width:175.6pt;height:75.3pt;z-index:-251668480;mso-position-horizontal-relative:margin;mso-width-relative:margin;mso-height-relative:margin" coordsize="22333,10408" ns12:gfxdata="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">
+                <ns11:group id="Group 5" ns12:spid="_x0000_s1027" style="position:absolute;left:7415;top:6065;width:12739;height:788;flip:y" coordorigin="7415,6065" coordsize="586,50" ns12:gfxdata="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">
+                  <ns11:rect id="Rectangle 17" ns12:spid="_x0000_s1028" style="position:absolute;left:7415;top:6086;width:210;height:29;visibility:visible;mso-wrap-style:square;v-text-anchor:top" ns12:gfxdata="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" fillcolor="#00b050" stroked="f">
+                    <ns11:textbox inset="2.88pt,2.88pt,2.88pt,2.88pt"/>
+                  </ns11:rect>
+                  <ns11:rect id="Rectangle 18" ns12:spid="_x0000_s1029" style="position:absolute;left:7580;top:6086;width:211;height:29;visibility:visible;mso-wrap-style:square;v-text-anchor:top" ns12:gfxdata="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" fillcolor="yellow" stroked="f">
+                    <ns11:textbox inset="2.88pt,2.88pt,2.88pt,2.88pt"/>
+                  </ns11:rect>
+                  <ns11:rect id="Rectangle 19" ns12:spid="_x0000_s1030" style="position:absolute;left:7791;top:6065;width:210;height:29;visibility:visible;mso-wrap-style:square;v-text-anchor:top" ns12:gfxdata="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" fillcolor="red" stroked="f">
+                    <ns11:textbox inset="2.88pt,2.88pt,2.88pt,2.88pt"/>
+                  </ns11:rect>
+                </ns11:group>
+                <ns11:group id="Groupe 13" ns12:spid="_x0000_s1031" style="position:absolute;width:22333;height:10408" coordsize="22333,10408" ns12:gfxdata="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">
+                  <ns11:shapetype id="_x0000_t75" coordsize="21600,21600" ns12:spt="75" ns12:preferrelative="t" path="m@4@5l@4@11@9@11@9@5xe" filled="f" stroked="f">
+                    <ns11:stroke joinstyle="miter"/>
+                    <ns11:formulas>
+                      <ns11:f eqn="if lineDrawn pixelLineWidth 0"/>
+                      <ns11:f eqn="sum @0 1 0"/>
+                      <ns11:f eqn="sum 0 0 @1"/>
+                      <ns11:f eqn="prod @2 1 2"/>
+                      <ns11:f eqn="prod @3 21600 pixelWidth"/>
+                      <ns11:f eqn="prod @3 21600 pixelHeight"/>
+                      <ns11:f eqn="sum @0 0 1"/>
+                      <ns11:f eqn="prod @6 1 2"/>
+                      <ns11:f eqn="prod @7 21600 pixelWidth"/>
+                      <ns11:f eqn="sum @8 21600 0"/>
+                      <ns11:f eqn="prod @7 21600 pixelHeight"/>
+                      <ns11:f eqn="sum @10 21600 0"/>
+                    </ns11:formulas>
+                    <ns11:path ns12:extrusionok="f" gradientshapeok="t" ns12:connecttype="rect"/>
+                    <ns12:lock ns11:ext="edit" aspectratio="t"/>
+                  </ns11:shapetype>
+                  <ns11:shape id="Picture 3" ns12:spid="_x0000_s1032" type="#_x0000_t75" style="position:absolute;width:6813;height:6204;visibility:visible;mso-wrap-style:square" ns12:gfxdata="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">
+                    <ns11:imagedata r:id="rId8" ns12:title=""/>
+                  </ns11:shape>
+                  <ns11:shapetype id="_x0000_t202" coordsize="21600,21600" ns12:spt="202" path="m,l,21600r21600,l21600,xe">
+                    <ns11:stroke joinstyle="miter"/>
+                    <ns11:path gradientshapeok="t" ns12:connecttype="rect"/>
+                  </ns11:shapetype>
+                  <ns11:shape id="Text Box 4" ns12:spid="_x0000_s1033" type="#_x0000_t202" style="position:absolute;left:6813;width:14207;height:5702;visibility:visible;mso-wrap-style:square;v-text-anchor:top" ns12:gfxdata="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" filled="f" stroked="f">
+                    <ns11:textbox inset="2.88pt,2.88pt,2.88pt,2.88pt">
                       <w:txbxContent>
                         <w:p ns2:paraId="7E28FFF1" ns2:textId="77777777">
                           <w:pPr>
@@ -455,10 +455,10 @@
                           </w:r>
                         </w:p>
                       </w:txbxContent>
-                    </v:textbox>
-                  </v:shape>
-                  <v:shape id="Text Box 9" o:spid="_x0000_s1034" type="#_x0000_t202" style="position:absolute;left:7010;top:8191;width:15323;height:2217;visibility:visible;mso-wrap-style:square;v-text-anchor:top" o:gfxdata="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" filled="f" stroked="f">
-                    <v:textbox inset="2.88pt,2.88pt,2.88pt,2.88pt">
+                    </ns11:textbox>
+                  </ns11:shape>
+                  <ns11:shape id="Text Box 9" ns12:spid="_x0000_s1034" type="#_x0000_t202" style="position:absolute;left:7010;top:8191;width:15323;height:2217;visibility:visible;mso-wrap-style:square;v-text-anchor:top" ns12:gfxdata="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" filled="f" stroked="f">
+                    <ns11:textbox inset="2.88pt,2.88pt,2.88pt,2.88pt">
                       <w:txbxContent>
                         <w:p ns2:paraId="13BA976F" ns2:textId="77777777">
                           <w:r>
@@ -469,14 +469,14 @@
                           </w:r>
                         </w:p>
                       </w:txbxContent>
-                    </v:textbox>
-                  </v:shape>
-                </v:group>
+                    </ns11:textbox>
+                  </ns11:shape>
+                </ns11:group>
                 <ns13:wrap anchorx="margin"/>
-              </v:group>
+              </ns11:group>
             </w:pict>
-          </mc:Fallback>
-        </mc:AlternateContent>
+          </ns1:Fallback>
+        </ns1:AlternateContent>
       </w:r>
     </w:p>
     <w:p ns2:paraId="0203D800" ns2:textId="77777777">
@@ -495,8 +495,8 @@
           <w:noProof/>
           <w:lang w:eastAsia="fr-FR"/>
         </w:rPr>
-        <mc:AlternateContent>
-          <mc:Choice Requires="wps">
+        <ns1:AlternateContent>
+          <ns1:Choice Requires="wps">
             <w:drawing>
               <wp:anchor distT="0" distB="0" distL="114300" distR="114300" simplePos="0" relativeHeight="251662336" behindDoc="1" locked="0" layoutInCell="1" allowOverlap="1" ns4:anchorId="2C135B1C" ns4:editId="7D9B0B92">
                 <wp:simplePos x="0" y="0"/>
@@ -519,30 +519,30 @@
                 </wp:wrapTight>
                 <wp:docPr id="251250240" name="Zone de texte 251250240"/>
                 <wp:cNvGraphicFramePr>
-                  <ns5:graphicFrameLocks/>
+                  <a:graphicFrameLocks/>
                 </wp:cNvGraphicFramePr>
-                <ns5:graphic>
-                  <ns5:graphicData uri="http://schemas.microsoft.com/office/word/2010/wordprocessingShape">
-                    <ns7:wsp>
-                      <ns7:cNvSpPr txBox="1">
-                        <ns5:spLocks noChangeArrowheads="1"/>
-                      </ns7:cNvSpPr>
-                      <ns7:spPr bwMode="auto">
-                        <ns5:xfrm>
-                          <ns5:off x="0" y="0"/>
-                          <ns5:ext cx="2000250" cy="723265"/>
-                        </ns5:xfrm>
-                        <ns5:prstGeom prst="rect">
-                          <ns5:avLst/>
-                        </ns5:prstGeom>
-                        <ns5:solidFill>
-                          <ns5:srgbClr val="FFFFFF"/>
-                        </ns5:solidFill>
-                        <ns5:ln>
-                          <ns5:noFill/>
-                        </ns5:ln>
-                      </ns7:spPr>
-                      <ns7:txbx>
+                <a:graphic>
+                  <a:graphicData uri="http://schemas.microsoft.com/office/word/2010/wordprocessingShape">
+                    <wps:wsp>
+                      <wps:cNvSpPr txBox="1">
+                        <a:spLocks noChangeArrowheads="1"/>
+                      </wps:cNvSpPr>
+                      <wps:spPr bwMode="auto">
+                        <a:xfrm>
+                          <a:off x="0" y="0"/>
+                          <a:ext cx="2000250" cy="723265"/>
+                        </a:xfrm>
+                        <a:prstGeom prst="rect">
+                          <a:avLst/>
+                        </a:prstGeom>
+                        <a:solidFill>
+                          <a:srgbClr val="FFFFFF"/>
+                        </a:solidFill>
+                        <a:ln>
+                          <a:noFill/>
+                        </a:ln>
+                      </wps:spPr>
+                      <wps:txbx>
                         <w:txbxContent>
                           <w:p ns2:paraId="373EFC37" ns2:textId="77777777">
                             <w:pPr>
@@ -573,13 +573,13 @@
                             </w:r>
                           </w:p>
                         </w:txbxContent>
-                      </ns7:txbx>
-                      <ns7:bodyPr rot="0" vertOverflow="clip" horzOverflow="clip" vert="horz" wrap="square" lIns="91440" tIns="45720" rIns="91440" bIns="45720" anchor="t" anchorCtr="0" upright="1">
-                        <ns5:noAutofit/>
-                      </ns7:bodyPr>
-                    </ns7:wsp>
-                  </ns5:graphicData>
-                </ns5:graphic>
+                      </wps:txbx>
+                      <wps:bodyPr rot="0" vertOverflow="clip" horzOverflow="clip" vert="horz" wrap="square" lIns="91440" tIns="45720" rIns="91440" bIns="45720" anchor="t" anchorCtr="0" upright="1">
+                        <a:noAutofit/>
+                      </wps:bodyPr>
+                    </wps:wsp>
+                  </a:graphicData>
+                </a:graphic>
                 <ns4:sizeRelH relativeFrom="margin">
                   <ns4:pctWidth>0</ns4:pctWidth>
                 </ns4:sizeRelH>
@@ -588,11 +588,11 @@
                 </ns4:sizeRelV>
               </wp:anchor>
             </w:drawing>
-          </mc:Choice>
-          <mc:Fallback>
+          </ns1:Choice>
+          <ns1:Fallback>
             <w:pict>
-              <v:shape ns2:anchorId="2C135B1C" id="Zone de texte 251250240" o:spid="_x0000_s1035" type="#_x0000_t202" style="position:absolute;left:0;text-align:left;margin-left:182.45pt;margin-top:2.85pt;width:157.5pt;height:56.95pt;z-index:-251654144;visibility:visible;mso-wrap-style:square;mso-width-percent:0;mso-height-percent:0;mso-wrap-distance-left:9pt;mso-wrap-distance-top:0;mso-wrap-distance-right:9pt;mso-wrap-distance-bottom:0;mso-position-horizontal:absolute;mso-position-horizontal-relative:margin;mso-position-vertical:absolute;mso-position-vertical-relative:text;mso-width-percent:0;mso-height-percent:0;mso-width-relative:margin;mso-height-relative:margin;v-text-anchor:top" o:gfxdata="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" stroked="f">
-                <v:textbox>
+              <ns11:shape ns2:anchorId="2C135B1C" id="Zone de texte 251250240" ns12:spid="_x0000_s1035" type="#_x0000_t202" style="position:absolute;left:0;text-align:left;margin-left:182.45pt;margin-top:2.85pt;width:157.5pt;height:56.95pt;z-index:-251654144;visibility:visible;mso-wrap-style:square;mso-width-percent:0;mso-height-percent:0;mso-wrap-distance-left:9pt;mso-wrap-distance-top:0;mso-wrap-distance-right:9pt;mso-wrap-distance-bottom:0;mso-position-horizontal:absolute;mso-position-horizontal-relative:margin;mso-position-vertical:absolute;mso-position-vertical-relative:text;mso-width-percent:0;mso-height-percent:0;mso-width-relative:margin;mso-height-relative:margin;v-text-anchor:top" ns12:gfxdata="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" stroked="f">
+                <ns11:textbox>
                   <w:txbxContent>
                     <w:p ns2:paraId="373EFC37" ns2:textId="77777777">
                       <w:pPr>
@@ -623,12 +623,12 @@
                       </w:r>
                     </w:p>
                   </w:txbxContent>
-                </v:textbox>
+                </ns11:textbox>
                 <ns13:wrap type="tight" anchorx="margin"/>
-              </v:shape>
+              </ns11:shape>
             </w:pict>
-          </mc:Fallback>
-        </mc:AlternateContent>
+          </ns1:Fallback>
+        </ns1:AlternateContent>
       </w:r>
       <w:r>
         <w:rPr>
@@ -658,43 +658,43 @@
             </wp:wrapTight>
             <wp:docPr id="2" name="Image 2"/>
             <wp:cNvGraphicFramePr>
-              <ns5:graphicFrameLocks noChangeAspect="1"/>
+              <a:graphicFrameLocks noChangeAspect="1"/>
             </wp:cNvGraphicFramePr>
-            <ns5:graphic>
-              <ns5:graphicData uri="http://schemas.openxmlformats.org/drawingml/2006/picture">
-                <ns9:pic>
-                  <ns9:nvPicPr>
-                    <ns9:cNvPr id="0" name="Image 5"/>
-                    <ns9:cNvPicPr>
-                      <ns5:picLocks noChangeAspect="1" noChangeArrowheads="1"/>
-                    </ns9:cNvPicPr>
-                  </ns9:nvPicPr>
-                  <ns9:blipFill>
-                    <ns5:blip r:embed="rId9">
-                      <ns5:extLst>
-                        <ns5:ext uri="{28A0092B-C50C-407E-A947-70E740481C1C}">
+            <a:graphic>
+              <a:graphicData uri="http://schemas.openxmlformats.org/drawingml/2006/picture">
+                <pic:pic>
+                  <pic:nvPicPr>
+                    <pic:cNvPr id="0" name="Image 5"/>
+                    <pic:cNvPicPr>
+                      <a:picLocks noChangeAspect="1" noChangeArrowheads="1"/>
+                    </pic:cNvPicPr>
+                  </pic:nvPicPr>
+                  <pic:blipFill>
+                    <a:blip r:embed="rId9">
+                      <a:extLst>
+                        <a:ext uri="{28A0092B-C50C-407E-A947-70E740481C1C}">
                           <ns8:useLocalDpi val="0"/>
-                        </ns5:ext>
-                      </ns5:extLst>
-                    </ns5:blip>
-                    <ns5:srcRect/>
-                    <ns5:stretch>
-                      <ns5:fillRect/>
-                    </ns5:stretch>
-                  </ns9:blipFill>
-                  <ns9:spPr bwMode="auto">
-                    <ns5:xfrm>
-                      <ns5:off x="0" y="0"/>
-                      <ns5:ext cx="790575" cy="740410"/>
-                    </ns5:xfrm>
-                    <ns5:prstGeom prst="rect">
-                      <ns5:avLst/>
-                    </ns5:prstGeom>
-                    <ns5:noFill/>
-                  </ns9:spPr>
-                </ns9:pic>
-              </ns5:graphicData>
-            </ns5:graphic>
+                        </a:ext>
+                      </a:extLst>
+                    </a:blip>
+                    <a:srcRect/>
+                    <a:stretch>
+                      <a:fillRect/>
+                    </a:stretch>
+                  </pic:blipFill>
+                  <pic:spPr bwMode="auto">
+                    <a:xfrm>
+                      <a:off x="0" y="0"/>
+                      <a:ext cx="790575" cy="740410"/>
+                    </a:xfrm>
+                    <a:prstGeom prst="rect">
+                      <a:avLst/>
+                    </a:prstGeom>
+                    <a:noFill/>
+                  </pic:spPr>
+                </pic:pic>
+              </a:graphicData>
+            </a:graphic>
             <ns4:sizeRelH relativeFrom="page">
               <ns4:pctWidth>0</ns4:pctWidth>
             </ns4:sizeRelH>
@@ -732,43 +732,43 @@
             </wp:wrapTight>
             <wp:docPr id="1" name="Image 1"/>
             <wp:cNvGraphicFramePr>
-              <ns5:graphicFrameLocks noChangeAspect="1"/>
+              <a:graphicFrameLocks noChangeAspect="1"/>
             </wp:cNvGraphicFramePr>
-            <ns5:graphic>
-              <ns5:graphicData uri="http://schemas.openxmlformats.org/drawingml/2006/picture">
-                <ns9:pic>
-                  <ns9:nvPicPr>
-                    <ns9:cNvPr id="0" name="Image 2"/>
-                    <ns9:cNvPicPr>
-                      <ns5:picLocks noChangeAspect="1" noChangeArrowheads="1"/>
-                    </ns9:cNvPicPr>
-                  </ns9:nvPicPr>
-                  <ns9:blipFill>
-                    <ns5:blip r:embed="rId10">
-                      <ns5:extLst>
-                        <ns5:ext uri="{28A0092B-C50C-407E-A947-70E740481C1C}">
+            <a:graphic>
+              <a:graphicData uri="http://schemas.openxmlformats.org/drawingml/2006/picture">
+                <pic:pic>
+                  <pic:nvPicPr>
+                    <pic:cNvPr id="0" name="Image 2"/>
+                    <pic:cNvPicPr>
+                      <a:picLocks noChangeAspect="1" noChangeArrowheads="1"/>
+                    </pic:cNvPicPr>
+                  </pic:nvPicPr>
+                  <pic:blipFill>
+                    <a:blip r:embed="rId10">
+                      <a:extLst>
+                        <a:ext uri="{28A0092B-C50C-407E-A947-70E740481C1C}">
                           <ns8:useLocalDpi val="0"/>
-                        </ns5:ext>
-                      </ns5:extLst>
-                    </ns5:blip>
-                    <ns5:srcRect/>
-                    <ns5:stretch>
-                      <ns5:fillRect/>
-                    </ns5:stretch>
-                  </ns9:blipFill>
-                  <ns9:spPr bwMode="auto">
-                    <ns5:xfrm>
-                      <ns5:off x="0" y="0"/>
-                      <ns5:ext cx="573405" cy="569595"/>
-                    </ns5:xfrm>
-                    <ns5:prstGeom prst="rect">
-                      <ns5:avLst/>
-                    </ns5:prstGeom>
-                    <ns5:noFill/>
-                  </ns9:spPr>
-                </ns9:pic>
-              </ns5:graphicData>
-            </ns5:graphic>
+                        </a:ext>
+                      </a:extLst>
+                    </a:blip>
+                    <a:srcRect/>
+                    <a:stretch>
+                      <a:fillRect/>
+                    </a:stretch>
+                  </pic:blipFill>
+                  <pic:spPr bwMode="auto">
+                    <a:xfrm>
+                      <a:off x="0" y="0"/>
+                      <a:ext cx="573405" cy="569595"/>
+                    </a:xfrm>
+                    <a:prstGeom prst="rect">
+                      <a:avLst/>
+                    </a:prstGeom>
+                    <a:noFill/>
+                  </pic:spPr>
+                </pic:pic>
+              </a:graphicData>
+            </a:graphic>
             <ns4:sizeRelH relativeFrom="page">
               <ns4:pctWidth>0</ns4:pctWidth>
             </ns4:sizeRelH>
@@ -811,8 +811,8 @@
           <w:szCs w:val="26"/>
           <w:lang w:eastAsia="fr-FR"/>
         </w:rPr>
-        <mc:AlternateContent>
-          <mc:Choice Requires="wps">
+        <ns1:AlternateContent>
+          <ns1:Choice Requires="wps">
             <w:drawing>
               <wp:anchor distT="0" distB="0" distL="114300" distR="114300" simplePos="0" relativeHeight="251674624" behindDoc="0" locked="0" layoutInCell="1" allowOverlap="1" ns4:anchorId="06D7241B" ns4:editId="0690C31B">
                 <wp:simplePos x="0" y="0"/>
@@ -827,51 +827,51 @@
                 <wp:wrapNone/>
                 <wp:docPr id="54" name="AutoShape 25"/>
                 <wp:cNvGraphicFramePr>
-                  <ns5:graphicFrameLocks/>
+                  <a:graphicFrameLocks/>
                 </wp:cNvGraphicFramePr>
-                <ns5:graphic>
-                  <ns5:graphicData uri="http://schemas.microsoft.com/office/word/2010/wordprocessingShape">
-                    <ns7:wsp>
-                      <ns7:cNvCnPr>
-                        <ns5:cxnSpLocks noChangeShapeType="1"/>
-                      </ns7:cNvCnPr>
-                      <ns7:spPr bwMode="auto">
-                        <ns5:xfrm>
-                          <ns5:off x="0" y="0"/>
-                          <ns5:ext cx="6106160" cy="0"/>
-                        </ns5:xfrm>
-                        <ns5:prstGeom prst="straightConnector1">
-                          <ns5:avLst/>
-                        </ns5:prstGeom>
-                        <ns5:noFill/>
-                        <ns5:ln w="19050">
-                          <ns5:solidFill>
-                            <ns5:srgbClr val="000000"/>
-                          </ns5:solidFill>
-                          <ns5:round/>
-                          <ns5:headEnd type="none" w="med" len="med"/>
-                          <ns5:tailEnd type="none" w="med" len="med"/>
-                        </ns5:ln>
-                      </ns7:spPr>
-                      <ns7:bodyPr/>
-                    </ns7:wsp>
-                  </ns5:graphicData>
-                </ns5:graphic>
+                <a:graphic>
+                  <a:graphicData uri="http://schemas.microsoft.com/office/word/2010/wordprocessingShape">
+                    <wps:wsp>
+                      <wps:cNvCnPr>
+                        <a:cxnSpLocks noChangeShapeType="1"/>
+                      </wps:cNvCnPr>
+                      <wps:spPr bwMode="auto">
+                        <a:xfrm>
+                          <a:off x="0" y="0"/>
+                          <a:ext cx="6106160" cy="0"/>
+                        </a:xfrm>
+                        <a:prstGeom prst="straightConnector1">
+                          <a:avLst/>
+                        </a:prstGeom>
+                        <a:noFill/>
+                        <a:ln w="19050">
+                          <a:solidFill>
+                            <a:srgbClr val="000000"/>
+                          </a:solidFill>
+                          <a:round/>
+                          <a:headEnd type="none" w="med" len="med"/>
+                          <a:tailEnd type="none" w="med" len="med"/>
+                        </a:ln>
+                      </wps:spPr>
+                      <wps:bodyPr/>
+                    </wps:wsp>
+                  </a:graphicData>
+                </a:graphic>
               </wp:anchor>
             </w:drawing>
-          </mc:Choice>
-          <mc:Fallback>
+          </ns1:Choice>
+          <ns1:Fallback>
             <w:pict>
-              <v:shapetype ns2:anchorId="5C87ADD2" id="_x0000_t32" coordsize="21600,21600" o:spt="32" o:oned="t" path="m,l21600,21600e" filled="f">
-                <v:path arrowok="t" fillok="f" o:connecttype="none"/>
-                <o:lock v:ext="edit" shapetype="t"/>
-              </v:shapetype>
-              <v:shape id="AutoShape 25" o:spid="_x0000_s1026" type="#_x0000_t32" style="position:absolute;margin-left:0;margin-top:-.05pt;width:480.8pt;height:0;z-index:251674624;visibility:visible;mso-wrap-style:square;mso-wrap-distance-left:9pt;mso-wrap-distance-top:0;mso-wrap-distance-right:9pt;mso-wrap-distance-bottom:0;mso-position-horizontal:absolute;mso-position-horizontal-relative:margin;mso-position-vertical:absolute;mso-position-vertical-relative:text" o:gfxdata="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" strokeweight="1.5pt">
+              <ns11:shapetype ns2:anchorId="5C87ADD2" id="_x0000_t32" coordsize="21600,21600" ns12:spt="32" ns12:oned="t" path="m,l21600,21600e" filled="f">
+                <ns11:path arrowok="t" fillok="f" ns12:connecttype="none"/>
+                <ns12:lock ns11:ext="edit" shapetype="t"/>
+              </ns11:shapetype>
+              <ns11:shape id="AutoShape 25" ns12:spid="_x0000_s1026" type="#_x0000_t32" style="position:absolute;margin-left:0;margin-top:-.05pt;width:480.8pt;height:0;z-index:251674624;visibility:visible;mso-wrap-style:square;mso-wrap-distance-left:9pt;mso-wrap-distance-top:0;mso-wrap-distance-right:9pt;mso-wrap-distance-bottom:0;mso-position-horizontal:absolute;mso-position-horizontal-relative:margin;mso-position-vertical:absolute;mso-position-vertical-relative:text" ns12:gfxdata="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" strokeweight="1.5pt">
                 <ns13:wrap anchorx="margin"/>
-              </v:shape>
+              </ns11:shape>
             </w:pict>
-          </mc:Fallback>
-        </mc:AlternateContent>
+          </ns1:Fallback>
+        </ns1:AlternateContent>
       </w:r>
     </w:p>
     <w:p ns2:paraId="6415ACF9" ns2:textId="77777777">
@@ -1033,8 +1033,8 @@
           <w:noProof/>
           <w:lang w:eastAsia="fr-FR"/>
         </w:rPr>
-        <mc:AlternateContent>
-          <mc:Choice Requires="wps">
+        <ns1:AlternateContent>
+          <ns1:Choice Requires="wps">
             <w:drawing>
               <wp:anchor distT="0" distB="0" distL="114300" distR="114300" simplePos="0" relativeHeight="251664384" behindDoc="0" locked="1" layoutInCell="1" allowOverlap="1" ns4:anchorId="6A9013CB" ns4:editId="34544F81">
                 <wp:simplePos x="0" y="0"/>
@@ -1049,65 +1049,65 @@
                 <wp:wrapNone/>
                 <wp:docPr id="1715820105" name="Rectangle à coins arrondis 1715820105"/>
                 <wp:cNvGraphicFramePr>
-                  <ns5:graphicFrameLocks/>
+                  <a:graphicFrameLocks/>
                 </wp:cNvGraphicFramePr>
-                <ns5:graphic>
-                  <ns5:graphicData uri="http://schemas.microsoft.com/office/word/2010/wordprocessingShape">
-                    <ns7:wsp>
-                      <ns7:cNvSpPr>
-                        <ns5:spLocks/>
-                      </ns7:cNvSpPr>
-                      <ns7:spPr>
-                        <ns5:xfrm>
-                          <ns5:off x="0" y="0"/>
-                          <ns5:ext cx="4857750" cy="752475"/>
-                        </ns5:xfrm>
-                        <ns5:prstGeom prst="roundRect">
-                          <ns5:avLst/>
-                        </ns5:prstGeom>
-                        <ns5:gradFill flip="none" rotWithShape="1">
-                          <ns5:gsLst>
-                            <ns5:gs pos="0">
-                              <ns5:schemeClr val="accent1">
-                                <ns5:lumMod val="60000"/>
-                                <ns5:lumOff val="40000"/>
-                                <ns5:tint val="66000"/>
-                                <ns5:satMod val="160000"/>
-                              </ns5:schemeClr>
-                            </ns5:gs>
-                            <ns5:gs pos="50000">
-                              <ns5:schemeClr val="accent1">
-                                <ns5:lumMod val="60000"/>
-                                <ns5:lumOff val="40000"/>
-                                <ns5:tint val="44500"/>
-                                <ns5:satMod val="160000"/>
-                              </ns5:schemeClr>
-                            </ns5:gs>
-                            <ns5:gs pos="100000">
-                              <ns5:schemeClr val="accent1">
-                                <ns5:lumMod val="60000"/>
-                                <ns5:lumOff val="40000"/>
-                                <ns5:tint val="23500"/>
-                                <ns5:satMod val="160000"/>
-                              </ns5:schemeClr>
-                            </ns5:gs>
-                          </ns5:gsLst>
-                          <ns5:lin ang="18900000" scaled="1"/>
-                          <ns5:tileRect/>
-                        </ns5:gradFill>
-                        <ns5:ln w="88900" cap="flat" cmpd="tri" algn="ctr">
-                          <ns5:solidFill>
-                            <ns5:srgbClr val="4472C4">
-                              <ns5:lumMod val="40000"/>
-                              <ns5:lumOff val="60000"/>
-                            </ns5:srgbClr>
-                          </ns5:solidFill>
-                          <ns5:prstDash val="solid"/>
-                          <ns5:miter lim="800000"/>
-                        </ns5:ln>
-                        <ns5:effectLst/>
-                      </ns7:spPr>
-                      <ns7:txbx>
+                <a:graphic>
+                  <a:graphicData uri="http://schemas.microsoft.com/office/word/2010/wordprocessingShape">
+                    <wps:wsp>
+                      <wps:cNvSpPr>
+                        <a:spLocks/>
+                      </wps:cNvSpPr>
+                      <wps:spPr>
+                        <a:xfrm>
+                          <a:off x="0" y="0"/>
+                          <a:ext cx="4857750" cy="752475"/>
+                        </a:xfrm>
+                        <a:prstGeom prst="roundRect">
+                          <a:avLst/>
+                        </a:prstGeom>
+                        <a:gradFill flip="none" rotWithShape="1">
+                          <a:gsLst>
+                            <a:gs pos="0">
+                              <a:schemeClr val="accent1">
+                                <a:lumMod val="60000"/>
+                                <a:lumOff val="40000"/>
+                                <a:tint val="66000"/>
+                                <a:satMod val="160000"/>
+                              </a:schemeClr>
+                            </a:gs>
+                            <a:gs pos="50000">
+                              <a:schemeClr val="accent1">
+                                <a:lumMod val="60000"/>
+                                <a:lumOff val="40000"/>
+                                <a:tint val="44500"/>
+                                <a:satMod val="160000"/>
+                              </a:schemeClr>
+                            </a:gs>
+                            <a:gs pos="100000">
+                              <a:schemeClr val="accent1">
+                                <a:lumMod val="60000"/>
+                                <a:lumOff val="40000"/>
+                                <a:tint val="23500"/>
+                                <a:satMod val="160000"/>
+                              </a:schemeClr>
+                            </a:gs>
+                          </a:gsLst>
+                          <a:lin ang="18900000" scaled="1"/>
+                          <a:tileRect/>
+                        </a:gradFill>
+                        <a:ln w="88900" cap="flat" cmpd="tri" algn="ctr">
+                          <a:solidFill>
+                            <a:srgbClr val="4472C4">
+                              <a:lumMod val="40000"/>
+                              <a:lumOff val="60000"/>
+                            </a:srgbClr>
+                          </a:solidFill>
+                          <a:prstDash val="solid"/>
+                          <a:miter lim="800000"/>
+                        </a:ln>
+                        <a:effectLst/>
+                      </wps:spPr>
+                      <wps:txbx>
                         <w:txbxContent>
                           <w:p ns2:paraId="480DFEF0" ns2:textId="53D35AD1">
                             <w:pPr>
@@ -1162,16 +1162,16 @@
                             </w:pPr>
                           </w:p>
                         </w:txbxContent>
-                      </ns7:txbx>
-                      <ns7:bodyPr rot="0" spcFirstLastPara="0" vertOverflow="overflow" horzOverflow="overflow" vert="horz" wrap="square" lIns="91440" tIns="45720" rIns="91440" bIns="45720" numCol="1" spcCol="0" rtlCol="0" fromWordArt="0" anchor="ctr" anchorCtr="0" forceAA="0" compatLnSpc="1">
-                        <ns5:prstTxWarp prst="textNoShape">
-                          <ns5:avLst/>
-                        </ns5:prstTxWarp>
-                        <ns5:noAutofit/>
-                      </ns7:bodyPr>
-                    </ns7:wsp>
-                  </ns5:graphicData>
-                </ns5:graphic>
+                      </wps:txbx>
+                      <wps:bodyPr rot="0" spcFirstLastPara="0" vertOverflow="overflow" horzOverflow="overflow" vert="horz" wrap="square" lIns="91440" tIns="45720" rIns="91440" bIns="45720" numCol="1" spcCol="0" rtlCol="0" fromWordArt="0" anchor="ctr" anchorCtr="0" forceAA="0" compatLnSpc="1">
+                        <a:prstTxWarp prst="textNoShape">
+                          <a:avLst/>
+                        </a:prstTxWarp>
+                        <a:noAutofit/>
+                      </wps:bodyPr>
+                    </wps:wsp>
+                  </a:graphicData>
+                </a:graphic>
                 <ns4:sizeRelH relativeFrom="page">
                   <ns4:pctWidth>0</ns4:pctWidth>
                 </ns4:sizeRelH>
@@ -1180,14 +1180,14 @@
                 </ns4:sizeRelV>
               </wp:anchor>
             </w:drawing>
-          </mc:Choice>
-          <mc:Fallback>
+          </ns1:Choice>
+          <ns1:Fallback>
             <w:pict>
-              <v:roundrect ns2:anchorId="6A9013CB" id="Rectangle à coins arrondis 1715820105" o:spid="_x0000_s1036" style="position:absolute;left:0;text-align:left;margin-left:58.9pt;margin-top:23.9pt;width:382.5pt;height:59.25pt;z-index:251664384;visibility:visible;mso-wrap-style:square;mso-width-percent:0;mso-height-percent:0;mso-wrap-distance-left:9pt;mso-wrap-distance-top:0;mso-wrap-distance-right:9pt;mso-wrap-distance-bottom:0;mso-position-horizontal:absolute;mso-position-horizontal-relative:text;mso-position-vertical:absolute;mso-position-vertical-relative:text;mso-width-percent:0;mso-height-percent:0;mso-width-relative:page;mso-height-relative:margin;v-text-anchor:middle" arcsize="10923f" o:gfxdata="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" fillcolor="#9cc2e5 [1940]" strokecolor="#b4c7e7" strokeweight="7pt">
-                <v:fill color2="#9cc2e5 [1940]" rotate="t" angle="135" colors="0 #b9dafb;.5 #d3e7fc;1 #e9f2fd" focus="100%" type="gradient"/>
-                <v:stroke linestyle="thickBetweenThin" joinstyle="miter"/>
-                <v:path arrowok="t"/>
-                <v:textbox>
+              <ns11:roundrect ns2:anchorId="6A9013CB" id="Rectangle à coins arrondis 1715820105" ns12:spid="_x0000_s1036" style="position:absolute;left:0;text-align:left;margin-left:58.9pt;margin-top:23.9pt;width:382.5pt;height:59.25pt;z-index:251664384;visibility:visible;mso-wrap-style:square;mso-width-percent:0;mso-height-percent:0;mso-wrap-distance-left:9pt;mso-wrap-distance-top:0;mso-wrap-distance-right:9pt;mso-wrap-distance-bottom:0;mso-position-horizontal:absolute;mso-position-horizontal-relative:text;mso-position-vertical:absolute;mso-position-vertical-relative:text;mso-width-percent:0;mso-height-percent:0;mso-width-relative:page;mso-height-relative:margin;v-text-anchor:middle" arcsize="10923f" ns12:gfxdata="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" fillcolor="#9cc2e5 [1940]" strokecolor="#b4c7e7" strokeweight="7pt">
+                <ns11:fill color2="#9cc2e5 [1940]" rotate="t" angle="135" colors="0 #b9dafb;.5 #d3e7fc;1 #e9f2fd" focus="100%" type="gradient"/>
+                <ns11:stroke linestyle="thickBetweenThin" joinstyle="miter"/>
+                <ns11:path arrowok="t"/>
+                <ns11:textbox>
                   <w:txbxContent>
                     <w:p ns2:paraId="480DFEF0" ns2:textId="53D35AD1">
                       <w:pPr>
@@ -1242,12 +1242,12 @@
                       </w:pPr>
                     </w:p>
                   </w:txbxContent>
-                </v:textbox>
+                </ns11:textbox>
                 <ns13:anchorlock/>
-              </v:roundrect>
+              </ns11:roundrect>
             </w:pict>
-          </mc:Fallback>
-        </mc:AlternateContent>
+          </ns1:Fallback>
+        </ns1:AlternateContent>
       </w:r>
       <w:r>
         <w:rPr>
@@ -1371,8 +1371,8 @@
           <w:noProof/>
           <w:lang w:eastAsia="fr-FR"/>
         </w:rPr>
-        <mc:AlternateContent>
-          <mc:Choice Requires="wps">
+        <ns1:AlternateContent>
+          <ns1:Choice Requires="wps">
             <w:drawing>
               <wp:anchor distT="0" distB="0" distL="114300" distR="114300" simplePos="0" relativeHeight="251656192" behindDoc="0" locked="0" layoutInCell="1" allowOverlap="1" ns4:anchorId="217ACBE6" ns4:editId="7EED0DB1">
                 <wp:simplePos x="0" y="0"/>
@@ -1387,28 +1387,28 @@
                 <wp:wrapNone/>
                 <wp:docPr id="32" name="Zone de texte 32"/>
                 <wp:cNvGraphicFramePr/>
-                <ns5:graphic>
-                  <ns5:graphicData uri="http://schemas.microsoft.com/office/word/2010/wordprocessingShape">
-                    <ns7:wsp>
-                      <ns7:cNvSpPr txBox="1"/>
-                      <ns7:spPr>
-                        <ns5:xfrm flipV="1">
-                          <ns5:off x="0" y="0"/>
-                          <ns5:ext cx="1619250" cy="142875"/>
-                        </ns5:xfrm>
-                        <ns5:prstGeom prst="rect">
-                          <ns5:avLst/>
-                        </ns5:prstGeom>
-                        <ns5:solidFill>
-                          <ns5:schemeClr val="lt1"/>
-                        </ns5:solidFill>
-                        <ns5:ln w="6350">
-                          <ns5:solidFill>
-                            <ns5:schemeClr val="bg1"/>
-                          </ns5:solidFill>
-                        </ns5:ln>
-                      </ns7:spPr>
-                      <ns7:txbx>
+                <a:graphic>
+                  <a:graphicData uri="http://schemas.microsoft.com/office/word/2010/wordprocessingShape">
+                    <wps:wsp>
+                      <wps:cNvSpPr txBox="1"/>
+                      <wps:spPr>
+                        <a:xfrm flipV="1">
+                          <a:off x="0" y="0"/>
+                          <a:ext cx="1619250" cy="142875"/>
+                        </a:xfrm>
+                        <a:prstGeom prst="rect">
+                          <a:avLst/>
+                        </a:prstGeom>
+                        <a:solidFill>
+                          <a:schemeClr val="lt1"/>
+                        </a:solidFill>
+                        <a:ln w="6350">
+                          <a:solidFill>
+                            <a:schemeClr val="bg1"/>
+                          </a:solidFill>
+                        </a:ln>
+                      </wps:spPr>
+                      <wps:txbx>
                         <w:txbxContent>
                           <w:p ns2:paraId="012B9229" ns2:textId="77777777">
                             <w:pPr>
@@ -1419,16 +1419,16 @@
                             </w:r>
                           </w:p>
                         </w:txbxContent>
-                      </ns7:txbx>
-                      <ns7:bodyPr rot="0" spcFirstLastPara="0" vertOverflow="overflow" horzOverflow="overflow" vert="horz" wrap="square" lIns="91440" tIns="45720" rIns="91440" bIns="45720" numCol="1" spcCol="0" rtlCol="0" fromWordArt="0" anchor="t" anchorCtr="0" forceAA="0" compatLnSpc="1">
-                        <ns5:prstTxWarp prst="textNoShape">
-                          <ns5:avLst/>
-                        </ns5:prstTxWarp>
-                        <ns5:noAutofit/>
-                      </ns7:bodyPr>
-                    </ns7:wsp>
-                  </ns5:graphicData>
-                </ns5:graphic>
+                      </wps:txbx>
+                      <wps:bodyPr rot="0" spcFirstLastPara="0" vertOverflow="overflow" horzOverflow="overflow" vert="horz" wrap="square" lIns="91440" tIns="45720" rIns="91440" bIns="45720" numCol="1" spcCol="0" rtlCol="0" fromWordArt="0" anchor="t" anchorCtr="0" forceAA="0" compatLnSpc="1">
+                        <a:prstTxWarp prst="textNoShape">
+                          <a:avLst/>
+                        </a:prstTxWarp>
+                        <a:noAutofit/>
+                      </wps:bodyPr>
+                    </wps:wsp>
+                  </a:graphicData>
+                </a:graphic>
                 <ns4:sizeRelH relativeFrom="margin">
                   <ns4:pctWidth>0</ns4:pctWidth>
                 </ns4:sizeRelH>
@@ -1437,11 +1437,11 @@
                 </ns4:sizeRelV>
               </wp:anchor>
             </w:drawing>
-          </mc:Choice>
-          <mc:Fallback>
+          </ns1:Choice>
+          <ns1:Fallback>
             <w:pict>
-              <v:shape ns2:anchorId="217ACBE6" id="Zone de texte 32" o:spid="_x0000_s1037" type="#_x0000_t202" style="position:absolute;left:0;text-align:left;margin-left:274.9pt;margin-top:19.35pt;width:127.5pt;height:11.25pt;flip:y;z-index:251656192;visibility:visible;mso-wrap-style:square;mso-width-percent:0;mso-height-percent:0;mso-wrap-distance-left:9pt;mso-wrap-distance-top:0;mso-wrap-distance-right:9pt;mso-wrap-distance-bottom:0;mso-position-horizontal:absolute;mso-position-horizontal-relative:margin;mso-position-vertical:absolute;mso-position-vertical-relative:text;mso-width-percent:0;mso-height-percent:0;mso-width-relative:margin;mso-height-relative:margin;v-text-anchor:top" o:gfxdata="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" fillcolor="white [3201]" strokecolor="white [3212]" strokeweight=".5pt">
-                <v:textbox>
+              <ns11:shape ns2:anchorId="217ACBE6" id="Zone de texte 32" ns12:spid="_x0000_s1037" type="#_x0000_t202" style="position:absolute;left:0;text-align:left;margin-left:274.9pt;margin-top:19.35pt;width:127.5pt;height:11.25pt;flip:y;z-index:251656192;visibility:visible;mso-wrap-style:square;mso-width-percent:0;mso-height-percent:0;mso-wrap-distance-left:9pt;mso-wrap-distance-top:0;mso-wrap-distance-right:9pt;mso-wrap-distance-bottom:0;mso-position-horizontal:absolute;mso-position-horizontal-relative:margin;mso-position-vertical:absolute;mso-position-vertical-relative:text;mso-width-percent:0;mso-height-percent:0;mso-width-relative:margin;mso-height-relative:margin;v-text-anchor:top" ns12:gfxdata="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" fillcolor="white [3201]" strokecolor="white [3212]" strokeweight=".5pt">
+                <ns11:textbox>
                   <w:txbxContent>
                     <w:p ns2:paraId="012B9229" ns2:textId="77777777">
                       <w:pPr>
@@ -1452,12 +1452,12 @@
                       </w:r>
                     </w:p>
                   </w:txbxContent>
-                </v:textbox>
+                </ns11:textbox>
                 <ns13:wrap anchorx="margin"/>
-              </v:shape>
+              </ns11:shape>
             </w:pict>
-          </mc:Fallback>
-        </mc:AlternateContent>
+          </ns1:Fallback>
+        </ns1:AlternateContent>
       </w:r>
       <w:r>
         <w:rPr>
@@ -1516,8 +1516,8 @@
           <w:noProof/>
           <w:lang w:eastAsia="fr-FR"/>
         </w:rPr>
-        <mc:AlternateContent>
-          <mc:Choice Requires="wps">
+        <ns1:AlternateContent>
+          <ns1:Choice Requires="wps">
             <w:drawing>
               <wp:anchor distT="0" distB="0" distL="114300" distR="114300" simplePos="0" relativeHeight="251652096" behindDoc="0" locked="0" layoutInCell="1" allowOverlap="1" ns4:anchorId="67334904" ns4:editId="436FF1E3">
                 <wp:simplePos x="0" y="0"/>
@@ -1532,42 +1532,42 @@
                 <wp:wrapNone/>
                 <wp:docPr id="6" name="Rectangle 6"/>
                 <wp:cNvGraphicFramePr>
-                  <ns5:graphicFrameLocks/>
+                  <a:graphicFrameLocks/>
                 </wp:cNvGraphicFramePr>
-                <ns5:graphic>
-                  <ns5:graphicData uri="http://schemas.microsoft.com/office/word/2010/wordprocessingShape">
-                    <ns7:wsp>
-                      <ns7:cNvSpPr>
-                        <ns5:spLocks noChangeArrowheads="1"/>
-                      </ns7:cNvSpPr>
-                      <ns7:spPr bwMode="auto">
-                        <ns5:xfrm>
-                          <ns5:off x="0" y="0"/>
-                          <ns5:ext cx="1596189" cy="1171575"/>
-                        </ns5:xfrm>
-                        <ns5:prstGeom prst="rect">
-                          <ns5:avLst/>
-                        </ns5:prstGeom>
-                        <ns5:solidFill>
-                          <ns5:srgbClr val="FFFFFF"/>
-                        </ns5:solidFill>
-                        <ns5:ln>
-                          <ns5:noFill/>
-                        </ns5:ln>
-                        <ns5:extLst>
-                          <ns5:ext uri="{91240B29-F687-4F45-9708-019B960494DF}">
+                <a:graphic>
+                  <a:graphicData uri="http://schemas.microsoft.com/office/word/2010/wordprocessingShape">
+                    <wps:wsp>
+                      <wps:cNvSpPr>
+                        <a:spLocks noChangeArrowheads="1"/>
+                      </wps:cNvSpPr>
+                      <wps:spPr bwMode="auto">
+                        <a:xfrm>
+                          <a:off x="0" y="0"/>
+                          <a:ext cx="1596189" cy="1171575"/>
+                        </a:xfrm>
+                        <a:prstGeom prst="rect">
+                          <a:avLst/>
+                        </a:prstGeom>
+                        <a:solidFill>
+                          <a:srgbClr val="FFFFFF"/>
+                        </a:solidFill>
+                        <a:ln>
+                          <a:noFill/>
+                        </a:ln>
+                        <a:extLst>
+                          <a:ext uri="{91240B29-F687-4F45-9708-019B960494DF}">
                             <ns8:hiddenLine w="9525">
-                              <ns5:solidFill>
-                                <ns5:srgbClr val="000000"/>
-                              </ns5:solidFill>
-                              <ns5:miter lim="800000"/>
-                              <ns5:headEnd/>
-                              <ns5:tailEnd/>
+                              <a:solidFill>
+                                <a:srgbClr val="000000"/>
+                              </a:solidFill>
+                              <a:miter lim="800000"/>
+                              <a:headEnd/>
+                              <a:tailEnd/>
                             </ns8:hiddenLine>
-                          </ns5:ext>
-                        </ns5:extLst>
-                      </ns7:spPr>
-                      <ns7:txbx>
+                          </a:ext>
+                        </a:extLst>
+                      </wps:spPr>
+                      <wps:txbx>
                         <w:txbxContent>
                           <w:p ns2:paraId="5E7C6FEF" ns2:textId="734532CE">
                             <w:pPr>
@@ -1633,13 +1633,13 @@
                             </w:r>
                           </w:p>
                         </w:txbxContent>
-                      </ns7:txbx>
-                      <ns7:bodyPr rot="0" vert="horz" wrap="square" lIns="91440" tIns="45720" rIns="91440" bIns="45720" anchor="t" anchorCtr="0" upright="1">
-                        <ns5:noAutofit/>
-                      </ns7:bodyPr>
-                    </ns7:wsp>
-                  </ns5:graphicData>
-                </ns5:graphic>
+                      </wps:txbx>
+                      <wps:bodyPr rot="0" vert="horz" wrap="square" lIns="91440" tIns="45720" rIns="91440" bIns="45720" anchor="t" anchorCtr="0" upright="1">
+                        <a:noAutofit/>
+                      </wps:bodyPr>
+                    </wps:wsp>
+                  </a:graphicData>
+                </a:graphic>
                 <ns4:sizeRelH relativeFrom="page">
                   <ns4:pctWidth>0</ns4:pctWidth>
                 </ns4:sizeRelH>
@@ -1648,11 +1648,11 @@
                 </ns4:sizeRelV>
               </wp:anchor>
             </w:drawing>
-          </mc:Choice>
-          <mc:Fallback>
+          </ns1:Choice>
+          <ns1:Fallback>
             <w:pict>
-              <v:rect ns2:anchorId="67334904" id="Rectangle 6" o:spid="_x0000_s1038" style="position:absolute;left:0;text-align:left;margin-left:377.2pt;margin-top:6.25pt;width:125.7pt;height:92.25pt;z-index:251652096;visibility:visible;mso-wrap-style:square;mso-width-percent:0;mso-height-percent:0;mso-wrap-distance-left:9pt;mso-wrap-distance-top:0;mso-wrap-distance-right:9pt;mso-wrap-distance-bottom:0;mso-position-horizontal:absolute;mso-position-horizontal-relative:text;mso-position-vertical:absolute;mso-position-vertical-relative:text;mso-width-percent:0;mso-height-percent:0;mso-width-relative:page;mso-height-relative:page;v-text-anchor:top" o:gfxdata="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" stroked="f">
-                <v:textbox>
+              <ns11:rect ns2:anchorId="67334904" id="Rectangle 6" ns12:spid="_x0000_s1038" style="position:absolute;left:0;text-align:left;margin-left:377.2pt;margin-top:6.25pt;width:125.7pt;height:92.25pt;z-index:251652096;visibility:visible;mso-wrap-style:square;mso-width-percent:0;mso-height-percent:0;mso-wrap-distance-left:9pt;mso-wrap-distance-top:0;mso-wrap-distance-right:9pt;mso-wrap-distance-bottom:0;mso-position-horizontal:absolute;mso-position-horizontal-relative:text;mso-position-vertical:absolute;mso-position-vertical-relative:text;mso-width-percent:0;mso-height-percent:0;mso-width-relative:page;mso-height-relative:page;v-text-anchor:top" ns12:gfxdata="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" stroked="f">
+                <ns11:textbox>
                   <w:txbxContent>
                     <w:p ns2:paraId="5E7C6FEF" ns2:textId="734532CE">
                       <w:pPr>
@@ -1718,11 +1718,11 @@
                       </w:r>
                     </w:p>
                   </w:txbxContent>
-                </v:textbox>
-              </v:rect>
+                </ns11:textbox>
+              </ns11:rect>
             </w:pict>
-          </mc:Fallback>
-        </mc:AlternateContent>
+          </ns1:Fallback>
+        </ns1:AlternateContent>
       </w:r>
       <w:r>
         <w:rPr>
@@ -1730,8 +1730,8 @@
           <w:noProof/>
           <w:lang w:eastAsia="fr-FR"/>
         </w:rPr>
-        <mc:AlternateContent>
-          <mc:Choice Requires="wps">
+        <ns1:AlternateContent>
+          <ns1:Choice Requires="wps">
             <w:drawing>
               <wp:anchor distT="0" distB="0" distL="114300" distR="114300" simplePos="0" relativeHeight="251660288" behindDoc="0" locked="0" layoutInCell="1" allowOverlap="1" ns4:anchorId="4E26EE04" ns4:editId="2B490783">
                 <wp:simplePos x="0" y="0"/>
@@ -1746,28 +1746,28 @@
                 <wp:wrapNone/>
                 <wp:docPr id="11" name="Zone de texte 11"/>
                 <wp:cNvGraphicFramePr/>
-                <ns5:graphic>
-                  <ns5:graphicData uri="http://schemas.microsoft.com/office/word/2010/wordprocessingShape">
-                    <ns7:wsp>
-                      <ns7:cNvSpPr txBox="1"/>
-                      <ns7:spPr>
-                        <ns5:xfrm>
-                          <ns5:off x="0" y="0"/>
-                          <ns5:ext cx="2146935" cy="1771650"/>
-                        </ns5:xfrm>
-                        <ns5:prstGeom prst="rect">
-                          <ns5:avLst/>
-                        </ns5:prstGeom>
-                        <ns5:solidFill>
-                          <ns5:schemeClr val="lt1"/>
-                        </ns5:solidFill>
-                        <ns5:ln w="6350">
-                          <ns5:solidFill>
-                            <ns5:schemeClr val="bg1"/>
-                          </ns5:solidFill>
-                        </ns5:ln>
-                      </ns7:spPr>
-                      <ns7:txbx>
+                <a:graphic>
+                  <a:graphicData uri="http://schemas.microsoft.com/office/word/2010/wordprocessingShape">
+                    <wps:wsp>
+                      <wps:cNvSpPr txBox="1"/>
+                      <wps:spPr>
+                        <a:xfrm>
+                          <a:off x="0" y="0"/>
+                          <a:ext cx="2146935" cy="1771650"/>
+                        </a:xfrm>
+                        <a:prstGeom prst="rect">
+                          <a:avLst/>
+                        </a:prstGeom>
+                        <a:solidFill>
+                          <a:schemeClr val="lt1"/>
+                        </a:solidFill>
+                        <a:ln w="6350">
+                          <a:solidFill>
+                            <a:schemeClr val="bg1"/>
+                          </a:solidFill>
+                        </a:ln>
+                      </wps:spPr>
+                      <wps:txbx>
                         <w:txbxContent>
                           <w:p ns2:paraId="1F74F718" ns2:textId="4F237188">
                             <w:pPr>
@@ -1891,16 +1891,16 @@
                             </w:pPr>
                           </w:p>
                         </w:txbxContent>
-                      </ns7:txbx>
-                      <ns7:bodyPr rot="0" spcFirstLastPara="0" vertOverflow="overflow" horzOverflow="overflow" vert="horz" wrap="square" lIns="91440" tIns="45720" rIns="91440" bIns="45720" numCol="1" spcCol="0" rtlCol="0" fromWordArt="0" anchor="t" anchorCtr="0" forceAA="0" compatLnSpc="1">
-                        <ns5:prstTxWarp prst="textNoShape">
-                          <ns5:avLst/>
-                        </ns5:prstTxWarp>
-                        <ns5:noAutofit/>
-                      </ns7:bodyPr>
-                    </ns7:wsp>
-                  </ns5:graphicData>
-                </ns5:graphic>
+                      </wps:txbx>
+                      <wps:bodyPr rot="0" spcFirstLastPara="0" vertOverflow="overflow" horzOverflow="overflow" vert="horz" wrap="square" lIns="91440" tIns="45720" rIns="91440" bIns="45720" numCol="1" spcCol="0" rtlCol="0" fromWordArt="0" anchor="t" anchorCtr="0" forceAA="0" compatLnSpc="1">
+                        <a:prstTxWarp prst="textNoShape">
+                          <a:avLst/>
+                        </a:prstTxWarp>
+                        <a:noAutofit/>
+                      </wps:bodyPr>
+                    </wps:wsp>
+                  </a:graphicData>
+                </a:graphic>
                 <ns4:sizeRelH relativeFrom="margin">
                   <ns4:pctWidth>0</ns4:pctWidth>
                 </ns4:sizeRelH>
@@ -1909,11 +1909,11 @@
                 </ns4:sizeRelV>
               </wp:anchor>
             </w:drawing>
-          </mc:Choice>
-          <mc:Fallback>
+          </ns1:Choice>
+          <ns1:Fallback>
             <w:pict>
-              <v:shape ns2:anchorId="4E26EE04" id="Zone de texte 11" o:spid="_x0000_s1039" type="#_x0000_t202" style="position:absolute;left:0;text-align:left;margin-left:-17.7pt;margin-top:16.2pt;width:169.05pt;height:139.5pt;z-index:251660288;visibility:visible;mso-wrap-style:square;mso-width-percent:0;mso-height-percent:0;mso-wrap-distance-left:9pt;mso-wrap-distance-top:0;mso-wrap-distance-right:9pt;mso-wrap-distance-bottom:0;mso-position-horizontal:absolute;mso-position-horizontal-relative:margin;mso-position-vertical:absolute;mso-position-vertical-relative:text;mso-width-percent:0;mso-height-percent:0;mso-width-relative:margin;mso-height-relative:margin;v-text-anchor:top" o:gfxdata="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" fillcolor="white [3201]" strokecolor="white [3212]" strokeweight=".5pt">
-                <v:textbox>
+              <ns11:shape ns2:anchorId="4E26EE04" id="Zone de texte 11" ns12:spid="_x0000_s1039" type="#_x0000_t202" style="position:absolute;left:0;text-align:left;margin-left:-17.7pt;margin-top:16.2pt;width:169.05pt;height:139.5pt;z-index:251660288;visibility:visible;mso-wrap-style:square;mso-width-percent:0;mso-height-percent:0;mso-wrap-distance-left:9pt;mso-wrap-distance-top:0;mso-wrap-distance-right:9pt;mso-wrap-distance-bottom:0;mso-position-horizontal:absolute;mso-position-horizontal-relative:margin;mso-position-vertical:absolute;mso-position-vertical-relative:text;mso-width-percent:0;mso-height-percent:0;mso-width-relative:margin;mso-height-relative:margin;v-text-anchor:top" ns12:gfxdata="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" fillcolor="white [3201]" strokecolor="white [3212]" strokeweight=".5pt">
+                <ns11:textbox>
                   <w:txbxContent>
                     <w:p ns2:paraId="1F74F718" ns2:textId="4F237188">
                       <w:pPr>
@@ -2037,12 +2037,12 @@
                       </w:pPr>
                     </w:p>
                   </w:txbxContent>
-                </v:textbox>
+                </ns11:textbox>
                 <ns13:wrap anchorx="margin"/>
-              </v:shape>
+              </ns11:shape>
             </w:pict>
-          </mc:Fallback>
-        </mc:AlternateContent>
+          </ns1:Fallback>
+        </ns1:AlternateContent>
       </w:r>
       <w:r>
         <w:rPr>
@@ -2050,8 +2050,8 @@
           <w:noProof/>
           <w:lang w:eastAsia="fr-FR"/>
         </w:rPr>
-        <mc:AlternateContent>
-          <mc:Choice Requires="wps">
+        <ns1:AlternateContent>
+          <ns1:Choice Requires="wps">
             <w:drawing>
               <wp:anchor distT="0" distB="0" distL="114300" distR="114300" simplePos="0" relativeHeight="251645952" behindDoc="0" locked="0" layoutInCell="1" allowOverlap="1" ns4:anchorId="18BB8649" ns4:editId="6D1B5B49">
                 <wp:simplePos x="0" y="0"/>
@@ -2066,52 +2066,52 @@
                 <wp:wrapNone/>
                 <wp:docPr id="8" name="Zone de texte 8"/>
                 <wp:cNvGraphicFramePr>
-                  <ns5:graphicFrameLocks/>
+                  <a:graphicFrameLocks/>
                 </wp:cNvGraphicFramePr>
-                <ns5:graphic>
-                  <ns5:graphicData uri="http://schemas.microsoft.com/office/word/2010/wordprocessingShape">
-                    <ns7:wsp>
-                      <ns7:cNvSpPr txBox="1">
-                        <ns5:spLocks noChangeArrowheads="1"/>
-                      </ns7:cNvSpPr>
-                      <ns7:spPr bwMode="auto">
-                        <ns5:xfrm>
-                          <ns5:off x="0" y="0"/>
-                          <ns5:ext cx="1734820" cy="1228725"/>
-                        </ns5:xfrm>
-                        <ns5:prstGeom prst="rect">
-                          <ns5:avLst/>
-                        </ns5:prstGeom>
-                        <ns5:solidFill>
-                          <ns5:srgbClr val="FFFFFF"/>
-                        </ns5:solidFill>
-                        <ns5:ln>
-                          <ns5:noFill/>
-                        </ns5:ln>
-                        <ns5:extLst>
-                          <ns5:ext uri="{91240B29-F687-4F45-9708-019B960494DF}">
+                <a:graphic>
+                  <a:graphicData uri="http://schemas.microsoft.com/office/word/2010/wordprocessingShape">
+                    <wps:wsp>
+                      <wps:cNvSpPr txBox="1">
+                        <a:spLocks noChangeArrowheads="1"/>
+                      </wps:cNvSpPr>
+                      <wps:spPr bwMode="auto">
+                        <a:xfrm>
+                          <a:off x="0" y="0"/>
+                          <a:ext cx="1734820" cy="1228725"/>
+                        </a:xfrm>
+                        <a:prstGeom prst="rect">
+                          <a:avLst/>
+                        </a:prstGeom>
+                        <a:solidFill>
+                          <a:srgbClr val="FFFFFF"/>
+                        </a:solidFill>
+                        <a:ln>
+                          <a:noFill/>
+                        </a:ln>
+                        <a:extLst>
+                          <a:ext uri="{91240B29-F687-4F45-9708-019B960494DF}">
                             <ns8:hiddenLine w="9525">
-                              <ns5:solidFill>
-                                <ns5:srgbClr val="000000"/>
-                              </ns5:solidFill>
-                              <ns5:miter lim="800000"/>
-                              <ns5:headEnd/>
-                              <ns5:tailEnd/>
+                              <a:solidFill>
+                                <a:srgbClr val="000000"/>
+                              </a:solidFill>
+                              <a:miter lim="800000"/>
+                              <a:headEnd/>
+                              <a:tailEnd/>
                             </ns8:hiddenLine>
-                          </ns5:ext>
-                        </ns5:extLst>
-                      </ns7:spPr>
-                      <ns7:txbx>
+                          </a:ext>
+                        </a:extLst>
+                      </wps:spPr>
+                      <wps:txbx>
                         <w:txbxContent>
                           <w:p ns2:paraId="6BEBDC5B" ns2:textId="77777777"/>
                         </w:txbxContent>
-                      </ns7:txbx>
-                      <ns7:bodyPr rot="0" vert="horz" wrap="square" lIns="91440" tIns="45720" rIns="91440" bIns="45720" anchor="t" anchorCtr="0" upright="1">
-                        <ns5:noAutofit/>
-                      </ns7:bodyPr>
-                    </ns7:wsp>
-                  </ns5:graphicData>
-                </ns5:graphic>
+                      </wps:txbx>
+                      <wps:bodyPr rot="0" vert="horz" wrap="square" lIns="91440" tIns="45720" rIns="91440" bIns="45720" anchor="t" anchorCtr="0" upright="1">
+                        <a:noAutofit/>
+                      </wps:bodyPr>
+                    </wps:wsp>
+                  </a:graphicData>
+                </a:graphic>
                 <ns4:sizeRelH relativeFrom="page">
                   <ns4:pctWidth>0</ns4:pctWidth>
                 </ns4:sizeRelH>
@@ -2120,19 +2120,19 @@
                 </ns4:sizeRelV>
               </wp:anchor>
             </w:drawing>
-          </mc:Choice>
-          <mc:Fallback>
+          </ns1:Choice>
+          <ns1:Fallback>
             <w:pict>
-              <v:shape ns2:anchorId="18BB8649" id="Zone de texte 8" o:spid="_x0000_s1040" type="#_x0000_t202" style="position:absolute;left:0;text-align:left;margin-left:144.95pt;margin-top:11.95pt;width:136.6pt;height:96.75pt;z-index:251645952;visibility:visible;mso-wrap-style:square;mso-width-percent:0;mso-height-percent:0;mso-wrap-distance-left:9pt;mso-wrap-distance-top:0;mso-wrap-distance-right:9pt;mso-wrap-distance-bottom:0;mso-position-horizontal:absolute;mso-position-horizontal-relative:text;mso-position-vertical:absolute;mso-position-vertical-relative:text;mso-width-percent:0;mso-height-percent:0;mso-width-relative:page;mso-height-relative:page;v-text-anchor:top" o:gfxdata="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" stroked="f">
-                <v:textbox>
+              <ns11:shape ns2:anchorId="18BB8649" id="Zone de texte 8" ns12:spid="_x0000_s1040" type="#_x0000_t202" style="position:absolute;left:0;text-align:left;margin-left:144.95pt;margin-top:11.95pt;width:136.6pt;height:96.75pt;z-index:251645952;visibility:visible;mso-wrap-style:square;mso-width-percent:0;mso-height-percent:0;mso-wrap-distance-left:9pt;mso-wrap-distance-top:0;mso-wrap-distance-right:9pt;mso-wrap-distance-bottom:0;mso-position-horizontal:absolute;mso-position-horizontal-relative:text;mso-position-vertical:absolute;mso-position-vertical-relative:text;mso-width-percent:0;mso-height-percent:0;mso-width-relative:page;mso-height-relative:page;v-text-anchor:top" ns12:gfxdata="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" stroked="f">
+                <ns11:textbox>
                   <w:txbxContent>
                     <w:p ns2:paraId="6BEBDC5B" ns2:textId="77777777"/>
                   </w:txbxContent>
-                </v:textbox>
-              </v:shape>
+                </ns11:textbox>
+              </ns11:shape>
             </w:pict>
-          </mc:Fallback>
-        </mc:AlternateContent>
+          </ns1:Fallback>
+        </ns1:AlternateContent>
       </w:r>
       <w:r>
         <w:rPr>
@@ -2140,8 +2140,8 @@
           <w:noProof/>
           <w:lang w:eastAsia="fr-FR"/>
         </w:rPr>
-        <mc:AlternateContent>
-          <mc:Choice Requires="wps">
+        <ns1:AlternateContent>
+          <ns1:Choice Requires="wps">
             <w:drawing>
               <wp:anchor distT="0" distB="0" distL="114300" distR="114300" simplePos="0" relativeHeight="251643904" behindDoc="0" locked="0" layoutInCell="1" allowOverlap="1" ns4:anchorId="4D89E546" ns4:editId="3E2D7BAE">
                 <wp:simplePos x="0" y="0"/>
@@ -2156,42 +2156,42 @@
                 <wp:wrapNone/>
                 <wp:docPr id="7" name="Rectangle 7"/>
                 <wp:cNvGraphicFramePr>
-                  <ns5:graphicFrameLocks/>
+                  <a:graphicFrameLocks/>
                 </wp:cNvGraphicFramePr>
-                <ns5:graphic>
-                  <ns5:graphicData uri="http://schemas.microsoft.com/office/word/2010/wordprocessingShape">
-                    <ns7:wsp>
-                      <ns7:cNvSpPr>
-                        <ns5:spLocks noChangeArrowheads="1"/>
-                      </ns7:cNvSpPr>
-                      <ns7:spPr bwMode="auto">
-                        <ns5:xfrm>
-                          <ns5:off x="0" y="0"/>
-                          <ns5:ext cx="2099310" cy="1228725"/>
-                        </ns5:xfrm>
-                        <ns5:prstGeom prst="rect">
-                          <ns5:avLst/>
-                        </ns5:prstGeom>
-                        <ns5:solidFill>
-                          <ns5:srgbClr val="FFFFFF"/>
-                        </ns5:solidFill>
-                        <ns5:ln>
-                          <ns5:noFill/>
-                        </ns5:ln>
-                        <ns5:extLst>
-                          <ns5:ext uri="{91240B29-F687-4F45-9708-019B960494DF}">
+                <a:graphic>
+                  <a:graphicData uri="http://schemas.microsoft.com/office/word/2010/wordprocessingShape">
+                    <wps:wsp>
+                      <wps:cNvSpPr>
+                        <a:spLocks noChangeArrowheads="1"/>
+                      </wps:cNvSpPr>
+                      <wps:spPr bwMode="auto">
+                        <a:xfrm>
+                          <a:off x="0" y="0"/>
+                          <a:ext cx="2099310" cy="1228725"/>
+                        </a:xfrm>
+                        <a:prstGeom prst="rect">
+                          <a:avLst/>
+                        </a:prstGeom>
+                        <a:solidFill>
+                          <a:srgbClr val="FFFFFF"/>
+                        </a:solidFill>
+                        <a:ln>
+                          <a:noFill/>
+                        </a:ln>
+                        <a:extLst>
+                          <a:ext uri="{91240B29-F687-4F45-9708-019B960494DF}">
                             <ns8:hiddenLine w="9525">
-                              <ns5:solidFill>
-                                <ns5:srgbClr val="000000"/>
-                              </ns5:solidFill>
-                              <ns5:miter lim="800000"/>
-                              <ns5:headEnd/>
-                              <ns5:tailEnd/>
+                              <a:solidFill>
+                                <a:srgbClr val="000000"/>
+                              </a:solidFill>
+                              <a:miter lim="800000"/>
+                              <a:headEnd/>
+                              <a:tailEnd/>
                             </ns8:hiddenLine>
-                          </ns5:ext>
-                        </ns5:extLst>
-                      </ns7:spPr>
-                      <ns7:txbx>
+                          </a:ext>
+                        </a:extLst>
+                      </wps:spPr>
+                      <wps:txbx>
                         <w:txbxContent>
                           <w:p ns2:paraId="684CFDC6" ns2:textId="77777777">
                             <w:pPr>
@@ -2224,13 +2224,13 @@
                             </w:r>
                           </w:p>
                         </w:txbxContent>
-                      </ns7:txbx>
-                      <ns7:bodyPr rot="0" vert="horz" wrap="square" lIns="91440" tIns="45720" rIns="91440" bIns="45720" anchor="t" anchorCtr="0" upright="1">
-                        <ns5:noAutofit/>
-                      </ns7:bodyPr>
-                    </ns7:wsp>
-                  </ns5:graphicData>
-                </ns5:graphic>
+                      </wps:txbx>
+                      <wps:bodyPr rot="0" vert="horz" wrap="square" lIns="91440" tIns="45720" rIns="91440" bIns="45720" anchor="t" anchorCtr="0" upright="1">
+                        <a:noAutofit/>
+                      </wps:bodyPr>
+                    </wps:wsp>
+                  </a:graphicData>
+                </a:graphic>
                 <ns4:sizeRelH relativeFrom="page">
                   <ns4:pctWidth>0</ns4:pctWidth>
                 </ns4:sizeRelH>
@@ -2239,11 +2239,11 @@
                 </ns4:sizeRelV>
               </wp:anchor>
             </w:drawing>
-          </mc:Choice>
-          <mc:Fallback>
+          </ns1:Choice>
+          <ns1:Fallback>
             <w:pict>
-              <v:rect ns2:anchorId="4D89E546" id="Rectangle 7" o:spid="_x0000_s1041" style="position:absolute;left:0;text-align:left;margin-left:-13.5pt;margin-top:11.95pt;width:165.3pt;height:96.75pt;z-index:251643904;visibility:visible;mso-wrap-style:square;mso-width-percent:0;mso-height-percent:0;mso-wrap-distance-left:9pt;mso-wrap-distance-top:0;mso-wrap-distance-right:9pt;mso-wrap-distance-bottom:0;mso-position-horizontal:absolute;mso-position-horizontal-relative:text;mso-position-vertical:absolute;mso-position-vertical-relative:text;mso-width-percent:0;mso-height-percent:0;mso-width-relative:page;mso-height-relative:page;v-text-anchor:top" o:gfxdata="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" stroked="f">
-                <v:textbox>
+              <ns11:rect ns2:anchorId="4D89E546" id="Rectangle 7" ns12:spid="_x0000_s1041" style="position:absolute;left:0;text-align:left;margin-left:-13.5pt;margin-top:11.95pt;width:165.3pt;height:96.75pt;z-index:251643904;visibility:visible;mso-wrap-style:square;mso-width-percent:0;mso-height-percent:0;mso-wrap-distance-left:9pt;mso-wrap-distance-top:0;mso-wrap-distance-right:9pt;mso-wrap-distance-bottom:0;mso-position-horizontal:absolute;mso-position-horizontal-relative:text;mso-position-vertical:absolute;mso-position-vertical-relative:text;mso-width-percent:0;mso-height-percent:0;mso-width-relative:page;mso-height-relative:page;v-text-anchor:top" ns12:gfxdata="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" stroked="f">
+                <ns11:textbox>
                   <w:txbxContent>
                     <w:p ns2:paraId="684CFDC6" ns2:textId="77777777">
                       <w:pPr>
@@ -2276,11 +2276,11 @@
                       </w:r>
                     </w:p>
                   </w:txbxContent>
-                </v:textbox>
-              </v:rect>
+                </ns11:textbox>
+              </ns11:rect>
             </w:pict>
-          </mc:Fallback>
-        </mc:AlternateContent>
+          </ns1:Fallback>
+        </ns1:AlternateContent>
       </w:r>
       <w:r>
         <w:rPr>
@@ -3417,8 +3417,8 @@
           <w:noProof/>
           <w:lang w:eastAsia="fr-FR"/>
         </w:rPr>
-        <mc:AlternateContent>
-          <mc:Choice Requires="wps">
+        <ns1:AlternateContent>
+          <ns1:Choice Requires="wps">
             <w:drawing>
               <wp:anchor distT="0" distB="0" distL="114300" distR="114300" simplePos="0" relativeHeight="251654144" behindDoc="0" locked="0" layoutInCell="1" allowOverlap="1" ns4:anchorId="71EEA676" ns4:editId="5C963E32">
                 <wp:simplePos x="0" y="0"/>
@@ -3433,35 +3433,35 @@
                 <wp:wrapNone/>
                 <wp:docPr id="21" name="Plaque 21"/>
                 <wp:cNvGraphicFramePr/>
-                <ns5:graphic>
-                  <ns5:graphicData uri="http://schemas.microsoft.com/office/word/2010/wordprocessingShape">
-                    <ns7:wsp>
-                      <ns7:cNvSpPr/>
-                      <ns7:spPr>
-                        <ns5:xfrm>
-                          <ns5:off x="0" y="0"/>
-                          <ns5:ext cx="5029200" cy="2838893"/>
-                        </ns5:xfrm>
-                        <ns5:prstGeom prst="bevel">
-                          <ns5:avLst/>
-                        </ns5:prstGeom>
-                        <ns5:ln/>
-                      </ns7:spPr>
-                      <ns7:style>
-                        <ns5:lnRef idx="2">
-                          <ns5:schemeClr val="accent6"/>
-                        </ns5:lnRef>
-                        <ns5:fillRef idx="1">
-                          <ns5:schemeClr val="lt1"/>
-                        </ns5:fillRef>
-                        <ns5:effectRef idx="0">
-                          <ns5:schemeClr val="accent6"/>
-                        </ns5:effectRef>
-                        <ns5:fontRef idx="minor">
-                          <ns5:schemeClr val="dk1"/>
-                        </ns5:fontRef>
-                      </ns7:style>
-                      <ns7:txbx>
+                <a:graphic>
+                  <a:graphicData uri="http://schemas.microsoft.com/office/word/2010/wordprocessingShape">
+                    <wps:wsp>
+                      <wps:cNvSpPr/>
+                      <wps:spPr>
+                        <a:xfrm>
+                          <a:off x="0" y="0"/>
+                          <a:ext cx="5029200" cy="2838893"/>
+                        </a:xfrm>
+                        <a:prstGeom prst="bevel">
+                          <a:avLst/>
+                        </a:prstGeom>
+                        <a:ln/>
+                      </wps:spPr>
+                      <wps:style>
+                        <a:lnRef idx="2">
+                          <a:schemeClr val="accent6"/>
+                        </a:lnRef>
+                        <a:fillRef idx="1">
+                          <a:schemeClr val="lt1"/>
+                        </a:fillRef>
+                        <a:effectRef idx="0">
+                          <a:schemeClr val="accent6"/>
+                        </a:effectRef>
+                        <a:fontRef idx="minor">
+                          <a:schemeClr val="dk1"/>
+                        </a:fontRef>
+                      </wps:style>
+                      <wps:txbx>
                         <w:txbxContent>
                           <w:p ns2:paraId="0771E523" ns2:textId="77777777">
                             <w:pPr>
@@ -3609,16 +3609,16 @@
                             </w:pPr>
                           </w:p>
                         </w:txbxContent>
-                      </ns7:txbx>
-                      <ns7:bodyPr rot="0" spcFirstLastPara="0" vertOverflow="overflow" horzOverflow="overflow" vert="horz" wrap="square" lIns="91440" tIns="45720" rIns="91440" bIns="45720" numCol="1" spcCol="0" rtlCol="0" fromWordArt="0" anchor="ctr" anchorCtr="0" forceAA="0" compatLnSpc="1">
-                        <ns5:prstTxWarp prst="textNoShape">
-                          <ns5:avLst/>
-                        </ns5:prstTxWarp>
-                        <ns5:noAutofit/>
-                      </ns7:bodyPr>
-                    </ns7:wsp>
-                  </ns5:graphicData>
-                </ns5:graphic>
+                      </wps:txbx>
+                      <wps:bodyPr rot="0" spcFirstLastPara="0" vertOverflow="overflow" horzOverflow="overflow" vert="horz" wrap="square" lIns="91440" tIns="45720" rIns="91440" bIns="45720" numCol="1" spcCol="0" rtlCol="0" fromWordArt="0" anchor="ctr" anchorCtr="0" forceAA="0" compatLnSpc="1">
+                        <a:prstTxWarp prst="textNoShape">
+                          <a:avLst/>
+                        </a:prstTxWarp>
+                        <a:noAutofit/>
+                      </wps:bodyPr>
+                    </wps:wsp>
+                  </a:graphicData>
+                </a:graphic>
                 <ns4:sizeRelH relativeFrom="margin">
                   <ns4:pctWidth>0</ns4:pctWidth>
                 </ns4:sizeRelH>
@@ -3627,30 +3627,30 @@
                 </ns4:sizeRelV>
               </wp:anchor>
             </w:drawing>
-          </mc:Choice>
-          <mc:Fallback>
+          </ns1:Choice>
+          <ns1:Fallback>
             <w:pict>
-              <v:shapetype ns2:anchorId="71EEA676" id="_x0000_t84" coordsize="21600,21600" o:spt="84" adj="2700" path="m,l,21600r21600,l21600,xem@0@0nfl@0@2@1@2@1@0xem,nfl@0@0em,21600nfl@0@2em21600,21600nfl@1@2em21600,nfl@1@0e">
-                <v:stroke joinstyle="miter"/>
-                <v:formulas>
-                  <v:f eqn="val #0"/>
-                  <v:f eqn="sum width 0 #0"/>
-                  <v:f eqn="sum height 0 #0"/>
-                  <v:f eqn="prod width 1 2"/>
-                  <v:f eqn="prod height 1 2"/>
-                  <v:f eqn="prod #0 1 2"/>
-                  <v:f eqn="prod #0 3 2"/>
-                  <v:f eqn="sum @1 @5 0"/>
-                  <v:f eqn="sum @2 @5 0"/>
-                </v:formulas>
-                <v:path o:extrusionok="f" limo="10800,10800" o:connecttype="custom" o:connectlocs="0,@4;@0,@4;@3,21600;@3,@2;21600,@4;@1,@4;@3,0;@3,@0" textboxrect="@0,@0,@1,@2"/>
-                <v:handles>
-                  <v:h position="#0,topLeft" switch="" xrange="0,10800"/>
-                </v:handles>
-                <o:complex v:ext="view"/>
-              </v:shapetype>
-              <v:shape id="Plaque 21" o:spid="_x0000_s1042" type="#_x0000_t84" style="position:absolute;left:0;text-align:left;margin-left:47.9pt;margin-top:11.9pt;width:396pt;height:223.55pt;z-index:251654144;visibility:visible;mso-wrap-style:square;mso-width-percent:0;mso-height-percent:0;mso-wrap-distance-left:9pt;mso-wrap-distance-top:0;mso-wrap-distance-right:9pt;mso-wrap-distance-bottom:0;mso-position-horizontal:absolute;mso-position-horizontal-relative:text;mso-position-vertical:absolute;mso-position-vertical-relative:text;mso-width-percent:0;mso-height-percent:0;mso-width-relative:margin;mso-height-relative:margin;v-text-anchor:middle" o:gfxdata="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" fillcolor="white [3201]" strokecolor="#70ad47 [3209]" strokeweight="1pt">
-                <v:textbox>
+              <ns11:shapetype ns2:anchorId="71EEA676" id="_x0000_t84" coordsize="21600,21600" ns12:spt="84" adj="2700" path="m,l,21600r21600,l21600,xem@0@0nfl@0@2@1@2@1@0xem,nfl@0@0em,21600nfl@0@2em21600,21600nfl@1@2em21600,nfl@1@0e">
+                <ns11:stroke joinstyle="miter"/>
+                <ns11:formulas>
+                  <ns11:f eqn="val #0"/>
+                  <ns11:f eqn="sum width 0 #0"/>
+                  <ns11:f eqn="sum height 0 #0"/>
+                  <ns11:f eqn="prod width 1 2"/>
+                  <ns11:f eqn="prod height 1 2"/>
+                  <ns11:f eqn="prod #0 1 2"/>
+                  <ns11:f eqn="prod #0 3 2"/>
+                  <ns11:f eqn="sum @1 @5 0"/>
+                  <ns11:f eqn="sum @2 @5 0"/>
+                </ns11:formulas>
+                <ns11:path ns12:extrusionok="f" limo="10800,10800" ns12:connecttype="custom" ns12:connectlocs="0,@4;@0,@4;@3,21600;@3,@2;21600,@4;@1,@4;@3,0;@3,@0" textboxrect="@0,@0,@1,@2"/>
+                <ns11:handles>
+                  <ns11:h position="#0,topLeft" switch="" xrange="0,10800"/>
+                </ns11:handles>
+                <ns12:complex ns11:ext="view"/>
+              </ns11:shapetype>
+              <ns11:shape id="Plaque 21" ns12:spid="_x0000_s1042" type="#_x0000_t84" style="position:absolute;left:0;text-align:left;margin-left:47.9pt;margin-top:11.9pt;width:396pt;height:223.55pt;z-index:251654144;visibility:visible;mso-wrap-style:square;mso-width-percent:0;mso-height-percent:0;mso-wrap-distance-left:9pt;mso-wrap-distance-top:0;mso-wrap-distance-right:9pt;mso-wrap-distance-bottom:0;mso-position-horizontal:absolute;mso-position-horizontal-relative:text;mso-position-vertical:absolute;mso-position-vertical-relative:text;mso-width-percent:0;mso-height-percent:0;mso-width-relative:margin;mso-height-relative:margin;v-text-anchor:middle" ns12:gfxdata="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" fillcolor="white [3201]" strokecolor="#70ad47 [3209]" strokeweight="1pt">
+                <ns11:textbox>
                   <w:txbxContent>
                     <w:p ns2:paraId="0771E523" ns2:textId="77777777">
                       <w:pPr>
@@ -3798,11 +3798,11 @@
                       </w:pPr>
                     </w:p>
                   </w:txbxContent>
-                </v:textbox>
-              </v:shape>
+                </ns11:textbox>
+              </ns11:shape>
             </w:pict>
-          </mc:Fallback>
-        </mc:AlternateContent>
+          </ns1:Fallback>
+        </ns1:AlternateContent>
       </w:r>
     </w:p>
     <w:p ns2:paraId="5E7ABCC2" ns2:textId="6B8D2F7E">
@@ -12376,8 +12376,8 @@
           <w:szCs w:val="24"/>
           <w:lang w:eastAsia="fr-FR"/>
         </w:rPr>
-        <mc:AlternateContent>
-          <mc:Choice Requires="wps">
+        <ns1:AlternateContent>
+          <ns1:Choice Requires="wps">
             <w:drawing>
               <wp:anchor distT="0" distB="0" distL="114300" distR="114300" simplePos="0" relativeHeight="251676672" behindDoc="0" locked="0" layoutInCell="1" allowOverlap="1" ns4:anchorId="637AD4DA" ns4:editId="123B3BED">
                 <wp:simplePos x="0" y="0"/>
@@ -12392,50 +12392,50 @@
                 <wp:wrapNone/>
                 <wp:docPr id="3" name="Hexagone 3"/>
                 <wp:cNvGraphicFramePr/>
-                <ns5:graphic>
-                  <ns5:graphicData uri="http://schemas.microsoft.com/office/word/2010/wordprocessingShape">
-                    <ns7:wsp>
-                      <ns7:cNvSpPr/>
-                      <ns7:spPr>
-                        <ns5:xfrm>
-                          <ns5:off x="0" y="0"/>
-                          <ns5:ext cx="2800350" cy="737369"/>
-                        </ns5:xfrm>
-                        <ns5:prstGeom prst="hexagon">
-                          <ns5:avLst/>
-                        </ns5:prstGeom>
-                        <ns5:solidFill>
-                          <ns5:schemeClr val="bg2"/>
-                        </ns5:solidFill>
-                        <ns5:ln>
-                          <ns5:solidFill>
-                            <ns5:schemeClr val="tx1">
-                              <ns5:lumMod val="50000"/>
-                              <ns5:lumOff val="50000"/>
-                            </ns5:schemeClr>
-                          </ns5:solidFill>
-                        </ns5:ln>
-                        <ns5:effectLst>
-                          <ns5:innerShdw blurRad="114300">
-                            <ns5:prstClr val="black"/>
-                          </ns5:innerShdw>
-                        </ns5:effectLst>
-                      </ns7:spPr>
-                      <ns7:style>
-                        <ns5:lnRef idx="1">
-                          <ns5:schemeClr val="accent5"/>
-                        </ns5:lnRef>
-                        <ns5:fillRef idx="2">
-                          <ns5:schemeClr val="accent5"/>
-                        </ns5:fillRef>
-                        <ns5:effectRef idx="1">
-                          <ns5:schemeClr val="accent5"/>
-                        </ns5:effectRef>
-                        <ns5:fontRef idx="minor">
-                          <ns5:schemeClr val="dk1"/>
-                        </ns5:fontRef>
-                      </ns7:style>
-                      <ns7:txbx>
+                <a:graphic>
+                  <a:graphicData uri="http://schemas.microsoft.com/office/word/2010/wordprocessingShape">
+                    <wps:wsp>
+                      <wps:cNvSpPr/>
+                      <wps:spPr>
+                        <a:xfrm>
+                          <a:off x="0" y="0"/>
+                          <a:ext cx="2800350" cy="737369"/>
+                        </a:xfrm>
+                        <a:prstGeom prst="hexagon">
+                          <a:avLst/>
+                        </a:prstGeom>
+                        <a:solidFill>
+                          <a:schemeClr val="bg2"/>
+                        </a:solidFill>
+                        <a:ln>
+                          <a:solidFill>
+                            <a:schemeClr val="tx1">
+                              <a:lumMod val="50000"/>
+                              <a:lumOff val="50000"/>
+                            </a:schemeClr>
+                          </a:solidFill>
+                        </a:ln>
+                        <a:effectLst>
+                          <a:innerShdw blurRad="114300">
+                            <a:prstClr val="black"/>
+                          </a:innerShdw>
+                        </a:effectLst>
+                      </wps:spPr>
+                      <wps:style>
+                        <a:lnRef idx="1">
+                          <a:schemeClr val="accent5"/>
+                        </a:lnRef>
+                        <a:fillRef idx="2">
+                          <a:schemeClr val="accent5"/>
+                        </a:fillRef>
+                        <a:effectRef idx="1">
+                          <a:schemeClr val="accent5"/>
+                        </a:effectRef>
+                        <a:fontRef idx="minor">
+                          <a:schemeClr val="dk1"/>
+                        </a:fontRef>
+                      </wps:style>
+                      <wps:txbx>
                         <w:txbxContent>
                           <w:p ns2:paraId="43A51CC7" ns2:textId="77777777">
                             <w:pPr>
@@ -12481,16 +12481,16 @@
                             </w:pPr>
                           </w:p>
                         </w:txbxContent>
-                      </ns7:txbx>
-                      <ns7:bodyPr rot="0" spcFirstLastPara="0" vertOverflow="overflow" horzOverflow="overflow" vert="horz" wrap="square" lIns="91440" tIns="45720" rIns="91440" bIns="45720" numCol="1" spcCol="0" rtlCol="0" fromWordArt="0" anchor="ctr" anchorCtr="0" forceAA="0" compatLnSpc="1">
-                        <ns5:prstTxWarp prst="textNoShape">
-                          <ns5:avLst/>
-                        </ns5:prstTxWarp>
-                        <ns5:noAutofit/>
-                      </ns7:bodyPr>
-                    </ns7:wsp>
-                  </ns5:graphicData>
-                </ns5:graphic>
+                      </wps:txbx>
+                      <wps:bodyPr rot="0" spcFirstLastPara="0" vertOverflow="overflow" horzOverflow="overflow" vert="horz" wrap="square" lIns="91440" tIns="45720" rIns="91440" bIns="45720" numCol="1" spcCol="0" rtlCol="0" fromWordArt="0" anchor="ctr" anchorCtr="0" forceAA="0" compatLnSpc="1">
+                        <a:prstTxWarp prst="textNoShape">
+                          <a:avLst/>
+                        </a:prstTxWarp>
+                        <a:noAutofit/>
+                      </wps:bodyPr>
+                    </wps:wsp>
+                  </a:graphicData>
+                </a:graphic>
                 <ns4:sizeRelH relativeFrom="margin">
                   <ns4:pctWidth>0</ns4:pctWidth>
                 </ns4:sizeRelH>
@@ -12499,26 +12499,26 @@
                 </ns4:sizeRelV>
               </wp:anchor>
             </w:drawing>
-          </mc:Choice>
-          <mc:Fallback>
+          </ns1:Choice>
+          <ns1:Fallback>
             <w:pict>
-              <v:shapetype ns2:anchorId="637AD4DA" id="_x0000_t9" coordsize="21600,21600" o:spt="9" adj="5400" path="m@0,l,10800@0,21600@1,21600,21600,10800@1,xe">
-                <v:stroke joinstyle="miter"/>
-                <v:formulas>
-                  <v:f eqn="val #0"/>
-                  <v:f eqn="sum width 0 #0"/>
-                  <v:f eqn="sum height 0 #0"/>
-                  <v:f eqn="prod @0 2929 10000"/>
-                  <v:f eqn="sum width 0 @3"/>
-                  <v:f eqn="sum height 0 @3"/>
-                </v:formulas>
-                <v:path gradientshapeok="t" o:connecttype="rect" textboxrect="1800,1800,19800,19800;3600,3600,18000,18000;6300,6300,15300,15300"/>
-                <v:handles>
-                  <v:h position="#0,topLeft" xrange="0,10800"/>
-                </v:handles>
-              </v:shapetype>
-              <v:shape id="Hexagone 3" o:spid="_x0000_s1043" type="#_x0000_t9" style="position:absolute;left:0;text-align:left;margin-left:184.65pt;margin-top:11pt;width:220.5pt;height:58.05pt;z-index:251676672;visibility:visible;mso-wrap-style:square;mso-width-percent:0;mso-height-percent:0;mso-wrap-distance-left:9pt;mso-wrap-distance-top:0;mso-wrap-distance-right:9pt;mso-wrap-distance-bottom:0;mso-position-horizontal:absolute;mso-position-horizontal-relative:page;mso-position-vertical:absolute;mso-position-vertical-relative:text;mso-width-percent:0;mso-height-percent:0;mso-width-relative:margin;mso-height-relative:margin;v-text-anchor:middle" o:gfxdata="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" adj="1422" fillcolor="#e7e6e6 [3214]" strokecolor="gray [1629]" strokeweight=".5pt">
-                <v:textbox>
+              <ns11:shapetype ns2:anchorId="637AD4DA" id="_x0000_t9" coordsize="21600,21600" ns12:spt="9" adj="5400" path="m@0,l,10800@0,21600@1,21600,21600,10800@1,xe">
+                <ns11:stroke joinstyle="miter"/>
+                <ns11:formulas>
+                  <ns11:f eqn="val #0"/>
+                  <ns11:f eqn="sum width 0 #0"/>
+                  <ns11:f eqn="sum height 0 #0"/>
+                  <ns11:f eqn="prod @0 2929 10000"/>
+                  <ns11:f eqn="sum width 0 @3"/>
+                  <ns11:f eqn="sum height 0 @3"/>
+                </ns11:formulas>
+                <ns11:path gradientshapeok="t" ns12:connecttype="rect" textboxrect="1800,1800,19800,19800;3600,3600,18000,18000;6300,6300,15300,15300"/>
+                <ns11:handles>
+                  <ns11:h position="#0,topLeft" xrange="0,10800"/>
+                </ns11:handles>
+              </ns11:shapetype>
+              <ns11:shape id="Hexagone 3" ns12:spid="_x0000_s1043" type="#_x0000_t9" style="position:absolute;left:0;text-align:left;margin-left:184.65pt;margin-top:11pt;width:220.5pt;height:58.05pt;z-index:251676672;visibility:visible;mso-wrap-style:square;mso-width-percent:0;mso-height-percent:0;mso-wrap-distance-left:9pt;mso-wrap-distance-top:0;mso-wrap-distance-right:9pt;mso-wrap-distance-bottom:0;mso-position-horizontal:absolute;mso-position-horizontal-relative:page;mso-position-vertical:absolute;mso-position-vertical-relative:text;mso-width-percent:0;mso-height-percent:0;mso-width-relative:margin;mso-height-relative:margin;v-text-anchor:middle" ns12:gfxdata="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" adj="1422" fillcolor="#e7e6e6 [3214]" strokecolor="gray [1629]" strokeweight=".5pt">
+                <ns11:textbox>
                   <w:txbxContent>
                     <w:p ns2:paraId="43A51CC7" ns2:textId="77777777">
                       <w:pPr>
@@ -12564,12 +12564,12 @@
                       </w:pPr>
                     </w:p>
                   </w:txbxContent>
-                </v:textbox>
+                </ns11:textbox>
                 <ns13:wrap anchorx="page"/>
-              </v:shape>
+              </ns11:shape>
             </w:pict>
-          </mc:Fallback>
-        </mc:AlternateContent>
+          </ns1:Fallback>
+        </ns1:AlternateContent>
       </w:r>
     </w:p>
     <w:p ns2:paraId="05BC3192" ns2:textId="7FB65FA4">
@@ -13702,8 +13702,8 @@
           <w:szCs w:val="24"/>
           <w:lang w:eastAsia="fr-FR"/>
         </w:rPr>
-        <mc:AlternateContent>
-          <mc:Choice Requires="wps">
+        <ns1:AlternateContent>
+          <ns1:Choice Requires="wps">
             <w:drawing>
               <wp:anchor distT="0" distB="0" distL="114300" distR="114300" simplePos="0" relativeHeight="251666432" behindDoc="0" locked="0" layoutInCell="1" allowOverlap="1" ns4:anchorId="02512AF6" ns4:editId="2AD0919F">
                 <wp:simplePos x="0" y="0"/>
@@ -13718,50 +13718,50 @@
                 <wp:wrapNone/>
                 <wp:docPr id="4" name="Hexagone 4"/>
                 <wp:cNvGraphicFramePr/>
-                <ns5:graphic>
-                  <ns5:graphicData uri="http://schemas.microsoft.com/office/word/2010/wordprocessingShape">
-                    <ns7:wsp>
-                      <ns7:cNvSpPr/>
-                      <ns7:spPr>
-                        <ns5:xfrm>
-                          <ns5:off x="0" y="0"/>
-                          <ns5:ext cx="4954002" cy="2269958"/>
-                        </ns5:xfrm>
-                        <ns5:prstGeom prst="hexagon">
-                          <ns5:avLst/>
-                        </ns5:prstGeom>
-                        <ns5:solidFill>
-                          <ns5:schemeClr val="bg2"/>
-                        </ns5:solidFill>
-                        <ns5:ln>
-                          <ns5:solidFill>
-                            <ns5:schemeClr val="tx1">
-                              <ns5:lumMod val="50000"/>
-                              <ns5:lumOff val="50000"/>
-                            </ns5:schemeClr>
-                          </ns5:solidFill>
-                        </ns5:ln>
-                        <ns5:effectLst>
-                          <ns5:innerShdw blurRad="114300">
-                            <ns5:prstClr val="black"/>
-                          </ns5:innerShdw>
-                        </ns5:effectLst>
-                      </ns7:spPr>
-                      <ns7:style>
-                        <ns5:lnRef idx="1">
-                          <ns5:schemeClr val="accent5"/>
-                        </ns5:lnRef>
-                        <ns5:fillRef idx="2">
-                          <ns5:schemeClr val="accent5"/>
-                        </ns5:fillRef>
-                        <ns5:effectRef idx="1">
-                          <ns5:schemeClr val="accent5"/>
-                        </ns5:effectRef>
-                        <ns5:fontRef idx="minor">
-                          <ns5:schemeClr val="dk1"/>
-                        </ns5:fontRef>
-                      </ns7:style>
-                      <ns7:txbx>
+                <a:graphic>
+                  <a:graphicData uri="http://schemas.microsoft.com/office/word/2010/wordprocessingShape">
+                    <wps:wsp>
+                      <wps:cNvSpPr/>
+                      <wps:spPr>
+                        <a:xfrm>
+                          <a:off x="0" y="0"/>
+                          <a:ext cx="4954002" cy="2269958"/>
+                        </a:xfrm>
+                        <a:prstGeom prst="hexagon">
+                          <a:avLst/>
+                        </a:prstGeom>
+                        <a:solidFill>
+                          <a:schemeClr val="bg2"/>
+                        </a:solidFill>
+                        <a:ln>
+                          <a:solidFill>
+                            <a:schemeClr val="tx1">
+                              <a:lumMod val="50000"/>
+                              <a:lumOff val="50000"/>
+                            </a:schemeClr>
+                          </a:solidFill>
+                        </a:ln>
+                        <a:effectLst>
+                          <a:innerShdw blurRad="114300">
+                            <a:prstClr val="black"/>
+                          </a:innerShdw>
+                        </a:effectLst>
+                      </wps:spPr>
+                      <wps:style>
+                        <a:lnRef idx="1">
+                          <a:schemeClr val="accent5"/>
+                        </a:lnRef>
+                        <a:fillRef idx="2">
+                          <a:schemeClr val="accent5"/>
+                        </a:fillRef>
+                        <a:effectRef idx="1">
+                          <a:schemeClr val="accent5"/>
+                        </a:effectRef>
+                        <a:fontRef idx="minor">
+                          <a:schemeClr val="dk1"/>
+                        </a:fontRef>
+                      </wps:style>
+                      <wps:txbx>
                         <w:txbxContent>
                           <w:p ns2:paraId="06E29CEB" ns2:textId="77777777">
                             <w:pPr>
@@ -13873,16 +13873,16 @@
                             </w:pPr>
                           </w:p>
                         </w:txbxContent>
-                      </ns7:txbx>
-                      <ns7:bodyPr rot="0" spcFirstLastPara="0" vertOverflow="overflow" horzOverflow="overflow" vert="horz" wrap="square" lIns="91440" tIns="45720" rIns="91440" bIns="45720" numCol="1" spcCol="0" rtlCol="0" fromWordArt="0" anchor="ctr" anchorCtr="0" forceAA="0" compatLnSpc="1">
-                        <ns5:prstTxWarp prst="textNoShape">
-                          <ns5:avLst/>
-                        </ns5:prstTxWarp>
-                        <ns5:noAutofit/>
-                      </ns7:bodyPr>
-                    </ns7:wsp>
-                  </ns5:graphicData>
-                </ns5:graphic>
+                      </wps:txbx>
+                      <wps:bodyPr rot="0" spcFirstLastPara="0" vertOverflow="overflow" horzOverflow="overflow" vert="horz" wrap="square" lIns="91440" tIns="45720" rIns="91440" bIns="45720" numCol="1" spcCol="0" rtlCol="0" fromWordArt="0" anchor="ctr" anchorCtr="0" forceAA="0" compatLnSpc="1">
+                        <a:prstTxWarp prst="textNoShape">
+                          <a:avLst/>
+                        </a:prstTxWarp>
+                        <a:noAutofit/>
+                      </wps:bodyPr>
+                    </wps:wsp>
+                  </a:graphicData>
+                </a:graphic>
                 <ns4:sizeRelH relativeFrom="margin">
                   <ns4:pctWidth>0</ns4:pctWidth>
                 </ns4:sizeRelH>
@@ -13891,11 +13891,11 @@
                 </ns4:sizeRelV>
               </wp:anchor>
             </w:drawing>
-          </mc:Choice>
-          <mc:Fallback>
+          </ns1:Choice>
+          <ns1:Fallback>
             <w:pict>
-              <v:shape ns2:anchorId="02512AF6" id="Hexagone 4" o:spid="_x0000_s1044" type="#_x0000_t9" style="position:absolute;left:0;text-align:left;margin-left:50.25pt;margin-top:112.7pt;width:390.1pt;height:178.75pt;z-index:251666432;visibility:visible;mso-wrap-style:square;mso-width-percent:0;mso-height-percent:0;mso-wrap-distance-left:9pt;mso-wrap-distance-top:0;mso-wrap-distance-right:9pt;mso-wrap-distance-bottom:0;mso-position-horizontal:absolute;mso-position-horizontal-relative:text;mso-position-vertical:absolute;mso-position-vertical-relative:text;mso-width-percent:0;mso-height-percent:0;mso-width-relative:margin;mso-height-relative:margin;v-text-anchor:middle" o:gfxdata="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" adj="2474" fillcolor="#e7e6e6 [3214]" strokecolor="gray [1629]" strokeweight=".5pt">
-                <v:textbox>
+              <ns11:shape ns2:anchorId="02512AF6" id="Hexagone 4" ns12:spid="_x0000_s1044" type="#_x0000_t9" style="position:absolute;left:0;text-align:left;margin-left:50.25pt;margin-top:112.7pt;width:390.1pt;height:178.75pt;z-index:251666432;visibility:visible;mso-wrap-style:square;mso-width-percent:0;mso-height-percent:0;mso-wrap-distance-left:9pt;mso-wrap-distance-top:0;mso-wrap-distance-right:9pt;mso-wrap-distance-bottom:0;mso-position-horizontal:absolute;mso-position-horizontal-relative:text;mso-position-vertical:absolute;mso-position-vertical-relative:text;mso-width-percent:0;mso-height-percent:0;mso-width-relative:margin;mso-height-relative:margin;v-text-anchor:middle" ns12:gfxdata="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" adj="2474" fillcolor="#e7e6e6 [3214]" strokecolor="gray [1629]" strokeweight=".5pt">
+                <ns11:textbox>
                   <w:txbxContent>
                     <w:p ns2:paraId="06E29CEB" ns2:textId="77777777">
                       <w:pPr>
@@ -14007,11 +14007,11 @@
                       </w:pPr>
                     </w:p>
                   </w:txbxContent>
-                </v:textbox>
-              </v:shape>
+                </ns11:textbox>
+              </ns11:shape>
             </w:pict>
-          </mc:Fallback>
-        </mc:AlternateContent>
+          </ns1:Fallback>
+        </ns1:AlternateContent>
       </w:r>
       <w:r>
         <w:rPr>
@@ -15167,10 +15167,11 @@
     </w:p>
     <w:p ns2:paraId="1824649F" ns2:textId="77777777">
       <w:pPr>
+        <w:keepNext/>
         <w:widowControl/>
         <w:spacing w:before="0" w:after="0" w:line="360" w:lineRule="auto"/>
         <w:ind w:firstLine="0"/>
-        <w:jc w:val="both"/>
+        <w:jc w:val="center"/>
         <w:rPr>
           <w:rFonts w:eastAsia="Times New Roman" w:cstheme="minorHAnsi" w:ascii="Times New Roman" w:hAnsi="Times New Roman" w:cs="Times New Roman"/>
           <w:sz w:val="24"/>
@@ -15180,135 +15181,141 @@
       </w:pPr>
       <w:r>
         <w:rPr>
+          <w:rFonts w:cstheme="minorHAnsi"/>
+          <w:noProof/>
+          <w:lang w:eastAsia="fr-FR"/>
+        </w:rPr>
+        <w:drawing>
+          <wp:inline distT="0" distB="0" distL="0" distR="0" ns4:anchorId="6CA92A5D" ns4:editId="57984117">
+            <wp:extent cx="3429000" cy="2571750"/>
+            <wp:effectExtent l="0" t="0" r="0" b="0"/>
+            <wp:docPr id="678639386" name="Image 1"/>
+            <wp:cNvGraphicFramePr>
+              <a:graphicFrameLocks noChangeAspect="1"/>
+            </wp:cNvGraphicFramePr>
+            <a:graphic>
+              <a:graphicData uri="http://schemas.openxmlformats.org/drawingml/2006/picture">
+                <pic:pic>
+                  <pic:nvPicPr>
+                    <pic:cNvPr id="0" name="Picture 1"/>
+                    <pic:cNvPicPr>
+                      <a:picLocks noChangeAspect="1" noChangeArrowheads="1"/>
+                    </pic:cNvPicPr>
+                  </pic:nvPicPr>
+                  <pic:blipFill>
+                    <a:blip r:embed="rId11" cstate="print">
+                      <a:extLst>
+                        <a:ext uri="{28A0092B-C50C-407E-A947-70E740481C1C}">
+                          <ns8:useLocalDpi val="0"/>
+                        </a:ext>
+                      </a:extLst>
+                    </a:blip>
+                    <a:srcRect/>
+                    <a:stretch>
+                      <a:fillRect/>
+                    </a:stretch>
+                  </pic:blipFill>
+                  <pic:spPr bwMode="auto">
+                    <a:xfrm>
+                      <a:off x="0" y="0"/>
+                      <a:ext cx="3429000" cy="2571750"/>
+                    </a:xfrm>
+                    <a:prstGeom prst="rect">
+                      <a:avLst/>
+                    </a:prstGeom>
+                    <a:noFill/>
+                    <a:ln>
+                      <a:noFill/>
+                    </a:ln>
+                  </pic:spPr>
+                </pic:pic>
+              </a:graphicData>
+            </a:graphic>
+          </wp:inline>
+        </w:drawing>
+      </w:r>
+    </w:p>
+    <w:p ns2:paraId="54E20144" ns2:textId="3111D644">
+      <w:pPr>
+        <w:pStyle w:val="MemoirePetit"/>
+        <w:rPr>
+          <w:lang w:val="fr-BE"/>
+        </w:rPr>
+        <w:spacing w:before="0" w:after="0" w:line="240" w:lineRule="auto"/>
+        <w:ind w:firstLine="0"/>
+        <w:jc w:val="left"/>
+      </w:pPr>
+      <w:r>
+        <w:rPr>
+          <w:sz w:val="20"/>
+          <w:szCs w:val="20"/>
+        </w:rPr>
+        <w:t xml:space="preserve">Photo </w:t>
+      </w:r>
+      <w:r>
+        <w:rPr>
+          <w:sz w:val="20"/>
+          <w:szCs w:val="20"/>
+        </w:rPr>
+        <w:fldChar w:fldCharType="begin" w:dirty="true"/>
+      </w:r>
+      <w:r>
+        <w:rPr>
+          <w:sz w:val="20"/>
+          <w:szCs w:val="20"/>
+        </w:rPr>
+        <w:instrText xml:space="preserve"> SEQ Photo \* ARABIC </w:instrText>
+      </w:r>
+      <w:r>
+        <w:rPr>
+          <w:sz w:val="20"/>
+          <w:szCs w:val="20"/>
+        </w:rPr>
+        <w:fldChar w:fldCharType="separate"/>
+      </w:r>
+      <w:r>
+        <w:rPr>
+          <w:sz w:val="20"/>
+          <w:szCs w:val="20"/>
+        </w:rPr>
+        <w:t xml:space="preserve">1</w:t>
+      </w:r>
+      <w:r>
+        <w:rPr>
+          <w:sz w:val="20"/>
+          <w:szCs w:val="20"/>
+        </w:rPr>
+        <w:fldChar w:fldCharType="end"/>
+      </w:r>
+      <w:r>
+        <w:rPr>
+          <w:sz w:val="20"/>
+          <w:szCs w:val="20"/>
+        </w:rPr>
+        <w:t xml:space="preserve"> — Vue en image de la Mairie de Kérou</w:t>
+      </w:r>
+    </w:p>
+    <w:p ns2:paraId="27CB497F" ns2:textId="77777777">
+      <w:pPr>
+        <w:widowControl/>
+        <w:spacing w:before="0" w:after="0" w:line="360" w:lineRule="auto"/>
+        <w:ind w:firstLine="0"/>
+        <w:jc w:val="both"/>
+        <w:rPr>
           <w:rFonts w:eastAsia="Times New Roman" w:cstheme="minorHAnsi" w:ascii="Times New Roman" w:hAnsi="Times New Roman" w:cs="Times New Roman"/>
           <w:sz w:val="24"/>
           <w:szCs w:val="24"/>
           <w:lang w:val="fr-BE"/>
         </w:rPr>
-        <w:t xml:space="preserve">                          </w:t>
-      </w:r>
-      <w:r>
-        <w:rPr>
-          <w:rFonts w:cstheme="minorHAnsi"/>
-          <w:noProof/>
-          <w:lang w:eastAsia="fr-FR"/>
-        </w:rPr>
-        <w:drawing>
-          <wp:inline distT="0" distB="0" distL="0" distR="0" ns4:anchorId="6CA92A5D" ns4:editId="57984117">
-            <wp:extent cx="3850005" cy="2461260"/>
-            <wp:effectExtent l="0" t="0" r="0" b="0"/>
-            <wp:docPr id="678639386" name="Image 1"/>
-            <wp:cNvGraphicFramePr>
-              <ns5:graphicFrameLocks noChangeAspect="1"/>
-            </wp:cNvGraphicFramePr>
-            <ns5:graphic>
-              <ns5:graphicData uri="http://schemas.openxmlformats.org/drawingml/2006/picture">
-                <ns9:pic>
-                  <ns9:nvPicPr>
-                    <ns9:cNvPr id="0" name="Picture 1"/>
-                    <ns9:cNvPicPr>
-                      <ns5:picLocks noChangeAspect="1" noChangeArrowheads="1"/>
-                    </ns9:cNvPicPr>
-                  </ns9:nvPicPr>
-                  <ns9:blipFill>
-                    <ns5:blip r:embed="rId11" cstate="print">
-                      <ns5:extLst>
-                        <ns5:ext uri="{28A0092B-C50C-407E-A947-70E740481C1C}">
-                          <ns8:useLocalDpi val="0"/>
-                        </ns5:ext>
-                      </ns5:extLst>
-                    </ns5:blip>
-                    <ns5:srcRect/>
-                    <ns5:stretch>
-                      <ns5:fillRect/>
-                    </ns5:stretch>
-                  </ns9:blipFill>
-                  <ns9:spPr bwMode="auto">
-                    <ns5:xfrm>
-                      <ns5:off x="0" y="0"/>
-                      <ns5:ext cx="3907091" cy="2497754"/>
-                    </ns5:xfrm>
-                    <ns5:prstGeom prst="rect">
-                      <ns5:avLst/>
-                    </ns5:prstGeom>
-                    <ns5:noFill/>
-                    <ns5:ln>
-                      <ns5:noFill/>
-                    </ns5:ln>
-                  </ns9:spPr>
-                </ns9:pic>
-              </ns5:graphicData>
-            </ns5:graphic>
-          </wp:inline>
-        </w:drawing>
-      </w:r>
-    </w:p>
-    <w:p ns2:paraId="54E20144" ns2:textId="3111D644">
-      <w:pPr>
-        <w:pStyle w:val="MemoirePetit"/>
-        <w:rPr>
-          <w:lang w:val="fr-BE"/>
-        </w:rPr>
-        <w:spacing w:before="0" w:after="0" w:line="240" w:lineRule="auto"/>
-        <w:ind w:firstLine="0"/>
-        <w:jc w:val="left"/>
-      </w:pPr>
-      <w:r>
-        <w:rPr>
-          <w:sz w:val="20"/>
-          <w:szCs w:val="20"/>
-        </w:rPr>
-        <w:t xml:space="preserve">Photo </w:t>
-      </w:r>
-      <w:r>
-        <w:rPr>
-          <w:sz w:val="20"/>
-          <w:szCs w:val="20"/>
-        </w:rPr>
-        <w:fldChar w:fldCharType="begin" w:dirty="true"/>
-      </w:r>
-      <w:r>
-        <w:rPr>
-          <w:sz w:val="20"/>
-          <w:szCs w:val="20"/>
-        </w:rPr>
-        <w:instrText xml:space="preserve"> SEQ Photo \* ARABIC </w:instrText>
-      </w:r>
-      <w:r>
-        <w:rPr>
-          <w:sz w:val="20"/>
-          <w:szCs w:val="20"/>
-        </w:rPr>
-        <w:fldChar w:fldCharType="separate"/>
-      </w:r>
-      <w:r>
-        <w:rPr>
-          <w:sz w:val="20"/>
-          <w:szCs w:val="20"/>
-        </w:rPr>
-        <w:t xml:space="preserve">1</w:t>
-      </w:r>
-      <w:r>
-        <w:rPr>
-          <w:sz w:val="20"/>
-          <w:szCs w:val="20"/>
-        </w:rPr>
-        <w:fldChar w:fldCharType="end"/>
-      </w:r>
-      <w:r>
-        <w:rPr>
-          <w:sz w:val="20"/>
-          <w:szCs w:val="20"/>
-        </w:rPr>
-        <w:t xml:space="preserve"> — Vue en image de la Mairie de Kérou</w:t>
-      </w:r>
-    </w:p>
-    <w:p ns2:paraId="27CB497F" ns2:textId="77777777">
-      <w:pPr>
+      </w:pPr>
+    </w:p>
+    <w:p ns2:paraId="7D5778B3" ns2:textId="56130001">
+      <w:pPr>
+        <w:keepNext/>
         <w:widowControl/>
         <w:spacing w:before="0" w:after="0" w:line="360" w:lineRule="auto"/>
         <w:ind w:firstLine="0"/>
-        <w:jc w:val="both"/>
+        <w:jc w:val="center"/>
         <w:rPr>
           <w:rFonts w:eastAsia="Times New Roman" w:cstheme="minorHAnsi" w:ascii="Times New Roman" w:hAnsi="Times New Roman" w:cs="Times New Roman"/>
           <w:sz w:val="24"/>
@@ -15316,29 +15323,6 @@
           <w:lang w:val="fr-BE"/>
         </w:rPr>
       </w:pPr>
-    </w:p>
-    <w:p ns2:paraId="7D5778B3" ns2:textId="56130001">
-      <w:pPr>
-        <w:widowControl/>
-        <w:spacing w:before="0" w:after="0" w:line="360" w:lineRule="auto"/>
-        <w:ind w:firstLine="0"/>
-        <w:jc w:val="both"/>
-        <w:rPr>
-          <w:rFonts w:eastAsia="Times New Roman" w:cstheme="minorHAnsi" w:ascii="Times New Roman" w:hAnsi="Times New Roman" w:cs="Times New Roman"/>
-          <w:sz w:val="24"/>
-          <w:szCs w:val="24"/>
-          <w:lang w:val="fr-BE"/>
-        </w:rPr>
-      </w:pPr>
-      <w:r>
-        <w:rPr>
-          <w:rFonts w:eastAsia="Times New Roman" w:cstheme="minorHAnsi" w:ascii="Times New Roman" w:hAnsi="Times New Roman" w:cs="Times New Roman"/>
-          <w:sz w:val="24"/>
-          <w:szCs w:val="24"/>
-          <w:lang w:val="fr-BE"/>
-        </w:rPr>
-        <w:t xml:space="preserve">                          </w:t>
-      </w:r>
       <w:r>
         <w:rPr>
           <w:rFonts w:cstheme="minorHAnsi"/>
@@ -15347,50 +15331,50 @@
         </w:rPr>
         <w:drawing>
           <wp:inline distT="0" distB="0" distL="0" distR="0" ns4:anchorId="2B75818E" ns4:editId="15DFED95">
-            <wp:extent cx="3848674" cy="2510155"/>
+            <wp:extent cx="3848674" cy="2519132"/>
             <wp:effectExtent l="0" t="0" r="0" b="4445"/>
             <wp:docPr id="869815646" name="Image 1"/>
             <wp:cNvGraphicFramePr>
-              <ns5:graphicFrameLocks noChangeAspect="1"/>
+              <a:graphicFrameLocks noChangeAspect="1"/>
             </wp:cNvGraphicFramePr>
-            <ns5:graphic>
-              <ns5:graphicData uri="http://schemas.openxmlformats.org/drawingml/2006/picture">
-                <ns9:pic>
-                  <ns9:nvPicPr>
-                    <ns9:cNvPr id="0" name="Picture 1"/>
-                    <ns9:cNvPicPr>
-                      <ns5:picLocks noChangeAspect="1" noChangeArrowheads="1"/>
-                    </ns9:cNvPicPr>
-                  </ns9:nvPicPr>
-                  <ns9:blipFill>
-                    <ns5:blip r:embed="rId12" cstate="print">
-                      <ns5:extLst>
-                        <ns5:ext uri="{28A0092B-C50C-407E-A947-70E740481C1C}">
+            <a:graphic>
+              <a:graphicData uri="http://schemas.openxmlformats.org/drawingml/2006/picture">
+                <pic:pic>
+                  <pic:nvPicPr>
+                    <pic:cNvPr id="0" name="Picture 1"/>
+                    <pic:cNvPicPr>
+                      <a:picLocks noChangeAspect="1" noChangeArrowheads="1"/>
+                    </pic:cNvPicPr>
+                  </pic:nvPicPr>
+                  <pic:blipFill>
+                    <a:blip r:embed="rId12" cstate="print">
+                      <a:extLst>
+                        <a:ext uri="{28A0092B-C50C-407E-A947-70E740481C1C}">
                           <ns8:useLocalDpi val="0"/>
-                        </ns5:ext>
-                      </ns5:extLst>
-                    </ns5:blip>
-                    <ns5:srcRect/>
-                    <ns5:stretch>
-                      <ns5:fillRect/>
-                    </ns5:stretch>
-                  </ns9:blipFill>
-                  <ns9:spPr bwMode="auto">
-                    <ns5:xfrm>
-                      <ns5:off x="0" y="0"/>
-                      <ns5:ext cx="3921556" cy="2557689"/>
-                    </ns5:xfrm>
-                    <ns5:prstGeom prst="rect">
-                      <ns5:avLst/>
-                    </ns5:prstGeom>
-                    <ns5:noFill/>
-                    <ns5:ln>
-                      <ns5:noFill/>
-                    </ns5:ln>
-                  </ns9:spPr>
-                </ns9:pic>
-              </ns5:graphicData>
-            </ns5:graphic>
+                        </a:ext>
+                      </a:extLst>
+                    </a:blip>
+                    <a:srcRect/>
+                    <a:stretch>
+                      <a:fillRect/>
+                    </a:stretch>
+                  </pic:blipFill>
+                  <pic:spPr bwMode="auto">
+                    <a:xfrm>
+                      <a:off x="0" y="0"/>
+                      <a:ext cx="3848674" cy="2519132"/>
+                    </a:xfrm>
+                    <a:prstGeom prst="rect">
+                      <a:avLst/>
+                    </a:prstGeom>
+                    <a:noFill/>
+                    <a:ln>
+                      <a:noFill/>
+                    </a:ln>
+                  </pic:spPr>
+                </pic:pic>
+              </a:graphicData>
+            </a:graphic>
           </wp:inline>
         </w:drawing>
       </w:r>
@@ -21590,8 +21574,8 @@
                 <w:noProof/>
                 <w:lang w:eastAsia="fr-FR"/>
               </w:rPr>
-              <mc:AlternateContent>
-                <mc:Choice Requires="wps">
+              <ns1:AlternateContent>
+                <ns1:Choice Requires="wps">
                   <w:drawing>
                     <wp:anchor distT="0" distB="0" distL="114300" distR="114300" simplePos="0" relativeHeight="251668480" behindDoc="0" locked="0" layoutInCell="1" allowOverlap="1" ns4:anchorId="204D920E" ns4:editId="1530E20F">
                       <wp:simplePos x="0" y="0"/>
@@ -21606,37 +21590,37 @@
                       <wp:wrapNone/>
                       <wp:docPr id="81808272" name="Connecteur droit 81808272"/>
                       <wp:cNvGraphicFramePr/>
-                      <ns5:graphic>
-                        <ns5:graphicData uri="http://schemas.microsoft.com/office/word/2010/wordprocessingShape">
-                          <ns7:wsp>
-                            <ns7:cNvCnPr/>
-                            <ns7:spPr>
-                              <ns5:xfrm>
-                                <ns5:off x="0" y="0"/>
-                                <ns5:ext cx="1682804" cy="530198"/>
-                              </ns5:xfrm>
-                              <ns5:prstGeom prst="line">
-                                <ns5:avLst/>
-                              </ns5:prstGeom>
-                            </ns7:spPr>
-                            <ns7:style>
-                              <ns5:lnRef idx="1">
-                                <ns5:schemeClr val="accent1"/>
-                              </ns5:lnRef>
-                              <ns5:fillRef idx="0">
-                                <ns5:schemeClr val="accent1"/>
-                              </ns5:fillRef>
-                              <ns5:effectRef idx="0">
-                                <ns5:schemeClr val="accent1"/>
-                              </ns5:effectRef>
-                              <ns5:fontRef idx="minor">
-                                <ns5:schemeClr val="tx1"/>
-                              </ns5:fontRef>
-                            </ns7:style>
-                            <ns7:bodyPr/>
-                          </ns7:wsp>
-                        </ns5:graphicData>
-                      </ns5:graphic>
+                      <a:graphic>
+                        <a:graphicData uri="http://schemas.microsoft.com/office/word/2010/wordprocessingShape">
+                          <wps:wsp>
+                            <wps:cNvCnPr/>
+                            <wps:spPr>
+                              <a:xfrm>
+                                <a:off x="0" y="0"/>
+                                <a:ext cx="1682804" cy="530198"/>
+                              </a:xfrm>
+                              <a:prstGeom prst="line">
+                                <a:avLst/>
+                              </a:prstGeom>
+                            </wps:spPr>
+                            <wps:style>
+                              <a:lnRef idx="1">
+                                <a:schemeClr val="accent1"/>
+                              </a:lnRef>
+                              <a:fillRef idx="0">
+                                <a:schemeClr val="accent1"/>
+                              </a:fillRef>
+                              <a:effectRef idx="0">
+                                <a:schemeClr val="accent1"/>
+                              </a:effectRef>
+                              <a:fontRef idx="minor">
+                                <a:schemeClr val="tx1"/>
+                              </a:fontRef>
+                            </wps:style>
+                            <wps:bodyPr/>
+                          </wps:wsp>
+                        </a:graphicData>
+                      </a:graphic>
                       <ns4:sizeRelH relativeFrom="margin">
                         <ns4:pctWidth>0</ns4:pctWidth>
                       </ns4:sizeRelH>
@@ -21645,15 +21629,15 @@
                       </ns4:sizeRelV>
                     </wp:anchor>
                   </w:drawing>
-                </mc:Choice>
-                <mc:Fallback>
+                </ns1:Choice>
+                <ns1:Fallback>
                   <w:pict>
-                    <v:line ns2:anchorId="466EDA4C" id="Connecteur droit 81808272" o:spid="_x0000_s1026" style="position:absolute;z-index:251668480;visibility:visible;mso-wrap-style:square;mso-width-percent:0;mso-height-percent:0;mso-wrap-distance-left:9pt;mso-wrap-distance-top:0;mso-wrap-distance-right:9pt;mso-wrap-distance-bottom:0;mso-position-horizontal:absolute;mso-position-horizontal-relative:text;mso-position-vertical:absolute;mso-position-vertical-relative:text;mso-width-percent:0;mso-height-percent:0;mso-width-relative:margin;mso-height-relative:margin" from="-3.9pt,.5pt" to="128.6pt,42.25pt" o:gfxdata="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" strokecolor="#5b9bd5 [3204]" strokeweight=".5pt">
-                      <v:stroke joinstyle="miter"/>
-                    </v:line>
+                    <ns11:line ns2:anchorId="466EDA4C" id="Connecteur droit 81808272" ns12:spid="_x0000_s1026" style="position:absolute;z-index:251668480;visibility:visible;mso-wrap-style:square;mso-width-percent:0;mso-height-percent:0;mso-wrap-distance-left:9pt;mso-wrap-distance-top:0;mso-wrap-distance-right:9pt;mso-wrap-distance-bottom:0;mso-position-horizontal:absolute;mso-position-horizontal-relative:text;mso-position-vertical:absolute;mso-position-vertical-relative:text;mso-width-percent:0;mso-height-percent:0;mso-width-relative:margin;mso-height-relative:margin" from="-3.9pt,.5pt" to="128.6pt,42.25pt" ns12:gfxdata="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" strokecolor="#5b9bd5 [3204]" strokeweight=".5pt">
+                      <ns11:stroke joinstyle="miter"/>
+                    </ns11:line>
                   </w:pict>
-                </mc:Fallback>
-              </mc:AlternateContent>
+                </ns1:Fallback>
+              </ns1:AlternateContent>
             </w:r>
             <w:r>
               <w:rPr/>
@@ -23894,8 +23878,8 @@
           <w:szCs w:val="24"/>
           <w:lang w:eastAsia="fr-FR"/>
         </w:rPr>
-        <mc:AlternateContent>
-          <mc:Choice Requires="wps">
+        <ns1:AlternateContent>
+          <ns1:Choice Requires="wps">
             <w:drawing>
               <wp:anchor distT="0" distB="0" distL="114300" distR="114300" simplePos="0" relativeHeight="251670528" behindDoc="0" locked="0" layoutInCell="1" allowOverlap="1" ns4:anchorId="32DDB414" ns4:editId="2BFBAC07">
                 <wp:simplePos x="0" y="0"/>
@@ -23910,50 +23894,50 @@
                 <wp:wrapNone/>
                 <wp:docPr id="5" name="Hexagone 5"/>
                 <wp:cNvGraphicFramePr/>
-                <ns5:graphic>
-                  <ns5:graphicData uri="http://schemas.microsoft.com/office/word/2010/wordprocessingShape">
-                    <ns7:wsp>
-                      <ns7:cNvSpPr/>
-                      <ns7:spPr>
-                        <ns5:xfrm>
-                          <ns5:off x="0" y="0"/>
-                          <ns5:ext cx="4200024" cy="1860884"/>
-                        </ns5:xfrm>
-                        <ns5:prstGeom prst="hexagon">
-                          <ns5:avLst/>
-                        </ns5:prstGeom>
-                        <ns5:solidFill>
-                          <ns5:schemeClr val="bg2"/>
-                        </ns5:solidFill>
-                        <ns5:ln>
-                          <ns5:solidFill>
-                            <ns5:schemeClr val="tx1">
-                              <ns5:lumMod val="50000"/>
-                              <ns5:lumOff val="50000"/>
-                            </ns5:schemeClr>
-                          </ns5:solidFill>
-                        </ns5:ln>
-                        <ns5:effectLst>
-                          <ns5:innerShdw blurRad="114300">
-                            <ns5:prstClr val="black"/>
-                          </ns5:innerShdw>
-                        </ns5:effectLst>
-                      </ns7:spPr>
-                      <ns7:style>
-                        <ns5:lnRef idx="1">
-                          <ns5:schemeClr val="accent5"/>
-                        </ns5:lnRef>
-                        <ns5:fillRef idx="2">
-                          <ns5:schemeClr val="accent5"/>
-                        </ns5:fillRef>
-                        <ns5:effectRef idx="1">
-                          <ns5:schemeClr val="accent5"/>
-                        </ns5:effectRef>
-                        <ns5:fontRef idx="minor">
-                          <ns5:schemeClr val="dk1"/>
-                        </ns5:fontRef>
-                      </ns7:style>
-                      <ns7:txbx>
+                <a:graphic>
+                  <a:graphicData uri="http://schemas.microsoft.com/office/word/2010/wordprocessingShape">
+                    <wps:wsp>
+                      <wps:cNvSpPr/>
+                      <wps:spPr>
+                        <a:xfrm>
+                          <a:off x="0" y="0"/>
+                          <a:ext cx="4200024" cy="1860884"/>
+                        </a:xfrm>
+                        <a:prstGeom prst="hexagon">
+                          <a:avLst/>
+                        </a:prstGeom>
+                        <a:solidFill>
+                          <a:schemeClr val="bg2"/>
+                        </a:solidFill>
+                        <a:ln>
+                          <a:solidFill>
+                            <a:schemeClr val="tx1">
+                              <a:lumMod val="50000"/>
+                              <a:lumOff val="50000"/>
+                            </a:schemeClr>
+                          </a:solidFill>
+                        </a:ln>
+                        <a:effectLst>
+                          <a:innerShdw blurRad="114300">
+                            <a:prstClr val="black"/>
+                          </a:innerShdw>
+                        </a:effectLst>
+                      </wps:spPr>
+                      <wps:style>
+                        <a:lnRef idx="1">
+                          <a:schemeClr val="accent5"/>
+                        </a:lnRef>
+                        <a:fillRef idx="2">
+                          <a:schemeClr val="accent5"/>
+                        </a:fillRef>
+                        <a:effectRef idx="1">
+                          <a:schemeClr val="accent5"/>
+                        </a:effectRef>
+                        <a:fontRef idx="minor">
+                          <a:schemeClr val="dk1"/>
+                        </a:fontRef>
+                      </wps:style>
+                      <wps:txbx>
                         <w:txbxContent>
                           <w:p ns2:paraId="7015052D" ns2:textId="77777777">
                             <w:pPr>
@@ -24065,16 +24049,16 @@
                             </w:pPr>
                           </w:p>
                         </w:txbxContent>
-                      </ns7:txbx>
-                      <ns7:bodyPr rot="0" spcFirstLastPara="0" vertOverflow="overflow" horzOverflow="overflow" vert="horz" wrap="square" lIns="91440" tIns="45720" rIns="91440" bIns="45720" numCol="1" spcCol="0" rtlCol="0" fromWordArt="0" anchor="ctr" anchorCtr="0" forceAA="0" compatLnSpc="1">
-                        <ns5:prstTxWarp prst="textNoShape">
-                          <ns5:avLst/>
-                        </ns5:prstTxWarp>
-                        <ns5:noAutofit/>
-                      </ns7:bodyPr>
-                    </ns7:wsp>
-                  </ns5:graphicData>
-                </ns5:graphic>
+                      </wps:txbx>
+                      <wps:bodyPr rot="0" spcFirstLastPara="0" vertOverflow="overflow" horzOverflow="overflow" vert="horz" wrap="square" lIns="91440" tIns="45720" rIns="91440" bIns="45720" numCol="1" spcCol="0" rtlCol="0" fromWordArt="0" anchor="ctr" anchorCtr="0" forceAA="0" compatLnSpc="1">
+                        <a:prstTxWarp prst="textNoShape">
+                          <a:avLst/>
+                        </a:prstTxWarp>
+                        <a:noAutofit/>
+                      </wps:bodyPr>
+                    </wps:wsp>
+                  </a:graphicData>
+                </a:graphic>
                 <ns4:sizeRelH relativeFrom="margin">
                   <ns4:pctWidth>0</ns4:pctWidth>
                 </ns4:sizeRelH>
@@ -24083,11 +24067,11 @@
                 </ns4:sizeRelV>
               </wp:anchor>
             </w:drawing>
-          </mc:Choice>
-          <mc:Fallback>
+          </ns1:Choice>
+          <ns1:Fallback>
             <w:pict>
-              <v:shape ns2:anchorId="32DDB414" id="Hexagone 5" o:spid="_x0000_s1045" type="#_x0000_t9" style="position:absolute;left:0;text-align:left;margin-left:54.7pt;margin-top:152.75pt;width:330.7pt;height:146.55pt;z-index:251670528;visibility:visible;mso-wrap-style:square;mso-width-percent:0;mso-height-percent:0;mso-wrap-distance-left:9pt;mso-wrap-distance-top:0;mso-wrap-distance-right:9pt;mso-wrap-distance-bottom:0;mso-position-horizontal:absolute;mso-position-horizontal-relative:text;mso-position-vertical:absolute;mso-position-vertical-relative:text;mso-width-percent:0;mso-height-percent:0;mso-width-relative:margin;mso-height-relative:margin;v-text-anchor:middle" o:gfxdata="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" adj="2393" fillcolor="#e7e6e6 [3214]" strokecolor="gray [1629]" strokeweight=".5pt">
-                <v:textbox>
+              <ns11:shape ns2:anchorId="32DDB414" id="Hexagone 5" ns12:spid="_x0000_s1045" type="#_x0000_t9" style="position:absolute;left:0;text-align:left;margin-left:54.7pt;margin-top:152.75pt;width:330.7pt;height:146.55pt;z-index:251670528;visibility:visible;mso-wrap-style:square;mso-width-percent:0;mso-height-percent:0;mso-wrap-distance-left:9pt;mso-wrap-distance-top:0;mso-wrap-distance-right:9pt;mso-wrap-distance-bottom:0;mso-position-horizontal:absolute;mso-position-horizontal-relative:text;mso-position-vertical:absolute;mso-position-vertical-relative:text;mso-width-percent:0;mso-height-percent:0;mso-width-relative:margin;mso-height-relative:margin;v-text-anchor:middle" ns12:gfxdata="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" adj="2393" fillcolor="#e7e6e6 [3214]" strokecolor="gray [1629]" strokeweight=".5pt">
+                <ns11:textbox>
                   <w:txbxContent>
                     <w:p ns2:paraId="7015052D" ns2:textId="77777777">
                       <w:pPr>
@@ -24199,11 +24183,11 @@
                       </w:pPr>
                     </w:p>
                   </w:txbxContent>
-                </v:textbox>
-              </v:shape>
+                </ns11:textbox>
+              </ns11:shape>
             </w:pict>
-          </mc:Fallback>
-        </mc:AlternateContent>
+          </ns1:Fallback>
+        </ns1:AlternateContent>
       </w:r>
       <w:r>
         <w:rPr>
@@ -32970,8 +32954,8 @@
           <w:szCs w:val="24"/>
           <w:lang w:eastAsia="fr-FR"/>
         </w:rPr>
-        <mc:AlternateContent>
-          <mc:Choice Requires="wps">
+        <ns1:AlternateContent>
+          <ns1:Choice Requires="wps">
             <w:drawing>
               <wp:anchor distT="0" distB="0" distL="114300" distR="114300" simplePos="0" relativeHeight="251672576" behindDoc="0" locked="0" layoutInCell="1" allowOverlap="1" ns4:anchorId="32B4755B" ns4:editId="01F0F7E8">
                 <wp:simplePos x="0" y="0"/>
@@ -32986,50 +32970,50 @@
                 <wp:wrapNone/>
                 <wp:docPr id="10" name="Hexagone 10"/>
                 <wp:cNvGraphicFramePr/>
-                <ns5:graphic>
-                  <ns5:graphicData uri="http://schemas.microsoft.com/office/word/2010/wordprocessingShape">
-                    <ns7:wsp>
-                      <ns7:cNvSpPr/>
-                      <ns7:spPr>
-                        <ns5:xfrm>
-                          <ns5:off x="0" y="0"/>
-                          <ns5:ext cx="5683919" cy="2935706"/>
-                        </ns5:xfrm>
-                        <ns5:prstGeom prst="hexagon">
-                          <ns5:avLst/>
-                        </ns5:prstGeom>
-                        <ns5:solidFill>
-                          <ns5:schemeClr val="bg2"/>
-                        </ns5:solidFill>
-                        <ns5:ln>
-                          <ns5:solidFill>
-                            <ns5:schemeClr val="tx1">
-                              <ns5:lumMod val="50000"/>
-                              <ns5:lumOff val="50000"/>
-                            </ns5:schemeClr>
-                          </ns5:solidFill>
-                        </ns5:ln>
-                        <ns5:effectLst>
-                          <ns5:innerShdw blurRad="114300">
-                            <ns5:prstClr val="black"/>
-                          </ns5:innerShdw>
-                        </ns5:effectLst>
-                      </ns7:spPr>
-                      <ns7:style>
-                        <ns5:lnRef idx="1">
-                          <ns5:schemeClr val="accent5"/>
-                        </ns5:lnRef>
-                        <ns5:fillRef idx="2">
-                          <ns5:schemeClr val="accent5"/>
-                        </ns5:fillRef>
-                        <ns5:effectRef idx="1">
-                          <ns5:schemeClr val="accent5"/>
-                        </ns5:effectRef>
-                        <ns5:fontRef idx="minor">
-                          <ns5:schemeClr val="dk1"/>
-                        </ns5:fontRef>
-                      </ns7:style>
-                      <ns7:txbx>
+                <a:graphic>
+                  <a:graphicData uri="http://schemas.microsoft.com/office/word/2010/wordprocessingShape">
+                    <wps:wsp>
+                      <wps:cNvSpPr/>
+                      <wps:spPr>
+                        <a:xfrm>
+                          <a:off x="0" y="0"/>
+                          <a:ext cx="5683919" cy="2935706"/>
+                        </a:xfrm>
+                        <a:prstGeom prst="hexagon">
+                          <a:avLst/>
+                        </a:prstGeom>
+                        <a:solidFill>
+                          <a:schemeClr val="bg2"/>
+                        </a:solidFill>
+                        <a:ln>
+                          <a:solidFill>
+                            <a:schemeClr val="tx1">
+                              <a:lumMod val="50000"/>
+                              <a:lumOff val="50000"/>
+                            </a:schemeClr>
+                          </a:solidFill>
+                        </a:ln>
+                        <a:effectLst>
+                          <a:innerShdw blurRad="114300">
+                            <a:prstClr val="black"/>
+                          </a:innerShdw>
+                        </a:effectLst>
+                      </wps:spPr>
+                      <wps:style>
+                        <a:lnRef idx="1">
+                          <a:schemeClr val="accent5"/>
+                        </a:lnRef>
+                        <a:fillRef idx="2">
+                          <a:schemeClr val="accent5"/>
+                        </a:fillRef>
+                        <a:effectRef idx="1">
+                          <a:schemeClr val="accent5"/>
+                        </a:effectRef>
+                        <a:fontRef idx="minor">
+                          <a:schemeClr val="dk1"/>
+                        </a:fontRef>
+                      </wps:style>
+                      <wps:txbx>
                         <w:txbxContent>
                           <w:p ns2:paraId="7F8011E6" ns2:textId="77777777">
                             <w:pPr>
@@ -33149,16 +33133,16 @@
                             </w:pPr>
                           </w:p>
                         </w:txbxContent>
-                      </ns7:txbx>
-                      <ns7:bodyPr rot="0" spcFirstLastPara="0" vertOverflow="overflow" horzOverflow="overflow" vert="horz" wrap="square" lIns="91440" tIns="45720" rIns="91440" bIns="45720" numCol="1" spcCol="0" rtlCol="0" fromWordArt="0" anchor="ctr" anchorCtr="0" forceAA="0" compatLnSpc="1">
-                        <ns5:prstTxWarp prst="textNoShape">
-                          <ns5:avLst/>
-                        </ns5:prstTxWarp>
-                        <ns5:noAutofit/>
-                      </ns7:bodyPr>
-                    </ns7:wsp>
-                  </ns5:graphicData>
-                </ns5:graphic>
+                      </wps:txbx>
+                      <wps:bodyPr rot="0" spcFirstLastPara="0" vertOverflow="overflow" horzOverflow="overflow" vert="horz" wrap="square" lIns="91440" tIns="45720" rIns="91440" bIns="45720" numCol="1" spcCol="0" rtlCol="0" fromWordArt="0" anchor="ctr" anchorCtr="0" forceAA="0" compatLnSpc="1">
+                        <a:prstTxWarp prst="textNoShape">
+                          <a:avLst/>
+                        </a:prstTxWarp>
+                        <a:noAutofit/>
+                      </wps:bodyPr>
+                    </wps:wsp>
+                  </a:graphicData>
+                </a:graphic>
                 <ns4:sizeRelH relativeFrom="margin">
                   <ns4:pctWidth>0</ns4:pctWidth>
                 </ns4:sizeRelH>
@@ -33167,11 +33151,11 @@
                 </ns4:sizeRelV>
               </wp:anchor>
             </w:drawing>
-          </mc:Choice>
-          <mc:Fallback>
+          </ns1:Choice>
+          <ns1:Fallback>
             <w:pict>
-              <v:shape ns2:anchorId="32B4755B" id="Hexagone 10" o:spid="_x0000_s1046" type="#_x0000_t9" style="position:absolute;left:0;text-align:left;margin-left:8.6pt;margin-top:96.55pt;width:447.55pt;height:231.15pt;z-index:251672576;visibility:visible;mso-wrap-style:square;mso-width-percent:0;mso-height-percent:0;mso-wrap-distance-left:9pt;mso-wrap-distance-top:0;mso-wrap-distance-right:9pt;mso-wrap-distance-bottom:0;mso-position-horizontal:absolute;mso-position-horizontal-relative:text;mso-position-vertical:absolute;mso-position-vertical-relative:text;mso-width-percent:0;mso-height-percent:0;mso-width-relative:margin;mso-height-relative:margin;v-text-anchor:middle" o:gfxdata="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" adj="2789" fillcolor="#e7e6e6 [3214]" strokecolor="gray [1629]" strokeweight=".5pt">
-                <v:textbox>
+              <ns11:shape ns2:anchorId="32B4755B" id="Hexagone 10" ns12:spid="_x0000_s1046" type="#_x0000_t9" style="position:absolute;left:0;text-align:left;margin-left:8.6pt;margin-top:96.55pt;width:447.55pt;height:231.15pt;z-index:251672576;visibility:visible;mso-wrap-style:square;mso-width-percent:0;mso-height-percent:0;mso-wrap-distance-left:9pt;mso-wrap-distance-top:0;mso-wrap-distance-right:9pt;mso-wrap-distance-bottom:0;mso-position-horizontal:absolute;mso-position-horizontal-relative:text;mso-position-vertical:absolute;mso-position-vertical-relative:text;mso-width-percent:0;mso-height-percent:0;mso-width-relative:margin;mso-height-relative:margin;v-text-anchor:middle" ns12:gfxdata="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" adj="2789" fillcolor="#e7e6e6 [3214]" strokecolor="gray [1629]" strokeweight=".5pt">
+                <ns11:textbox>
                   <w:txbxContent>
                     <w:p ns2:paraId="7F8011E6" ns2:textId="77777777">
                       <w:pPr>
@@ -33291,11 +33275,11 @@
                       </w:pPr>
                     </w:p>
                   </w:txbxContent>
-                </v:textbox>
-              </v:shape>
+                </ns11:textbox>
+              </ns11:shape>
             </w:pict>
-          </mc:Fallback>
-        </mc:AlternateContent>
+          </ns1:Fallback>
+        </ns1:AlternateContent>
       </w:r>
       <w:r>
         <w:rPr>
@@ -46392,13 +46376,14 @@
     </w:p>
     <w:p ns2:paraId="1E214344" ns2:textId="4A787341">
       <w:pPr>
+        <w:keepNext/>
         <w:tabs>
           <w:tab w:val="left" w:pos="6190"/>
         </w:tabs>
         <w:widowControl/>
         <w:spacing w:before="0" w:after="0" w:line="360" w:lineRule="auto"/>
         <w:ind w:firstLine="0"/>
-        <w:jc w:val="both"/>
+        <w:jc w:val="center"/>
         <w:rPr>
           <w:rFonts w:cstheme="minorHAnsi" w:ascii="Times New Roman" w:hAnsi="Times New Roman" w:cs="Times New Roman" w:eastAsia="Times New Roman"/>
           <w:sz w:val="24"/>
@@ -46415,37 +46400,37 @@
         </w:rPr>
         <w:drawing>
           <wp:inline distT="0" distB="0" distL="0" distR="0" ns4:anchorId="45039B84" ns4:editId="0FE15AB8">
-            <wp:extent cx="6675120" cy="5707380"/>
+            <wp:extent cx="5580380" cy="3150938"/>
             <wp:effectExtent l="0" t="0" r="0" b="7620"/>
             <wp:docPr id="748763123" name="Image 1"/>
             <wp:cNvGraphicFramePr>
-              <ns5:graphicFrameLocks noChangeAspect="1"/>
+              <a:graphicFrameLocks noChangeAspect="1"/>
             </wp:cNvGraphicFramePr>
-            <ns5:graphic>
-              <ns5:graphicData uri="http://schemas.openxmlformats.org/drawingml/2006/picture">
-                <ns9:pic>
-                  <ns9:nvPicPr>
-                    <ns9:cNvPr id="748763123" name=""/>
-                    <ns9:cNvPicPr/>
-                  </ns9:nvPicPr>
-                  <ns9:blipFill>
-                    <ns5:blip r:embed="rId16"/>
-                    <ns5:stretch>
-                      <ns5:fillRect/>
-                    </ns5:stretch>
-                  </ns9:blipFill>
-                  <ns9:spPr>
-                    <ns5:xfrm>
-                      <ns5:off x="0" y="0"/>
-                      <ns5:ext cx="6675120" cy="5707380"/>
-                    </ns5:xfrm>
-                    <ns5:prstGeom prst="rect">
-                      <ns5:avLst/>
-                    </ns5:prstGeom>
-                  </ns9:spPr>
-                </ns9:pic>
-              </ns5:graphicData>
-            </ns5:graphic>
+            <a:graphic>
+              <a:graphicData uri="http://schemas.openxmlformats.org/drawingml/2006/picture">
+                <pic:pic>
+                  <pic:nvPicPr>
+                    <pic:cNvPr id="748763123" name=""/>
+                    <pic:cNvPicPr/>
+                  </pic:nvPicPr>
+                  <pic:blipFill>
+                    <a:blip r:embed="rId16"/>
+                    <a:stretch>
+                      <a:fillRect/>
+                    </a:stretch>
+                  </pic:blipFill>
+                  <pic:spPr>
+                    <a:xfrm>
+                      <a:off x="0" y="0"/>
+                      <a:ext cx="5580380" cy="3150938"/>
+                    </a:xfrm>
+                    <a:prstGeom prst="rect">
+                      <a:avLst/>
+                    </a:prstGeom>
+                  </pic:spPr>
+                </pic:pic>
+              </a:graphicData>
+            </a:graphic>
           </wp:inline>
         </w:drawing>
       </w:r>

</xml_diff>

<commit_message>
Harmonisation des sources des illustrations
</commit_message>
<xml_diff>
--- a/doc.docx
+++ b/doc.docx
@@ -1,6 +1,6 @@
 
 <file path=word/document.xml><?xml version="1.0" encoding="utf-8"?>
-<w:document xmlns:a="http://schemas.openxmlformats.org/drawingml/2006/main" xmlns:ns1="http://schemas.openxmlformats.org/markup-compatibility/2006" xmlns:ns11="urn:schemas-microsoft-com:vml" xmlns:ns12="urn:schemas-microsoft-com:office:office" xmlns:ns13="urn:schemas-microsoft-com:office:word" xmlns:ns2="http://schemas.microsoft.com/office/word/2010/wordml" xmlns:ns4="http://schemas.microsoft.com/office/word/2010/wordprocessingDrawing" xmlns:ns6="http://schemas.microsoft.com/office/word/2010/wordprocessingGroup" xmlns:ns8="http://schemas.microsoft.com/office/drawing/2010/main" xmlns:pic="http://schemas.openxmlformats.org/drawingml/2006/picture" xmlns:r="http://schemas.openxmlformats.org/officeDocument/2006/relationships" xmlns:w="http://schemas.openxmlformats.org/wordprocessingml/2006/main" xmlns:wp="http://schemas.openxmlformats.org/drawingml/2006/wordprocessingDrawing" xmlns:wps="http://schemas.microsoft.com/office/word/2010/wordprocessingShape" ns1:Ignorable="w14 w15 w16se wp14">
+<w:document xmlns:ns1="http://schemas.openxmlformats.org/markup-compatibility/2006" xmlns:ns10="http://schemas.openxmlformats.org/officeDocument/2006/relationships" xmlns:ns11="urn:schemas-microsoft-com:vml" xmlns:ns12="urn:schemas-microsoft-com:office:office" xmlns:ns13="urn:schemas-microsoft-com:office:word" xmlns:ns2="http://schemas.microsoft.com/office/word/2010/wordml" xmlns:ns3="http://schemas.openxmlformats.org/drawingml/2006/wordprocessingDrawing" xmlns:ns4="http://schemas.microsoft.com/office/word/2010/wordprocessingDrawing" xmlns:ns5="http://schemas.openxmlformats.org/drawingml/2006/main" xmlns:ns6="http://schemas.microsoft.com/office/word/2010/wordprocessingGroup" xmlns:ns7="http://schemas.microsoft.com/office/word/2010/wordprocessingShape" xmlns:ns8="http://schemas.microsoft.com/office/drawing/2010/main" xmlns:ns9="http://schemas.openxmlformats.org/drawingml/2006/picture" xmlns:w="http://schemas.openxmlformats.org/wordprocessingml/2006/main" ns1:Ignorable="w14 w15 w16se wp14">
   <w:body>
     <w:p ns2:paraId="7AB3675A" ns2:textId="77777777">
       <w:pPr>
@@ -39,244 +39,244 @@
         <ns1:AlternateContent>
           <ns1:Choice Requires="wpg">
             <w:drawing>
-              <wp:anchor distT="0" distB="0" distL="114300" distR="114300" simplePos="0" relativeHeight="251648000" behindDoc="1" locked="0" layoutInCell="1" allowOverlap="1" ns4:anchorId="4BAE0E57" ns4:editId="729E2BD9">
-                <wp:simplePos x="0" y="0"/>
-                <wp:positionH relativeFrom="margin">
-                  <wp:posOffset>-167640</wp:posOffset>
-                </wp:positionH>
-                <wp:positionV relativeFrom="paragraph">
-                  <wp:posOffset>208915</wp:posOffset>
-                </wp:positionV>
-                <wp:extent cx="2230120" cy="956310"/>
-                <wp:effectExtent l="0" t="0" r="0" b="0"/>
-                <wp:wrapNone/>
-                <wp:docPr id="9" name="Groupe 9"/>
-                <wp:cNvGraphicFramePr/>
-                <a:graphic>
-                  <a:graphicData uri="http://schemas.microsoft.com/office/word/2010/wordprocessingGroup">
+              <ns3:anchor distT="0" distB="0" distL="114300" distR="114300" simplePos="0" relativeHeight="251648000" behindDoc="1" locked="0" layoutInCell="1" allowOverlap="1" ns4:anchorId="4BAE0E57" ns4:editId="729E2BD9">
+                <ns3:simplePos x="0" y="0"/>
+                <ns3:positionH relativeFrom="margin">
+                  <ns3:posOffset>-167640</ns3:posOffset>
+                </ns3:positionH>
+                <ns3:positionV relativeFrom="paragraph">
+                  <ns3:posOffset>208915</ns3:posOffset>
+                </ns3:positionV>
+                <ns3:extent cx="2230120" cy="956310"/>
+                <ns3:effectExtent l="0" t="0" r="0" b="0"/>
+                <ns3:wrapNone/>
+                <ns3:docPr id="9" name="Groupe 9"/>
+                <ns3:cNvGraphicFramePr/>
+                <ns5:graphic>
+                  <ns5:graphicData uri="http://schemas.microsoft.com/office/word/2010/wordprocessingGroup">
                     <ns6:wgp>
                       <ns6:cNvGrpSpPr/>
                       <ns6:grpSpPr bwMode="auto">
-                        <a:xfrm>
-                          <a:off x="0" y="0"/>
-                          <a:ext cx="2230120" cy="956310"/>
-                          <a:chOff x="0" y="0"/>
-                          <a:chExt cx="22333" cy="10408"/>
-                        </a:xfrm>
+                        <ns5:xfrm>
+                          <ns5:off x="0" y="0"/>
+                          <ns5:ext cx="2230120" cy="956310"/>
+                          <ns5:chOff x="0" y="0"/>
+                          <ns5:chExt cx="22333" cy="10408"/>
+                        </ns5:xfrm>
                       </ns6:grpSpPr>
                       <ns6:grpSp>
                         <ns6:cNvPr id="12" name="Group 5"/>
                         <ns6:cNvGrpSpPr>
-                          <a:grpSpLocks/>
+                          <ns5:grpSpLocks/>
                         </ns6:cNvGrpSpPr>
                         <ns6:grpSpPr bwMode="auto">
-                          <a:xfrm flipV="1">
-                            <a:off x="7415" y="6065"/>
-                            <a:ext cx="12739" cy="788"/>
-                            <a:chOff x="7415" y="6065"/>
-                            <a:chExt cx="586" cy="50"/>
-                          </a:xfrm>
+                          <ns5:xfrm flipV="1">
+                            <ns5:off x="7415" y="6065"/>
+                            <ns5:ext cx="12739" cy="788"/>
+                            <ns5:chOff x="7415" y="6065"/>
+                            <ns5:chExt cx="586" cy="50"/>
+                          </ns5:xfrm>
                         </ns6:grpSpPr>
-                        <wps:wsp>
-                          <wps:cNvPr id="17" name="Rectangle 17"/>
-                          <wps:cNvSpPr>
-                            <a:spLocks noChangeArrowheads="1"/>
-                          </wps:cNvSpPr>
-                          <wps:spPr bwMode="auto">
-                            <a:xfrm>
-                              <a:off x="7415" y="6086"/>
-                              <a:ext cx="210" cy="29"/>
-                            </a:xfrm>
-                            <a:prstGeom prst="rect">
-                              <a:avLst/>
-                            </a:prstGeom>
-                            <a:solidFill>
-                              <a:srgbClr val="00B050"/>
-                            </a:solidFill>
-                            <a:ln>
-                              <a:noFill/>
-                            </a:ln>
-                            <a:extLst>
-                              <a:ext uri="{91240B29-F687-4F45-9708-019B960494DF}">
+                        <ns7:wsp>
+                          <ns7:cNvPr id="17" name="Rectangle 17"/>
+                          <ns7:cNvSpPr>
+                            <ns5:spLocks noChangeArrowheads="1"/>
+                          </ns7:cNvSpPr>
+                          <ns7:spPr bwMode="auto">
+                            <ns5:xfrm>
+                              <ns5:off x="7415" y="6086"/>
+                              <ns5:ext cx="210" cy="29"/>
+                            </ns5:xfrm>
+                            <ns5:prstGeom prst="rect">
+                              <ns5:avLst/>
+                            </ns5:prstGeom>
+                            <ns5:solidFill>
+                              <ns5:srgbClr val="00B050"/>
+                            </ns5:solidFill>
+                            <ns5:ln>
+                              <ns5:noFill/>
+                            </ns5:ln>
+                            <ns5:extLst>
+                              <ns5:ext uri="{91240B29-F687-4F45-9708-019B960494DF}">
                                 <ns8:hiddenLine w="9525">
-                                  <a:solidFill>
-                                    <a:srgbClr val="000000"/>
-                                  </a:solidFill>
-                                  <a:miter lim="800000"/>
-                                  <a:headEnd/>
-                                  <a:tailEnd/>
+                                  <ns5:solidFill>
+                                    <ns5:srgbClr val="000000"/>
+                                  </ns5:solidFill>
+                                  <ns5:miter lim="800000"/>
+                                  <ns5:headEnd/>
+                                  <ns5:tailEnd/>
                                 </ns8:hiddenLine>
-                              </a:ext>
-                            </a:extLst>
-                          </wps:spPr>
-                          <wps:bodyPr rot="0" vert="horz" wrap="square" lIns="36576" tIns="36576" rIns="36576" bIns="36576" anchor="t" anchorCtr="0" upright="1">
-                            <a:noAutofit/>
-                          </wps:bodyPr>
-                        </wps:wsp>
-                        <wps:wsp>
-                          <wps:cNvPr id="18" name="Rectangle 18"/>
-                          <wps:cNvSpPr>
-                            <a:spLocks noChangeArrowheads="1"/>
-                          </wps:cNvSpPr>
-                          <wps:spPr bwMode="auto">
-                            <a:xfrm>
-                              <a:off x="7580" y="6086"/>
-                              <a:ext cx="211" cy="29"/>
-                            </a:xfrm>
-                            <a:prstGeom prst="rect">
-                              <a:avLst/>
-                            </a:prstGeom>
-                            <a:solidFill>
-                              <a:srgbClr val="FFFF00"/>
-                            </a:solidFill>
-                            <a:ln>
-                              <a:noFill/>
-                            </a:ln>
-                            <a:extLst>
-                              <a:ext uri="{91240B29-F687-4F45-9708-019B960494DF}">
+                              </ns5:ext>
+                            </ns5:extLst>
+                          </ns7:spPr>
+                          <ns7:bodyPr rot="0" vert="horz" wrap="square" lIns="36576" tIns="36576" rIns="36576" bIns="36576" anchor="t" anchorCtr="0" upright="1">
+                            <ns5:noAutofit/>
+                          </ns7:bodyPr>
+                        </ns7:wsp>
+                        <ns7:wsp>
+                          <ns7:cNvPr id="18" name="Rectangle 18"/>
+                          <ns7:cNvSpPr>
+                            <ns5:spLocks noChangeArrowheads="1"/>
+                          </ns7:cNvSpPr>
+                          <ns7:spPr bwMode="auto">
+                            <ns5:xfrm>
+                              <ns5:off x="7580" y="6086"/>
+                              <ns5:ext cx="211" cy="29"/>
+                            </ns5:xfrm>
+                            <ns5:prstGeom prst="rect">
+                              <ns5:avLst/>
+                            </ns5:prstGeom>
+                            <ns5:solidFill>
+                              <ns5:srgbClr val="FFFF00"/>
+                            </ns5:solidFill>
+                            <ns5:ln>
+                              <ns5:noFill/>
+                            </ns5:ln>
+                            <ns5:extLst>
+                              <ns5:ext uri="{91240B29-F687-4F45-9708-019B960494DF}">
                                 <ns8:hiddenLine w="9525">
-                                  <a:solidFill>
-                                    <a:srgbClr val="000000"/>
-                                  </a:solidFill>
-                                  <a:miter lim="800000"/>
-                                  <a:headEnd/>
-                                  <a:tailEnd/>
+                                  <ns5:solidFill>
+                                    <ns5:srgbClr val="000000"/>
+                                  </ns5:solidFill>
+                                  <ns5:miter lim="800000"/>
+                                  <ns5:headEnd/>
+                                  <ns5:tailEnd/>
                                 </ns8:hiddenLine>
-                              </a:ext>
-                            </a:extLst>
-                          </wps:spPr>
-                          <wps:bodyPr rot="0" vert="horz" wrap="square" lIns="36576" tIns="36576" rIns="36576" bIns="36576" anchor="t" anchorCtr="0" upright="1">
-                            <a:noAutofit/>
-                          </wps:bodyPr>
-                        </wps:wsp>
-                        <wps:wsp>
-                          <wps:cNvPr id="19" name="Rectangle 19"/>
-                          <wps:cNvSpPr>
-                            <a:spLocks noChangeArrowheads="1"/>
-                          </wps:cNvSpPr>
-                          <wps:spPr bwMode="auto">
-                            <a:xfrm>
-                              <a:off x="7791" y="6065"/>
-                              <a:ext cx="210" cy="29"/>
-                            </a:xfrm>
-                            <a:prstGeom prst="rect">
-                              <a:avLst/>
-                            </a:prstGeom>
-                            <a:solidFill>
-                              <a:srgbClr val="FF0000"/>
-                            </a:solidFill>
-                            <a:ln>
-                              <a:noFill/>
-                            </a:ln>
-                            <a:extLst>
-                              <a:ext uri="{91240B29-F687-4F45-9708-019B960494DF}">
+                              </ns5:ext>
+                            </ns5:extLst>
+                          </ns7:spPr>
+                          <ns7:bodyPr rot="0" vert="horz" wrap="square" lIns="36576" tIns="36576" rIns="36576" bIns="36576" anchor="t" anchorCtr="0" upright="1">
+                            <ns5:noAutofit/>
+                          </ns7:bodyPr>
+                        </ns7:wsp>
+                        <ns7:wsp>
+                          <ns7:cNvPr id="19" name="Rectangle 19"/>
+                          <ns7:cNvSpPr>
+                            <ns5:spLocks noChangeArrowheads="1"/>
+                          </ns7:cNvSpPr>
+                          <ns7:spPr bwMode="auto">
+                            <ns5:xfrm>
+                              <ns5:off x="7791" y="6065"/>
+                              <ns5:ext cx="210" cy="29"/>
+                            </ns5:xfrm>
+                            <ns5:prstGeom prst="rect">
+                              <ns5:avLst/>
+                            </ns5:prstGeom>
+                            <ns5:solidFill>
+                              <ns5:srgbClr val="FF0000"/>
+                            </ns5:solidFill>
+                            <ns5:ln>
+                              <ns5:noFill/>
+                            </ns5:ln>
+                            <ns5:extLst>
+                              <ns5:ext uri="{91240B29-F687-4F45-9708-019B960494DF}">
                                 <ns8:hiddenLine w="9525">
-                                  <a:solidFill>
-                                    <a:srgbClr val="000000"/>
-                                  </a:solidFill>
-                                  <a:miter lim="800000"/>
-                                  <a:headEnd/>
-                                  <a:tailEnd/>
+                                  <ns5:solidFill>
+                                    <ns5:srgbClr val="000000"/>
+                                  </ns5:solidFill>
+                                  <ns5:miter lim="800000"/>
+                                  <ns5:headEnd/>
+                                  <ns5:tailEnd/>
                                 </ns8:hiddenLine>
-                              </a:ext>
-                            </a:extLst>
-                          </wps:spPr>
-                          <wps:bodyPr rot="0" vert="horz" wrap="square" lIns="36576" tIns="36576" rIns="36576" bIns="36576" anchor="t" anchorCtr="0" upright="1">
-                            <a:noAutofit/>
-                          </wps:bodyPr>
-                        </wps:wsp>
+                              </ns5:ext>
+                            </ns5:extLst>
+                          </ns7:spPr>
+                          <ns7:bodyPr rot="0" vert="horz" wrap="square" lIns="36576" tIns="36576" rIns="36576" bIns="36576" anchor="t" anchorCtr="0" upright="1">
+                            <ns5:noAutofit/>
+                          </ns7:bodyPr>
+                        </ns7:wsp>
                       </ns6:grpSp>
                       <ns6:grpSp>
                         <ns6:cNvPr id="13" name="Groupe 13"/>
                         <ns6:cNvGrpSpPr>
-                          <a:grpSpLocks/>
+                          <ns5:grpSpLocks/>
                         </ns6:cNvGrpSpPr>
                         <ns6:grpSpPr bwMode="auto">
-                          <a:xfrm>
-                            <a:off x="0" y="0"/>
-                            <a:ext cx="22333" cy="10408"/>
-                            <a:chOff x="0" y="0"/>
-                            <a:chExt cx="22333" cy="10408"/>
-                          </a:xfrm>
+                          <ns5:xfrm>
+                            <ns5:off x="0" y="0"/>
+                            <ns5:ext cx="22333" cy="10408"/>
+                            <ns5:chOff x="0" y="0"/>
+                            <ns5:chExt cx="22333" cy="10408"/>
+                          </ns5:xfrm>
                         </ns6:grpSpPr>
-                        <pic:pic>
-                          <pic:nvPicPr>
-                            <pic:cNvPr id="14" name="Picture 3"/>
-                            <pic:cNvPicPr>
-                              <a:picLocks noChangeAspect="1"/>
-                            </pic:cNvPicPr>
-                          </pic:nvPicPr>
-                          <pic:blipFill>
-                            <a:blip r:embed="rId7" cstate="print">
-                              <a:extLst>
-                                <a:ext uri="{28A0092B-C50C-407E-A947-70E740481C1C}">
+                        <ns9:pic>
+                          <ns9:nvPicPr>
+                            <ns9:cNvPr id="14" name="Picture 3"/>
+                            <ns9:cNvPicPr>
+                              <ns5:picLocks noChangeAspect="1"/>
+                            </ns9:cNvPicPr>
+                          </ns9:nvPicPr>
+                          <ns9:blipFill>
+                            <ns5:blip ns10:embed="rId7" cstate="print">
+                              <ns5:extLst>
+                                <ns5:ext uri="{28A0092B-C50C-407E-A947-70E740481C1C}">
                                   <ns8:useLocalDpi val="0"/>
-                                </a:ext>
-                              </a:extLst>
-                            </a:blip>
-                            <a:srcRect/>
-                            <a:stretch>
-                              <a:fillRect/>
-                            </a:stretch>
-                          </pic:blipFill>
-                          <pic:spPr bwMode="auto">
-                            <a:xfrm>
-                              <a:off x="0" y="0"/>
-                              <a:ext cx="6813" cy="6204"/>
-                            </a:xfrm>
-                            <a:prstGeom prst="rect">
-                              <a:avLst/>
-                            </a:prstGeom>
-                            <a:noFill/>
-                            <a:extLst>
-                              <a:ext uri="{909E8E84-426E-40DD-AFC4-6F175D3DCCD1}">
+                                </ns5:ext>
+                              </ns5:extLst>
+                            </ns5:blip>
+                            <ns5:srcRect/>
+                            <ns5:stretch>
+                              <ns5:fillRect/>
+                            </ns5:stretch>
+                          </ns9:blipFill>
+                          <ns9:spPr bwMode="auto">
+                            <ns5:xfrm>
+                              <ns5:off x="0" y="0"/>
+                              <ns5:ext cx="6813" cy="6204"/>
+                            </ns5:xfrm>
+                            <ns5:prstGeom prst="rect">
+                              <ns5:avLst/>
+                            </ns5:prstGeom>
+                            <ns5:noFill/>
+                            <ns5:extLst>
+                              <ns5:ext uri="{909E8E84-426E-40DD-AFC4-6F175D3DCCD1}">
                                 <ns8:hiddenFill>
-                                  <a:solidFill>
-                                    <a:srgbClr val="FFFFFF"/>
-                                  </a:solidFill>
+                                  <ns5:solidFill>
+                                    <ns5:srgbClr val="FFFFFF"/>
+                                  </ns5:solidFill>
                                 </ns8:hiddenFill>
-                              </a:ext>
-                            </a:extLst>
-                          </pic:spPr>
-                        </pic:pic>
-                        <wps:wsp>
-                          <wps:cNvPr id="15" name="Text Box 4"/>
-                          <wps:cNvSpPr txBox="1">
-                            <a:spLocks noChangeArrowheads="1"/>
-                          </wps:cNvSpPr>
-                          <wps:spPr bwMode="auto">
-                            <a:xfrm>
-                              <a:off x="6813" y="0"/>
-                              <a:ext cx="14207" cy="5702"/>
-                            </a:xfrm>
-                            <a:prstGeom prst="rect">
-                              <a:avLst/>
-                            </a:prstGeom>
-                            <a:noFill/>
-                            <a:ln>
-                              <a:noFill/>
-                            </a:ln>
-                            <a:extLst>
-                              <a:ext uri="{909E8E84-426E-40DD-AFC4-6F175D3DCCD1}">
+                              </ns5:ext>
+                            </ns5:extLst>
+                          </ns9:spPr>
+                        </ns9:pic>
+                        <ns7:wsp>
+                          <ns7:cNvPr id="15" name="Text Box 4"/>
+                          <ns7:cNvSpPr txBox="1">
+                            <ns5:spLocks noChangeArrowheads="1"/>
+                          </ns7:cNvSpPr>
+                          <ns7:spPr bwMode="auto">
+                            <ns5:xfrm>
+                              <ns5:off x="6813" y="0"/>
+                              <ns5:ext cx="14207" cy="5702"/>
+                            </ns5:xfrm>
+                            <ns5:prstGeom prst="rect">
+                              <ns5:avLst/>
+                            </ns5:prstGeom>
+                            <ns5:noFill/>
+                            <ns5:ln>
+                              <ns5:noFill/>
+                            </ns5:ln>
+                            <ns5:extLst>
+                              <ns5:ext uri="{909E8E84-426E-40DD-AFC4-6F175D3DCCD1}">
                                 <ns8:hiddenFill>
-                                  <a:solidFill>
-                                    <a:srgbClr val="FFFFFF"/>
-                                  </a:solidFill>
+                                  <ns5:solidFill>
+                                    <ns5:srgbClr val="FFFFFF"/>
+                                  </ns5:solidFill>
                                 </ns8:hiddenFill>
-                              </a:ext>
-                              <a:ext uri="{91240B29-F687-4F45-9708-019B960494DF}">
+                              </ns5:ext>
+                              <ns5:ext uri="{91240B29-F687-4F45-9708-019B960494DF}">
                                 <ns8:hiddenLine w="9525">
-                                  <a:solidFill>
-                                    <a:srgbClr val="000000"/>
-                                  </a:solidFill>
-                                  <a:miter lim="800000"/>
-                                  <a:headEnd/>
-                                  <a:tailEnd/>
+                                  <ns5:solidFill>
+                                    <ns5:srgbClr val="000000"/>
+                                  </ns5:solidFill>
+                                  <ns5:miter lim="800000"/>
+                                  <ns5:headEnd/>
+                                  <ns5:tailEnd/>
                                 </ns8:hiddenLine>
-                              </a:ext>
-                            </a:extLst>
-                          </wps:spPr>
-                          <wps:txbx>
+                              </ns5:ext>
+                            </ns5:extLst>
+                          </ns7:spPr>
+                          <ns7:txbx>
                             <w:txbxContent>
                               <w:p ns2:paraId="7E28FFF1" ns2:textId="77777777">
                                 <w:pPr>
@@ -309,49 +309,49 @@
                                 </w:r>
                               </w:p>
                             </w:txbxContent>
-                          </wps:txbx>
-                          <wps:bodyPr rot="0" vert="horz" wrap="square" lIns="36576" tIns="36576" rIns="36576" bIns="36576" anchor="t" anchorCtr="0" upright="1">
-                            <a:noAutofit/>
-                          </wps:bodyPr>
-                        </wps:wsp>
-                        <wps:wsp>
-                          <wps:cNvPr id="16" name="Text Box 9"/>
-                          <wps:cNvSpPr txBox="1">
-                            <a:spLocks noChangeArrowheads="1"/>
-                          </wps:cNvSpPr>
-                          <wps:spPr bwMode="auto">
-                            <a:xfrm>
-                              <a:off x="7010" y="8191"/>
-                              <a:ext cx="15323" cy="2217"/>
-                            </a:xfrm>
-                            <a:prstGeom prst="rect">
-                              <a:avLst/>
-                            </a:prstGeom>
-                            <a:noFill/>
-                            <a:ln>
-                              <a:noFill/>
-                            </a:ln>
-                            <a:extLst>
-                              <a:ext uri="{909E8E84-426E-40DD-AFC4-6F175D3DCCD1}">
+                          </ns7:txbx>
+                          <ns7:bodyPr rot="0" vert="horz" wrap="square" lIns="36576" tIns="36576" rIns="36576" bIns="36576" anchor="t" anchorCtr="0" upright="1">
+                            <ns5:noAutofit/>
+                          </ns7:bodyPr>
+                        </ns7:wsp>
+                        <ns7:wsp>
+                          <ns7:cNvPr id="16" name="Text Box 9"/>
+                          <ns7:cNvSpPr txBox="1">
+                            <ns5:spLocks noChangeArrowheads="1"/>
+                          </ns7:cNvSpPr>
+                          <ns7:spPr bwMode="auto">
+                            <ns5:xfrm>
+                              <ns5:off x="7010" y="8191"/>
+                              <ns5:ext cx="15323" cy="2217"/>
+                            </ns5:xfrm>
+                            <ns5:prstGeom prst="rect">
+                              <ns5:avLst/>
+                            </ns5:prstGeom>
+                            <ns5:noFill/>
+                            <ns5:ln>
+                              <ns5:noFill/>
+                            </ns5:ln>
+                            <ns5:extLst>
+                              <ns5:ext uri="{909E8E84-426E-40DD-AFC4-6F175D3DCCD1}">
                                 <ns8:hiddenFill>
-                                  <a:solidFill>
-                                    <a:srgbClr val="FFFFFF"/>
-                                  </a:solidFill>
+                                  <ns5:solidFill>
+                                    <ns5:srgbClr val="FFFFFF"/>
+                                  </ns5:solidFill>
                                 </ns8:hiddenFill>
-                              </a:ext>
-                              <a:ext uri="{91240B29-F687-4F45-9708-019B960494DF}">
+                              </ns5:ext>
+                              <ns5:ext uri="{91240B29-F687-4F45-9708-019B960494DF}">
                                 <ns8:hiddenLine w="9525">
-                                  <a:solidFill>
-                                    <a:srgbClr val="000000"/>
-                                  </a:solidFill>
-                                  <a:miter lim="800000"/>
-                                  <a:headEnd/>
-                                  <a:tailEnd/>
+                                  <ns5:solidFill>
+                                    <ns5:srgbClr val="000000"/>
+                                  </ns5:solidFill>
+                                  <ns5:miter lim="800000"/>
+                                  <ns5:headEnd/>
+                                  <ns5:tailEnd/>
                                 </ns8:hiddenLine>
-                              </a:ext>
-                            </a:extLst>
-                          </wps:spPr>
-                          <wps:txbx>
+                              </ns5:ext>
+                            </ns5:extLst>
+                          </ns7:spPr>
+                          <ns7:txbx>
                             <w:txbxContent>
                               <w:p ns2:paraId="13BA976F" ns2:textId="77777777">
                                 <w:r>
@@ -362,22 +362,22 @@
                                 </w:r>
                               </w:p>
                             </w:txbxContent>
-                          </wps:txbx>
-                          <wps:bodyPr rot="0" vert="horz" wrap="square" lIns="36576" tIns="36576" rIns="36576" bIns="36576" anchor="t" anchorCtr="0" upright="1">
-                            <a:noAutofit/>
-                          </wps:bodyPr>
-                        </wps:wsp>
+                          </ns7:txbx>
+                          <ns7:bodyPr rot="0" vert="horz" wrap="square" lIns="36576" tIns="36576" rIns="36576" bIns="36576" anchor="t" anchorCtr="0" upright="1">
+                            <ns5:noAutofit/>
+                          </ns7:bodyPr>
+                        </ns7:wsp>
                       </ns6:grpSp>
                     </ns6:wgp>
-                  </a:graphicData>
-                </a:graphic>
+                  </ns5:graphicData>
+                </ns5:graphic>
                 <ns4:sizeRelH relativeFrom="margin">
                   <ns4:pctWidth>0</ns4:pctWidth>
                 </ns4:sizeRelH>
                 <ns4:sizeRelV relativeFrom="margin">
                   <ns4:pctHeight>0</ns4:pctHeight>
                 </ns4:sizeRelV>
-              </wp:anchor>
+              </ns3:anchor>
             </w:drawing>
           </ns1:Choice>
           <ns1:Fallback>
@@ -415,7 +415,7 @@
                     <ns12:lock ns11:ext="edit" aspectratio="t"/>
                   </ns11:shapetype>
                   <ns11:shape id="Picture 3" ns12:spid="_x0000_s1032" type="#_x0000_t75" style="position:absolute;width:6813;height:6204;visibility:visible;mso-wrap-style:square" ns12:gfxdata="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">
-                    <ns11:imagedata r:id="rId8" ns12:title=""/>
+                    <ns11:imagedata ns10:id="rId8" ns12:title=""/>
                   </ns11:shape>
                   <ns11:shapetype id="_x0000_t202" coordsize="21600,21600" ns12:spt="202" path="m,l,21600r21600,l21600,xe">
                     <ns11:stroke joinstyle="miter"/>
@@ -498,51 +498,51 @@
         <ns1:AlternateContent>
           <ns1:Choice Requires="wps">
             <w:drawing>
-              <wp:anchor distT="0" distB="0" distL="114300" distR="114300" simplePos="0" relativeHeight="251662336" behindDoc="1" locked="0" layoutInCell="1" allowOverlap="1" ns4:anchorId="2C135B1C" ns4:editId="7D9B0B92">
-                <wp:simplePos x="0" y="0"/>
-                <wp:positionH relativeFrom="margin">
-                  <wp:posOffset>2317115</wp:posOffset>
-                </wp:positionH>
-                <wp:positionV relativeFrom="paragraph">
-                  <wp:posOffset>36195</wp:posOffset>
-                </wp:positionV>
-                <wp:extent cx="2000250" cy="723265"/>
-                <wp:effectExtent l="0" t="0" r="0" b="635"/>
-                <wp:wrapTight wrapText="bothSides">
-                  <wp:wrapPolygon edited="0">
-                    <wp:start x="0" y="0"/>
-                    <wp:lineTo x="0" y="21050"/>
-                    <wp:lineTo x="21394" y="21050"/>
-                    <wp:lineTo x="21394" y="0"/>
-                    <wp:lineTo x="0" y="0"/>
-                  </wp:wrapPolygon>
-                </wp:wrapTight>
-                <wp:docPr id="251250240" name="Zone de texte 251250240"/>
-                <wp:cNvGraphicFramePr>
-                  <a:graphicFrameLocks/>
-                </wp:cNvGraphicFramePr>
-                <a:graphic>
-                  <a:graphicData uri="http://schemas.microsoft.com/office/word/2010/wordprocessingShape">
-                    <wps:wsp>
-                      <wps:cNvSpPr txBox="1">
-                        <a:spLocks noChangeArrowheads="1"/>
-                      </wps:cNvSpPr>
-                      <wps:spPr bwMode="auto">
-                        <a:xfrm>
-                          <a:off x="0" y="0"/>
-                          <a:ext cx="2000250" cy="723265"/>
-                        </a:xfrm>
-                        <a:prstGeom prst="rect">
-                          <a:avLst/>
-                        </a:prstGeom>
-                        <a:solidFill>
-                          <a:srgbClr val="FFFFFF"/>
-                        </a:solidFill>
-                        <a:ln>
-                          <a:noFill/>
-                        </a:ln>
-                      </wps:spPr>
-                      <wps:txbx>
+              <ns3:anchor distT="0" distB="0" distL="114300" distR="114300" simplePos="0" relativeHeight="251662336" behindDoc="1" locked="0" layoutInCell="1" allowOverlap="1" ns4:anchorId="2C135B1C" ns4:editId="7D9B0B92">
+                <ns3:simplePos x="0" y="0"/>
+                <ns3:positionH relativeFrom="margin">
+                  <ns3:posOffset>2317115</ns3:posOffset>
+                </ns3:positionH>
+                <ns3:positionV relativeFrom="paragraph">
+                  <ns3:posOffset>36195</ns3:posOffset>
+                </ns3:positionV>
+                <ns3:extent cx="2000250" cy="723265"/>
+                <ns3:effectExtent l="0" t="0" r="0" b="635"/>
+                <ns3:wrapTight wrapText="bothSides">
+                  <ns3:wrapPolygon edited="0">
+                    <ns3:start x="0" y="0"/>
+                    <ns3:lineTo x="0" y="21050"/>
+                    <ns3:lineTo x="21394" y="21050"/>
+                    <ns3:lineTo x="21394" y="0"/>
+                    <ns3:lineTo x="0" y="0"/>
+                  </ns3:wrapPolygon>
+                </ns3:wrapTight>
+                <ns3:docPr id="251250240" name="Zone de texte 251250240"/>
+                <ns3:cNvGraphicFramePr>
+                  <ns5:graphicFrameLocks/>
+                </ns3:cNvGraphicFramePr>
+                <ns5:graphic>
+                  <ns5:graphicData uri="http://schemas.microsoft.com/office/word/2010/wordprocessingShape">
+                    <ns7:wsp>
+                      <ns7:cNvSpPr txBox="1">
+                        <ns5:spLocks noChangeArrowheads="1"/>
+                      </ns7:cNvSpPr>
+                      <ns7:spPr bwMode="auto">
+                        <ns5:xfrm>
+                          <ns5:off x="0" y="0"/>
+                          <ns5:ext cx="2000250" cy="723265"/>
+                        </ns5:xfrm>
+                        <ns5:prstGeom prst="rect">
+                          <ns5:avLst/>
+                        </ns5:prstGeom>
+                        <ns5:solidFill>
+                          <ns5:srgbClr val="FFFFFF"/>
+                        </ns5:solidFill>
+                        <ns5:ln>
+                          <ns5:noFill/>
+                        </ns5:ln>
+                      </ns7:spPr>
+                      <ns7:txbx>
                         <w:txbxContent>
                           <w:p ns2:paraId="373EFC37" ns2:textId="77777777">
                             <w:pPr>
@@ -573,20 +573,20 @@
                             </w:r>
                           </w:p>
                         </w:txbxContent>
-                      </wps:txbx>
-                      <wps:bodyPr rot="0" vertOverflow="clip" horzOverflow="clip" vert="horz" wrap="square" lIns="91440" tIns="45720" rIns="91440" bIns="45720" anchor="t" anchorCtr="0" upright="1">
-                        <a:noAutofit/>
-                      </wps:bodyPr>
-                    </wps:wsp>
-                  </a:graphicData>
-                </a:graphic>
+                      </ns7:txbx>
+                      <ns7:bodyPr rot="0" vertOverflow="clip" horzOverflow="clip" vert="horz" wrap="square" lIns="91440" tIns="45720" rIns="91440" bIns="45720" anchor="t" anchorCtr="0" upright="1">
+                        <ns5:noAutofit/>
+                      </ns7:bodyPr>
+                    </ns7:wsp>
+                  </ns5:graphicData>
+                </ns5:graphic>
                 <ns4:sizeRelH relativeFrom="margin">
                   <ns4:pctWidth>0</ns4:pctWidth>
                 </ns4:sizeRelH>
                 <ns4:sizeRelV relativeFrom="margin">
                   <ns4:pctHeight>0</ns4:pctHeight>
                 </ns4:sizeRelV>
-              </wp:anchor>
+              </ns3:anchor>
             </w:drawing>
           </ns1:Choice>
           <ns1:Fallback>
@@ -637,71 +637,71 @@
           <w:lang w:eastAsia="fr-FR"/>
         </w:rPr>
         <w:drawing>
-          <wp:anchor distT="0" distB="0" distL="114300" distR="114300" simplePos="0" relativeHeight="251641856" behindDoc="1" locked="0" layoutInCell="1" allowOverlap="1" ns4:anchorId="4017EE67" ns4:editId="7121C3C0">
-            <wp:simplePos x="0" y="0"/>
-            <wp:positionH relativeFrom="column">
-              <wp:posOffset>5479415</wp:posOffset>
-            </wp:positionH>
-            <wp:positionV relativeFrom="paragraph">
-              <wp:posOffset>83185</wp:posOffset>
-            </wp:positionV>
-            <wp:extent cx="790575" cy="740410"/>
-            <wp:effectExtent l="0" t="0" r="9525" b="2540"/>
-            <wp:wrapTight wrapText="bothSides">
-              <wp:wrapPolygon edited="0">
-                <wp:start x="0" y="0"/>
-                <wp:lineTo x="0" y="21118"/>
-                <wp:lineTo x="21340" y="21118"/>
-                <wp:lineTo x="21340" y="0"/>
-                <wp:lineTo x="0" y="0"/>
-              </wp:wrapPolygon>
-            </wp:wrapTight>
-            <wp:docPr id="2" name="Image 2"/>
-            <wp:cNvGraphicFramePr>
-              <a:graphicFrameLocks noChangeAspect="1"/>
-            </wp:cNvGraphicFramePr>
-            <a:graphic>
-              <a:graphicData uri="http://schemas.openxmlformats.org/drawingml/2006/picture">
-                <pic:pic>
-                  <pic:nvPicPr>
-                    <pic:cNvPr id="0" name="Image 5"/>
-                    <pic:cNvPicPr>
-                      <a:picLocks noChangeAspect="1" noChangeArrowheads="1"/>
-                    </pic:cNvPicPr>
-                  </pic:nvPicPr>
-                  <pic:blipFill>
-                    <a:blip r:embed="rId9">
-                      <a:extLst>
-                        <a:ext uri="{28A0092B-C50C-407E-A947-70E740481C1C}">
+          <ns3:anchor distT="0" distB="0" distL="114300" distR="114300" simplePos="0" relativeHeight="251641856" behindDoc="1" locked="0" layoutInCell="1" allowOverlap="1" ns4:anchorId="4017EE67" ns4:editId="7121C3C0">
+            <ns3:simplePos x="0" y="0"/>
+            <ns3:positionH relativeFrom="column">
+              <ns3:posOffset>5479415</ns3:posOffset>
+            </ns3:positionH>
+            <ns3:positionV relativeFrom="paragraph">
+              <ns3:posOffset>83185</ns3:posOffset>
+            </ns3:positionV>
+            <ns3:extent cx="790575" cy="740410"/>
+            <ns3:effectExtent l="0" t="0" r="9525" b="2540"/>
+            <ns3:wrapTight wrapText="bothSides">
+              <ns3:wrapPolygon edited="0">
+                <ns3:start x="0" y="0"/>
+                <ns3:lineTo x="0" y="21118"/>
+                <ns3:lineTo x="21340" y="21118"/>
+                <ns3:lineTo x="21340" y="0"/>
+                <ns3:lineTo x="0" y="0"/>
+              </ns3:wrapPolygon>
+            </ns3:wrapTight>
+            <ns3:docPr id="2" name="Image 2"/>
+            <ns3:cNvGraphicFramePr>
+              <ns5:graphicFrameLocks noChangeAspect="1"/>
+            </ns3:cNvGraphicFramePr>
+            <ns5:graphic>
+              <ns5:graphicData uri="http://schemas.openxmlformats.org/drawingml/2006/picture">
+                <ns9:pic>
+                  <ns9:nvPicPr>
+                    <ns9:cNvPr id="0" name="Image 5"/>
+                    <ns9:cNvPicPr>
+                      <ns5:picLocks noChangeAspect="1" noChangeArrowheads="1"/>
+                    </ns9:cNvPicPr>
+                  </ns9:nvPicPr>
+                  <ns9:blipFill>
+                    <ns5:blip ns10:embed="rId9">
+                      <ns5:extLst>
+                        <ns5:ext uri="{28A0092B-C50C-407E-A947-70E740481C1C}">
                           <ns8:useLocalDpi val="0"/>
-                        </a:ext>
-                      </a:extLst>
-                    </a:blip>
-                    <a:srcRect/>
-                    <a:stretch>
-                      <a:fillRect/>
-                    </a:stretch>
-                  </pic:blipFill>
-                  <pic:spPr bwMode="auto">
-                    <a:xfrm>
-                      <a:off x="0" y="0"/>
-                      <a:ext cx="790575" cy="740410"/>
-                    </a:xfrm>
-                    <a:prstGeom prst="rect">
-                      <a:avLst/>
-                    </a:prstGeom>
-                    <a:noFill/>
-                  </pic:spPr>
-                </pic:pic>
-              </a:graphicData>
-            </a:graphic>
+                        </ns5:ext>
+                      </ns5:extLst>
+                    </ns5:blip>
+                    <ns5:srcRect/>
+                    <ns5:stretch>
+                      <ns5:fillRect/>
+                    </ns5:stretch>
+                  </ns9:blipFill>
+                  <ns9:spPr bwMode="auto">
+                    <ns5:xfrm>
+                      <ns5:off x="0" y="0"/>
+                      <ns5:ext cx="790575" cy="740410"/>
+                    </ns5:xfrm>
+                    <ns5:prstGeom prst="rect">
+                      <ns5:avLst/>
+                    </ns5:prstGeom>
+                    <ns5:noFill/>
+                  </ns9:spPr>
+                </ns9:pic>
+              </ns5:graphicData>
+            </ns5:graphic>
             <ns4:sizeRelH relativeFrom="page">
               <ns4:pctWidth>0</ns4:pctWidth>
             </ns4:sizeRelH>
             <ns4:sizeRelV relativeFrom="page">
               <ns4:pctHeight>0</ns4:pctHeight>
             </ns4:sizeRelV>
-          </wp:anchor>
+          </ns3:anchor>
         </w:drawing>
       </w:r>
       <w:r>
@@ -711,71 +711,71 @@
           <w:lang w:eastAsia="fr-FR"/>
         </w:rPr>
         <w:drawing>
-          <wp:anchor distT="0" distB="0" distL="114300" distR="114300" simplePos="0" relativeHeight="251639808" behindDoc="1" locked="0" layoutInCell="1" allowOverlap="1" ns4:anchorId="375F90E4" ns4:editId="68464348">
-            <wp:simplePos x="0" y="0"/>
-            <wp:positionH relativeFrom="margin">
-              <wp:posOffset>4472305</wp:posOffset>
-            </wp:positionH>
-            <wp:positionV relativeFrom="paragraph">
-              <wp:posOffset>136525</wp:posOffset>
-            </wp:positionV>
-            <wp:extent cx="573405" cy="569595"/>
-            <wp:effectExtent l="0" t="0" r="0" b="1905"/>
-            <wp:wrapTight wrapText="bothSides">
-              <wp:wrapPolygon edited="0">
-                <wp:start x="0" y="0"/>
-                <wp:lineTo x="0" y="20950"/>
-                <wp:lineTo x="20811" y="20950"/>
-                <wp:lineTo x="20811" y="0"/>
-                <wp:lineTo x="0" y="0"/>
-              </wp:wrapPolygon>
-            </wp:wrapTight>
-            <wp:docPr id="1" name="Image 1"/>
-            <wp:cNvGraphicFramePr>
-              <a:graphicFrameLocks noChangeAspect="1"/>
-            </wp:cNvGraphicFramePr>
-            <a:graphic>
-              <a:graphicData uri="http://schemas.openxmlformats.org/drawingml/2006/picture">
-                <pic:pic>
-                  <pic:nvPicPr>
-                    <pic:cNvPr id="0" name="Image 2"/>
-                    <pic:cNvPicPr>
-                      <a:picLocks noChangeAspect="1" noChangeArrowheads="1"/>
-                    </pic:cNvPicPr>
-                  </pic:nvPicPr>
-                  <pic:blipFill>
-                    <a:blip r:embed="rId10">
-                      <a:extLst>
-                        <a:ext uri="{28A0092B-C50C-407E-A947-70E740481C1C}">
+          <ns3:anchor distT="0" distB="0" distL="114300" distR="114300" simplePos="0" relativeHeight="251639808" behindDoc="1" locked="0" layoutInCell="1" allowOverlap="1" ns4:anchorId="375F90E4" ns4:editId="68464348">
+            <ns3:simplePos x="0" y="0"/>
+            <ns3:positionH relativeFrom="margin">
+              <ns3:posOffset>4472305</ns3:posOffset>
+            </ns3:positionH>
+            <ns3:positionV relativeFrom="paragraph">
+              <ns3:posOffset>136525</ns3:posOffset>
+            </ns3:positionV>
+            <ns3:extent cx="573405" cy="569595"/>
+            <ns3:effectExtent l="0" t="0" r="0" b="1905"/>
+            <ns3:wrapTight wrapText="bothSides">
+              <ns3:wrapPolygon edited="0">
+                <ns3:start x="0" y="0"/>
+                <ns3:lineTo x="0" y="20950"/>
+                <ns3:lineTo x="20811" y="20950"/>
+                <ns3:lineTo x="20811" y="0"/>
+                <ns3:lineTo x="0" y="0"/>
+              </ns3:wrapPolygon>
+            </ns3:wrapTight>
+            <ns3:docPr id="1" name="Image 1"/>
+            <ns3:cNvGraphicFramePr>
+              <ns5:graphicFrameLocks noChangeAspect="1"/>
+            </ns3:cNvGraphicFramePr>
+            <ns5:graphic>
+              <ns5:graphicData uri="http://schemas.openxmlformats.org/drawingml/2006/picture">
+                <ns9:pic>
+                  <ns9:nvPicPr>
+                    <ns9:cNvPr id="0" name="Image 2"/>
+                    <ns9:cNvPicPr>
+                      <ns5:picLocks noChangeAspect="1" noChangeArrowheads="1"/>
+                    </ns9:cNvPicPr>
+                  </ns9:nvPicPr>
+                  <ns9:blipFill>
+                    <ns5:blip ns10:embed="rId10">
+                      <ns5:extLst>
+                        <ns5:ext uri="{28A0092B-C50C-407E-A947-70E740481C1C}">
                           <ns8:useLocalDpi val="0"/>
-                        </a:ext>
-                      </a:extLst>
-                    </a:blip>
-                    <a:srcRect/>
-                    <a:stretch>
-                      <a:fillRect/>
-                    </a:stretch>
-                  </pic:blipFill>
-                  <pic:spPr bwMode="auto">
-                    <a:xfrm>
-                      <a:off x="0" y="0"/>
-                      <a:ext cx="573405" cy="569595"/>
-                    </a:xfrm>
-                    <a:prstGeom prst="rect">
-                      <a:avLst/>
-                    </a:prstGeom>
-                    <a:noFill/>
-                  </pic:spPr>
-                </pic:pic>
-              </a:graphicData>
-            </a:graphic>
+                        </ns5:ext>
+                      </ns5:extLst>
+                    </ns5:blip>
+                    <ns5:srcRect/>
+                    <ns5:stretch>
+                      <ns5:fillRect/>
+                    </ns5:stretch>
+                  </ns9:blipFill>
+                  <ns9:spPr bwMode="auto">
+                    <ns5:xfrm>
+                      <ns5:off x="0" y="0"/>
+                      <ns5:ext cx="573405" cy="569595"/>
+                    </ns5:xfrm>
+                    <ns5:prstGeom prst="rect">
+                      <ns5:avLst/>
+                    </ns5:prstGeom>
+                    <ns5:noFill/>
+                  </ns9:spPr>
+                </ns9:pic>
+              </ns5:graphicData>
+            </ns5:graphic>
             <ns4:sizeRelH relativeFrom="page">
               <ns4:pctWidth>0</ns4:pctWidth>
             </ns4:sizeRelH>
             <ns4:sizeRelV relativeFrom="page">
               <ns4:pctHeight>0</ns4:pctHeight>
             </ns4:sizeRelV>
-          </wp:anchor>
+          </ns3:anchor>
         </w:drawing>
       </w:r>
     </w:p>
@@ -814,50 +814,50 @@
         <ns1:AlternateContent>
           <ns1:Choice Requires="wps">
             <w:drawing>
-              <wp:anchor distT="0" distB="0" distL="114300" distR="114300" simplePos="0" relativeHeight="251674624" behindDoc="0" locked="0" layoutInCell="1" allowOverlap="1" ns4:anchorId="06D7241B" ns4:editId="0690C31B">
-                <wp:simplePos x="0" y="0"/>
-                <wp:positionH relativeFrom="margin">
-                  <wp:posOffset>0</wp:posOffset>
-                </wp:positionH>
-                <wp:positionV relativeFrom="paragraph">
-                  <wp:posOffset>-635</wp:posOffset>
-                </wp:positionV>
-                <wp:extent cx="6106160" cy="0"/>
-                <wp:effectExtent l="0" t="0" r="0" b="0"/>
-                <wp:wrapNone/>
-                <wp:docPr id="54" name="AutoShape 25"/>
-                <wp:cNvGraphicFramePr>
-                  <a:graphicFrameLocks/>
-                </wp:cNvGraphicFramePr>
-                <a:graphic>
-                  <a:graphicData uri="http://schemas.microsoft.com/office/word/2010/wordprocessingShape">
-                    <wps:wsp>
-                      <wps:cNvCnPr>
-                        <a:cxnSpLocks noChangeShapeType="1"/>
-                      </wps:cNvCnPr>
-                      <wps:spPr bwMode="auto">
-                        <a:xfrm>
-                          <a:off x="0" y="0"/>
-                          <a:ext cx="6106160" cy="0"/>
-                        </a:xfrm>
-                        <a:prstGeom prst="straightConnector1">
-                          <a:avLst/>
-                        </a:prstGeom>
-                        <a:noFill/>
-                        <a:ln w="19050">
-                          <a:solidFill>
-                            <a:srgbClr val="000000"/>
-                          </a:solidFill>
-                          <a:round/>
-                          <a:headEnd type="none" w="med" len="med"/>
-                          <a:tailEnd type="none" w="med" len="med"/>
-                        </a:ln>
-                      </wps:spPr>
-                      <wps:bodyPr/>
-                    </wps:wsp>
-                  </a:graphicData>
-                </a:graphic>
-              </wp:anchor>
+              <ns3:anchor distT="0" distB="0" distL="114300" distR="114300" simplePos="0" relativeHeight="251674624" behindDoc="0" locked="0" layoutInCell="1" allowOverlap="1" ns4:anchorId="06D7241B" ns4:editId="0690C31B">
+                <ns3:simplePos x="0" y="0"/>
+                <ns3:positionH relativeFrom="margin">
+                  <ns3:posOffset>0</ns3:posOffset>
+                </ns3:positionH>
+                <ns3:positionV relativeFrom="paragraph">
+                  <ns3:posOffset>-635</ns3:posOffset>
+                </ns3:positionV>
+                <ns3:extent cx="6106160" cy="0"/>
+                <ns3:effectExtent l="0" t="0" r="0" b="0"/>
+                <ns3:wrapNone/>
+                <ns3:docPr id="54" name="AutoShape 25"/>
+                <ns3:cNvGraphicFramePr>
+                  <ns5:graphicFrameLocks/>
+                </ns3:cNvGraphicFramePr>
+                <ns5:graphic>
+                  <ns5:graphicData uri="http://schemas.microsoft.com/office/word/2010/wordprocessingShape">
+                    <ns7:wsp>
+                      <ns7:cNvCnPr>
+                        <ns5:cxnSpLocks noChangeShapeType="1"/>
+                      </ns7:cNvCnPr>
+                      <ns7:spPr bwMode="auto">
+                        <ns5:xfrm>
+                          <ns5:off x="0" y="0"/>
+                          <ns5:ext cx="6106160" cy="0"/>
+                        </ns5:xfrm>
+                        <ns5:prstGeom prst="straightConnector1">
+                          <ns5:avLst/>
+                        </ns5:prstGeom>
+                        <ns5:noFill/>
+                        <ns5:ln w="19050">
+                          <ns5:solidFill>
+                            <ns5:srgbClr val="000000"/>
+                          </ns5:solidFill>
+                          <ns5:round/>
+                          <ns5:headEnd type="none" w="med" len="med"/>
+                          <ns5:tailEnd type="none" w="med" len="med"/>
+                        </ns5:ln>
+                      </ns7:spPr>
+                      <ns7:bodyPr/>
+                    </ns7:wsp>
+                  </ns5:graphicData>
+                </ns5:graphic>
+              </ns3:anchor>
             </w:drawing>
           </ns1:Choice>
           <ns1:Fallback>
@@ -1036,78 +1036,78 @@
         <ns1:AlternateContent>
           <ns1:Choice Requires="wps">
             <w:drawing>
-              <wp:anchor distT="0" distB="0" distL="114300" distR="114300" simplePos="0" relativeHeight="251664384" behindDoc="0" locked="1" layoutInCell="1" allowOverlap="1" ns4:anchorId="6A9013CB" ns4:editId="34544F81">
-                <wp:simplePos x="0" y="0"/>
-                <wp:positionH relativeFrom="column">
-                  <wp:posOffset>748030</wp:posOffset>
-                </wp:positionH>
-                <wp:positionV relativeFrom="paragraph">
-                  <wp:posOffset>303530</wp:posOffset>
-                </wp:positionV>
-                <wp:extent cx="4857750" cy="752475"/>
-                <wp:effectExtent l="38100" t="38100" r="57150" b="66675"/>
-                <wp:wrapNone/>
-                <wp:docPr id="1715820105" name="Rectangle à coins arrondis 1715820105"/>
-                <wp:cNvGraphicFramePr>
-                  <a:graphicFrameLocks/>
-                </wp:cNvGraphicFramePr>
-                <a:graphic>
-                  <a:graphicData uri="http://schemas.microsoft.com/office/word/2010/wordprocessingShape">
-                    <wps:wsp>
-                      <wps:cNvSpPr>
-                        <a:spLocks/>
-                      </wps:cNvSpPr>
-                      <wps:spPr>
-                        <a:xfrm>
-                          <a:off x="0" y="0"/>
-                          <a:ext cx="4857750" cy="752475"/>
-                        </a:xfrm>
-                        <a:prstGeom prst="roundRect">
-                          <a:avLst/>
-                        </a:prstGeom>
-                        <a:gradFill flip="none" rotWithShape="1">
-                          <a:gsLst>
-                            <a:gs pos="0">
-                              <a:schemeClr val="accent1">
-                                <a:lumMod val="60000"/>
-                                <a:lumOff val="40000"/>
-                                <a:tint val="66000"/>
-                                <a:satMod val="160000"/>
-                              </a:schemeClr>
-                            </a:gs>
-                            <a:gs pos="50000">
-                              <a:schemeClr val="accent1">
-                                <a:lumMod val="60000"/>
-                                <a:lumOff val="40000"/>
-                                <a:tint val="44500"/>
-                                <a:satMod val="160000"/>
-                              </a:schemeClr>
-                            </a:gs>
-                            <a:gs pos="100000">
-                              <a:schemeClr val="accent1">
-                                <a:lumMod val="60000"/>
-                                <a:lumOff val="40000"/>
-                                <a:tint val="23500"/>
-                                <a:satMod val="160000"/>
-                              </a:schemeClr>
-                            </a:gs>
-                          </a:gsLst>
-                          <a:lin ang="18900000" scaled="1"/>
-                          <a:tileRect/>
-                        </a:gradFill>
-                        <a:ln w="88900" cap="flat" cmpd="tri" algn="ctr">
-                          <a:solidFill>
-                            <a:srgbClr val="4472C4">
-                              <a:lumMod val="40000"/>
-                              <a:lumOff val="60000"/>
-                            </a:srgbClr>
-                          </a:solidFill>
-                          <a:prstDash val="solid"/>
-                          <a:miter lim="800000"/>
-                        </a:ln>
-                        <a:effectLst/>
-                      </wps:spPr>
-                      <wps:txbx>
+              <ns3:anchor distT="0" distB="0" distL="114300" distR="114300" simplePos="0" relativeHeight="251664384" behindDoc="0" locked="1" layoutInCell="1" allowOverlap="1" ns4:anchorId="6A9013CB" ns4:editId="34544F81">
+                <ns3:simplePos x="0" y="0"/>
+                <ns3:positionH relativeFrom="column">
+                  <ns3:posOffset>748030</ns3:posOffset>
+                </ns3:positionH>
+                <ns3:positionV relativeFrom="paragraph">
+                  <ns3:posOffset>303530</ns3:posOffset>
+                </ns3:positionV>
+                <ns3:extent cx="4857750" cy="752475"/>
+                <ns3:effectExtent l="38100" t="38100" r="57150" b="66675"/>
+                <ns3:wrapNone/>
+                <ns3:docPr id="1715820105" name="Rectangle à coins arrondis 1715820105"/>
+                <ns3:cNvGraphicFramePr>
+                  <ns5:graphicFrameLocks/>
+                </ns3:cNvGraphicFramePr>
+                <ns5:graphic>
+                  <ns5:graphicData uri="http://schemas.microsoft.com/office/word/2010/wordprocessingShape">
+                    <ns7:wsp>
+                      <ns7:cNvSpPr>
+                        <ns5:spLocks/>
+                      </ns7:cNvSpPr>
+                      <ns7:spPr>
+                        <ns5:xfrm>
+                          <ns5:off x="0" y="0"/>
+                          <ns5:ext cx="4857750" cy="752475"/>
+                        </ns5:xfrm>
+                        <ns5:prstGeom prst="roundRect">
+                          <ns5:avLst/>
+                        </ns5:prstGeom>
+                        <ns5:gradFill flip="none" rotWithShape="1">
+                          <ns5:gsLst>
+                            <ns5:gs pos="0">
+                              <ns5:schemeClr val="accent1">
+                                <ns5:lumMod val="60000"/>
+                                <ns5:lumOff val="40000"/>
+                                <ns5:tint val="66000"/>
+                                <ns5:satMod val="160000"/>
+                              </ns5:schemeClr>
+                            </ns5:gs>
+                            <ns5:gs pos="50000">
+                              <ns5:schemeClr val="accent1">
+                                <ns5:lumMod val="60000"/>
+                                <ns5:lumOff val="40000"/>
+                                <ns5:tint val="44500"/>
+                                <ns5:satMod val="160000"/>
+                              </ns5:schemeClr>
+                            </ns5:gs>
+                            <ns5:gs pos="100000">
+                              <ns5:schemeClr val="accent1">
+                                <ns5:lumMod val="60000"/>
+                                <ns5:lumOff val="40000"/>
+                                <ns5:tint val="23500"/>
+                                <ns5:satMod val="160000"/>
+                              </ns5:schemeClr>
+                            </ns5:gs>
+                          </ns5:gsLst>
+                          <ns5:lin ang="18900000" scaled="1"/>
+                          <ns5:tileRect/>
+                        </ns5:gradFill>
+                        <ns5:ln w="88900" cap="flat" cmpd="tri" algn="ctr">
+                          <ns5:solidFill>
+                            <ns5:srgbClr val="4472C4">
+                              <ns5:lumMod val="40000"/>
+                              <ns5:lumOff val="60000"/>
+                            </ns5:srgbClr>
+                          </ns5:solidFill>
+                          <ns5:prstDash val="solid"/>
+                          <ns5:miter lim="800000"/>
+                        </ns5:ln>
+                        <ns5:effectLst/>
+                      </ns7:spPr>
+                      <ns7:txbx>
                         <w:txbxContent>
                           <w:p ns2:paraId="480DFEF0" ns2:textId="53D35AD1">
                             <w:pPr>
@@ -1162,23 +1162,23 @@
                             </w:pPr>
                           </w:p>
                         </w:txbxContent>
-                      </wps:txbx>
-                      <wps:bodyPr rot="0" spcFirstLastPara="0" vertOverflow="overflow" horzOverflow="overflow" vert="horz" wrap="square" lIns="91440" tIns="45720" rIns="91440" bIns="45720" numCol="1" spcCol="0" rtlCol="0" fromWordArt="0" anchor="ctr" anchorCtr="0" forceAA="0" compatLnSpc="1">
-                        <a:prstTxWarp prst="textNoShape">
-                          <a:avLst/>
-                        </a:prstTxWarp>
-                        <a:noAutofit/>
-                      </wps:bodyPr>
-                    </wps:wsp>
-                  </a:graphicData>
-                </a:graphic>
+                      </ns7:txbx>
+                      <ns7:bodyPr rot="0" spcFirstLastPara="0" vertOverflow="overflow" horzOverflow="overflow" vert="horz" wrap="square" lIns="91440" tIns="45720" rIns="91440" bIns="45720" numCol="1" spcCol="0" rtlCol="0" fromWordArt="0" anchor="ctr" anchorCtr="0" forceAA="0" compatLnSpc="1">
+                        <ns5:prstTxWarp prst="textNoShape">
+                          <ns5:avLst/>
+                        </ns5:prstTxWarp>
+                        <ns5:noAutofit/>
+                      </ns7:bodyPr>
+                    </ns7:wsp>
+                  </ns5:graphicData>
+                </ns5:graphic>
                 <ns4:sizeRelH relativeFrom="page">
                   <ns4:pctWidth>0</ns4:pctWidth>
                 </ns4:sizeRelH>
                 <ns4:sizeRelV relativeFrom="margin">
                   <ns4:pctHeight>0</ns4:pctHeight>
                 </ns4:sizeRelV>
-              </wp:anchor>
+              </ns3:anchor>
             </w:drawing>
           </ns1:Choice>
           <ns1:Fallback>
@@ -1374,41 +1374,41 @@
         <ns1:AlternateContent>
           <ns1:Choice Requires="wps">
             <w:drawing>
-              <wp:anchor distT="0" distB="0" distL="114300" distR="114300" simplePos="0" relativeHeight="251656192" behindDoc="0" locked="0" layoutInCell="1" allowOverlap="1" ns4:anchorId="217ACBE6" ns4:editId="7EED0DB1">
-                <wp:simplePos x="0" y="0"/>
-                <wp:positionH relativeFrom="margin">
-                  <wp:posOffset>3491231</wp:posOffset>
-                </wp:positionH>
-                <wp:positionV relativeFrom="paragraph">
-                  <wp:posOffset>245745</wp:posOffset>
-                </wp:positionV>
-                <wp:extent cx="1619250" cy="142875"/>
-                <wp:effectExtent l="0" t="0" r="19050" b="28575"/>
-                <wp:wrapNone/>
-                <wp:docPr id="32" name="Zone de texte 32"/>
-                <wp:cNvGraphicFramePr/>
-                <a:graphic>
-                  <a:graphicData uri="http://schemas.microsoft.com/office/word/2010/wordprocessingShape">
-                    <wps:wsp>
-                      <wps:cNvSpPr txBox="1"/>
-                      <wps:spPr>
-                        <a:xfrm flipV="1">
-                          <a:off x="0" y="0"/>
-                          <a:ext cx="1619250" cy="142875"/>
-                        </a:xfrm>
-                        <a:prstGeom prst="rect">
-                          <a:avLst/>
-                        </a:prstGeom>
-                        <a:solidFill>
-                          <a:schemeClr val="lt1"/>
-                        </a:solidFill>
-                        <a:ln w="6350">
-                          <a:solidFill>
-                            <a:schemeClr val="bg1"/>
-                          </a:solidFill>
-                        </a:ln>
-                      </wps:spPr>
-                      <wps:txbx>
+              <ns3:anchor distT="0" distB="0" distL="114300" distR="114300" simplePos="0" relativeHeight="251656192" behindDoc="0" locked="0" layoutInCell="1" allowOverlap="1" ns4:anchorId="217ACBE6" ns4:editId="7EED0DB1">
+                <ns3:simplePos x="0" y="0"/>
+                <ns3:positionH relativeFrom="margin">
+                  <ns3:posOffset>3491231</ns3:posOffset>
+                </ns3:positionH>
+                <ns3:positionV relativeFrom="paragraph">
+                  <ns3:posOffset>245745</ns3:posOffset>
+                </ns3:positionV>
+                <ns3:extent cx="1619250" cy="142875"/>
+                <ns3:effectExtent l="0" t="0" r="19050" b="28575"/>
+                <ns3:wrapNone/>
+                <ns3:docPr id="32" name="Zone de texte 32"/>
+                <ns3:cNvGraphicFramePr/>
+                <ns5:graphic>
+                  <ns5:graphicData uri="http://schemas.microsoft.com/office/word/2010/wordprocessingShape">
+                    <ns7:wsp>
+                      <ns7:cNvSpPr txBox="1"/>
+                      <ns7:spPr>
+                        <ns5:xfrm flipV="1">
+                          <ns5:off x="0" y="0"/>
+                          <ns5:ext cx="1619250" cy="142875"/>
+                        </ns5:xfrm>
+                        <ns5:prstGeom prst="rect">
+                          <ns5:avLst/>
+                        </ns5:prstGeom>
+                        <ns5:solidFill>
+                          <ns5:schemeClr val="lt1"/>
+                        </ns5:solidFill>
+                        <ns5:ln w="6350">
+                          <ns5:solidFill>
+                            <ns5:schemeClr val="bg1"/>
+                          </ns5:solidFill>
+                        </ns5:ln>
+                      </ns7:spPr>
+                      <ns7:txbx>
                         <w:txbxContent>
                           <w:p ns2:paraId="012B9229" ns2:textId="77777777">
                             <w:pPr>
@@ -1419,23 +1419,23 @@
                             </w:r>
                           </w:p>
                         </w:txbxContent>
-                      </wps:txbx>
-                      <wps:bodyPr rot="0" spcFirstLastPara="0" vertOverflow="overflow" horzOverflow="overflow" vert="horz" wrap="square" lIns="91440" tIns="45720" rIns="91440" bIns="45720" numCol="1" spcCol="0" rtlCol="0" fromWordArt="0" anchor="t" anchorCtr="0" forceAA="0" compatLnSpc="1">
-                        <a:prstTxWarp prst="textNoShape">
-                          <a:avLst/>
-                        </a:prstTxWarp>
-                        <a:noAutofit/>
-                      </wps:bodyPr>
-                    </wps:wsp>
-                  </a:graphicData>
-                </a:graphic>
+                      </ns7:txbx>
+                      <ns7:bodyPr rot="0" spcFirstLastPara="0" vertOverflow="overflow" horzOverflow="overflow" vert="horz" wrap="square" lIns="91440" tIns="45720" rIns="91440" bIns="45720" numCol="1" spcCol="0" rtlCol="0" fromWordArt="0" anchor="t" anchorCtr="0" forceAA="0" compatLnSpc="1">
+                        <ns5:prstTxWarp prst="textNoShape">
+                          <ns5:avLst/>
+                        </ns5:prstTxWarp>
+                        <ns5:noAutofit/>
+                      </ns7:bodyPr>
+                    </ns7:wsp>
+                  </ns5:graphicData>
+                </ns5:graphic>
                 <ns4:sizeRelH relativeFrom="margin">
                   <ns4:pctWidth>0</ns4:pctWidth>
                 </ns4:sizeRelH>
                 <ns4:sizeRelV relativeFrom="margin">
                   <ns4:pctHeight>0</ns4:pctHeight>
                 </ns4:sizeRelV>
-              </wp:anchor>
+              </ns3:anchor>
             </w:drawing>
           </ns1:Choice>
           <ns1:Fallback>
@@ -1519,55 +1519,55 @@
         <ns1:AlternateContent>
           <ns1:Choice Requires="wps">
             <w:drawing>
-              <wp:anchor distT="0" distB="0" distL="114300" distR="114300" simplePos="0" relativeHeight="251652096" behindDoc="0" locked="0" layoutInCell="1" allowOverlap="1" ns4:anchorId="67334904" ns4:editId="436FF1E3">
-                <wp:simplePos x="0" y="0"/>
-                <wp:positionH relativeFrom="column">
-                  <wp:posOffset>4790373</wp:posOffset>
-                </wp:positionH>
-                <wp:positionV relativeFrom="paragraph">
-                  <wp:posOffset>79576</wp:posOffset>
-                </wp:positionV>
-                <wp:extent cx="1596189" cy="1171575"/>
-                <wp:effectExtent l="0" t="0" r="4445" b="9525"/>
-                <wp:wrapNone/>
-                <wp:docPr id="6" name="Rectangle 6"/>
-                <wp:cNvGraphicFramePr>
-                  <a:graphicFrameLocks/>
-                </wp:cNvGraphicFramePr>
-                <a:graphic>
-                  <a:graphicData uri="http://schemas.microsoft.com/office/word/2010/wordprocessingShape">
-                    <wps:wsp>
-                      <wps:cNvSpPr>
-                        <a:spLocks noChangeArrowheads="1"/>
-                      </wps:cNvSpPr>
-                      <wps:spPr bwMode="auto">
-                        <a:xfrm>
-                          <a:off x="0" y="0"/>
-                          <a:ext cx="1596189" cy="1171575"/>
-                        </a:xfrm>
-                        <a:prstGeom prst="rect">
-                          <a:avLst/>
-                        </a:prstGeom>
-                        <a:solidFill>
-                          <a:srgbClr val="FFFFFF"/>
-                        </a:solidFill>
-                        <a:ln>
-                          <a:noFill/>
-                        </a:ln>
-                        <a:extLst>
-                          <a:ext uri="{91240B29-F687-4F45-9708-019B960494DF}">
+              <ns3:anchor distT="0" distB="0" distL="114300" distR="114300" simplePos="0" relativeHeight="251652096" behindDoc="0" locked="0" layoutInCell="1" allowOverlap="1" ns4:anchorId="67334904" ns4:editId="436FF1E3">
+                <ns3:simplePos x="0" y="0"/>
+                <ns3:positionH relativeFrom="column">
+                  <ns3:posOffset>4790373</ns3:posOffset>
+                </ns3:positionH>
+                <ns3:positionV relativeFrom="paragraph">
+                  <ns3:posOffset>79576</ns3:posOffset>
+                </ns3:positionV>
+                <ns3:extent cx="1596189" cy="1171575"/>
+                <ns3:effectExtent l="0" t="0" r="4445" b="9525"/>
+                <ns3:wrapNone/>
+                <ns3:docPr id="6" name="Rectangle 6"/>
+                <ns3:cNvGraphicFramePr>
+                  <ns5:graphicFrameLocks/>
+                </ns3:cNvGraphicFramePr>
+                <ns5:graphic>
+                  <ns5:graphicData uri="http://schemas.microsoft.com/office/word/2010/wordprocessingShape">
+                    <ns7:wsp>
+                      <ns7:cNvSpPr>
+                        <ns5:spLocks noChangeArrowheads="1"/>
+                      </ns7:cNvSpPr>
+                      <ns7:spPr bwMode="auto">
+                        <ns5:xfrm>
+                          <ns5:off x="0" y="0"/>
+                          <ns5:ext cx="1596189" cy="1171575"/>
+                        </ns5:xfrm>
+                        <ns5:prstGeom prst="rect">
+                          <ns5:avLst/>
+                        </ns5:prstGeom>
+                        <ns5:solidFill>
+                          <ns5:srgbClr val="FFFFFF"/>
+                        </ns5:solidFill>
+                        <ns5:ln>
+                          <ns5:noFill/>
+                        </ns5:ln>
+                        <ns5:extLst>
+                          <ns5:ext uri="{91240B29-F687-4F45-9708-019B960494DF}">
                             <ns8:hiddenLine w="9525">
-                              <a:solidFill>
-                                <a:srgbClr val="000000"/>
-                              </a:solidFill>
-                              <a:miter lim="800000"/>
-                              <a:headEnd/>
-                              <a:tailEnd/>
+                              <ns5:solidFill>
+                                <ns5:srgbClr val="000000"/>
+                              </ns5:solidFill>
+                              <ns5:miter lim="800000"/>
+                              <ns5:headEnd/>
+                              <ns5:tailEnd/>
                             </ns8:hiddenLine>
-                          </a:ext>
-                        </a:extLst>
-                      </wps:spPr>
-                      <wps:txbx>
+                          </ns5:ext>
+                        </ns5:extLst>
+                      </ns7:spPr>
+                      <ns7:txbx>
                         <w:txbxContent>
                           <w:p ns2:paraId="5E7C6FEF" ns2:textId="734532CE">
                             <w:pPr>
@@ -1633,20 +1633,20 @@
                             </w:r>
                           </w:p>
                         </w:txbxContent>
-                      </wps:txbx>
-                      <wps:bodyPr rot="0" vert="horz" wrap="square" lIns="91440" tIns="45720" rIns="91440" bIns="45720" anchor="t" anchorCtr="0" upright="1">
-                        <a:noAutofit/>
-                      </wps:bodyPr>
-                    </wps:wsp>
-                  </a:graphicData>
-                </a:graphic>
+                      </ns7:txbx>
+                      <ns7:bodyPr rot="0" vert="horz" wrap="square" lIns="91440" tIns="45720" rIns="91440" bIns="45720" anchor="t" anchorCtr="0" upright="1">
+                        <ns5:noAutofit/>
+                      </ns7:bodyPr>
+                    </ns7:wsp>
+                  </ns5:graphicData>
+                </ns5:graphic>
                 <ns4:sizeRelH relativeFrom="page">
                   <ns4:pctWidth>0</ns4:pctWidth>
                 </ns4:sizeRelH>
                 <ns4:sizeRelV relativeFrom="page">
                   <ns4:pctHeight>0</ns4:pctHeight>
                 </ns4:sizeRelV>
-              </wp:anchor>
+              </ns3:anchor>
             </w:drawing>
           </ns1:Choice>
           <ns1:Fallback>
@@ -1733,41 +1733,41 @@
         <ns1:AlternateContent>
           <ns1:Choice Requires="wps">
             <w:drawing>
-              <wp:anchor distT="0" distB="0" distL="114300" distR="114300" simplePos="0" relativeHeight="251660288" behindDoc="0" locked="0" layoutInCell="1" allowOverlap="1" ns4:anchorId="4E26EE04" ns4:editId="2B490783">
-                <wp:simplePos x="0" y="0"/>
-                <wp:positionH relativeFrom="margin">
-                  <wp:posOffset>-224790</wp:posOffset>
-                </wp:positionH>
-                <wp:positionV relativeFrom="paragraph">
-                  <wp:posOffset>205740</wp:posOffset>
-                </wp:positionV>
-                <wp:extent cx="2146935" cy="1771650"/>
-                <wp:effectExtent l="0" t="0" r="24765" b="19050"/>
-                <wp:wrapNone/>
-                <wp:docPr id="11" name="Zone de texte 11"/>
-                <wp:cNvGraphicFramePr/>
-                <a:graphic>
-                  <a:graphicData uri="http://schemas.microsoft.com/office/word/2010/wordprocessingShape">
-                    <wps:wsp>
-                      <wps:cNvSpPr txBox="1"/>
-                      <wps:spPr>
-                        <a:xfrm>
-                          <a:off x="0" y="0"/>
-                          <a:ext cx="2146935" cy="1771650"/>
-                        </a:xfrm>
-                        <a:prstGeom prst="rect">
-                          <a:avLst/>
-                        </a:prstGeom>
-                        <a:solidFill>
-                          <a:schemeClr val="lt1"/>
-                        </a:solidFill>
-                        <a:ln w="6350">
-                          <a:solidFill>
-                            <a:schemeClr val="bg1"/>
-                          </a:solidFill>
-                        </a:ln>
-                      </wps:spPr>
-                      <wps:txbx>
+              <ns3:anchor distT="0" distB="0" distL="114300" distR="114300" simplePos="0" relativeHeight="251660288" behindDoc="0" locked="0" layoutInCell="1" allowOverlap="1" ns4:anchorId="4E26EE04" ns4:editId="2B490783">
+                <ns3:simplePos x="0" y="0"/>
+                <ns3:positionH relativeFrom="margin">
+                  <ns3:posOffset>-224790</ns3:posOffset>
+                </ns3:positionH>
+                <ns3:positionV relativeFrom="paragraph">
+                  <ns3:posOffset>205740</ns3:posOffset>
+                </ns3:positionV>
+                <ns3:extent cx="2146935" cy="1771650"/>
+                <ns3:effectExtent l="0" t="0" r="24765" b="19050"/>
+                <ns3:wrapNone/>
+                <ns3:docPr id="11" name="Zone de texte 11"/>
+                <ns3:cNvGraphicFramePr/>
+                <ns5:graphic>
+                  <ns5:graphicData uri="http://schemas.microsoft.com/office/word/2010/wordprocessingShape">
+                    <ns7:wsp>
+                      <ns7:cNvSpPr txBox="1"/>
+                      <ns7:spPr>
+                        <ns5:xfrm>
+                          <ns5:off x="0" y="0"/>
+                          <ns5:ext cx="2146935" cy="1771650"/>
+                        </ns5:xfrm>
+                        <ns5:prstGeom prst="rect">
+                          <ns5:avLst/>
+                        </ns5:prstGeom>
+                        <ns5:solidFill>
+                          <ns5:schemeClr val="lt1"/>
+                        </ns5:solidFill>
+                        <ns5:ln w="6350">
+                          <ns5:solidFill>
+                            <ns5:schemeClr val="bg1"/>
+                          </ns5:solidFill>
+                        </ns5:ln>
+                      </ns7:spPr>
+                      <ns7:txbx>
                         <w:txbxContent>
                           <w:p ns2:paraId="1F74F718" ns2:textId="4F237188">
                             <w:pPr>
@@ -1891,23 +1891,23 @@
                             </w:pPr>
                           </w:p>
                         </w:txbxContent>
-                      </wps:txbx>
-                      <wps:bodyPr rot="0" spcFirstLastPara="0" vertOverflow="overflow" horzOverflow="overflow" vert="horz" wrap="square" lIns="91440" tIns="45720" rIns="91440" bIns="45720" numCol="1" spcCol="0" rtlCol="0" fromWordArt="0" anchor="t" anchorCtr="0" forceAA="0" compatLnSpc="1">
-                        <a:prstTxWarp prst="textNoShape">
-                          <a:avLst/>
-                        </a:prstTxWarp>
-                        <a:noAutofit/>
-                      </wps:bodyPr>
-                    </wps:wsp>
-                  </a:graphicData>
-                </a:graphic>
+                      </ns7:txbx>
+                      <ns7:bodyPr rot="0" spcFirstLastPara="0" vertOverflow="overflow" horzOverflow="overflow" vert="horz" wrap="square" lIns="91440" tIns="45720" rIns="91440" bIns="45720" numCol="1" spcCol="0" rtlCol="0" fromWordArt="0" anchor="t" anchorCtr="0" forceAA="0" compatLnSpc="1">
+                        <ns5:prstTxWarp prst="textNoShape">
+                          <ns5:avLst/>
+                        </ns5:prstTxWarp>
+                        <ns5:noAutofit/>
+                      </ns7:bodyPr>
+                    </ns7:wsp>
+                  </ns5:graphicData>
+                </ns5:graphic>
                 <ns4:sizeRelH relativeFrom="margin">
                   <ns4:pctWidth>0</ns4:pctWidth>
                 </ns4:sizeRelH>
                 <ns4:sizeRelV relativeFrom="margin">
                   <ns4:pctHeight>0</ns4:pctHeight>
                 </ns4:sizeRelV>
-              </wp:anchor>
+              </ns3:anchor>
             </w:drawing>
           </ns1:Choice>
           <ns1:Fallback>
@@ -2053,72 +2053,72 @@
         <ns1:AlternateContent>
           <ns1:Choice Requires="wps">
             <w:drawing>
-              <wp:anchor distT="0" distB="0" distL="114300" distR="114300" simplePos="0" relativeHeight="251645952" behindDoc="0" locked="0" layoutInCell="1" allowOverlap="1" ns4:anchorId="18BB8649" ns4:editId="6D1B5B49">
-                <wp:simplePos x="0" y="0"/>
-                <wp:positionH relativeFrom="column">
-                  <wp:posOffset>1840865</wp:posOffset>
-                </wp:positionH>
-                <wp:positionV relativeFrom="paragraph">
-                  <wp:posOffset>151765</wp:posOffset>
-                </wp:positionV>
-                <wp:extent cx="1734820" cy="1228725"/>
-                <wp:effectExtent l="0" t="0" r="0" b="9525"/>
-                <wp:wrapNone/>
-                <wp:docPr id="8" name="Zone de texte 8"/>
-                <wp:cNvGraphicFramePr>
-                  <a:graphicFrameLocks/>
-                </wp:cNvGraphicFramePr>
-                <a:graphic>
-                  <a:graphicData uri="http://schemas.microsoft.com/office/word/2010/wordprocessingShape">
-                    <wps:wsp>
-                      <wps:cNvSpPr txBox="1">
-                        <a:spLocks noChangeArrowheads="1"/>
-                      </wps:cNvSpPr>
-                      <wps:spPr bwMode="auto">
-                        <a:xfrm>
-                          <a:off x="0" y="0"/>
-                          <a:ext cx="1734820" cy="1228725"/>
-                        </a:xfrm>
-                        <a:prstGeom prst="rect">
-                          <a:avLst/>
-                        </a:prstGeom>
-                        <a:solidFill>
-                          <a:srgbClr val="FFFFFF"/>
-                        </a:solidFill>
-                        <a:ln>
-                          <a:noFill/>
-                        </a:ln>
-                        <a:extLst>
-                          <a:ext uri="{91240B29-F687-4F45-9708-019B960494DF}">
+              <ns3:anchor distT="0" distB="0" distL="114300" distR="114300" simplePos="0" relativeHeight="251645952" behindDoc="0" locked="0" layoutInCell="1" allowOverlap="1" ns4:anchorId="18BB8649" ns4:editId="6D1B5B49">
+                <ns3:simplePos x="0" y="0"/>
+                <ns3:positionH relativeFrom="column">
+                  <ns3:posOffset>1840865</ns3:posOffset>
+                </ns3:positionH>
+                <ns3:positionV relativeFrom="paragraph">
+                  <ns3:posOffset>151765</ns3:posOffset>
+                </ns3:positionV>
+                <ns3:extent cx="1734820" cy="1228725"/>
+                <ns3:effectExtent l="0" t="0" r="0" b="9525"/>
+                <ns3:wrapNone/>
+                <ns3:docPr id="8" name="Zone de texte 8"/>
+                <ns3:cNvGraphicFramePr>
+                  <ns5:graphicFrameLocks/>
+                </ns3:cNvGraphicFramePr>
+                <ns5:graphic>
+                  <ns5:graphicData uri="http://schemas.microsoft.com/office/word/2010/wordprocessingShape">
+                    <ns7:wsp>
+                      <ns7:cNvSpPr txBox="1">
+                        <ns5:spLocks noChangeArrowheads="1"/>
+                      </ns7:cNvSpPr>
+                      <ns7:spPr bwMode="auto">
+                        <ns5:xfrm>
+                          <ns5:off x="0" y="0"/>
+                          <ns5:ext cx="1734820" cy="1228725"/>
+                        </ns5:xfrm>
+                        <ns5:prstGeom prst="rect">
+                          <ns5:avLst/>
+                        </ns5:prstGeom>
+                        <ns5:solidFill>
+                          <ns5:srgbClr val="FFFFFF"/>
+                        </ns5:solidFill>
+                        <ns5:ln>
+                          <ns5:noFill/>
+                        </ns5:ln>
+                        <ns5:extLst>
+                          <ns5:ext uri="{91240B29-F687-4F45-9708-019B960494DF}">
                             <ns8:hiddenLine w="9525">
-                              <a:solidFill>
-                                <a:srgbClr val="000000"/>
-                              </a:solidFill>
-                              <a:miter lim="800000"/>
-                              <a:headEnd/>
-                              <a:tailEnd/>
+                              <ns5:solidFill>
+                                <ns5:srgbClr val="000000"/>
+                              </ns5:solidFill>
+                              <ns5:miter lim="800000"/>
+                              <ns5:headEnd/>
+                              <ns5:tailEnd/>
                             </ns8:hiddenLine>
-                          </a:ext>
-                        </a:extLst>
-                      </wps:spPr>
-                      <wps:txbx>
+                          </ns5:ext>
+                        </ns5:extLst>
+                      </ns7:spPr>
+                      <ns7:txbx>
                         <w:txbxContent>
                           <w:p ns2:paraId="6BEBDC5B" ns2:textId="77777777"/>
                         </w:txbxContent>
-                      </wps:txbx>
-                      <wps:bodyPr rot="0" vert="horz" wrap="square" lIns="91440" tIns="45720" rIns="91440" bIns="45720" anchor="t" anchorCtr="0" upright="1">
-                        <a:noAutofit/>
-                      </wps:bodyPr>
-                    </wps:wsp>
-                  </a:graphicData>
-                </a:graphic>
+                      </ns7:txbx>
+                      <ns7:bodyPr rot="0" vert="horz" wrap="square" lIns="91440" tIns="45720" rIns="91440" bIns="45720" anchor="t" anchorCtr="0" upright="1">
+                        <ns5:noAutofit/>
+                      </ns7:bodyPr>
+                    </ns7:wsp>
+                  </ns5:graphicData>
+                </ns5:graphic>
                 <ns4:sizeRelH relativeFrom="page">
                   <ns4:pctWidth>0</ns4:pctWidth>
                 </ns4:sizeRelH>
                 <ns4:sizeRelV relativeFrom="page">
                   <ns4:pctHeight>0</ns4:pctHeight>
                 </ns4:sizeRelV>
-              </wp:anchor>
+              </ns3:anchor>
             </w:drawing>
           </ns1:Choice>
           <ns1:Fallback>
@@ -2143,55 +2143,55 @@
         <ns1:AlternateContent>
           <ns1:Choice Requires="wps">
             <w:drawing>
-              <wp:anchor distT="0" distB="0" distL="114300" distR="114300" simplePos="0" relativeHeight="251643904" behindDoc="0" locked="0" layoutInCell="1" allowOverlap="1" ns4:anchorId="4D89E546" ns4:editId="3E2D7BAE">
-                <wp:simplePos x="0" y="0"/>
-                <wp:positionH relativeFrom="column">
-                  <wp:posOffset>-171450</wp:posOffset>
-                </wp:positionH>
-                <wp:positionV relativeFrom="paragraph">
-                  <wp:posOffset>151765</wp:posOffset>
-                </wp:positionV>
-                <wp:extent cx="2099310" cy="1228725"/>
-                <wp:effectExtent l="0" t="0" r="0" b="9525"/>
-                <wp:wrapNone/>
-                <wp:docPr id="7" name="Rectangle 7"/>
-                <wp:cNvGraphicFramePr>
-                  <a:graphicFrameLocks/>
-                </wp:cNvGraphicFramePr>
-                <a:graphic>
-                  <a:graphicData uri="http://schemas.microsoft.com/office/word/2010/wordprocessingShape">
-                    <wps:wsp>
-                      <wps:cNvSpPr>
-                        <a:spLocks noChangeArrowheads="1"/>
-                      </wps:cNvSpPr>
-                      <wps:spPr bwMode="auto">
-                        <a:xfrm>
-                          <a:off x="0" y="0"/>
-                          <a:ext cx="2099310" cy="1228725"/>
-                        </a:xfrm>
-                        <a:prstGeom prst="rect">
-                          <a:avLst/>
-                        </a:prstGeom>
-                        <a:solidFill>
-                          <a:srgbClr val="FFFFFF"/>
-                        </a:solidFill>
-                        <a:ln>
-                          <a:noFill/>
-                        </a:ln>
-                        <a:extLst>
-                          <a:ext uri="{91240B29-F687-4F45-9708-019B960494DF}">
+              <ns3:anchor distT="0" distB="0" distL="114300" distR="114300" simplePos="0" relativeHeight="251643904" behindDoc="0" locked="0" layoutInCell="1" allowOverlap="1" ns4:anchorId="4D89E546" ns4:editId="3E2D7BAE">
+                <ns3:simplePos x="0" y="0"/>
+                <ns3:positionH relativeFrom="column">
+                  <ns3:posOffset>-171450</ns3:posOffset>
+                </ns3:positionH>
+                <ns3:positionV relativeFrom="paragraph">
+                  <ns3:posOffset>151765</ns3:posOffset>
+                </ns3:positionV>
+                <ns3:extent cx="2099310" cy="1228725"/>
+                <ns3:effectExtent l="0" t="0" r="0" b="9525"/>
+                <ns3:wrapNone/>
+                <ns3:docPr id="7" name="Rectangle 7"/>
+                <ns3:cNvGraphicFramePr>
+                  <ns5:graphicFrameLocks/>
+                </ns3:cNvGraphicFramePr>
+                <ns5:graphic>
+                  <ns5:graphicData uri="http://schemas.microsoft.com/office/word/2010/wordprocessingShape">
+                    <ns7:wsp>
+                      <ns7:cNvSpPr>
+                        <ns5:spLocks noChangeArrowheads="1"/>
+                      </ns7:cNvSpPr>
+                      <ns7:spPr bwMode="auto">
+                        <ns5:xfrm>
+                          <ns5:off x="0" y="0"/>
+                          <ns5:ext cx="2099310" cy="1228725"/>
+                        </ns5:xfrm>
+                        <ns5:prstGeom prst="rect">
+                          <ns5:avLst/>
+                        </ns5:prstGeom>
+                        <ns5:solidFill>
+                          <ns5:srgbClr val="FFFFFF"/>
+                        </ns5:solidFill>
+                        <ns5:ln>
+                          <ns5:noFill/>
+                        </ns5:ln>
+                        <ns5:extLst>
+                          <ns5:ext uri="{91240B29-F687-4F45-9708-019B960494DF}">
                             <ns8:hiddenLine w="9525">
-                              <a:solidFill>
-                                <a:srgbClr val="000000"/>
-                              </a:solidFill>
-                              <a:miter lim="800000"/>
-                              <a:headEnd/>
-                              <a:tailEnd/>
+                              <ns5:solidFill>
+                                <ns5:srgbClr val="000000"/>
+                              </ns5:solidFill>
+                              <ns5:miter lim="800000"/>
+                              <ns5:headEnd/>
+                              <ns5:tailEnd/>
                             </ns8:hiddenLine>
-                          </a:ext>
-                        </a:extLst>
-                      </wps:spPr>
-                      <wps:txbx>
+                          </ns5:ext>
+                        </ns5:extLst>
+                      </ns7:spPr>
+                      <ns7:txbx>
                         <w:txbxContent>
                           <w:p ns2:paraId="684CFDC6" ns2:textId="77777777">
                             <w:pPr>
@@ -2224,20 +2224,20 @@
                             </w:r>
                           </w:p>
                         </w:txbxContent>
-                      </wps:txbx>
-                      <wps:bodyPr rot="0" vert="horz" wrap="square" lIns="91440" tIns="45720" rIns="91440" bIns="45720" anchor="t" anchorCtr="0" upright="1">
-                        <a:noAutofit/>
-                      </wps:bodyPr>
-                    </wps:wsp>
-                  </a:graphicData>
-                </a:graphic>
+                      </ns7:txbx>
+                      <ns7:bodyPr rot="0" vert="horz" wrap="square" lIns="91440" tIns="45720" rIns="91440" bIns="45720" anchor="t" anchorCtr="0" upright="1">
+                        <ns5:noAutofit/>
+                      </ns7:bodyPr>
+                    </ns7:wsp>
+                  </ns5:graphicData>
+                </ns5:graphic>
                 <ns4:sizeRelH relativeFrom="page">
                   <ns4:pctWidth>0</ns4:pctWidth>
                 </ns4:sizeRelH>
                 <ns4:sizeRelV relativeFrom="page">
                   <ns4:pctHeight>0</ns4:pctHeight>
                 </ns4:sizeRelV>
-              </wp:anchor>
+              </ns3:anchor>
             </w:drawing>
           </ns1:Choice>
           <ns1:Fallback>
@@ -2535,8 +2535,8 @@
     <w:p>
       <w:pPr>
         <w:sectPr>
-          <w:headerReference w:type="default" r:id="rId17"/>
-          <w:footerReference w:type="default" r:id="rId18"/>
+          <w:headerReference w:type="default" ns10:id="rId17"/>
+          <w:footerReference w:type="default" ns10:id="rId18"/>
           <w:type w:val="nextPage"/>
           <w:pgSz w:w="11906" w:h="16838"/>
           <w:pgMar w:top="567" w:right="1274" w:bottom="709" w:left="1134" w:header="283" w:footer="680" w:gutter="0"/>
@@ -3420,48 +3420,48 @@
         <ns1:AlternateContent>
           <ns1:Choice Requires="wps">
             <w:drawing>
-              <wp:anchor distT="0" distB="0" distL="114300" distR="114300" simplePos="0" relativeHeight="251654144" behindDoc="0" locked="0" layoutInCell="1" allowOverlap="1" ns4:anchorId="71EEA676" ns4:editId="5C963E32">
-                <wp:simplePos x="0" y="0"/>
-                <wp:positionH relativeFrom="column">
-                  <wp:posOffset>608196</wp:posOffset>
-                </wp:positionH>
-                <wp:positionV relativeFrom="paragraph">
-                  <wp:posOffset>151398</wp:posOffset>
-                </wp:positionV>
-                <wp:extent cx="5029200" cy="2838893"/>
-                <wp:effectExtent l="0" t="0" r="19050" b="19050"/>
-                <wp:wrapNone/>
-                <wp:docPr id="21" name="Plaque 21"/>
-                <wp:cNvGraphicFramePr/>
-                <a:graphic>
-                  <a:graphicData uri="http://schemas.microsoft.com/office/word/2010/wordprocessingShape">
-                    <wps:wsp>
-                      <wps:cNvSpPr/>
-                      <wps:spPr>
-                        <a:xfrm>
-                          <a:off x="0" y="0"/>
-                          <a:ext cx="5029200" cy="2838893"/>
-                        </a:xfrm>
-                        <a:prstGeom prst="bevel">
-                          <a:avLst/>
-                        </a:prstGeom>
-                        <a:ln/>
-                      </wps:spPr>
-                      <wps:style>
-                        <a:lnRef idx="2">
-                          <a:schemeClr val="accent6"/>
-                        </a:lnRef>
-                        <a:fillRef idx="1">
-                          <a:schemeClr val="lt1"/>
-                        </a:fillRef>
-                        <a:effectRef idx="0">
-                          <a:schemeClr val="accent6"/>
-                        </a:effectRef>
-                        <a:fontRef idx="minor">
-                          <a:schemeClr val="dk1"/>
-                        </a:fontRef>
-                      </wps:style>
-                      <wps:txbx>
+              <ns3:anchor distT="0" distB="0" distL="114300" distR="114300" simplePos="0" relativeHeight="251654144" behindDoc="0" locked="0" layoutInCell="1" allowOverlap="1" ns4:anchorId="71EEA676" ns4:editId="5C963E32">
+                <ns3:simplePos x="0" y="0"/>
+                <ns3:positionH relativeFrom="column">
+                  <ns3:posOffset>608196</ns3:posOffset>
+                </ns3:positionH>
+                <ns3:positionV relativeFrom="paragraph">
+                  <ns3:posOffset>151398</ns3:posOffset>
+                </ns3:positionV>
+                <ns3:extent cx="5029200" cy="2838893"/>
+                <ns3:effectExtent l="0" t="0" r="19050" b="19050"/>
+                <ns3:wrapNone/>
+                <ns3:docPr id="21" name="Plaque 21"/>
+                <ns3:cNvGraphicFramePr/>
+                <ns5:graphic>
+                  <ns5:graphicData uri="http://schemas.microsoft.com/office/word/2010/wordprocessingShape">
+                    <ns7:wsp>
+                      <ns7:cNvSpPr/>
+                      <ns7:spPr>
+                        <ns5:xfrm>
+                          <ns5:off x="0" y="0"/>
+                          <ns5:ext cx="5029200" cy="2838893"/>
+                        </ns5:xfrm>
+                        <ns5:prstGeom prst="bevel">
+                          <ns5:avLst/>
+                        </ns5:prstGeom>
+                        <ns5:ln/>
+                      </ns7:spPr>
+                      <ns7:style>
+                        <ns5:lnRef idx="2">
+                          <ns5:schemeClr val="accent6"/>
+                        </ns5:lnRef>
+                        <ns5:fillRef idx="1">
+                          <ns5:schemeClr val="lt1"/>
+                        </ns5:fillRef>
+                        <ns5:effectRef idx="0">
+                          <ns5:schemeClr val="accent6"/>
+                        </ns5:effectRef>
+                        <ns5:fontRef idx="minor">
+                          <ns5:schemeClr val="dk1"/>
+                        </ns5:fontRef>
+                      </ns7:style>
+                      <ns7:txbx>
                         <w:txbxContent>
                           <w:p ns2:paraId="0771E523" ns2:textId="77777777">
                             <w:pPr>
@@ -3609,23 +3609,23 @@
                             </w:pPr>
                           </w:p>
                         </w:txbxContent>
-                      </wps:txbx>
-                      <wps:bodyPr rot="0" spcFirstLastPara="0" vertOverflow="overflow" horzOverflow="overflow" vert="horz" wrap="square" lIns="91440" tIns="45720" rIns="91440" bIns="45720" numCol="1" spcCol="0" rtlCol="0" fromWordArt="0" anchor="ctr" anchorCtr="0" forceAA="0" compatLnSpc="1">
-                        <a:prstTxWarp prst="textNoShape">
-                          <a:avLst/>
-                        </a:prstTxWarp>
-                        <a:noAutofit/>
-                      </wps:bodyPr>
-                    </wps:wsp>
-                  </a:graphicData>
-                </a:graphic>
+                      </ns7:txbx>
+                      <ns7:bodyPr rot="0" spcFirstLastPara="0" vertOverflow="overflow" horzOverflow="overflow" vert="horz" wrap="square" lIns="91440" tIns="45720" rIns="91440" bIns="45720" numCol="1" spcCol="0" rtlCol="0" fromWordArt="0" anchor="ctr" anchorCtr="0" forceAA="0" compatLnSpc="1">
+                        <ns5:prstTxWarp prst="textNoShape">
+                          <ns5:avLst/>
+                        </ns5:prstTxWarp>
+                        <ns5:noAutofit/>
+                      </ns7:bodyPr>
+                    </ns7:wsp>
+                  </ns5:graphicData>
+                </ns5:graphic>
                 <ns4:sizeRelH relativeFrom="margin">
                   <ns4:pctWidth>0</ns4:pctWidth>
                 </ns4:sizeRelH>
                 <ns4:sizeRelV relativeFrom="margin">
                   <ns4:pctHeight>0</ns4:pctHeight>
                 </ns4:sizeRelV>
-              </wp:anchor>
+              </ns3:anchor>
             </w:drawing>
           </ns1:Choice>
           <ns1:Fallback>
@@ -12379,63 +12379,63 @@
         <ns1:AlternateContent>
           <ns1:Choice Requires="wps">
             <w:drawing>
-              <wp:anchor distT="0" distB="0" distL="114300" distR="114300" simplePos="0" relativeHeight="251676672" behindDoc="0" locked="0" layoutInCell="1" allowOverlap="1" ns4:anchorId="637AD4DA" ns4:editId="123B3BED">
-                <wp:simplePos x="0" y="0"/>
-                <wp:positionH relativeFrom="page">
-                  <wp:posOffset>2345155</wp:posOffset>
-                </wp:positionH>
-                <wp:positionV relativeFrom="paragraph">
-                  <wp:posOffset>139499</wp:posOffset>
-                </wp:positionV>
-                <wp:extent cx="2800350" cy="737369"/>
-                <wp:effectExtent l="19050" t="0" r="38100" b="24765"/>
-                <wp:wrapNone/>
-                <wp:docPr id="3" name="Hexagone 3"/>
-                <wp:cNvGraphicFramePr/>
-                <a:graphic>
-                  <a:graphicData uri="http://schemas.microsoft.com/office/word/2010/wordprocessingShape">
-                    <wps:wsp>
-                      <wps:cNvSpPr/>
-                      <wps:spPr>
-                        <a:xfrm>
-                          <a:off x="0" y="0"/>
-                          <a:ext cx="2800350" cy="737369"/>
-                        </a:xfrm>
-                        <a:prstGeom prst="hexagon">
-                          <a:avLst/>
-                        </a:prstGeom>
-                        <a:solidFill>
-                          <a:schemeClr val="bg2"/>
-                        </a:solidFill>
-                        <a:ln>
-                          <a:solidFill>
-                            <a:schemeClr val="tx1">
-                              <a:lumMod val="50000"/>
-                              <a:lumOff val="50000"/>
-                            </a:schemeClr>
-                          </a:solidFill>
-                        </a:ln>
-                        <a:effectLst>
-                          <a:innerShdw blurRad="114300">
-                            <a:prstClr val="black"/>
-                          </a:innerShdw>
-                        </a:effectLst>
-                      </wps:spPr>
-                      <wps:style>
-                        <a:lnRef idx="1">
-                          <a:schemeClr val="accent5"/>
-                        </a:lnRef>
-                        <a:fillRef idx="2">
-                          <a:schemeClr val="accent5"/>
-                        </a:fillRef>
-                        <a:effectRef idx="1">
-                          <a:schemeClr val="accent5"/>
-                        </a:effectRef>
-                        <a:fontRef idx="minor">
-                          <a:schemeClr val="dk1"/>
-                        </a:fontRef>
-                      </wps:style>
-                      <wps:txbx>
+              <ns3:anchor distT="0" distB="0" distL="114300" distR="114300" simplePos="0" relativeHeight="251676672" behindDoc="0" locked="0" layoutInCell="1" allowOverlap="1" ns4:anchorId="637AD4DA" ns4:editId="123B3BED">
+                <ns3:simplePos x="0" y="0"/>
+                <ns3:positionH relativeFrom="page">
+                  <ns3:posOffset>2345155</ns3:posOffset>
+                </ns3:positionH>
+                <ns3:positionV relativeFrom="paragraph">
+                  <ns3:posOffset>139499</ns3:posOffset>
+                </ns3:positionV>
+                <ns3:extent cx="2800350" cy="737369"/>
+                <ns3:effectExtent l="19050" t="0" r="38100" b="24765"/>
+                <ns3:wrapNone/>
+                <ns3:docPr id="3" name="Hexagone 3"/>
+                <ns3:cNvGraphicFramePr/>
+                <ns5:graphic>
+                  <ns5:graphicData uri="http://schemas.microsoft.com/office/word/2010/wordprocessingShape">
+                    <ns7:wsp>
+                      <ns7:cNvSpPr/>
+                      <ns7:spPr>
+                        <ns5:xfrm>
+                          <ns5:off x="0" y="0"/>
+                          <ns5:ext cx="2800350" cy="737369"/>
+                        </ns5:xfrm>
+                        <ns5:prstGeom prst="hexagon">
+                          <ns5:avLst/>
+                        </ns5:prstGeom>
+                        <ns5:solidFill>
+                          <ns5:schemeClr val="bg2"/>
+                        </ns5:solidFill>
+                        <ns5:ln>
+                          <ns5:solidFill>
+                            <ns5:schemeClr val="tx1">
+                              <ns5:lumMod val="50000"/>
+                              <ns5:lumOff val="50000"/>
+                            </ns5:schemeClr>
+                          </ns5:solidFill>
+                        </ns5:ln>
+                        <ns5:effectLst>
+                          <ns5:innerShdw blurRad="114300">
+                            <ns5:prstClr val="black"/>
+                          </ns5:innerShdw>
+                        </ns5:effectLst>
+                      </ns7:spPr>
+                      <ns7:style>
+                        <ns5:lnRef idx="1">
+                          <ns5:schemeClr val="accent5"/>
+                        </ns5:lnRef>
+                        <ns5:fillRef idx="2">
+                          <ns5:schemeClr val="accent5"/>
+                        </ns5:fillRef>
+                        <ns5:effectRef idx="1">
+                          <ns5:schemeClr val="accent5"/>
+                        </ns5:effectRef>
+                        <ns5:fontRef idx="minor">
+                          <ns5:schemeClr val="dk1"/>
+                        </ns5:fontRef>
+                      </ns7:style>
+                      <ns7:txbx>
                         <w:txbxContent>
                           <w:p ns2:paraId="43A51CC7" ns2:textId="77777777">
                             <w:pPr>
@@ -12481,23 +12481,23 @@
                             </w:pPr>
                           </w:p>
                         </w:txbxContent>
-                      </wps:txbx>
-                      <wps:bodyPr rot="0" spcFirstLastPara="0" vertOverflow="overflow" horzOverflow="overflow" vert="horz" wrap="square" lIns="91440" tIns="45720" rIns="91440" bIns="45720" numCol="1" spcCol="0" rtlCol="0" fromWordArt="0" anchor="ctr" anchorCtr="0" forceAA="0" compatLnSpc="1">
-                        <a:prstTxWarp prst="textNoShape">
-                          <a:avLst/>
-                        </a:prstTxWarp>
-                        <a:noAutofit/>
-                      </wps:bodyPr>
-                    </wps:wsp>
-                  </a:graphicData>
-                </a:graphic>
+                      </ns7:txbx>
+                      <ns7:bodyPr rot="0" spcFirstLastPara="0" vertOverflow="overflow" horzOverflow="overflow" vert="horz" wrap="square" lIns="91440" tIns="45720" rIns="91440" bIns="45720" numCol="1" spcCol="0" rtlCol="0" fromWordArt="0" anchor="ctr" anchorCtr="0" forceAA="0" compatLnSpc="1">
+                        <ns5:prstTxWarp prst="textNoShape">
+                          <ns5:avLst/>
+                        </ns5:prstTxWarp>
+                        <ns5:noAutofit/>
+                      </ns7:bodyPr>
+                    </ns7:wsp>
+                  </ns5:graphicData>
+                </ns5:graphic>
                 <ns4:sizeRelH relativeFrom="margin">
                   <ns4:pctWidth>0</ns4:pctWidth>
                 </ns4:sizeRelH>
                 <ns4:sizeRelV relativeFrom="margin">
                   <ns4:pctHeight>0</ns4:pctHeight>
                 </ns4:sizeRelV>
-              </wp:anchor>
+              </ns3:anchor>
             </w:drawing>
           </ns1:Choice>
           <ns1:Fallback>
@@ -13705,63 +13705,63 @@
         <ns1:AlternateContent>
           <ns1:Choice Requires="wps">
             <w:drawing>
-              <wp:anchor distT="0" distB="0" distL="114300" distR="114300" simplePos="0" relativeHeight="251666432" behindDoc="0" locked="0" layoutInCell="1" allowOverlap="1" ns4:anchorId="02512AF6" ns4:editId="2AD0919F">
-                <wp:simplePos x="0" y="0"/>
-                <wp:positionH relativeFrom="column">
-                  <wp:posOffset>638476</wp:posOffset>
-                </wp:positionH>
-                <wp:positionV relativeFrom="paragraph">
-                  <wp:posOffset>1431524</wp:posOffset>
-                </wp:positionV>
-                <wp:extent cx="4954002" cy="2269958"/>
-                <wp:effectExtent l="19050" t="0" r="37465" b="16510"/>
-                <wp:wrapNone/>
-                <wp:docPr id="4" name="Hexagone 4"/>
-                <wp:cNvGraphicFramePr/>
-                <a:graphic>
-                  <a:graphicData uri="http://schemas.microsoft.com/office/word/2010/wordprocessingShape">
-                    <wps:wsp>
-                      <wps:cNvSpPr/>
-                      <wps:spPr>
-                        <a:xfrm>
-                          <a:off x="0" y="0"/>
-                          <a:ext cx="4954002" cy="2269958"/>
-                        </a:xfrm>
-                        <a:prstGeom prst="hexagon">
-                          <a:avLst/>
-                        </a:prstGeom>
-                        <a:solidFill>
-                          <a:schemeClr val="bg2"/>
-                        </a:solidFill>
-                        <a:ln>
-                          <a:solidFill>
-                            <a:schemeClr val="tx1">
-                              <a:lumMod val="50000"/>
-                              <a:lumOff val="50000"/>
-                            </a:schemeClr>
-                          </a:solidFill>
-                        </a:ln>
-                        <a:effectLst>
-                          <a:innerShdw blurRad="114300">
-                            <a:prstClr val="black"/>
-                          </a:innerShdw>
-                        </a:effectLst>
-                      </wps:spPr>
-                      <wps:style>
-                        <a:lnRef idx="1">
-                          <a:schemeClr val="accent5"/>
-                        </a:lnRef>
-                        <a:fillRef idx="2">
-                          <a:schemeClr val="accent5"/>
-                        </a:fillRef>
-                        <a:effectRef idx="1">
-                          <a:schemeClr val="accent5"/>
-                        </a:effectRef>
-                        <a:fontRef idx="minor">
-                          <a:schemeClr val="dk1"/>
-                        </a:fontRef>
-                      </wps:style>
-                      <wps:txbx>
+              <ns3:anchor distT="0" distB="0" distL="114300" distR="114300" simplePos="0" relativeHeight="251666432" behindDoc="0" locked="0" layoutInCell="1" allowOverlap="1" ns4:anchorId="02512AF6" ns4:editId="2AD0919F">
+                <ns3:simplePos x="0" y="0"/>
+                <ns3:positionH relativeFrom="column">
+                  <ns3:posOffset>638476</ns3:posOffset>
+                </ns3:positionH>
+                <ns3:positionV relativeFrom="paragraph">
+                  <ns3:posOffset>1431524</ns3:posOffset>
+                </ns3:positionV>
+                <ns3:extent cx="4954002" cy="2269958"/>
+                <ns3:effectExtent l="19050" t="0" r="37465" b="16510"/>
+                <ns3:wrapNone/>
+                <ns3:docPr id="4" name="Hexagone 4"/>
+                <ns3:cNvGraphicFramePr/>
+                <ns5:graphic>
+                  <ns5:graphicData uri="http://schemas.microsoft.com/office/word/2010/wordprocessingShape">
+                    <ns7:wsp>
+                      <ns7:cNvSpPr/>
+                      <ns7:spPr>
+                        <ns5:xfrm>
+                          <ns5:off x="0" y="0"/>
+                          <ns5:ext cx="4954002" cy="2269958"/>
+                        </ns5:xfrm>
+                        <ns5:prstGeom prst="hexagon">
+                          <ns5:avLst/>
+                        </ns5:prstGeom>
+                        <ns5:solidFill>
+                          <ns5:schemeClr val="bg2"/>
+                        </ns5:solidFill>
+                        <ns5:ln>
+                          <ns5:solidFill>
+                            <ns5:schemeClr val="tx1">
+                              <ns5:lumMod val="50000"/>
+                              <ns5:lumOff val="50000"/>
+                            </ns5:schemeClr>
+                          </ns5:solidFill>
+                        </ns5:ln>
+                        <ns5:effectLst>
+                          <ns5:innerShdw blurRad="114300">
+                            <ns5:prstClr val="black"/>
+                          </ns5:innerShdw>
+                        </ns5:effectLst>
+                      </ns7:spPr>
+                      <ns7:style>
+                        <ns5:lnRef idx="1">
+                          <ns5:schemeClr val="accent5"/>
+                        </ns5:lnRef>
+                        <ns5:fillRef idx="2">
+                          <ns5:schemeClr val="accent5"/>
+                        </ns5:fillRef>
+                        <ns5:effectRef idx="1">
+                          <ns5:schemeClr val="accent5"/>
+                        </ns5:effectRef>
+                        <ns5:fontRef idx="minor">
+                          <ns5:schemeClr val="dk1"/>
+                        </ns5:fontRef>
+                      </ns7:style>
+                      <ns7:txbx>
                         <w:txbxContent>
                           <w:p ns2:paraId="06E29CEB" ns2:textId="77777777">
                             <w:pPr>
@@ -13873,23 +13873,23 @@
                             </w:pPr>
                           </w:p>
                         </w:txbxContent>
-                      </wps:txbx>
-                      <wps:bodyPr rot="0" spcFirstLastPara="0" vertOverflow="overflow" horzOverflow="overflow" vert="horz" wrap="square" lIns="91440" tIns="45720" rIns="91440" bIns="45720" numCol="1" spcCol="0" rtlCol="0" fromWordArt="0" anchor="ctr" anchorCtr="0" forceAA="0" compatLnSpc="1">
-                        <a:prstTxWarp prst="textNoShape">
-                          <a:avLst/>
-                        </a:prstTxWarp>
-                        <a:noAutofit/>
-                      </wps:bodyPr>
-                    </wps:wsp>
-                  </a:graphicData>
-                </a:graphic>
+                      </ns7:txbx>
+                      <ns7:bodyPr rot="0" spcFirstLastPara="0" vertOverflow="overflow" horzOverflow="overflow" vert="horz" wrap="square" lIns="91440" tIns="45720" rIns="91440" bIns="45720" numCol="1" spcCol="0" rtlCol="0" fromWordArt="0" anchor="ctr" anchorCtr="0" forceAA="0" compatLnSpc="1">
+                        <ns5:prstTxWarp prst="textNoShape">
+                          <ns5:avLst/>
+                        </ns5:prstTxWarp>
+                        <ns5:noAutofit/>
+                      </ns7:bodyPr>
+                    </ns7:wsp>
+                  </ns5:graphicData>
+                </ns5:graphic>
                 <ns4:sizeRelH relativeFrom="margin">
                   <ns4:pctWidth>0</ns4:pctWidth>
                 </ns4:sizeRelH>
                 <ns4:sizeRelV relativeFrom="margin">
                   <ns4:pctHeight>0</ns4:pctHeight>
                 </ns4:sizeRelV>
-              </wp:anchor>
+              </ns3:anchor>
             </w:drawing>
           </ns1:Choice>
           <ns1:Fallback>
@@ -15186,52 +15186,52 @@
           <w:lang w:eastAsia="fr-FR"/>
         </w:rPr>
         <w:drawing>
-          <wp:inline distT="0" distB="0" distL="0" distR="0" ns4:anchorId="6CA92A5D" ns4:editId="57984117">
-            <wp:extent cx="3429000" cy="2571750"/>
-            <wp:effectExtent l="0" t="0" r="0" b="0"/>
-            <wp:docPr id="678639386" name="Image 1"/>
-            <wp:cNvGraphicFramePr>
-              <a:graphicFrameLocks noChangeAspect="1"/>
-            </wp:cNvGraphicFramePr>
-            <a:graphic>
-              <a:graphicData uri="http://schemas.openxmlformats.org/drawingml/2006/picture">
-                <pic:pic>
-                  <pic:nvPicPr>
-                    <pic:cNvPr id="0" name="Picture 1"/>
-                    <pic:cNvPicPr>
-                      <a:picLocks noChangeAspect="1" noChangeArrowheads="1"/>
-                    </pic:cNvPicPr>
-                  </pic:nvPicPr>
-                  <pic:blipFill>
-                    <a:blip r:embed="rId11" cstate="print">
-                      <a:extLst>
-                        <a:ext uri="{28A0092B-C50C-407E-A947-70E740481C1C}">
+          <ns3:inline distT="0" distB="0" distL="0" distR="0" ns4:anchorId="6CA92A5D" ns4:editId="57984117">
+            <ns3:extent cx="3429000" cy="2571750"/>
+            <ns3:effectExtent l="0" t="0" r="0" b="0"/>
+            <ns3:docPr id="678639386" name="Image 1"/>
+            <ns3:cNvGraphicFramePr>
+              <ns5:graphicFrameLocks noChangeAspect="1"/>
+            </ns3:cNvGraphicFramePr>
+            <ns5:graphic>
+              <ns5:graphicData uri="http://schemas.openxmlformats.org/drawingml/2006/picture">
+                <ns9:pic>
+                  <ns9:nvPicPr>
+                    <ns9:cNvPr id="0" name="Picture 1"/>
+                    <ns9:cNvPicPr>
+                      <ns5:picLocks noChangeAspect="1" noChangeArrowheads="1"/>
+                    </ns9:cNvPicPr>
+                  </ns9:nvPicPr>
+                  <ns9:blipFill>
+                    <ns5:blip ns10:embed="rId11" cstate="print">
+                      <ns5:extLst>
+                        <ns5:ext uri="{28A0092B-C50C-407E-A947-70E740481C1C}">
                           <ns8:useLocalDpi val="0"/>
-                        </a:ext>
-                      </a:extLst>
-                    </a:blip>
-                    <a:srcRect/>
-                    <a:stretch>
-                      <a:fillRect/>
-                    </a:stretch>
-                  </pic:blipFill>
-                  <pic:spPr bwMode="auto">
-                    <a:xfrm>
-                      <a:off x="0" y="0"/>
-                      <a:ext cx="3429000" cy="2571750"/>
-                    </a:xfrm>
-                    <a:prstGeom prst="rect">
-                      <a:avLst/>
-                    </a:prstGeom>
-                    <a:noFill/>
-                    <a:ln>
-                      <a:noFill/>
-                    </a:ln>
-                  </pic:spPr>
-                </pic:pic>
-              </a:graphicData>
-            </a:graphic>
-          </wp:inline>
+                        </ns5:ext>
+                      </ns5:extLst>
+                    </ns5:blip>
+                    <ns5:srcRect/>
+                    <ns5:stretch>
+                      <ns5:fillRect/>
+                    </ns5:stretch>
+                  </ns9:blipFill>
+                  <ns9:spPr bwMode="auto">
+                    <ns5:xfrm>
+                      <ns5:off x="0" y="0"/>
+                      <ns5:ext cx="3429000" cy="2571750"/>
+                    </ns5:xfrm>
+                    <ns5:prstGeom prst="rect">
+                      <ns5:avLst/>
+                    </ns5:prstGeom>
+                    <ns5:noFill/>
+                    <ns5:ln>
+                      <ns5:noFill/>
+                    </ns5:ln>
+                  </ns9:spPr>
+                </ns9:pic>
+              </ns5:graphicData>
+            </ns5:graphic>
+          </ns3:inline>
         </w:drawing>
       </w:r>
     </w:p>
@@ -15330,52 +15330,52 @@
           <w:lang w:eastAsia="fr-FR"/>
         </w:rPr>
         <w:drawing>
-          <wp:inline distT="0" distB="0" distL="0" distR="0" ns4:anchorId="2B75818E" ns4:editId="15DFED95">
-            <wp:extent cx="3848674" cy="2519132"/>
-            <wp:effectExtent l="0" t="0" r="0" b="4445"/>
-            <wp:docPr id="869815646" name="Image 1"/>
-            <wp:cNvGraphicFramePr>
-              <a:graphicFrameLocks noChangeAspect="1"/>
-            </wp:cNvGraphicFramePr>
-            <a:graphic>
-              <a:graphicData uri="http://schemas.openxmlformats.org/drawingml/2006/picture">
-                <pic:pic>
-                  <pic:nvPicPr>
-                    <pic:cNvPr id="0" name="Picture 1"/>
-                    <pic:cNvPicPr>
-                      <a:picLocks noChangeAspect="1" noChangeArrowheads="1"/>
-                    </pic:cNvPicPr>
-                  </pic:nvPicPr>
-                  <pic:blipFill>
-                    <a:blip r:embed="rId12" cstate="print">
-                      <a:extLst>
-                        <a:ext uri="{28A0092B-C50C-407E-A947-70E740481C1C}">
+          <ns3:inline distT="0" distB="0" distL="0" distR="0" ns4:anchorId="2B75818E" ns4:editId="15DFED95">
+            <ns3:extent cx="3848674" cy="2519132"/>
+            <ns3:effectExtent l="0" t="0" r="0" b="4445"/>
+            <ns3:docPr id="869815646" name="Image 1"/>
+            <ns3:cNvGraphicFramePr>
+              <ns5:graphicFrameLocks noChangeAspect="1"/>
+            </ns3:cNvGraphicFramePr>
+            <ns5:graphic>
+              <ns5:graphicData uri="http://schemas.openxmlformats.org/drawingml/2006/picture">
+                <ns9:pic>
+                  <ns9:nvPicPr>
+                    <ns9:cNvPr id="0" name="Picture 1"/>
+                    <ns9:cNvPicPr>
+                      <ns5:picLocks noChangeAspect="1" noChangeArrowheads="1"/>
+                    </ns9:cNvPicPr>
+                  </ns9:nvPicPr>
+                  <ns9:blipFill>
+                    <ns5:blip ns10:embed="rId12" cstate="print">
+                      <ns5:extLst>
+                        <ns5:ext uri="{28A0092B-C50C-407E-A947-70E740481C1C}">
                           <ns8:useLocalDpi val="0"/>
-                        </a:ext>
-                      </a:extLst>
-                    </a:blip>
-                    <a:srcRect/>
-                    <a:stretch>
-                      <a:fillRect/>
-                    </a:stretch>
-                  </pic:blipFill>
-                  <pic:spPr bwMode="auto">
-                    <a:xfrm>
-                      <a:off x="0" y="0"/>
-                      <a:ext cx="3848674" cy="2519132"/>
-                    </a:xfrm>
-                    <a:prstGeom prst="rect">
-                      <a:avLst/>
-                    </a:prstGeom>
-                    <a:noFill/>
-                    <a:ln>
-                      <a:noFill/>
-                    </a:ln>
-                  </pic:spPr>
-                </pic:pic>
-              </a:graphicData>
-            </a:graphic>
-          </wp:inline>
+                        </ns5:ext>
+                      </ns5:extLst>
+                    </ns5:blip>
+                    <ns5:srcRect/>
+                    <ns5:stretch>
+                      <ns5:fillRect/>
+                    </ns5:stretch>
+                  </ns9:blipFill>
+                  <ns9:spPr bwMode="auto">
+                    <ns5:xfrm>
+                      <ns5:off x="0" y="0"/>
+                      <ns5:ext cx="3848674" cy="2519132"/>
+                    </ns5:xfrm>
+                    <ns5:prstGeom prst="rect">
+                      <ns5:avLst/>
+                    </ns5:prstGeom>
+                    <ns5:noFill/>
+                    <ns5:ln>
+                      <ns5:noFill/>
+                    </ns5:ln>
+                  </ns9:spPr>
+                </ns9:pic>
+              </ns5:graphicData>
+            </ns5:graphic>
+          </ns3:inline>
         </w:drawing>
       </w:r>
     </w:p>
@@ -21577,57 +21577,57 @@
               <ns1:AlternateContent>
                 <ns1:Choice Requires="wps">
                   <w:drawing>
-                    <wp:anchor distT="0" distB="0" distL="114300" distR="114300" simplePos="0" relativeHeight="251668480" behindDoc="0" locked="0" layoutInCell="1" allowOverlap="1" ns4:anchorId="204D920E" ns4:editId="1530E20F">
-                      <wp:simplePos x="0" y="0"/>
-                      <wp:positionH relativeFrom="column">
-                        <wp:posOffset>-49669</wp:posOffset>
-                      </wp:positionH>
-                      <wp:positionV relativeFrom="paragraph">
-                        <wp:posOffset>6601</wp:posOffset>
-                      </wp:positionV>
-                      <wp:extent cx="1682804" cy="530198"/>
-                      <wp:effectExtent l="0" t="0" r="31750" b="22860"/>
-                      <wp:wrapNone/>
-                      <wp:docPr id="81808272" name="Connecteur droit 81808272"/>
-                      <wp:cNvGraphicFramePr/>
-                      <a:graphic>
-                        <a:graphicData uri="http://schemas.microsoft.com/office/word/2010/wordprocessingShape">
-                          <wps:wsp>
-                            <wps:cNvCnPr/>
-                            <wps:spPr>
-                              <a:xfrm>
-                                <a:off x="0" y="0"/>
-                                <a:ext cx="1682804" cy="530198"/>
-                              </a:xfrm>
-                              <a:prstGeom prst="line">
-                                <a:avLst/>
-                              </a:prstGeom>
-                            </wps:spPr>
-                            <wps:style>
-                              <a:lnRef idx="1">
-                                <a:schemeClr val="accent1"/>
-                              </a:lnRef>
-                              <a:fillRef idx="0">
-                                <a:schemeClr val="accent1"/>
-                              </a:fillRef>
-                              <a:effectRef idx="0">
-                                <a:schemeClr val="accent1"/>
-                              </a:effectRef>
-                              <a:fontRef idx="minor">
-                                <a:schemeClr val="tx1"/>
-                              </a:fontRef>
-                            </wps:style>
-                            <wps:bodyPr/>
-                          </wps:wsp>
-                        </a:graphicData>
-                      </a:graphic>
+                    <ns3:anchor distT="0" distB="0" distL="114300" distR="114300" simplePos="0" relativeHeight="251668480" behindDoc="0" locked="0" layoutInCell="1" allowOverlap="1" ns4:anchorId="204D920E" ns4:editId="1530E20F">
+                      <ns3:simplePos x="0" y="0"/>
+                      <ns3:positionH relativeFrom="column">
+                        <ns3:posOffset>-49669</ns3:posOffset>
+                      </ns3:positionH>
+                      <ns3:positionV relativeFrom="paragraph">
+                        <ns3:posOffset>6601</ns3:posOffset>
+                      </ns3:positionV>
+                      <ns3:extent cx="1682804" cy="530198"/>
+                      <ns3:effectExtent l="0" t="0" r="31750" b="22860"/>
+                      <ns3:wrapNone/>
+                      <ns3:docPr id="81808272" name="Connecteur droit 81808272"/>
+                      <ns3:cNvGraphicFramePr/>
+                      <ns5:graphic>
+                        <ns5:graphicData uri="http://schemas.microsoft.com/office/word/2010/wordprocessingShape">
+                          <ns7:wsp>
+                            <ns7:cNvCnPr/>
+                            <ns7:spPr>
+                              <ns5:xfrm>
+                                <ns5:off x="0" y="0"/>
+                                <ns5:ext cx="1682804" cy="530198"/>
+                              </ns5:xfrm>
+                              <ns5:prstGeom prst="line">
+                                <ns5:avLst/>
+                              </ns5:prstGeom>
+                            </ns7:spPr>
+                            <ns7:style>
+                              <ns5:lnRef idx="1">
+                                <ns5:schemeClr val="accent1"/>
+                              </ns5:lnRef>
+                              <ns5:fillRef idx="0">
+                                <ns5:schemeClr val="accent1"/>
+                              </ns5:fillRef>
+                              <ns5:effectRef idx="0">
+                                <ns5:schemeClr val="accent1"/>
+                              </ns5:effectRef>
+                              <ns5:fontRef idx="minor">
+                                <ns5:schemeClr val="tx1"/>
+                              </ns5:fontRef>
+                            </ns7:style>
+                            <ns7:bodyPr/>
+                          </ns7:wsp>
+                        </ns5:graphicData>
+                      </ns5:graphic>
                       <ns4:sizeRelH relativeFrom="margin">
                         <ns4:pctWidth>0</ns4:pctWidth>
                       </ns4:sizeRelH>
                       <ns4:sizeRelV relativeFrom="margin">
                         <ns4:pctHeight>0</ns4:pctHeight>
                       </ns4:sizeRelV>
-                    </wp:anchor>
+                    </ns3:anchor>
                   </w:drawing>
                 </ns1:Choice>
                 <ns1:Fallback>
@@ -22265,17 +22265,13 @@
     <w:p ns2:paraId="379DAD50" ns2:textId="77777777">
       <w:pPr>
         <w:pStyle w:val="MemoirePetit"/>
-        <w:tabs>
-          <w:tab w:val="left" w:pos="6190"/>
-          <w:tab w:val="left" w:pos="7230"/>
-        </w:tabs>
-        <w:rPr/>
         <w:spacing w:before="0" w:after="0" w:line="240" w:lineRule="auto"/>
         <w:ind w:firstLine="0"/>
         <w:jc w:val="left"/>
       </w:pPr>
       <w:r>
         <w:rPr>
+          <w:rFonts w:ascii="Times New Roman" w:eastAsia="Times New Roman" w:hAnsi="Times New Roman" w:cs="Times New Roman"/>
           <w:sz w:val="20"/>
           <w:szCs w:val="20"/>
         </w:rPr>
@@ -23881,63 +23877,63 @@
         <ns1:AlternateContent>
           <ns1:Choice Requires="wps">
             <w:drawing>
-              <wp:anchor distT="0" distB="0" distL="114300" distR="114300" simplePos="0" relativeHeight="251670528" behindDoc="0" locked="0" layoutInCell="1" allowOverlap="1" ns4:anchorId="32DDB414" ns4:editId="2BFBAC07">
-                <wp:simplePos x="0" y="0"/>
-                <wp:positionH relativeFrom="column">
-                  <wp:posOffset>694624</wp:posOffset>
-                </wp:positionH>
-                <wp:positionV relativeFrom="paragraph">
-                  <wp:posOffset>1940092</wp:posOffset>
-                </wp:positionV>
-                <wp:extent cx="4200024" cy="1860884"/>
-                <wp:effectExtent l="19050" t="0" r="29210" b="25400"/>
-                <wp:wrapNone/>
-                <wp:docPr id="5" name="Hexagone 5"/>
-                <wp:cNvGraphicFramePr/>
-                <a:graphic>
-                  <a:graphicData uri="http://schemas.microsoft.com/office/word/2010/wordprocessingShape">
-                    <wps:wsp>
-                      <wps:cNvSpPr/>
-                      <wps:spPr>
-                        <a:xfrm>
-                          <a:off x="0" y="0"/>
-                          <a:ext cx="4200024" cy="1860884"/>
-                        </a:xfrm>
-                        <a:prstGeom prst="hexagon">
-                          <a:avLst/>
-                        </a:prstGeom>
-                        <a:solidFill>
-                          <a:schemeClr val="bg2"/>
-                        </a:solidFill>
-                        <a:ln>
-                          <a:solidFill>
-                            <a:schemeClr val="tx1">
-                              <a:lumMod val="50000"/>
-                              <a:lumOff val="50000"/>
-                            </a:schemeClr>
-                          </a:solidFill>
-                        </a:ln>
-                        <a:effectLst>
-                          <a:innerShdw blurRad="114300">
-                            <a:prstClr val="black"/>
-                          </a:innerShdw>
-                        </a:effectLst>
-                      </wps:spPr>
-                      <wps:style>
-                        <a:lnRef idx="1">
-                          <a:schemeClr val="accent5"/>
-                        </a:lnRef>
-                        <a:fillRef idx="2">
-                          <a:schemeClr val="accent5"/>
-                        </a:fillRef>
-                        <a:effectRef idx="1">
-                          <a:schemeClr val="accent5"/>
-                        </a:effectRef>
-                        <a:fontRef idx="minor">
-                          <a:schemeClr val="dk1"/>
-                        </a:fontRef>
-                      </wps:style>
-                      <wps:txbx>
+              <ns3:anchor distT="0" distB="0" distL="114300" distR="114300" simplePos="0" relativeHeight="251670528" behindDoc="0" locked="0" layoutInCell="1" allowOverlap="1" ns4:anchorId="32DDB414" ns4:editId="2BFBAC07">
+                <ns3:simplePos x="0" y="0"/>
+                <ns3:positionH relativeFrom="column">
+                  <ns3:posOffset>694624</ns3:posOffset>
+                </ns3:positionH>
+                <ns3:positionV relativeFrom="paragraph">
+                  <ns3:posOffset>1940092</ns3:posOffset>
+                </ns3:positionV>
+                <ns3:extent cx="4200024" cy="1860884"/>
+                <ns3:effectExtent l="19050" t="0" r="29210" b="25400"/>
+                <ns3:wrapNone/>
+                <ns3:docPr id="5" name="Hexagone 5"/>
+                <ns3:cNvGraphicFramePr/>
+                <ns5:graphic>
+                  <ns5:graphicData uri="http://schemas.microsoft.com/office/word/2010/wordprocessingShape">
+                    <ns7:wsp>
+                      <ns7:cNvSpPr/>
+                      <ns7:spPr>
+                        <ns5:xfrm>
+                          <ns5:off x="0" y="0"/>
+                          <ns5:ext cx="4200024" cy="1860884"/>
+                        </ns5:xfrm>
+                        <ns5:prstGeom prst="hexagon">
+                          <ns5:avLst/>
+                        </ns5:prstGeom>
+                        <ns5:solidFill>
+                          <ns5:schemeClr val="bg2"/>
+                        </ns5:solidFill>
+                        <ns5:ln>
+                          <ns5:solidFill>
+                            <ns5:schemeClr val="tx1">
+                              <ns5:lumMod val="50000"/>
+                              <ns5:lumOff val="50000"/>
+                            </ns5:schemeClr>
+                          </ns5:solidFill>
+                        </ns5:ln>
+                        <ns5:effectLst>
+                          <ns5:innerShdw blurRad="114300">
+                            <ns5:prstClr val="black"/>
+                          </ns5:innerShdw>
+                        </ns5:effectLst>
+                      </ns7:spPr>
+                      <ns7:style>
+                        <ns5:lnRef idx="1">
+                          <ns5:schemeClr val="accent5"/>
+                        </ns5:lnRef>
+                        <ns5:fillRef idx="2">
+                          <ns5:schemeClr val="accent5"/>
+                        </ns5:fillRef>
+                        <ns5:effectRef idx="1">
+                          <ns5:schemeClr val="accent5"/>
+                        </ns5:effectRef>
+                        <ns5:fontRef idx="minor">
+                          <ns5:schemeClr val="dk1"/>
+                        </ns5:fontRef>
+                      </ns7:style>
+                      <ns7:txbx>
                         <w:txbxContent>
                           <w:p ns2:paraId="7015052D" ns2:textId="77777777">
                             <w:pPr>
@@ -24049,23 +24045,23 @@
                             </w:pPr>
                           </w:p>
                         </w:txbxContent>
-                      </wps:txbx>
-                      <wps:bodyPr rot="0" spcFirstLastPara="0" vertOverflow="overflow" horzOverflow="overflow" vert="horz" wrap="square" lIns="91440" tIns="45720" rIns="91440" bIns="45720" numCol="1" spcCol="0" rtlCol="0" fromWordArt="0" anchor="ctr" anchorCtr="0" forceAA="0" compatLnSpc="1">
-                        <a:prstTxWarp prst="textNoShape">
-                          <a:avLst/>
-                        </a:prstTxWarp>
-                        <a:noAutofit/>
-                      </wps:bodyPr>
-                    </wps:wsp>
-                  </a:graphicData>
-                </a:graphic>
+                      </ns7:txbx>
+                      <ns7:bodyPr rot="0" spcFirstLastPara="0" vertOverflow="overflow" horzOverflow="overflow" vert="horz" wrap="square" lIns="91440" tIns="45720" rIns="91440" bIns="45720" numCol="1" spcCol="0" rtlCol="0" fromWordArt="0" anchor="ctr" anchorCtr="0" forceAA="0" compatLnSpc="1">
+                        <ns5:prstTxWarp prst="textNoShape">
+                          <ns5:avLst/>
+                        </ns5:prstTxWarp>
+                        <ns5:noAutofit/>
+                      </ns7:bodyPr>
+                    </ns7:wsp>
+                  </ns5:graphicData>
+                </ns5:graphic>
                 <ns4:sizeRelH relativeFrom="margin">
                   <ns4:pctWidth>0</ns4:pctWidth>
                 </ns4:sizeRelH>
                 <ns4:sizeRelV relativeFrom="margin">
                   <ns4:pctHeight>0</ns4:pctHeight>
                 </ns4:sizeRelV>
-              </wp:anchor>
+              </ns3:anchor>
             </w:drawing>
           </ns1:Choice>
           <ns1:Fallback>
@@ -29394,13 +29390,13 @@
     <w:p ns2:paraId="2D357691" ns2:textId="6BBCC64C">
       <w:pPr>
         <w:pStyle w:val="MemoirePetit"/>
-        <w:rPr/>
         <w:spacing w:before="0" w:after="0" w:line="240" w:lineRule="auto"/>
         <w:ind w:firstLine="0"/>
         <w:jc w:val="left"/>
       </w:pPr>
       <w:r>
         <w:rPr>
+          <w:rFonts w:ascii="Times New Roman" w:eastAsia="Times New Roman" w:hAnsi="Times New Roman" w:cs="Times New Roman"/>
           <w:sz w:val="20"/>
           <w:szCs w:val="20"/>
         </w:rPr>
@@ -30654,18 +30650,13 @@
     <w:p ns2:paraId="33B7D2C5" ns2:textId="77777777">
       <w:pPr>
         <w:pStyle w:val="MemoirePetit"/>
-        <w:tabs>
-          <w:tab w:val="left" w:pos="7230"/>
-        </w:tabs>
-        <w:rPr>
-          <w:rStyle w:val="bumpedfont15"/>
-        </w:rPr>
         <w:spacing w:before="0" w:after="0" w:line="240" w:lineRule="auto"/>
         <w:ind w:firstLine="0"/>
         <w:jc w:val="left"/>
       </w:pPr>
       <w:r>
         <w:rPr>
+          <w:rFonts w:ascii="Times New Roman" w:eastAsia="Times New Roman" w:hAnsi="Times New Roman" w:cs="Times New Roman"/>
           <w:sz w:val="20"/>
           <w:szCs w:val="20"/>
         </w:rPr>
@@ -32957,63 +32948,63 @@
         <ns1:AlternateContent>
           <ns1:Choice Requires="wps">
             <w:drawing>
-              <wp:anchor distT="0" distB="0" distL="114300" distR="114300" simplePos="0" relativeHeight="251672576" behindDoc="0" locked="0" layoutInCell="1" allowOverlap="1" ns4:anchorId="32B4755B" ns4:editId="01F0F7E8">
-                <wp:simplePos x="0" y="0"/>
-                <wp:positionH relativeFrom="column">
-                  <wp:posOffset>109086</wp:posOffset>
-                </wp:positionH>
-                <wp:positionV relativeFrom="paragraph">
-                  <wp:posOffset>1226218</wp:posOffset>
-                </wp:positionV>
-                <wp:extent cx="5683919" cy="2935706"/>
-                <wp:effectExtent l="19050" t="0" r="31115" b="17145"/>
-                <wp:wrapNone/>
-                <wp:docPr id="10" name="Hexagone 10"/>
-                <wp:cNvGraphicFramePr/>
-                <a:graphic>
-                  <a:graphicData uri="http://schemas.microsoft.com/office/word/2010/wordprocessingShape">
-                    <wps:wsp>
-                      <wps:cNvSpPr/>
-                      <wps:spPr>
-                        <a:xfrm>
-                          <a:off x="0" y="0"/>
-                          <a:ext cx="5683919" cy="2935706"/>
-                        </a:xfrm>
-                        <a:prstGeom prst="hexagon">
-                          <a:avLst/>
-                        </a:prstGeom>
-                        <a:solidFill>
-                          <a:schemeClr val="bg2"/>
-                        </a:solidFill>
-                        <a:ln>
-                          <a:solidFill>
-                            <a:schemeClr val="tx1">
-                              <a:lumMod val="50000"/>
-                              <a:lumOff val="50000"/>
-                            </a:schemeClr>
-                          </a:solidFill>
-                        </a:ln>
-                        <a:effectLst>
-                          <a:innerShdw blurRad="114300">
-                            <a:prstClr val="black"/>
-                          </a:innerShdw>
-                        </a:effectLst>
-                      </wps:spPr>
-                      <wps:style>
-                        <a:lnRef idx="1">
-                          <a:schemeClr val="accent5"/>
-                        </a:lnRef>
-                        <a:fillRef idx="2">
-                          <a:schemeClr val="accent5"/>
-                        </a:fillRef>
-                        <a:effectRef idx="1">
-                          <a:schemeClr val="accent5"/>
-                        </a:effectRef>
-                        <a:fontRef idx="minor">
-                          <a:schemeClr val="dk1"/>
-                        </a:fontRef>
-                      </wps:style>
-                      <wps:txbx>
+              <ns3:anchor distT="0" distB="0" distL="114300" distR="114300" simplePos="0" relativeHeight="251672576" behindDoc="0" locked="0" layoutInCell="1" allowOverlap="1" ns4:anchorId="32B4755B" ns4:editId="01F0F7E8">
+                <ns3:simplePos x="0" y="0"/>
+                <ns3:positionH relativeFrom="column">
+                  <ns3:posOffset>109086</ns3:posOffset>
+                </ns3:positionH>
+                <ns3:positionV relativeFrom="paragraph">
+                  <ns3:posOffset>1226218</ns3:posOffset>
+                </ns3:positionV>
+                <ns3:extent cx="5683919" cy="2935706"/>
+                <ns3:effectExtent l="19050" t="0" r="31115" b="17145"/>
+                <ns3:wrapNone/>
+                <ns3:docPr id="10" name="Hexagone 10"/>
+                <ns3:cNvGraphicFramePr/>
+                <ns5:graphic>
+                  <ns5:graphicData uri="http://schemas.microsoft.com/office/word/2010/wordprocessingShape">
+                    <ns7:wsp>
+                      <ns7:cNvSpPr/>
+                      <ns7:spPr>
+                        <ns5:xfrm>
+                          <ns5:off x="0" y="0"/>
+                          <ns5:ext cx="5683919" cy="2935706"/>
+                        </ns5:xfrm>
+                        <ns5:prstGeom prst="hexagon">
+                          <ns5:avLst/>
+                        </ns5:prstGeom>
+                        <ns5:solidFill>
+                          <ns5:schemeClr val="bg2"/>
+                        </ns5:solidFill>
+                        <ns5:ln>
+                          <ns5:solidFill>
+                            <ns5:schemeClr val="tx1">
+                              <ns5:lumMod val="50000"/>
+                              <ns5:lumOff val="50000"/>
+                            </ns5:schemeClr>
+                          </ns5:solidFill>
+                        </ns5:ln>
+                        <ns5:effectLst>
+                          <ns5:innerShdw blurRad="114300">
+                            <ns5:prstClr val="black"/>
+                          </ns5:innerShdw>
+                        </ns5:effectLst>
+                      </ns7:spPr>
+                      <ns7:style>
+                        <ns5:lnRef idx="1">
+                          <ns5:schemeClr val="accent5"/>
+                        </ns5:lnRef>
+                        <ns5:fillRef idx="2">
+                          <ns5:schemeClr val="accent5"/>
+                        </ns5:fillRef>
+                        <ns5:effectRef idx="1">
+                          <ns5:schemeClr val="accent5"/>
+                        </ns5:effectRef>
+                        <ns5:fontRef idx="minor">
+                          <ns5:schemeClr val="dk1"/>
+                        </ns5:fontRef>
+                      </ns7:style>
+                      <ns7:txbx>
                         <w:txbxContent>
                           <w:p ns2:paraId="7F8011E6" ns2:textId="77777777">
                             <w:pPr>
@@ -33133,23 +33124,23 @@
                             </w:pPr>
                           </w:p>
                         </w:txbxContent>
-                      </wps:txbx>
-                      <wps:bodyPr rot="0" spcFirstLastPara="0" vertOverflow="overflow" horzOverflow="overflow" vert="horz" wrap="square" lIns="91440" tIns="45720" rIns="91440" bIns="45720" numCol="1" spcCol="0" rtlCol="0" fromWordArt="0" anchor="ctr" anchorCtr="0" forceAA="0" compatLnSpc="1">
-                        <a:prstTxWarp prst="textNoShape">
-                          <a:avLst/>
-                        </a:prstTxWarp>
-                        <a:noAutofit/>
-                      </wps:bodyPr>
-                    </wps:wsp>
-                  </a:graphicData>
-                </a:graphic>
+                      </ns7:txbx>
+                      <ns7:bodyPr rot="0" spcFirstLastPara="0" vertOverflow="overflow" horzOverflow="overflow" vert="horz" wrap="square" lIns="91440" tIns="45720" rIns="91440" bIns="45720" numCol="1" spcCol="0" rtlCol="0" fromWordArt="0" anchor="ctr" anchorCtr="0" forceAA="0" compatLnSpc="1">
+                        <ns5:prstTxWarp prst="textNoShape">
+                          <ns5:avLst/>
+                        </ns5:prstTxWarp>
+                        <ns5:noAutofit/>
+                      </ns7:bodyPr>
+                    </ns7:wsp>
+                  </ns5:graphicData>
+                </ns5:graphic>
                 <ns4:sizeRelH relativeFrom="margin">
                   <ns4:pctWidth>0</ns4:pctWidth>
                 </ns4:sizeRelH>
                 <ns4:sizeRelV relativeFrom="margin">
                   <ns4:pctHeight>0</ns4:pctHeight>
                 </ns4:sizeRelV>
-              </wp:anchor>
+              </ns3:anchor>
             </w:drawing>
           </ns1:Choice>
           <ns1:Fallback>
@@ -33991,13 +33982,13 @@
     <w:p ns2:paraId="1845EDA0" ns2:textId="77777777">
       <w:pPr>
         <w:pStyle w:val="MemoirePetit"/>
-        <w:rPr/>
         <w:spacing w:before="0" w:after="0" w:line="240" w:lineRule="auto"/>
         <w:ind w:firstLine="0"/>
         <w:jc w:val="left"/>
       </w:pPr>
       <w:r>
         <w:rPr>
+          <w:rFonts w:ascii="Times New Roman" w:eastAsia="Times New Roman" w:hAnsi="Times New Roman" w:cs="Times New Roman"/>
           <w:sz w:val="20"/>
           <w:szCs w:val="20"/>
         </w:rPr>
@@ -34693,13 +34684,13 @@
     <w:p ns2:paraId="116C770C" ns2:textId="21A447BD">
       <w:pPr>
         <w:pStyle w:val="MemoirePetit"/>
-        <w:rPr/>
         <w:spacing w:before="0" w:after="0" w:line="240" w:lineRule="auto"/>
         <w:ind w:firstLine="0"/>
         <w:jc w:val="left"/>
       </w:pPr>
       <w:r>
         <w:rPr>
+          <w:rFonts w:ascii="Times New Roman" w:eastAsia="Times New Roman" w:hAnsi="Times New Roman" w:cs="Times New Roman"/>
           <w:sz w:val="20"/>
           <w:szCs w:val="20"/>
         </w:rPr>
@@ -35178,13 +35169,13 @@
     <w:p ns2:paraId="67A90275" ns2:textId="59F0DEA1">
       <w:pPr>
         <w:pStyle w:val="MemoirePetit"/>
-        <w:rPr/>
         <w:spacing w:before="0" w:after="0" w:line="240" w:lineRule="auto"/>
         <w:ind w:firstLine="0"/>
         <w:jc w:val="left"/>
       </w:pPr>
       <w:r>
         <w:rPr>
+          <w:rFonts w:ascii="Times New Roman" w:eastAsia="Times New Roman" w:hAnsi="Times New Roman" w:cs="Times New Roman"/>
           <w:sz w:val="20"/>
           <w:szCs w:val="20"/>
         </w:rPr>
@@ -35997,13 +35988,13 @@
     <w:p ns2:paraId="5C398EC4" ns2:textId="6A924FD7">
       <w:pPr>
         <w:pStyle w:val="MemoirePetit"/>
-        <w:rPr/>
         <w:spacing w:before="0" w:after="0" w:line="240" w:lineRule="auto"/>
         <w:ind w:firstLine="0"/>
         <w:jc w:val="left"/>
       </w:pPr>
       <w:r>
         <w:rPr>
+          <w:rFonts w:ascii="Times New Roman" w:eastAsia="Times New Roman" w:hAnsi="Times New Roman" w:cs="Times New Roman"/>
           <w:sz w:val="20"/>
           <w:szCs w:val="20"/>
         </w:rPr>
@@ -37624,13 +37615,13 @@
     <w:p ns2:paraId="0C368B3F" ns2:textId="77777777">
       <w:pPr>
         <w:pStyle w:val="MemoirePetit"/>
-        <w:rPr/>
         <w:spacing w:before="0" w:after="0" w:line="240" w:lineRule="auto"/>
         <w:ind w:firstLine="0"/>
         <w:jc w:val="left"/>
       </w:pPr>
       <w:r>
         <w:rPr>
+          <w:rFonts w:ascii="Times New Roman" w:eastAsia="Times New Roman" w:hAnsi="Times New Roman" w:cs="Times New Roman"/>
           <w:sz w:val="20"/>
           <w:szCs w:val="20"/>
         </w:rPr>
@@ -39420,13 +39411,13 @@
     <w:p ns2:paraId="5FDDA0B9" ns2:textId="440ACF7E">
       <w:pPr>
         <w:pStyle w:val="MemoirePetit"/>
-        <w:rPr/>
         <w:spacing w:before="0" w:after="0" w:line="240" w:lineRule="auto"/>
         <w:ind w:firstLine="0"/>
         <w:jc w:val="left"/>
       </w:pPr>
       <w:r>
         <w:rPr>
+          <w:rFonts w:ascii="Times New Roman" w:eastAsia="Times New Roman" w:hAnsi="Times New Roman" w:cs="Times New Roman"/>
           <w:sz w:val="20"/>
           <w:szCs w:val="20"/>
         </w:rPr>
@@ -41039,13 +41030,13 @@
     <w:p ns2:paraId="09961EAB" ns2:textId="77777777">
       <w:pPr>
         <w:pStyle w:val="MemoirePetit"/>
-        <w:rPr/>
         <w:spacing w:before="0" w:after="0" w:line="240" w:lineRule="auto"/>
         <w:ind w:firstLine="0"/>
         <w:jc w:val="left"/>
       </w:pPr>
       <w:r>
         <w:rPr>
+          <w:rFonts w:ascii="Times New Roman" w:eastAsia="Times New Roman" w:hAnsi="Times New Roman" w:cs="Times New Roman"/>
           <w:sz w:val="20"/>
           <w:szCs w:val="20"/>
         </w:rPr>
@@ -46248,7 +46239,7 @@
         </w:rPr>
         <w:t xml:space="preserve">Association Nationale des Communes du Bénin (ANCB). </w:t>
       </w:r>
-      <w:hyperlink r:id="rId13" w:history="1">
+      <w:hyperlink ns10:id="rId13" w:history="1">
         <w:r>
           <w:rPr>
             <w:rStyle w:val="Lienhypertexte"/>
@@ -46279,7 +46270,7 @@
         </w:rPr>
         <w:t xml:space="preserve">Ministère de la Décentralisation et de la Gouvernance Locale. </w:t>
       </w:r>
-      <w:hyperlink r:id="rId14" w:history="1">
+      <w:hyperlink ns10:id="rId14" w:history="1">
         <w:r>
           <w:rPr>
             <w:rStyle w:val="Lienhypertexte"/>
@@ -46310,7 +46301,7 @@
         </w:rPr>
         <w:t xml:space="preserve">Portail officiel du Gouvernement du Bénin. </w:t>
       </w:r>
-      <w:hyperlink r:id="rId15" w:history="1">
+      <w:hyperlink ns10:id="rId15" w:history="1">
         <w:r>
           <w:rPr>
             <w:rStyle w:val="Lienhypertexte"/>
@@ -46399,39 +46390,39 @@
           <w:lang w:eastAsia="fr-FR"/>
         </w:rPr>
         <w:drawing>
-          <wp:inline distT="0" distB="0" distL="0" distR="0" ns4:anchorId="45039B84" ns4:editId="0FE15AB8">
-            <wp:extent cx="5580380" cy="3150938"/>
-            <wp:effectExtent l="0" t="0" r="0" b="7620"/>
-            <wp:docPr id="748763123" name="Image 1"/>
-            <wp:cNvGraphicFramePr>
-              <a:graphicFrameLocks noChangeAspect="1"/>
-            </wp:cNvGraphicFramePr>
-            <a:graphic>
-              <a:graphicData uri="http://schemas.openxmlformats.org/drawingml/2006/picture">
-                <pic:pic>
-                  <pic:nvPicPr>
-                    <pic:cNvPr id="748763123" name=""/>
-                    <pic:cNvPicPr/>
-                  </pic:nvPicPr>
-                  <pic:blipFill>
-                    <a:blip r:embed="rId16"/>
-                    <a:stretch>
-                      <a:fillRect/>
-                    </a:stretch>
-                  </pic:blipFill>
-                  <pic:spPr>
-                    <a:xfrm>
-                      <a:off x="0" y="0"/>
-                      <a:ext cx="5580380" cy="3150938"/>
-                    </a:xfrm>
-                    <a:prstGeom prst="rect">
-                      <a:avLst/>
-                    </a:prstGeom>
-                  </pic:spPr>
-                </pic:pic>
-              </a:graphicData>
-            </a:graphic>
-          </wp:inline>
+          <ns3:inline distT="0" distB="0" distL="0" distR="0" ns4:anchorId="45039B84" ns4:editId="0FE15AB8">
+            <ns3:extent cx="5580380" cy="3150938"/>
+            <ns3:effectExtent l="0" t="0" r="0" b="7620"/>
+            <ns3:docPr id="748763123" name="Image 1"/>
+            <ns3:cNvGraphicFramePr>
+              <ns5:graphicFrameLocks noChangeAspect="1"/>
+            </ns3:cNvGraphicFramePr>
+            <ns5:graphic>
+              <ns5:graphicData uri="http://schemas.openxmlformats.org/drawingml/2006/picture">
+                <ns9:pic>
+                  <ns9:nvPicPr>
+                    <ns9:cNvPr id="748763123" name=""/>
+                    <ns9:cNvPicPr/>
+                  </ns9:nvPicPr>
+                  <ns9:blipFill>
+                    <ns5:blip ns10:embed="rId16"/>
+                    <ns5:stretch>
+                      <ns5:fillRect/>
+                    </ns5:stretch>
+                  </ns9:blipFill>
+                  <ns9:spPr>
+                    <ns5:xfrm>
+                      <ns5:off x="0" y="0"/>
+                      <ns5:ext cx="5580380" cy="3150938"/>
+                    </ns5:xfrm>
+                    <ns5:prstGeom prst="rect">
+                      <ns5:avLst/>
+                    </ns5:prstGeom>
+                  </ns9:spPr>
+                </ns9:pic>
+              </ns5:graphicData>
+            </ns5:graphic>
+          </ns3:inline>
         </w:drawing>
       </w:r>
     </w:p>
@@ -47588,8 +47579,8 @@
       </w:pPr>
     </w:p>
     <w:sectPr>
-      <w:headerReference w:type="default" r:id="rId17"/>
-      <w:footerReference w:type="default" r:id="rId18"/>
+      <w:headerReference w:type="default" ns10:id="rId17"/>
+      <w:footerReference w:type="default" ns10:id="rId18"/>
       <w:pgSz w:w="11906" w:h="16838"/>
       <w:pgMar w:top="1417" w:right="1417" w:bottom="1417" w:left="1701" w:header="283" w:footer="680" w:gutter="0"/>
       <w:cols w:space="708"/>

</xml_diff>

<commit_message>
Harmonisation de la présentation des citations
</commit_message>
<xml_diff>
--- a/doc.docx
+++ b/doc.docx
@@ -14913,9 +14913,9 @@
     <w:p ns2:paraId="421CE442" ns2:textId="77777777">
       <w:pPr>
         <w:pStyle w:val="MemoireCorps"/>
-        <w:rPr>
-          <w:lang w:eastAsia="fr-FR"/>
-        </w:rPr>
+        <w:spacing w:before="0" w:after="120" w:line="360" w:lineRule="auto"/>
+        <w:ind w:firstLine="567"/>
+        <w:jc w:val="both"/>
       </w:pPr>
       <w:r>
         <w:rPr>
@@ -15481,7 +15481,9 @@
     <w:p ns2:paraId="1CE4CF90" ns2:textId="5B77E3C6">
       <w:pPr>
         <w:pStyle w:val="MemoireCorps"/>
-        <w:rPr/>
+        <w:spacing w:before="0" w:after="120" w:line="360" w:lineRule="auto"/>
+        <w:ind w:firstLine="567"/>
+        <w:jc w:val="both"/>
       </w:pPr>
       <w:r>
         <w:rPr/>
@@ -30709,10 +30711,9 @@
     <w:p ns2:paraId="41F89BFD" ns2:textId="77777777">
       <w:pPr>
         <w:pStyle w:val="MemoireCorps"/>
-        <w:tabs>
-          <w:tab w:val="left" w:pos="7230"/>
-        </w:tabs>
-        <w:rPr/>
+        <w:spacing w:before="0" w:after="120" w:line="360" w:lineRule="auto"/>
+        <w:ind w:left="720" w:right="720" w:firstLine="0"/>
+        <w:jc w:val="both"/>
       </w:pPr>
       <w:r>
         <w:rPr/>
@@ -30758,12 +30759,9 @@
     <w:p ns2:paraId="01AA2BD6" ns2:textId="5333C03A">
       <w:pPr>
         <w:pStyle w:val="MemoireCorps"/>
-        <w:tabs>
-          <w:tab w:val="left" w:pos="7230"/>
-        </w:tabs>
-        <w:rPr>
-          <w:color w:val="000000" w:themeColor="text1"/>
-        </w:rPr>
+        <w:spacing w:before="0" w:after="120" w:line="360" w:lineRule="auto"/>
+        <w:ind w:left="720" w:right="720" w:firstLine="0"/>
+        <w:jc w:val="both"/>
       </w:pPr>
       <w:r>
         <w:rPr/>
@@ -32338,7 +32336,9 @@
     <w:p ns2:paraId="48CFEDB6" ns2:textId="77777777">
       <w:pPr>
         <w:pStyle w:val="MemoireCorps"/>
-        <w:rPr/>
+        <w:spacing w:before="0" w:after="120" w:line="360" w:lineRule="auto"/>
+        <w:ind w:firstLine="567"/>
+        <w:jc w:val="both"/>
       </w:pPr>
       <w:r>
         <w:rPr/>
@@ -36760,11 +36760,9 @@
     <w:p ns2:paraId="4A8513C5" ns2:textId="293E4527">
       <w:pPr>
         <w:pStyle w:val="MemoireCorps"/>
-        <w:tabs>
-          <w:tab w:val="left" w:pos="6190"/>
-          <w:tab w:val="left" w:pos="7230"/>
-        </w:tabs>
-        <w:rPr/>
+        <w:spacing w:before="0" w:after="120" w:line="360" w:lineRule="auto"/>
+        <w:ind w:left="720" w:right="720" w:firstLine="0"/>
+        <w:jc w:val="both"/>
       </w:pPr>
       <w:r>
         <w:rPr/>
@@ -37631,7 +37629,9 @@
     <w:p ns2:paraId="7C93E940" ns2:textId="77777777">
       <w:pPr>
         <w:pStyle w:val="MemoireCorps"/>
-        <w:rPr/>
+        <w:spacing w:before="0" w:after="120" w:line="360" w:lineRule="auto"/>
+        <w:ind w:left="720" w:right="720" w:firstLine="0"/>
+        <w:jc w:val="both"/>
       </w:pPr>
       <w:r>
         <w:rPr/>
@@ -39427,7 +39427,9 @@
     <w:p ns2:paraId="546BCFAB" ns2:textId="538D2ADA">
       <w:pPr>
         <w:pStyle w:val="MemoireCorps"/>
-        <w:rPr/>
+        <w:spacing w:before="0" w:after="120" w:line="360" w:lineRule="auto"/>
+        <w:ind w:left="720" w:right="720" w:firstLine="0"/>
+        <w:jc w:val="both"/>
       </w:pPr>
       <w:r>
         <w:rPr/>
@@ -41046,7 +41048,9 @@
     <w:p ns2:paraId="5F23425D" ns2:textId="01C141BD">
       <w:pPr>
         <w:pStyle w:val="MemoireCorps"/>
-        <w:rPr/>
+        <w:spacing w:before="0" w:after="120" w:line="360" w:lineRule="auto"/>
+        <w:ind w:left="720" w:right="720" w:firstLine="0"/>
+        <w:jc w:val="both"/>
       </w:pPr>
       <w:r>
         <w:rPr/>

</xml_diff>

<commit_message>
Harmonisation de la bibliographie
</commit_message>
<xml_diff>
--- a/doc.docx
+++ b/doc.docx
@@ -45072,8 +45072,8 @@
         </w:numPr>
         <w:widowControl/>
         <w:spacing w:before="0" w:after="120" w:line="360" w:lineRule="auto"/>
-        <w:ind w:firstLine="0"/>
-        <w:jc w:val="both"/>
+        <w:ind w:firstLine="0" w:left="720" w:hanging="360"/>
+        <w:jc w:val="left"/>
         <w:rPr>
           <w:rFonts w:asciiTheme="minorHAnsi" w:hAnsiTheme="minorHAnsi" w:cstheme="minorHAnsi" w:ascii="Times New Roman" w:hAnsi="Times New Roman" w:cs="Times New Roman" w:eastAsia="Times New Roman"/>
         </w:rPr>
@@ -45081,6 +45081,8 @@
       <w:r>
         <w:rPr>
           <w:rFonts w:asciiTheme="minorHAnsi" w:hAnsiTheme="minorHAnsi" w:cstheme="minorHAnsi" w:ascii="Times New Roman" w:hAnsi="Times New Roman" w:cs="Times New Roman" w:eastAsia="Times New Roman"/>
+          <w:sz w:val="24"/>
+          <w:szCs w:val="24"/>
         </w:rPr>
         <w:t xml:space="preserve">Hooghe, L., &amp; Marks, G. (2001). </w:t>
       </w:r>
@@ -45088,12 +45090,16 @@
         <w:rPr>
           <w:rStyle w:val="Accentuation"/>
           <w:rFonts w:asciiTheme="minorHAnsi" w:hAnsiTheme="minorHAnsi" w:cstheme="minorHAnsi" w:ascii="Times New Roman" w:hAnsi="Times New Roman" w:cs="Times New Roman" w:eastAsia="Times New Roman"/>
+          <w:sz w:val="24"/>
+          <w:szCs w:val="24"/>
         </w:rPr>
         <w:t>La gouvernance à plusieurs niveaux et l'intégration européenne</w:t>
       </w:r>
       <w:r>
         <w:rPr>
           <w:rFonts w:asciiTheme="minorHAnsi" w:hAnsiTheme="minorHAnsi" w:cstheme="minorHAnsi" w:ascii="Times New Roman" w:hAnsi="Times New Roman" w:cs="Times New Roman" w:eastAsia="Times New Roman"/>
+          <w:sz w:val="24"/>
+          <w:szCs w:val="24"/>
         </w:rPr>
         <w:t xml:space="preserve">. </w:t>
       </w:r>
@@ -45101,6 +45107,8 @@
       <w:r>
         <w:rPr>
           <w:rFonts w:asciiTheme="minorHAnsi" w:hAnsiTheme="minorHAnsi" w:cstheme="minorHAnsi" w:ascii="Times New Roman" w:hAnsi="Times New Roman" w:cs="Times New Roman" w:eastAsia="Times New Roman"/>
+          <w:sz w:val="24"/>
+          <w:szCs w:val="24"/>
         </w:rPr>
         <w:t>Lanham</w:t>
       </w:r>
@@ -45108,6 +45116,8 @@
       <w:r>
         <w:rPr>
           <w:rFonts w:asciiTheme="minorHAnsi" w:hAnsiTheme="minorHAnsi" w:cstheme="minorHAnsi" w:ascii="Times New Roman" w:hAnsi="Times New Roman" w:cs="Times New Roman" w:eastAsia="Times New Roman"/>
+          <w:sz w:val="24"/>
+          <w:szCs w:val="24"/>
         </w:rPr>
         <w:t xml:space="preserve"> : </w:t>
       </w:r>
@@ -45115,6 +45125,8 @@
       <w:r>
         <w:rPr>
           <w:rFonts w:asciiTheme="minorHAnsi" w:hAnsiTheme="minorHAnsi" w:cstheme="minorHAnsi" w:ascii="Times New Roman" w:hAnsi="Times New Roman" w:cs="Times New Roman" w:eastAsia="Times New Roman"/>
+          <w:sz w:val="24"/>
+          <w:szCs w:val="24"/>
         </w:rPr>
         <w:t>Rowman</w:t>
       </w:r>
@@ -45122,6 +45134,8 @@
       <w:r>
         <w:rPr>
           <w:rFonts w:asciiTheme="minorHAnsi" w:hAnsiTheme="minorHAnsi" w:cstheme="minorHAnsi" w:ascii="Times New Roman" w:hAnsi="Times New Roman" w:cs="Times New Roman" w:eastAsia="Times New Roman"/>
+          <w:sz w:val="24"/>
+          <w:szCs w:val="24"/>
         </w:rPr>
         <w:t xml:space="preserve"> &amp; </w:t>
       </w:r>
@@ -45129,6 +45143,8 @@
       <w:r>
         <w:rPr>
           <w:rFonts w:asciiTheme="minorHAnsi" w:hAnsiTheme="minorHAnsi" w:cstheme="minorHAnsi" w:ascii="Times New Roman" w:hAnsi="Times New Roman" w:cs="Times New Roman" w:eastAsia="Times New Roman"/>
+          <w:sz w:val="24"/>
+          <w:szCs w:val="24"/>
         </w:rPr>
         <w:t>Littlefield</w:t>
       </w:r>
@@ -45136,6 +45152,8 @@
       <w:r>
         <w:rPr>
           <w:rFonts w:asciiTheme="minorHAnsi" w:hAnsiTheme="minorHAnsi" w:cstheme="minorHAnsi" w:ascii="Times New Roman" w:hAnsi="Times New Roman" w:cs="Times New Roman" w:eastAsia="Times New Roman"/>
+          <w:sz w:val="24"/>
+          <w:szCs w:val="24"/>
         </w:rPr>
         <w:t>.</w:t>
       </w:r>
@@ -45149,8 +45167,8 @@
         </w:numPr>
         <w:widowControl/>
         <w:spacing w:before="0" w:after="120" w:line="360" w:lineRule="auto"/>
-        <w:ind w:firstLine="0"/>
-        <w:jc w:val="both"/>
+        <w:ind w:firstLine="0" w:left="720" w:hanging="360"/>
+        <w:jc w:val="left"/>
         <w:rPr>
           <w:rFonts w:asciiTheme="minorHAnsi" w:hAnsiTheme="minorHAnsi" w:cstheme="minorHAnsi" w:ascii="Times New Roman" w:hAnsi="Times New Roman" w:cs="Times New Roman" w:eastAsia="Times New Roman"/>
         </w:rPr>
@@ -45158,6 +45176,8 @@
       <w:r>
         <w:rPr>
           <w:rFonts w:asciiTheme="minorHAnsi" w:hAnsiTheme="minorHAnsi" w:cstheme="minorHAnsi" w:ascii="Times New Roman" w:hAnsi="Times New Roman" w:cs="Times New Roman" w:eastAsia="Times New Roman"/>
+          <w:sz w:val="24"/>
+          <w:szCs w:val="24"/>
         </w:rPr>
         <w:t xml:space="preserve">Hooghe, L., &amp; Marks, G. (2003). « Les différents types de gouvernance multiniveaux ». </w:t>
       </w:r>
@@ -45165,12 +45185,16 @@
         <w:rPr>
           <w:rStyle w:val="Accentuation"/>
           <w:rFonts w:asciiTheme="minorHAnsi" w:hAnsiTheme="minorHAnsi" w:cstheme="minorHAnsi" w:ascii="Times New Roman" w:hAnsi="Times New Roman" w:cs="Times New Roman" w:eastAsia="Times New Roman"/>
+          <w:sz w:val="24"/>
+          <w:szCs w:val="24"/>
         </w:rPr>
         <w:t>Revue américaine de science politique</w:t>
       </w:r>
       <w:r>
         <w:rPr>
           <w:rFonts w:asciiTheme="minorHAnsi" w:hAnsiTheme="minorHAnsi" w:cstheme="minorHAnsi" w:ascii="Times New Roman" w:hAnsi="Times New Roman" w:cs="Times New Roman" w:eastAsia="Times New Roman"/>
+          <w:sz w:val="24"/>
+          <w:szCs w:val="24"/>
         </w:rPr>
         <w:t>, 97(2), 233-243.</w:t>
       </w:r>
@@ -45210,8 +45234,8 @@
         </w:numPr>
         <w:widowControl/>
         <w:spacing w:before="0" w:after="120" w:line="360" w:lineRule="auto"/>
-        <w:ind w:firstLine="0"/>
-        <w:jc w:val="both"/>
+        <w:ind w:firstLine="0" w:left="720" w:hanging="360"/>
+        <w:jc w:val="left"/>
         <w:rPr>
           <w:rFonts w:asciiTheme="minorHAnsi" w:hAnsiTheme="minorHAnsi" w:cstheme="minorHAnsi" w:ascii="Times New Roman" w:hAnsi="Times New Roman" w:cs="Times New Roman" w:eastAsia="Times New Roman"/>
         </w:rPr>
@@ -45219,6 +45243,8 @@
       <w:r>
         <w:rPr>
           <w:rFonts w:asciiTheme="minorHAnsi" w:hAnsiTheme="minorHAnsi" w:cstheme="minorHAnsi" w:ascii="Times New Roman" w:hAnsi="Times New Roman" w:cs="Times New Roman" w:eastAsia="Times New Roman"/>
+          <w:sz w:val="24"/>
+          <w:szCs w:val="24"/>
         </w:rPr>
         <w:t xml:space="preserve">Banque mondiale. (2021). </w:t>
       </w:r>
@@ -45226,12 +45252,16 @@
         <w:rPr>
           <w:rStyle w:val="Accentuation"/>
           <w:rFonts w:asciiTheme="minorHAnsi" w:hAnsiTheme="minorHAnsi" w:cstheme="minorHAnsi" w:ascii="Times New Roman" w:hAnsi="Times New Roman" w:cs="Times New Roman" w:eastAsia="Times New Roman"/>
+          <w:sz w:val="24"/>
+          <w:szCs w:val="24"/>
         </w:rPr>
         <w:t>Décentralisation et gouvernance locale en Afrique de l'Ouest</w:t>
       </w:r>
       <w:r>
         <w:rPr>
           <w:rFonts w:asciiTheme="minorHAnsi" w:hAnsiTheme="minorHAnsi" w:cstheme="minorHAnsi" w:ascii="Times New Roman" w:hAnsi="Times New Roman" w:cs="Times New Roman" w:eastAsia="Times New Roman"/>
+          <w:sz w:val="24"/>
+          <w:szCs w:val="24"/>
         </w:rPr>
         <w:t>. Washington, DC.</w:t>
       </w:r>
@@ -45248,39 +45278,59 @@
           <w:rFonts w:asciiTheme="minorHAnsi" w:hAnsiTheme="minorHAnsi" w:cstheme="minorHAnsi" w:ascii="Times New Roman" w:hAnsi="Times New Roman" w:cs="Times New Roman" w:eastAsia="Times New Roman"/>
           <w:szCs w:val="24"/>
         </w:rPr>
-      </w:pPr>
-      <w:r>
-        <w:rPr/>
-        <w:t xml:space="preserve">PNUD, </w:t>
+        <w:spacing w:before="0" w:after="120" w:line="360" w:lineRule="auto"/>
+        <w:ind w:left="720" w:hanging="360"/>
+        <w:jc w:val="left"/>
+      </w:pPr>
+      <w:r>
+        <w:rPr>
+          <w:rFonts w:ascii="Times New Roman" w:hAnsi="Times New Roman" w:eastAsia="Times New Roman" w:cs="Times New Roman"/>
+          <w:sz w:val="24"/>
+          <w:szCs w:val="24"/>
+        </w:rPr>
+        <w:t xml:space="preserve">PNUD. (2020). Gouvernance locale et participation citoyenne.</w:t>
       </w:r>
       <w:proofErr w:type="spellStart"/>
       <w:r>
         <w:rPr>
           <w:i/>
           <w:iCs/>
-        </w:rPr>
-        <w:t>Gouvernance</w:t>
+          <w:rFonts w:ascii="Times New Roman" w:hAnsi="Times New Roman" w:eastAsia="Times New Roman" w:cs="Times New Roman"/>
+          <w:sz w:val="24"/>
+          <w:szCs w:val="24"/>
+        </w:rPr>
+        <w:t/>
       </w:r>
       <w:proofErr w:type="spellEnd"/>
       <w:r>
         <w:rPr>
           <w:i/>
           <w:iCs/>
-        </w:rPr>
-        <w:t xml:space="preserve"> locale et participation </w:t>
+          <w:rFonts w:ascii="Times New Roman" w:hAnsi="Times New Roman" w:eastAsia="Times New Roman" w:cs="Times New Roman"/>
+          <w:sz w:val="24"/>
+          <w:szCs w:val="24"/>
+        </w:rPr>
+        <w:t xml:space="preserve"/>
       </w:r>
       <w:proofErr w:type="spellStart"/>
       <w:r>
         <w:rPr>
           <w:i/>
           <w:iCs/>
-        </w:rPr>
-        <w:t>citoyenne</w:t>
-      </w:r>
-      <w:proofErr w:type="spellEnd"/>
-      <w:r>
-        <w:rPr/>
-        <w:t>, 2020.</w:t>
+          <w:rFonts w:ascii="Times New Roman" w:hAnsi="Times New Roman" w:eastAsia="Times New Roman" w:cs="Times New Roman"/>
+          <w:sz w:val="24"/>
+          <w:szCs w:val="24"/>
+        </w:rPr>
+        <w:t/>
+      </w:r>
+      <w:proofErr w:type="spellEnd"/>
+      <w:r>
+        <w:rPr>
+          <w:rFonts w:ascii="Times New Roman" w:hAnsi="Times New Roman" w:eastAsia="Times New Roman" w:cs="Times New Roman"/>
+          <w:sz w:val="24"/>
+          <w:szCs w:val="24"/>
+        </w:rPr>
+        <w:t/>
       </w:r>
     </w:p>
     <w:p>
@@ -45292,8 +45342,8 @@
         </w:numPr>
         <w:widowControl/>
         <w:spacing w:before="0" w:after="120" w:line="360" w:lineRule="auto"/>
-        <w:ind w:firstLine="0"/>
-        <w:jc w:val="both"/>
+        <w:ind w:firstLine="0" w:left="720" w:hanging="360"/>
+        <w:jc w:val="left"/>
         <w:rPr>
           <w:rFonts w:asciiTheme="minorHAnsi" w:hAnsiTheme="minorHAnsi" w:cstheme="minorHAnsi" w:ascii="Times New Roman" w:hAnsi="Times New Roman" w:cs="Times New Roman" w:eastAsia="Times New Roman"/>
         </w:rPr>
@@ -45301,6 +45351,8 @@
       <w:r>
         <w:rPr>
           <w:rFonts w:asciiTheme="minorHAnsi" w:hAnsiTheme="minorHAnsi" w:cstheme="minorHAnsi" w:ascii="Times New Roman" w:hAnsi="Times New Roman" w:cs="Times New Roman" w:eastAsia="Times New Roman"/>
+          <w:sz w:val="24"/>
+          <w:szCs w:val="24"/>
         </w:rPr>
         <w:t xml:space="preserve">Programme des Nations Unies pour le Développement (PNUD-Bénin). (2021). </w:t>
       </w:r>
@@ -45308,12 +45360,16 @@
         <w:rPr>
           <w:rStyle w:val="Accentuation"/>
           <w:rFonts w:asciiTheme="minorHAnsi" w:hAnsiTheme="minorHAnsi" w:cstheme="minorHAnsi" w:ascii="Times New Roman" w:hAnsi="Times New Roman" w:cs="Times New Roman" w:eastAsia="Times New Roman"/>
+          <w:sz w:val="24"/>
+          <w:szCs w:val="24"/>
         </w:rPr>
         <w:t>Appui à la gouvernance locale et à la décentralisation au Bénin</w:t>
       </w:r>
       <w:r>
         <w:rPr>
           <w:rFonts w:asciiTheme="minorHAnsi" w:hAnsiTheme="minorHAnsi" w:cstheme="minorHAnsi" w:ascii="Times New Roman" w:hAnsi="Times New Roman" w:cs="Times New Roman" w:eastAsia="Times New Roman"/>
+          <w:sz w:val="24"/>
+          <w:szCs w:val="24"/>
         </w:rPr>
         <w:t>. Cotonou.</w:t>
       </w:r>
@@ -45330,87 +45386,131 @@
           <w:rFonts w:asciiTheme="minorHAnsi" w:hAnsiTheme="minorHAnsi" w:cstheme="minorHAnsi" w:ascii="Times New Roman" w:hAnsi="Times New Roman" w:cs="Times New Roman" w:eastAsia="Times New Roman"/>
           <w:szCs w:val="24"/>
         </w:rPr>
-      </w:pPr>
-      <w:proofErr w:type="spellStart"/>
-      <w:r>
-        <w:rPr/>
-        <w:t>Banque</w:t>
-      </w:r>
-      <w:proofErr w:type="spellEnd"/>
-      <w:r>
-        <w:rPr/>
-        <w:t xml:space="preserve"> </w:t>
-      </w:r>
-      <w:proofErr w:type="spellStart"/>
-      <w:r>
-        <w:rPr/>
-        <w:t>mondiale</w:t>
-      </w:r>
-      <w:proofErr w:type="spellEnd"/>
-      <w:r>
-        <w:rPr/>
-        <w:t xml:space="preserve">, </w:t>
+        <w:spacing w:before="0" w:after="120" w:line="360" w:lineRule="auto"/>
+        <w:ind w:left="720" w:hanging="360"/>
+        <w:jc w:val="left"/>
+      </w:pPr>
+      <w:proofErr w:type="spellStart"/>
+      <w:r>
+        <w:rPr>
+          <w:rFonts w:ascii="Times New Roman" w:hAnsi="Times New Roman" w:eastAsia="Times New Roman" w:cs="Times New Roman"/>
+          <w:sz w:val="24"/>
+          <w:szCs w:val="24"/>
+        </w:rPr>
+        <w:t>Banque mondiale. (2019). Décentralisation et gouvernance locale en Afrique.</w:t>
+      </w:r>
+      <w:proofErr w:type="spellEnd"/>
+      <w:r>
+        <w:rPr>
+          <w:rFonts w:ascii="Times New Roman" w:hAnsi="Times New Roman" w:eastAsia="Times New Roman" w:cs="Times New Roman"/>
+          <w:sz w:val="24"/>
+          <w:szCs w:val="24"/>
+        </w:rPr>
+        <w:t xml:space="preserve"/>
+      </w:r>
+      <w:proofErr w:type="spellStart"/>
+      <w:r>
+        <w:rPr>
+          <w:rFonts w:ascii="Times New Roman" w:hAnsi="Times New Roman" w:eastAsia="Times New Roman" w:cs="Times New Roman"/>
+          <w:sz w:val="24"/>
+          <w:szCs w:val="24"/>
+        </w:rPr>
+        <w:t/>
+      </w:r>
+      <w:proofErr w:type="spellEnd"/>
+      <w:r>
+        <w:rPr>
+          <w:rFonts w:ascii="Times New Roman" w:hAnsi="Times New Roman" w:eastAsia="Times New Roman" w:cs="Times New Roman"/>
+          <w:sz w:val="24"/>
+          <w:szCs w:val="24"/>
+        </w:rPr>
+        <w:t xml:space="preserve"/>
       </w:r>
       <w:proofErr w:type="spellStart"/>
       <w:r>
         <w:rPr>
           <w:i/>
           <w:iCs/>
-        </w:rPr>
-        <w:t>Décentralisation</w:t>
+          <w:rFonts w:ascii="Times New Roman" w:hAnsi="Times New Roman" w:eastAsia="Times New Roman" w:cs="Times New Roman"/>
+          <w:sz w:val="24"/>
+          <w:szCs w:val="24"/>
+        </w:rPr>
+        <w:t/>
       </w:r>
       <w:proofErr w:type="spellEnd"/>
       <w:r>
         <w:rPr>
           <w:i/>
           <w:iCs/>
-        </w:rPr>
-        <w:t xml:space="preserve"> et </w:t>
+          <w:rFonts w:ascii="Times New Roman" w:hAnsi="Times New Roman" w:eastAsia="Times New Roman" w:cs="Times New Roman"/>
+          <w:sz w:val="24"/>
+          <w:szCs w:val="24"/>
+        </w:rPr>
+        <w:t xml:space="preserve"/>
       </w:r>
       <w:proofErr w:type="spellStart"/>
       <w:r>
         <w:rPr>
           <w:i/>
           <w:iCs/>
-        </w:rPr>
-        <w:t>gouvernance</w:t>
+          <w:rFonts w:ascii="Times New Roman" w:hAnsi="Times New Roman" w:eastAsia="Times New Roman" w:cs="Times New Roman"/>
+          <w:sz w:val="24"/>
+          <w:szCs w:val="24"/>
+        </w:rPr>
+        <w:t/>
       </w:r>
       <w:proofErr w:type="spellEnd"/>
       <w:r>
         <w:rPr>
           <w:i/>
           <w:iCs/>
-        </w:rPr>
-        <w:t xml:space="preserve"> locale </w:t>
+          <w:rFonts w:ascii="Times New Roman" w:hAnsi="Times New Roman" w:eastAsia="Times New Roman" w:cs="Times New Roman"/>
+          <w:sz w:val="24"/>
+          <w:szCs w:val="24"/>
+        </w:rPr>
+        <w:t xml:space="preserve"/>
       </w:r>
       <w:proofErr w:type="spellStart"/>
       <w:r>
         <w:rPr>
           <w:i/>
           <w:iCs/>
-        </w:rPr>
-        <w:t>en</w:t>
+          <w:rFonts w:ascii="Times New Roman" w:hAnsi="Times New Roman" w:eastAsia="Times New Roman" w:cs="Times New Roman"/>
+          <w:sz w:val="24"/>
+          <w:szCs w:val="24"/>
+        </w:rPr>
+        <w:t/>
       </w:r>
       <w:proofErr w:type="spellEnd"/>
       <w:r>
         <w:rPr>
           <w:i/>
           <w:iCs/>
-        </w:rPr>
-        <w:t xml:space="preserve"> </w:t>
+          <w:rFonts w:ascii="Times New Roman" w:hAnsi="Times New Roman" w:eastAsia="Times New Roman" w:cs="Times New Roman"/>
+          <w:sz w:val="24"/>
+          <w:szCs w:val="24"/>
+        </w:rPr>
+        <w:t xml:space="preserve"/>
       </w:r>
       <w:proofErr w:type="spellStart"/>
       <w:r>
         <w:rPr>
           <w:i/>
           <w:iCs/>
-        </w:rPr>
-        <w:t>Afrique</w:t>
-      </w:r>
-      <w:proofErr w:type="spellEnd"/>
-      <w:r>
-        <w:rPr/>
-        <w:t>, 2019.</w:t>
+          <w:rFonts w:ascii="Times New Roman" w:hAnsi="Times New Roman" w:eastAsia="Times New Roman" w:cs="Times New Roman"/>
+          <w:sz w:val="24"/>
+          <w:szCs w:val="24"/>
+        </w:rPr>
+        <w:t/>
+      </w:r>
+      <w:proofErr w:type="spellEnd"/>
+      <w:r>
+        <w:rPr>
+          <w:rFonts w:ascii="Times New Roman" w:hAnsi="Times New Roman" w:eastAsia="Times New Roman" w:cs="Times New Roman"/>
+          <w:sz w:val="24"/>
+          <w:szCs w:val="24"/>
+        </w:rPr>
+        <w:t/>
       </w:r>
     </w:p>
     <w:p>
@@ -45425,30 +45525,53 @@
           <w:rFonts w:asciiTheme="minorHAnsi" w:hAnsiTheme="minorHAnsi" w:cstheme="minorHAnsi" w:ascii="Times New Roman" w:hAnsi="Times New Roman" w:cs="Times New Roman" w:eastAsia="Times New Roman"/>
           <w:szCs w:val="24"/>
         </w:rPr>
-      </w:pPr>
-      <w:r>
-        <w:rPr/>
-        <w:t xml:space="preserve">Rapports </w:t>
-      </w:r>
-      <w:proofErr w:type="spellStart"/>
-      <w:r>
-        <w:rPr/>
-        <w:t>annuels</w:t>
-      </w:r>
-      <w:proofErr w:type="spellEnd"/>
-      <w:r>
-        <w:rPr/>
-        <w:t xml:space="preserve"> de la commune de </w:t>
-      </w:r>
-      <w:proofErr w:type="spellStart"/>
-      <w:r>
-        <w:rPr/>
-        <w:t>Kérou</w:t>
-      </w:r>
-      <w:proofErr w:type="spellEnd"/>
-      <w:r>
-        <w:rPr/>
-        <w:t xml:space="preserve">. </w:t>
+        <w:spacing w:before="0" w:after="120" w:line="360" w:lineRule="auto"/>
+        <w:ind w:left="720" w:hanging="360"/>
+        <w:jc w:val="left"/>
+      </w:pPr>
+      <w:r>
+        <w:rPr>
+          <w:rFonts w:ascii="Times New Roman" w:hAnsi="Times New Roman" w:eastAsia="Times New Roman" w:cs="Times New Roman"/>
+          <w:sz w:val="24"/>
+          <w:szCs w:val="24"/>
+        </w:rPr>
+        <w:t xml:space="preserve">Rapports annuels de la commune de Kérou.</w:t>
+      </w:r>
+      <w:proofErr w:type="spellStart"/>
+      <w:r>
+        <w:rPr>
+          <w:rFonts w:ascii="Times New Roman" w:hAnsi="Times New Roman" w:eastAsia="Times New Roman" w:cs="Times New Roman"/>
+          <w:sz w:val="24"/>
+          <w:szCs w:val="24"/>
+        </w:rPr>
+        <w:t/>
+      </w:r>
+      <w:proofErr w:type="spellEnd"/>
+      <w:r>
+        <w:rPr>
+          <w:rFonts w:ascii="Times New Roman" w:hAnsi="Times New Roman" w:eastAsia="Times New Roman" w:cs="Times New Roman"/>
+          <w:sz w:val="24"/>
+          <w:szCs w:val="24"/>
+        </w:rPr>
+        <w:t xml:space="preserve"/>
+      </w:r>
+      <w:proofErr w:type="spellStart"/>
+      <w:r>
+        <w:rPr>
+          <w:rFonts w:ascii="Times New Roman" w:hAnsi="Times New Roman" w:eastAsia="Times New Roman" w:cs="Times New Roman"/>
+          <w:sz w:val="24"/>
+          <w:szCs w:val="24"/>
+        </w:rPr>
+        <w:t/>
+      </w:r>
+      <w:proofErr w:type="spellEnd"/>
+      <w:r>
+        <w:rPr>
+          <w:rFonts w:ascii="Times New Roman" w:hAnsi="Times New Roman" w:eastAsia="Times New Roman" w:cs="Times New Roman"/>
+          <w:sz w:val="24"/>
+          <w:szCs w:val="24"/>
+        </w:rPr>
+        <w:t xml:space="preserve"/>
       </w:r>
     </w:p>
     <w:p>
@@ -45463,99 +45586,139 @@
           <w:rFonts w:asciiTheme="minorHAnsi" w:hAnsiTheme="minorHAnsi" w:cstheme="minorHAnsi" w:ascii="Times New Roman" w:hAnsi="Times New Roman" w:cs="Times New Roman" w:eastAsia="Times New Roman"/>
           <w:szCs w:val="24"/>
         </w:rPr>
+        <w:spacing w:before="0" w:after="120" w:line="360" w:lineRule="auto"/>
+        <w:ind w:left="720" w:hanging="360"/>
+        <w:jc w:val="left"/>
       </w:pPr>
       <w:proofErr w:type="spellStart"/>
       <w:r>
         <w:rPr>
           <w:i/>
           <w:iCs/>
-        </w:rPr>
-        <w:t>Charte</w:t>
+          <w:rFonts w:ascii="Times New Roman" w:hAnsi="Times New Roman" w:eastAsia="Times New Roman" w:cs="Times New Roman"/>
+          <w:sz w:val="24"/>
+          <w:szCs w:val="24"/>
+        </w:rPr>
+        <w:t>Charte nationale sur la gouvernance locale en République du Bénin. (2011).</w:t>
       </w:r>
       <w:proofErr w:type="spellEnd"/>
       <w:r>
         <w:rPr>
           <w:i/>
           <w:iCs/>
-        </w:rPr>
-        <w:t xml:space="preserve"> </w:t>
+          <w:rFonts w:ascii="Times New Roman" w:hAnsi="Times New Roman" w:eastAsia="Times New Roman" w:cs="Times New Roman"/>
+          <w:sz w:val="24"/>
+          <w:szCs w:val="24"/>
+        </w:rPr>
+        <w:t xml:space="preserve"/>
       </w:r>
       <w:proofErr w:type="spellStart"/>
       <w:r>
         <w:rPr>
           <w:i/>
           <w:iCs/>
-        </w:rPr>
-        <w:t>nationale</w:t>
+          <w:rFonts w:ascii="Times New Roman" w:hAnsi="Times New Roman" w:eastAsia="Times New Roman" w:cs="Times New Roman"/>
+          <w:sz w:val="24"/>
+          <w:szCs w:val="24"/>
+        </w:rPr>
+        <w:t/>
       </w:r>
       <w:proofErr w:type="spellEnd"/>
       <w:r>
         <w:rPr>
           <w:i/>
           <w:iCs/>
-        </w:rPr>
-        <w:t xml:space="preserve"> sur la </w:t>
+          <w:rFonts w:ascii="Times New Roman" w:hAnsi="Times New Roman" w:eastAsia="Times New Roman" w:cs="Times New Roman"/>
+          <w:sz w:val="24"/>
+          <w:szCs w:val="24"/>
+        </w:rPr>
+        <w:t xml:space="preserve"/>
       </w:r>
       <w:proofErr w:type="spellStart"/>
       <w:r>
         <w:rPr>
           <w:i/>
           <w:iCs/>
-        </w:rPr>
-        <w:t>gouvernance</w:t>
+          <w:rFonts w:ascii="Times New Roman" w:hAnsi="Times New Roman" w:eastAsia="Times New Roman" w:cs="Times New Roman"/>
+          <w:sz w:val="24"/>
+          <w:szCs w:val="24"/>
+        </w:rPr>
+        <w:t/>
       </w:r>
       <w:proofErr w:type="spellEnd"/>
       <w:r>
         <w:rPr>
           <w:i/>
           <w:iCs/>
-        </w:rPr>
-        <w:t xml:space="preserve"> locale </w:t>
+          <w:rFonts w:ascii="Times New Roman" w:hAnsi="Times New Roman" w:eastAsia="Times New Roman" w:cs="Times New Roman"/>
+          <w:sz w:val="24"/>
+          <w:szCs w:val="24"/>
+        </w:rPr>
+        <w:t xml:space="preserve"/>
       </w:r>
       <w:proofErr w:type="spellStart"/>
       <w:r>
         <w:rPr>
           <w:i/>
           <w:iCs/>
-        </w:rPr>
-        <w:t>en</w:t>
+          <w:rFonts w:ascii="Times New Roman" w:hAnsi="Times New Roman" w:eastAsia="Times New Roman" w:cs="Times New Roman"/>
+          <w:sz w:val="24"/>
+          <w:szCs w:val="24"/>
+        </w:rPr>
+        <w:t/>
       </w:r>
       <w:proofErr w:type="spellEnd"/>
       <w:r>
         <w:rPr>
           <w:i/>
           <w:iCs/>
-        </w:rPr>
-        <w:t xml:space="preserve"> </w:t>
+          <w:rFonts w:ascii="Times New Roman" w:hAnsi="Times New Roman" w:eastAsia="Times New Roman" w:cs="Times New Roman"/>
+          <w:sz w:val="24"/>
+          <w:szCs w:val="24"/>
+        </w:rPr>
+        <w:t xml:space="preserve"/>
       </w:r>
       <w:proofErr w:type="spellStart"/>
       <w:r>
         <w:rPr>
           <w:i/>
           <w:iCs/>
-        </w:rPr>
-        <w:t>République</w:t>
+          <w:rFonts w:ascii="Times New Roman" w:hAnsi="Times New Roman" w:eastAsia="Times New Roman" w:cs="Times New Roman"/>
+          <w:sz w:val="24"/>
+          <w:szCs w:val="24"/>
+        </w:rPr>
+        <w:t/>
       </w:r>
       <w:proofErr w:type="spellEnd"/>
       <w:r>
         <w:rPr>
           <w:i/>
           <w:iCs/>
-        </w:rPr>
-        <w:t xml:space="preserve"> du </w:t>
+          <w:rFonts w:ascii="Times New Roman" w:hAnsi="Times New Roman" w:eastAsia="Times New Roman" w:cs="Times New Roman"/>
+          <w:sz w:val="24"/>
+          <w:szCs w:val="24"/>
+        </w:rPr>
+        <w:t xml:space="preserve"/>
       </w:r>
       <w:proofErr w:type="spellStart"/>
       <w:r>
         <w:rPr>
           <w:i/>
           <w:iCs/>
-        </w:rPr>
-        <w:t>Bénin</w:t>
-      </w:r>
-      <w:proofErr w:type="spellEnd"/>
-      <w:r>
-        <w:rPr/>
-        <w:t>, 2011</w:t>
+          <w:rFonts w:ascii="Times New Roman" w:hAnsi="Times New Roman" w:eastAsia="Times New Roman" w:cs="Times New Roman"/>
+          <w:sz w:val="24"/>
+          <w:szCs w:val="24"/>
+        </w:rPr>
+        <w:t/>
+      </w:r>
+      <w:proofErr w:type="spellEnd"/>
+      <w:r>
+        <w:rPr>
+          <w:rFonts w:ascii="Times New Roman" w:hAnsi="Times New Roman" w:eastAsia="Times New Roman" w:cs="Times New Roman"/>
+          <w:sz w:val="24"/>
+          <w:szCs w:val="24"/>
+        </w:rPr>
+        <w:t/>
       </w:r>
     </w:p>
     <w:p>
@@ -45567,8 +45730,8 @@
         </w:numPr>
         <w:widowControl/>
         <w:spacing w:before="0" w:after="120" w:line="360" w:lineRule="auto"/>
-        <w:ind w:firstLine="0"/>
-        <w:jc w:val="both"/>
+        <w:ind w:firstLine="0" w:left="720" w:hanging="360"/>
+        <w:jc w:val="left"/>
         <w:rPr>
           <w:rFonts w:asciiTheme="minorHAnsi" w:hAnsiTheme="minorHAnsi" w:cstheme="minorHAnsi" w:ascii="Times New Roman" w:hAnsi="Times New Roman" w:cs="Times New Roman" w:eastAsia="Times New Roman"/>
         </w:rPr>
@@ -45580,8 +45743,10 @@
           <w:rFonts w:asciiTheme="minorHAnsi" w:hAnsiTheme="minorHAnsi" w:cstheme="minorHAnsi" w:ascii="Times New Roman" w:hAnsi="Times New Roman" w:cs="Times New Roman" w:eastAsia="Times New Roman"/>
           <w:b w:val="0"/>
           <w:bCs w:val="0"/>
-        </w:rPr>
-        <w:t>PartiCiP</w:t>
+          <w:sz w:val="24"/>
+          <w:szCs w:val="24"/>
+        </w:rPr>
+        <w:t>PartiCiP / ONG ALCRER. (2019). Charte nationale de reddition de comptes au niveau des collectivités locales au Bénin : plaquette de vulgarisation. Cotonou : ONG ALCRER.</w:t>
       </w:r>
       <w:proofErr w:type="spellEnd"/>
       <w:r>
@@ -45590,27 +45755,35 @@
           <w:rFonts w:asciiTheme="minorHAnsi" w:hAnsiTheme="minorHAnsi" w:cstheme="minorHAnsi" w:ascii="Times New Roman" w:hAnsi="Times New Roman" w:cs="Times New Roman" w:eastAsia="Times New Roman"/>
           <w:b w:val="0"/>
           <w:bCs w:val="0"/>
-        </w:rPr>
-        <w:t xml:space="preserve"> / ONG ALCRER (2019).</w:t>
+          <w:sz w:val="24"/>
+          <w:szCs w:val="24"/>
+        </w:rPr>
+        <w:t xml:space="preserve"/>
       </w:r>
       <w:r>
         <w:rPr>
           <w:rFonts w:asciiTheme="minorHAnsi" w:hAnsiTheme="minorHAnsi" w:cstheme="minorHAnsi" w:ascii="Times New Roman" w:hAnsi="Times New Roman" w:cs="Times New Roman" w:eastAsia="Times New Roman"/>
-        </w:rPr>
-        <w:t xml:space="preserve"> </w:t>
+          <w:sz w:val="24"/>
+          <w:szCs w:val="24"/>
+        </w:rPr>
+        <w:t xml:space="preserve"/>
       </w:r>
       <w:r>
         <w:rPr>
           <w:rStyle w:val="Accentuation"/>
           <w:rFonts w:asciiTheme="minorHAnsi" w:eastAsia="Times New Roman" w:hAnsiTheme="minorHAnsi" w:cstheme="minorHAnsi" w:ascii="Times New Roman" w:hAnsi="Times New Roman" w:cs="Times New Roman"/>
-        </w:rPr>
-        <w:t>Charte nationale de reddition de comptes au niveau des collectivités locales au Bénin : plaquette de vulgarisation</w:t>
+          <w:sz w:val="24"/>
+          <w:szCs w:val="24"/>
+        </w:rPr>
+        <w:t/>
       </w:r>
       <w:r>
         <w:rPr>
           <w:rFonts w:asciiTheme="minorHAnsi" w:hAnsiTheme="minorHAnsi" w:cstheme="minorHAnsi" w:ascii="Times New Roman" w:hAnsi="Times New Roman" w:cs="Times New Roman" w:eastAsia="Times New Roman"/>
-        </w:rPr>
-        <w:t>. Cotonou : ONG ALCRER.</w:t>
+          <w:sz w:val="24"/>
+          <w:szCs w:val="24"/>
+        </w:rPr>
+        <w:t/>
       </w:r>
     </w:p>
     <w:p>
@@ -45624,35 +45797,60 @@
         <w:rPr>
           <w:rFonts w:asciiTheme="minorHAnsi" w:hAnsiTheme="minorHAnsi" w:cstheme="minorHAnsi" w:ascii="Times New Roman" w:hAnsi="Times New Roman" w:cs="Times New Roman" w:eastAsia="Times New Roman"/>
         </w:rPr>
+        <w:spacing w:before="0" w:after="120" w:line="360" w:lineRule="auto"/>
+        <w:ind w:left="720" w:hanging="360"/>
+        <w:jc w:val="left"/>
       </w:pPr>
       <w:r>
         <w:rPr>
           <w:rStyle w:val="lev"/>
           <w:b w:val="0"/>
           <w:bCs w:val="0"/>
+          <w:rFonts w:ascii="Times New Roman" w:hAnsi="Times New Roman" w:eastAsia="Times New Roman" w:cs="Times New Roman"/>
+          <w:sz w:val="24"/>
+          <w:szCs w:val="24"/>
         </w:rPr>
         <w:t>République du Bénin.</w:t>
       </w:r>
       <w:r>
-        <w:rPr/>
+        <w:rPr>
+          <w:rFonts w:ascii="Times New Roman" w:hAnsi="Times New Roman" w:eastAsia="Times New Roman" w:cs="Times New Roman"/>
+          <w:sz w:val="24"/>
+          <w:szCs w:val="24"/>
+        </w:rPr>
         <w:t xml:space="preserve"> </w:t>
       </w:r>
       <w:r>
         <w:rPr>
           <w:rStyle w:val="Accentuation"/>
+          <w:rFonts w:ascii="Times New Roman" w:hAnsi="Times New Roman" w:eastAsia="Times New Roman" w:cs="Times New Roman"/>
+          <w:sz w:val="24"/>
+          <w:szCs w:val="24"/>
         </w:rPr>
         <w:t>Manuel de procédures de reddition de comptes à l’usage des acteurs communaux</w:t>
       </w:r>
       <w:r>
-        <w:rPr/>
+        <w:rPr>
+          <w:rFonts w:ascii="Times New Roman" w:hAnsi="Times New Roman" w:eastAsia="Times New Roman" w:cs="Times New Roman"/>
+          <w:sz w:val="24"/>
+          <w:szCs w:val="24"/>
+        </w:rPr>
         <w:t xml:space="preserve">. Document de référence relatif aux procédures et principes de </w:t>
       </w:r>
       <w:r>
-        <w:rPr/>
+        <w:rPr>
+          <w:rFonts w:ascii="Times New Roman" w:hAnsi="Times New Roman" w:eastAsia="Times New Roman" w:cs="Times New Roman"/>
+          <w:sz w:val="24"/>
+          <w:szCs w:val="24"/>
+        </w:rPr>
         <w:t>reddition de comptes</w:t>
       </w:r>
       <w:r>
-        <w:rPr/>
+        <w:rPr>
+          <w:rFonts w:ascii="Times New Roman" w:hAnsi="Times New Roman" w:eastAsia="Times New Roman" w:cs="Times New Roman"/>
+          <w:sz w:val="24"/>
+          <w:szCs w:val="24"/>
+        </w:rPr>
         <w:t xml:space="preserve"> au niveau communal.</w:t>
       </w:r>
     </w:p>
@@ -45668,10 +45866,17 @@
           <w:rFonts w:cstheme="minorHAnsi" w:ascii="Times New Roman" w:hAnsi="Times New Roman" w:cs="Times New Roman" w:eastAsia="Times New Roman"/>
           <w:sz w:val="24"/>
         </w:rPr>
-      </w:pPr>
-      <w:r>
-        <w:rPr/>
-        <w:t>Ambassade des Pays-Bas près le Bénin, la VNG internationale et la SNV, 2011</w:t>
+        <w:spacing w:before="0" w:after="120" w:line="360" w:lineRule="auto"/>
+        <w:ind w:left="720" w:hanging="360"/>
+        <w:jc w:val="left"/>
+      </w:pPr>
+      <w:r>
+        <w:rPr>
+          <w:rFonts w:ascii="Times New Roman" w:hAnsi="Times New Roman" w:eastAsia="Times New Roman" w:cs="Times New Roman"/>
+          <w:sz w:val="24"/>
+          <w:szCs w:val="24"/>
+        </w:rPr>
+        <w:t>Ambassade des Pays-Bas près le Bénin, la VNG internationale et la SNV. (2011).</w:t>
       </w:r>
     </w:p>
     <w:p>
@@ -45711,8 +45916,8 @@
         </w:numPr>
         <w:widowControl/>
         <w:spacing w:before="0" w:after="120" w:line="360" w:lineRule="auto"/>
-        <w:ind w:firstLine="0"/>
-        <w:jc w:val="both"/>
+        <w:ind w:firstLine="0" w:left="720" w:hanging="360"/>
+        <w:jc w:val="left"/>
         <w:rPr>
           <w:rFonts w:asciiTheme="minorHAnsi" w:hAnsiTheme="minorHAnsi" w:cstheme="minorHAnsi" w:ascii="Times New Roman" w:hAnsi="Times New Roman" w:cs="Times New Roman" w:eastAsia="Times New Roman"/>
         </w:rPr>
@@ -45720,6 +45925,8 @@
       <w:r>
         <w:rPr>
           <w:rFonts w:asciiTheme="minorHAnsi" w:hAnsiTheme="minorHAnsi" w:cstheme="minorHAnsi" w:ascii="Times New Roman" w:hAnsi="Times New Roman" w:cs="Times New Roman" w:eastAsia="Times New Roman"/>
+          <w:sz w:val="24"/>
+          <w:szCs w:val="24"/>
         </w:rPr>
         <w:t xml:space="preserve">République du Bénin. (1990). </w:t>
       </w:r>
@@ -45727,12 +45934,16 @@
         <w:rPr>
           <w:rStyle w:val="Accentuation"/>
           <w:rFonts w:asciiTheme="minorHAnsi" w:hAnsiTheme="minorHAnsi" w:cstheme="minorHAnsi" w:ascii="Times New Roman" w:hAnsi="Times New Roman" w:cs="Times New Roman" w:eastAsia="Times New Roman"/>
+          <w:sz w:val="24"/>
+          <w:szCs w:val="24"/>
         </w:rPr>
         <w:t>Constitution du 11 décembre 1990</w:t>
       </w:r>
       <w:r>
         <w:rPr>
           <w:rFonts w:asciiTheme="minorHAnsi" w:hAnsiTheme="minorHAnsi" w:cstheme="minorHAnsi" w:ascii="Times New Roman" w:hAnsi="Times New Roman" w:cs="Times New Roman" w:eastAsia="Times New Roman"/>
+          <w:sz w:val="24"/>
+          <w:szCs w:val="24"/>
         </w:rPr>
         <w:t>, telle que révisée.</w:t>
       </w:r>
@@ -45746,8 +45957,8 @@
         </w:numPr>
         <w:widowControl/>
         <w:spacing w:before="0" w:after="120" w:line="360" w:lineRule="auto"/>
-        <w:ind w:firstLine="0"/>
-        <w:jc w:val="both"/>
+        <w:ind w:firstLine="0" w:left="720" w:hanging="360"/>
+        <w:jc w:val="left"/>
         <w:rPr>
           <w:rFonts w:asciiTheme="minorHAnsi" w:hAnsiTheme="minorHAnsi" w:cstheme="minorHAnsi" w:ascii="Times New Roman" w:hAnsi="Times New Roman" w:cs="Times New Roman" w:eastAsia="Times New Roman"/>
         </w:rPr>
@@ -45755,6 +45966,8 @@
       <w:r>
         <w:rPr>
           <w:rFonts w:asciiTheme="minorHAnsi" w:hAnsiTheme="minorHAnsi" w:cstheme="minorHAnsi" w:ascii="Times New Roman" w:hAnsi="Times New Roman" w:cs="Times New Roman" w:eastAsia="Times New Roman"/>
+          <w:sz w:val="24"/>
+          <w:szCs w:val="24"/>
         </w:rPr>
         <w:t xml:space="preserve">République du Bénin. (2021). </w:t>
       </w:r>
@@ -45762,12 +45975,16 @@
         <w:rPr>
           <w:rStyle w:val="Accentuation"/>
           <w:rFonts w:asciiTheme="minorHAnsi" w:hAnsiTheme="minorHAnsi" w:cstheme="minorHAnsi" w:ascii="Times New Roman" w:hAnsi="Times New Roman" w:cs="Times New Roman" w:eastAsia="Times New Roman"/>
+          <w:sz w:val="24"/>
+          <w:szCs w:val="24"/>
         </w:rPr>
         <w:t>Loi n° 2021-14 du 20 décembre 2021 portant Code de l'administration territoriale en République du Bénin</w:t>
       </w:r>
       <w:r>
         <w:rPr>
           <w:rFonts w:asciiTheme="minorHAnsi" w:hAnsiTheme="minorHAnsi" w:cstheme="minorHAnsi" w:ascii="Times New Roman" w:hAnsi="Times New Roman" w:cs="Times New Roman" w:eastAsia="Times New Roman"/>
+          <w:sz w:val="24"/>
+          <w:szCs w:val="24"/>
         </w:rPr>
         <w:t>.</w:t>
       </w:r>
@@ -45781,8 +45998,8 @@
         </w:numPr>
         <w:widowControl/>
         <w:spacing w:before="0" w:after="120" w:line="360" w:lineRule="auto"/>
-        <w:ind w:firstLine="0"/>
-        <w:jc w:val="both"/>
+        <w:ind w:firstLine="0" w:left="720" w:hanging="360"/>
+        <w:jc w:val="left"/>
         <w:rPr>
           <w:rFonts w:asciiTheme="minorHAnsi" w:hAnsiTheme="minorHAnsi" w:cstheme="minorHAnsi" w:ascii="Times New Roman" w:hAnsi="Times New Roman" w:cs="Times New Roman" w:eastAsia="Times New Roman"/>
         </w:rPr>
@@ -45790,6 +46007,8 @@
       <w:r>
         <w:rPr>
           <w:rFonts w:asciiTheme="minorHAnsi" w:hAnsiTheme="minorHAnsi" w:cstheme="minorHAnsi" w:ascii="Times New Roman" w:hAnsi="Times New Roman" w:cs="Times New Roman" w:eastAsia="Times New Roman"/>
+          <w:sz w:val="24"/>
+          <w:szCs w:val="24"/>
         </w:rPr>
         <w:t xml:space="preserve">République du Bénin. (2022). </w:t>
       </w:r>
@@ -45797,12 +46016,16 @@
         <w:rPr>
           <w:rStyle w:val="Accentuation"/>
           <w:rFonts w:asciiTheme="minorHAnsi" w:hAnsiTheme="minorHAnsi" w:cstheme="minorHAnsi" w:ascii="Times New Roman" w:hAnsi="Times New Roman" w:cs="Times New Roman" w:eastAsia="Times New Roman"/>
+          <w:sz w:val="24"/>
+          <w:szCs w:val="24"/>
         </w:rPr>
         <w:t>Décrets d'application du Code de l'administration territoriale</w:t>
       </w:r>
       <w:r>
         <w:rPr>
           <w:rFonts w:asciiTheme="minorHAnsi" w:hAnsiTheme="minorHAnsi" w:cstheme="minorHAnsi" w:ascii="Times New Roman" w:hAnsi="Times New Roman" w:cs="Times New Roman" w:eastAsia="Times New Roman"/>
+          <w:sz w:val="24"/>
+          <w:szCs w:val="24"/>
         </w:rPr>
         <w:t>.</w:t>
       </w:r>
@@ -45816,8 +46039,8 @@
         </w:numPr>
         <w:widowControl/>
         <w:spacing w:before="0" w:after="120" w:line="360" w:lineRule="auto"/>
-        <w:ind w:firstLine="0"/>
-        <w:jc w:val="both"/>
+        <w:ind w:firstLine="0" w:left="720" w:hanging="360"/>
+        <w:jc w:val="left"/>
         <w:rPr>
           <w:rFonts w:asciiTheme="minorHAnsi" w:hAnsiTheme="minorHAnsi" w:cstheme="minorHAnsi" w:ascii="Times New Roman" w:hAnsi="Times New Roman" w:cs="Times New Roman" w:eastAsia="Times New Roman"/>
         </w:rPr>
@@ -45825,6 +46048,8 @@
       <w:r>
         <w:rPr>
           <w:rFonts w:asciiTheme="minorHAnsi" w:hAnsiTheme="minorHAnsi" w:cstheme="minorHAnsi" w:ascii="Times New Roman" w:hAnsi="Times New Roman" w:cs="Times New Roman" w:eastAsia="Times New Roman"/>
+          <w:sz w:val="24"/>
+          <w:szCs w:val="24"/>
         </w:rPr>
         <w:t xml:space="preserve">Ministère de la Décentralisation et de la Gouvernance Locale. (2023). </w:t>
       </w:r>
@@ -45832,12 +46057,16 @@
         <w:rPr>
           <w:rStyle w:val="Accentuation"/>
           <w:rFonts w:asciiTheme="minorHAnsi" w:hAnsiTheme="minorHAnsi" w:cstheme="minorHAnsi" w:ascii="Times New Roman" w:hAnsi="Times New Roman" w:cs="Times New Roman" w:eastAsia="Times New Roman"/>
+          <w:sz w:val="24"/>
+          <w:szCs w:val="24"/>
         </w:rPr>
         <w:t>Guide du conseiller communal et des organes infra-communaux</w:t>
       </w:r>
       <w:r>
         <w:rPr>
           <w:rFonts w:asciiTheme="minorHAnsi" w:hAnsiTheme="minorHAnsi" w:cstheme="minorHAnsi" w:ascii="Times New Roman" w:hAnsi="Times New Roman" w:cs="Times New Roman" w:eastAsia="Times New Roman"/>
+          <w:sz w:val="24"/>
+          <w:szCs w:val="24"/>
         </w:rPr>
         <w:t>. Cotonou.</w:t>
       </w:r>
@@ -45879,8 +46108,8 @@
         </w:numPr>
         <w:widowControl/>
         <w:spacing w:before="0" w:after="120" w:line="360" w:lineRule="auto"/>
-        <w:ind w:firstLine="0"/>
-        <w:jc w:val="both"/>
+        <w:ind w:firstLine="0" w:left="720" w:hanging="360"/>
+        <w:jc w:val="left"/>
         <w:rPr>
           <w:rFonts w:asciiTheme="minorHAnsi" w:hAnsiTheme="minorHAnsi" w:cstheme="minorHAnsi" w:ascii="Times New Roman" w:hAnsi="Times New Roman" w:cs="Times New Roman" w:eastAsia="Times New Roman"/>
         </w:rPr>
@@ -45889,6 +46118,8 @@
       <w:r>
         <w:rPr>
           <w:rFonts w:asciiTheme="minorHAnsi" w:hAnsiTheme="minorHAnsi" w:cstheme="minorHAnsi" w:ascii="Times New Roman" w:hAnsi="Times New Roman" w:cs="Times New Roman" w:eastAsia="Times New Roman"/>
+          <w:sz w:val="24"/>
+          <w:szCs w:val="24"/>
         </w:rPr>
         <w:t>Adjaho</w:t>
       </w:r>
@@ -45896,6 +46127,8 @@
       <w:r>
         <w:rPr>
           <w:rFonts w:asciiTheme="minorHAnsi" w:hAnsiTheme="minorHAnsi" w:cstheme="minorHAnsi" w:ascii="Times New Roman" w:hAnsi="Times New Roman" w:cs="Times New Roman" w:eastAsia="Times New Roman"/>
+          <w:sz w:val="24"/>
+          <w:szCs w:val="24"/>
         </w:rPr>
         <w:t xml:space="preserve">, M. (2019). </w:t>
       </w:r>
@@ -45903,12 +46136,16 @@
         <w:rPr>
           <w:rStyle w:val="Accentuation"/>
           <w:rFonts w:asciiTheme="minorHAnsi" w:hAnsiTheme="minorHAnsi" w:cstheme="minorHAnsi" w:ascii="Times New Roman" w:hAnsi="Times New Roman" w:cs="Times New Roman" w:eastAsia="Times New Roman"/>
+          <w:sz w:val="24"/>
+          <w:szCs w:val="24"/>
         </w:rPr>
         <w:t>La gouvernance locale et la participation citoyenne dans les communes du Bénin</w:t>
       </w:r>
       <w:r>
         <w:rPr>
           <w:rFonts w:asciiTheme="minorHAnsi" w:hAnsiTheme="minorHAnsi" w:cstheme="minorHAnsi" w:ascii="Times New Roman" w:hAnsi="Times New Roman" w:cs="Times New Roman" w:eastAsia="Times New Roman"/>
+          <w:sz w:val="24"/>
+          <w:szCs w:val="24"/>
         </w:rPr>
         <w:t xml:space="preserve"> (Mémoire de Master). Université d'Abomey-Calavi.</w:t>
       </w:r>
@@ -45922,8 +46159,8 @@
         </w:numPr>
         <w:widowControl/>
         <w:spacing w:before="0" w:after="120" w:line="360" w:lineRule="auto"/>
-        <w:ind w:firstLine="0"/>
-        <w:jc w:val="both"/>
+        <w:ind w:firstLine="0" w:left="720" w:hanging="360"/>
+        <w:jc w:val="left"/>
         <w:rPr>
           <w:rFonts w:asciiTheme="minorHAnsi" w:hAnsiTheme="minorHAnsi" w:cstheme="minorHAnsi" w:ascii="Times New Roman" w:hAnsi="Times New Roman" w:cs="Times New Roman" w:eastAsia="Times New Roman"/>
         </w:rPr>
@@ -45932,6 +46169,8 @@
       <w:r>
         <w:rPr>
           <w:rFonts w:asciiTheme="minorHAnsi" w:hAnsiTheme="minorHAnsi" w:cstheme="minorHAnsi" w:ascii="Times New Roman" w:hAnsi="Times New Roman" w:cs="Times New Roman" w:eastAsia="Times New Roman"/>
+          <w:sz w:val="24"/>
+          <w:szCs w:val="24"/>
         </w:rPr>
         <w:t>Agossou</w:t>
       </w:r>
@@ -45939,6 +46178,8 @@
       <w:r>
         <w:rPr>
           <w:rFonts w:asciiTheme="minorHAnsi" w:hAnsiTheme="minorHAnsi" w:cstheme="minorHAnsi" w:ascii="Times New Roman" w:hAnsi="Times New Roman" w:cs="Times New Roman" w:eastAsia="Times New Roman"/>
+          <w:sz w:val="24"/>
+          <w:szCs w:val="24"/>
         </w:rPr>
         <w:t xml:space="preserve">, C. (2021). </w:t>
       </w:r>
@@ -45946,12 +46187,16 @@
         <w:rPr>
           <w:rStyle w:val="Accentuation"/>
           <w:rFonts w:asciiTheme="minorHAnsi" w:hAnsiTheme="minorHAnsi" w:cstheme="minorHAnsi" w:ascii="Times New Roman" w:hAnsi="Times New Roman" w:cs="Times New Roman" w:eastAsia="Times New Roman"/>
+          <w:sz w:val="24"/>
+          <w:szCs w:val="24"/>
         </w:rPr>
         <w:t>La décentralisation et le fonctionnement des organes locaux au Bénin</w:t>
       </w:r>
       <w:r>
         <w:rPr>
           <w:rFonts w:asciiTheme="minorHAnsi" w:hAnsiTheme="minorHAnsi" w:cstheme="minorHAnsi" w:ascii="Times New Roman" w:hAnsi="Times New Roman" w:cs="Times New Roman" w:eastAsia="Times New Roman"/>
+          <w:sz w:val="24"/>
+          <w:szCs w:val="24"/>
         </w:rPr>
         <w:t xml:space="preserve"> (Mémoire de Master). Université d'Abomey-Calavi.</w:t>
       </w:r>
@@ -45969,10 +46214,16 @@
           <w:sz w:val="24"/>
           <w:szCs w:val="24"/>
         </w:rPr>
-      </w:pPr>
-      <w:r>
-        <w:rPr>
-          <w:lang w:val="en-US"/>
+        <w:spacing w:before="0" w:after="120" w:line="360" w:lineRule="auto"/>
+        <w:ind w:left="720" w:hanging="360"/>
+        <w:jc w:val="left"/>
+      </w:pPr>
+      <w:r>
+        <w:rPr>
+          <w:lang w:val="en-US"/>
+          <w:rFonts w:ascii="Times New Roman" w:hAnsi="Times New Roman" w:eastAsia="Times New Roman" w:cs="Times New Roman"/>
+          <w:sz w:val="24"/>
+          <w:szCs w:val="24"/>
         </w:rPr>
         <w:lastRenderedPageBreak/>
         <w:t xml:space="preserve">HOUNMÉNOU, G. Bernard. (2006). </w:t>
@@ -45981,6 +46232,9 @@
       <w:r>
         <w:rPr>
           <w:lang w:val="en-US"/>
+          <w:rFonts w:ascii="Times New Roman" w:hAnsi="Times New Roman" w:eastAsia="Times New Roman" w:cs="Times New Roman"/>
+          <w:sz w:val="24"/>
+          <w:szCs w:val="24"/>
         </w:rPr>
         <w:t>Décentralisation</w:t>
       </w:r>
@@ -45988,6 +46242,9 @@
       <w:r>
         <w:rPr>
           <w:lang w:val="en-US"/>
+          <w:rFonts w:ascii="Times New Roman" w:hAnsi="Times New Roman" w:eastAsia="Times New Roman" w:cs="Times New Roman"/>
+          <w:sz w:val="24"/>
+          <w:szCs w:val="24"/>
         </w:rPr>
         <w:t xml:space="preserve">, </w:t>
       </w:r>
@@ -45995,6 +46252,9 @@
       <w:r>
         <w:rPr>
           <w:lang w:val="en-US"/>
+          <w:rFonts w:ascii="Times New Roman" w:hAnsi="Times New Roman" w:eastAsia="Times New Roman" w:cs="Times New Roman"/>
+          <w:sz w:val="24"/>
+          <w:szCs w:val="24"/>
         </w:rPr>
         <w:t>gouvernance</w:t>
       </w:r>
@@ -46002,6 +46262,9 @@
       <w:r>
         <w:rPr>
           <w:lang w:val="en-US"/>
+          <w:rFonts w:ascii="Times New Roman" w:hAnsi="Times New Roman" w:eastAsia="Times New Roman" w:cs="Times New Roman"/>
+          <w:sz w:val="24"/>
+          <w:szCs w:val="24"/>
         </w:rPr>
         <w:t xml:space="preserve"> participative et </w:t>
       </w:r>
@@ -46009,6 +46272,9 @@
       <w:r>
         <w:rPr>
           <w:lang w:val="en-US"/>
+          <w:rFonts w:ascii="Times New Roman" w:hAnsi="Times New Roman" w:eastAsia="Times New Roman" w:cs="Times New Roman"/>
+          <w:sz w:val="24"/>
+          <w:szCs w:val="24"/>
         </w:rPr>
         <w:t>dynamiques</w:t>
       </w:r>
@@ -46016,6 +46282,9 @@
       <w:r>
         <w:rPr>
           <w:lang w:val="en-US"/>
+          <w:rFonts w:ascii="Times New Roman" w:hAnsi="Times New Roman" w:eastAsia="Times New Roman" w:cs="Times New Roman"/>
+          <w:sz w:val="24"/>
+          <w:szCs w:val="24"/>
         </w:rPr>
         <w:t xml:space="preserve"> locales de </w:t>
       </w:r>
@@ -46024,6 +46293,9 @@
       <w:r>
         <w:rPr>
           <w:lang w:val="en-US"/>
+          <w:rFonts w:ascii="Times New Roman" w:hAnsi="Times New Roman" w:eastAsia="Times New Roman" w:cs="Times New Roman"/>
+          <w:sz w:val="24"/>
+          <w:szCs w:val="24"/>
         </w:rPr>
         <w:t>développement</w:t>
       </w:r>
@@ -46031,6 +46303,9 @@
       <w:r>
         <w:rPr>
           <w:lang w:val="en-US"/>
+          <w:rFonts w:ascii="Times New Roman" w:hAnsi="Times New Roman" w:eastAsia="Times New Roman" w:cs="Times New Roman"/>
+          <w:sz w:val="24"/>
+          <w:szCs w:val="24"/>
         </w:rPr>
         <w:t xml:space="preserve"> :</w:t>
       </w:r>
@@ -46038,6 +46313,9 @@
       <w:r>
         <w:rPr>
           <w:lang w:val="en-US"/>
+          <w:rFonts w:ascii="Times New Roman" w:hAnsi="Times New Roman" w:eastAsia="Times New Roman" w:cs="Times New Roman"/>
+          <w:sz w:val="24"/>
+          <w:szCs w:val="24"/>
         </w:rPr>
         <w:t xml:space="preserve"> </w:t>
       </w:r>
@@ -46045,6 +46323,9 @@
       <w:r>
         <w:rPr>
           <w:lang w:val="en-US"/>
+          <w:rFonts w:ascii="Times New Roman" w:hAnsi="Times New Roman" w:eastAsia="Times New Roman" w:cs="Times New Roman"/>
+          <w:sz w:val="24"/>
+          <w:szCs w:val="24"/>
         </w:rPr>
         <w:t>étude</w:t>
       </w:r>
@@ -46052,6 +46333,9 @@
       <w:r>
         <w:rPr>
           <w:lang w:val="en-US"/>
+          <w:rFonts w:ascii="Times New Roman" w:hAnsi="Times New Roman" w:eastAsia="Times New Roman" w:cs="Times New Roman"/>
+          <w:sz w:val="24"/>
+          <w:szCs w:val="24"/>
         </w:rPr>
         <w:t xml:space="preserve"> de </w:t>
       </w:r>
@@ -46059,6 +46343,9 @@
       <w:r>
         <w:rPr>
           <w:lang w:val="en-US"/>
+          <w:rFonts w:ascii="Times New Roman" w:hAnsi="Times New Roman" w:eastAsia="Times New Roman" w:cs="Times New Roman"/>
+          <w:sz w:val="24"/>
+          <w:szCs w:val="24"/>
         </w:rPr>
         <w:t>cas</w:t>
       </w:r>
@@ -46066,6 +46353,9 @@
       <w:r>
         <w:rPr>
           <w:lang w:val="en-US"/>
+          <w:rFonts w:ascii="Times New Roman" w:hAnsi="Times New Roman" w:eastAsia="Times New Roman" w:cs="Times New Roman"/>
+          <w:sz w:val="24"/>
+          <w:szCs w:val="24"/>
         </w:rPr>
         <w:t xml:space="preserve"> </w:t>
       </w:r>
@@ -46073,6 +46363,9 @@
       <w:r>
         <w:rPr>
           <w:lang w:val="en-US"/>
+          <w:rFonts w:ascii="Times New Roman" w:hAnsi="Times New Roman" w:eastAsia="Times New Roman" w:cs="Times New Roman"/>
+          <w:sz w:val="24"/>
+          <w:szCs w:val="24"/>
         </w:rPr>
         <w:t>en</w:t>
       </w:r>
@@ -46080,6 +46373,9 @@
       <w:r>
         <w:rPr>
           <w:lang w:val="en-US"/>
+          <w:rFonts w:ascii="Times New Roman" w:hAnsi="Times New Roman" w:eastAsia="Times New Roman" w:cs="Times New Roman"/>
+          <w:sz w:val="24"/>
+          <w:szCs w:val="24"/>
         </w:rPr>
         <w:t xml:space="preserve"> milieu rural au </w:t>
       </w:r>
@@ -46087,6 +46383,9 @@
       <w:r>
         <w:rPr>
           <w:lang w:val="en-US"/>
+          <w:rFonts w:ascii="Times New Roman" w:hAnsi="Times New Roman" w:eastAsia="Times New Roman" w:cs="Times New Roman"/>
+          <w:sz w:val="24"/>
+          <w:szCs w:val="24"/>
         </w:rPr>
         <w:t>Bénin</w:t>
       </w:r>
@@ -46094,6 +46393,9 @@
       <w:r>
         <w:rPr>
           <w:lang w:val="en-US"/>
+          <w:rFonts w:ascii="Times New Roman" w:hAnsi="Times New Roman" w:eastAsia="Times New Roman" w:cs="Times New Roman"/>
+          <w:sz w:val="24"/>
+          <w:szCs w:val="24"/>
         </w:rPr>
         <w:t xml:space="preserve">. </w:t>
       </w:r>
@@ -46101,6 +46403,9 @@
       <w:r>
         <w:rPr>
           <w:lang w:val="en-US"/>
+          <w:rFonts w:ascii="Times New Roman" w:hAnsi="Times New Roman" w:eastAsia="Times New Roman" w:cs="Times New Roman"/>
+          <w:sz w:val="24"/>
+          <w:szCs w:val="24"/>
         </w:rPr>
         <w:t>Thèse</w:t>
       </w:r>
@@ -46108,6 +46413,9 @@
       <w:r>
         <w:rPr>
           <w:lang w:val="en-US"/>
+          <w:rFonts w:ascii="Times New Roman" w:hAnsi="Times New Roman" w:eastAsia="Times New Roman" w:cs="Times New Roman"/>
+          <w:sz w:val="24"/>
+          <w:szCs w:val="24"/>
         </w:rPr>
         <w:t xml:space="preserve"> de </w:t>
       </w:r>
@@ -46115,6 +46423,9 @@
       <w:r>
         <w:rPr>
           <w:lang w:val="en-US"/>
+          <w:rFonts w:ascii="Times New Roman" w:hAnsi="Times New Roman" w:eastAsia="Times New Roman" w:cs="Times New Roman"/>
+          <w:sz w:val="24"/>
+          <w:szCs w:val="24"/>
         </w:rPr>
         <w:t>doctorat</w:t>
       </w:r>
@@ -46122,6 +46433,9 @@
       <w:r>
         <w:rPr>
           <w:lang w:val="en-US"/>
+          <w:rFonts w:ascii="Times New Roman" w:hAnsi="Times New Roman" w:eastAsia="Times New Roman" w:cs="Times New Roman"/>
+          <w:sz w:val="24"/>
+          <w:szCs w:val="24"/>
         </w:rPr>
         <w:t xml:space="preserve"> </w:t>
       </w:r>
@@ -46129,6 +46443,9 @@
       <w:r>
         <w:rPr>
           <w:lang w:val="en-US"/>
+          <w:rFonts w:ascii="Times New Roman" w:hAnsi="Times New Roman" w:eastAsia="Times New Roman" w:cs="Times New Roman"/>
+          <w:sz w:val="24"/>
+          <w:szCs w:val="24"/>
         </w:rPr>
         <w:t>en</w:t>
       </w:r>
@@ -46136,6 +46453,9 @@
       <w:r>
         <w:rPr>
           <w:lang w:val="en-US"/>
+          <w:rFonts w:ascii="Times New Roman" w:hAnsi="Times New Roman" w:eastAsia="Times New Roman" w:cs="Times New Roman"/>
+          <w:sz w:val="24"/>
+          <w:szCs w:val="24"/>
         </w:rPr>
         <w:t xml:space="preserve"> Sciences </w:t>
       </w:r>
@@ -46143,6 +46463,9 @@
       <w:r>
         <w:rPr>
           <w:lang w:val="en-US"/>
+          <w:rFonts w:ascii="Times New Roman" w:hAnsi="Times New Roman" w:eastAsia="Times New Roman" w:cs="Times New Roman"/>
+          <w:sz w:val="24"/>
+          <w:szCs w:val="24"/>
         </w:rPr>
         <w:t>Économiques</w:t>
       </w:r>
@@ -46150,6 +46473,9 @@
       <w:r>
         <w:rPr>
           <w:lang w:val="en-US"/>
+          <w:rFonts w:ascii="Times New Roman" w:hAnsi="Times New Roman" w:eastAsia="Times New Roman" w:cs="Times New Roman"/>
+          <w:sz w:val="24"/>
+          <w:szCs w:val="24"/>
         </w:rPr>
         <w:t xml:space="preserve">, </w:t>
       </w:r>
@@ -46157,6 +46483,9 @@
       <w:r>
         <w:rPr>
           <w:lang w:val="en-US"/>
+          <w:rFonts w:ascii="Times New Roman" w:hAnsi="Times New Roman" w:eastAsia="Times New Roman" w:cs="Times New Roman"/>
+          <w:sz w:val="24"/>
+          <w:szCs w:val="24"/>
         </w:rPr>
         <w:t>Université</w:t>
       </w:r>
@@ -46164,6 +46493,9 @@
       <w:r>
         <w:rPr>
           <w:lang w:val="en-US"/>
+          <w:rFonts w:ascii="Times New Roman" w:hAnsi="Times New Roman" w:eastAsia="Times New Roman" w:cs="Times New Roman"/>
+          <w:sz w:val="24"/>
+          <w:szCs w:val="24"/>
         </w:rPr>
         <w:t xml:space="preserve"> de Versailles Saint-Quentin-</w:t>
       </w:r>
@@ -46171,6 +46503,9 @@
       <w:r>
         <w:rPr>
           <w:lang w:val="en-US"/>
+          <w:rFonts w:ascii="Times New Roman" w:hAnsi="Times New Roman" w:eastAsia="Times New Roman" w:cs="Times New Roman"/>
+          <w:sz w:val="24"/>
+          <w:szCs w:val="24"/>
         </w:rPr>
         <w:t>en</w:t>
       </w:r>
@@ -46178,6 +46513,9 @@
       <w:r>
         <w:rPr>
           <w:lang w:val="en-US"/>
+          <w:rFonts w:ascii="Times New Roman" w:hAnsi="Times New Roman" w:eastAsia="Times New Roman" w:cs="Times New Roman"/>
+          <w:sz w:val="24"/>
+          <w:szCs w:val="24"/>
         </w:rPr>
         <w:t xml:space="preserve">-Yvelines.  </w:t>
       </w:r>

</xml_diff>

<commit_message>
Début des chapitres sur une nouvelle page
</commit_message>
<xml_diff>
--- a/doc.docx
+++ b/doc.docx
@@ -4131,6 +4131,7 @@
           <w:sz w:val="26"/>
           <w:szCs w:val="26"/>
         </w:rPr>
+        <w:pageBreakBefore/>
       </w:pPr>
       <w:r>
         <w:rPr>
@@ -4262,6 +4263,7 @@
           <w:sz w:val="32"/>
           <w:szCs w:val="32"/>
         </w:rPr>
+        <w:pageBreakBefore/>
       </w:pPr>
       <w:r>
         <w:rPr>
@@ -5999,6 +6001,7 @@
           <w:sz w:val="32"/>
           <w:szCs w:val="32"/>
         </w:rPr>
+        <w:pageBreakBefore/>
       </w:pPr>
       <w:r>
         <w:rPr>
@@ -6796,6 +6799,7 @@
           <w:sz w:val="32"/>
           <w:szCs w:val="32"/>
         </w:rPr>
+        <w:pageBreakBefore/>
       </w:pPr>
       <w:r>
         <w:rPr>
@@ -7155,6 +7159,7 @@
           <w:sz w:val="32"/>
           <w:szCs w:val="32"/>
         </w:rPr>
+        <w:pageBreakBefore/>
       </w:pPr>
       <w:r>
         <w:t>Liste des figures, cartes et photos</w:t>
@@ -7782,6 +7787,7 @@
           <w:sz w:val="32"/>
           <w:szCs w:val="32"/>
         </w:rPr>
+        <w:pageBreakBefore/>
       </w:pPr>
       <w:r>
         <w:rPr>
@@ -8337,6 +8343,7 @@
           <w:sz w:val="32"/>
           <w:szCs w:val="32"/>
         </w:rPr>
+        <w:pageBreakBefore/>
       </w:pPr>
       <w:r>
         <w:rPr>
@@ -8769,6 +8776,7 @@
           <w:sz w:val="32"/>
           <w:szCs w:val="32"/>
         </w:rPr>
+        <w:pageBreakBefore/>
       </w:pPr>
       <w:r>
         <w:rPr>
@@ -12372,6 +12380,7 @@
         </w:rPr>
         <w:keepNext/>
         <w:keepLines/>
+        <w:pageBreakBefore/>
       </w:pPr>
       <w:r>
         <w:rPr>
@@ -13699,6 +13708,7 @@
         </w:rPr>
         <w:keepNext/>
         <w:keepLines/>
+        <w:pageBreakBefore/>
       </w:pPr>
       <w:r>
         <w:rPr>
@@ -23882,6 +23892,7 @@
         </w:rPr>
         <w:keepNext/>
         <w:keepLines/>
+        <w:pageBreakBefore/>
       </w:pPr>
       <w:r>
         <w:rPr>
@@ -44376,6 +44387,7 @@
         </w:rPr>
         <w:keepNext/>
         <w:keepLines/>
+        <w:pageBreakBefore/>
       </w:pPr>
       <w:r>
         <w:rPr>
@@ -45084,6 +45096,7 @@
         </w:rPr>
         <w:keepNext/>
         <w:keepLines/>
+        <w:pageBreakBefore/>
       </w:pPr>
       <w:r>
         <w:rPr>

</xml_diff>

<commit_message>
Correction des titres isolés en bas de page
</commit_message>
<xml_diff>
--- a/doc.docx
+++ b/doc.docx
@@ -4132,6 +4132,7 @@
           <w:szCs w:val="26"/>
         </w:rPr>
         <w:pageBreakBefore/>
+        <w:keepNext/>
       </w:pPr>
       <w:r>
         <w:rPr>
@@ -4264,6 +4265,7 @@
           <w:szCs w:val="32"/>
         </w:rPr>
         <w:pageBreakBefore/>
+        <w:keepNext/>
       </w:pPr>
       <w:r>
         <w:rPr>
@@ -6002,6 +6004,7 @@
           <w:szCs w:val="32"/>
         </w:rPr>
         <w:pageBreakBefore/>
+        <w:keepNext/>
       </w:pPr>
       <w:r>
         <w:rPr>
@@ -6800,6 +6803,7 @@
           <w:szCs w:val="32"/>
         </w:rPr>
         <w:pageBreakBefore/>
+        <w:keepNext/>
       </w:pPr>
       <w:r>
         <w:rPr>
@@ -7160,6 +7164,7 @@
           <w:szCs w:val="32"/>
         </w:rPr>
         <w:pageBreakBefore/>
+        <w:keepNext/>
       </w:pPr>
       <w:r>
         <w:t>Liste des figures, cartes et photos</w:t>
@@ -7788,6 +7793,7 @@
           <w:szCs w:val="32"/>
         </w:rPr>
         <w:pageBreakBefore/>
+        <w:keepNext/>
       </w:pPr>
       <w:r>
         <w:rPr>
@@ -8344,6 +8350,7 @@
           <w:szCs w:val="32"/>
         </w:rPr>
         <w:pageBreakBefore/>
+        <w:keepNext/>
       </w:pPr>
       <w:r>
         <w:rPr>
@@ -8777,6 +8784,7 @@
           <w:szCs w:val="32"/>
         </w:rPr>
         <w:pageBreakBefore/>
+        <w:keepNext/>
       </w:pPr>
       <w:r>
         <w:rPr>

</xml_diff>

<commit_message>
Suppression des pages blanches inutiles
</commit_message>
<xml_diff>
--- a/doc.docx
+++ b/doc.docx
@@ -4131,7 +4131,6 @@
           <w:sz w:val="26"/>
           <w:szCs w:val="26"/>
         </w:rPr>
-        <w:pageBreakBefore/>
         <w:keepNext/>
       </w:pPr>
       <w:r>
@@ -4264,7 +4263,6 @@
           <w:sz w:val="32"/>
           <w:szCs w:val="32"/>
         </w:rPr>
-        <w:pageBreakBefore/>
         <w:keepNext/>
       </w:pPr>
       <w:r>
@@ -6003,7 +6001,6 @@
           <w:sz w:val="32"/>
           <w:szCs w:val="32"/>
         </w:rPr>
-        <w:pageBreakBefore/>
         <w:keepNext/>
       </w:pPr>
       <w:r>
@@ -6802,7 +6799,6 @@
           <w:sz w:val="32"/>
           <w:szCs w:val="32"/>
         </w:rPr>
-        <w:pageBreakBefore/>
         <w:keepNext/>
       </w:pPr>
       <w:r>
@@ -13716,7 +13712,6 @@
         </w:rPr>
         <w:keepNext/>
         <w:keepLines/>
-        <w:pageBreakBefore/>
       </w:pPr>
       <w:r>
         <w:rPr>
@@ -14047,7 +14042,6 @@
           <w:sz w:val="24"/>
           <w:szCs w:val="24"/>
         </w:rPr>
-        <w:br w:type="page"/>
       </w:r>
     </w:p>
     <w:p ns2:paraId="11A86B27" ns2:textId="17056EEF">
@@ -24229,7 +24223,6 @@
           <w:sz w:val="26"/>
           <w:szCs w:val="26"/>
         </w:rPr>
-        <w:br w:type="page"/>
       </w:r>
     </w:p>
     <w:p ns2:paraId="34FC156F" ns2:textId="77777777">
@@ -33293,7 +33286,6 @@
           <w:sz w:val="26"/>
           <w:szCs w:val="26"/>
         </w:rPr>
-        <w:br w:type="page"/>
       </w:r>
     </w:p>
     <w:p ns2:paraId="6ECCCCAE" ns2:textId="77777777">

</xml_diff>

<commit_message>
Correction des coupures de tableaux
</commit_message>
<xml_diff>
--- a/doc.docx
+++ b/doc.docx
@@ -28664,6 +28664,7 @@
           <w:cnfStyle w:val="100000000000" w:firstRow="1" w:lastRow="0" w:firstColumn="0" w:lastColumn="0" w:oddVBand="0" w:evenVBand="0" w:oddHBand="0" w:evenHBand="0" w:firstRowFirstColumn="0" w:firstRowLastColumn="0" w:lastRowFirstColumn="0" w:lastRowLastColumn="0"/>
           <w:trHeight w:val="1690"/>
           <w:cantSplit/>
+          <w:tblHeader w:val="true"/>
         </w:trPr>
         <w:tc>
           <w:tcPr>
@@ -29718,6 +29719,7 @@
           <w:cnfStyle w:val="100000000000" w:firstRow="1" w:lastRow="0" w:firstColumn="0" w:lastColumn="0" w:oddVBand="0" w:evenVBand="0" w:oddHBand="0" w:evenHBand="0" w:firstRowFirstColumn="0" w:firstRowLastColumn="0" w:lastRowFirstColumn="0" w:lastRowLastColumn="0"/>
           <w:trHeight w:val="423"/>
           <w:cantSplit/>
+          <w:tblHeader w:val="true"/>
         </w:trPr>
         <w:tc>
           <w:tcPr>
@@ -40377,6 +40379,7 @@
         <w:trPr>
           <w:trHeight w:val="397"/>
           <w:cantSplit/>
+          <w:tblHeader w:val="true"/>
         </w:trPr>
         <w:tc>
           <w:tcPr>
@@ -40460,6 +40463,7 @@
           <w:wAfter w:w="14" w:type="dxa"/>
           <w:trHeight w:val="397"/>
           <w:cantSplit/>
+          <w:tblHeader w:val="true"/>
         </w:trPr>
         <w:tc>
           <w:tcPr>
@@ -40546,6 +40550,7 @@
           <w:wAfter w:w="14" w:type="dxa"/>
           <w:trHeight w:val="397"/>
           <w:cantSplit/>
+          <w:tblHeader w:val="true"/>
         </w:trPr>
         <w:tc>
           <w:tcPr>

</xml_diff>

<commit_message>
Harmonisation des titres des annexes
</commit_message>
<xml_diff>
--- a/doc.docx
+++ b/doc.docx
@@ -7818,7 +7818,7 @@
         </w:rPr>
       </w:pPr>
       <w:r>
-        <w:t xml:space="preserve">ANNEXE 1 : Organigramme de la mairie</w:t>
+        <w:t xml:space="preserve">Annexe 1 : Organigramme de la mairie</w:t>
       </w:r>
     </w:p>
     <w:p ns2:paraId="77B203B6" ns2:textId="66F4867D">
@@ -7837,7 +7837,7 @@
         </w:rPr>
       </w:pPr>
       <w:r>
-        <w:t xml:space="preserve">ANNEXE 2 : Questionnaire</w:t>
+        <w:t xml:space="preserve">Annexe 2 : Questionnaire</w:t>
       </w:r>
     </w:p>
     <w:p ns2:paraId="049516E3" ns2:textId="6C16E4EB">
@@ -7856,7 +7856,7 @@
         </w:rPr>
       </w:pPr>
       <w:r>
-        <w:t xml:space="preserve">ANNEXE 3 : Guide d’entretien</w:t>
+        <w:t xml:space="preserve">Annexe 3 : Guide d’entretien</w:t>
       </w:r>
     </w:p>
     <w:p ns2:paraId="669BA8D3" ns2:textId="0007873A">
@@ -7875,7 +7875,7 @@
         </w:rPr>
       </w:pPr>
       <w:r>
-        <w:t xml:space="preserve">ANNEXE 4 : Autres</w:t>
+        <w:t xml:space="preserve">Annexe 4 : Autres</w:t>
       </w:r>
     </w:p>
     <w:p ns2:paraId="17A3DE55" ns2:textId="77777777">

</xml_diff>

<commit_message>
Vérification du pied de page
</commit_message>
<xml_diff>
--- a/doc.docx
+++ b/doc.docx
@@ -47993,84 +47993,113 @@
 </file>
 
 <file path=word/footer1.xml><?xml version="1.0" encoding="utf-8"?>
-<w:ftr xmlns:wpc="http://schemas.microsoft.com/office/word/2010/wordprocessingCanvas" xmlns:cx="http://schemas.microsoft.com/office/drawing/2014/chartex" xmlns:mc="http://schemas.openxmlformats.org/markup-compatibility/2006" xmlns:o="urn:schemas-microsoft-com:office:office" xmlns:r="http://schemas.openxmlformats.org/officeDocument/2006/relationships" xmlns:m="http://schemas.openxmlformats.org/officeDocument/2006/math" xmlns:v="urn:schemas-microsoft-com:vml" xmlns:wp14="http://schemas.microsoft.com/office/word/2010/wordprocessingDrawing" xmlns:wp="http://schemas.openxmlformats.org/drawingml/2006/wordprocessingDrawing" xmlns:w10="urn:schemas-microsoft-com:office:word" xmlns:w="http://schemas.openxmlformats.org/wordprocessingml/2006/main" xmlns:w14="http://schemas.microsoft.com/office/word/2010/wordml" xmlns:w15="http://schemas.microsoft.com/office/word/2012/wordml" xmlns:w16se="http://schemas.microsoft.com/office/word/2015/wordml/symex" xmlns:wpg="http://schemas.microsoft.com/office/word/2010/wordprocessingGroup" xmlns:wpi="http://schemas.microsoft.com/office/word/2010/wordprocessingInk" xmlns:wne="http://schemas.microsoft.com/office/word/2006/wordml" xmlns:wps="http://schemas.microsoft.com/office/word/2010/wordprocessingShape" mc:Ignorable="w14 w15 w16se wp14">
-  <w:p>
+<w:ftr xmlns:ns1="http://schemas.openxmlformats.org/markup-compatibility/2006" xmlns:ns2="http://schemas.microsoft.com/office/word/2010/wordml" xmlns:w="http://schemas.openxmlformats.org/wordprocessingml/2006/main" ns1:Ignorable="w14 w15 w16se wp14">
+  <w:p ns2:paraId="70947CFD" ns2:textId="36358DFB">
     <w:pPr>
       <w:pStyle w:val="Pieddepage"/>
       <w:pBdr>
         <w:top w:val="thinThickSmallGap" w:sz="24" w:space="1" w:color="823B0B" w:themeColor="accent2" w:themeShade="7F"/>
       </w:pBdr>
       <w:rPr>
-        <w:rFonts w:asciiTheme="majorHAnsi" w:eastAsiaTheme="majorEastAsia" w:hAnsiTheme="majorHAnsi" w:cstheme="majorBidi"/>
+        <w:rFonts w:ascii="Times New Roman" w:hAnsi="Times New Roman" w:cs="Times New Roman" w:eastAsia="Times New Roman"/>
+        <w:sz w:val="20"/>
+        <w:szCs w:val="20"/>
       </w:rPr>
     </w:pPr>
     <w:r>
       <w:rPr>
-        <w:rFonts w:asciiTheme="majorHAnsi" w:eastAsiaTheme="majorEastAsia" w:hAnsiTheme="majorHAnsi" w:cstheme="majorBidi"/>
+        <w:rFonts w:ascii="Times New Roman" w:hAnsi="Times New Roman" w:cs="Times New Roman" w:eastAsia="Times New Roman"/>
+        <w:sz w:val="20"/>
+        <w:szCs w:val="20"/>
       </w:rPr>
       <w:t>Rédigé par</w:t>
     </w:r>
     <w:r>
       <w:rPr>
-        <w:rFonts w:asciiTheme="majorHAnsi" w:eastAsiaTheme="majorEastAsia" w:hAnsiTheme="majorHAnsi" w:cstheme="majorBidi"/>
+        <w:rFonts w:ascii="Times New Roman" w:hAnsi="Times New Roman" w:cs="Times New Roman" w:eastAsia="Times New Roman"/>
+        <w:sz w:val="20"/>
+        <w:szCs w:val="20"/>
       </w:rPr>
       <w:t xml:space="preserve"> BAH</w:t>
     </w:r>
     <w:r>
       <w:rPr>
-        <w:rFonts w:asciiTheme="majorHAnsi" w:eastAsiaTheme="majorEastAsia" w:hAnsiTheme="majorHAnsi" w:cstheme="majorBidi"/>
+        <w:rFonts w:ascii="Times New Roman" w:hAnsi="Times New Roman" w:cs="Times New Roman" w:eastAsia="Times New Roman"/>
+        <w:sz w:val="20"/>
+        <w:szCs w:val="20"/>
       </w:rPr>
       <w:t xml:space="preserve"> GUINE Yvette Raïssa</w:t>
     </w:r>
     <w:r>
       <w:rPr>
-        <w:rFonts w:asciiTheme="majorHAnsi" w:eastAsiaTheme="majorEastAsia" w:hAnsiTheme="majorHAnsi" w:cstheme="majorBidi"/>
+        <w:rFonts w:ascii="Times New Roman" w:hAnsi="Times New Roman" w:cs="Times New Roman" w:eastAsia="Times New Roman"/>
+        <w:sz w:val="20"/>
+        <w:szCs w:val="20"/>
       </w:rPr>
       <w:t xml:space="preserve"> </w:t>
     </w:r>
     <w:r>
       <w:rPr>
-        <w:rFonts w:asciiTheme="majorHAnsi" w:eastAsiaTheme="majorEastAsia" w:hAnsiTheme="majorHAnsi" w:cstheme="majorBidi"/>
+        <w:rFonts w:ascii="Times New Roman" w:hAnsi="Times New Roman" w:cs="Times New Roman" w:eastAsia="Times New Roman"/>
+        <w:sz w:val="20"/>
+        <w:szCs w:val="20"/>
       </w:rPr>
       <w:ptab w:relativeTo="margin" w:alignment="right" w:leader="none"/>
     </w:r>
     <w:r>
       <w:rPr>
-        <w:rFonts w:asciiTheme="majorHAnsi" w:eastAsiaTheme="majorEastAsia" w:hAnsiTheme="majorHAnsi" w:cstheme="majorBidi"/>
+        <w:rFonts w:ascii="Times New Roman" w:hAnsi="Times New Roman" w:cs="Times New Roman" w:eastAsia="Times New Roman"/>
+        <w:sz w:val="20"/>
+        <w:szCs w:val="20"/>
       </w:rPr>
       <w:t xml:space="preserve">Page </w:t>
     </w:r>
     <w:r>
       <w:rPr>
-        <w:rFonts w:eastAsiaTheme="minorEastAsia"/>
+        <w:rFonts w:ascii="Times New Roman" w:hAnsi="Times New Roman" w:cs="Times New Roman" w:eastAsia="Times New Roman"/>
+        <w:sz w:val="20"/>
+        <w:szCs w:val="20"/>
       </w:rPr>
       <w:fldChar w:fldCharType="begin"/>
     </w:r>
     <w:r>
       <w:instrText>PAGE   \* MERGEFORMAT</w:instrText>
+      <w:rPr>
+        <w:rFonts w:ascii="Times New Roman" w:hAnsi="Times New Roman" w:cs="Times New Roman" w:eastAsia="Times New Roman"/>
+        <w:sz w:val="20"/>
+        <w:szCs w:val="20"/>
+      </w:rPr>
     </w:r>
     <w:r>
       <w:rPr>
-        <w:rFonts w:eastAsiaTheme="minorEastAsia"/>
+        <w:rFonts w:ascii="Times New Roman" w:hAnsi="Times New Roman" w:cs="Times New Roman" w:eastAsia="Times New Roman"/>
+        <w:sz w:val="20"/>
+        <w:szCs w:val="20"/>
       </w:rPr>
       <w:fldChar w:fldCharType="separate"/>
     </w:r>
     <w:r>
       <w:rPr>
-        <w:rFonts w:asciiTheme="majorHAnsi" w:eastAsiaTheme="majorEastAsia" w:hAnsiTheme="majorHAnsi" w:cstheme="majorBidi"/>
+        <w:rFonts w:ascii="Times New Roman" w:hAnsi="Times New Roman" w:cs="Times New Roman" w:eastAsia="Times New Roman"/>
         <w:noProof/>
+        <w:sz w:val="20"/>
+        <w:szCs w:val="20"/>
       </w:rPr>
       <w:t>21</w:t>
     </w:r>
     <w:r>
       <w:rPr>
-        <w:rFonts w:asciiTheme="majorHAnsi" w:eastAsiaTheme="majorEastAsia" w:hAnsiTheme="majorHAnsi" w:cstheme="majorBidi"/>
+        <w:rFonts w:ascii="Times New Roman" w:hAnsi="Times New Roman" w:cs="Times New Roman" w:eastAsia="Times New Roman"/>
+        <w:sz w:val="20"/>
+        <w:szCs w:val="20"/>
       </w:rPr>
       <w:fldChar w:fldCharType="end"/>
     </w:r>
     <w:r>
       <w:rPr>
-        <w:rFonts w:asciiTheme="majorHAnsi" w:eastAsiaTheme="majorEastAsia" w:hAnsiTheme="majorHAnsi" w:cstheme="majorBidi"/>
+        <w:rFonts w:ascii="Times New Roman" w:hAnsi="Times New Roman" w:cs="Times New Roman" w:eastAsia="Times New Roman"/>
+        <w:sz w:val="20"/>
+        <w:szCs w:val="20"/>
       </w:rPr>
       <w:t xml:space="preserve"> </w:t>
     </w:r>

</xml_diff>

<commit_message>
Actualisation de la liste des figures
</commit_message>
<xml_diff>
--- a/doc.docx
+++ b/doc.docx
@@ -7248,83 +7248,58 @@
         <w:spacing w:before="0" w:after="0" w:line="240" w:lineRule="auto"/>
         <w:ind w:firstLine="0"/>
         <w:jc w:val="left"/>
+        <w:tabs>
+          <w:tab w:val="right" w:leader="dot" w:pos="8190"/>
+        </w:tabs>
       </w:pPr>
       <w:r>
         <w:rPr>
           <w:sz w:val="20"/>
           <w:szCs w:val="20"/>
         </w:rPr>
-        <w:fldChar w:fldCharType="begin" w:dirty="true"/>
+        <w:t xml:space="preserve">Photo 1 — Vue en image de la Mairie de Kérou</w:t>
       </w:r>
       <w:r>
         <w:rPr>
           <w:sz w:val="20"/>
           <w:szCs w:val="20"/>
         </w:rPr>
-        <w:instrText xml:space="preserve"> TOC \h \z \c "Photo" </w:instrText>
+        <w:tab/>
       </w:r>
       <w:r>
         <w:rPr>
           <w:sz w:val="20"/>
           <w:szCs w:val="20"/>
         </w:rPr>
-        <w:fldChar w:fldCharType="separate"/>
+        <w:t>25</w:t>
       </w:r>
       <w:r>
         <w:rPr>
           <w:sz w:val="20"/>
           <w:szCs w:val="20"/>
         </w:rPr>
-        <w:t xml:space="preserve">Photo 1 — Vue en image de la Mairie de Kérou</w:t>
+        <w:br/>
       </w:r>
       <w:r>
         <w:rPr>
           <w:sz w:val="20"/>
           <w:szCs w:val="20"/>
         </w:rPr>
-        <w:t xml:space="preserve">	</w:t>
+        <w:t xml:space="preserve">Photo 2 — Géolocalisation de la Mairie de Kérou</w:t>
       </w:r>
       <w:r>
         <w:rPr>
           <w:sz w:val="20"/>
           <w:szCs w:val="20"/>
         </w:rPr>
-        <w:t xml:space="preserve">18</w:t>
+        <w:tab/>
       </w:r>
       <w:r>
         <w:rPr>
           <w:sz w:val="20"/>
           <w:szCs w:val="20"/>
         </w:rPr>
-        <w:br/>
-      </w:r>
-      <w:r>
-        <w:rPr>
-          <w:sz w:val="20"/>
-          <w:szCs w:val="20"/>
-        </w:rPr>
-        <w:t xml:space="preserve">Photo 2 — Géolocalisation de la Mairie de Kérou</w:t>
-      </w:r>
-      <w:r>
-        <w:rPr>
-          <w:sz w:val="20"/>
-          <w:szCs w:val="20"/>
-        </w:rPr>
-        <w:t xml:space="preserve">	</w:t>
-      </w:r>
-      <w:r>
-        <w:rPr>
-          <w:sz w:val="20"/>
-          <w:szCs w:val="20"/>
-        </w:rPr>
-        <w:t xml:space="preserve">18</w:t>
-      </w:r>
-      <w:r>
-        <w:rPr>
-          <w:sz w:val="20"/>
-          <w:szCs w:val="20"/>
-        </w:rPr>
-        <w:fldChar w:fldCharType="end"/>
+        <w:t>25</w:t>
       </w:r>
     </w:p>
     <w:p>

</xml_diff>

<commit_message>
Contrôle des marges du mémoire
</commit_message>
<xml_diff>
--- a/doc.docx
+++ b/doc.docx
@@ -1,6 +1,6 @@
 
 <file path=word/document.xml><?xml version="1.0" encoding="utf-8"?>
-<w:document xmlns:ns1="http://schemas.openxmlformats.org/markup-compatibility/2006" xmlns:ns10="http://schemas.openxmlformats.org/officeDocument/2006/relationships" xmlns:ns11="urn:schemas-microsoft-com:vml" xmlns:ns12="urn:schemas-microsoft-com:office:office" xmlns:ns13="urn:schemas-microsoft-com:office:word" xmlns:ns2="http://schemas.microsoft.com/office/word/2010/wordml" xmlns:ns3="http://schemas.openxmlformats.org/drawingml/2006/wordprocessingDrawing" xmlns:ns4="http://schemas.microsoft.com/office/word/2010/wordprocessingDrawing" xmlns:ns5="http://schemas.openxmlformats.org/drawingml/2006/main" xmlns:ns6="http://schemas.microsoft.com/office/word/2010/wordprocessingGroup" xmlns:ns7="http://schemas.microsoft.com/office/word/2010/wordprocessingShape" xmlns:ns8="http://schemas.microsoft.com/office/drawing/2010/main" xmlns:ns9="http://schemas.openxmlformats.org/drawingml/2006/picture" xmlns:w="http://schemas.openxmlformats.org/wordprocessingml/2006/main" ns1:Ignorable="w14 w15 w16se wp14">
+<w:document xmlns:ns1="http://schemas.openxmlformats.org/markup-compatibility/2006" xmlns:ns10="http://schemas.openxmlformats.org/officeDocument/2006/relationships" xmlns:ns11="urn:schemas-microsoft-com:vml" xmlns:ns12="urn:schemas-microsoft-com:office:office" xmlns:ns13="urn:schemas-microsoft-com:office:word" xmlns:ns2="http://schemas.microsoft.com/office/word/2010/wordml" xmlns:ns4="http://schemas.microsoft.com/office/word/2010/wordprocessingDrawing" xmlns:ns5="http://schemas.openxmlformats.org/drawingml/2006/main" xmlns:ns6="http://schemas.microsoft.com/office/word/2010/wordprocessingGroup" xmlns:ns7="http://schemas.microsoft.com/office/word/2010/wordprocessingShape" xmlns:ns8="http://schemas.microsoft.com/office/drawing/2010/main" xmlns:ns9="http://schemas.openxmlformats.org/drawingml/2006/picture" xmlns:w="http://schemas.openxmlformats.org/wordprocessingml/2006/main" xmlns:wp="http://schemas.openxmlformats.org/drawingml/2006/wordprocessingDrawing" ns1:Ignorable="w14 w15 w16se wp14">
   <w:body>
     <w:p ns2:paraId="7AB3675A" ns2:textId="77777777">
       <w:pPr>
@@ -39,19 +39,19 @@
         <ns1:AlternateContent>
           <ns1:Choice Requires="wpg">
             <w:drawing>
-              <ns3:anchor distT="0" distB="0" distL="114300" distR="114300" simplePos="0" relativeHeight="251648000" behindDoc="1" locked="0" layoutInCell="1" allowOverlap="1" ns4:anchorId="4BAE0E57" ns4:editId="729E2BD9">
-                <ns3:simplePos x="0" y="0"/>
-                <ns3:positionH relativeFrom="margin">
-                  <ns3:posOffset>-167640</ns3:posOffset>
-                </ns3:positionH>
-                <ns3:positionV relativeFrom="paragraph">
-                  <ns3:posOffset>208915</ns3:posOffset>
-                </ns3:positionV>
-                <ns3:extent cx="2230120" cy="956310"/>
-                <ns3:effectExtent l="0" t="0" r="0" b="0"/>
-                <ns3:wrapNone/>
-                <ns3:docPr id="9" name="Groupe 9"/>
-                <ns3:cNvGraphicFramePr/>
+              <wp:anchor distT="0" distB="0" distL="114300" distR="114300" simplePos="0" relativeHeight="251648000" behindDoc="1" locked="0" layoutInCell="1" allowOverlap="1" ns4:anchorId="4BAE0E57" ns4:editId="729E2BD9">
+                <wp:simplePos x="0" y="0"/>
+                <wp:positionH relativeFrom="margin">
+                  <wp:posOffset>-167640</wp:posOffset>
+                </wp:positionH>
+                <wp:positionV relativeFrom="paragraph">
+                  <wp:posOffset>208915</wp:posOffset>
+                </wp:positionV>
+                <wp:extent cx="2230120" cy="956310"/>
+                <wp:effectExtent l="0" t="0" r="0" b="0"/>
+                <wp:wrapNone/>
+                <wp:docPr id="9" name="Groupe 9"/>
+                <wp:cNvGraphicFramePr/>
                 <ns5:graphic>
                   <ns5:graphicData uri="http://schemas.microsoft.com/office/word/2010/wordprocessingGroup">
                     <ns6:wgp>
@@ -377,7 +377,7 @@
                 <ns4:sizeRelV relativeFrom="margin">
                   <ns4:pctHeight>0</ns4:pctHeight>
                 </ns4:sizeRelV>
-              </ns3:anchor>
+              </wp:anchor>
             </w:drawing>
           </ns1:Choice>
           <ns1:Fallback>
@@ -498,29 +498,29 @@
         <ns1:AlternateContent>
           <ns1:Choice Requires="wps">
             <w:drawing>
-              <ns3:anchor distT="0" distB="0" distL="114300" distR="114300" simplePos="0" relativeHeight="251662336" behindDoc="1" locked="0" layoutInCell="1" allowOverlap="1" ns4:anchorId="2C135B1C" ns4:editId="7D9B0B92">
-                <ns3:simplePos x="0" y="0"/>
-                <ns3:positionH relativeFrom="margin">
-                  <ns3:posOffset>2317115</ns3:posOffset>
-                </ns3:positionH>
-                <ns3:positionV relativeFrom="paragraph">
-                  <ns3:posOffset>36195</ns3:posOffset>
-                </ns3:positionV>
-                <ns3:extent cx="2000250" cy="723265"/>
-                <ns3:effectExtent l="0" t="0" r="0" b="635"/>
-                <ns3:wrapTight wrapText="bothSides">
-                  <ns3:wrapPolygon edited="0">
-                    <ns3:start x="0" y="0"/>
-                    <ns3:lineTo x="0" y="21050"/>
-                    <ns3:lineTo x="21394" y="21050"/>
-                    <ns3:lineTo x="21394" y="0"/>
-                    <ns3:lineTo x="0" y="0"/>
-                  </ns3:wrapPolygon>
-                </ns3:wrapTight>
-                <ns3:docPr id="251250240" name="Zone de texte 251250240"/>
-                <ns3:cNvGraphicFramePr>
+              <wp:anchor distT="0" distB="0" distL="114300" distR="114300" simplePos="0" relativeHeight="251662336" behindDoc="1" locked="0" layoutInCell="1" allowOverlap="1" ns4:anchorId="2C135B1C" ns4:editId="7D9B0B92">
+                <wp:simplePos x="0" y="0"/>
+                <wp:positionH relativeFrom="margin">
+                  <wp:posOffset>2317115</wp:posOffset>
+                </wp:positionH>
+                <wp:positionV relativeFrom="paragraph">
+                  <wp:posOffset>36195</wp:posOffset>
+                </wp:positionV>
+                <wp:extent cx="2000250" cy="723265"/>
+                <wp:effectExtent l="0" t="0" r="0" b="635"/>
+                <wp:wrapTight wrapText="bothSides">
+                  <wp:wrapPolygon edited="0">
+                    <wp:start x="0" y="0"/>
+                    <wp:lineTo x="0" y="21050"/>
+                    <wp:lineTo x="21394" y="21050"/>
+                    <wp:lineTo x="21394" y="0"/>
+                    <wp:lineTo x="0" y="0"/>
+                  </wp:wrapPolygon>
+                </wp:wrapTight>
+                <wp:docPr id="251250240" name="Zone de texte 251250240"/>
+                <wp:cNvGraphicFramePr>
                   <ns5:graphicFrameLocks/>
-                </ns3:cNvGraphicFramePr>
+                </wp:cNvGraphicFramePr>
                 <ns5:graphic>
                   <ns5:graphicData uri="http://schemas.microsoft.com/office/word/2010/wordprocessingShape">
                     <ns7:wsp>
@@ -586,7 +586,7 @@
                 <ns4:sizeRelV relativeFrom="margin">
                   <ns4:pctHeight>0</ns4:pctHeight>
                 </ns4:sizeRelV>
-              </ns3:anchor>
+              </wp:anchor>
             </w:drawing>
           </ns1:Choice>
           <ns1:Fallback>
@@ -637,29 +637,29 @@
           <w:lang w:eastAsia="fr-FR"/>
         </w:rPr>
         <w:drawing>
-          <ns3:anchor distT="0" distB="0" distL="114300" distR="114300" simplePos="0" relativeHeight="251641856" behindDoc="1" locked="0" layoutInCell="1" allowOverlap="1" ns4:anchorId="4017EE67" ns4:editId="7121C3C0">
-            <ns3:simplePos x="0" y="0"/>
-            <ns3:positionH relativeFrom="column">
-              <ns3:posOffset>5479415</ns3:posOffset>
-            </ns3:positionH>
-            <ns3:positionV relativeFrom="paragraph">
-              <ns3:posOffset>83185</ns3:posOffset>
-            </ns3:positionV>
-            <ns3:extent cx="790575" cy="740410"/>
-            <ns3:effectExtent l="0" t="0" r="9525" b="2540"/>
-            <ns3:wrapTight wrapText="bothSides">
-              <ns3:wrapPolygon edited="0">
-                <ns3:start x="0" y="0"/>
-                <ns3:lineTo x="0" y="21118"/>
-                <ns3:lineTo x="21340" y="21118"/>
-                <ns3:lineTo x="21340" y="0"/>
-                <ns3:lineTo x="0" y="0"/>
-              </ns3:wrapPolygon>
-            </ns3:wrapTight>
-            <ns3:docPr id="2" name="Image 2"/>
-            <ns3:cNvGraphicFramePr>
+          <wp:anchor distT="0" distB="0" distL="114300" distR="114300" simplePos="0" relativeHeight="251641856" behindDoc="1" locked="0" layoutInCell="1" allowOverlap="1" ns4:anchorId="4017EE67" ns4:editId="7121C3C0">
+            <wp:simplePos x="0" y="0"/>
+            <wp:positionH relativeFrom="column">
+              <wp:posOffset>5479415</wp:posOffset>
+            </wp:positionH>
+            <wp:positionV relativeFrom="paragraph">
+              <wp:posOffset>83185</wp:posOffset>
+            </wp:positionV>
+            <wp:extent cx="790575" cy="740410"/>
+            <wp:effectExtent l="0" t="0" r="9525" b="2540"/>
+            <wp:wrapTight wrapText="bothSides">
+              <wp:wrapPolygon edited="0">
+                <wp:start x="0" y="0"/>
+                <wp:lineTo x="0" y="21118"/>
+                <wp:lineTo x="21340" y="21118"/>
+                <wp:lineTo x="21340" y="0"/>
+                <wp:lineTo x="0" y="0"/>
+              </wp:wrapPolygon>
+            </wp:wrapTight>
+            <wp:docPr id="2" name="Image 2"/>
+            <wp:cNvGraphicFramePr>
               <ns5:graphicFrameLocks noChangeAspect="1"/>
-            </ns3:cNvGraphicFramePr>
+            </wp:cNvGraphicFramePr>
             <ns5:graphic>
               <ns5:graphicData uri="http://schemas.openxmlformats.org/drawingml/2006/picture">
                 <ns9:pic>
@@ -701,7 +701,7 @@
             <ns4:sizeRelV relativeFrom="page">
               <ns4:pctHeight>0</ns4:pctHeight>
             </ns4:sizeRelV>
-          </ns3:anchor>
+          </wp:anchor>
         </w:drawing>
       </w:r>
       <w:r>
@@ -711,29 +711,29 @@
           <w:lang w:eastAsia="fr-FR"/>
         </w:rPr>
         <w:drawing>
-          <ns3:anchor distT="0" distB="0" distL="114300" distR="114300" simplePos="0" relativeHeight="251639808" behindDoc="1" locked="0" layoutInCell="1" allowOverlap="1" ns4:anchorId="375F90E4" ns4:editId="68464348">
-            <ns3:simplePos x="0" y="0"/>
-            <ns3:positionH relativeFrom="margin">
-              <ns3:posOffset>4472305</ns3:posOffset>
-            </ns3:positionH>
-            <ns3:positionV relativeFrom="paragraph">
-              <ns3:posOffset>136525</ns3:posOffset>
-            </ns3:positionV>
-            <ns3:extent cx="573405" cy="569595"/>
-            <ns3:effectExtent l="0" t="0" r="0" b="1905"/>
-            <ns3:wrapTight wrapText="bothSides">
-              <ns3:wrapPolygon edited="0">
-                <ns3:start x="0" y="0"/>
-                <ns3:lineTo x="0" y="20950"/>
-                <ns3:lineTo x="20811" y="20950"/>
-                <ns3:lineTo x="20811" y="0"/>
-                <ns3:lineTo x="0" y="0"/>
-              </ns3:wrapPolygon>
-            </ns3:wrapTight>
-            <ns3:docPr id="1" name="Image 1"/>
-            <ns3:cNvGraphicFramePr>
+          <wp:anchor distT="0" distB="0" distL="114300" distR="114300" simplePos="0" relativeHeight="251639808" behindDoc="1" locked="0" layoutInCell="1" allowOverlap="1" ns4:anchorId="375F90E4" ns4:editId="68464348">
+            <wp:simplePos x="0" y="0"/>
+            <wp:positionH relativeFrom="margin">
+              <wp:posOffset>4472305</wp:posOffset>
+            </wp:positionH>
+            <wp:positionV relativeFrom="paragraph">
+              <wp:posOffset>136525</wp:posOffset>
+            </wp:positionV>
+            <wp:extent cx="573405" cy="569595"/>
+            <wp:effectExtent l="0" t="0" r="0" b="1905"/>
+            <wp:wrapTight wrapText="bothSides">
+              <wp:wrapPolygon edited="0">
+                <wp:start x="0" y="0"/>
+                <wp:lineTo x="0" y="20950"/>
+                <wp:lineTo x="20811" y="20950"/>
+                <wp:lineTo x="20811" y="0"/>
+                <wp:lineTo x="0" y="0"/>
+              </wp:wrapPolygon>
+            </wp:wrapTight>
+            <wp:docPr id="1" name="Image 1"/>
+            <wp:cNvGraphicFramePr>
               <ns5:graphicFrameLocks noChangeAspect="1"/>
-            </ns3:cNvGraphicFramePr>
+            </wp:cNvGraphicFramePr>
             <ns5:graphic>
               <ns5:graphicData uri="http://schemas.openxmlformats.org/drawingml/2006/picture">
                 <ns9:pic>
@@ -775,7 +775,7 @@
             <ns4:sizeRelV relativeFrom="page">
               <ns4:pctHeight>0</ns4:pctHeight>
             </ns4:sizeRelV>
-          </ns3:anchor>
+          </wp:anchor>
         </w:drawing>
       </w:r>
     </w:p>
@@ -814,21 +814,21 @@
         <ns1:AlternateContent>
           <ns1:Choice Requires="wps">
             <w:drawing>
-              <ns3:anchor distT="0" distB="0" distL="114300" distR="114300" simplePos="0" relativeHeight="251674624" behindDoc="0" locked="0" layoutInCell="1" allowOverlap="1" ns4:anchorId="06D7241B" ns4:editId="0690C31B">
-                <ns3:simplePos x="0" y="0"/>
-                <ns3:positionH relativeFrom="margin">
-                  <ns3:posOffset>0</ns3:posOffset>
-                </ns3:positionH>
-                <ns3:positionV relativeFrom="paragraph">
-                  <ns3:posOffset>-635</ns3:posOffset>
-                </ns3:positionV>
-                <ns3:extent cx="6106160" cy="0"/>
-                <ns3:effectExtent l="0" t="0" r="0" b="0"/>
-                <ns3:wrapNone/>
-                <ns3:docPr id="54" name="AutoShape 25"/>
-                <ns3:cNvGraphicFramePr>
+              <wp:anchor distT="0" distB="0" distL="114300" distR="114300" simplePos="0" relativeHeight="251674624" behindDoc="0" locked="0" layoutInCell="1" allowOverlap="1" ns4:anchorId="06D7241B" ns4:editId="0690C31B">
+                <wp:simplePos x="0" y="0"/>
+                <wp:positionH relativeFrom="margin">
+                  <wp:posOffset>0</wp:posOffset>
+                </wp:positionH>
+                <wp:positionV relativeFrom="paragraph">
+                  <wp:posOffset>-635</wp:posOffset>
+                </wp:positionV>
+                <wp:extent cx="6106160" cy="0"/>
+                <wp:effectExtent l="0" t="0" r="0" b="0"/>
+                <wp:wrapNone/>
+                <wp:docPr id="54" name="AutoShape 25"/>
+                <wp:cNvGraphicFramePr>
                   <ns5:graphicFrameLocks/>
-                </ns3:cNvGraphicFramePr>
+                </wp:cNvGraphicFramePr>
                 <ns5:graphic>
                   <ns5:graphicData uri="http://schemas.microsoft.com/office/word/2010/wordprocessingShape">
                     <ns7:wsp>
@@ -857,7 +857,7 @@
                     </ns7:wsp>
                   </ns5:graphicData>
                 </ns5:graphic>
-              </ns3:anchor>
+              </wp:anchor>
             </w:drawing>
           </ns1:Choice>
           <ns1:Fallback>
@@ -1036,21 +1036,21 @@
         <ns1:AlternateContent>
           <ns1:Choice Requires="wps">
             <w:drawing>
-              <ns3:anchor distT="0" distB="0" distL="114300" distR="114300" simplePos="0" relativeHeight="251664384" behindDoc="0" locked="1" layoutInCell="1" allowOverlap="1" ns4:anchorId="6A9013CB" ns4:editId="34544F81">
-                <ns3:simplePos x="0" y="0"/>
-                <ns3:positionH relativeFrom="column">
-                  <ns3:posOffset>748030</ns3:posOffset>
-                </ns3:positionH>
-                <ns3:positionV relativeFrom="paragraph">
-                  <ns3:posOffset>303530</ns3:posOffset>
-                </ns3:positionV>
-                <ns3:extent cx="4857750" cy="752475"/>
-                <ns3:effectExtent l="38100" t="38100" r="57150" b="66675"/>
-                <ns3:wrapNone/>
-                <ns3:docPr id="1715820105" name="Rectangle à coins arrondis 1715820105"/>
-                <ns3:cNvGraphicFramePr>
+              <wp:anchor distT="0" distB="0" distL="114300" distR="114300" simplePos="0" relativeHeight="251664384" behindDoc="0" locked="1" layoutInCell="1" allowOverlap="1" ns4:anchorId="6A9013CB" ns4:editId="34544F81">
+                <wp:simplePos x="0" y="0"/>
+                <wp:positionH relativeFrom="column">
+                  <wp:posOffset>748030</wp:posOffset>
+                </wp:positionH>
+                <wp:positionV relativeFrom="paragraph">
+                  <wp:posOffset>303530</wp:posOffset>
+                </wp:positionV>
+                <wp:extent cx="4857750" cy="752475"/>
+                <wp:effectExtent l="38100" t="38100" r="57150" b="66675"/>
+                <wp:wrapNone/>
+                <wp:docPr id="1715820105" name="Rectangle à coins arrondis 1715820105"/>
+                <wp:cNvGraphicFramePr>
                   <ns5:graphicFrameLocks/>
-                </ns3:cNvGraphicFramePr>
+                </wp:cNvGraphicFramePr>
                 <ns5:graphic>
                   <ns5:graphicData uri="http://schemas.microsoft.com/office/word/2010/wordprocessingShape">
                     <ns7:wsp>
@@ -1178,7 +1178,7 @@
                 <ns4:sizeRelV relativeFrom="margin">
                   <ns4:pctHeight>0</ns4:pctHeight>
                 </ns4:sizeRelV>
-              </ns3:anchor>
+              </wp:anchor>
             </w:drawing>
           </ns1:Choice>
           <ns1:Fallback>
@@ -1374,19 +1374,19 @@
         <ns1:AlternateContent>
           <ns1:Choice Requires="wps">
             <w:drawing>
-              <ns3:anchor distT="0" distB="0" distL="114300" distR="114300" simplePos="0" relativeHeight="251656192" behindDoc="0" locked="0" layoutInCell="1" allowOverlap="1" ns4:anchorId="217ACBE6" ns4:editId="7EED0DB1">
-                <ns3:simplePos x="0" y="0"/>
-                <ns3:positionH relativeFrom="margin">
-                  <ns3:posOffset>3491231</ns3:posOffset>
-                </ns3:positionH>
-                <ns3:positionV relativeFrom="paragraph">
-                  <ns3:posOffset>245745</ns3:posOffset>
-                </ns3:positionV>
-                <ns3:extent cx="1619250" cy="142875"/>
-                <ns3:effectExtent l="0" t="0" r="19050" b="28575"/>
-                <ns3:wrapNone/>
-                <ns3:docPr id="32" name="Zone de texte 32"/>
-                <ns3:cNvGraphicFramePr/>
+              <wp:anchor distT="0" distB="0" distL="114300" distR="114300" simplePos="0" relativeHeight="251656192" behindDoc="0" locked="0" layoutInCell="1" allowOverlap="1" ns4:anchorId="217ACBE6" ns4:editId="7EED0DB1">
+                <wp:simplePos x="0" y="0"/>
+                <wp:positionH relativeFrom="margin">
+                  <wp:posOffset>3491231</wp:posOffset>
+                </wp:positionH>
+                <wp:positionV relativeFrom="paragraph">
+                  <wp:posOffset>245745</wp:posOffset>
+                </wp:positionV>
+                <wp:extent cx="1619250" cy="142875"/>
+                <wp:effectExtent l="0" t="0" r="19050" b="28575"/>
+                <wp:wrapNone/>
+                <wp:docPr id="32" name="Zone de texte 32"/>
+                <wp:cNvGraphicFramePr/>
                 <ns5:graphic>
                   <ns5:graphicData uri="http://schemas.microsoft.com/office/word/2010/wordprocessingShape">
                     <ns7:wsp>
@@ -1435,7 +1435,7 @@
                 <ns4:sizeRelV relativeFrom="margin">
                   <ns4:pctHeight>0</ns4:pctHeight>
                 </ns4:sizeRelV>
-              </ns3:anchor>
+              </wp:anchor>
             </w:drawing>
           </ns1:Choice>
           <ns1:Fallback>
@@ -1519,21 +1519,21 @@
         <ns1:AlternateContent>
           <ns1:Choice Requires="wps">
             <w:drawing>
-              <ns3:anchor distT="0" distB="0" distL="114300" distR="114300" simplePos="0" relativeHeight="251652096" behindDoc="0" locked="0" layoutInCell="1" allowOverlap="1" ns4:anchorId="67334904" ns4:editId="436FF1E3">
-                <ns3:simplePos x="0" y="0"/>
-                <ns3:positionH relativeFrom="column">
-                  <ns3:posOffset>4790373</ns3:posOffset>
-                </ns3:positionH>
-                <ns3:positionV relativeFrom="paragraph">
-                  <ns3:posOffset>79576</ns3:posOffset>
-                </ns3:positionV>
-                <ns3:extent cx="1596189" cy="1171575"/>
-                <ns3:effectExtent l="0" t="0" r="4445" b="9525"/>
-                <ns3:wrapNone/>
-                <ns3:docPr id="6" name="Rectangle 6"/>
-                <ns3:cNvGraphicFramePr>
+              <wp:anchor distT="0" distB="0" distL="114300" distR="114300" simplePos="0" relativeHeight="251652096" behindDoc="0" locked="0" layoutInCell="1" allowOverlap="1" ns4:anchorId="67334904" ns4:editId="436FF1E3">
+                <wp:simplePos x="0" y="0"/>
+                <wp:positionH relativeFrom="column">
+                  <wp:posOffset>4790373</wp:posOffset>
+                </wp:positionH>
+                <wp:positionV relativeFrom="paragraph">
+                  <wp:posOffset>79576</wp:posOffset>
+                </wp:positionV>
+                <wp:extent cx="1596189" cy="1171575"/>
+                <wp:effectExtent l="0" t="0" r="4445" b="9525"/>
+                <wp:wrapNone/>
+                <wp:docPr id="6" name="Rectangle 6"/>
+                <wp:cNvGraphicFramePr>
                   <ns5:graphicFrameLocks/>
-                </ns3:cNvGraphicFramePr>
+                </wp:cNvGraphicFramePr>
                 <ns5:graphic>
                   <ns5:graphicData uri="http://schemas.microsoft.com/office/word/2010/wordprocessingShape">
                     <ns7:wsp>
@@ -1646,7 +1646,7 @@
                 <ns4:sizeRelV relativeFrom="page">
                   <ns4:pctHeight>0</ns4:pctHeight>
                 </ns4:sizeRelV>
-              </ns3:anchor>
+              </wp:anchor>
             </w:drawing>
           </ns1:Choice>
           <ns1:Fallback>
@@ -1733,19 +1733,19 @@
         <ns1:AlternateContent>
           <ns1:Choice Requires="wps">
             <w:drawing>
-              <ns3:anchor distT="0" distB="0" distL="114300" distR="114300" simplePos="0" relativeHeight="251660288" behindDoc="0" locked="0" layoutInCell="1" allowOverlap="1" ns4:anchorId="4E26EE04" ns4:editId="2B490783">
-                <ns3:simplePos x="0" y="0"/>
-                <ns3:positionH relativeFrom="margin">
-                  <ns3:posOffset>-224790</ns3:posOffset>
-                </ns3:positionH>
-                <ns3:positionV relativeFrom="paragraph">
-                  <ns3:posOffset>205740</ns3:posOffset>
-                </ns3:positionV>
-                <ns3:extent cx="2146935" cy="1771650"/>
-                <ns3:effectExtent l="0" t="0" r="24765" b="19050"/>
-                <ns3:wrapNone/>
-                <ns3:docPr id="11" name="Zone de texte 11"/>
-                <ns3:cNvGraphicFramePr/>
+              <wp:anchor distT="0" distB="0" distL="114300" distR="114300" simplePos="0" relativeHeight="251660288" behindDoc="0" locked="0" layoutInCell="1" allowOverlap="1" ns4:anchorId="4E26EE04" ns4:editId="2B490783">
+                <wp:simplePos x="0" y="0"/>
+                <wp:positionH relativeFrom="margin">
+                  <wp:posOffset>-224790</wp:posOffset>
+                </wp:positionH>
+                <wp:positionV relativeFrom="paragraph">
+                  <wp:posOffset>205740</wp:posOffset>
+                </wp:positionV>
+                <wp:extent cx="2146935" cy="1771650"/>
+                <wp:effectExtent l="0" t="0" r="24765" b="19050"/>
+                <wp:wrapNone/>
+                <wp:docPr id="11" name="Zone de texte 11"/>
+                <wp:cNvGraphicFramePr/>
                 <ns5:graphic>
                   <ns5:graphicData uri="http://schemas.microsoft.com/office/word/2010/wordprocessingShape">
                     <ns7:wsp>
@@ -1907,7 +1907,7 @@
                 <ns4:sizeRelV relativeFrom="margin">
                   <ns4:pctHeight>0</ns4:pctHeight>
                 </ns4:sizeRelV>
-              </ns3:anchor>
+              </wp:anchor>
             </w:drawing>
           </ns1:Choice>
           <ns1:Fallback>
@@ -2053,21 +2053,21 @@
         <ns1:AlternateContent>
           <ns1:Choice Requires="wps">
             <w:drawing>
-              <ns3:anchor distT="0" distB="0" distL="114300" distR="114300" simplePos="0" relativeHeight="251645952" behindDoc="0" locked="0" layoutInCell="1" allowOverlap="1" ns4:anchorId="18BB8649" ns4:editId="6D1B5B49">
-                <ns3:simplePos x="0" y="0"/>
-                <ns3:positionH relativeFrom="column">
-                  <ns3:posOffset>1840865</ns3:posOffset>
-                </ns3:positionH>
-                <ns3:positionV relativeFrom="paragraph">
-                  <ns3:posOffset>151765</ns3:posOffset>
-                </ns3:positionV>
-                <ns3:extent cx="1734820" cy="1228725"/>
-                <ns3:effectExtent l="0" t="0" r="0" b="9525"/>
-                <ns3:wrapNone/>
-                <ns3:docPr id="8" name="Zone de texte 8"/>
-                <ns3:cNvGraphicFramePr>
+              <wp:anchor distT="0" distB="0" distL="114300" distR="114300" simplePos="0" relativeHeight="251645952" behindDoc="0" locked="0" layoutInCell="1" allowOverlap="1" ns4:anchorId="18BB8649" ns4:editId="6D1B5B49">
+                <wp:simplePos x="0" y="0"/>
+                <wp:positionH relativeFrom="column">
+                  <wp:posOffset>1840865</wp:posOffset>
+                </wp:positionH>
+                <wp:positionV relativeFrom="paragraph">
+                  <wp:posOffset>151765</wp:posOffset>
+                </wp:positionV>
+                <wp:extent cx="1734820" cy="1228725"/>
+                <wp:effectExtent l="0" t="0" r="0" b="9525"/>
+                <wp:wrapNone/>
+                <wp:docPr id="8" name="Zone de texte 8"/>
+                <wp:cNvGraphicFramePr>
                   <ns5:graphicFrameLocks/>
-                </ns3:cNvGraphicFramePr>
+                </wp:cNvGraphicFramePr>
                 <ns5:graphic>
                   <ns5:graphicData uri="http://schemas.microsoft.com/office/word/2010/wordprocessingShape">
                     <ns7:wsp>
@@ -2118,7 +2118,7 @@
                 <ns4:sizeRelV relativeFrom="page">
                   <ns4:pctHeight>0</ns4:pctHeight>
                 </ns4:sizeRelV>
-              </ns3:anchor>
+              </wp:anchor>
             </w:drawing>
           </ns1:Choice>
           <ns1:Fallback>
@@ -2143,21 +2143,21 @@
         <ns1:AlternateContent>
           <ns1:Choice Requires="wps">
             <w:drawing>
-              <ns3:anchor distT="0" distB="0" distL="114300" distR="114300" simplePos="0" relativeHeight="251643904" behindDoc="0" locked="0" layoutInCell="1" allowOverlap="1" ns4:anchorId="4D89E546" ns4:editId="3E2D7BAE">
-                <ns3:simplePos x="0" y="0"/>
-                <ns3:positionH relativeFrom="column">
-                  <ns3:posOffset>-171450</ns3:posOffset>
-                </ns3:positionH>
-                <ns3:positionV relativeFrom="paragraph">
-                  <ns3:posOffset>151765</ns3:posOffset>
-                </ns3:positionV>
-                <ns3:extent cx="2099310" cy="1228725"/>
-                <ns3:effectExtent l="0" t="0" r="0" b="9525"/>
-                <ns3:wrapNone/>
-                <ns3:docPr id="7" name="Rectangle 7"/>
-                <ns3:cNvGraphicFramePr>
+              <wp:anchor distT="0" distB="0" distL="114300" distR="114300" simplePos="0" relativeHeight="251643904" behindDoc="0" locked="0" layoutInCell="1" allowOverlap="1" ns4:anchorId="4D89E546" ns4:editId="3E2D7BAE">
+                <wp:simplePos x="0" y="0"/>
+                <wp:positionH relativeFrom="column">
+                  <wp:posOffset>-171450</wp:posOffset>
+                </wp:positionH>
+                <wp:positionV relativeFrom="paragraph">
+                  <wp:posOffset>151765</wp:posOffset>
+                </wp:positionV>
+                <wp:extent cx="2099310" cy="1228725"/>
+                <wp:effectExtent l="0" t="0" r="0" b="9525"/>
+                <wp:wrapNone/>
+                <wp:docPr id="7" name="Rectangle 7"/>
+                <wp:cNvGraphicFramePr>
                   <ns5:graphicFrameLocks/>
-                </ns3:cNvGraphicFramePr>
+                </wp:cNvGraphicFramePr>
                 <ns5:graphic>
                   <ns5:graphicData uri="http://schemas.microsoft.com/office/word/2010/wordprocessingShape">
                     <ns7:wsp>
@@ -2237,7 +2237,7 @@
                 <ns4:sizeRelV relativeFrom="page">
                   <ns4:pctHeight>0</ns4:pctHeight>
                 </ns4:sizeRelV>
-              </ns3:anchor>
+              </wp:anchor>
             </w:drawing>
           </ns1:Choice>
           <ns1:Fallback>
@@ -3420,19 +3420,19 @@
         <ns1:AlternateContent>
           <ns1:Choice Requires="wps">
             <w:drawing>
-              <ns3:anchor distT="0" distB="0" distL="114300" distR="114300" simplePos="0" relativeHeight="251654144" behindDoc="0" locked="0" layoutInCell="1" allowOverlap="1" ns4:anchorId="71EEA676" ns4:editId="5C963E32">
-                <ns3:simplePos x="0" y="0"/>
-                <ns3:positionH relativeFrom="column">
-                  <ns3:posOffset>608196</ns3:posOffset>
-                </ns3:positionH>
-                <ns3:positionV relativeFrom="paragraph">
-                  <ns3:posOffset>151398</ns3:posOffset>
-                </ns3:positionV>
-                <ns3:extent cx="5029200" cy="2838893"/>
-                <ns3:effectExtent l="0" t="0" r="19050" b="19050"/>
-                <ns3:wrapNone/>
-                <ns3:docPr id="21" name="Plaque 21"/>
-                <ns3:cNvGraphicFramePr/>
+              <wp:anchor distT="0" distB="0" distL="114300" distR="114300" simplePos="0" relativeHeight="251654144" behindDoc="0" locked="0" layoutInCell="1" allowOverlap="1" ns4:anchorId="71EEA676" ns4:editId="5C963E32">
+                <wp:simplePos x="0" y="0"/>
+                <wp:positionH relativeFrom="column">
+                  <wp:posOffset>608196</wp:posOffset>
+                </wp:positionH>
+                <wp:positionV relativeFrom="paragraph">
+                  <wp:posOffset>151398</wp:posOffset>
+                </wp:positionV>
+                <wp:extent cx="4937760" cy="2838893"/>
+                <wp:effectExtent l="0" t="0" r="19050" b="19050"/>
+                <wp:wrapNone/>
+                <wp:docPr id="21" name="Plaque 21"/>
+                <wp:cNvGraphicFramePr/>
                 <ns5:graphic>
                   <ns5:graphicData uri="http://schemas.microsoft.com/office/word/2010/wordprocessingShape">
                     <ns7:wsp>
@@ -3625,7 +3625,7 @@
                 <ns4:sizeRelV relativeFrom="margin">
                   <ns4:pctHeight>0</ns4:pctHeight>
                 </ns4:sizeRelV>
-              </ns3:anchor>
+              </wp:anchor>
             </w:drawing>
           </ns1:Choice>
           <ns1:Fallback>
@@ -12432,19 +12432,19 @@
         <ns1:AlternateContent>
           <ns1:Choice Requires="wps">
             <w:drawing>
-              <ns3:anchor distT="0" distB="0" distL="114300" distR="114300" simplePos="0" relativeHeight="251676672" behindDoc="0" locked="0" layoutInCell="1" allowOverlap="1" ns4:anchorId="637AD4DA" ns4:editId="123B3BED">
-                <ns3:simplePos x="0" y="0"/>
-                <ns3:positionH relativeFrom="page">
-                  <ns3:posOffset>2345155</ns3:posOffset>
-                </ns3:positionH>
-                <ns3:positionV relativeFrom="paragraph">
-                  <ns3:posOffset>139499</ns3:posOffset>
-                </ns3:positionV>
-                <ns3:extent cx="2800350" cy="737369"/>
-                <ns3:effectExtent l="19050" t="0" r="38100" b="24765"/>
-                <ns3:wrapNone/>
-                <ns3:docPr id="3" name="Hexagone 3"/>
-                <ns3:cNvGraphicFramePr/>
+              <wp:anchor distT="0" distB="0" distL="114300" distR="114300" simplePos="0" relativeHeight="251676672" behindDoc="0" locked="0" layoutInCell="1" allowOverlap="1" ns4:anchorId="637AD4DA" ns4:editId="123B3BED">
+                <wp:simplePos x="0" y="0"/>
+                <wp:positionH relativeFrom="page">
+                  <wp:posOffset>2345155</wp:posOffset>
+                </wp:positionH>
+                <wp:positionV relativeFrom="paragraph">
+                  <wp:posOffset>139499</wp:posOffset>
+                </wp:positionV>
+                <wp:extent cx="2800350" cy="737369"/>
+                <wp:effectExtent l="19050" t="0" r="38100" b="24765"/>
+                <wp:wrapNone/>
+                <wp:docPr id="3" name="Hexagone 3"/>
+                <wp:cNvGraphicFramePr/>
                 <ns5:graphic>
                   <ns5:graphicData uri="http://schemas.microsoft.com/office/word/2010/wordprocessingShape">
                     <ns7:wsp>
@@ -12550,7 +12550,7 @@
                 <ns4:sizeRelV relativeFrom="margin">
                   <ns4:pctHeight>0</ns4:pctHeight>
                 </ns4:sizeRelV>
-              </ns3:anchor>
+              </wp:anchor>
             </w:drawing>
           </ns1:Choice>
           <ns1:Fallback>
@@ -13759,19 +13759,19 @@
         <ns1:AlternateContent>
           <ns1:Choice Requires="wps">
             <w:drawing>
-              <ns3:anchor distT="0" distB="0" distL="114300" distR="114300" simplePos="0" relativeHeight="251666432" behindDoc="0" locked="0" layoutInCell="1" allowOverlap="1" ns4:anchorId="02512AF6" ns4:editId="2AD0919F">
-                <ns3:simplePos x="0" y="0"/>
-                <ns3:positionH relativeFrom="column">
-                  <ns3:posOffset>638476</ns3:posOffset>
-                </ns3:positionH>
-                <ns3:positionV relativeFrom="paragraph">
-                  <ns3:posOffset>1431524</ns3:posOffset>
-                </ns3:positionV>
-                <ns3:extent cx="4954002" cy="2269958"/>
-                <ns3:effectExtent l="19050" t="0" r="37465" b="16510"/>
-                <ns3:wrapNone/>
-                <ns3:docPr id="4" name="Hexagone 4"/>
-                <ns3:cNvGraphicFramePr/>
+              <wp:anchor distT="0" distB="0" distL="114300" distR="114300" simplePos="0" relativeHeight="251666432" behindDoc="0" locked="0" layoutInCell="1" allowOverlap="1" ns4:anchorId="02512AF6" ns4:editId="2AD0919F">
+                <wp:simplePos x="0" y="0"/>
+                <wp:positionH relativeFrom="column">
+                  <wp:posOffset>638476</wp:posOffset>
+                </wp:positionH>
+                <wp:positionV relativeFrom="paragraph">
+                  <wp:posOffset>1431524</wp:posOffset>
+                </wp:positionV>
+                <wp:extent cx="4925000" cy="2269958"/>
+                <wp:effectExtent l="19050" t="0" r="37465" b="16510"/>
+                <wp:wrapNone/>
+                <wp:docPr id="4" name="Hexagone 4"/>
+                <wp:cNvGraphicFramePr/>
                 <ns5:graphic>
                   <ns5:graphicData uri="http://schemas.microsoft.com/office/word/2010/wordprocessingShape">
                     <ns7:wsp>
@@ -13943,7 +13943,7 @@
                 <ns4:sizeRelV relativeFrom="margin">
                   <ns4:pctHeight>0</ns4:pctHeight>
                 </ns4:sizeRelV>
-              </ns3:anchor>
+              </wp:anchor>
             </w:drawing>
           </ns1:Choice>
           <ns1:Fallback>
@@ -15241,13 +15241,13 @@
           <w:lang w:eastAsia="fr-FR"/>
         </w:rPr>
         <w:drawing>
-          <ns3:inline distT="0" distB="0" distL="0" distR="0" ns4:anchorId="6CA92A5D" ns4:editId="57984117">
-            <ns3:extent cx="3429000" cy="2571750"/>
-            <ns3:effectExtent l="0" t="0" r="0" b="0"/>
-            <ns3:docPr id="678639386" name="Image 1"/>
-            <ns3:cNvGraphicFramePr>
+          <wp:inline distT="0" distB="0" distL="0" distR="0" ns4:anchorId="6CA92A5D" ns4:editId="57984117">
+            <wp:extent cx="3429000" cy="2571750"/>
+            <wp:effectExtent l="0" t="0" r="0" b="0"/>
+            <wp:docPr id="678639386" name="Image 1"/>
+            <wp:cNvGraphicFramePr>
               <ns5:graphicFrameLocks noChangeAspect="1"/>
-            </ns3:cNvGraphicFramePr>
+            </wp:cNvGraphicFramePr>
             <ns5:graphic>
               <ns5:graphicData uri="http://schemas.openxmlformats.org/drawingml/2006/picture">
                 <ns9:pic>
@@ -15286,7 +15286,7 @@
                 </ns9:pic>
               </ns5:graphicData>
             </ns5:graphic>
-          </ns3:inline>
+          </wp:inline>
         </w:drawing>
       </w:r>
     </w:p>
@@ -15386,13 +15386,13 @@
           <w:lang w:eastAsia="fr-FR"/>
         </w:rPr>
         <w:drawing>
-          <ns3:inline distT="0" distB="0" distL="0" distR="0" ns4:anchorId="2B75818E" ns4:editId="15DFED95">
-            <ns3:extent cx="3848674" cy="2519132"/>
-            <ns3:effectExtent l="0" t="0" r="0" b="4445"/>
-            <ns3:docPr id="869815646" name="Image 1"/>
-            <ns3:cNvGraphicFramePr>
+          <wp:inline distT="0" distB="0" distL="0" distR="0" ns4:anchorId="2B75818E" ns4:editId="15DFED95">
+            <wp:extent cx="3848674" cy="2519132"/>
+            <wp:effectExtent l="0" t="0" r="0" b="4445"/>
+            <wp:docPr id="869815646" name="Image 1"/>
+            <wp:cNvGraphicFramePr>
               <ns5:graphicFrameLocks noChangeAspect="1"/>
-            </ns3:cNvGraphicFramePr>
+            </wp:cNvGraphicFramePr>
             <ns5:graphic>
               <ns5:graphicData uri="http://schemas.openxmlformats.org/drawingml/2006/picture">
                 <ns9:pic>
@@ -15431,7 +15431,7 @@
                 </ns9:pic>
               </ns5:graphicData>
             </ns5:graphic>
-          </ns3:inline>
+          </wp:inline>
         </w:drawing>
       </w:r>
     </w:p>
@@ -21594,17 +21594,18 @@
     <w:tbl>
       <w:tblPr>
         <w:tblStyle w:val="Tramemoyenne1"/>
-        <w:tblW w:w="0" w:type="auto"/>
+        <w:tblW w:w="8788" w:type="dxa"/>
         <w:tblLook w:val="04A0" w:firstRow="1" w:lastRow="0" w:firstColumn="1" w:lastColumn="0" w:noHBand="0" w:noVBand="1"/>
+        <w:tblLayout w:type="fixed"/>
       </w:tblPr>
       <w:tblGrid>
-        <w:gridCol w:w="2565"/>
-        <w:gridCol w:w="1630"/>
-        <w:gridCol w:w="971"/>
-        <w:gridCol w:w="971"/>
-        <w:gridCol w:w="1244"/>
-        <w:gridCol w:w="971"/>
-        <w:gridCol w:w="1126"/>
+        <w:gridCol w:w="2378"/>
+        <w:gridCol w:w="1511"/>
+        <w:gridCol w:w="900"/>
+        <w:gridCol w:w="900"/>
+        <w:gridCol w:w="1153"/>
+        <w:gridCol w:w="900"/>
+        <w:gridCol w:w="1046"/>
       </w:tblGrid>
       <w:tr ns2:paraId="7DD8CDC3" ns2:textId="77777777">
         <w:trPr>
@@ -21614,7 +21615,7 @@
         <w:tc>
           <w:tcPr>
             <w:cnfStyle w:val="001000000000" w:firstRow="0" w:lastRow="0" w:firstColumn="1" w:lastColumn="0" w:oddVBand="0" w:evenVBand="0" w:oddHBand="0" w:evenHBand="0" w:firstRowFirstColumn="0" w:firstRowLastColumn="0" w:lastRowFirstColumn="0" w:lastRowLastColumn="0"/>
-            <w:tcW w:w="2601" w:type="dxa"/>
+            <w:tcW w:w="2412" w:type="dxa"/>
             <w:hideMark/>
           </w:tcPr>
           <w:p ns2:paraId="475B53C4" ns2:textId="77777777">
@@ -21634,19 +21635,19 @@
               <ns1:AlternateContent>
                 <ns1:Choice Requires="wps">
                   <w:drawing>
-                    <ns3:anchor distT="0" distB="0" distL="114300" distR="114300" simplePos="0" relativeHeight="251668480" behindDoc="0" locked="0" layoutInCell="1" allowOverlap="1" ns4:anchorId="204D920E" ns4:editId="1530E20F">
-                      <ns3:simplePos x="0" y="0"/>
-                      <ns3:positionH relativeFrom="column">
-                        <ns3:posOffset>-49669</ns3:posOffset>
-                      </ns3:positionH>
-                      <ns3:positionV relativeFrom="paragraph">
-                        <ns3:posOffset>6601</ns3:posOffset>
-                      </ns3:positionV>
-                      <ns3:extent cx="1682804" cy="530198"/>
-                      <ns3:effectExtent l="0" t="0" r="31750" b="22860"/>
-                      <ns3:wrapNone/>
-                      <ns3:docPr id="81808272" name="Connecteur droit 81808272"/>
-                      <ns3:cNvGraphicFramePr/>
+                    <wp:anchor distT="0" distB="0" distL="114300" distR="114300" simplePos="0" relativeHeight="251668480" behindDoc="0" locked="0" layoutInCell="1" allowOverlap="1" ns4:anchorId="204D920E" ns4:editId="1530E20F">
+                      <wp:simplePos x="0" y="0"/>
+                      <wp:positionH relativeFrom="column">
+                        <wp:posOffset>0</wp:posOffset>
+                      </wp:positionH>
+                      <wp:positionV relativeFrom="paragraph">
+                        <wp:posOffset>6601</wp:posOffset>
+                      </wp:positionV>
+                      <wp:extent cx="1682804" cy="530198"/>
+                      <wp:effectExtent l="0" t="0" r="31750" b="22860"/>
+                      <wp:wrapNone/>
+                      <wp:docPr id="81808272" name="Connecteur droit 81808272"/>
+                      <wp:cNvGraphicFramePr/>
                       <ns5:graphic>
                         <ns5:graphicData uri="http://schemas.microsoft.com/office/word/2010/wordprocessingShape">
                           <ns7:wsp>
@@ -21684,7 +21685,7 @@
                       <ns4:sizeRelV relativeFrom="margin">
                         <ns4:pctHeight>0</ns4:pctHeight>
                       </ns4:sizeRelV>
-                    </ns3:anchor>
+                    </wp:anchor>
                   </w:drawing>
                 </ns1:Choice>
                 <ns1:Fallback>
@@ -21718,7 +21719,7 @@
         </w:tc>
         <w:tc>
           <w:tcPr>
-            <w:tcW w:w="1647" w:type="dxa"/>
+            <w:tcW w:w="1527" w:type="dxa"/>
             <w:hideMark/>
           </w:tcPr>
           <w:p ns2:paraId="1C2A0AF1" ns2:textId="77777777">
@@ -21739,7 +21740,7 @@
         </w:tc>
         <w:tc>
           <w:tcPr>
-            <w:tcW w:w="992" w:type="dxa"/>
+            <w:tcW w:w="920" w:type="dxa"/>
             <w:hideMark/>
           </w:tcPr>
           <w:p ns2:paraId="13F272CE" ns2:textId="77777777">
@@ -21760,7 +21761,7 @@
         </w:tc>
         <w:tc>
           <w:tcPr>
-            <w:tcW w:w="992" w:type="dxa"/>
+            <w:tcW w:w="920" w:type="dxa"/>
             <w:hideMark/>
           </w:tcPr>
           <w:p ns2:paraId="572B059A" ns2:textId="77777777">
@@ -21781,7 +21782,7 @@
         </w:tc>
         <w:tc>
           <w:tcPr>
-            <w:tcW w:w="1276" w:type="dxa"/>
+            <w:tcW w:w="1183" w:type="dxa"/>
             <w:hideMark/>
           </w:tcPr>
           <w:p ns2:paraId="2882CAB3" ns2:textId="77777777">
@@ -21802,7 +21803,7 @@
         </w:tc>
         <w:tc>
           <w:tcPr>
-            <w:tcW w:w="992" w:type="dxa"/>
+            <w:tcW w:w="920" w:type="dxa"/>
             <w:hideMark/>
           </w:tcPr>
           <w:p ns2:paraId="3CA70221" ns2:textId="77777777">
@@ -21823,7 +21824,7 @@
         </w:tc>
         <w:tc>
           <w:tcPr>
-            <w:tcW w:w="1129" w:type="dxa"/>
+            <w:tcW w:w="1047" w:type="dxa"/>
             <w:hideMark/>
           </w:tcPr>
           <w:p ns2:paraId="6E09824E" ns2:textId="77777777">
@@ -21851,7 +21852,7 @@
         <w:tc>
           <w:tcPr>
             <w:cnfStyle w:val="001000000000" w:firstRow="0" w:lastRow="0" w:firstColumn="1" w:lastColumn="0" w:oddVBand="0" w:evenVBand="0" w:oddHBand="0" w:evenHBand="0" w:firstRowFirstColumn="0" w:firstRowLastColumn="0" w:lastRowFirstColumn="0" w:lastRowLastColumn="0"/>
-            <w:tcW w:w="2601" w:type="dxa"/>
+            <w:tcW w:w="2412" w:type="dxa"/>
             <w:hideMark/>
           </w:tcPr>
           <w:p ns2:paraId="015AB38B" ns2:textId="77777777">
@@ -21871,7 +21872,7 @@
         </w:tc>
         <w:tc>
           <w:tcPr>
-            <w:tcW w:w="1647" w:type="dxa"/>
+            <w:tcW w:w="1527" w:type="dxa"/>
             <w:hideMark/>
           </w:tcPr>
           <w:p ns2:paraId="0FA69F29" ns2:textId="77777777">
@@ -21892,7 +21893,7 @@
         </w:tc>
         <w:tc>
           <w:tcPr>
-            <w:tcW w:w="992" w:type="dxa"/>
+            <w:tcW w:w="920" w:type="dxa"/>
             <w:hideMark/>
           </w:tcPr>
           <w:p ns2:paraId="06349C33" ns2:textId="77777777">
@@ -21913,7 +21914,7 @@
         </w:tc>
         <w:tc>
           <w:tcPr>
-            <w:tcW w:w="992" w:type="dxa"/>
+            <w:tcW w:w="920" w:type="dxa"/>
             <w:hideMark/>
           </w:tcPr>
           <w:p ns2:paraId="2B590744" ns2:textId="77777777">
@@ -21934,7 +21935,7 @@
         </w:tc>
         <w:tc>
           <w:tcPr>
-            <w:tcW w:w="1276" w:type="dxa"/>
+            <w:tcW w:w="1183" w:type="dxa"/>
             <w:hideMark/>
           </w:tcPr>
           <w:p ns2:paraId="1178766A" ns2:textId="77777777">
@@ -21955,7 +21956,7 @@
         </w:tc>
         <w:tc>
           <w:tcPr>
-            <w:tcW w:w="992" w:type="dxa"/>
+            <w:tcW w:w="920" w:type="dxa"/>
             <w:hideMark/>
           </w:tcPr>
           <w:p ns2:paraId="55636CE7" ns2:textId="77777777">
@@ -21976,7 +21977,7 @@
         </w:tc>
         <w:tc>
           <w:tcPr>
-            <w:tcW w:w="1129" w:type="dxa"/>
+            <w:tcW w:w="1047" w:type="dxa"/>
             <w:hideMark/>
           </w:tcPr>
           <w:p ns2:paraId="6255B870" ns2:textId="77777777">
@@ -22004,7 +22005,7 @@
         <w:tc>
           <w:tcPr>
             <w:cnfStyle w:val="001000000000" w:firstRow="0" w:lastRow="0" w:firstColumn="1" w:lastColumn="0" w:oddVBand="0" w:evenVBand="0" w:oddHBand="0" w:evenHBand="0" w:firstRowFirstColumn="0" w:firstRowLastColumn="0" w:lastRowFirstColumn="0" w:lastRowLastColumn="0"/>
-            <w:tcW w:w="2601" w:type="dxa"/>
+            <w:tcW w:w="2412" w:type="dxa"/>
             <w:hideMark/>
           </w:tcPr>
           <w:p ns2:paraId="24C2546D" ns2:textId="77777777">
@@ -22024,7 +22025,7 @@
         </w:tc>
         <w:tc>
           <w:tcPr>
-            <w:tcW w:w="1647" w:type="dxa"/>
+            <w:tcW w:w="1527" w:type="dxa"/>
             <w:hideMark/>
           </w:tcPr>
           <w:p ns2:paraId="4E2DAE1E" ns2:textId="77777777">
@@ -22045,7 +22046,7 @@
         </w:tc>
         <w:tc>
           <w:tcPr>
-            <w:tcW w:w="992" w:type="dxa"/>
+            <w:tcW w:w="920" w:type="dxa"/>
             <w:hideMark/>
           </w:tcPr>
           <w:p ns2:paraId="497D8A8B" ns2:textId="77777777">
@@ -22066,7 +22067,7 @@
         </w:tc>
         <w:tc>
           <w:tcPr>
-            <w:tcW w:w="992" w:type="dxa"/>
+            <w:tcW w:w="920" w:type="dxa"/>
             <w:hideMark/>
           </w:tcPr>
           <w:p ns2:paraId="7038C192" ns2:textId="77777777">
@@ -22087,7 +22088,7 @@
         </w:tc>
         <w:tc>
           <w:tcPr>
-            <w:tcW w:w="1276" w:type="dxa"/>
+            <w:tcW w:w="1183" w:type="dxa"/>
             <w:hideMark/>
           </w:tcPr>
           <w:p ns2:paraId="4C66FE64" ns2:textId="77777777">
@@ -22108,7 +22109,7 @@
         </w:tc>
         <w:tc>
           <w:tcPr>
-            <w:tcW w:w="992" w:type="dxa"/>
+            <w:tcW w:w="920" w:type="dxa"/>
             <w:hideMark/>
           </w:tcPr>
           <w:p ns2:paraId="263A2203" ns2:textId="77777777">
@@ -22129,7 +22130,7 @@
         </w:tc>
         <w:tc>
           <w:tcPr>
-            <w:tcW w:w="1129" w:type="dxa"/>
+            <w:tcW w:w="1047" w:type="dxa"/>
             <w:hideMark/>
           </w:tcPr>
           <w:p ns2:paraId="1F37A535" ns2:textId="77777777">
@@ -22157,7 +22158,7 @@
         <w:tc>
           <w:tcPr>
             <w:cnfStyle w:val="001000000000" w:firstRow="0" w:lastRow="0" w:firstColumn="1" w:lastColumn="0" w:oddVBand="0" w:evenVBand="0" w:oddHBand="0" w:evenHBand="0" w:firstRowFirstColumn="0" w:firstRowLastColumn="0" w:lastRowFirstColumn="0" w:lastRowLastColumn="0"/>
-            <w:tcW w:w="2601" w:type="dxa"/>
+            <w:tcW w:w="2412" w:type="dxa"/>
             <w:hideMark/>
           </w:tcPr>
           <w:p ns2:paraId="3802D042" ns2:textId="77777777">
@@ -22177,7 +22178,7 @@
         </w:tc>
         <w:tc>
           <w:tcPr>
-            <w:tcW w:w="1647" w:type="dxa"/>
+            <w:tcW w:w="1527" w:type="dxa"/>
             <w:hideMark/>
           </w:tcPr>
           <w:p ns2:paraId="5EFC3995" ns2:textId="77777777">
@@ -22198,7 +22199,7 @@
         </w:tc>
         <w:tc>
           <w:tcPr>
-            <w:tcW w:w="992" w:type="dxa"/>
+            <w:tcW w:w="920" w:type="dxa"/>
             <w:hideMark/>
           </w:tcPr>
           <w:p ns2:paraId="0D39FF85" ns2:textId="77777777">
@@ -22219,7 +22220,7 @@
         </w:tc>
         <w:tc>
           <w:tcPr>
-            <w:tcW w:w="992" w:type="dxa"/>
+            <w:tcW w:w="920" w:type="dxa"/>
             <w:hideMark/>
           </w:tcPr>
           <w:p ns2:paraId="050C447F" ns2:textId="77777777">
@@ -22240,7 +22241,7 @@
         </w:tc>
         <w:tc>
           <w:tcPr>
-            <w:tcW w:w="1276" w:type="dxa"/>
+            <w:tcW w:w="1183" w:type="dxa"/>
             <w:hideMark/>
           </w:tcPr>
           <w:p ns2:paraId="42AC71EF" ns2:textId="77777777">
@@ -22261,7 +22262,7 @@
         </w:tc>
         <w:tc>
           <w:tcPr>
-            <w:tcW w:w="992" w:type="dxa"/>
+            <w:tcW w:w="920" w:type="dxa"/>
             <w:hideMark/>
           </w:tcPr>
           <w:p ns2:paraId="6C9BC7B2" ns2:textId="77777777">
@@ -22282,7 +22283,7 @@
         </w:tc>
         <w:tc>
           <w:tcPr>
-            <w:tcW w:w="1129" w:type="dxa"/>
+            <w:tcW w:w="1047" w:type="dxa"/>
             <w:hideMark/>
           </w:tcPr>
           <w:p ns2:paraId="2F48EAC1" ns2:textId="77777777">
@@ -23944,19 +23945,19 @@
         <ns1:AlternateContent>
           <ns1:Choice Requires="wps">
             <w:drawing>
-              <ns3:anchor distT="0" distB="0" distL="114300" distR="114300" simplePos="0" relativeHeight="251670528" behindDoc="0" locked="0" layoutInCell="1" allowOverlap="1" ns4:anchorId="32DDB414" ns4:editId="2BFBAC07">
-                <ns3:simplePos x="0" y="0"/>
-                <ns3:positionH relativeFrom="column">
-                  <ns3:posOffset>694624</ns3:posOffset>
-                </ns3:positionH>
-                <ns3:positionV relativeFrom="paragraph">
-                  <ns3:posOffset>1940092</ns3:posOffset>
-                </ns3:positionV>
-                <ns3:extent cx="4200024" cy="1860884"/>
-                <ns3:effectExtent l="19050" t="0" r="29210" b="25400"/>
-                <ns3:wrapNone/>
-                <ns3:docPr id="5" name="Hexagone 5"/>
-                <ns3:cNvGraphicFramePr/>
+              <wp:anchor distT="0" distB="0" distL="114300" distR="114300" simplePos="0" relativeHeight="251670528" behindDoc="0" locked="0" layoutInCell="1" allowOverlap="1" ns4:anchorId="32DDB414" ns4:editId="2BFBAC07">
+                <wp:simplePos x="0" y="0"/>
+                <wp:positionH relativeFrom="column">
+                  <wp:posOffset>694624</wp:posOffset>
+                </wp:positionH>
+                <wp:positionV relativeFrom="paragraph">
+                  <wp:posOffset>1940092</wp:posOffset>
+                </wp:positionV>
+                <wp:extent cx="4200024" cy="1860884"/>
+                <wp:effectExtent l="19050" t="0" r="29210" b="25400"/>
+                <wp:wrapNone/>
+                <wp:docPr id="5" name="Hexagone 5"/>
+                <wp:cNvGraphicFramePr/>
                 <ns5:graphic>
                   <ns5:graphicData uri="http://schemas.microsoft.com/office/word/2010/wordprocessingShape">
                     <ns7:wsp>
@@ -24128,7 +24129,7 @@
                 <ns4:sizeRelV relativeFrom="margin">
                   <ns4:pctHeight>0</ns4:pctHeight>
                 </ns4:sizeRelV>
-              </ns3:anchor>
+              </wp:anchor>
             </w:drawing>
           </ns1:Choice>
           <ns1:Fallback>
@@ -28683,16 +28684,17 @@
     <w:tbl>
       <w:tblPr>
         <w:tblStyle w:val="Tramemoyenne1"/>
-        <w:tblW w:w="8808" w:type="dxa"/>
+        <w:tblW w:w="8788" w:type="dxa"/>
         <w:tblLook w:val="04A0" w:firstRow="1" w:lastRow="0" w:firstColumn="1" w:lastColumn="0" w:noHBand="0" w:noVBand="1"/>
+        <w:tblLayout w:type="fixed"/>
       </w:tblPr>
       <w:tblGrid>
-        <w:gridCol w:w="1508"/>
-        <w:gridCol w:w="355"/>
-        <w:gridCol w:w="1916"/>
-        <w:gridCol w:w="1685"/>
-        <w:gridCol w:w="1685"/>
-        <w:gridCol w:w="1659"/>
+        <w:gridCol w:w="1505"/>
+        <w:gridCol w:w="354"/>
+        <w:gridCol w:w="1912"/>
+        <w:gridCol w:w="1681"/>
+        <w:gridCol w:w="1681"/>
+        <w:gridCol w:w="1655"/>
       </w:tblGrid>
       <w:tr ns2:paraId="46DE96B3" ns2:textId="77777777">
         <w:trPr>
@@ -28704,7 +28706,7 @@
         <w:tc>
           <w:tcPr>
             <w:cnfStyle w:val="001000000000" w:firstRow="0" w:lastRow="0" w:firstColumn="1" w:lastColumn="0" w:oddVBand="0" w:evenVBand="0" w:oddHBand="0" w:evenHBand="0" w:firstRowFirstColumn="0" w:firstRowLastColumn="0" w:lastRowFirstColumn="0" w:lastRowLastColumn="0"/>
-            <w:tcW w:w="1863" w:type="dxa"/>
+            <w:tcW w:w="1859" w:type="dxa"/>
             <w:gridSpan w:val="2"/>
           </w:tcPr>
           <w:p ns2:paraId="65B97BE9" ns2:textId="77777777">
@@ -28736,7 +28738,7 @@
         </w:tc>
         <w:tc>
           <w:tcPr>
-            <w:tcW w:w="1916" w:type="dxa"/>
+            <w:tcW w:w="1912" w:type="dxa"/>
           </w:tcPr>
           <w:p ns2:paraId="2763BDD0" ns2:textId="77777777">
             <w:pPr>
@@ -28769,7 +28771,7 @@
         </w:tc>
         <w:tc>
           <w:tcPr>
-            <w:tcW w:w="1685" w:type="dxa"/>
+            <w:tcW w:w="1681" w:type="dxa"/>
           </w:tcPr>
           <w:p ns2:paraId="1465E5F7" ns2:textId="77777777">
             <w:pPr>
@@ -28802,7 +28804,7 @@
         </w:tc>
         <w:tc>
           <w:tcPr>
-            <w:tcW w:w="1685" w:type="dxa"/>
+            <w:tcW w:w="1681" w:type="dxa"/>
           </w:tcPr>
           <w:p ns2:paraId="7857144A" ns2:textId="77777777">
             <w:pPr>
@@ -28835,7 +28837,7 @@
         </w:tc>
         <w:tc>
           <w:tcPr>
-            <w:tcW w:w="1659" w:type="dxa"/>
+            <w:tcW w:w="1655" w:type="dxa"/>
           </w:tcPr>
           <w:p ns2:paraId="3974001F" ns2:textId="77777777">
             <w:pPr>
@@ -28876,7 +28878,7 @@
         <w:tc>
           <w:tcPr>
             <w:cnfStyle w:val="001000000000" w:firstRow="0" w:lastRow="0" w:firstColumn="1" w:lastColumn="0" w:oddVBand="0" w:evenVBand="0" w:oddHBand="0" w:evenHBand="0" w:firstRowFirstColumn="0" w:firstRowLastColumn="0" w:lastRowFirstColumn="0" w:lastRowLastColumn="0"/>
-            <w:tcW w:w="1863" w:type="dxa"/>
+            <w:tcW w:w="1859" w:type="dxa"/>
             <w:gridSpan w:val="2"/>
           </w:tcPr>
           <w:p ns2:paraId="64482073" ns2:textId="77777777">
@@ -28908,7 +28910,7 @@
         </w:tc>
         <w:tc>
           <w:tcPr>
-            <w:tcW w:w="1916" w:type="dxa"/>
+            <w:tcW w:w="1912" w:type="dxa"/>
           </w:tcPr>
           <w:p ns2:paraId="4B8A9C60" ns2:textId="227E5828">
             <w:pPr>
@@ -28930,7 +28932,7 @@
         </w:tc>
         <w:tc>
           <w:tcPr>
-            <w:tcW w:w="1685" w:type="dxa"/>
+            <w:tcW w:w="1681" w:type="dxa"/>
           </w:tcPr>
           <w:p ns2:paraId="1F9DF5C1" ns2:textId="77777777">
             <w:pPr>
@@ -28962,7 +28964,7 @@
         </w:tc>
         <w:tc>
           <w:tcPr>
-            <w:tcW w:w="1685" w:type="dxa"/>
+            <w:tcW w:w="1681" w:type="dxa"/>
           </w:tcPr>
           <w:p ns2:paraId="65045888" ns2:textId="77777777">
             <w:pPr>
@@ -28980,7 +28982,7 @@
         </w:tc>
         <w:tc>
           <w:tcPr>
-            <w:tcW w:w="1659" w:type="dxa"/>
+            <w:tcW w:w="1655" w:type="dxa"/>
           </w:tcPr>
           <w:p ns2:paraId="72C54274" ns2:textId="3B3842DB">
             <w:pPr>
@@ -29010,7 +29012,7 @@
         <w:tc>
           <w:tcPr>
             <w:cnfStyle w:val="001000000000" w:firstRow="0" w:lastRow="0" w:firstColumn="1" w:lastColumn="0" w:oddVBand="0" w:evenVBand="0" w:oddHBand="0" w:evenHBand="0" w:firstRowFirstColumn="0" w:firstRowLastColumn="0" w:lastRowFirstColumn="0" w:lastRowLastColumn="0"/>
-            <w:tcW w:w="1508" w:type="dxa"/>
+            <w:tcW w:w="1505" w:type="dxa"/>
             <w:vMerge w:val="restart"/>
           </w:tcPr>
           <w:p ns2:paraId="72564437" ns2:textId="77777777">
@@ -29042,7 +29044,7 @@
         </w:tc>
         <w:tc>
           <w:tcPr>
-            <w:tcW w:w="355" w:type="dxa"/>
+            <w:tcW w:w="354" w:type="dxa"/>
           </w:tcPr>
           <w:p ns2:paraId="4A22AFEE" ns2:textId="77777777">
             <w:pPr>
@@ -29062,7 +29064,7 @@
         </w:tc>
         <w:tc>
           <w:tcPr>
-            <w:tcW w:w="1916" w:type="dxa"/>
+            <w:tcW w:w="1912" w:type="dxa"/>
           </w:tcPr>
           <w:p ns2:paraId="2FC4089E" ns2:textId="77777777">
             <w:pPr>
@@ -29088,7 +29090,7 @@
         </w:tc>
         <w:tc>
           <w:tcPr>
-            <w:tcW w:w="1685" w:type="dxa"/>
+            <w:tcW w:w="1681" w:type="dxa"/>
           </w:tcPr>
           <w:p ns2:paraId="0E8B4FFF" ns2:textId="77777777">
             <w:pPr>
@@ -29109,7 +29111,7 @@
         </w:tc>
         <w:tc>
           <w:tcPr>
-            <w:tcW w:w="1685" w:type="dxa"/>
+            <w:tcW w:w="1681" w:type="dxa"/>
           </w:tcPr>
           <w:p ns2:paraId="11889EC4" ns2:textId="0D474DC2">
             <w:pPr>
@@ -29144,7 +29146,7 @@
         </w:tc>
         <w:tc>
           <w:tcPr>
-            <w:tcW w:w="1659" w:type="dxa"/>
+            <w:tcW w:w="1655" w:type="dxa"/>
           </w:tcPr>
           <w:p ns2:paraId="413F705D" ns2:textId="77777777">
             <w:pPr>
@@ -29180,7 +29182,7 @@
         <w:tc>
           <w:tcPr>
             <w:cnfStyle w:val="001000000000" w:firstRow="0" w:lastRow="0" w:firstColumn="1" w:lastColumn="0" w:oddVBand="0" w:evenVBand="0" w:oddHBand="0" w:evenHBand="0" w:firstRowFirstColumn="0" w:firstRowLastColumn="0" w:lastRowFirstColumn="0" w:lastRowLastColumn="0"/>
-            <w:tcW w:w="1508" w:type="dxa"/>
+            <w:tcW w:w="1505" w:type="dxa"/>
             <w:vMerge/>
           </w:tcPr>
           <w:p ns2:paraId="0C0CD9A2" ns2:textId="77777777">
@@ -29198,7 +29200,7 @@
         </w:tc>
         <w:tc>
           <w:tcPr>
-            <w:tcW w:w="355" w:type="dxa"/>
+            <w:tcW w:w="354" w:type="dxa"/>
           </w:tcPr>
           <w:p ns2:paraId="6405C07D" ns2:textId="77777777">
             <w:pPr>
@@ -29218,7 +29220,7 @@
         </w:tc>
         <w:tc>
           <w:tcPr>
-            <w:tcW w:w="1916" w:type="dxa"/>
+            <w:tcW w:w="1912" w:type="dxa"/>
           </w:tcPr>
           <w:p ns2:paraId="4BB674CB" ns2:textId="77777777">
             <w:pPr>
@@ -29237,7 +29239,7 @@
         </w:tc>
         <w:tc>
           <w:tcPr>
-            <w:tcW w:w="1685" w:type="dxa"/>
+            <w:tcW w:w="1681" w:type="dxa"/>
           </w:tcPr>
           <w:p ns2:paraId="31AB737A" ns2:textId="6AB7A693">
             <w:pPr>
@@ -29266,7 +29268,7 @@
         </w:tc>
         <w:tc>
           <w:tcPr>
-            <w:tcW w:w="1685" w:type="dxa"/>
+            <w:tcW w:w="1681" w:type="dxa"/>
           </w:tcPr>
           <w:p ns2:paraId="1979E018" ns2:textId="77777777">
             <w:pPr>
@@ -29282,7 +29284,7 @@
         </w:tc>
         <w:tc>
           <w:tcPr>
-            <w:tcW w:w="1659" w:type="dxa"/>
+            <w:tcW w:w="1655" w:type="dxa"/>
           </w:tcPr>
           <w:p ns2:paraId="7396CB36" ns2:textId="77777777">
             <w:pPr>
@@ -29311,7 +29313,7 @@
         <w:tc>
           <w:tcPr>
             <w:cnfStyle w:val="001000000000" w:firstRow="0" w:lastRow="0" w:firstColumn="1" w:lastColumn="0" w:oddVBand="0" w:evenVBand="0" w:oddHBand="0" w:evenHBand="0" w:firstRowFirstColumn="0" w:firstRowLastColumn="0" w:lastRowFirstColumn="0" w:lastRowLastColumn="0"/>
-            <w:tcW w:w="1508" w:type="dxa"/>
+            <w:tcW w:w="1505" w:type="dxa"/>
             <w:vMerge/>
           </w:tcPr>
           <w:p ns2:paraId="1D6FE8DE" ns2:textId="77777777">
@@ -29329,7 +29331,7 @@
         </w:tc>
         <w:tc>
           <w:tcPr>
-            <w:tcW w:w="355" w:type="dxa"/>
+            <w:tcW w:w="354" w:type="dxa"/>
           </w:tcPr>
           <w:p ns2:paraId="69455C98" ns2:textId="77777777">
             <w:pPr>
@@ -29349,7 +29351,7 @@
         </w:tc>
         <w:tc>
           <w:tcPr>
-            <w:tcW w:w="1916" w:type="dxa"/>
+            <w:tcW w:w="1912" w:type="dxa"/>
           </w:tcPr>
           <w:p ns2:paraId="24FE2C28" ns2:textId="77777777">
             <w:pPr>
@@ -29374,7 +29376,7 @@
         </w:tc>
         <w:tc>
           <w:tcPr>
-            <w:tcW w:w="1685" w:type="dxa"/>
+            <w:tcW w:w="1681" w:type="dxa"/>
           </w:tcPr>
           <w:p ns2:paraId="45F0B473" ns2:textId="7869A685">
             <w:pPr>
@@ -29393,7 +29395,7 @@
         </w:tc>
         <w:tc>
           <w:tcPr>
-            <w:tcW w:w="1685" w:type="dxa"/>
+            <w:tcW w:w="1681" w:type="dxa"/>
           </w:tcPr>
           <w:p ns2:paraId="3E478947" ns2:textId="77777777">
             <w:pPr>
@@ -29424,7 +29426,7 @@
         </w:tc>
         <w:tc>
           <w:tcPr>
-            <w:tcW w:w="1659" w:type="dxa"/>
+            <w:tcW w:w="1655" w:type="dxa"/>
           </w:tcPr>
           <w:p ns2:paraId="596A390A" ns2:textId="77777777">
             <w:pPr>
@@ -29740,14 +29742,15 @@
     <w:tbl>
       <w:tblPr>
         <w:tblStyle w:val="Tramemoyenne1"/>
-        <w:tblW w:w="10223" w:type="dxa"/>
+        <w:tblW w:w="8788" w:type="dxa"/>
         <w:tblLook w:val="04A0" w:firstRow="1" w:lastRow="0" w:firstColumn="1" w:lastColumn="0" w:noHBand="0" w:noVBand="1"/>
+        <w:tblLayout w:type="fixed"/>
       </w:tblPr>
       <w:tblGrid>
-        <w:gridCol w:w="2977"/>
-        <w:gridCol w:w="2126"/>
-        <w:gridCol w:w="2835"/>
-        <w:gridCol w:w="2285"/>
+        <w:gridCol w:w="2559"/>
+        <w:gridCol w:w="1828"/>
+        <w:gridCol w:w="2437"/>
+        <w:gridCol w:w="1964"/>
       </w:tblGrid>
       <w:tr ns2:paraId="43EB2EA9" ns2:textId="77777777">
         <w:trPr>
@@ -29759,7 +29762,7 @@
         <w:tc>
           <w:tcPr>
             <w:cnfStyle w:val="001000000000" w:firstRow="0" w:lastRow="0" w:firstColumn="1" w:lastColumn="0" w:oddVBand="0" w:evenVBand="0" w:oddHBand="0" w:evenHBand="0" w:firstRowFirstColumn="0" w:firstRowLastColumn="0" w:lastRowFirstColumn="0" w:lastRowLastColumn="0"/>
-            <w:tcW w:w="2977" w:type="dxa"/>
+            <w:tcW w:w="2559" w:type="dxa"/>
           </w:tcPr>
           <w:p ns2:paraId="462F6780" ns2:textId="77777777">
             <w:pPr>
@@ -29781,7 +29784,7 @@
         </w:tc>
         <w:tc>
           <w:tcPr>
-            <w:tcW w:w="2126" w:type="dxa"/>
+            <w:tcW w:w="1828" w:type="dxa"/>
           </w:tcPr>
           <w:p ns2:paraId="23A27D15" ns2:textId="77777777">
             <w:pPr>
@@ -29804,7 +29807,7 @@
         </w:tc>
         <w:tc>
           <w:tcPr>
-            <w:tcW w:w="2835" w:type="dxa"/>
+            <w:tcW w:w="2437" w:type="dxa"/>
           </w:tcPr>
           <w:p ns2:paraId="2BA55177" ns2:textId="77777777">
             <w:pPr>
@@ -29827,7 +29830,7 @@
         </w:tc>
         <w:tc>
           <w:tcPr>
-            <w:tcW w:w="2285" w:type="dxa"/>
+            <w:tcW w:w="1964" w:type="dxa"/>
           </w:tcPr>
           <w:p ns2:paraId="00331CF9" ns2:textId="77777777">
             <w:pPr>
@@ -29858,7 +29861,7 @@
         <w:tc>
           <w:tcPr>
             <w:cnfStyle w:val="001000000000" w:firstRow="0" w:lastRow="0" w:firstColumn="1" w:lastColumn="0" w:oddVBand="0" w:evenVBand="0" w:oddHBand="0" w:evenHBand="0" w:firstRowFirstColumn="0" w:firstRowLastColumn="0" w:lastRowFirstColumn="0" w:lastRowLastColumn="0"/>
-            <w:tcW w:w="2977" w:type="dxa"/>
+            <w:tcW w:w="2559" w:type="dxa"/>
           </w:tcPr>
           <w:p ns2:paraId="3069D7B3" ns2:textId="77777777">
             <w:pPr>
@@ -29876,7 +29879,7 @@
         </w:tc>
         <w:tc>
           <w:tcPr>
-            <w:tcW w:w="2126" w:type="dxa"/>
+            <w:tcW w:w="1828" w:type="dxa"/>
           </w:tcPr>
           <w:p ns2:paraId="6784A8C5" ns2:textId="77777777">
             <w:pPr>
@@ -29895,7 +29898,7 @@
         </w:tc>
         <w:tc>
           <w:tcPr>
-            <w:tcW w:w="2835" w:type="dxa"/>
+            <w:tcW w:w="2437" w:type="dxa"/>
           </w:tcPr>
           <w:p ns2:paraId="674B76FD" ns2:textId="77777777">
             <w:pPr>
@@ -29914,7 +29917,7 @@
         </w:tc>
         <w:tc>
           <w:tcPr>
-            <w:tcW w:w="2285" w:type="dxa"/>
+            <w:tcW w:w="1964" w:type="dxa"/>
           </w:tcPr>
           <w:p ns2:paraId="5520B78D" ns2:textId="77777777">
             <w:pPr>
@@ -29942,7 +29945,7 @@
         <w:tc>
           <w:tcPr>
             <w:cnfStyle w:val="001000000000" w:firstRow="0" w:lastRow="0" w:firstColumn="1" w:lastColumn="0" w:oddVBand="0" w:evenVBand="0" w:oddHBand="0" w:evenHBand="0" w:firstRowFirstColumn="0" w:firstRowLastColumn="0" w:lastRowFirstColumn="0" w:lastRowLastColumn="0"/>
-            <w:tcW w:w="2977" w:type="dxa"/>
+            <w:tcW w:w="2559" w:type="dxa"/>
           </w:tcPr>
           <w:p ns2:paraId="0C28AACF" ns2:textId="77777777">
             <w:pPr>
@@ -29960,7 +29963,7 @@
         </w:tc>
         <w:tc>
           <w:tcPr>
-            <w:tcW w:w="2126" w:type="dxa"/>
+            <w:tcW w:w="1828" w:type="dxa"/>
           </w:tcPr>
           <w:p ns2:paraId="0F2D8F5C" ns2:textId="77777777">
             <w:pPr>
@@ -29979,7 +29982,7 @@
         </w:tc>
         <w:tc>
           <w:tcPr>
-            <w:tcW w:w="2835" w:type="dxa"/>
+            <w:tcW w:w="2437" w:type="dxa"/>
           </w:tcPr>
           <w:p ns2:paraId="61E16CD3" ns2:textId="77777777">
             <w:pPr>
@@ -29998,7 +30001,7 @@
         </w:tc>
         <w:tc>
           <w:tcPr>
-            <w:tcW w:w="2285" w:type="dxa"/>
+            <w:tcW w:w="1964" w:type="dxa"/>
           </w:tcPr>
           <w:p ns2:paraId="2018C188" ns2:textId="77777777">
             <w:pPr>
@@ -30026,7 +30029,7 @@
         <w:tc>
           <w:tcPr>
             <w:cnfStyle w:val="001000000000" w:firstRow="0" w:lastRow="0" w:firstColumn="1" w:lastColumn="0" w:oddVBand="0" w:evenVBand="0" w:oddHBand="0" w:evenHBand="0" w:firstRowFirstColumn="0" w:firstRowLastColumn="0" w:lastRowFirstColumn="0" w:lastRowLastColumn="0"/>
-            <w:tcW w:w="2977" w:type="dxa"/>
+            <w:tcW w:w="2559" w:type="dxa"/>
           </w:tcPr>
           <w:p ns2:paraId="5A5942C7" ns2:textId="77777777">
             <w:pPr>
@@ -30044,7 +30047,7 @@
         </w:tc>
         <w:tc>
           <w:tcPr>
-            <w:tcW w:w="2126" w:type="dxa"/>
+            <w:tcW w:w="1828" w:type="dxa"/>
           </w:tcPr>
           <w:p ns2:paraId="2D63B56B" ns2:textId="77777777">
             <w:pPr>
@@ -30063,7 +30066,7 @@
         </w:tc>
         <w:tc>
           <w:tcPr>
-            <w:tcW w:w="2835" w:type="dxa"/>
+            <w:tcW w:w="2437" w:type="dxa"/>
           </w:tcPr>
           <w:p ns2:paraId="65339DA4" ns2:textId="77777777">
             <w:pPr>
@@ -30082,7 +30085,7 @@
         </w:tc>
         <w:tc>
           <w:tcPr>
-            <w:tcW w:w="2285" w:type="dxa"/>
+            <w:tcW w:w="1964" w:type="dxa"/>
           </w:tcPr>
           <w:p ns2:paraId="08337945" ns2:textId="77777777">
             <w:pPr>
@@ -30110,7 +30113,7 @@
         <w:tc>
           <w:tcPr>
             <w:cnfStyle w:val="001000000000" w:firstRow="0" w:lastRow="0" w:firstColumn="1" w:lastColumn="0" w:oddVBand="0" w:evenVBand="0" w:oddHBand="0" w:evenHBand="0" w:firstRowFirstColumn="0" w:firstRowLastColumn="0" w:lastRowFirstColumn="0" w:lastRowLastColumn="0"/>
-            <w:tcW w:w="2977" w:type="dxa"/>
+            <w:tcW w:w="2559" w:type="dxa"/>
           </w:tcPr>
           <w:p ns2:paraId="13F23DBC" ns2:textId="77777777">
             <w:pPr>
@@ -30128,7 +30131,7 @@
         </w:tc>
         <w:tc>
           <w:tcPr>
-            <w:tcW w:w="2126" w:type="dxa"/>
+            <w:tcW w:w="1828" w:type="dxa"/>
           </w:tcPr>
           <w:p ns2:paraId="4F370B65" ns2:textId="77777777">
             <w:pPr>
@@ -30147,7 +30150,7 @@
         </w:tc>
         <w:tc>
           <w:tcPr>
-            <w:tcW w:w="2835" w:type="dxa"/>
+            <w:tcW w:w="2437" w:type="dxa"/>
           </w:tcPr>
           <w:p ns2:paraId="0DBD0114" ns2:textId="77777777">
             <w:pPr>
@@ -30166,7 +30169,7 @@
         </w:tc>
         <w:tc>
           <w:tcPr>
-            <w:tcW w:w="2285" w:type="dxa"/>
+            <w:tcW w:w="1964" w:type="dxa"/>
           </w:tcPr>
           <w:p ns2:paraId="26DF1883" ns2:textId="77777777">
             <w:pPr>
@@ -30194,7 +30197,7 @@
         <w:tc>
           <w:tcPr>
             <w:cnfStyle w:val="001000000000" w:firstRow="0" w:lastRow="0" w:firstColumn="1" w:lastColumn="0" w:oddVBand="0" w:evenVBand="0" w:oddHBand="0" w:evenHBand="0" w:firstRowFirstColumn="0" w:firstRowLastColumn="0" w:lastRowFirstColumn="0" w:lastRowLastColumn="0"/>
-            <w:tcW w:w="2977" w:type="dxa"/>
+            <w:tcW w:w="2559" w:type="dxa"/>
           </w:tcPr>
           <w:p ns2:paraId="64879442" ns2:textId="77777777">
             <w:pPr>
@@ -30212,7 +30215,7 @@
         </w:tc>
         <w:tc>
           <w:tcPr>
-            <w:tcW w:w="2126" w:type="dxa"/>
+            <w:tcW w:w="1828" w:type="dxa"/>
           </w:tcPr>
           <w:p ns2:paraId="404FA209" ns2:textId="77777777">
             <w:pPr>
@@ -30231,7 +30234,7 @@
         </w:tc>
         <w:tc>
           <w:tcPr>
-            <w:tcW w:w="2835" w:type="dxa"/>
+            <w:tcW w:w="2437" w:type="dxa"/>
           </w:tcPr>
           <w:p ns2:paraId="4A0808FD" ns2:textId="77777777">
             <w:pPr>
@@ -30250,7 +30253,7 @@
         </w:tc>
         <w:tc>
           <w:tcPr>
-            <w:tcW w:w="2285" w:type="dxa"/>
+            <w:tcW w:w="1964" w:type="dxa"/>
           </w:tcPr>
           <w:p ns2:paraId="314DA3F5" ns2:textId="77777777">
             <w:pPr>
@@ -30278,7 +30281,7 @@
         <w:tc>
           <w:tcPr>
             <w:cnfStyle w:val="001000000000" w:firstRow="0" w:lastRow="0" w:firstColumn="1" w:lastColumn="0" w:oddVBand="0" w:evenVBand="0" w:oddHBand="0" w:evenHBand="0" w:firstRowFirstColumn="0" w:firstRowLastColumn="0" w:lastRowFirstColumn="0" w:lastRowLastColumn="0"/>
-            <w:tcW w:w="2977" w:type="dxa"/>
+            <w:tcW w:w="2559" w:type="dxa"/>
           </w:tcPr>
           <w:p ns2:paraId="7B4221FE" ns2:textId="77777777">
             <w:pPr>
@@ -30296,7 +30299,7 @@
         </w:tc>
         <w:tc>
           <w:tcPr>
-            <w:tcW w:w="2126" w:type="dxa"/>
+            <w:tcW w:w="1828" w:type="dxa"/>
           </w:tcPr>
           <w:p ns2:paraId="331F0143" ns2:textId="77777777">
             <w:pPr>
@@ -30315,7 +30318,7 @@
         </w:tc>
         <w:tc>
           <w:tcPr>
-            <w:tcW w:w="2835" w:type="dxa"/>
+            <w:tcW w:w="2437" w:type="dxa"/>
           </w:tcPr>
           <w:p ns2:paraId="47804812" ns2:textId="77777777">
             <w:pPr>
@@ -30334,7 +30337,7 @@
         </w:tc>
         <w:tc>
           <w:tcPr>
-            <w:tcW w:w="2285" w:type="dxa"/>
+            <w:tcW w:w="1964" w:type="dxa"/>
           </w:tcPr>
           <w:p ns2:paraId="1F59C77D" ns2:textId="77777777">
             <w:pPr>
@@ -30362,7 +30365,7 @@
         <w:tc>
           <w:tcPr>
             <w:cnfStyle w:val="001000000000" w:firstRow="0" w:lastRow="0" w:firstColumn="1" w:lastColumn="0" w:oddVBand="0" w:evenVBand="0" w:oddHBand="0" w:evenHBand="0" w:firstRowFirstColumn="0" w:firstRowLastColumn="0" w:lastRowFirstColumn="0" w:lastRowLastColumn="0"/>
-            <w:tcW w:w="2977" w:type="dxa"/>
+            <w:tcW w:w="2559" w:type="dxa"/>
           </w:tcPr>
           <w:p ns2:paraId="7EF14426" ns2:textId="77777777">
             <w:pPr>
@@ -30380,7 +30383,7 @@
         </w:tc>
         <w:tc>
           <w:tcPr>
-            <w:tcW w:w="2126" w:type="dxa"/>
+            <w:tcW w:w="1828" w:type="dxa"/>
           </w:tcPr>
           <w:p ns2:paraId="08D06D34" ns2:textId="77777777">
             <w:pPr>
@@ -30399,7 +30402,7 @@
         </w:tc>
         <w:tc>
           <w:tcPr>
-            <w:tcW w:w="2835" w:type="dxa"/>
+            <w:tcW w:w="2437" w:type="dxa"/>
           </w:tcPr>
           <w:p ns2:paraId="3EFA200F" ns2:textId="77777777">
             <w:pPr>
@@ -30418,7 +30421,7 @@
         </w:tc>
         <w:tc>
           <w:tcPr>
-            <w:tcW w:w="2285" w:type="dxa"/>
+            <w:tcW w:w="1964" w:type="dxa"/>
           </w:tcPr>
           <w:p ns2:paraId="1CACB3D2" ns2:textId="77777777">
             <w:pPr>
@@ -30446,7 +30449,7 @@
         <w:tc>
           <w:tcPr>
             <w:cnfStyle w:val="001000000000" w:firstRow="0" w:lastRow="0" w:firstColumn="1" w:lastColumn="0" w:oddVBand="0" w:evenVBand="0" w:oddHBand="0" w:evenHBand="0" w:firstRowFirstColumn="0" w:firstRowLastColumn="0" w:lastRowFirstColumn="0" w:lastRowLastColumn="0"/>
-            <w:tcW w:w="2977" w:type="dxa"/>
+            <w:tcW w:w="2559" w:type="dxa"/>
           </w:tcPr>
           <w:p ns2:paraId="1C5F77F6" ns2:textId="77777777">
             <w:pPr>
@@ -30465,7 +30468,7 @@
         </w:tc>
         <w:tc>
           <w:tcPr>
-            <w:tcW w:w="2126" w:type="dxa"/>
+            <w:tcW w:w="1828" w:type="dxa"/>
           </w:tcPr>
           <w:p ns2:paraId="1589CB3F" ns2:textId="77777777">
             <w:pPr>
@@ -30484,7 +30487,7 @@
         </w:tc>
         <w:tc>
           <w:tcPr>
-            <w:tcW w:w="2835" w:type="dxa"/>
+            <w:tcW w:w="2437" w:type="dxa"/>
           </w:tcPr>
           <w:p ns2:paraId="6246F02C" ns2:textId="237B3278">
             <w:pPr>
@@ -30507,7 +30510,7 @@
         </w:tc>
         <w:tc>
           <w:tcPr>
-            <w:tcW w:w="2285" w:type="dxa"/>
+            <w:tcW w:w="1964" w:type="dxa"/>
           </w:tcPr>
           <w:p ns2:paraId="5678C257" ns2:textId="77777777">
             <w:pPr>
@@ -30535,7 +30538,7 @@
         <w:tc>
           <w:tcPr>
             <w:cnfStyle w:val="001000000000" w:firstRow="0" w:lastRow="0" w:firstColumn="1" w:lastColumn="0" w:oddVBand="0" w:evenVBand="0" w:oddHBand="0" w:evenHBand="0" w:firstRowFirstColumn="0" w:firstRowLastColumn="0" w:lastRowFirstColumn="0" w:lastRowLastColumn="0"/>
-            <w:tcW w:w="2977" w:type="dxa"/>
+            <w:tcW w:w="2559" w:type="dxa"/>
           </w:tcPr>
           <w:p ns2:paraId="18D0E718" ns2:textId="77777777">
             <w:pPr>
@@ -30553,7 +30556,7 @@
         </w:tc>
         <w:tc>
           <w:tcPr>
-            <w:tcW w:w="2126" w:type="dxa"/>
+            <w:tcW w:w="1828" w:type="dxa"/>
           </w:tcPr>
           <w:p ns2:paraId="213E34CD" ns2:textId="77777777">
             <w:pPr>
@@ -30572,7 +30575,7 @@
         </w:tc>
         <w:tc>
           <w:tcPr>
-            <w:tcW w:w="2835" w:type="dxa"/>
+            <w:tcW w:w="2437" w:type="dxa"/>
           </w:tcPr>
           <w:p ns2:paraId="6A7C4EF9" ns2:textId="77777777">
             <w:pPr>
@@ -30591,7 +30594,7 @@
         </w:tc>
         <w:tc>
           <w:tcPr>
-            <w:tcW w:w="2285" w:type="dxa"/>
+            <w:tcW w:w="1964" w:type="dxa"/>
           </w:tcPr>
           <w:p ns2:paraId="3DEE90A2" ns2:textId="77777777">
             <w:pPr>
@@ -30619,7 +30622,7 @@
         <w:tc>
           <w:tcPr>
             <w:cnfStyle w:val="001000000000" w:firstRow="0" w:lastRow="0" w:firstColumn="1" w:lastColumn="0" w:oddVBand="0" w:evenVBand="0" w:oddHBand="0" w:evenHBand="0" w:firstRowFirstColumn="0" w:firstRowLastColumn="0" w:lastRowFirstColumn="0" w:lastRowLastColumn="0"/>
-            <w:tcW w:w="2977" w:type="dxa"/>
+            <w:tcW w:w="2559" w:type="dxa"/>
           </w:tcPr>
           <w:p ns2:paraId="277990B6" ns2:textId="77777777">
             <w:pPr>
@@ -30643,7 +30646,7 @@
         </w:tc>
         <w:tc>
           <w:tcPr>
-            <w:tcW w:w="2126" w:type="dxa"/>
+            <w:tcW w:w="1828" w:type="dxa"/>
           </w:tcPr>
           <w:p ns2:paraId="7DB16949" ns2:textId="77777777">
             <w:pPr>
@@ -30668,7 +30671,7 @@
         </w:tc>
         <w:tc>
           <w:tcPr>
-            <w:tcW w:w="2835" w:type="dxa"/>
+            <w:tcW w:w="2437" w:type="dxa"/>
           </w:tcPr>
           <w:p ns2:paraId="1A210730" ns2:textId="25DDFF25">
             <w:pPr>
@@ -30700,7 +30703,7 @@
         </w:tc>
         <w:tc>
           <w:tcPr>
-            <w:tcW w:w="2285" w:type="dxa"/>
+            <w:tcW w:w="1964" w:type="dxa"/>
           </w:tcPr>
           <w:p ns2:paraId="001D850C" ns2:textId="77777777">
             <w:pPr>
@@ -32993,19 +32996,19 @@
         <ns1:AlternateContent>
           <ns1:Choice Requires="wps">
             <w:drawing>
-              <ns3:anchor distT="0" distB="0" distL="114300" distR="114300" simplePos="0" relativeHeight="251672576" behindDoc="0" locked="0" layoutInCell="1" allowOverlap="1" ns4:anchorId="32B4755B" ns4:editId="01F0F7E8">
-                <ns3:simplePos x="0" y="0"/>
-                <ns3:positionH relativeFrom="column">
-                  <ns3:posOffset>109086</ns3:posOffset>
-                </ns3:positionH>
-                <ns3:positionV relativeFrom="paragraph">
-                  <ns3:posOffset>1226218</ns3:posOffset>
-                </ns3:positionV>
-                <ns3:extent cx="5683919" cy="2935706"/>
-                <ns3:effectExtent l="19050" t="0" r="31115" b="17145"/>
-                <ns3:wrapNone/>
-                <ns3:docPr id="10" name="Hexagone 10"/>
-                <ns3:cNvGraphicFramePr/>
+              <wp:anchor distT="0" distB="0" distL="114300" distR="114300" simplePos="0" relativeHeight="251672576" behindDoc="0" locked="0" layoutInCell="1" allowOverlap="1" ns4:anchorId="32B4755B" ns4:editId="01F0F7E8">
+                <wp:simplePos x="0" y="0"/>
+                <wp:positionH relativeFrom="column">
+                  <wp:posOffset>109086</wp:posOffset>
+                </wp:positionH>
+                <wp:positionV relativeFrom="paragraph">
+                  <wp:posOffset>1226218</wp:posOffset>
+                </wp:positionV>
+                <wp:extent cx="5450000" cy="2935706"/>
+                <wp:effectExtent l="19050" t="0" r="31115" b="17145"/>
+                <wp:wrapNone/>
+                <wp:docPr id="10" name="Hexagone 10"/>
+                <wp:cNvGraphicFramePr/>
                 <ns5:graphic>
                   <ns5:graphicData uri="http://schemas.microsoft.com/office/word/2010/wordprocessingShape">
                     <ns7:wsp>
@@ -33185,7 +33188,7 @@
                 <ns4:sizeRelV relativeFrom="margin">
                   <ns4:pctHeight>0</ns4:pctHeight>
                 </ns4:sizeRelV>
-              </ns3:anchor>
+              </wp:anchor>
             </w:drawing>
           </ns1:Choice>
           <ns1:Fallback>
@@ -35428,7 +35431,7 @@
     </w:p>
     <w:tbl>
       <w:tblPr>
-        <w:tblW w:w="8934" w:type="dxa"/>
+        <w:tblW w:w="8788" w:type="dxa"/>
         <w:tblInd w:w="212" w:type="dxa"/>
         <w:tblBorders>
           <w:top w:val="single" w:sz="4" w:space="0" w:color="auto"/>
@@ -35446,11 +35449,11 @@
         <w:tblLook w:val="0000" w:firstRow="0" w:lastRow="0" w:firstColumn="0" w:lastColumn="0" w:noHBand="0" w:noVBand="0"/>
       </w:tblPr>
       <w:tblGrid>
-        <w:gridCol w:w="932"/>
-        <w:gridCol w:w="2815"/>
-        <w:gridCol w:w="1729"/>
-        <w:gridCol w:w="1940"/>
-        <w:gridCol w:w="1518"/>
+        <w:gridCol w:w="917"/>
+        <w:gridCol w:w="2769"/>
+        <w:gridCol w:w="1701"/>
+        <w:gridCol w:w="1908"/>
+        <w:gridCol w:w="1493"/>
       </w:tblGrid>
       <w:tr ns2:paraId="6334D452" ns2:textId="77777777">
         <w:trPr>
@@ -35459,7 +35462,7 @@
         </w:trPr>
         <w:tc>
           <w:tcPr>
-            <w:tcW w:w="932" w:type="dxa"/>
+            <w:tcW w:w="917" w:type="dxa"/>
             <w:vMerge w:val="restart"/>
           </w:tcPr>
           <w:bookmarkEnd w:id="6"/>
@@ -35476,7 +35479,7 @@
         </w:tc>
         <w:tc>
           <w:tcPr>
-            <w:tcW w:w="4544" w:type="dxa"/>
+            <w:tcW w:w="4470" w:type="dxa"/>
             <w:gridSpan w:val="2"/>
           </w:tcPr>
           <w:p ns2:paraId="6774F40F" ns2:textId="77777777">
@@ -35503,7 +35506,7 @@
         </w:tc>
         <w:tc>
           <w:tcPr>
-            <w:tcW w:w="3458" w:type="dxa"/>
+            <w:tcW w:w="3401" w:type="dxa"/>
             <w:gridSpan w:val="2"/>
           </w:tcPr>
           <w:p ns2:paraId="47DF7914" ns2:textId="23E72F42">
@@ -35529,7 +35532,7 @@
         </w:trPr>
         <w:tc>
           <w:tcPr>
-            <w:tcW w:w="932" w:type="dxa"/>
+            <w:tcW w:w="917" w:type="dxa"/>
             <w:vMerge/>
           </w:tcPr>
           <w:p ns2:paraId="7CC248BE" ns2:textId="77777777">
@@ -35546,7 +35549,7 @@
         </w:tc>
         <w:tc>
           <w:tcPr>
-            <w:tcW w:w="2815" w:type="dxa"/>
+            <w:tcW w:w="2769" w:type="dxa"/>
           </w:tcPr>
           <w:p ns2:paraId="446DA400" ns2:textId="230177E8">
             <w:pPr>
@@ -35571,7 +35574,7 @@
         </w:tc>
         <w:tc>
           <w:tcPr>
-            <w:tcW w:w="1729" w:type="dxa"/>
+            <w:tcW w:w="1701" w:type="dxa"/>
           </w:tcPr>
           <w:p ns2:paraId="3D395AF5" ns2:textId="77777777">
             <w:pPr>
@@ -35596,7 +35599,7 @@
         </w:tc>
         <w:tc>
           <w:tcPr>
-            <w:tcW w:w="1940" w:type="dxa"/>
+            <w:tcW w:w="1908" w:type="dxa"/>
           </w:tcPr>
           <w:p ns2:paraId="5C63435E" ns2:textId="77777777">
             <w:pPr>
@@ -35621,7 +35624,7 @@
         </w:tc>
         <w:tc>
           <w:tcPr>
-            <w:tcW w:w="1517" w:type="dxa"/>
+            <w:tcW w:w="1492" w:type="dxa"/>
           </w:tcPr>
           <w:p ns2:paraId="671C493C" ns2:textId="77777777">
             <w:pPr>
@@ -35652,7 +35655,7 @@
         </w:trPr>
         <w:tc>
           <w:tcPr>
-            <w:tcW w:w="932" w:type="dxa"/>
+            <w:tcW w:w="917" w:type="dxa"/>
           </w:tcPr>
           <w:p ns2:paraId="7F747B3C" ns2:textId="77777777">
             <w:pPr>
@@ -35667,7 +35670,7 @@
         </w:tc>
         <w:tc>
           <w:tcPr>
-            <w:tcW w:w="2815" w:type="dxa"/>
+            <w:tcW w:w="2769" w:type="dxa"/>
           </w:tcPr>
           <w:p ns2:paraId="32A8ACA0" ns2:textId="5A8E2659">
             <w:pPr>
@@ -35682,7 +35685,7 @@
         </w:tc>
         <w:tc>
           <w:tcPr>
-            <w:tcW w:w="1729" w:type="dxa"/>
+            <w:tcW w:w="1701" w:type="dxa"/>
           </w:tcPr>
           <w:p ns2:paraId="0BF34B79" ns2:textId="6336A86E">
             <w:pPr>
@@ -35697,7 +35700,7 @@
         </w:tc>
         <w:tc>
           <w:tcPr>
-            <w:tcW w:w="1940" w:type="dxa"/>
+            <w:tcW w:w="1908" w:type="dxa"/>
           </w:tcPr>
           <w:p ns2:paraId="0FA3102A" ns2:textId="1AE7FCD9">
             <w:pPr>
@@ -35712,7 +35715,7 @@
         </w:tc>
         <w:tc>
           <w:tcPr>
-            <w:tcW w:w="1517" w:type="dxa"/>
+            <w:tcW w:w="1492" w:type="dxa"/>
           </w:tcPr>
           <w:p ns2:paraId="7DAFDF5D" ns2:textId="37AF6D23">
             <w:pPr>
@@ -35733,7 +35736,7 @@
         </w:trPr>
         <w:tc>
           <w:tcPr>
-            <w:tcW w:w="932" w:type="dxa"/>
+            <w:tcW w:w="917" w:type="dxa"/>
           </w:tcPr>
           <w:p ns2:paraId="5BD27E36" ns2:textId="77777777">
             <w:pPr>
@@ -35748,7 +35751,7 @@
         </w:tc>
         <w:tc>
           <w:tcPr>
-            <w:tcW w:w="2815" w:type="dxa"/>
+            <w:tcW w:w="2769" w:type="dxa"/>
           </w:tcPr>
           <w:p ns2:paraId="3540B24A" ns2:textId="673ABC6D">
             <w:pPr>
@@ -35763,7 +35766,7 @@
         </w:tc>
         <w:tc>
           <w:tcPr>
-            <w:tcW w:w="1729" w:type="dxa"/>
+            <w:tcW w:w="1701" w:type="dxa"/>
           </w:tcPr>
           <w:p ns2:paraId="0E047E1A" ns2:textId="5E65BE5C">
             <w:pPr>
@@ -35778,7 +35781,7 @@
         </w:tc>
         <w:tc>
           <w:tcPr>
-            <w:tcW w:w="1940" w:type="dxa"/>
+            <w:tcW w:w="1908" w:type="dxa"/>
           </w:tcPr>
           <w:p ns2:paraId="5D666E48" ns2:textId="270E8E94">
             <w:pPr>
@@ -35793,7 +35796,7 @@
         </w:tc>
         <w:tc>
           <w:tcPr>
-            <w:tcW w:w="1517" w:type="dxa"/>
+            <w:tcW w:w="1492" w:type="dxa"/>
           </w:tcPr>
           <w:p ns2:paraId="3DA19AE5" ns2:textId="2D63639B">
             <w:pPr>
@@ -35814,7 +35817,7 @@
         </w:trPr>
         <w:tc>
           <w:tcPr>
-            <w:tcW w:w="932" w:type="dxa"/>
+            <w:tcW w:w="917" w:type="dxa"/>
           </w:tcPr>
           <w:p ns2:paraId="13F5AFC8" ns2:textId="77777777">
             <w:pPr>
@@ -35829,7 +35832,7 @@
         </w:tc>
         <w:tc>
           <w:tcPr>
-            <w:tcW w:w="2815" w:type="dxa"/>
+            <w:tcW w:w="2769" w:type="dxa"/>
           </w:tcPr>
           <w:p ns2:paraId="53653816" ns2:textId="1BA1B5B6">
             <w:pPr>
@@ -35844,7 +35847,7 @@
         </w:tc>
         <w:tc>
           <w:tcPr>
-            <w:tcW w:w="1729" w:type="dxa"/>
+            <w:tcW w:w="1701" w:type="dxa"/>
           </w:tcPr>
           <w:p ns2:paraId="6D25992D" ns2:textId="4C08A235">
             <w:pPr>
@@ -35859,7 +35862,7 @@
         </w:tc>
         <w:tc>
           <w:tcPr>
-            <w:tcW w:w="1940" w:type="dxa"/>
+            <w:tcW w:w="1908" w:type="dxa"/>
           </w:tcPr>
           <w:p ns2:paraId="567256D9" ns2:textId="75B02E1B">
             <w:pPr>
@@ -35874,7 +35877,7 @@
         </w:tc>
         <w:tc>
           <w:tcPr>
-            <w:tcW w:w="1517" w:type="dxa"/>
+            <w:tcW w:w="1492" w:type="dxa"/>
           </w:tcPr>
           <w:p ns2:paraId="7B7A9447" ns2:textId="0ECC4414">
             <w:pPr>
@@ -35895,7 +35898,7 @@
         </w:trPr>
         <w:tc>
           <w:tcPr>
-            <w:tcW w:w="932" w:type="dxa"/>
+            <w:tcW w:w="917" w:type="dxa"/>
           </w:tcPr>
           <w:p ns2:paraId="504A3851" ns2:textId="77777777">
             <w:pPr>
@@ -35910,7 +35913,7 @@
         </w:tc>
         <w:tc>
           <w:tcPr>
-            <w:tcW w:w="2815" w:type="dxa"/>
+            <w:tcW w:w="2769" w:type="dxa"/>
           </w:tcPr>
           <w:p ns2:paraId="4A5F53FE" ns2:textId="077C27CA">
             <w:pPr>
@@ -35925,7 +35928,7 @@
         </w:tc>
         <w:tc>
           <w:tcPr>
-            <w:tcW w:w="1729" w:type="dxa"/>
+            <w:tcW w:w="1701" w:type="dxa"/>
           </w:tcPr>
           <w:p ns2:paraId="46260593" ns2:textId="209F958E">
             <w:pPr>
@@ -35940,7 +35943,7 @@
         </w:tc>
         <w:tc>
           <w:tcPr>
-            <w:tcW w:w="1940" w:type="dxa"/>
+            <w:tcW w:w="1908" w:type="dxa"/>
           </w:tcPr>
           <w:p ns2:paraId="3BB0AB20" ns2:textId="4677597F">
             <w:pPr>
@@ -35955,7 +35958,7 @@
         </w:tc>
         <w:tc>
           <w:tcPr>
-            <w:tcW w:w="1517" w:type="dxa"/>
+            <w:tcW w:w="1492" w:type="dxa"/>
           </w:tcPr>
           <w:p ns2:paraId="03A1B27C" ns2:textId="2810CCEF">
             <w:pPr>
@@ -35976,7 +35979,7 @@
         </w:trPr>
         <w:tc>
           <w:tcPr>
-            <w:tcW w:w="932" w:type="dxa"/>
+            <w:tcW w:w="917" w:type="dxa"/>
           </w:tcPr>
           <w:p ns2:paraId="23A9638D" ns2:textId="77777777">
             <w:pPr>
@@ -35991,7 +35994,7 @@
         </w:tc>
         <w:tc>
           <w:tcPr>
-            <w:tcW w:w="2815" w:type="dxa"/>
+            <w:tcW w:w="2769" w:type="dxa"/>
           </w:tcPr>
           <w:p ns2:paraId="345CD956" ns2:textId="7F3B256F">
             <w:pPr>
@@ -36006,7 +36009,7 @@
         </w:tc>
         <w:tc>
           <w:tcPr>
-            <w:tcW w:w="1729" w:type="dxa"/>
+            <w:tcW w:w="1701" w:type="dxa"/>
           </w:tcPr>
           <w:p ns2:paraId="690A8C29" ns2:textId="550C55F4">
             <w:pPr>
@@ -36021,7 +36024,7 @@
         </w:tc>
         <w:tc>
           <w:tcPr>
-            <w:tcW w:w="1940" w:type="dxa"/>
+            <w:tcW w:w="1908" w:type="dxa"/>
           </w:tcPr>
           <w:p ns2:paraId="54AFEB84" ns2:textId="30D9332A">
             <w:pPr>
@@ -36036,7 +36039,7 @@
         </w:tc>
         <w:tc>
           <w:tcPr>
-            <w:tcW w:w="1517" w:type="dxa"/>
+            <w:tcW w:w="1492" w:type="dxa"/>
           </w:tcPr>
           <w:p ns2:paraId="7BEB12FF" ns2:textId="6EC96F31">
             <w:pPr>
@@ -36874,17 +36877,17 @@
       <w:tblPr>
         <w:tblStyle w:val="Grilledutableau"/>
         <w:tblpPr w:leftFromText="141" w:rightFromText="141" w:vertAnchor="text" w:horzAnchor="margin" w:tblpX="-490" w:tblpY="231"/>
-        <w:tblW w:w="9790" w:type="dxa"/>
+        <w:tblW w:w="8788" w:type="dxa"/>
         <w:tblLayout w:type="fixed"/>
         <w:tblLook w:val="04A0" w:firstRow="1" w:lastRow="0" w:firstColumn="1" w:lastColumn="0" w:noHBand="0" w:noVBand="1"/>
       </w:tblPr>
       <w:tblGrid>
-        <w:gridCol w:w="3679"/>
-        <w:gridCol w:w="1276"/>
-        <w:gridCol w:w="1703"/>
-        <w:gridCol w:w="1275"/>
-        <w:gridCol w:w="1843"/>
-        <w:gridCol w:w="14"/>
+        <w:gridCol w:w="3302"/>
+        <w:gridCol w:w="1145"/>
+        <w:gridCol w:w="1529"/>
+        <w:gridCol w:w="1145"/>
+        <w:gridCol w:w="1654"/>
+        <w:gridCol w:w="13"/>
       </w:tblGrid>
       <w:tr ns2:paraId="6CC6FEBA" ns2:textId="77777777">
         <w:trPr>
@@ -36893,7 +36896,7 @@
         </w:trPr>
         <w:tc>
           <w:tcPr>
-            <w:tcW w:w="3679" w:type="dxa"/>
+            <w:tcW w:w="3302" w:type="dxa"/>
             <w:vMerge w:val="restart"/>
             <w:tcBorders>
               <w:top w:val="single" w:sz="4" w:space="0" w:color="auto"/>
@@ -36918,7 +36921,7 @@
         </w:tc>
         <w:tc>
           <w:tcPr>
-            <w:tcW w:w="6111" w:type="dxa"/>
+            <w:tcW w:w="5486" w:type="dxa"/>
             <w:gridSpan w:val="5"/>
             <w:tcBorders>
               <w:top w:val="single" w:sz="4" w:space="0" w:color="auto"/>
@@ -36954,7 +36957,7 @@
         </w:trPr>
         <w:tc>
           <w:tcPr>
-            <w:tcW w:w="3679" w:type="dxa"/>
+            <w:tcW w:w="3302" w:type="dxa"/>
             <w:vMerge/>
             <w:tcBorders>
               <w:left w:val="single" w:sz="4" w:space="0" w:color="auto"/>
@@ -36976,7 +36979,7 @@
         </w:tc>
         <w:tc>
           <w:tcPr>
-            <w:tcW w:w="2979" w:type="dxa"/>
+            <w:tcW w:w="2674" w:type="dxa"/>
             <w:gridSpan w:val="2"/>
             <w:tcBorders>
               <w:top w:val="single" w:sz="4" w:space="0" w:color="auto"/>
@@ -37004,7 +37007,7 @@
         </w:tc>
         <w:tc>
           <w:tcPr>
-            <w:tcW w:w="3118" w:type="dxa"/>
+            <w:tcW w:w="2799" w:type="dxa"/>
             <w:gridSpan w:val="2"/>
             <w:tcBorders>
               <w:top w:val="single" w:sz="4" w:space="0" w:color="auto"/>
@@ -37040,7 +37043,7 @@
         </w:trPr>
         <w:tc>
           <w:tcPr>
-            <w:tcW w:w="3679" w:type="dxa"/>
+            <w:tcW w:w="3302" w:type="dxa"/>
             <w:vMerge/>
             <w:tcBorders>
               <w:left w:val="single" w:sz="4" w:space="0" w:color="auto"/>
@@ -37063,7 +37066,7 @@
         </w:tc>
         <w:tc>
           <w:tcPr>
-            <w:tcW w:w="1276" w:type="dxa"/>
+            <w:tcW w:w="1145" w:type="dxa"/>
             <w:tcBorders>
               <w:top w:val="single" w:sz="4" w:space="0" w:color="auto"/>
               <w:left w:val="single" w:sz="4" w:space="0" w:color="auto"/>
@@ -37090,7 +37093,7 @@
         </w:tc>
         <w:tc>
           <w:tcPr>
-            <w:tcW w:w="1703" w:type="dxa"/>
+            <w:tcW w:w="1529" w:type="dxa"/>
             <w:tcBorders>
               <w:top w:val="single" w:sz="4" w:space="0" w:color="auto"/>
               <w:left w:val="single" w:sz="4" w:space="0" w:color="auto"/>
@@ -37116,7 +37119,7 @@
         </w:tc>
         <w:tc>
           <w:tcPr>
-            <w:tcW w:w="1275" w:type="dxa"/>
+            <w:tcW w:w="1145" w:type="dxa"/>
             <w:tcBorders>
               <w:top w:val="single" w:sz="4" w:space="0" w:color="auto"/>
               <w:left w:val="single" w:sz="4" w:space="0" w:color="auto"/>
@@ -37143,7 +37146,7 @@
         </w:tc>
         <w:tc>
           <w:tcPr>
-            <w:tcW w:w="1843" w:type="dxa"/>
+            <w:tcW w:w="1654" w:type="dxa"/>
             <w:tcBorders>
               <w:top w:val="single" w:sz="4" w:space="0" w:color="auto"/>
               <w:left w:val="single" w:sz="4" w:space="0" w:color="auto"/>
@@ -37177,7 +37180,7 @@
         </w:trPr>
         <w:tc>
           <w:tcPr>
-            <w:tcW w:w="3679" w:type="dxa"/>
+            <w:tcW w:w="3302" w:type="dxa"/>
             <w:tcBorders>
               <w:top w:val="single" w:sz="4" w:space="0" w:color="auto"/>
               <w:left w:val="single" w:sz="4" w:space="0" w:color="auto"/>
@@ -37211,7 +37214,7 @@
         </w:tc>
         <w:tc>
           <w:tcPr>
-            <w:tcW w:w="1276" w:type="dxa"/>
+            <w:tcW w:w="1145" w:type="dxa"/>
             <w:tcBorders>
               <w:top w:val="single" w:sz="4" w:space="0" w:color="auto"/>
               <w:left w:val="single" w:sz="4" w:space="0" w:color="auto"/>
@@ -37232,7 +37235,7 @@
         </w:tc>
         <w:tc>
           <w:tcPr>
-            <w:tcW w:w="1703" w:type="dxa"/>
+            <w:tcW w:w="1529" w:type="dxa"/>
             <w:tcBorders>
               <w:top w:val="single" w:sz="4" w:space="0" w:color="auto"/>
               <w:left w:val="single" w:sz="4" w:space="0" w:color="auto"/>
@@ -37257,7 +37260,7 @@
         </w:tc>
         <w:tc>
           <w:tcPr>
-            <w:tcW w:w="1275" w:type="dxa"/>
+            <w:tcW w:w="1145" w:type="dxa"/>
             <w:tcBorders>
               <w:top w:val="single" w:sz="4" w:space="0" w:color="auto"/>
               <w:left w:val="single" w:sz="4" w:space="0" w:color="auto"/>
@@ -37278,7 +37281,7 @@
         </w:tc>
         <w:tc>
           <w:tcPr>
-            <w:tcW w:w="1843" w:type="dxa"/>
+            <w:tcW w:w="1654" w:type="dxa"/>
             <w:tcBorders>
               <w:top w:val="single" w:sz="4" w:space="0" w:color="auto"/>
               <w:left w:val="single" w:sz="4" w:space="0" w:color="auto"/>
@@ -37307,7 +37310,7 @@
         </w:trPr>
         <w:tc>
           <w:tcPr>
-            <w:tcW w:w="3679" w:type="dxa"/>
+            <w:tcW w:w="3302" w:type="dxa"/>
             <w:tcBorders>
               <w:top w:val="single" w:sz="4" w:space="0" w:color="auto"/>
               <w:left w:val="single" w:sz="4" w:space="0" w:color="auto"/>
@@ -37340,7 +37343,7 @@
         </w:tc>
         <w:tc>
           <w:tcPr>
-            <w:tcW w:w="1276" w:type="dxa"/>
+            <w:tcW w:w="1145" w:type="dxa"/>
             <w:tcBorders>
               <w:top w:val="single" w:sz="4" w:space="0" w:color="auto"/>
               <w:left w:val="single" w:sz="4" w:space="0" w:color="auto"/>
@@ -37361,7 +37364,7 @@
         </w:tc>
         <w:tc>
           <w:tcPr>
-            <w:tcW w:w="1703" w:type="dxa"/>
+            <w:tcW w:w="1529" w:type="dxa"/>
             <w:tcBorders>
               <w:top w:val="single" w:sz="4" w:space="0" w:color="auto"/>
               <w:left w:val="single" w:sz="4" w:space="0" w:color="auto"/>
@@ -37394,7 +37397,7 @@
         </w:tc>
         <w:tc>
           <w:tcPr>
-            <w:tcW w:w="1275" w:type="dxa"/>
+            <w:tcW w:w="1145" w:type="dxa"/>
             <w:tcBorders>
               <w:top w:val="single" w:sz="4" w:space="0" w:color="auto"/>
               <w:left w:val="single" w:sz="4" w:space="0" w:color="auto"/>
@@ -37415,7 +37418,7 @@
         </w:tc>
         <w:tc>
           <w:tcPr>
-            <w:tcW w:w="1843" w:type="dxa"/>
+            <w:tcW w:w="1654" w:type="dxa"/>
             <w:tcBorders>
               <w:top w:val="single" w:sz="4" w:space="0" w:color="auto"/>
               <w:left w:val="single" w:sz="4" w:space="0" w:color="auto"/>
@@ -37444,7 +37447,7 @@
         </w:trPr>
         <w:tc>
           <w:tcPr>
-            <w:tcW w:w="3679" w:type="dxa"/>
+            <w:tcW w:w="3302" w:type="dxa"/>
             <w:tcBorders>
               <w:top w:val="single" w:sz="4" w:space="0" w:color="auto"/>
               <w:left w:val="single" w:sz="4" w:space="0" w:color="auto"/>
@@ -37469,7 +37472,7 @@
         </w:tc>
         <w:tc>
           <w:tcPr>
-            <w:tcW w:w="1276" w:type="dxa"/>
+            <w:tcW w:w="1145" w:type="dxa"/>
             <w:tcBorders>
               <w:top w:val="single" w:sz="4" w:space="0" w:color="auto"/>
               <w:left w:val="single" w:sz="4" w:space="0" w:color="auto"/>
@@ -37490,7 +37493,7 @@
         </w:tc>
         <w:tc>
           <w:tcPr>
-            <w:tcW w:w="1703" w:type="dxa"/>
+            <w:tcW w:w="1529" w:type="dxa"/>
             <w:tcBorders>
               <w:top w:val="single" w:sz="4" w:space="0" w:color="auto"/>
               <w:left w:val="single" w:sz="4" w:space="0" w:color="auto"/>
@@ -37523,7 +37526,7 @@
         </w:tc>
         <w:tc>
           <w:tcPr>
-            <w:tcW w:w="1275" w:type="dxa"/>
+            <w:tcW w:w="1145" w:type="dxa"/>
             <w:tcBorders>
               <w:top w:val="single" w:sz="4" w:space="0" w:color="auto"/>
               <w:left w:val="single" w:sz="4" w:space="0" w:color="auto"/>
@@ -37544,7 +37547,7 @@
         </w:tc>
         <w:tc>
           <w:tcPr>
-            <w:tcW w:w="1843" w:type="dxa"/>
+            <w:tcW w:w="1654" w:type="dxa"/>
             <w:tcBorders>
               <w:top w:val="single" w:sz="4" w:space="0" w:color="auto"/>
               <w:left w:val="single" w:sz="4" w:space="0" w:color="auto"/>
@@ -37573,7 +37576,7 @@
         </w:trPr>
         <w:tc>
           <w:tcPr>
-            <w:tcW w:w="3679" w:type="dxa"/>
+            <w:tcW w:w="3302" w:type="dxa"/>
             <w:tcBorders>
               <w:top w:val="single" w:sz="4" w:space="0" w:color="auto"/>
               <w:left w:val="single" w:sz="4" w:space="0" w:color="auto"/>
@@ -37598,7 +37601,7 @@
         </w:tc>
         <w:tc>
           <w:tcPr>
-            <w:tcW w:w="1276" w:type="dxa"/>
+            <w:tcW w:w="1145" w:type="dxa"/>
             <w:tcBorders>
               <w:top w:val="single" w:sz="4" w:space="0" w:color="auto"/>
               <w:left w:val="single" w:sz="4" w:space="0" w:color="auto"/>
@@ -37619,7 +37622,7 @@
         </w:tc>
         <w:tc>
           <w:tcPr>
-            <w:tcW w:w="1703" w:type="dxa"/>
+            <w:tcW w:w="1529" w:type="dxa"/>
             <w:tcBorders>
               <w:top w:val="single" w:sz="4" w:space="0" w:color="auto"/>
               <w:left w:val="single" w:sz="4" w:space="0" w:color="auto"/>
@@ -37640,7 +37643,7 @@
         </w:tc>
         <w:tc>
           <w:tcPr>
-            <w:tcW w:w="1275" w:type="dxa"/>
+            <w:tcW w:w="1145" w:type="dxa"/>
             <w:tcBorders>
               <w:top w:val="single" w:sz="4" w:space="0" w:color="auto"/>
               <w:left w:val="single" w:sz="4" w:space="0" w:color="auto"/>
@@ -37661,7 +37664,7 @@
         </w:tc>
         <w:tc>
           <w:tcPr>
-            <w:tcW w:w="1843" w:type="dxa"/>
+            <w:tcW w:w="1654" w:type="dxa"/>
             <w:tcBorders>
               <w:top w:val="single" w:sz="4" w:space="0" w:color="auto"/>
               <w:left w:val="single" w:sz="4" w:space="0" w:color="auto"/>
@@ -38201,16 +38204,16 @@
       <w:tblPr>
         <w:tblStyle w:val="Grilledutableau"/>
         <w:tblpPr w:leftFromText="141" w:rightFromText="141" w:vertAnchor="text" w:horzAnchor="margin" w:tblpX="-490" w:tblpY="231"/>
-        <w:tblW w:w="9790" w:type="dxa"/>
+        <w:tblW w:w="8788" w:type="dxa"/>
         <w:tblLayout w:type="fixed"/>
         <w:tblLook w:val="04A0" w:firstRow="1" w:lastRow="0" w:firstColumn="1" w:lastColumn="0" w:noHBand="0" w:noVBand="1"/>
       </w:tblPr>
       <w:tblGrid>
-        <w:gridCol w:w="4248"/>
-        <w:gridCol w:w="992"/>
-        <w:gridCol w:w="1843"/>
-        <w:gridCol w:w="1134"/>
-        <w:gridCol w:w="1559"/>
+        <w:gridCol w:w="3813"/>
+        <w:gridCol w:w="890"/>
+        <w:gridCol w:w="1654"/>
+        <w:gridCol w:w="1018"/>
+        <w:gridCol w:w="1399"/>
         <w:gridCol w:w="14"/>
       </w:tblGrid>
       <w:tr ns2:paraId="0157CDFF" ns2:textId="77777777">
@@ -38220,7 +38223,7 @@
         </w:trPr>
         <w:tc>
           <w:tcPr>
-            <w:tcW w:w="4248" w:type="dxa"/>
+            <w:tcW w:w="3813" w:type="dxa"/>
             <w:vMerge w:val="restart"/>
             <w:tcBorders>
               <w:top w:val="single" w:sz="4" w:space="0" w:color="auto"/>
@@ -38266,7 +38269,7 @@
         </w:tc>
         <w:tc>
           <w:tcPr>
-            <w:tcW w:w="5542" w:type="dxa"/>
+            <w:tcW w:w="4975" w:type="dxa"/>
             <w:gridSpan w:val="5"/>
             <w:tcBorders>
               <w:top w:val="single" w:sz="4" w:space="0" w:color="auto"/>
@@ -38302,7 +38305,7 @@
         </w:trPr>
         <w:tc>
           <w:tcPr>
-            <w:tcW w:w="4248" w:type="dxa"/>
+            <w:tcW w:w="3813" w:type="dxa"/>
             <w:vMerge/>
             <w:tcBorders>
               <w:left w:val="single" w:sz="4" w:space="0" w:color="auto"/>
@@ -38324,7 +38327,7 @@
         </w:tc>
         <w:tc>
           <w:tcPr>
-            <w:tcW w:w="2835" w:type="dxa"/>
+            <w:tcW w:w="2545" w:type="dxa"/>
             <w:gridSpan w:val="2"/>
             <w:tcBorders>
               <w:top w:val="single" w:sz="4" w:space="0" w:color="auto"/>
@@ -38352,7 +38355,7 @@
         </w:tc>
         <w:tc>
           <w:tcPr>
-            <w:tcW w:w="2693" w:type="dxa"/>
+            <w:tcW w:w="2417" w:type="dxa"/>
             <w:gridSpan w:val="2"/>
             <w:tcBorders>
               <w:top w:val="single" w:sz="4" w:space="0" w:color="auto"/>
@@ -38388,7 +38391,7 @@
         </w:trPr>
         <w:tc>
           <w:tcPr>
-            <w:tcW w:w="4248" w:type="dxa"/>
+            <w:tcW w:w="3813" w:type="dxa"/>
             <w:vMerge/>
             <w:tcBorders>
               <w:left w:val="single" w:sz="4" w:space="0" w:color="auto"/>
@@ -38411,7 +38414,7 @@
         </w:tc>
         <w:tc>
           <w:tcPr>
-            <w:tcW w:w="992" w:type="dxa"/>
+            <w:tcW w:w="890" w:type="dxa"/>
             <w:tcBorders>
               <w:top w:val="single" w:sz="4" w:space="0" w:color="auto"/>
               <w:left w:val="single" w:sz="4" w:space="0" w:color="auto"/>
@@ -38438,7 +38441,7 @@
         </w:tc>
         <w:tc>
           <w:tcPr>
-            <w:tcW w:w="1843" w:type="dxa"/>
+            <w:tcW w:w="1654" w:type="dxa"/>
             <w:tcBorders>
               <w:top w:val="single" w:sz="4" w:space="0" w:color="auto"/>
               <w:left w:val="single" w:sz="4" w:space="0" w:color="auto"/>
@@ -38464,7 +38467,7 @@
         </w:tc>
         <w:tc>
           <w:tcPr>
-            <w:tcW w:w="1134" w:type="dxa"/>
+            <w:tcW w:w="1018" w:type="dxa"/>
             <w:tcBorders>
               <w:top w:val="single" w:sz="4" w:space="0" w:color="auto"/>
               <w:left w:val="single" w:sz="4" w:space="0" w:color="auto"/>
@@ -38491,7 +38494,7 @@
         </w:tc>
         <w:tc>
           <w:tcPr>
-            <w:tcW w:w="1559" w:type="dxa"/>
+            <w:tcW w:w="1399" w:type="dxa"/>
             <w:tcBorders>
               <w:top w:val="single" w:sz="4" w:space="0" w:color="auto"/>
               <w:left w:val="single" w:sz="4" w:space="0" w:color="auto"/>
@@ -38525,7 +38528,7 @@
         </w:trPr>
         <w:tc>
           <w:tcPr>
-            <w:tcW w:w="4248" w:type="dxa"/>
+            <w:tcW w:w="3813" w:type="dxa"/>
             <w:tcBorders>
               <w:top w:val="single" w:sz="4" w:space="0" w:color="auto"/>
               <w:left w:val="single" w:sz="4" w:space="0" w:color="auto"/>
@@ -38559,7 +38562,7 @@
         </w:tc>
         <w:tc>
           <w:tcPr>
-            <w:tcW w:w="992" w:type="dxa"/>
+            <w:tcW w:w="890" w:type="dxa"/>
             <w:tcBorders>
               <w:top w:val="single" w:sz="4" w:space="0" w:color="auto"/>
               <w:left w:val="single" w:sz="4" w:space="0" w:color="auto"/>
@@ -38580,7 +38583,7 @@
         </w:tc>
         <w:tc>
           <w:tcPr>
-            <w:tcW w:w="1843" w:type="dxa"/>
+            <w:tcW w:w="1654" w:type="dxa"/>
             <w:tcBorders>
               <w:top w:val="single" w:sz="4" w:space="0" w:color="auto"/>
               <w:left w:val="single" w:sz="4" w:space="0" w:color="auto"/>
@@ -38601,7 +38604,7 @@
         </w:tc>
         <w:tc>
           <w:tcPr>
-            <w:tcW w:w="1134" w:type="dxa"/>
+            <w:tcW w:w="1018" w:type="dxa"/>
             <w:tcBorders>
               <w:top w:val="single" w:sz="4" w:space="0" w:color="auto"/>
               <w:left w:val="single" w:sz="4" w:space="0" w:color="auto"/>
@@ -38622,7 +38625,7 @@
         </w:tc>
         <w:tc>
           <w:tcPr>
-            <w:tcW w:w="1559" w:type="dxa"/>
+            <w:tcW w:w="1399" w:type="dxa"/>
             <w:tcBorders>
               <w:top w:val="single" w:sz="4" w:space="0" w:color="auto"/>
               <w:left w:val="single" w:sz="4" w:space="0" w:color="auto"/>
@@ -38651,7 +38654,7 @@
         </w:trPr>
         <w:tc>
           <w:tcPr>
-            <w:tcW w:w="4248" w:type="dxa"/>
+            <w:tcW w:w="3813" w:type="dxa"/>
             <w:tcBorders>
               <w:top w:val="single" w:sz="4" w:space="0" w:color="auto"/>
               <w:left w:val="single" w:sz="4" w:space="0" w:color="auto"/>
@@ -38684,7 +38687,7 @@
         </w:tc>
         <w:tc>
           <w:tcPr>
-            <w:tcW w:w="992" w:type="dxa"/>
+            <w:tcW w:w="890" w:type="dxa"/>
             <w:tcBorders>
               <w:top w:val="single" w:sz="4" w:space="0" w:color="auto"/>
               <w:left w:val="single" w:sz="4" w:space="0" w:color="auto"/>
@@ -38705,7 +38708,7 @@
         </w:tc>
         <w:tc>
           <w:tcPr>
-            <w:tcW w:w="1843" w:type="dxa"/>
+            <w:tcW w:w="1654" w:type="dxa"/>
             <w:tcBorders>
               <w:top w:val="single" w:sz="4" w:space="0" w:color="auto"/>
               <w:left w:val="single" w:sz="4" w:space="0" w:color="auto"/>
@@ -38726,7 +38729,7 @@
         </w:tc>
         <w:tc>
           <w:tcPr>
-            <w:tcW w:w="1134" w:type="dxa"/>
+            <w:tcW w:w="1018" w:type="dxa"/>
             <w:tcBorders>
               <w:top w:val="single" w:sz="4" w:space="0" w:color="auto"/>
               <w:left w:val="single" w:sz="4" w:space="0" w:color="auto"/>
@@ -38747,7 +38750,7 @@
         </w:tc>
         <w:tc>
           <w:tcPr>
-            <w:tcW w:w="1559" w:type="dxa"/>
+            <w:tcW w:w="1399" w:type="dxa"/>
             <w:tcBorders>
               <w:top w:val="single" w:sz="4" w:space="0" w:color="auto"/>
               <w:left w:val="single" w:sz="4" w:space="0" w:color="auto"/>
@@ -38776,7 +38779,7 @@
         </w:trPr>
         <w:tc>
           <w:tcPr>
-            <w:tcW w:w="4248" w:type="dxa"/>
+            <w:tcW w:w="3813" w:type="dxa"/>
             <w:tcBorders>
               <w:top w:val="single" w:sz="4" w:space="0" w:color="auto"/>
               <w:left w:val="single" w:sz="4" w:space="0" w:color="auto"/>
@@ -38801,7 +38804,7 @@
         </w:tc>
         <w:tc>
           <w:tcPr>
-            <w:tcW w:w="992" w:type="dxa"/>
+            <w:tcW w:w="890" w:type="dxa"/>
             <w:tcBorders>
               <w:top w:val="single" w:sz="4" w:space="0" w:color="auto"/>
               <w:left w:val="single" w:sz="4" w:space="0" w:color="auto"/>
@@ -38822,7 +38825,7 @@
         </w:tc>
         <w:tc>
           <w:tcPr>
-            <w:tcW w:w="1843" w:type="dxa"/>
+            <w:tcW w:w="1654" w:type="dxa"/>
             <w:tcBorders>
               <w:top w:val="single" w:sz="4" w:space="0" w:color="auto"/>
               <w:left w:val="single" w:sz="4" w:space="0" w:color="auto"/>
@@ -38843,7 +38846,7 @@
         </w:tc>
         <w:tc>
           <w:tcPr>
-            <w:tcW w:w="1134" w:type="dxa"/>
+            <w:tcW w:w="1018" w:type="dxa"/>
             <w:tcBorders>
               <w:top w:val="single" w:sz="4" w:space="0" w:color="auto"/>
               <w:left w:val="single" w:sz="4" w:space="0" w:color="auto"/>
@@ -38864,7 +38867,7 @@
         </w:tc>
         <w:tc>
           <w:tcPr>
-            <w:tcW w:w="1559" w:type="dxa"/>
+            <w:tcW w:w="1399" w:type="dxa"/>
             <w:tcBorders>
               <w:top w:val="single" w:sz="4" w:space="0" w:color="auto"/>
               <w:left w:val="single" w:sz="4" w:space="0" w:color="auto"/>
@@ -38893,7 +38896,7 @@
         </w:trPr>
         <w:tc>
           <w:tcPr>
-            <w:tcW w:w="4248" w:type="dxa"/>
+            <w:tcW w:w="3813" w:type="dxa"/>
             <w:tcBorders>
               <w:top w:val="single" w:sz="4" w:space="0" w:color="auto"/>
               <w:left w:val="single" w:sz="4" w:space="0" w:color="auto"/>
@@ -38918,7 +38921,7 @@
         </w:tc>
         <w:tc>
           <w:tcPr>
-            <w:tcW w:w="992" w:type="dxa"/>
+            <w:tcW w:w="890" w:type="dxa"/>
             <w:tcBorders>
               <w:top w:val="single" w:sz="4" w:space="0" w:color="auto"/>
               <w:left w:val="single" w:sz="4" w:space="0" w:color="auto"/>
@@ -38939,7 +38942,7 @@
         </w:tc>
         <w:tc>
           <w:tcPr>
-            <w:tcW w:w="1843" w:type="dxa"/>
+            <w:tcW w:w="1654" w:type="dxa"/>
             <w:tcBorders>
               <w:top w:val="single" w:sz="4" w:space="0" w:color="auto"/>
               <w:left w:val="single" w:sz="4" w:space="0" w:color="auto"/>
@@ -38960,7 +38963,7 @@
         </w:tc>
         <w:tc>
           <w:tcPr>
-            <w:tcW w:w="1134" w:type="dxa"/>
+            <w:tcW w:w="1018" w:type="dxa"/>
             <w:tcBorders>
               <w:top w:val="single" w:sz="4" w:space="0" w:color="auto"/>
               <w:left w:val="single" w:sz="4" w:space="0" w:color="auto"/>
@@ -38981,7 +38984,7 @@
         </w:tc>
         <w:tc>
           <w:tcPr>
-            <w:tcW w:w="1559" w:type="dxa"/>
+            <w:tcW w:w="1399" w:type="dxa"/>
             <w:tcBorders>
               <w:top w:val="single" w:sz="4" w:space="0" w:color="auto"/>
               <w:left w:val="single" w:sz="4" w:space="0" w:color="auto"/>
@@ -39010,7 +39013,7 @@
         </w:trPr>
         <w:tc>
           <w:tcPr>
-            <w:tcW w:w="4248" w:type="dxa"/>
+            <w:tcW w:w="3813" w:type="dxa"/>
             <w:tcBorders>
               <w:top w:val="single" w:sz="4" w:space="0" w:color="auto"/>
               <w:left w:val="single" w:sz="4" w:space="0" w:color="auto"/>
@@ -39035,7 +39038,7 @@
         </w:tc>
         <w:tc>
           <w:tcPr>
-            <w:tcW w:w="992" w:type="dxa"/>
+            <w:tcW w:w="890" w:type="dxa"/>
             <w:tcBorders>
               <w:top w:val="single" w:sz="4" w:space="0" w:color="auto"/>
               <w:left w:val="single" w:sz="4" w:space="0" w:color="auto"/>
@@ -39056,7 +39059,7 @@
         </w:tc>
         <w:tc>
           <w:tcPr>
-            <w:tcW w:w="1843" w:type="dxa"/>
+            <w:tcW w:w="1654" w:type="dxa"/>
             <w:tcBorders>
               <w:top w:val="single" w:sz="4" w:space="0" w:color="auto"/>
               <w:left w:val="single" w:sz="4" w:space="0" w:color="auto"/>
@@ -39077,7 +39080,7 @@
         </w:tc>
         <w:tc>
           <w:tcPr>
-            <w:tcW w:w="1134" w:type="dxa"/>
+            <w:tcW w:w="1018" w:type="dxa"/>
             <w:tcBorders>
               <w:top w:val="single" w:sz="4" w:space="0" w:color="auto"/>
               <w:left w:val="single" w:sz="4" w:space="0" w:color="auto"/>
@@ -39098,7 +39101,7 @@
         </w:tc>
         <w:tc>
           <w:tcPr>
-            <w:tcW w:w="1559" w:type="dxa"/>
+            <w:tcW w:w="1399" w:type="dxa"/>
             <w:tcBorders>
               <w:top w:val="single" w:sz="4" w:space="0" w:color="auto"/>
               <w:left w:val="single" w:sz="4" w:space="0" w:color="auto"/>
@@ -39127,7 +39130,7 @@
         </w:trPr>
         <w:tc>
           <w:tcPr>
-            <w:tcW w:w="4248" w:type="dxa"/>
+            <w:tcW w:w="3813" w:type="dxa"/>
             <w:tcBorders>
               <w:top w:val="single" w:sz="4" w:space="0" w:color="auto"/>
               <w:left w:val="single" w:sz="4" w:space="0" w:color="auto"/>
@@ -39160,7 +39163,7 @@
         </w:tc>
         <w:tc>
           <w:tcPr>
-            <w:tcW w:w="992" w:type="dxa"/>
+            <w:tcW w:w="890" w:type="dxa"/>
             <w:tcBorders>
               <w:top w:val="single" w:sz="4" w:space="0" w:color="auto"/>
               <w:left w:val="single" w:sz="4" w:space="0" w:color="auto"/>
@@ -39181,7 +39184,7 @@
         </w:tc>
         <w:tc>
           <w:tcPr>
-            <w:tcW w:w="1843" w:type="dxa"/>
+            <w:tcW w:w="1654" w:type="dxa"/>
             <w:tcBorders>
               <w:top w:val="single" w:sz="4" w:space="0" w:color="auto"/>
               <w:left w:val="single" w:sz="4" w:space="0" w:color="auto"/>
@@ -39202,7 +39205,7 @@
         </w:tc>
         <w:tc>
           <w:tcPr>
-            <w:tcW w:w="1134" w:type="dxa"/>
+            <w:tcW w:w="1018" w:type="dxa"/>
             <w:tcBorders>
               <w:top w:val="single" w:sz="4" w:space="0" w:color="auto"/>
               <w:left w:val="single" w:sz="4" w:space="0" w:color="auto"/>
@@ -39223,7 +39226,7 @@
         </w:tc>
         <w:tc>
           <w:tcPr>
-            <w:tcW w:w="1559" w:type="dxa"/>
+            <w:tcW w:w="1399" w:type="dxa"/>
             <w:tcBorders>
               <w:top w:val="single" w:sz="4" w:space="0" w:color="auto"/>
               <w:left w:val="single" w:sz="4" w:space="0" w:color="auto"/>
@@ -39252,7 +39255,7 @@
         </w:trPr>
         <w:tc>
           <w:tcPr>
-            <w:tcW w:w="4248" w:type="dxa"/>
+            <w:tcW w:w="3813" w:type="dxa"/>
             <w:tcBorders>
               <w:top w:val="single" w:sz="4" w:space="0" w:color="auto"/>
               <w:left w:val="single" w:sz="4" w:space="0" w:color="auto"/>
@@ -39285,7 +39288,7 @@
         </w:tc>
         <w:tc>
           <w:tcPr>
-            <w:tcW w:w="992" w:type="dxa"/>
+            <w:tcW w:w="890" w:type="dxa"/>
             <w:tcBorders>
               <w:top w:val="single" w:sz="4" w:space="0" w:color="auto"/>
               <w:left w:val="single" w:sz="4" w:space="0" w:color="auto"/>
@@ -39306,7 +39309,7 @@
         </w:tc>
         <w:tc>
           <w:tcPr>
-            <w:tcW w:w="1843" w:type="dxa"/>
+            <w:tcW w:w="1654" w:type="dxa"/>
             <w:tcBorders>
               <w:top w:val="single" w:sz="4" w:space="0" w:color="auto"/>
               <w:left w:val="single" w:sz="4" w:space="0" w:color="auto"/>
@@ -39327,7 +39330,7 @@
         </w:tc>
         <w:tc>
           <w:tcPr>
-            <w:tcW w:w="1134" w:type="dxa"/>
+            <w:tcW w:w="1018" w:type="dxa"/>
             <w:tcBorders>
               <w:top w:val="single" w:sz="4" w:space="0" w:color="auto"/>
               <w:left w:val="single" w:sz="4" w:space="0" w:color="auto"/>
@@ -39348,7 +39351,7 @@
         </w:tc>
         <w:tc>
           <w:tcPr>
-            <w:tcW w:w="1559" w:type="dxa"/>
+            <w:tcW w:w="1399" w:type="dxa"/>
             <w:tcBorders>
               <w:top w:val="single" w:sz="4" w:space="0" w:color="auto"/>
               <w:left w:val="single" w:sz="4" w:space="0" w:color="auto"/>
@@ -39377,7 +39380,7 @@
         </w:trPr>
         <w:tc>
           <w:tcPr>
-            <w:tcW w:w="4248" w:type="dxa"/>
+            <w:tcW w:w="3813" w:type="dxa"/>
             <w:tcBorders>
               <w:top w:val="single" w:sz="4" w:space="0" w:color="auto"/>
               <w:left w:val="single" w:sz="4" w:space="0" w:color="auto"/>
@@ -39405,7 +39408,7 @@
         </w:tc>
         <w:tc>
           <w:tcPr>
-            <w:tcW w:w="992" w:type="dxa"/>
+            <w:tcW w:w="890" w:type="dxa"/>
             <w:tcBorders>
               <w:top w:val="single" w:sz="4" w:space="0" w:color="auto"/>
               <w:left w:val="single" w:sz="4" w:space="0" w:color="auto"/>
@@ -39426,7 +39429,7 @@
         </w:tc>
         <w:tc>
           <w:tcPr>
-            <w:tcW w:w="1843" w:type="dxa"/>
+            <w:tcW w:w="1654" w:type="dxa"/>
             <w:tcBorders>
               <w:top w:val="single" w:sz="4" w:space="0" w:color="auto"/>
               <w:left w:val="single" w:sz="4" w:space="0" w:color="auto"/>
@@ -39447,7 +39450,7 @@
         </w:tc>
         <w:tc>
           <w:tcPr>
-            <w:tcW w:w="1134" w:type="dxa"/>
+            <w:tcW w:w="1018" w:type="dxa"/>
             <w:tcBorders>
               <w:top w:val="single" w:sz="4" w:space="0" w:color="auto"/>
               <w:left w:val="single" w:sz="4" w:space="0" w:color="auto"/>
@@ -39468,7 +39471,7 @@
         </w:tc>
         <w:tc>
           <w:tcPr>
-            <w:tcW w:w="1559" w:type="dxa"/>
+            <w:tcW w:w="1399" w:type="dxa"/>
             <w:tcBorders>
               <w:top w:val="single" w:sz="4" w:space="0" w:color="auto"/>
               <w:left w:val="single" w:sz="4" w:space="0" w:color="auto"/>
@@ -40398,17 +40401,17 @@
       <w:tblPr>
         <w:tblStyle w:val="Grilledutableau"/>
         <w:tblpPr w:leftFromText="141" w:rightFromText="141" w:vertAnchor="text" w:horzAnchor="margin" w:tblpX="-490" w:tblpY="231"/>
-        <w:tblW w:w="9790" w:type="dxa"/>
+        <w:tblW w:w="8788" w:type="dxa"/>
         <w:tblLayout w:type="fixed"/>
         <w:tblLook w:val="04A0" w:firstRow="1" w:lastRow="0" w:firstColumn="1" w:lastColumn="0" w:noHBand="0" w:noVBand="1"/>
       </w:tblPr>
       <w:tblGrid>
-        <w:gridCol w:w="3679"/>
-        <w:gridCol w:w="1276"/>
-        <w:gridCol w:w="1703"/>
-        <w:gridCol w:w="1275"/>
-        <w:gridCol w:w="1843"/>
-        <w:gridCol w:w="14"/>
+        <w:gridCol w:w="3302"/>
+        <w:gridCol w:w="1145"/>
+        <w:gridCol w:w="1529"/>
+        <w:gridCol w:w="1145"/>
+        <w:gridCol w:w="1654"/>
+        <w:gridCol w:w="13"/>
       </w:tblGrid>
       <w:tr ns2:paraId="18412820" ns2:textId="77777777">
         <w:trPr>
@@ -40418,7 +40421,7 @@
         </w:trPr>
         <w:tc>
           <w:tcPr>
-            <w:tcW w:w="3679" w:type="dxa"/>
+            <w:tcW w:w="3302" w:type="dxa"/>
             <w:vMerge w:val="restart"/>
             <w:tcBorders>
               <w:top w:val="single" w:sz="4" w:space="0" w:color="auto"/>
@@ -40465,7 +40468,7 @@
         </w:tc>
         <w:tc>
           <w:tcPr>
-            <w:tcW w:w="6111" w:type="dxa"/>
+            <w:tcW w:w="5486" w:type="dxa"/>
             <w:gridSpan w:val="5"/>
             <w:tcBorders>
               <w:top w:val="single" w:sz="4" w:space="0" w:color="auto"/>
@@ -40502,7 +40505,7 @@
         </w:trPr>
         <w:tc>
           <w:tcPr>
-            <w:tcW w:w="3679" w:type="dxa"/>
+            <w:tcW w:w="3302" w:type="dxa"/>
             <w:vMerge/>
             <w:tcBorders>
               <w:left w:val="single" w:sz="4" w:space="0" w:color="auto"/>
@@ -40524,7 +40527,7 @@
         </w:tc>
         <w:tc>
           <w:tcPr>
-            <w:tcW w:w="2979" w:type="dxa"/>
+            <w:tcW w:w="2674" w:type="dxa"/>
             <w:gridSpan w:val="2"/>
             <w:tcBorders>
               <w:top w:val="single" w:sz="4" w:space="0" w:color="auto"/>
@@ -40552,7 +40555,7 @@
         </w:tc>
         <w:tc>
           <w:tcPr>
-            <w:tcW w:w="3118" w:type="dxa"/>
+            <w:tcW w:w="2799" w:type="dxa"/>
             <w:gridSpan w:val="2"/>
             <w:tcBorders>
               <w:top w:val="single" w:sz="4" w:space="0" w:color="auto"/>
@@ -40589,7 +40592,7 @@
         </w:trPr>
         <w:tc>
           <w:tcPr>
-            <w:tcW w:w="3679" w:type="dxa"/>
+            <w:tcW w:w="3302" w:type="dxa"/>
             <w:vMerge/>
             <w:tcBorders>
               <w:left w:val="single" w:sz="4" w:space="0" w:color="auto"/>
@@ -40612,7 +40615,7 @@
         </w:tc>
         <w:tc>
           <w:tcPr>
-            <w:tcW w:w="1276" w:type="dxa"/>
+            <w:tcW w:w="1145" w:type="dxa"/>
             <w:tcBorders>
               <w:top w:val="single" w:sz="4" w:space="0" w:color="auto"/>
               <w:left w:val="single" w:sz="4" w:space="0" w:color="auto"/>
@@ -40639,7 +40642,7 @@
         </w:tc>
         <w:tc>
           <w:tcPr>
-            <w:tcW w:w="1703" w:type="dxa"/>
+            <w:tcW w:w="1529" w:type="dxa"/>
             <w:tcBorders>
               <w:top w:val="single" w:sz="4" w:space="0" w:color="auto"/>
               <w:left w:val="single" w:sz="4" w:space="0" w:color="auto"/>
@@ -40665,7 +40668,7 @@
         </w:tc>
         <w:tc>
           <w:tcPr>
-            <w:tcW w:w="1275" w:type="dxa"/>
+            <w:tcW w:w="1145" w:type="dxa"/>
             <w:tcBorders>
               <w:top w:val="single" w:sz="4" w:space="0" w:color="auto"/>
               <w:left w:val="single" w:sz="4" w:space="0" w:color="auto"/>
@@ -40692,7 +40695,7 @@
         </w:tc>
         <w:tc>
           <w:tcPr>
-            <w:tcW w:w="1843" w:type="dxa"/>
+            <w:tcW w:w="1654" w:type="dxa"/>
             <w:tcBorders>
               <w:top w:val="single" w:sz="4" w:space="0" w:color="auto"/>
               <w:left w:val="single" w:sz="4" w:space="0" w:color="auto"/>
@@ -40726,7 +40729,7 @@
         </w:trPr>
         <w:tc>
           <w:tcPr>
-            <w:tcW w:w="3679" w:type="dxa"/>
+            <w:tcW w:w="3302" w:type="dxa"/>
             <w:tcBorders>
               <w:top w:val="single" w:sz="4" w:space="0" w:color="auto"/>
               <w:left w:val="single" w:sz="4" w:space="0" w:color="auto"/>
@@ -40759,7 +40762,7 @@
         </w:tc>
         <w:tc>
           <w:tcPr>
-            <w:tcW w:w="1276" w:type="dxa"/>
+            <w:tcW w:w="1145" w:type="dxa"/>
             <w:tcBorders>
               <w:top w:val="single" w:sz="4" w:space="0" w:color="auto"/>
               <w:left w:val="single" w:sz="4" w:space="0" w:color="auto"/>
@@ -40780,7 +40783,7 @@
         </w:tc>
         <w:tc>
           <w:tcPr>
-            <w:tcW w:w="1703" w:type="dxa"/>
+            <w:tcW w:w="1529" w:type="dxa"/>
             <w:tcBorders>
               <w:top w:val="single" w:sz="4" w:space="0" w:color="auto"/>
               <w:left w:val="single" w:sz="4" w:space="0" w:color="auto"/>
@@ -40801,7 +40804,7 @@
         </w:tc>
         <w:tc>
           <w:tcPr>
-            <w:tcW w:w="1275" w:type="dxa"/>
+            <w:tcW w:w="1145" w:type="dxa"/>
             <w:tcBorders>
               <w:top w:val="single" w:sz="4" w:space="0" w:color="auto"/>
               <w:left w:val="single" w:sz="4" w:space="0" w:color="auto"/>
@@ -40822,7 +40825,7 @@
         </w:tc>
         <w:tc>
           <w:tcPr>
-            <w:tcW w:w="1843" w:type="dxa"/>
+            <w:tcW w:w="1654" w:type="dxa"/>
             <w:tcBorders>
               <w:top w:val="single" w:sz="4" w:space="0" w:color="auto"/>
               <w:left w:val="single" w:sz="4" w:space="0" w:color="auto"/>
@@ -40851,7 +40854,7 @@
         </w:trPr>
         <w:tc>
           <w:tcPr>
-            <w:tcW w:w="3679" w:type="dxa"/>
+            <w:tcW w:w="3302" w:type="dxa"/>
             <w:tcBorders>
               <w:top w:val="single" w:sz="4" w:space="0" w:color="auto"/>
               <w:left w:val="single" w:sz="4" w:space="0" w:color="auto"/>
@@ -40900,7 +40903,7 @@
         </w:tc>
         <w:tc>
           <w:tcPr>
-            <w:tcW w:w="1276" w:type="dxa"/>
+            <w:tcW w:w="1145" w:type="dxa"/>
             <w:tcBorders>
               <w:top w:val="single" w:sz="4" w:space="0" w:color="auto"/>
               <w:left w:val="single" w:sz="4" w:space="0" w:color="auto"/>
@@ -40921,7 +40924,7 @@
         </w:tc>
         <w:tc>
           <w:tcPr>
-            <w:tcW w:w="1703" w:type="dxa"/>
+            <w:tcW w:w="1529" w:type="dxa"/>
             <w:tcBorders>
               <w:top w:val="single" w:sz="4" w:space="0" w:color="auto"/>
               <w:left w:val="single" w:sz="4" w:space="0" w:color="auto"/>
@@ -40942,7 +40945,7 @@
         </w:tc>
         <w:tc>
           <w:tcPr>
-            <w:tcW w:w="1275" w:type="dxa"/>
+            <w:tcW w:w="1145" w:type="dxa"/>
             <w:tcBorders>
               <w:top w:val="single" w:sz="4" w:space="0" w:color="auto"/>
               <w:left w:val="single" w:sz="4" w:space="0" w:color="auto"/>
@@ -40963,7 +40966,7 @@
         </w:tc>
         <w:tc>
           <w:tcPr>
-            <w:tcW w:w="1843" w:type="dxa"/>
+            <w:tcW w:w="1654" w:type="dxa"/>
             <w:tcBorders>
               <w:top w:val="single" w:sz="4" w:space="0" w:color="auto"/>
               <w:left w:val="single" w:sz="4" w:space="0" w:color="auto"/>
@@ -40992,7 +40995,7 @@
         </w:trPr>
         <w:tc>
           <w:tcPr>
-            <w:tcW w:w="3679" w:type="dxa"/>
+            <w:tcW w:w="3302" w:type="dxa"/>
             <w:tcBorders>
               <w:top w:val="single" w:sz="4" w:space="0" w:color="auto"/>
               <w:left w:val="single" w:sz="4" w:space="0" w:color="auto"/>
@@ -41033,7 +41036,7 @@
         </w:tc>
         <w:tc>
           <w:tcPr>
-            <w:tcW w:w="1276" w:type="dxa"/>
+            <w:tcW w:w="1145" w:type="dxa"/>
             <w:tcBorders>
               <w:top w:val="single" w:sz="4" w:space="0" w:color="auto"/>
               <w:left w:val="single" w:sz="4" w:space="0" w:color="auto"/>
@@ -41054,7 +41057,7 @@
         </w:tc>
         <w:tc>
           <w:tcPr>
-            <w:tcW w:w="1703" w:type="dxa"/>
+            <w:tcW w:w="1529" w:type="dxa"/>
             <w:tcBorders>
               <w:top w:val="single" w:sz="4" w:space="0" w:color="auto"/>
               <w:left w:val="single" w:sz="4" w:space="0" w:color="auto"/>
@@ -41075,7 +41078,7 @@
         </w:tc>
         <w:tc>
           <w:tcPr>
-            <w:tcW w:w="1275" w:type="dxa"/>
+            <w:tcW w:w="1145" w:type="dxa"/>
             <w:tcBorders>
               <w:top w:val="single" w:sz="4" w:space="0" w:color="auto"/>
               <w:left w:val="single" w:sz="4" w:space="0" w:color="auto"/>
@@ -41096,7 +41099,7 @@
         </w:tc>
         <w:tc>
           <w:tcPr>
-            <w:tcW w:w="1843" w:type="dxa"/>
+            <w:tcW w:w="1654" w:type="dxa"/>
             <w:tcBorders>
               <w:top w:val="single" w:sz="4" w:space="0" w:color="auto"/>
               <w:left w:val="single" w:sz="4" w:space="0" w:color="auto"/>
@@ -46850,13 +46853,13 @@
           <w:lang w:eastAsia="fr-FR"/>
         </w:rPr>
         <w:drawing>
-          <ns3:inline distT="0" distB="0" distL="0" distR="0" ns4:anchorId="45039B84" ns4:editId="0FE15AB8">
-            <ns3:extent cx="5580380" cy="3150938"/>
-            <ns3:effectExtent l="0" t="0" r="0" b="7620"/>
-            <ns3:docPr id="748763123" name="Image 1"/>
-            <ns3:cNvGraphicFramePr>
+          <wp:inline distT="0" distB="0" distL="0" distR="0" ns4:anchorId="45039B84" ns4:editId="0FE15AB8">
+            <wp:extent cx="5580380" cy="3150938"/>
+            <wp:effectExtent l="0" t="0" r="0" b="7620"/>
+            <wp:docPr id="748763123" name="Image 1"/>
+            <wp:cNvGraphicFramePr>
               <ns5:graphicFrameLocks noChangeAspect="1"/>
-            </ns3:cNvGraphicFramePr>
+            </wp:cNvGraphicFramePr>
             <ns5:graphic>
               <ns5:graphicData uri="http://schemas.openxmlformats.org/drawingml/2006/picture">
                 <ns9:pic>
@@ -46882,7 +46885,7 @@
                 </ns9:pic>
               </ns5:graphicData>
             </ns5:graphic>
-          </ns3:inline>
+          </wp:inline>
         </w:drawing>
       </w:r>
     </w:p>

</xml_diff>

<commit_message>
Réparer la structure interne du document Word
</commit_message>
<xml_diff>
--- a/doc.docx
+++ b/doc.docx
@@ -1,6 +1,6 @@
 
 <file path=word/document.xml><?xml version="1.0" encoding="utf-8"?>
-<w:document xmlns:ns1="http://schemas.openxmlformats.org/markup-compatibility/2006" xmlns:ns10="http://schemas.openxmlformats.org/officeDocument/2006/relationships" xmlns:ns11="urn:schemas-microsoft-com:vml" xmlns:ns12="urn:schemas-microsoft-com:office:office" xmlns:ns13="urn:schemas-microsoft-com:office:word" xmlns:ns2="http://schemas.microsoft.com/office/word/2010/wordml" xmlns:ns4="http://schemas.microsoft.com/office/word/2010/wordprocessingDrawing" xmlns:ns5="http://schemas.openxmlformats.org/drawingml/2006/main" xmlns:ns6="http://schemas.microsoft.com/office/word/2010/wordprocessingGroup" xmlns:ns7="http://schemas.microsoft.com/office/word/2010/wordprocessingShape" xmlns:ns8="http://schemas.microsoft.com/office/drawing/2010/main" xmlns:ns9="http://schemas.openxmlformats.org/drawingml/2006/picture" xmlns:w="http://schemas.openxmlformats.org/wordprocessingml/2006/main" xmlns:wp="http://schemas.openxmlformats.org/drawingml/2006/wordprocessingDrawing" ns1:Ignorable="w14 w15 w16se wp14">
+<w:document xmlns:a="http://schemas.openxmlformats.org/drawingml/2006/main" xmlns:mc="http://schemas.openxmlformats.org/markup-compatibility/2006" xmlns:ns11="urn:schemas-microsoft-com:vml" xmlns:ns12="urn:schemas-microsoft-com:office:office" xmlns:ns13="urn:schemas-microsoft-com:office:word" xmlns:ns2="http://schemas.microsoft.com/office/word/2010/wordml" xmlns:ns4="http://schemas.microsoft.com/office/word/2010/wordprocessingDrawing" xmlns:ns6="http://schemas.microsoft.com/office/word/2010/wordprocessingGroup" xmlns:ns7="http://schemas.microsoft.com/office/word/2010/wordprocessingShape" xmlns:ns8="http://schemas.microsoft.com/office/drawing/2010/main" xmlns:pic="http://schemas.openxmlformats.org/drawingml/2006/picture" xmlns:r="http://schemas.openxmlformats.org/officeDocument/2006/relationships" xmlns:w="http://schemas.openxmlformats.org/wordprocessingml/2006/main" xmlns:wp="http://schemas.openxmlformats.org/drawingml/2006/wordprocessingDrawing" mc:Ignorable="w14 w15 w16se wp14">
   <w:body>
     <w:p ns2:paraId="7AB3675A" ns2:textId="77777777">
       <w:pPr>
@@ -36,8 +36,8 @@
           <w:noProof/>
           <w:lang w:eastAsia="fr-FR"/>
         </w:rPr>
-        <ns1:AlternateContent>
-          <ns1:Choice Requires="wpg">
+        <mc:AlternateContent>
+          <mc:Choice Requires="wpg">
             <w:drawing>
               <wp:anchor distT="0" distB="0" distL="114300" distR="114300" simplePos="0" relativeHeight="251648000" behindDoc="1" locked="0" layoutInCell="1" allowOverlap="1" ns4:anchorId="4BAE0E57" ns4:editId="729E2BD9">
                 <wp:simplePos x="0" y="0"/>
@@ -52,229 +52,229 @@
                 <wp:wrapNone/>
                 <wp:docPr id="9" name="Groupe 9"/>
                 <wp:cNvGraphicFramePr/>
-                <ns5:graphic>
-                  <ns5:graphicData uri="http://schemas.microsoft.com/office/word/2010/wordprocessingGroup">
+                <a:graphic>
+                  <a:graphicData uri="http://schemas.microsoft.com/office/word/2010/wordprocessingGroup">
                     <ns6:wgp>
                       <ns6:cNvGrpSpPr/>
                       <ns6:grpSpPr bwMode="auto">
-                        <ns5:xfrm>
-                          <ns5:off x="0" y="0"/>
-                          <ns5:ext cx="2230120" cy="956310"/>
-                          <ns5:chOff x="0" y="0"/>
-                          <ns5:chExt cx="22333" cy="10408"/>
-                        </ns5:xfrm>
+                        <a:xfrm>
+                          <a:off x="0" y="0"/>
+                          <a:ext cx="2230120" cy="956310"/>
+                          <a:chOff x="0" y="0"/>
+                          <a:chExt cx="22333" cy="10408"/>
+                        </a:xfrm>
                       </ns6:grpSpPr>
                       <ns6:grpSp>
                         <ns6:cNvPr id="12" name="Group 5"/>
                         <ns6:cNvGrpSpPr>
-                          <ns5:grpSpLocks/>
+                          <a:grpSpLocks/>
                         </ns6:cNvGrpSpPr>
                         <ns6:grpSpPr bwMode="auto">
-                          <ns5:xfrm flipV="1">
-                            <ns5:off x="7415" y="6065"/>
-                            <ns5:ext cx="12739" cy="788"/>
-                            <ns5:chOff x="7415" y="6065"/>
-                            <ns5:chExt cx="586" cy="50"/>
-                          </ns5:xfrm>
+                          <a:xfrm flipV="1">
+                            <a:off x="7415" y="6065"/>
+                            <a:ext cx="12739" cy="788"/>
+                            <a:chOff x="7415" y="6065"/>
+                            <a:chExt cx="586" cy="50"/>
+                          </a:xfrm>
                         </ns6:grpSpPr>
                         <ns7:wsp>
                           <ns7:cNvPr id="17" name="Rectangle 17"/>
                           <ns7:cNvSpPr>
-                            <ns5:spLocks noChangeArrowheads="1"/>
+                            <a:spLocks noChangeArrowheads="1"/>
                           </ns7:cNvSpPr>
                           <ns7:spPr bwMode="auto">
-                            <ns5:xfrm>
-                              <ns5:off x="7415" y="6086"/>
-                              <ns5:ext cx="210" cy="29"/>
-                            </ns5:xfrm>
-                            <ns5:prstGeom prst="rect">
-                              <ns5:avLst/>
-                            </ns5:prstGeom>
-                            <ns5:solidFill>
-                              <ns5:srgbClr val="00B050"/>
-                            </ns5:solidFill>
-                            <ns5:ln>
-                              <ns5:noFill/>
-                            </ns5:ln>
-                            <ns5:extLst>
-                              <ns5:ext uri="{91240B29-F687-4F45-9708-019B960494DF}">
+                            <a:xfrm>
+                              <a:off x="7415" y="6086"/>
+                              <a:ext cx="210" cy="29"/>
+                            </a:xfrm>
+                            <a:prstGeom prst="rect">
+                              <a:avLst/>
+                            </a:prstGeom>
+                            <a:solidFill>
+                              <a:srgbClr val="00B050"/>
+                            </a:solidFill>
+                            <a:ln>
+                              <a:noFill/>
+                            </a:ln>
+                            <a:extLst>
+                              <a:ext uri="{91240B29-F687-4F45-9708-019B960494DF}">
                                 <ns8:hiddenLine w="9525">
-                                  <ns5:solidFill>
-                                    <ns5:srgbClr val="000000"/>
-                                  </ns5:solidFill>
-                                  <ns5:miter lim="800000"/>
-                                  <ns5:headEnd/>
-                                  <ns5:tailEnd/>
+                                  <a:solidFill>
+                                    <a:srgbClr val="000000"/>
+                                  </a:solidFill>
+                                  <a:miter lim="800000"/>
+                                  <a:headEnd/>
+                                  <a:tailEnd/>
                                 </ns8:hiddenLine>
-                              </ns5:ext>
-                            </ns5:extLst>
+                              </a:ext>
+                            </a:extLst>
                           </ns7:spPr>
                           <ns7:bodyPr rot="0" vert="horz" wrap="square" lIns="36576" tIns="36576" rIns="36576" bIns="36576" anchor="t" anchorCtr="0" upright="1">
-                            <ns5:noAutofit/>
+                            <a:noAutofit/>
                           </ns7:bodyPr>
                         </ns7:wsp>
                         <ns7:wsp>
                           <ns7:cNvPr id="18" name="Rectangle 18"/>
                           <ns7:cNvSpPr>
-                            <ns5:spLocks noChangeArrowheads="1"/>
+                            <a:spLocks noChangeArrowheads="1"/>
                           </ns7:cNvSpPr>
                           <ns7:spPr bwMode="auto">
-                            <ns5:xfrm>
-                              <ns5:off x="7580" y="6086"/>
-                              <ns5:ext cx="211" cy="29"/>
-                            </ns5:xfrm>
-                            <ns5:prstGeom prst="rect">
-                              <ns5:avLst/>
-                            </ns5:prstGeom>
-                            <ns5:solidFill>
-                              <ns5:srgbClr val="FFFF00"/>
-                            </ns5:solidFill>
-                            <ns5:ln>
-                              <ns5:noFill/>
-                            </ns5:ln>
-                            <ns5:extLst>
-                              <ns5:ext uri="{91240B29-F687-4F45-9708-019B960494DF}">
+                            <a:xfrm>
+                              <a:off x="7580" y="6086"/>
+                              <a:ext cx="211" cy="29"/>
+                            </a:xfrm>
+                            <a:prstGeom prst="rect">
+                              <a:avLst/>
+                            </a:prstGeom>
+                            <a:solidFill>
+                              <a:srgbClr val="FFFF00"/>
+                            </a:solidFill>
+                            <a:ln>
+                              <a:noFill/>
+                            </a:ln>
+                            <a:extLst>
+                              <a:ext uri="{91240B29-F687-4F45-9708-019B960494DF}">
                                 <ns8:hiddenLine w="9525">
-                                  <ns5:solidFill>
-                                    <ns5:srgbClr val="000000"/>
-                                  </ns5:solidFill>
-                                  <ns5:miter lim="800000"/>
-                                  <ns5:headEnd/>
-                                  <ns5:tailEnd/>
+                                  <a:solidFill>
+                                    <a:srgbClr val="000000"/>
+                                  </a:solidFill>
+                                  <a:miter lim="800000"/>
+                                  <a:headEnd/>
+                                  <a:tailEnd/>
                                 </ns8:hiddenLine>
-                              </ns5:ext>
-                            </ns5:extLst>
+                              </a:ext>
+                            </a:extLst>
                           </ns7:spPr>
                           <ns7:bodyPr rot="0" vert="horz" wrap="square" lIns="36576" tIns="36576" rIns="36576" bIns="36576" anchor="t" anchorCtr="0" upright="1">
-                            <ns5:noAutofit/>
+                            <a:noAutofit/>
                           </ns7:bodyPr>
                         </ns7:wsp>
                         <ns7:wsp>
                           <ns7:cNvPr id="19" name="Rectangle 19"/>
                           <ns7:cNvSpPr>
-                            <ns5:spLocks noChangeArrowheads="1"/>
+                            <a:spLocks noChangeArrowheads="1"/>
                           </ns7:cNvSpPr>
                           <ns7:spPr bwMode="auto">
-                            <ns5:xfrm>
-                              <ns5:off x="7791" y="6065"/>
-                              <ns5:ext cx="210" cy="29"/>
-                            </ns5:xfrm>
-                            <ns5:prstGeom prst="rect">
-                              <ns5:avLst/>
-                            </ns5:prstGeom>
-                            <ns5:solidFill>
-                              <ns5:srgbClr val="FF0000"/>
-                            </ns5:solidFill>
-                            <ns5:ln>
-                              <ns5:noFill/>
-                            </ns5:ln>
-                            <ns5:extLst>
-                              <ns5:ext uri="{91240B29-F687-4F45-9708-019B960494DF}">
+                            <a:xfrm>
+                              <a:off x="7791" y="6065"/>
+                              <a:ext cx="210" cy="29"/>
+                            </a:xfrm>
+                            <a:prstGeom prst="rect">
+                              <a:avLst/>
+                            </a:prstGeom>
+                            <a:solidFill>
+                              <a:srgbClr val="FF0000"/>
+                            </a:solidFill>
+                            <a:ln>
+                              <a:noFill/>
+                            </a:ln>
+                            <a:extLst>
+                              <a:ext uri="{91240B29-F687-4F45-9708-019B960494DF}">
                                 <ns8:hiddenLine w="9525">
-                                  <ns5:solidFill>
-                                    <ns5:srgbClr val="000000"/>
-                                  </ns5:solidFill>
-                                  <ns5:miter lim="800000"/>
-                                  <ns5:headEnd/>
-                                  <ns5:tailEnd/>
+                                  <a:solidFill>
+                                    <a:srgbClr val="000000"/>
+                                  </a:solidFill>
+                                  <a:miter lim="800000"/>
+                                  <a:headEnd/>
+                                  <a:tailEnd/>
                                 </ns8:hiddenLine>
-                              </ns5:ext>
-                            </ns5:extLst>
+                              </a:ext>
+                            </a:extLst>
                           </ns7:spPr>
                           <ns7:bodyPr rot="0" vert="horz" wrap="square" lIns="36576" tIns="36576" rIns="36576" bIns="36576" anchor="t" anchorCtr="0" upright="1">
-                            <ns5:noAutofit/>
+                            <a:noAutofit/>
                           </ns7:bodyPr>
                         </ns7:wsp>
                       </ns6:grpSp>
                       <ns6:grpSp>
                         <ns6:cNvPr id="13" name="Groupe 13"/>
                         <ns6:cNvGrpSpPr>
-                          <ns5:grpSpLocks/>
+                          <a:grpSpLocks/>
                         </ns6:cNvGrpSpPr>
                         <ns6:grpSpPr bwMode="auto">
-                          <ns5:xfrm>
-                            <ns5:off x="0" y="0"/>
-                            <ns5:ext cx="22333" cy="10408"/>
-                            <ns5:chOff x="0" y="0"/>
-                            <ns5:chExt cx="22333" cy="10408"/>
-                          </ns5:xfrm>
+                          <a:xfrm>
+                            <a:off x="0" y="0"/>
+                            <a:ext cx="22333" cy="10408"/>
+                            <a:chOff x="0" y="0"/>
+                            <a:chExt cx="22333" cy="10408"/>
+                          </a:xfrm>
                         </ns6:grpSpPr>
-                        <ns9:pic>
-                          <ns9:nvPicPr>
-                            <ns9:cNvPr id="14" name="Picture 3"/>
-                            <ns9:cNvPicPr>
-                              <ns5:picLocks noChangeAspect="1"/>
-                            </ns9:cNvPicPr>
-                          </ns9:nvPicPr>
-                          <ns9:blipFill>
-                            <ns5:blip ns10:embed="rId7" cstate="print">
-                              <ns5:extLst>
-                                <ns5:ext uri="{28A0092B-C50C-407E-A947-70E740481C1C}">
+                        <pic:pic>
+                          <pic:nvPicPr>
+                            <pic:cNvPr id="14" name="Picture 3"/>
+                            <pic:cNvPicPr>
+                              <a:picLocks noChangeAspect="1"/>
+                            </pic:cNvPicPr>
+                          </pic:nvPicPr>
+                          <pic:blipFill>
+                            <a:blip r:embed="rId7" cstate="print">
+                              <a:extLst>
+                                <a:ext uri="{28A0092B-C50C-407E-A947-70E740481C1C}">
                                   <ns8:useLocalDpi val="0"/>
-                                </ns5:ext>
-                              </ns5:extLst>
-                            </ns5:blip>
-                            <ns5:srcRect/>
-                            <ns5:stretch>
-                              <ns5:fillRect/>
-                            </ns5:stretch>
-                          </ns9:blipFill>
-                          <ns9:spPr bwMode="auto">
-                            <ns5:xfrm>
-                              <ns5:off x="0" y="0"/>
-                              <ns5:ext cx="6813" cy="6204"/>
-                            </ns5:xfrm>
-                            <ns5:prstGeom prst="rect">
-                              <ns5:avLst/>
-                            </ns5:prstGeom>
-                            <ns5:noFill/>
-                            <ns5:extLst>
-                              <ns5:ext uri="{909E8E84-426E-40DD-AFC4-6F175D3DCCD1}">
+                                </a:ext>
+                              </a:extLst>
+                            </a:blip>
+                            <a:srcRect/>
+                            <a:stretch>
+                              <a:fillRect/>
+                            </a:stretch>
+                          </pic:blipFill>
+                          <pic:spPr bwMode="auto">
+                            <a:xfrm>
+                              <a:off x="0" y="0"/>
+                              <a:ext cx="6813" cy="6204"/>
+                            </a:xfrm>
+                            <a:prstGeom prst="rect">
+                              <a:avLst/>
+                            </a:prstGeom>
+                            <a:noFill/>
+                            <a:extLst>
+                              <a:ext uri="{909E8E84-426E-40DD-AFC4-6F175D3DCCD1}">
                                 <ns8:hiddenFill>
-                                  <ns5:solidFill>
-                                    <ns5:srgbClr val="FFFFFF"/>
-                                  </ns5:solidFill>
+                                  <a:solidFill>
+                                    <a:srgbClr val="FFFFFF"/>
+                                  </a:solidFill>
                                 </ns8:hiddenFill>
-                              </ns5:ext>
-                            </ns5:extLst>
-                          </ns9:spPr>
-                        </ns9:pic>
+                              </a:ext>
+                            </a:extLst>
+                          </pic:spPr>
+                        </pic:pic>
                         <ns7:wsp>
                           <ns7:cNvPr id="15" name="Text Box 4"/>
                           <ns7:cNvSpPr txBox="1">
-                            <ns5:spLocks noChangeArrowheads="1"/>
+                            <a:spLocks noChangeArrowheads="1"/>
                           </ns7:cNvSpPr>
                           <ns7:spPr bwMode="auto">
-                            <ns5:xfrm>
-                              <ns5:off x="6813" y="0"/>
-                              <ns5:ext cx="14207" cy="5702"/>
-                            </ns5:xfrm>
-                            <ns5:prstGeom prst="rect">
-                              <ns5:avLst/>
-                            </ns5:prstGeom>
-                            <ns5:noFill/>
-                            <ns5:ln>
-                              <ns5:noFill/>
-                            </ns5:ln>
-                            <ns5:extLst>
-                              <ns5:ext uri="{909E8E84-426E-40DD-AFC4-6F175D3DCCD1}">
+                            <a:xfrm>
+                              <a:off x="6813" y="0"/>
+                              <a:ext cx="14207" cy="5702"/>
+                            </a:xfrm>
+                            <a:prstGeom prst="rect">
+                              <a:avLst/>
+                            </a:prstGeom>
+                            <a:noFill/>
+                            <a:ln>
+                              <a:noFill/>
+                            </a:ln>
+                            <a:extLst>
+                              <a:ext uri="{909E8E84-426E-40DD-AFC4-6F175D3DCCD1}">
                                 <ns8:hiddenFill>
-                                  <ns5:solidFill>
-                                    <ns5:srgbClr val="FFFFFF"/>
-                                  </ns5:solidFill>
+                                  <a:solidFill>
+                                    <a:srgbClr val="FFFFFF"/>
+                                  </a:solidFill>
                                 </ns8:hiddenFill>
-                              </ns5:ext>
-                              <ns5:ext uri="{91240B29-F687-4F45-9708-019B960494DF}">
+                              </a:ext>
+                              <a:ext uri="{91240B29-F687-4F45-9708-019B960494DF}">
                                 <ns8:hiddenLine w="9525">
-                                  <ns5:solidFill>
-                                    <ns5:srgbClr val="000000"/>
-                                  </ns5:solidFill>
-                                  <ns5:miter lim="800000"/>
-                                  <ns5:headEnd/>
-                                  <ns5:tailEnd/>
+                                  <a:solidFill>
+                                    <a:srgbClr val="000000"/>
+                                  </a:solidFill>
+                                  <a:miter lim="800000"/>
+                                  <a:headEnd/>
+                                  <a:tailEnd/>
                                 </ns8:hiddenLine>
-                              </ns5:ext>
-                            </ns5:extLst>
+                              </a:ext>
+                            </a:extLst>
                           </ns7:spPr>
                           <ns7:txbx>
                             <w:txbxContent>
@@ -311,45 +311,45 @@
                             </w:txbxContent>
                           </ns7:txbx>
                           <ns7:bodyPr rot="0" vert="horz" wrap="square" lIns="36576" tIns="36576" rIns="36576" bIns="36576" anchor="t" anchorCtr="0" upright="1">
-                            <ns5:noAutofit/>
+                            <a:noAutofit/>
                           </ns7:bodyPr>
                         </ns7:wsp>
                         <ns7:wsp>
                           <ns7:cNvPr id="16" name="Text Box 9"/>
                           <ns7:cNvSpPr txBox="1">
-                            <ns5:spLocks noChangeArrowheads="1"/>
+                            <a:spLocks noChangeArrowheads="1"/>
                           </ns7:cNvSpPr>
                           <ns7:spPr bwMode="auto">
-                            <ns5:xfrm>
-                              <ns5:off x="7010" y="8191"/>
-                              <ns5:ext cx="15323" cy="2217"/>
-                            </ns5:xfrm>
-                            <ns5:prstGeom prst="rect">
-                              <ns5:avLst/>
-                            </ns5:prstGeom>
-                            <ns5:noFill/>
-                            <ns5:ln>
-                              <ns5:noFill/>
-                            </ns5:ln>
-                            <ns5:extLst>
-                              <ns5:ext uri="{909E8E84-426E-40DD-AFC4-6F175D3DCCD1}">
+                            <a:xfrm>
+                              <a:off x="7010" y="8191"/>
+                              <a:ext cx="15323" cy="2217"/>
+                            </a:xfrm>
+                            <a:prstGeom prst="rect">
+                              <a:avLst/>
+                            </a:prstGeom>
+                            <a:noFill/>
+                            <a:ln>
+                              <a:noFill/>
+                            </a:ln>
+                            <a:extLst>
+                              <a:ext uri="{909E8E84-426E-40DD-AFC4-6F175D3DCCD1}">
                                 <ns8:hiddenFill>
-                                  <ns5:solidFill>
-                                    <ns5:srgbClr val="FFFFFF"/>
-                                  </ns5:solidFill>
+                                  <a:solidFill>
+                                    <a:srgbClr val="FFFFFF"/>
+                                  </a:solidFill>
                                 </ns8:hiddenFill>
-                              </ns5:ext>
-                              <ns5:ext uri="{91240B29-F687-4F45-9708-019B960494DF}">
+                              </a:ext>
+                              <a:ext uri="{91240B29-F687-4F45-9708-019B960494DF}">
                                 <ns8:hiddenLine w="9525">
-                                  <ns5:solidFill>
-                                    <ns5:srgbClr val="000000"/>
-                                  </ns5:solidFill>
-                                  <ns5:miter lim="800000"/>
-                                  <ns5:headEnd/>
-                                  <ns5:tailEnd/>
+                                  <a:solidFill>
+                                    <a:srgbClr val="000000"/>
+                                  </a:solidFill>
+                                  <a:miter lim="800000"/>
+                                  <a:headEnd/>
+                                  <a:tailEnd/>
                                 </ns8:hiddenLine>
-                              </ns5:ext>
-                            </ns5:extLst>
+                              </a:ext>
+                            </a:extLst>
                           </ns7:spPr>
                           <ns7:txbx>
                             <w:txbxContent>
@@ -364,13 +364,13 @@
                             </w:txbxContent>
                           </ns7:txbx>
                           <ns7:bodyPr rot="0" vert="horz" wrap="square" lIns="36576" tIns="36576" rIns="36576" bIns="36576" anchor="t" anchorCtr="0" upright="1">
-                            <ns5:noAutofit/>
+                            <a:noAutofit/>
                           </ns7:bodyPr>
                         </ns7:wsp>
                       </ns6:grpSp>
                     </ns6:wgp>
-                  </ns5:graphicData>
-                </ns5:graphic>
+                  </a:graphicData>
+                </a:graphic>
                 <ns4:sizeRelH relativeFrom="margin">
                   <ns4:pctWidth>0</ns4:pctWidth>
                 </ns4:sizeRelH>
@@ -379,8 +379,8 @@
                 </ns4:sizeRelV>
               </wp:anchor>
             </w:drawing>
-          </ns1:Choice>
-          <ns1:Fallback>
+          </mc:Choice>
+          <mc:Fallback>
             <w:pict>
               <ns11:group ns2:anchorId="4BAE0E57" id="Groupe 9" ns12:spid="_x0000_s1026" style="position:absolute;left:0;text-align:left;margin-left:-13.2pt;margin-top:16.45pt;width:175.6pt;height:75.3pt;z-index:-251668480;mso-position-horizontal-relative:margin;mso-width-relative:margin;mso-height-relative:margin" coordsize="22333,10408" ns12:gfxdata="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">
                 <ns11:group id="Group 5" ns12:spid="_x0000_s1027" style="position:absolute;left:7415;top:6065;width:12739;height:788;flip:y" coordorigin="7415,6065" coordsize="586,50" ns12:gfxdata="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">
@@ -415,7 +415,7 @@
                     <ns12:lock ns11:ext="edit" aspectratio="t"/>
                   </ns11:shapetype>
                   <ns11:shape id="Picture 3" ns12:spid="_x0000_s1032" type="#_x0000_t75" style="position:absolute;width:6813;height:6204;visibility:visible;mso-wrap-style:square" ns12:gfxdata="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">
-                    <ns11:imagedata ns10:id="rId8" ns12:title=""/>
+                    <ns11:imagedata r:id="rId8" ns12:title=""/>
                   </ns11:shape>
                   <ns11:shapetype id="_x0000_t202" coordsize="21600,21600" ns12:spt="202" path="m,l,21600r21600,l21600,xe">
                     <ns11:stroke joinstyle="miter"/>
@@ -475,8 +475,8 @@
                 <ns13:wrap anchorx="margin"/>
               </ns11:group>
             </w:pict>
-          </ns1:Fallback>
-        </ns1:AlternateContent>
+          </mc:Fallback>
+        </mc:AlternateContent>
       </w:r>
     </w:p>
     <w:p ns2:paraId="0203D800" ns2:textId="77777777">
@@ -495,8 +495,8 @@
           <w:noProof/>
           <w:lang w:eastAsia="fr-FR"/>
         </w:rPr>
-        <ns1:AlternateContent>
-          <ns1:Choice Requires="wps">
+        <mc:AlternateContent>
+          <mc:Choice Requires="wps">
             <w:drawing>
               <wp:anchor distT="0" distB="0" distL="114300" distR="114300" simplePos="0" relativeHeight="251662336" behindDoc="1" locked="0" layoutInCell="1" allowOverlap="1" ns4:anchorId="2C135B1C" ns4:editId="7D9B0B92">
                 <wp:simplePos x="0" y="0"/>
@@ -519,28 +519,28 @@
                 </wp:wrapTight>
                 <wp:docPr id="251250240" name="Zone de texte 251250240"/>
                 <wp:cNvGraphicFramePr>
-                  <ns5:graphicFrameLocks/>
+                  <a:graphicFrameLocks/>
                 </wp:cNvGraphicFramePr>
-                <ns5:graphic>
-                  <ns5:graphicData uri="http://schemas.microsoft.com/office/word/2010/wordprocessingShape">
+                <a:graphic>
+                  <a:graphicData uri="http://schemas.microsoft.com/office/word/2010/wordprocessingShape">
                     <ns7:wsp>
                       <ns7:cNvSpPr txBox="1">
-                        <ns5:spLocks noChangeArrowheads="1"/>
+                        <a:spLocks noChangeArrowheads="1"/>
                       </ns7:cNvSpPr>
                       <ns7:spPr bwMode="auto">
-                        <ns5:xfrm>
-                          <ns5:off x="0" y="0"/>
-                          <ns5:ext cx="2000250" cy="723265"/>
-                        </ns5:xfrm>
-                        <ns5:prstGeom prst="rect">
-                          <ns5:avLst/>
-                        </ns5:prstGeom>
-                        <ns5:solidFill>
-                          <ns5:srgbClr val="FFFFFF"/>
-                        </ns5:solidFill>
-                        <ns5:ln>
-                          <ns5:noFill/>
-                        </ns5:ln>
+                        <a:xfrm>
+                          <a:off x="0" y="0"/>
+                          <a:ext cx="2000250" cy="723265"/>
+                        </a:xfrm>
+                        <a:prstGeom prst="rect">
+                          <a:avLst/>
+                        </a:prstGeom>
+                        <a:solidFill>
+                          <a:srgbClr val="FFFFFF"/>
+                        </a:solidFill>
+                        <a:ln>
+                          <a:noFill/>
+                        </a:ln>
                       </ns7:spPr>
                       <ns7:txbx>
                         <w:txbxContent>
@@ -575,11 +575,11 @@
                         </w:txbxContent>
                       </ns7:txbx>
                       <ns7:bodyPr rot="0" vertOverflow="clip" horzOverflow="clip" vert="horz" wrap="square" lIns="91440" tIns="45720" rIns="91440" bIns="45720" anchor="t" anchorCtr="0" upright="1">
-                        <ns5:noAutofit/>
+                        <a:noAutofit/>
                       </ns7:bodyPr>
                     </ns7:wsp>
-                  </ns5:graphicData>
-                </ns5:graphic>
+                  </a:graphicData>
+                </a:graphic>
                 <ns4:sizeRelH relativeFrom="margin">
                   <ns4:pctWidth>0</ns4:pctWidth>
                 </ns4:sizeRelH>
@@ -588,8 +588,8 @@
                 </ns4:sizeRelV>
               </wp:anchor>
             </w:drawing>
-          </ns1:Choice>
-          <ns1:Fallback>
+          </mc:Choice>
+          <mc:Fallback>
             <w:pict>
               <ns11:shape ns2:anchorId="2C135B1C" id="Zone de texte 251250240" ns12:spid="_x0000_s1035" type="#_x0000_t202" style="position:absolute;left:0;text-align:left;margin-left:182.45pt;margin-top:2.85pt;width:157.5pt;height:56.95pt;z-index:-251654144;visibility:visible;mso-wrap-style:square;mso-width-percent:0;mso-height-percent:0;mso-wrap-distance-left:9pt;mso-wrap-distance-top:0;mso-wrap-distance-right:9pt;mso-wrap-distance-bottom:0;mso-position-horizontal:absolute;mso-position-horizontal-relative:margin;mso-position-vertical:absolute;mso-position-vertical-relative:text;mso-width-percent:0;mso-height-percent:0;mso-width-relative:margin;mso-height-relative:margin;v-text-anchor:top" ns12:gfxdata="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" stroked="f">
                 <ns11:textbox>
@@ -627,8 +627,8 @@
                 <ns13:wrap type="tight" anchorx="margin"/>
               </ns11:shape>
             </w:pict>
-          </ns1:Fallback>
-        </ns1:AlternateContent>
+          </mc:Fallback>
+        </mc:AlternateContent>
       </w:r>
       <w:r>
         <w:rPr>
@@ -658,43 +658,43 @@
             </wp:wrapTight>
             <wp:docPr id="2" name="Image 2"/>
             <wp:cNvGraphicFramePr>
-              <ns5:graphicFrameLocks noChangeAspect="1"/>
+              <a:graphicFrameLocks noChangeAspect="1"/>
             </wp:cNvGraphicFramePr>
-            <ns5:graphic>
-              <ns5:graphicData uri="http://schemas.openxmlformats.org/drawingml/2006/picture">
-                <ns9:pic>
-                  <ns9:nvPicPr>
-                    <ns9:cNvPr id="0" name="Image 5"/>
-                    <ns9:cNvPicPr>
-                      <ns5:picLocks noChangeAspect="1" noChangeArrowheads="1"/>
-                    </ns9:cNvPicPr>
-                  </ns9:nvPicPr>
-                  <ns9:blipFill>
-                    <ns5:blip ns10:embed="rId9">
-                      <ns5:extLst>
-                        <ns5:ext uri="{28A0092B-C50C-407E-A947-70E740481C1C}">
+            <a:graphic>
+              <a:graphicData uri="http://schemas.openxmlformats.org/drawingml/2006/picture">
+                <pic:pic>
+                  <pic:nvPicPr>
+                    <pic:cNvPr id="0" name="Image 5"/>
+                    <pic:cNvPicPr>
+                      <a:picLocks noChangeAspect="1" noChangeArrowheads="1"/>
+                    </pic:cNvPicPr>
+                  </pic:nvPicPr>
+                  <pic:blipFill>
+                    <a:blip r:embed="rId9">
+                      <a:extLst>
+                        <a:ext uri="{28A0092B-C50C-407E-A947-70E740481C1C}">
                           <ns8:useLocalDpi val="0"/>
-                        </ns5:ext>
-                      </ns5:extLst>
-                    </ns5:blip>
-                    <ns5:srcRect/>
-                    <ns5:stretch>
-                      <ns5:fillRect/>
-                    </ns5:stretch>
-                  </ns9:blipFill>
-                  <ns9:spPr bwMode="auto">
-                    <ns5:xfrm>
-                      <ns5:off x="0" y="0"/>
-                      <ns5:ext cx="790575" cy="740410"/>
-                    </ns5:xfrm>
-                    <ns5:prstGeom prst="rect">
-                      <ns5:avLst/>
-                    </ns5:prstGeom>
-                    <ns5:noFill/>
-                  </ns9:spPr>
-                </ns9:pic>
-              </ns5:graphicData>
-            </ns5:graphic>
+                        </a:ext>
+                      </a:extLst>
+                    </a:blip>
+                    <a:srcRect/>
+                    <a:stretch>
+                      <a:fillRect/>
+                    </a:stretch>
+                  </pic:blipFill>
+                  <pic:spPr bwMode="auto">
+                    <a:xfrm>
+                      <a:off x="0" y="0"/>
+                      <a:ext cx="790575" cy="740410"/>
+                    </a:xfrm>
+                    <a:prstGeom prst="rect">
+                      <a:avLst/>
+                    </a:prstGeom>
+                    <a:noFill/>
+                  </pic:spPr>
+                </pic:pic>
+              </a:graphicData>
+            </a:graphic>
             <ns4:sizeRelH relativeFrom="page">
               <ns4:pctWidth>0</ns4:pctWidth>
             </ns4:sizeRelH>
@@ -732,43 +732,43 @@
             </wp:wrapTight>
             <wp:docPr id="1" name="Image 1"/>
             <wp:cNvGraphicFramePr>
-              <ns5:graphicFrameLocks noChangeAspect="1"/>
+              <a:graphicFrameLocks noChangeAspect="1"/>
             </wp:cNvGraphicFramePr>
-            <ns5:graphic>
-              <ns5:graphicData uri="http://schemas.openxmlformats.org/drawingml/2006/picture">
-                <ns9:pic>
-                  <ns9:nvPicPr>
-                    <ns9:cNvPr id="0" name="Image 2"/>
-                    <ns9:cNvPicPr>
-                      <ns5:picLocks noChangeAspect="1" noChangeArrowheads="1"/>
-                    </ns9:cNvPicPr>
-                  </ns9:nvPicPr>
-                  <ns9:blipFill>
-                    <ns5:blip ns10:embed="rId10">
-                      <ns5:extLst>
-                        <ns5:ext uri="{28A0092B-C50C-407E-A947-70E740481C1C}">
+            <a:graphic>
+              <a:graphicData uri="http://schemas.openxmlformats.org/drawingml/2006/picture">
+                <pic:pic>
+                  <pic:nvPicPr>
+                    <pic:cNvPr id="0" name="Image 2"/>
+                    <pic:cNvPicPr>
+                      <a:picLocks noChangeAspect="1" noChangeArrowheads="1"/>
+                    </pic:cNvPicPr>
+                  </pic:nvPicPr>
+                  <pic:blipFill>
+                    <a:blip r:embed="rId10">
+                      <a:extLst>
+                        <a:ext uri="{28A0092B-C50C-407E-A947-70E740481C1C}">
                           <ns8:useLocalDpi val="0"/>
-                        </ns5:ext>
-                      </ns5:extLst>
-                    </ns5:blip>
-                    <ns5:srcRect/>
-                    <ns5:stretch>
-                      <ns5:fillRect/>
-                    </ns5:stretch>
-                  </ns9:blipFill>
-                  <ns9:spPr bwMode="auto">
-                    <ns5:xfrm>
-                      <ns5:off x="0" y="0"/>
-                      <ns5:ext cx="573405" cy="569595"/>
-                    </ns5:xfrm>
-                    <ns5:prstGeom prst="rect">
-                      <ns5:avLst/>
-                    </ns5:prstGeom>
-                    <ns5:noFill/>
-                  </ns9:spPr>
-                </ns9:pic>
-              </ns5:graphicData>
-            </ns5:graphic>
+                        </a:ext>
+                      </a:extLst>
+                    </a:blip>
+                    <a:srcRect/>
+                    <a:stretch>
+                      <a:fillRect/>
+                    </a:stretch>
+                  </pic:blipFill>
+                  <pic:spPr bwMode="auto">
+                    <a:xfrm>
+                      <a:off x="0" y="0"/>
+                      <a:ext cx="573405" cy="569595"/>
+                    </a:xfrm>
+                    <a:prstGeom prst="rect">
+                      <a:avLst/>
+                    </a:prstGeom>
+                    <a:noFill/>
+                  </pic:spPr>
+                </pic:pic>
+              </a:graphicData>
+            </a:graphic>
             <ns4:sizeRelH relativeFrom="page">
               <ns4:pctWidth>0</ns4:pctWidth>
             </ns4:sizeRelH>
@@ -811,8 +811,8 @@
           <w:szCs w:val="26"/>
           <w:lang w:eastAsia="fr-FR"/>
         </w:rPr>
-        <ns1:AlternateContent>
-          <ns1:Choice Requires="wps">
+        <mc:AlternateContent>
+          <mc:Choice Requires="wps">
             <w:drawing>
               <wp:anchor distT="0" distB="0" distL="114300" distR="114300" simplePos="0" relativeHeight="251674624" behindDoc="0" locked="0" layoutInCell="1" allowOverlap="1" ns4:anchorId="06D7241B" ns4:editId="0690C31B">
                 <wp:simplePos x="0" y="0"/>
@@ -827,40 +827,40 @@
                 <wp:wrapNone/>
                 <wp:docPr id="54" name="AutoShape 25"/>
                 <wp:cNvGraphicFramePr>
-                  <ns5:graphicFrameLocks/>
+                  <a:graphicFrameLocks/>
                 </wp:cNvGraphicFramePr>
-                <ns5:graphic>
-                  <ns5:graphicData uri="http://schemas.microsoft.com/office/word/2010/wordprocessingShape">
+                <a:graphic>
+                  <a:graphicData uri="http://schemas.microsoft.com/office/word/2010/wordprocessingShape">
                     <ns7:wsp>
                       <ns7:cNvCnPr>
-                        <ns5:cxnSpLocks noChangeShapeType="1"/>
+                        <a:cxnSpLocks noChangeShapeType="1"/>
                       </ns7:cNvCnPr>
                       <ns7:spPr bwMode="auto">
-                        <ns5:xfrm>
-                          <ns5:off x="0" y="0"/>
-                          <ns5:ext cx="6106160" cy="0"/>
-                        </ns5:xfrm>
-                        <ns5:prstGeom prst="straightConnector1">
-                          <ns5:avLst/>
-                        </ns5:prstGeom>
-                        <ns5:noFill/>
-                        <ns5:ln w="19050">
-                          <ns5:solidFill>
-                            <ns5:srgbClr val="000000"/>
-                          </ns5:solidFill>
-                          <ns5:round/>
-                          <ns5:headEnd type="none" w="med" len="med"/>
-                          <ns5:tailEnd type="none" w="med" len="med"/>
-                        </ns5:ln>
+                        <a:xfrm>
+                          <a:off x="0" y="0"/>
+                          <a:ext cx="6106160" cy="0"/>
+                        </a:xfrm>
+                        <a:prstGeom prst="straightConnector1">
+                          <a:avLst/>
+                        </a:prstGeom>
+                        <a:noFill/>
+                        <a:ln w="19050">
+                          <a:solidFill>
+                            <a:srgbClr val="000000"/>
+                          </a:solidFill>
+                          <a:round/>
+                          <a:headEnd type="none" w="med" len="med"/>
+                          <a:tailEnd type="none" w="med" len="med"/>
+                        </a:ln>
                       </ns7:spPr>
                       <ns7:bodyPr/>
                     </ns7:wsp>
-                  </ns5:graphicData>
-                </ns5:graphic>
+                  </a:graphicData>
+                </a:graphic>
               </wp:anchor>
             </w:drawing>
-          </ns1:Choice>
-          <ns1:Fallback>
+          </mc:Choice>
+          <mc:Fallback>
             <w:pict>
               <ns11:shapetype ns2:anchorId="5C87ADD2" id="_x0000_t32" coordsize="21600,21600" ns12:spt="32" ns12:oned="t" path="m,l21600,21600e" filled="f">
                 <ns11:path arrowok="t" fillok="f" ns12:connecttype="none"/>
@@ -870,8 +870,8 @@
                 <ns13:wrap anchorx="margin"/>
               </ns11:shape>
             </w:pict>
-          </ns1:Fallback>
-        </ns1:AlternateContent>
+          </mc:Fallback>
+        </mc:AlternateContent>
       </w:r>
     </w:p>
     <w:p ns2:paraId="6415ACF9" ns2:textId="77777777">
@@ -1033,8 +1033,8 @@
           <w:noProof/>
           <w:lang w:eastAsia="fr-FR"/>
         </w:rPr>
-        <ns1:AlternateContent>
-          <ns1:Choice Requires="wps">
+        <mc:AlternateContent>
+          <mc:Choice Requires="wps">
             <w:drawing>
               <wp:anchor distT="0" distB="0" distL="114300" distR="114300" simplePos="0" relativeHeight="251664384" behindDoc="0" locked="1" layoutInCell="1" allowOverlap="1" ns4:anchorId="6A9013CB" ns4:editId="34544F81">
                 <wp:simplePos x="0" y="0"/>
@@ -1049,63 +1049,63 @@
                 <wp:wrapNone/>
                 <wp:docPr id="1715820105" name="Rectangle à coins arrondis 1715820105"/>
                 <wp:cNvGraphicFramePr>
-                  <ns5:graphicFrameLocks/>
+                  <a:graphicFrameLocks/>
                 </wp:cNvGraphicFramePr>
-                <ns5:graphic>
-                  <ns5:graphicData uri="http://schemas.microsoft.com/office/word/2010/wordprocessingShape">
+                <a:graphic>
+                  <a:graphicData uri="http://schemas.microsoft.com/office/word/2010/wordprocessingShape">
                     <ns7:wsp>
                       <ns7:cNvSpPr>
-                        <ns5:spLocks/>
+                        <a:spLocks/>
                       </ns7:cNvSpPr>
                       <ns7:spPr>
-                        <ns5:xfrm>
-                          <ns5:off x="0" y="0"/>
-                          <ns5:ext cx="4857750" cy="752475"/>
-                        </ns5:xfrm>
-                        <ns5:prstGeom prst="roundRect">
-                          <ns5:avLst/>
-                        </ns5:prstGeom>
-                        <ns5:gradFill flip="none" rotWithShape="1">
-                          <ns5:gsLst>
-                            <ns5:gs pos="0">
-                              <ns5:schemeClr val="accent1">
-                                <ns5:lumMod val="60000"/>
-                                <ns5:lumOff val="40000"/>
-                                <ns5:tint val="66000"/>
-                                <ns5:satMod val="160000"/>
-                              </ns5:schemeClr>
-                            </ns5:gs>
-                            <ns5:gs pos="50000">
-                              <ns5:schemeClr val="accent1">
-                                <ns5:lumMod val="60000"/>
-                                <ns5:lumOff val="40000"/>
-                                <ns5:tint val="44500"/>
-                                <ns5:satMod val="160000"/>
-                              </ns5:schemeClr>
-                            </ns5:gs>
-                            <ns5:gs pos="100000">
-                              <ns5:schemeClr val="accent1">
-                                <ns5:lumMod val="60000"/>
-                                <ns5:lumOff val="40000"/>
-                                <ns5:tint val="23500"/>
-                                <ns5:satMod val="160000"/>
-                              </ns5:schemeClr>
-                            </ns5:gs>
-                          </ns5:gsLst>
-                          <ns5:lin ang="18900000" scaled="1"/>
-                          <ns5:tileRect/>
-                        </ns5:gradFill>
-                        <ns5:ln w="88900" cap="flat" cmpd="tri" algn="ctr">
-                          <ns5:solidFill>
-                            <ns5:srgbClr val="4472C4">
-                              <ns5:lumMod val="40000"/>
-                              <ns5:lumOff val="60000"/>
-                            </ns5:srgbClr>
-                          </ns5:solidFill>
-                          <ns5:prstDash val="solid"/>
-                          <ns5:miter lim="800000"/>
-                        </ns5:ln>
-                        <ns5:effectLst/>
+                        <a:xfrm>
+                          <a:off x="0" y="0"/>
+                          <a:ext cx="4857750" cy="752475"/>
+                        </a:xfrm>
+                        <a:prstGeom prst="roundRect">
+                          <a:avLst/>
+                        </a:prstGeom>
+                        <a:gradFill flip="none" rotWithShape="1">
+                          <a:gsLst>
+                            <a:gs pos="0">
+                              <a:schemeClr val="accent1">
+                                <a:lumMod val="60000"/>
+                                <a:lumOff val="40000"/>
+                                <a:tint val="66000"/>
+                                <a:satMod val="160000"/>
+                              </a:schemeClr>
+                            </a:gs>
+                            <a:gs pos="50000">
+                              <a:schemeClr val="accent1">
+                                <a:lumMod val="60000"/>
+                                <a:lumOff val="40000"/>
+                                <a:tint val="44500"/>
+                                <a:satMod val="160000"/>
+                              </a:schemeClr>
+                            </a:gs>
+                            <a:gs pos="100000">
+                              <a:schemeClr val="accent1">
+                                <a:lumMod val="60000"/>
+                                <a:lumOff val="40000"/>
+                                <a:tint val="23500"/>
+                                <a:satMod val="160000"/>
+                              </a:schemeClr>
+                            </a:gs>
+                          </a:gsLst>
+                          <a:lin ang="18900000" scaled="1"/>
+                          <a:tileRect/>
+                        </a:gradFill>
+                        <a:ln w="88900" cap="flat" cmpd="tri" algn="ctr">
+                          <a:solidFill>
+                            <a:srgbClr val="4472C4">
+                              <a:lumMod val="40000"/>
+                              <a:lumOff val="60000"/>
+                            </a:srgbClr>
+                          </a:solidFill>
+                          <a:prstDash val="solid"/>
+                          <a:miter lim="800000"/>
+                        </a:ln>
+                        <a:effectLst/>
                       </ns7:spPr>
                       <ns7:txbx>
                         <w:txbxContent>
@@ -1164,14 +1164,14 @@
                         </w:txbxContent>
                       </ns7:txbx>
                       <ns7:bodyPr rot="0" spcFirstLastPara="0" vertOverflow="overflow" horzOverflow="overflow" vert="horz" wrap="square" lIns="91440" tIns="45720" rIns="91440" bIns="45720" numCol="1" spcCol="0" rtlCol="0" fromWordArt="0" anchor="ctr" anchorCtr="0" forceAA="0" compatLnSpc="1">
-                        <ns5:prstTxWarp prst="textNoShape">
-                          <ns5:avLst/>
-                        </ns5:prstTxWarp>
-                        <ns5:noAutofit/>
+                        <a:prstTxWarp prst="textNoShape">
+                          <a:avLst/>
+                        </a:prstTxWarp>
+                        <a:noAutofit/>
                       </ns7:bodyPr>
                     </ns7:wsp>
-                  </ns5:graphicData>
-                </ns5:graphic>
+                  </a:graphicData>
+                </a:graphic>
                 <ns4:sizeRelH relativeFrom="page">
                   <ns4:pctWidth>0</ns4:pctWidth>
                 </ns4:sizeRelH>
@@ -1180,8 +1180,8 @@
                 </ns4:sizeRelV>
               </wp:anchor>
             </w:drawing>
-          </ns1:Choice>
-          <ns1:Fallback>
+          </mc:Choice>
+          <mc:Fallback>
             <w:pict>
               <ns11:roundrect ns2:anchorId="6A9013CB" id="Rectangle à coins arrondis 1715820105" ns12:spid="_x0000_s1036" style="position:absolute;left:0;text-align:left;margin-left:58.9pt;margin-top:23.9pt;width:382.5pt;height:59.25pt;z-index:251664384;visibility:visible;mso-wrap-style:square;mso-width-percent:0;mso-height-percent:0;mso-wrap-distance-left:9pt;mso-wrap-distance-top:0;mso-wrap-distance-right:9pt;mso-wrap-distance-bottom:0;mso-position-horizontal:absolute;mso-position-horizontal-relative:text;mso-position-vertical:absolute;mso-position-vertical-relative:text;mso-width-percent:0;mso-height-percent:0;mso-width-relative:page;mso-height-relative:margin;v-text-anchor:middle" arcsize="10923f" ns12:gfxdata="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" fillcolor="#9cc2e5 [1940]" strokecolor="#b4c7e7" strokeweight="7pt">
                 <ns11:fill color2="#9cc2e5 [1940]" rotate="t" angle="135" colors="0 #b9dafb;.5 #d3e7fc;1 #e9f2fd" focus="100%" type="gradient"/>
@@ -1246,8 +1246,8 @@
                 <ns13:anchorlock/>
               </ns11:roundrect>
             </w:pict>
-          </ns1:Fallback>
-        </ns1:AlternateContent>
+          </mc:Fallback>
+        </mc:AlternateContent>
       </w:r>
       <w:r>
         <w:rPr>
@@ -1371,8 +1371,8 @@
           <w:noProof/>
           <w:lang w:eastAsia="fr-FR"/>
         </w:rPr>
-        <ns1:AlternateContent>
-          <ns1:Choice Requires="wps">
+        <mc:AlternateContent>
+          <mc:Choice Requires="wps">
             <w:drawing>
               <wp:anchor distT="0" distB="0" distL="114300" distR="114300" simplePos="0" relativeHeight="251656192" behindDoc="0" locked="0" layoutInCell="1" allowOverlap="1" ns4:anchorId="217ACBE6" ns4:editId="7EED0DB1">
                 <wp:simplePos x="0" y="0"/>
@@ -1387,26 +1387,26 @@
                 <wp:wrapNone/>
                 <wp:docPr id="32" name="Zone de texte 32"/>
                 <wp:cNvGraphicFramePr/>
-                <ns5:graphic>
-                  <ns5:graphicData uri="http://schemas.microsoft.com/office/word/2010/wordprocessingShape">
+                <a:graphic>
+                  <a:graphicData uri="http://schemas.microsoft.com/office/word/2010/wordprocessingShape">
                     <ns7:wsp>
                       <ns7:cNvSpPr txBox="1"/>
                       <ns7:spPr>
-                        <ns5:xfrm flipV="1">
-                          <ns5:off x="0" y="0"/>
-                          <ns5:ext cx="1619250" cy="142875"/>
-                        </ns5:xfrm>
-                        <ns5:prstGeom prst="rect">
-                          <ns5:avLst/>
-                        </ns5:prstGeom>
-                        <ns5:solidFill>
-                          <ns5:schemeClr val="lt1"/>
-                        </ns5:solidFill>
-                        <ns5:ln w="6350">
-                          <ns5:solidFill>
-                            <ns5:schemeClr val="bg1"/>
-                          </ns5:solidFill>
-                        </ns5:ln>
+                        <a:xfrm flipV="1">
+                          <a:off x="0" y="0"/>
+                          <a:ext cx="1619250" cy="142875"/>
+                        </a:xfrm>
+                        <a:prstGeom prst="rect">
+                          <a:avLst/>
+                        </a:prstGeom>
+                        <a:solidFill>
+                          <a:schemeClr val="lt1"/>
+                        </a:solidFill>
+                        <a:ln w="6350">
+                          <a:solidFill>
+                            <a:schemeClr val="bg1"/>
+                          </a:solidFill>
+                        </a:ln>
                       </ns7:spPr>
                       <ns7:txbx>
                         <w:txbxContent>
@@ -1421,14 +1421,14 @@
                         </w:txbxContent>
                       </ns7:txbx>
                       <ns7:bodyPr rot="0" spcFirstLastPara="0" vertOverflow="overflow" horzOverflow="overflow" vert="horz" wrap="square" lIns="91440" tIns="45720" rIns="91440" bIns="45720" numCol="1" spcCol="0" rtlCol="0" fromWordArt="0" anchor="t" anchorCtr="0" forceAA="0" compatLnSpc="1">
-                        <ns5:prstTxWarp prst="textNoShape">
-                          <ns5:avLst/>
-                        </ns5:prstTxWarp>
-                        <ns5:noAutofit/>
+                        <a:prstTxWarp prst="textNoShape">
+                          <a:avLst/>
+                        </a:prstTxWarp>
+                        <a:noAutofit/>
                       </ns7:bodyPr>
                     </ns7:wsp>
-                  </ns5:graphicData>
-                </ns5:graphic>
+                  </a:graphicData>
+                </a:graphic>
                 <ns4:sizeRelH relativeFrom="margin">
                   <ns4:pctWidth>0</ns4:pctWidth>
                 </ns4:sizeRelH>
@@ -1437,8 +1437,8 @@
                 </ns4:sizeRelV>
               </wp:anchor>
             </w:drawing>
-          </ns1:Choice>
-          <ns1:Fallback>
+          </mc:Choice>
+          <mc:Fallback>
             <w:pict>
               <ns11:shape ns2:anchorId="217ACBE6" id="Zone de texte 32" ns12:spid="_x0000_s1037" type="#_x0000_t202" style="position:absolute;left:0;text-align:left;margin-left:274.9pt;margin-top:19.35pt;width:127.5pt;height:11.25pt;flip:y;z-index:251656192;visibility:visible;mso-wrap-style:square;mso-width-percent:0;mso-height-percent:0;mso-wrap-distance-left:9pt;mso-wrap-distance-top:0;mso-wrap-distance-right:9pt;mso-wrap-distance-bottom:0;mso-position-horizontal:absolute;mso-position-horizontal-relative:margin;mso-position-vertical:absolute;mso-position-vertical-relative:text;mso-width-percent:0;mso-height-percent:0;mso-width-relative:margin;mso-height-relative:margin;v-text-anchor:top" ns12:gfxdata="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" fillcolor="white [3201]" strokecolor="white [3212]" strokeweight=".5pt">
                 <ns11:textbox>
@@ -1456,8 +1456,8 @@
                 <ns13:wrap anchorx="margin"/>
               </ns11:shape>
             </w:pict>
-          </ns1:Fallback>
-        </ns1:AlternateContent>
+          </mc:Fallback>
+        </mc:AlternateContent>
       </w:r>
       <w:r>
         <w:rPr>
@@ -1516,8 +1516,8 @@
           <w:noProof/>
           <w:lang w:eastAsia="fr-FR"/>
         </w:rPr>
-        <ns1:AlternateContent>
-          <ns1:Choice Requires="wps">
+        <mc:AlternateContent>
+          <mc:Choice Requires="wps">
             <w:drawing>
               <wp:anchor distT="0" distB="0" distL="114300" distR="114300" simplePos="0" relativeHeight="251652096" behindDoc="0" locked="0" layoutInCell="1" allowOverlap="1" ns4:anchorId="67334904" ns4:editId="436FF1E3">
                 <wp:simplePos x="0" y="0"/>
@@ -1532,40 +1532,40 @@
                 <wp:wrapNone/>
                 <wp:docPr id="6" name="Rectangle 6"/>
                 <wp:cNvGraphicFramePr>
-                  <ns5:graphicFrameLocks/>
+                  <a:graphicFrameLocks/>
                 </wp:cNvGraphicFramePr>
-                <ns5:graphic>
-                  <ns5:graphicData uri="http://schemas.microsoft.com/office/word/2010/wordprocessingShape">
+                <a:graphic>
+                  <a:graphicData uri="http://schemas.microsoft.com/office/word/2010/wordprocessingShape">
                     <ns7:wsp>
                       <ns7:cNvSpPr>
-                        <ns5:spLocks noChangeArrowheads="1"/>
+                        <a:spLocks noChangeArrowheads="1"/>
                       </ns7:cNvSpPr>
                       <ns7:spPr bwMode="auto">
-                        <ns5:xfrm>
-                          <ns5:off x="0" y="0"/>
-                          <ns5:ext cx="1596189" cy="1171575"/>
-                        </ns5:xfrm>
-                        <ns5:prstGeom prst="rect">
-                          <ns5:avLst/>
-                        </ns5:prstGeom>
-                        <ns5:solidFill>
-                          <ns5:srgbClr val="FFFFFF"/>
-                        </ns5:solidFill>
-                        <ns5:ln>
-                          <ns5:noFill/>
-                        </ns5:ln>
-                        <ns5:extLst>
-                          <ns5:ext uri="{91240B29-F687-4F45-9708-019B960494DF}">
+                        <a:xfrm>
+                          <a:off x="0" y="0"/>
+                          <a:ext cx="1596189" cy="1171575"/>
+                        </a:xfrm>
+                        <a:prstGeom prst="rect">
+                          <a:avLst/>
+                        </a:prstGeom>
+                        <a:solidFill>
+                          <a:srgbClr val="FFFFFF"/>
+                        </a:solidFill>
+                        <a:ln>
+                          <a:noFill/>
+                        </a:ln>
+                        <a:extLst>
+                          <a:ext uri="{91240B29-F687-4F45-9708-019B960494DF}">
                             <ns8:hiddenLine w="9525">
-                              <ns5:solidFill>
-                                <ns5:srgbClr val="000000"/>
-                              </ns5:solidFill>
-                              <ns5:miter lim="800000"/>
-                              <ns5:headEnd/>
-                              <ns5:tailEnd/>
+                              <a:solidFill>
+                                <a:srgbClr val="000000"/>
+                              </a:solidFill>
+                              <a:miter lim="800000"/>
+                              <a:headEnd/>
+                              <a:tailEnd/>
                             </ns8:hiddenLine>
-                          </ns5:ext>
-                        </ns5:extLst>
+                          </a:ext>
+                        </a:extLst>
                       </ns7:spPr>
                       <ns7:txbx>
                         <w:txbxContent>
@@ -1635,11 +1635,11 @@
                         </w:txbxContent>
                       </ns7:txbx>
                       <ns7:bodyPr rot="0" vert="horz" wrap="square" lIns="91440" tIns="45720" rIns="91440" bIns="45720" anchor="t" anchorCtr="0" upright="1">
-                        <ns5:noAutofit/>
+                        <a:noAutofit/>
                       </ns7:bodyPr>
                     </ns7:wsp>
-                  </ns5:graphicData>
-                </ns5:graphic>
+                  </a:graphicData>
+                </a:graphic>
                 <ns4:sizeRelH relativeFrom="page">
                   <ns4:pctWidth>0</ns4:pctWidth>
                 </ns4:sizeRelH>
@@ -1648,8 +1648,8 @@
                 </ns4:sizeRelV>
               </wp:anchor>
             </w:drawing>
-          </ns1:Choice>
-          <ns1:Fallback>
+          </mc:Choice>
+          <mc:Fallback>
             <w:pict>
               <ns11:rect ns2:anchorId="67334904" id="Rectangle 6" ns12:spid="_x0000_s1038" style="position:absolute;left:0;text-align:left;margin-left:377.2pt;margin-top:6.25pt;width:125.7pt;height:92.25pt;z-index:251652096;visibility:visible;mso-wrap-style:square;mso-width-percent:0;mso-height-percent:0;mso-wrap-distance-left:9pt;mso-wrap-distance-top:0;mso-wrap-distance-right:9pt;mso-wrap-distance-bottom:0;mso-position-horizontal:absolute;mso-position-horizontal-relative:text;mso-position-vertical:absolute;mso-position-vertical-relative:text;mso-width-percent:0;mso-height-percent:0;mso-width-relative:page;mso-height-relative:page;v-text-anchor:top" ns12:gfxdata="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" stroked="f">
                 <ns11:textbox>
@@ -1721,8 +1721,8 @@
                 </ns11:textbox>
               </ns11:rect>
             </w:pict>
-          </ns1:Fallback>
-        </ns1:AlternateContent>
+          </mc:Fallback>
+        </mc:AlternateContent>
       </w:r>
       <w:r>
         <w:rPr>
@@ -1730,8 +1730,8 @@
           <w:noProof/>
           <w:lang w:eastAsia="fr-FR"/>
         </w:rPr>
-        <ns1:AlternateContent>
-          <ns1:Choice Requires="wps">
+        <mc:AlternateContent>
+          <mc:Choice Requires="wps">
             <w:drawing>
               <wp:anchor distT="0" distB="0" distL="114300" distR="114300" simplePos="0" relativeHeight="251660288" behindDoc="0" locked="0" layoutInCell="1" allowOverlap="1" ns4:anchorId="4E26EE04" ns4:editId="2B490783">
                 <wp:simplePos x="0" y="0"/>
@@ -1746,26 +1746,26 @@
                 <wp:wrapNone/>
                 <wp:docPr id="11" name="Zone de texte 11"/>
                 <wp:cNvGraphicFramePr/>
-                <ns5:graphic>
-                  <ns5:graphicData uri="http://schemas.microsoft.com/office/word/2010/wordprocessingShape">
+                <a:graphic>
+                  <a:graphicData uri="http://schemas.microsoft.com/office/word/2010/wordprocessingShape">
                     <ns7:wsp>
                       <ns7:cNvSpPr txBox="1"/>
                       <ns7:spPr>
-                        <ns5:xfrm>
-                          <ns5:off x="0" y="0"/>
-                          <ns5:ext cx="2146935" cy="1771650"/>
-                        </ns5:xfrm>
-                        <ns5:prstGeom prst="rect">
-                          <ns5:avLst/>
-                        </ns5:prstGeom>
-                        <ns5:solidFill>
-                          <ns5:schemeClr val="lt1"/>
-                        </ns5:solidFill>
-                        <ns5:ln w="6350">
-                          <ns5:solidFill>
-                            <ns5:schemeClr val="bg1"/>
-                          </ns5:solidFill>
-                        </ns5:ln>
+                        <a:xfrm>
+                          <a:off x="0" y="0"/>
+                          <a:ext cx="2146935" cy="1771650"/>
+                        </a:xfrm>
+                        <a:prstGeom prst="rect">
+                          <a:avLst/>
+                        </a:prstGeom>
+                        <a:solidFill>
+                          <a:schemeClr val="lt1"/>
+                        </a:solidFill>
+                        <a:ln w="6350">
+                          <a:solidFill>
+                            <a:schemeClr val="bg1"/>
+                          </a:solidFill>
+                        </a:ln>
                       </ns7:spPr>
                       <ns7:txbx>
                         <w:txbxContent>
@@ -1893,14 +1893,14 @@
                         </w:txbxContent>
                       </ns7:txbx>
                       <ns7:bodyPr rot="0" spcFirstLastPara="0" vertOverflow="overflow" horzOverflow="overflow" vert="horz" wrap="square" lIns="91440" tIns="45720" rIns="91440" bIns="45720" numCol="1" spcCol="0" rtlCol="0" fromWordArt="0" anchor="t" anchorCtr="0" forceAA="0" compatLnSpc="1">
-                        <ns5:prstTxWarp prst="textNoShape">
-                          <ns5:avLst/>
-                        </ns5:prstTxWarp>
-                        <ns5:noAutofit/>
+                        <a:prstTxWarp prst="textNoShape">
+                          <a:avLst/>
+                        </a:prstTxWarp>
+                        <a:noAutofit/>
                       </ns7:bodyPr>
                     </ns7:wsp>
-                  </ns5:graphicData>
-                </ns5:graphic>
+                  </a:graphicData>
+                </a:graphic>
                 <ns4:sizeRelH relativeFrom="margin">
                   <ns4:pctWidth>0</ns4:pctWidth>
                 </ns4:sizeRelH>
@@ -1909,8 +1909,8 @@
                 </ns4:sizeRelV>
               </wp:anchor>
             </w:drawing>
-          </ns1:Choice>
-          <ns1:Fallback>
+          </mc:Choice>
+          <mc:Fallback>
             <w:pict>
               <ns11:shape ns2:anchorId="4E26EE04" id="Zone de texte 11" ns12:spid="_x0000_s1039" type="#_x0000_t202" style="position:absolute;left:0;text-align:left;margin-left:-17.7pt;margin-top:16.2pt;width:169.05pt;height:139.5pt;z-index:251660288;visibility:visible;mso-wrap-style:square;mso-width-percent:0;mso-height-percent:0;mso-wrap-distance-left:9pt;mso-wrap-distance-top:0;mso-wrap-distance-right:9pt;mso-wrap-distance-bottom:0;mso-position-horizontal:absolute;mso-position-horizontal-relative:margin;mso-position-vertical:absolute;mso-position-vertical-relative:text;mso-width-percent:0;mso-height-percent:0;mso-width-relative:margin;mso-height-relative:margin;v-text-anchor:top" ns12:gfxdata="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" fillcolor="white [3201]" strokecolor="white [3212]" strokeweight=".5pt">
                 <ns11:textbox>
@@ -2041,8 +2041,8 @@
                 <ns13:wrap anchorx="margin"/>
               </ns11:shape>
             </w:pict>
-          </ns1:Fallback>
-        </ns1:AlternateContent>
+          </mc:Fallback>
+        </mc:AlternateContent>
       </w:r>
       <w:r>
         <w:rPr>
@@ -2050,8 +2050,8 @@
           <w:noProof/>
           <w:lang w:eastAsia="fr-FR"/>
         </w:rPr>
-        <ns1:AlternateContent>
-          <ns1:Choice Requires="wps">
+        <mc:AlternateContent>
+          <mc:Choice Requires="wps">
             <w:drawing>
               <wp:anchor distT="0" distB="0" distL="114300" distR="114300" simplePos="0" relativeHeight="251645952" behindDoc="0" locked="0" layoutInCell="1" allowOverlap="1" ns4:anchorId="18BB8649" ns4:editId="6D1B5B49">
                 <wp:simplePos x="0" y="0"/>
@@ -2066,40 +2066,40 @@
                 <wp:wrapNone/>
                 <wp:docPr id="8" name="Zone de texte 8"/>
                 <wp:cNvGraphicFramePr>
-                  <ns5:graphicFrameLocks/>
+                  <a:graphicFrameLocks/>
                 </wp:cNvGraphicFramePr>
-                <ns5:graphic>
-                  <ns5:graphicData uri="http://schemas.microsoft.com/office/word/2010/wordprocessingShape">
+                <a:graphic>
+                  <a:graphicData uri="http://schemas.microsoft.com/office/word/2010/wordprocessingShape">
                     <ns7:wsp>
                       <ns7:cNvSpPr txBox="1">
-                        <ns5:spLocks noChangeArrowheads="1"/>
+                        <a:spLocks noChangeArrowheads="1"/>
                       </ns7:cNvSpPr>
                       <ns7:spPr bwMode="auto">
-                        <ns5:xfrm>
-                          <ns5:off x="0" y="0"/>
-                          <ns5:ext cx="1734820" cy="1228725"/>
-                        </ns5:xfrm>
-                        <ns5:prstGeom prst="rect">
-                          <ns5:avLst/>
-                        </ns5:prstGeom>
-                        <ns5:solidFill>
-                          <ns5:srgbClr val="FFFFFF"/>
-                        </ns5:solidFill>
-                        <ns5:ln>
-                          <ns5:noFill/>
-                        </ns5:ln>
-                        <ns5:extLst>
-                          <ns5:ext uri="{91240B29-F687-4F45-9708-019B960494DF}">
+                        <a:xfrm>
+                          <a:off x="0" y="0"/>
+                          <a:ext cx="1734820" cy="1228725"/>
+                        </a:xfrm>
+                        <a:prstGeom prst="rect">
+                          <a:avLst/>
+                        </a:prstGeom>
+                        <a:solidFill>
+                          <a:srgbClr val="FFFFFF"/>
+                        </a:solidFill>
+                        <a:ln>
+                          <a:noFill/>
+                        </a:ln>
+                        <a:extLst>
+                          <a:ext uri="{91240B29-F687-4F45-9708-019B960494DF}">
                             <ns8:hiddenLine w="9525">
-                              <ns5:solidFill>
-                                <ns5:srgbClr val="000000"/>
-                              </ns5:solidFill>
-                              <ns5:miter lim="800000"/>
-                              <ns5:headEnd/>
-                              <ns5:tailEnd/>
+                              <a:solidFill>
+                                <a:srgbClr val="000000"/>
+                              </a:solidFill>
+                              <a:miter lim="800000"/>
+                              <a:headEnd/>
+                              <a:tailEnd/>
                             </ns8:hiddenLine>
-                          </ns5:ext>
-                        </ns5:extLst>
+                          </a:ext>
+                        </a:extLst>
                       </ns7:spPr>
                       <ns7:txbx>
                         <w:txbxContent>
@@ -2107,11 +2107,11 @@
                         </w:txbxContent>
                       </ns7:txbx>
                       <ns7:bodyPr rot="0" vert="horz" wrap="square" lIns="91440" tIns="45720" rIns="91440" bIns="45720" anchor="t" anchorCtr="0" upright="1">
-                        <ns5:noAutofit/>
+                        <a:noAutofit/>
                       </ns7:bodyPr>
                     </ns7:wsp>
-                  </ns5:graphicData>
-                </ns5:graphic>
+                  </a:graphicData>
+                </a:graphic>
                 <ns4:sizeRelH relativeFrom="page">
                   <ns4:pctWidth>0</ns4:pctWidth>
                 </ns4:sizeRelH>
@@ -2120,8 +2120,8 @@
                 </ns4:sizeRelV>
               </wp:anchor>
             </w:drawing>
-          </ns1:Choice>
-          <ns1:Fallback>
+          </mc:Choice>
+          <mc:Fallback>
             <w:pict>
               <ns11:shape ns2:anchorId="18BB8649" id="Zone de texte 8" ns12:spid="_x0000_s1040" type="#_x0000_t202" style="position:absolute;left:0;text-align:left;margin-left:144.95pt;margin-top:11.95pt;width:136.6pt;height:96.75pt;z-index:251645952;visibility:visible;mso-wrap-style:square;mso-width-percent:0;mso-height-percent:0;mso-wrap-distance-left:9pt;mso-wrap-distance-top:0;mso-wrap-distance-right:9pt;mso-wrap-distance-bottom:0;mso-position-horizontal:absolute;mso-position-horizontal-relative:text;mso-position-vertical:absolute;mso-position-vertical-relative:text;mso-width-percent:0;mso-height-percent:0;mso-width-relative:page;mso-height-relative:page;v-text-anchor:top" ns12:gfxdata="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" stroked="f">
                 <ns11:textbox>
@@ -2131,8 +2131,8 @@
                 </ns11:textbox>
               </ns11:shape>
             </w:pict>
-          </ns1:Fallback>
-        </ns1:AlternateContent>
+          </mc:Fallback>
+        </mc:AlternateContent>
       </w:r>
       <w:r>
         <w:rPr>
@@ -2140,8 +2140,8 @@
           <w:noProof/>
           <w:lang w:eastAsia="fr-FR"/>
         </w:rPr>
-        <ns1:AlternateContent>
-          <ns1:Choice Requires="wps">
+        <mc:AlternateContent>
+          <mc:Choice Requires="wps">
             <w:drawing>
               <wp:anchor distT="0" distB="0" distL="114300" distR="114300" simplePos="0" relativeHeight="251643904" behindDoc="0" locked="0" layoutInCell="1" allowOverlap="1" ns4:anchorId="4D89E546" ns4:editId="3E2D7BAE">
                 <wp:simplePos x="0" y="0"/>
@@ -2156,40 +2156,40 @@
                 <wp:wrapNone/>
                 <wp:docPr id="7" name="Rectangle 7"/>
                 <wp:cNvGraphicFramePr>
-                  <ns5:graphicFrameLocks/>
+                  <a:graphicFrameLocks/>
                 </wp:cNvGraphicFramePr>
-                <ns5:graphic>
-                  <ns5:graphicData uri="http://schemas.microsoft.com/office/word/2010/wordprocessingShape">
+                <a:graphic>
+                  <a:graphicData uri="http://schemas.microsoft.com/office/word/2010/wordprocessingShape">
                     <ns7:wsp>
                       <ns7:cNvSpPr>
-                        <ns5:spLocks noChangeArrowheads="1"/>
+                        <a:spLocks noChangeArrowheads="1"/>
                       </ns7:cNvSpPr>
                       <ns7:spPr bwMode="auto">
-                        <ns5:xfrm>
-                          <ns5:off x="0" y="0"/>
-                          <ns5:ext cx="2099310" cy="1228725"/>
-                        </ns5:xfrm>
-                        <ns5:prstGeom prst="rect">
-                          <ns5:avLst/>
-                        </ns5:prstGeom>
-                        <ns5:solidFill>
-                          <ns5:srgbClr val="FFFFFF"/>
-                        </ns5:solidFill>
-                        <ns5:ln>
-                          <ns5:noFill/>
-                        </ns5:ln>
-                        <ns5:extLst>
-                          <ns5:ext uri="{91240B29-F687-4F45-9708-019B960494DF}">
+                        <a:xfrm>
+                          <a:off x="0" y="0"/>
+                          <a:ext cx="2099310" cy="1228725"/>
+                        </a:xfrm>
+                        <a:prstGeom prst="rect">
+                          <a:avLst/>
+                        </a:prstGeom>
+                        <a:solidFill>
+                          <a:srgbClr val="FFFFFF"/>
+                        </a:solidFill>
+                        <a:ln>
+                          <a:noFill/>
+                        </a:ln>
+                        <a:extLst>
+                          <a:ext uri="{91240B29-F687-4F45-9708-019B960494DF}">
                             <ns8:hiddenLine w="9525">
-                              <ns5:solidFill>
-                                <ns5:srgbClr val="000000"/>
-                              </ns5:solidFill>
-                              <ns5:miter lim="800000"/>
-                              <ns5:headEnd/>
-                              <ns5:tailEnd/>
+                              <a:solidFill>
+                                <a:srgbClr val="000000"/>
+                              </a:solidFill>
+                              <a:miter lim="800000"/>
+                              <a:headEnd/>
+                              <a:tailEnd/>
                             </ns8:hiddenLine>
-                          </ns5:ext>
-                        </ns5:extLst>
+                          </a:ext>
+                        </a:extLst>
                       </ns7:spPr>
                       <ns7:txbx>
                         <w:txbxContent>
@@ -2226,11 +2226,11 @@
                         </w:txbxContent>
                       </ns7:txbx>
                       <ns7:bodyPr rot="0" vert="horz" wrap="square" lIns="91440" tIns="45720" rIns="91440" bIns="45720" anchor="t" anchorCtr="0" upright="1">
-                        <ns5:noAutofit/>
+                        <a:noAutofit/>
                       </ns7:bodyPr>
                     </ns7:wsp>
-                  </ns5:graphicData>
-                </ns5:graphic>
+                  </a:graphicData>
+                </a:graphic>
                 <ns4:sizeRelH relativeFrom="page">
                   <ns4:pctWidth>0</ns4:pctWidth>
                 </ns4:sizeRelH>
@@ -2239,8 +2239,8 @@
                 </ns4:sizeRelV>
               </wp:anchor>
             </w:drawing>
-          </ns1:Choice>
-          <ns1:Fallback>
+          </mc:Choice>
+          <mc:Fallback>
             <w:pict>
               <ns11:rect ns2:anchorId="4D89E546" id="Rectangle 7" ns12:spid="_x0000_s1041" style="position:absolute;left:0;text-align:left;margin-left:-13.5pt;margin-top:11.95pt;width:165.3pt;height:96.75pt;z-index:251643904;visibility:visible;mso-wrap-style:square;mso-width-percent:0;mso-height-percent:0;mso-wrap-distance-left:9pt;mso-wrap-distance-top:0;mso-wrap-distance-right:9pt;mso-wrap-distance-bottom:0;mso-position-horizontal:absolute;mso-position-horizontal-relative:text;mso-position-vertical:absolute;mso-position-vertical-relative:text;mso-width-percent:0;mso-height-percent:0;mso-width-relative:page;mso-height-relative:page;v-text-anchor:top" ns12:gfxdata="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" stroked="f">
                 <ns11:textbox>
@@ -2279,8 +2279,8 @@
                 </ns11:textbox>
               </ns11:rect>
             </w:pict>
-          </ns1:Fallback>
-        </ns1:AlternateContent>
+          </mc:Fallback>
+        </mc:AlternateContent>
       </w:r>
       <w:r>
         <w:rPr>
@@ -2535,8 +2535,8 @@
     <w:p>
       <w:pPr>
         <w:sectPr>
-          <w:headerReference w:type="default" ns10:id="rId17"/>
-          <w:footerReference w:type="default" ns10:id="rId18"/>
+          <w:headerReference w:type="default" r:id="rId17"/>
+          <w:footerReference w:type="default" r:id="rId18"/>
           <w:type w:val="nextPage"/>
           <w:pgSz w:w="11906" w:h="16838"/>
           <w:pgMar w:top="567" w:right="1274" w:bottom="709" w:left="1134" w:header="283" w:footer="680" w:gutter="0"/>
@@ -2669,8 +2669,8 @@
           <w:noProof/>
           <w:lang w:eastAsia="fr-FR"/>
         </w:rPr>
-        <ns1:AlternateContent>
-          <ns1:Choice Requires="wps">
+        <mc:AlternateContent>
+          <mc:Choice Requires="wps">
             <w:drawing>
               <wp:anchor distT="0" distB="0" distL="114300" distR="114300" simplePos="0" relativeHeight="251654144" behindDoc="0" locked="0" layoutInCell="1" allowOverlap="1" ns4:anchorId="71EEA676" ns4:editId="5C963E32">
                 <wp:simplePos x="0" y="0"/>
@@ -2685,33 +2685,33 @@
                 <wp:wrapNone/>
                 <wp:docPr id="21" name="Plaque 21"/>
                 <wp:cNvGraphicFramePr/>
-                <ns5:graphic>
-                  <ns5:graphicData uri="http://schemas.microsoft.com/office/word/2010/wordprocessingShape">
+                <a:graphic>
+                  <a:graphicData uri="http://schemas.microsoft.com/office/word/2010/wordprocessingShape">
                     <ns7:wsp>
                       <ns7:cNvSpPr/>
                       <ns7:spPr>
-                        <ns5:xfrm>
-                          <ns5:off x="0" y="0"/>
-                          <ns5:ext cx="5029200" cy="2838893"/>
-                        </ns5:xfrm>
-                        <ns5:prstGeom prst="bevel">
-                          <ns5:avLst/>
-                        </ns5:prstGeom>
-                        <ns5:ln/>
+                        <a:xfrm>
+                          <a:off x="0" y="0"/>
+                          <a:ext cx="5029200" cy="2838893"/>
+                        </a:xfrm>
+                        <a:prstGeom prst="bevel">
+                          <a:avLst/>
+                        </a:prstGeom>
+                        <a:ln/>
                       </ns7:spPr>
                       <ns7:style>
-                        <ns5:lnRef idx="2">
-                          <ns5:schemeClr val="accent6"/>
-                        </ns5:lnRef>
-                        <ns5:fillRef idx="1">
-                          <ns5:schemeClr val="lt1"/>
-                        </ns5:fillRef>
-                        <ns5:effectRef idx="0">
-                          <ns5:schemeClr val="accent6"/>
-                        </ns5:effectRef>
-                        <ns5:fontRef idx="minor">
-                          <ns5:schemeClr val="dk1"/>
-                        </ns5:fontRef>
+                        <a:lnRef idx="2">
+                          <a:schemeClr val="accent6"/>
+                        </a:lnRef>
+                        <a:fillRef idx="1">
+                          <a:schemeClr val="lt1"/>
+                        </a:fillRef>
+                        <a:effectRef idx="0">
+                          <a:schemeClr val="accent6"/>
+                        </a:effectRef>
+                        <a:fontRef idx="minor">
+                          <a:schemeClr val="dk1"/>
+                        </a:fontRef>
                       </ns7:style>
                       <ns7:txbx>
                         <w:txbxContent>
@@ -2863,14 +2863,14 @@
                         </w:txbxContent>
                       </ns7:txbx>
                       <ns7:bodyPr rot="0" spcFirstLastPara="0" vertOverflow="overflow" horzOverflow="overflow" vert="horz" wrap="square" lIns="91440" tIns="45720" rIns="91440" bIns="45720" numCol="1" spcCol="0" rtlCol="0" fromWordArt="0" anchor="ctr" anchorCtr="0" forceAA="0" compatLnSpc="1">
-                        <ns5:prstTxWarp prst="textNoShape">
-                          <ns5:avLst/>
-                        </ns5:prstTxWarp>
-                        <ns5:noAutofit/>
+                        <a:prstTxWarp prst="textNoShape">
+                          <a:avLst/>
+                        </a:prstTxWarp>
+                        <a:noAutofit/>
                       </ns7:bodyPr>
                     </ns7:wsp>
-                  </ns5:graphicData>
-                </ns5:graphic>
+                  </a:graphicData>
+                </a:graphic>
                 <ns4:sizeRelH relativeFrom="margin">
                   <ns4:pctWidth>0</ns4:pctWidth>
                 </ns4:sizeRelH>
@@ -2879,8 +2879,8 @@
                 </ns4:sizeRelV>
               </wp:anchor>
             </w:drawing>
-          </ns1:Choice>
-          <ns1:Fallback>
+          </mc:Choice>
+          <mc:Fallback>
             <w:pict>
               <ns11:shapetype ns2:anchorId="71EEA676" id="_x0000_t84" coordsize="21600,21600" ns12:spt="84" adj="2700" path="m,l,21600r21600,l21600,xem@0@0nfl@0@2@1@2@1@0xem,nfl@0@0em,21600nfl@0@2em21600,21600nfl@1@2em21600,nfl@1@0e">
                 <ns11:stroke joinstyle="miter"/>
@@ -3053,8 +3053,8 @@
                 </ns11:textbox>
               </ns11:shape>
             </w:pict>
-          </ns1:Fallback>
-        </ns1:AlternateContent>
+          </mc:Fallback>
+        </mc:AlternateContent>
       </w:r>
     </w:p>
     <w:p ns2:paraId="5E7ABCC2" ns2:textId="6B8D2F7E">
@@ -9792,8 +9792,8 @@
           <w:szCs w:val="24"/>
           <w:lang w:eastAsia="fr-FR"/>
         </w:rPr>
-        <ns1:AlternateContent>
-          <ns1:Choice Requires="wps">
+        <mc:AlternateContent>
+          <mc:Choice Requires="wps">
             <w:drawing>
               <wp:anchor distT="0" distB="0" distL="114300" distR="114300" simplePos="0" relativeHeight="251676672" behindDoc="0" locked="0" layoutInCell="1" allowOverlap="1" ns4:anchorId="637AD4DA" ns4:editId="123B3BED">
                 <wp:simplePos x="0" y="0"/>
@@ -9808,48 +9808,48 @@
                 <wp:wrapNone/>
                 <wp:docPr id="3" name="Hexagone 3"/>
                 <wp:cNvGraphicFramePr/>
-                <ns5:graphic>
-                  <ns5:graphicData uri="http://schemas.microsoft.com/office/word/2010/wordprocessingShape">
+                <a:graphic>
+                  <a:graphicData uri="http://schemas.microsoft.com/office/word/2010/wordprocessingShape">
                     <ns7:wsp>
                       <ns7:cNvSpPr/>
                       <ns7:spPr>
-                        <ns5:xfrm>
-                          <ns5:off x="0" y="0"/>
-                          <ns5:ext cx="2800350" cy="737369"/>
-                        </ns5:xfrm>
-                        <ns5:prstGeom prst="hexagon">
-                          <ns5:avLst/>
-                        </ns5:prstGeom>
-                        <ns5:solidFill>
-                          <ns5:schemeClr val="bg2"/>
-                        </ns5:solidFill>
-                        <ns5:ln>
-                          <ns5:solidFill>
-                            <ns5:schemeClr val="tx1">
-                              <ns5:lumMod val="50000"/>
-                              <ns5:lumOff val="50000"/>
-                            </ns5:schemeClr>
-                          </ns5:solidFill>
-                        </ns5:ln>
-                        <ns5:effectLst>
-                          <ns5:innerShdw blurRad="114300">
-                            <ns5:prstClr val="black"/>
-                          </ns5:innerShdw>
-                        </ns5:effectLst>
+                        <a:xfrm>
+                          <a:off x="0" y="0"/>
+                          <a:ext cx="2800350" cy="737369"/>
+                        </a:xfrm>
+                        <a:prstGeom prst="hexagon">
+                          <a:avLst/>
+                        </a:prstGeom>
+                        <a:solidFill>
+                          <a:schemeClr val="bg2"/>
+                        </a:solidFill>
+                        <a:ln>
+                          <a:solidFill>
+                            <a:schemeClr val="tx1">
+                              <a:lumMod val="50000"/>
+                              <a:lumOff val="50000"/>
+                            </a:schemeClr>
+                          </a:solidFill>
+                        </a:ln>
+                        <a:effectLst>
+                          <a:innerShdw blurRad="114300">
+                            <a:prstClr val="black"/>
+                          </a:innerShdw>
+                        </a:effectLst>
                       </ns7:spPr>
                       <ns7:style>
-                        <ns5:lnRef idx="1">
-                          <ns5:schemeClr val="accent5"/>
-                        </ns5:lnRef>
-                        <ns5:fillRef idx="2">
-                          <ns5:schemeClr val="accent5"/>
-                        </ns5:fillRef>
-                        <ns5:effectRef idx="1">
-                          <ns5:schemeClr val="accent5"/>
-                        </ns5:effectRef>
-                        <ns5:fontRef idx="minor">
-                          <ns5:schemeClr val="dk1"/>
-                        </ns5:fontRef>
+                        <a:lnRef idx="1">
+                          <a:schemeClr val="accent5"/>
+                        </a:lnRef>
+                        <a:fillRef idx="2">
+                          <a:schemeClr val="accent5"/>
+                        </a:fillRef>
+                        <a:effectRef idx="1">
+                          <a:schemeClr val="accent5"/>
+                        </a:effectRef>
+                        <a:fontRef idx="minor">
+                          <a:schemeClr val="dk1"/>
+                        </a:fontRef>
                       </ns7:style>
                       <ns7:txbx>
                         <w:txbxContent>
@@ -9899,14 +9899,14 @@
                         </w:txbxContent>
                       </ns7:txbx>
                       <ns7:bodyPr rot="0" spcFirstLastPara="0" vertOverflow="overflow" horzOverflow="overflow" vert="horz" wrap="square" lIns="91440" tIns="45720" rIns="91440" bIns="45720" numCol="1" spcCol="0" rtlCol="0" fromWordArt="0" anchor="ctr" anchorCtr="0" forceAA="0" compatLnSpc="1">
-                        <ns5:prstTxWarp prst="textNoShape">
-                          <ns5:avLst/>
-                        </ns5:prstTxWarp>
-                        <ns5:noAutofit/>
+                        <a:prstTxWarp prst="textNoShape">
+                          <a:avLst/>
+                        </a:prstTxWarp>
+                        <a:noAutofit/>
                       </ns7:bodyPr>
                     </ns7:wsp>
-                  </ns5:graphicData>
-                </ns5:graphic>
+                  </a:graphicData>
+                </a:graphic>
                 <ns4:sizeRelH relativeFrom="margin">
                   <ns4:pctWidth>0</ns4:pctWidth>
                 </ns4:sizeRelH>
@@ -9915,8 +9915,8 @@
                 </ns4:sizeRelV>
               </wp:anchor>
             </w:drawing>
-          </ns1:Choice>
-          <ns1:Fallback>
+          </mc:Choice>
+          <mc:Fallback>
             <w:pict>
               <ns11:shapetype ns2:anchorId="637AD4DA" id="_x0000_t9" coordsize="21600,21600" ns12:spt="9" adj="5400" path="m@0,l,10800@0,21600@1,21600,21600,10800@1,xe">
                 <ns11:stroke joinstyle="miter"/>
@@ -9984,8 +9984,8 @@
                 <ns13:wrap anchorx="page"/>
               </ns11:shape>
             </w:pict>
-          </ns1:Fallback>
-        </ns1:AlternateContent>
+          </mc:Fallback>
+        </mc:AlternateContent>
       </w:r>
     </w:p>
     <w:p ns2:paraId="05BC3192" ns2:textId="7FB65FA4">
@@ -10775,8 +10775,8 @@
           <w:szCs w:val="24"/>
           <w:lang w:eastAsia="fr-FR"/>
         </w:rPr>
-        <ns1:AlternateContent>
-          <ns1:Choice Requires="wps">
+        <mc:AlternateContent>
+          <mc:Choice Requires="wps">
             <w:drawing>
               <wp:anchor distT="0" distB="0" distL="114300" distR="114300" simplePos="0" relativeHeight="251666432" behindDoc="0" locked="0" layoutInCell="1" allowOverlap="1" ns4:anchorId="02512AF6" ns4:editId="2AD0919F">
                 <wp:simplePos x="0" y="0"/>
@@ -10791,48 +10791,48 @@
                 <wp:wrapNone/>
                 <wp:docPr id="4" name="Hexagone 4"/>
                 <wp:cNvGraphicFramePr/>
-                <ns5:graphic>
-                  <ns5:graphicData uri="http://schemas.microsoft.com/office/word/2010/wordprocessingShape">
+                <a:graphic>
+                  <a:graphicData uri="http://schemas.microsoft.com/office/word/2010/wordprocessingShape">
                     <ns7:wsp>
                       <ns7:cNvSpPr/>
                       <ns7:spPr>
-                        <ns5:xfrm>
-                          <ns5:off x="0" y="0"/>
-                          <ns5:ext cx="4954002" cy="2269958"/>
-                        </ns5:xfrm>
-                        <ns5:prstGeom prst="hexagon">
-                          <ns5:avLst/>
-                        </ns5:prstGeom>
-                        <ns5:solidFill>
-                          <ns5:schemeClr val="bg2"/>
-                        </ns5:solidFill>
-                        <ns5:ln>
-                          <ns5:solidFill>
-                            <ns5:schemeClr val="tx1">
-                              <ns5:lumMod val="50000"/>
-                              <ns5:lumOff val="50000"/>
-                            </ns5:schemeClr>
-                          </ns5:solidFill>
-                        </ns5:ln>
-                        <ns5:effectLst>
-                          <ns5:innerShdw blurRad="114300">
-                            <ns5:prstClr val="black"/>
-                          </ns5:innerShdw>
-                        </ns5:effectLst>
+                        <a:xfrm>
+                          <a:off x="0" y="0"/>
+                          <a:ext cx="4954002" cy="2269958"/>
+                        </a:xfrm>
+                        <a:prstGeom prst="hexagon">
+                          <a:avLst/>
+                        </a:prstGeom>
+                        <a:solidFill>
+                          <a:schemeClr val="bg2"/>
+                        </a:solidFill>
+                        <a:ln>
+                          <a:solidFill>
+                            <a:schemeClr val="tx1">
+                              <a:lumMod val="50000"/>
+                              <a:lumOff val="50000"/>
+                            </a:schemeClr>
+                          </a:solidFill>
+                        </a:ln>
+                        <a:effectLst>
+                          <a:innerShdw blurRad="114300">
+                            <a:prstClr val="black"/>
+                          </a:innerShdw>
+                        </a:effectLst>
                       </ns7:spPr>
                       <ns7:style>
-                        <ns5:lnRef idx="1">
-                          <ns5:schemeClr val="accent5"/>
-                        </ns5:lnRef>
-                        <ns5:fillRef idx="2">
-                          <ns5:schemeClr val="accent5"/>
-                        </ns5:fillRef>
-                        <ns5:effectRef idx="1">
-                          <ns5:schemeClr val="accent5"/>
-                        </ns5:effectRef>
-                        <ns5:fontRef idx="minor">
-                          <ns5:schemeClr val="dk1"/>
-                        </ns5:fontRef>
+                        <a:lnRef idx="1">
+                          <a:schemeClr val="accent5"/>
+                        </a:lnRef>
+                        <a:fillRef idx="2">
+                          <a:schemeClr val="accent5"/>
+                        </a:fillRef>
+                        <a:effectRef idx="1">
+                          <a:schemeClr val="accent5"/>
+                        </a:effectRef>
+                        <a:fontRef idx="minor">
+                          <a:schemeClr val="dk1"/>
+                        </a:fontRef>
                       </ns7:style>
                       <ns7:txbx>
                         <w:txbxContent>
@@ -10948,14 +10948,14 @@
                         </w:txbxContent>
                       </ns7:txbx>
                       <ns7:bodyPr rot="0" spcFirstLastPara="0" vertOverflow="overflow" horzOverflow="overflow" vert="horz" wrap="square" lIns="91440" tIns="45720" rIns="91440" bIns="45720" numCol="1" spcCol="0" rtlCol="0" fromWordArt="0" anchor="ctr" anchorCtr="0" forceAA="0" compatLnSpc="1">
-                        <ns5:prstTxWarp prst="textNoShape">
-                          <ns5:avLst/>
-                        </ns5:prstTxWarp>
-                        <ns5:noAutofit/>
+                        <a:prstTxWarp prst="textNoShape">
+                          <a:avLst/>
+                        </a:prstTxWarp>
+                        <a:noAutofit/>
                       </ns7:bodyPr>
                     </ns7:wsp>
-                  </ns5:graphicData>
-                </ns5:graphic>
+                  </a:graphicData>
+                </a:graphic>
                 <ns4:sizeRelH relativeFrom="margin">
                   <ns4:pctWidth>0</ns4:pctWidth>
                 </ns4:sizeRelH>
@@ -10964,8 +10964,8 @@
                 </ns4:sizeRelV>
               </wp:anchor>
             </w:drawing>
-          </ns1:Choice>
-          <ns1:Fallback>
+          </mc:Choice>
+          <mc:Fallback>
             <w:pict>
               <ns11:shape ns2:anchorId="02512AF6" id="Hexagone 4" ns12:spid="_x0000_s1044" type="#_x0000_t9" style="position:absolute;left:0;text-align:left;margin-left:50.25pt;margin-top:112.7pt;width:390.1pt;height:178.75pt;z-index:251666432;visibility:visible;mso-wrap-style:square;mso-width-percent:0;mso-height-percent:0;mso-wrap-distance-left:9pt;mso-wrap-distance-top:0;mso-wrap-distance-right:9pt;mso-wrap-distance-bottom:0;mso-position-horizontal:absolute;mso-position-horizontal-relative:text;mso-position-vertical:absolute;mso-position-vertical-relative:text;mso-width-percent:0;mso-height-percent:0;mso-width-relative:margin;mso-height-relative:margin;v-text-anchor:middle" ns12:gfxdata="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" adj="2474" fillcolor="#e7e6e6 [3214]" strokecolor="gray [1629]" strokeweight=".5pt">
                 <ns11:textbox>
@@ -11083,8 +11083,8 @@
                 </ns11:textbox>
               </ns11:shape>
             </w:pict>
-          </ns1:Fallback>
-        </ns1:AlternateContent>
+          </mc:Fallback>
+        </mc:AlternateContent>
       </w:r>
       <w:r>
         <w:rPr>
@@ -12251,46 +12251,46 @@
             <wp:effectExtent l="0" t="0" r="0" b="0"/>
             <wp:docPr id="678639386" name="Image 1"/>
             <wp:cNvGraphicFramePr>
-              <ns5:graphicFrameLocks noChangeAspect="1"/>
+              <a:graphicFrameLocks noChangeAspect="1"/>
             </wp:cNvGraphicFramePr>
-            <ns5:graphic>
-              <ns5:graphicData uri="http://schemas.openxmlformats.org/drawingml/2006/picture">
-                <ns9:pic>
-                  <ns9:nvPicPr>
-                    <ns9:cNvPr id="0" name="Picture 1"/>
-                    <ns9:cNvPicPr>
-                      <ns5:picLocks noChangeAspect="1" noChangeArrowheads="1"/>
-                    </ns9:cNvPicPr>
-                  </ns9:nvPicPr>
-                  <ns9:blipFill>
-                    <ns5:blip ns10:embed="rId11" cstate="print">
-                      <ns5:extLst>
-                        <ns5:ext uri="{28A0092B-C50C-407E-A947-70E740481C1C}">
+            <a:graphic>
+              <a:graphicData uri="http://schemas.openxmlformats.org/drawingml/2006/picture">
+                <pic:pic>
+                  <pic:nvPicPr>
+                    <pic:cNvPr id="0" name="Picture 1"/>
+                    <pic:cNvPicPr>
+                      <a:picLocks noChangeAspect="1" noChangeArrowheads="1"/>
+                    </pic:cNvPicPr>
+                  </pic:nvPicPr>
+                  <pic:blipFill>
+                    <a:blip r:embed="rId11" cstate="print">
+                      <a:extLst>
+                        <a:ext uri="{28A0092B-C50C-407E-A947-70E740481C1C}">
                           <ns8:useLocalDpi val="0"/>
-                        </ns5:ext>
-                      </ns5:extLst>
-                    </ns5:blip>
-                    <ns5:srcRect/>
-                    <ns5:stretch>
-                      <ns5:fillRect/>
-                    </ns5:stretch>
-                  </ns9:blipFill>
-                  <ns9:spPr bwMode="auto">
-                    <ns5:xfrm>
-                      <ns5:off x="0" y="0"/>
-                      <ns5:ext cx="3429000" cy="2571750"/>
-                    </ns5:xfrm>
-                    <ns5:prstGeom prst="rect">
-                      <ns5:avLst/>
-                    </ns5:prstGeom>
-                    <ns5:noFill/>
-                    <ns5:ln>
-                      <ns5:noFill/>
-                    </ns5:ln>
-                  </ns9:spPr>
-                </ns9:pic>
-              </ns5:graphicData>
-            </ns5:graphic>
+                        </a:ext>
+                      </a:extLst>
+                    </a:blip>
+                    <a:srcRect/>
+                    <a:stretch>
+                      <a:fillRect/>
+                    </a:stretch>
+                  </pic:blipFill>
+                  <pic:spPr bwMode="auto">
+                    <a:xfrm>
+                      <a:off x="0" y="0"/>
+                      <a:ext cx="3429000" cy="2571750"/>
+                    </a:xfrm>
+                    <a:prstGeom prst="rect">
+                      <a:avLst/>
+                    </a:prstGeom>
+                    <a:noFill/>
+                    <a:ln>
+                      <a:noFill/>
+                    </a:ln>
+                  </pic:spPr>
+                </pic:pic>
+              </a:graphicData>
+            </a:graphic>
           </wp:inline>
         </w:drawing>
       </w:r>
@@ -12396,46 +12396,46 @@
             <wp:effectExtent l="0" t="0" r="0" b="4445"/>
             <wp:docPr id="869815646" name="Image 1"/>
             <wp:cNvGraphicFramePr>
-              <ns5:graphicFrameLocks noChangeAspect="1"/>
+              <a:graphicFrameLocks noChangeAspect="1"/>
             </wp:cNvGraphicFramePr>
-            <ns5:graphic>
-              <ns5:graphicData uri="http://schemas.openxmlformats.org/drawingml/2006/picture">
-                <ns9:pic>
-                  <ns9:nvPicPr>
-                    <ns9:cNvPr id="0" name="Picture 1"/>
-                    <ns9:cNvPicPr>
-                      <ns5:picLocks noChangeAspect="1" noChangeArrowheads="1"/>
-                    </ns9:cNvPicPr>
-                  </ns9:nvPicPr>
-                  <ns9:blipFill>
-                    <ns5:blip ns10:embed="rId12" cstate="print">
-                      <ns5:extLst>
-                        <ns5:ext uri="{28A0092B-C50C-407E-A947-70E740481C1C}">
+            <a:graphic>
+              <a:graphicData uri="http://schemas.openxmlformats.org/drawingml/2006/picture">
+                <pic:pic>
+                  <pic:nvPicPr>
+                    <pic:cNvPr id="0" name="Picture 1"/>
+                    <pic:cNvPicPr>
+                      <a:picLocks noChangeAspect="1" noChangeArrowheads="1"/>
+                    </pic:cNvPicPr>
+                  </pic:nvPicPr>
+                  <pic:blipFill>
+                    <a:blip r:embed="rId12" cstate="print">
+                      <a:extLst>
+                        <a:ext uri="{28A0092B-C50C-407E-A947-70E740481C1C}">
                           <ns8:useLocalDpi val="0"/>
-                        </ns5:ext>
-                      </ns5:extLst>
-                    </ns5:blip>
-                    <ns5:srcRect/>
-                    <ns5:stretch>
-                      <ns5:fillRect/>
-                    </ns5:stretch>
-                  </ns9:blipFill>
-                  <ns9:spPr bwMode="auto">
-                    <ns5:xfrm>
-                      <ns5:off x="0" y="0"/>
-                      <ns5:ext cx="3848674" cy="2519132"/>
-                    </ns5:xfrm>
-                    <ns5:prstGeom prst="rect">
-                      <ns5:avLst/>
-                    </ns5:prstGeom>
-                    <ns5:noFill/>
-                    <ns5:ln>
-                      <ns5:noFill/>
-                    </ns5:ln>
-                  </ns9:spPr>
-                </ns9:pic>
-              </ns5:graphicData>
-            </ns5:graphic>
+                        </a:ext>
+                      </a:extLst>
+                    </a:blip>
+                    <a:srcRect/>
+                    <a:stretch>
+                      <a:fillRect/>
+                    </a:stretch>
+                  </pic:blipFill>
+                  <pic:spPr bwMode="auto">
+                    <a:xfrm>
+                      <a:off x="0" y="0"/>
+                      <a:ext cx="3848674" cy="2519132"/>
+                    </a:xfrm>
+                    <a:prstGeom prst="rect">
+                      <a:avLst/>
+                    </a:prstGeom>
+                    <a:noFill/>
+                    <a:ln>
+                      <a:noFill/>
+                    </a:ln>
+                  </pic:spPr>
+                </pic:pic>
+              </a:graphicData>
+            </a:graphic>
           </wp:inline>
         </w:drawing>
       </w:r>
@@ -18600,8 +18600,8 @@
       <w:tblPr>
         <w:tblStyle w:val="Tramemoyenne1"/>
         <w:tblW w:w="8788" w:type="dxa"/>
+        <w:tblLayout w:type="fixed"/>
         <w:tblLook w:val="04A0" w:firstRow="1" w:lastRow="0" w:firstColumn="1" w:lastColumn="0" w:noHBand="0" w:noVBand="1"/>
-        <w:tblLayout w:type="fixed"/>
       </w:tblPr>
       <w:tblGrid>
         <w:gridCol w:w="2378"/>
@@ -18637,8 +18637,8 @@
                 <w:noProof/>
                 <w:lang w:eastAsia="fr-FR"/>
               </w:rPr>
-              <ns1:AlternateContent>
-                <ns1:Choice Requires="wps">
+              <mc:AlternateContent>
+                <mc:Choice Requires="wps">
                   <w:drawing>
                     <wp:anchor distT="0" distB="0" distL="114300" distR="114300" simplePos="0" relativeHeight="251668480" behindDoc="0" locked="0" layoutInCell="1" allowOverlap="1" ns4:anchorId="204D920E" ns4:editId="1530E20F">
                       <wp:simplePos x="0" y="0"/>
@@ -18653,37 +18653,37 @@
                       <wp:wrapNone/>
                       <wp:docPr id="81808272" name="Connecteur droit 81808272"/>
                       <wp:cNvGraphicFramePr/>
-                      <ns5:graphic>
-                        <ns5:graphicData uri="http://schemas.microsoft.com/office/word/2010/wordprocessingShape">
+                      <a:graphic>
+                        <a:graphicData uri="http://schemas.microsoft.com/office/word/2010/wordprocessingShape">
                           <ns7:wsp>
                             <ns7:cNvCnPr/>
                             <ns7:spPr>
-                              <ns5:xfrm>
-                                <ns5:off x="0" y="0"/>
-                                <ns5:ext cx="1682804" cy="530198"/>
-                              </ns5:xfrm>
-                              <ns5:prstGeom prst="line">
-                                <ns5:avLst/>
-                              </ns5:prstGeom>
+                              <a:xfrm>
+                                <a:off x="0" y="0"/>
+                                <a:ext cx="1682804" cy="530198"/>
+                              </a:xfrm>
+                              <a:prstGeom prst="line">
+                                <a:avLst/>
+                              </a:prstGeom>
                             </ns7:spPr>
                             <ns7:style>
-                              <ns5:lnRef idx="1">
-                                <ns5:schemeClr val="accent1"/>
-                              </ns5:lnRef>
-                              <ns5:fillRef idx="0">
-                                <ns5:schemeClr val="accent1"/>
-                              </ns5:fillRef>
-                              <ns5:effectRef idx="0">
-                                <ns5:schemeClr val="accent1"/>
-                              </ns5:effectRef>
-                              <ns5:fontRef idx="minor">
-                                <ns5:schemeClr val="tx1"/>
-                              </ns5:fontRef>
+                              <a:lnRef idx="1">
+                                <a:schemeClr val="accent1"/>
+                              </a:lnRef>
+                              <a:fillRef idx="0">
+                                <a:schemeClr val="accent1"/>
+                              </a:fillRef>
+                              <a:effectRef idx="0">
+                                <a:schemeClr val="accent1"/>
+                              </a:effectRef>
+                              <a:fontRef idx="minor">
+                                <a:schemeClr val="tx1"/>
+                              </a:fontRef>
                             </ns7:style>
                             <ns7:bodyPr/>
                           </ns7:wsp>
-                        </ns5:graphicData>
-                      </ns5:graphic>
+                        </a:graphicData>
+                      </a:graphic>
                       <ns4:sizeRelH relativeFrom="margin">
                         <ns4:pctWidth>0</ns4:pctWidth>
                       </ns4:sizeRelH>
@@ -18692,15 +18692,15 @@
                       </ns4:sizeRelV>
                     </wp:anchor>
                   </w:drawing>
-                </ns1:Choice>
-                <ns1:Fallback>
+                </mc:Choice>
+                <mc:Fallback>
                   <w:pict>
                     <ns11:line ns2:anchorId="466EDA4C" id="Connecteur droit 81808272" ns12:spid="_x0000_s1026" style="position:absolute;z-index:251668480;visibility:visible;mso-wrap-style:square;mso-width-percent:0;mso-height-percent:0;mso-wrap-distance-left:9pt;mso-wrap-distance-top:0;mso-wrap-distance-right:9pt;mso-wrap-distance-bottom:0;mso-position-horizontal:absolute;mso-position-horizontal-relative:text;mso-position-vertical:absolute;mso-position-vertical-relative:text;mso-width-percent:0;mso-height-percent:0;mso-width-relative:margin;mso-height-relative:margin" from="-3.9pt,.5pt" to="128.6pt,42.25pt" ns12:gfxdata="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" strokecolor="#5b9bd5 [3204]" strokeweight=".5pt">
                       <ns11:stroke joinstyle="miter"/>
                     </ns11:line>
                   </w:pict>
-                </ns1:Fallback>
-              </ns1:AlternateContent>
+                </mc:Fallback>
+              </mc:AlternateContent>
             </w:r>
             <w:r>
               <w:rPr/>
@@ -20921,8 +20921,8 @@
           <w:szCs w:val="24"/>
           <w:lang w:eastAsia="fr-FR"/>
         </w:rPr>
-        <ns1:AlternateContent>
-          <ns1:Choice Requires="wps">
+        <mc:AlternateContent>
+          <mc:Choice Requires="wps">
             <w:drawing>
               <wp:anchor distT="0" distB="0" distL="114300" distR="114300" simplePos="0" relativeHeight="251670528" behindDoc="0" locked="0" layoutInCell="1" allowOverlap="1" ns4:anchorId="32DDB414" ns4:editId="2BFBAC07">
                 <wp:simplePos x="0" y="0"/>
@@ -20937,48 +20937,48 @@
                 <wp:wrapNone/>
                 <wp:docPr id="5" name="Hexagone 5"/>
                 <wp:cNvGraphicFramePr/>
-                <ns5:graphic>
-                  <ns5:graphicData uri="http://schemas.microsoft.com/office/word/2010/wordprocessingShape">
+                <a:graphic>
+                  <a:graphicData uri="http://schemas.microsoft.com/office/word/2010/wordprocessingShape">
                     <ns7:wsp>
                       <ns7:cNvSpPr/>
                       <ns7:spPr>
-                        <ns5:xfrm>
-                          <ns5:off x="0" y="0"/>
-                          <ns5:ext cx="4200024" cy="1860884"/>
-                        </ns5:xfrm>
-                        <ns5:prstGeom prst="hexagon">
-                          <ns5:avLst/>
-                        </ns5:prstGeom>
-                        <ns5:solidFill>
-                          <ns5:schemeClr val="bg2"/>
-                        </ns5:solidFill>
-                        <ns5:ln>
-                          <ns5:solidFill>
-                            <ns5:schemeClr val="tx1">
-                              <ns5:lumMod val="50000"/>
-                              <ns5:lumOff val="50000"/>
-                            </ns5:schemeClr>
-                          </ns5:solidFill>
-                        </ns5:ln>
-                        <ns5:effectLst>
-                          <ns5:innerShdw blurRad="114300">
-                            <ns5:prstClr val="black"/>
-                          </ns5:innerShdw>
-                        </ns5:effectLst>
+                        <a:xfrm>
+                          <a:off x="0" y="0"/>
+                          <a:ext cx="4200024" cy="1860884"/>
+                        </a:xfrm>
+                        <a:prstGeom prst="hexagon">
+                          <a:avLst/>
+                        </a:prstGeom>
+                        <a:solidFill>
+                          <a:schemeClr val="bg2"/>
+                        </a:solidFill>
+                        <a:ln>
+                          <a:solidFill>
+                            <a:schemeClr val="tx1">
+                              <a:lumMod val="50000"/>
+                              <a:lumOff val="50000"/>
+                            </a:schemeClr>
+                          </a:solidFill>
+                        </a:ln>
+                        <a:effectLst>
+                          <a:innerShdw blurRad="114300">
+                            <a:prstClr val="black"/>
+                          </a:innerShdw>
+                        </a:effectLst>
                       </ns7:spPr>
                       <ns7:style>
-                        <ns5:lnRef idx="1">
-                          <ns5:schemeClr val="accent5"/>
-                        </ns5:lnRef>
-                        <ns5:fillRef idx="2">
-                          <ns5:schemeClr val="accent5"/>
-                        </ns5:fillRef>
-                        <ns5:effectRef idx="1">
-                          <ns5:schemeClr val="accent5"/>
-                        </ns5:effectRef>
-                        <ns5:fontRef idx="minor">
-                          <ns5:schemeClr val="dk1"/>
-                        </ns5:fontRef>
+                        <a:lnRef idx="1">
+                          <a:schemeClr val="accent5"/>
+                        </a:lnRef>
+                        <a:fillRef idx="2">
+                          <a:schemeClr val="accent5"/>
+                        </a:fillRef>
+                        <a:effectRef idx="1">
+                          <a:schemeClr val="accent5"/>
+                        </a:effectRef>
+                        <a:fontRef idx="minor">
+                          <a:schemeClr val="dk1"/>
+                        </a:fontRef>
                       </ns7:style>
                       <ns7:txbx>
                         <w:txbxContent>
@@ -21094,14 +21094,14 @@
                         </w:txbxContent>
                       </ns7:txbx>
                       <ns7:bodyPr rot="0" spcFirstLastPara="0" vertOverflow="overflow" horzOverflow="overflow" vert="horz" wrap="square" lIns="91440" tIns="45720" rIns="91440" bIns="45720" numCol="1" spcCol="0" rtlCol="0" fromWordArt="0" anchor="ctr" anchorCtr="0" forceAA="0" compatLnSpc="1">
-                        <ns5:prstTxWarp prst="textNoShape">
-                          <ns5:avLst/>
-                        </ns5:prstTxWarp>
-                        <ns5:noAutofit/>
+                        <a:prstTxWarp prst="textNoShape">
+                          <a:avLst/>
+                        </a:prstTxWarp>
+                        <a:noAutofit/>
                       </ns7:bodyPr>
                     </ns7:wsp>
-                  </ns5:graphicData>
-                </ns5:graphic>
+                  </a:graphicData>
+                </a:graphic>
                 <ns4:sizeRelH relativeFrom="margin">
                   <ns4:pctWidth>0</ns4:pctWidth>
                 </ns4:sizeRelH>
@@ -21110,8 +21110,8 @@
                 </ns4:sizeRelV>
               </wp:anchor>
             </w:drawing>
-          </ns1:Choice>
-          <ns1:Fallback>
+          </mc:Choice>
+          <mc:Fallback>
             <w:pict>
               <ns11:shape ns2:anchorId="32DDB414" id="Hexagone 5" ns12:spid="_x0000_s1045" type="#_x0000_t9" style="position:absolute;left:0;text-align:left;margin-left:54.7pt;margin-top:152.75pt;width:330.7pt;height:146.55pt;z-index:251670528;visibility:visible;mso-wrap-style:square;mso-width-percent:0;mso-height-percent:0;mso-wrap-distance-left:9pt;mso-wrap-distance-top:0;mso-wrap-distance-right:9pt;mso-wrap-distance-bottom:0;mso-position-horizontal:absolute;mso-position-horizontal-relative:text;mso-position-vertical:absolute;mso-position-vertical-relative:text;mso-width-percent:0;mso-height-percent:0;mso-width-relative:margin;mso-height-relative:margin;v-text-anchor:middle" ns12:gfxdata="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" adj="2393" fillcolor="#e7e6e6 [3214]" strokecolor="gray [1629]" strokeweight=".5pt">
                 <ns11:textbox>
@@ -21229,8 +21229,8 @@
                 </ns11:textbox>
               </ns11:shape>
             </w:pict>
-          </ns1:Fallback>
-        </ns1:AlternateContent>
+          </mc:Fallback>
+        </mc:AlternateContent>
       </w:r>
       <w:r>
         <w:rPr>
@@ -25645,8 +25645,8 @@
       <w:tblPr>
         <w:tblStyle w:val="Tramemoyenne1"/>
         <w:tblW w:w="8788" w:type="dxa"/>
+        <w:tblLayout w:type="fixed"/>
         <w:tblLook w:val="04A0" w:firstRow="1" w:lastRow="0" w:firstColumn="1" w:lastColumn="0" w:noHBand="0" w:noVBand="1"/>
-        <w:tblLayout w:type="fixed"/>
       </w:tblPr>
       <w:tblGrid>
         <w:gridCol w:w="1505"/>
@@ -26703,8 +26703,8 @@
       <w:tblPr>
         <w:tblStyle w:val="Tramemoyenne1"/>
         <w:tblW w:w="8788" w:type="dxa"/>
+        <w:tblLayout w:type="fixed"/>
         <w:tblLook w:val="04A0" w:firstRow="1" w:lastRow="0" w:firstColumn="1" w:lastColumn="0" w:noHBand="0" w:noVBand="1"/>
-        <w:tblLayout w:type="fixed"/>
       </w:tblPr>
       <w:tblGrid>
         <w:gridCol w:w="2559"/>
@@ -29953,8 +29953,8 @@
           <w:szCs w:val="24"/>
           <w:lang w:eastAsia="fr-FR"/>
         </w:rPr>
-        <ns1:AlternateContent>
-          <ns1:Choice Requires="wps">
+        <mc:AlternateContent>
+          <mc:Choice Requires="wps">
             <w:drawing>
               <wp:anchor distT="0" distB="0" distL="114300" distR="114300" simplePos="0" relativeHeight="251672576" behindDoc="0" locked="0" layoutInCell="1" allowOverlap="1" ns4:anchorId="32B4755B" ns4:editId="01F0F7E8">
                 <wp:simplePos x="0" y="0"/>
@@ -29969,48 +29969,48 @@
                 <wp:wrapNone/>
                 <wp:docPr id="10" name="Hexagone 10"/>
                 <wp:cNvGraphicFramePr/>
-                <ns5:graphic>
-                  <ns5:graphicData uri="http://schemas.microsoft.com/office/word/2010/wordprocessingShape">
+                <a:graphic>
+                  <a:graphicData uri="http://schemas.microsoft.com/office/word/2010/wordprocessingShape">
                     <ns7:wsp>
                       <ns7:cNvSpPr/>
                       <ns7:spPr>
-                        <ns5:xfrm>
-                          <ns5:off x="0" y="0"/>
-                          <ns5:ext cx="5683919" cy="2935706"/>
-                        </ns5:xfrm>
-                        <ns5:prstGeom prst="hexagon">
-                          <ns5:avLst/>
-                        </ns5:prstGeom>
-                        <ns5:solidFill>
-                          <ns5:schemeClr val="bg2"/>
-                        </ns5:solidFill>
-                        <ns5:ln>
-                          <ns5:solidFill>
-                            <ns5:schemeClr val="tx1">
-                              <ns5:lumMod val="50000"/>
-                              <ns5:lumOff val="50000"/>
-                            </ns5:schemeClr>
-                          </ns5:solidFill>
-                        </ns5:ln>
-                        <ns5:effectLst>
-                          <ns5:innerShdw blurRad="114300">
-                            <ns5:prstClr val="black"/>
-                          </ns5:innerShdw>
-                        </ns5:effectLst>
+                        <a:xfrm>
+                          <a:off x="0" y="0"/>
+                          <a:ext cx="5683919" cy="2935706"/>
+                        </a:xfrm>
+                        <a:prstGeom prst="hexagon">
+                          <a:avLst/>
+                        </a:prstGeom>
+                        <a:solidFill>
+                          <a:schemeClr val="bg2"/>
+                        </a:solidFill>
+                        <a:ln>
+                          <a:solidFill>
+                            <a:schemeClr val="tx1">
+                              <a:lumMod val="50000"/>
+                              <a:lumOff val="50000"/>
+                            </a:schemeClr>
+                          </a:solidFill>
+                        </a:ln>
+                        <a:effectLst>
+                          <a:innerShdw blurRad="114300">
+                            <a:prstClr val="black"/>
+                          </a:innerShdw>
+                        </a:effectLst>
                       </ns7:spPr>
                       <ns7:style>
-                        <ns5:lnRef idx="1">
-                          <ns5:schemeClr val="accent5"/>
-                        </ns5:lnRef>
-                        <ns5:fillRef idx="2">
-                          <ns5:schemeClr val="accent5"/>
-                        </ns5:fillRef>
-                        <ns5:effectRef idx="1">
-                          <ns5:schemeClr val="accent5"/>
-                        </ns5:effectRef>
-                        <ns5:fontRef idx="minor">
-                          <ns5:schemeClr val="dk1"/>
-                        </ns5:fontRef>
+                        <a:lnRef idx="1">
+                          <a:schemeClr val="accent5"/>
+                        </a:lnRef>
+                        <a:fillRef idx="2">
+                          <a:schemeClr val="accent5"/>
+                        </a:fillRef>
+                        <a:effectRef idx="1">
+                          <a:schemeClr val="accent5"/>
+                        </a:effectRef>
+                        <a:fontRef idx="minor">
+                          <a:schemeClr val="dk1"/>
+                        </a:fontRef>
                       </ns7:style>
                       <ns7:txbx>
                         <w:txbxContent>
@@ -30134,14 +30134,14 @@
                         </w:txbxContent>
                       </ns7:txbx>
                       <ns7:bodyPr rot="0" spcFirstLastPara="0" vertOverflow="overflow" horzOverflow="overflow" vert="horz" wrap="square" lIns="91440" tIns="45720" rIns="91440" bIns="45720" numCol="1" spcCol="0" rtlCol="0" fromWordArt="0" anchor="ctr" anchorCtr="0" forceAA="0" compatLnSpc="1">
-                        <ns5:prstTxWarp prst="textNoShape">
-                          <ns5:avLst/>
-                        </ns5:prstTxWarp>
-                        <ns5:noAutofit/>
+                        <a:prstTxWarp prst="textNoShape">
+                          <a:avLst/>
+                        </a:prstTxWarp>
+                        <a:noAutofit/>
                       </ns7:bodyPr>
                     </ns7:wsp>
-                  </ns5:graphicData>
-                </ns5:graphic>
+                  </a:graphicData>
+                </a:graphic>
                 <ns4:sizeRelH relativeFrom="margin">
                   <ns4:pctWidth>0</ns4:pctWidth>
                 </ns4:sizeRelH>
@@ -30150,8 +30150,8 @@
                 </ns4:sizeRelV>
               </wp:anchor>
             </w:drawing>
-          </ns1:Choice>
-          <ns1:Fallback>
+          </mc:Choice>
+          <mc:Fallback>
             <w:pict>
               <ns11:shape ns2:anchorId="32B4755B" id="Hexagone 10" ns12:spid="_x0000_s1046" type="#_x0000_t9" style="position:absolute;left:0;text-align:left;margin-left:8.6pt;margin-top:96.55pt;width:447.55pt;height:231.15pt;z-index:251672576;visibility:visible;mso-wrap-style:square;mso-width-percent:0;mso-height-percent:0;mso-wrap-distance-left:9pt;mso-wrap-distance-top:0;mso-wrap-distance-right:9pt;mso-wrap-distance-bottom:0;mso-position-horizontal:absolute;mso-position-horizontal-relative:text;mso-position-vertical:absolute;mso-position-vertical-relative:text;mso-width-percent:0;mso-height-percent:0;mso-width-relative:margin;mso-height-relative:margin;v-text-anchor:middle" ns12:gfxdata="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" adj="2789" fillcolor="#e7e6e6 [3214]" strokecolor="gray [1629]" strokeweight=".5pt">
                 <ns11:textbox>
@@ -30277,8 +30277,8 @@
                 </ns11:textbox>
               </ns11:shape>
             </w:pict>
-          </ns1:Fallback>
-        </ns1:AlternateContent>
+          </mc:Fallback>
+        </mc:AlternateContent>
       </w:r>
       <w:r>
         <w:rPr>
@@ -43131,7 +43131,7 @@
         </w:rPr>
         <w:t xml:space="preserve">Association Nationale des Communes du Bénin (ANCB). </w:t>
       </w:r>
-      <w:hyperlink ns10:id="rId13" w:history="1">
+      <w:hyperlink r:id="rId13" w:history="1">
         <w:r>
           <w:rPr>
             <w:rStyle w:val="Lienhypertexte"/>
@@ -43162,7 +43162,7 @@
         </w:rPr>
         <w:t xml:space="preserve">Ministère de la Décentralisation et de la Gouvernance Locale. </w:t>
       </w:r>
-      <w:hyperlink ns10:id="rId14" w:history="1">
+      <w:hyperlink r:id="rId14" w:history="1">
         <w:r>
           <w:rPr>
             <w:rStyle w:val="Lienhypertexte"/>
@@ -43193,7 +43193,7 @@
         </w:rPr>
         <w:t xml:space="preserve">Portail officiel du Gouvernement du Bénin. </w:t>
       </w:r>
-      <w:hyperlink ns10:id="rId15" w:history="1">
+      <w:hyperlink r:id="rId15" w:history="1">
         <w:r>
           <w:rPr>
             <w:rStyle w:val="Lienhypertexte"/>
@@ -43291,33 +43291,33 @@
             <wp:effectExtent l="0" t="0" r="0" b="7620"/>
             <wp:docPr id="748763123" name="Image 1"/>
             <wp:cNvGraphicFramePr>
-              <ns5:graphicFrameLocks noChangeAspect="1"/>
+              <a:graphicFrameLocks noChangeAspect="1"/>
             </wp:cNvGraphicFramePr>
-            <ns5:graphic>
-              <ns5:graphicData uri="http://schemas.openxmlformats.org/drawingml/2006/picture">
-                <ns9:pic>
-                  <ns9:nvPicPr>
-                    <ns9:cNvPr id="748763123" name=""/>
-                    <ns9:cNvPicPr/>
-                  </ns9:nvPicPr>
-                  <ns9:blipFill>
-                    <ns5:blip ns10:embed="rId16"/>
-                    <ns5:stretch>
-                      <ns5:fillRect/>
-                    </ns5:stretch>
-                  </ns9:blipFill>
-                  <ns9:spPr>
-                    <ns5:xfrm>
-                      <ns5:off x="0" y="0"/>
-                      <ns5:ext cx="5580380" cy="3150938"/>
-                    </ns5:xfrm>
-                    <ns5:prstGeom prst="rect">
-                      <ns5:avLst/>
-                    </ns5:prstGeom>
-                  </ns9:spPr>
-                </ns9:pic>
-              </ns5:graphicData>
-            </ns5:graphic>
+            <a:graphic>
+              <a:graphicData uri="http://schemas.openxmlformats.org/drawingml/2006/picture">
+                <pic:pic>
+                  <pic:nvPicPr>
+                    <pic:cNvPr id="748763123" name=""/>
+                    <pic:cNvPicPr/>
+                  </pic:nvPicPr>
+                  <pic:blipFill>
+                    <a:blip r:embed="rId16"/>
+                    <a:stretch>
+                      <a:fillRect/>
+                    </a:stretch>
+                  </pic:blipFill>
+                  <pic:spPr>
+                    <a:xfrm>
+                      <a:off x="0" y="0"/>
+                      <a:ext cx="5580380" cy="3150938"/>
+                    </a:xfrm>
+                    <a:prstGeom prst="rect">
+                      <a:avLst/>
+                    </a:prstGeom>
+                  </pic:spPr>
+                </pic:pic>
+              </a:graphicData>
+            </a:graphic>
           </wp:inline>
         </w:drawing>
       </w:r>
@@ -44425,8 +44425,8 @@
       </w:pPr>
     </w:p>
     <w:sectPr>
-      <w:headerReference w:type="default" ns10:id="rId17"/>
-      <w:footerReference w:type="default" ns10:id="rId18"/>
+      <w:headerReference w:type="default" r:id="rId17"/>
+      <w:footerReference w:type="default" r:id="rId18"/>
       <w:pgSz w:w="11906" w:h="16838"/>
       <w:pgMar w:top="1417" w:right="1417" w:bottom="1417" w:left="1701" w:header="283" w:footer="680" w:gutter="0"/>
       <w:cols w:space="708"/>

</xml_diff>

<commit_message>
Réparer l’ordre XML des listes Word
</commit_message>
<xml_diff>
--- a/doc.docx
+++ b/doc.docx
@@ -44631,7 +44631,7 @@
 </file>
 
 <file path=word/numbering.xml><?xml version="1.0" encoding="utf-8"?>
-<w:numbering xmlns:ns1="http://schemas.openxmlformats.org/markup-compatibility/2006" xmlns:ns2="http://schemas.microsoft.com/office/word/2012/wordml" xmlns:w="http://schemas.openxmlformats.org/wordprocessingml/2006/main" ns1:Ignorable="w14 w15 w16se wp14">
+<w:numbering xmlns:mc="http://schemas.openxmlformats.org/markup-compatibility/2006" xmlns:ns2="http://schemas.microsoft.com/office/word/2012/wordml" xmlns:w="http://schemas.openxmlformats.org/wordprocessingml/2006/main" mc:Ignorable="w14 w15 w16se wp14">
   <w:abstractNum w:abstractNumId="0" ns2:restartNumberingAfterBreak="0">
     <w:nsid w:val="FFFFFF88"/>
     <w:multiLevelType w:val="singleLevel"/>
@@ -50839,6 +50839,55 @@
       <w:rPr>
         <w:rFonts w:ascii="Wingdings" w:hAnsi="Wingdings" w:hint="default"/>
       </w:rPr>
+    </w:lvl>
+  </w:abstractNum>
+  <w:abstractNum w:abstractNumId="58">
+    <w:nsid w:val="7A2B4C19"/>
+    <w:multiLevelType w:val="multilevel"/>
+    <w:tmpl w:val="7A2B4C19"/>
+    <w:lvl w:ilvl="0">
+      <w:start w:val="1"/>
+      <w:numFmt w:val="decimal"/>
+      <w:pStyle w:val="Titre1"/>
+      <w:suff w:val="space"/>
+      <w:lvlText w:val="%1"/>
+      <w:lvlJc w:val="left"/>
+      <w:pPr>
+        <w:tabs>
+          <w:tab w:val="num" w:pos="720"/>
+        </w:tabs>
+        <w:ind w:left="720" w:hanging="720"/>
+      </w:pPr>
+    </w:lvl>
+    <w:lvl w:ilvl="1">
+      <w:start w:val="1"/>
+      <w:numFmt w:val="decimal"/>
+      <w:lvlRestart w:val="1"/>
+      <w:pStyle w:val="Titre2"/>
+      <w:suff w:val="space"/>
+      <w:lvlText w:val="%1.%2"/>
+      <w:lvlJc w:val="left"/>
+      <w:pPr>
+        <w:tabs>
+          <w:tab w:val="num" w:pos="1440"/>
+        </w:tabs>
+        <w:ind w:left="1440" w:hanging="720"/>
+      </w:pPr>
+    </w:lvl>
+    <w:lvl w:ilvl="2">
+      <w:start w:val="1"/>
+      <w:numFmt w:val="decimal"/>
+      <w:lvlRestart w:val="1"/>
+      <w:pStyle w:val="Titre3"/>
+      <w:suff w:val="space"/>
+      <w:lvlText w:val="%1.%2.%3"/>
+      <w:lvlJc w:val="left"/>
+      <w:pPr>
+        <w:tabs>
+          <w:tab w:val="num" w:pos="2160"/>
+        </w:tabs>
+        <w:ind w:left="2160" w:hanging="720"/>
+      </w:pPr>
     </w:lvl>
   </w:abstractNum>
   <w:num w:numId="1">
@@ -51126,59 +51175,10 @@
   <w:num w:numId="58">
     <w:abstractNumId w:val="15"/>
   </w:num>
-  <w:numIdMacAtCleanup w:val="58"/>
-  <w:abstractNum w:abstractNumId="58">
-    <w:nsid w:val="7A2B4C19"/>
-    <w:multiLevelType w:val="multilevel"/>
-    <w:tmpl w:val="7A2B4C19"/>
-    <w:lvl w:ilvl="0">
-      <w:start w:val="1"/>
-      <w:numFmt w:val="decimal"/>
-      <w:pStyle w:val="Titre1"/>
-      <w:suff w:val="space"/>
-      <w:lvlText w:val="%1"/>
-      <w:lvlJc w:val="left"/>
-      <w:pPr>
-        <w:tabs>
-          <w:tab w:val="num" w:pos="720"/>
-        </w:tabs>
-        <w:ind w:left="720" w:hanging="720"/>
-      </w:pPr>
-    </w:lvl>
-    <w:lvl w:ilvl="1">
-      <w:start w:val="1"/>
-      <w:numFmt w:val="decimal"/>
-      <w:lvlRestart w:val="1"/>
-      <w:pStyle w:val="Titre2"/>
-      <w:suff w:val="space"/>
-      <w:lvlText w:val="%1.%2"/>
-      <w:lvlJc w:val="left"/>
-      <w:pPr>
-        <w:tabs>
-          <w:tab w:val="num" w:pos="1440"/>
-        </w:tabs>
-        <w:ind w:left="1440" w:hanging="720"/>
-      </w:pPr>
-    </w:lvl>
-    <w:lvl w:ilvl="2">
-      <w:start w:val="1"/>
-      <w:numFmt w:val="decimal"/>
-      <w:lvlRestart w:val="1"/>
-      <w:pStyle w:val="Titre3"/>
-      <w:suff w:val="space"/>
-      <w:lvlText w:val="%1.%2.%3"/>
-      <w:lvlJc w:val="left"/>
-      <w:pPr>
-        <w:tabs>
-          <w:tab w:val="num" w:pos="2160"/>
-        </w:tabs>
-        <w:ind w:left="2160" w:hanging="720"/>
-      </w:pPr>
-    </w:lvl>
-  </w:abstractNum>
   <w:num w:numId="59">
     <w:abstractNumId w:val="58"/>
   </w:num>
+  <w:numIdMacAtCleanup w:val="58"/>
 </w:numbering>
 </file>
 

</xml_diff>

<commit_message>
Nettoyer les extensions XML des listes Word
</commit_message>
<xml_diff>
--- a/doc.docx
+++ b/doc.docx
@@ -44631,8 +44631,8 @@
 </file>
 
 <file path=word/numbering.xml><?xml version="1.0" encoding="utf-8"?>
-<w:numbering xmlns:mc="http://schemas.openxmlformats.org/markup-compatibility/2006" xmlns:ns2="http://schemas.microsoft.com/office/word/2012/wordml" xmlns:w="http://schemas.openxmlformats.org/wordprocessingml/2006/main" mc:Ignorable="w14 w15 w16se wp14">
-  <w:abstractNum w:abstractNumId="0" ns2:restartNumberingAfterBreak="0">
+<w:numbering xmlns:w="http://schemas.openxmlformats.org/wordprocessingml/2006/main">
+  <w:abstractNum w:abstractNumId="0">
     <w:nsid w:val="FFFFFF88"/>
     <w:multiLevelType w:val="singleLevel"/>
     <w:tmpl w:val="070CA2A8"/>
@@ -44650,7 +44650,7 @@
       </w:pPr>
     </w:lvl>
   </w:abstractNum>
-  <w:abstractNum w:abstractNumId="1" ns2:restartNumberingAfterBreak="0">
+  <w:abstractNum w:abstractNumId="1">
     <w:nsid w:val="FFFFFF89"/>
     <w:multiLevelType w:val="singleLevel"/>
     <w:tmpl w:val="3F8C46D6"/>
@@ -44671,7 +44671,7 @@
       </w:rPr>
     </w:lvl>
   </w:abstractNum>
-  <w:abstractNum w:abstractNumId="2" ns2:restartNumberingAfterBreak="0">
+  <w:abstractNum w:abstractNumId="2">
     <w:nsid w:val="01264A54"/>
     <w:multiLevelType w:val="hybridMultilevel"/>
     <w:tmpl w:val="1C4033FA"/>
@@ -44761,7 +44761,7 @@
       </w:pPr>
     </w:lvl>
   </w:abstractNum>
-  <w:abstractNum w:abstractNumId="3" ns2:restartNumberingAfterBreak="0">
+  <w:abstractNum w:abstractNumId="3">
     <w:nsid w:val="03812403"/>
     <w:multiLevelType w:val="multilevel"/>
     <w:tmpl w:val="66C2B83E"/>
@@ -44874,7 +44874,7 @@
       </w:rPr>
     </w:lvl>
   </w:abstractNum>
-  <w:abstractNum w:abstractNumId="4" ns2:restartNumberingAfterBreak="0">
+  <w:abstractNum w:abstractNumId="4">
     <w:nsid w:val="04124BE8"/>
     <w:multiLevelType w:val="hybridMultilevel"/>
     <w:tmpl w:val="C9A42728"/>
@@ -44964,7 +44964,7 @@
       </w:pPr>
     </w:lvl>
   </w:abstractNum>
-  <w:abstractNum w:abstractNumId="5" ns2:restartNumberingAfterBreak="0">
+  <w:abstractNum w:abstractNumId="5">
     <w:nsid w:val="05455B98"/>
     <w:multiLevelType w:val="multilevel"/>
     <w:tmpl w:val="3B267632"/>
@@ -45077,7 +45077,7 @@
       </w:rPr>
     </w:lvl>
   </w:abstractNum>
-  <w:abstractNum w:abstractNumId="6" ns2:restartNumberingAfterBreak="0">
+  <w:abstractNum w:abstractNumId="6">
     <w:nsid w:val="08E72F86"/>
     <w:multiLevelType w:val="hybridMultilevel"/>
     <w:tmpl w:val="EDFC6558"/>
@@ -45280,7 +45280,7 @@
       </w:rPr>
     </w:lvl>
   </w:abstractNum>
-  <w:abstractNum w:abstractNumId="7" ns2:restartNumberingAfterBreak="0">
+  <w:abstractNum w:abstractNumId="7">
     <w:nsid w:val="0B836373"/>
     <w:multiLevelType w:val="hybridMultilevel"/>
     <w:tmpl w:val="FD1E2840"/>
@@ -45366,7 +45366,7 @@
       </w:pPr>
     </w:lvl>
   </w:abstractNum>
-  <w:abstractNum w:abstractNumId="8" ns2:restartNumberingAfterBreak="0">
+  <w:abstractNum w:abstractNumId="8">
     <w:nsid w:val="0C5670C3"/>
     <w:multiLevelType w:val="hybridMultilevel"/>
     <w:tmpl w:val="62C226F2"/>
@@ -45481,7 +45481,7 @@
       </w:rPr>
     </w:lvl>
   </w:abstractNum>
-  <w:abstractNum w:abstractNumId="9" ns2:restartNumberingAfterBreak="0">
+  <w:abstractNum w:abstractNumId="9">
     <w:nsid w:val="0EC376AB"/>
     <w:multiLevelType w:val="hybridMultilevel"/>
     <w:tmpl w:val="E2C2E758"/>
@@ -45593,7 +45593,7 @@
       </w:rPr>
     </w:lvl>
   </w:abstractNum>
-  <w:abstractNum w:abstractNumId="10" ns2:restartNumberingAfterBreak="0">
+  <w:abstractNum w:abstractNumId="10">
     <w:nsid w:val="134160E4"/>
     <w:multiLevelType w:val="hybridMultilevel"/>
     <w:tmpl w:val="A6B4CA44"/>
@@ -45796,7 +45796,7 @@
       </w:rPr>
     </w:lvl>
   </w:abstractNum>
-  <w:abstractNum w:abstractNumId="11" ns2:restartNumberingAfterBreak="0">
+  <w:abstractNum w:abstractNumId="11">
     <w:nsid w:val="1447122C"/>
     <w:multiLevelType w:val="hybridMultilevel"/>
     <w:tmpl w:val="8ADC8DBE"/>
@@ -45908,7 +45908,7 @@
       </w:rPr>
     </w:lvl>
   </w:abstractNum>
-  <w:abstractNum w:abstractNumId="12" ns2:restartNumberingAfterBreak="0">
+  <w:abstractNum w:abstractNumId="12">
     <w:nsid w:val="16E33E19"/>
     <w:multiLevelType w:val="hybridMultilevel"/>
     <w:tmpl w:val="E836F0CC"/>
@@ -46020,7 +46020,7 @@
       </w:rPr>
     </w:lvl>
   </w:abstractNum>
-  <w:abstractNum w:abstractNumId="13" ns2:restartNumberingAfterBreak="0">
+  <w:abstractNum w:abstractNumId="13">
     <w:nsid w:val="17746F25"/>
     <w:multiLevelType w:val="hybridMultilevel"/>
     <w:tmpl w:val="ACD6031E"/>
@@ -46133,7 +46133,7 @@
       </w:rPr>
     </w:lvl>
   </w:abstractNum>
-  <w:abstractNum w:abstractNumId="14" ns2:restartNumberingAfterBreak="0">
+  <w:abstractNum w:abstractNumId="14">
     <w:nsid w:val="18ED7595"/>
     <w:multiLevelType w:val="hybridMultilevel"/>
     <w:tmpl w:val="07A6BCB6"/>
@@ -46222,7 +46222,7 @@
       </w:pPr>
     </w:lvl>
   </w:abstractNum>
-  <w:abstractNum w:abstractNumId="15" ns2:restartNumberingAfterBreak="0">
+  <w:abstractNum w:abstractNumId="15">
     <w:nsid w:val="18FA68EC"/>
     <w:multiLevelType w:val="hybridMultilevel"/>
     <w:tmpl w:val="22B4966A"/>
@@ -46311,7 +46311,7 @@
       </w:pPr>
     </w:lvl>
   </w:abstractNum>
-  <w:abstractNum w:abstractNumId="16" ns2:restartNumberingAfterBreak="0">
+  <w:abstractNum w:abstractNumId="16">
     <w:nsid w:val="1A68477C"/>
     <w:multiLevelType w:val="hybridMultilevel"/>
     <w:tmpl w:val="4FFCF5D2"/>
@@ -46424,7 +46424,7 @@
       </w:rPr>
     </w:lvl>
   </w:abstractNum>
-  <w:abstractNum w:abstractNumId="17" ns2:restartNumberingAfterBreak="0">
+  <w:abstractNum w:abstractNumId="17">
     <w:nsid w:val="1CA3602E"/>
     <w:multiLevelType w:val="hybridMultilevel"/>
     <w:tmpl w:val="1BCE28CC"/>
@@ -46510,7 +46510,7 @@
       </w:pPr>
     </w:lvl>
   </w:abstractNum>
-  <w:abstractNum w:abstractNumId="18" ns2:restartNumberingAfterBreak="0">
+  <w:abstractNum w:abstractNumId="18">
     <w:nsid w:val="2B3F39F6"/>
     <w:multiLevelType w:val="hybridMultilevel"/>
     <w:tmpl w:val="A748EF28"/>
@@ -46596,7 +46596,7 @@
       </w:pPr>
     </w:lvl>
   </w:abstractNum>
-  <w:abstractNum w:abstractNumId="19" ns2:restartNumberingAfterBreak="0">
+  <w:abstractNum w:abstractNumId="19">
     <w:nsid w:val="2E885427"/>
     <w:multiLevelType w:val="multilevel"/>
     <w:tmpl w:val="65303F58"/>
@@ -46745,7 +46745,7 @@
       </w:rPr>
     </w:lvl>
   </w:abstractNum>
-  <w:abstractNum w:abstractNumId="20" ns2:restartNumberingAfterBreak="0">
+  <w:abstractNum w:abstractNumId="20">
     <w:nsid w:val="30EC0F8F"/>
     <w:multiLevelType w:val="multilevel"/>
     <w:tmpl w:val="083EB6B6"/>
@@ -46858,7 +46858,7 @@
       </w:rPr>
     </w:lvl>
   </w:abstractNum>
-  <w:abstractNum w:abstractNumId="21" ns2:restartNumberingAfterBreak="0">
+  <w:abstractNum w:abstractNumId="21">
     <w:nsid w:val="3287121E"/>
     <w:multiLevelType w:val="hybridMultilevel"/>
     <w:tmpl w:val="C07C0086"/>
@@ -46947,7 +46947,7 @@
       </w:pPr>
     </w:lvl>
   </w:abstractNum>
-  <w:abstractNum w:abstractNumId="22" ns2:restartNumberingAfterBreak="0">
+  <w:abstractNum w:abstractNumId="22">
     <w:nsid w:val="36632847"/>
     <w:multiLevelType w:val="hybridMultilevel"/>
     <w:tmpl w:val="C29EC650"/>
@@ -47060,7 +47060,7 @@
       </w:rPr>
     </w:lvl>
   </w:abstractNum>
-  <w:abstractNum w:abstractNumId="23" ns2:restartNumberingAfterBreak="0">
+  <w:abstractNum w:abstractNumId="23">
     <w:nsid w:val="37F02BB9"/>
     <w:multiLevelType w:val="hybridMultilevel"/>
     <w:tmpl w:val="55147314"/>
@@ -47146,7 +47146,7 @@
       </w:pPr>
     </w:lvl>
   </w:abstractNum>
-  <w:abstractNum w:abstractNumId="24" ns2:restartNumberingAfterBreak="0">
+  <w:abstractNum w:abstractNumId="24">
     <w:nsid w:val="3922027A"/>
     <w:multiLevelType w:val="hybridMultilevel"/>
     <w:tmpl w:val="86DE9C54"/>
@@ -47261,7 +47261,7 @@
       </w:rPr>
     </w:lvl>
   </w:abstractNum>
-  <w:abstractNum w:abstractNumId="25" ns2:restartNumberingAfterBreak="0">
+  <w:abstractNum w:abstractNumId="25">
     <w:nsid w:val="3DEF3A4B"/>
     <w:multiLevelType w:val="hybridMultilevel"/>
     <w:tmpl w:val="002270EA"/>
@@ -47376,7 +47376,7 @@
       </w:rPr>
     </w:lvl>
   </w:abstractNum>
-  <w:abstractNum w:abstractNumId="26" ns2:restartNumberingAfterBreak="0">
+  <w:abstractNum w:abstractNumId="26">
     <w:nsid w:val="4019430B"/>
     <w:multiLevelType w:val="hybridMultilevel"/>
     <w:tmpl w:val="8D407812"/>
@@ -47489,7 +47489,7 @@
       </w:rPr>
     </w:lvl>
   </w:abstractNum>
-  <w:abstractNum w:abstractNumId="27" ns2:restartNumberingAfterBreak="0">
+  <w:abstractNum w:abstractNumId="27">
     <w:nsid w:val="44DE28F9"/>
     <w:multiLevelType w:val="hybridMultilevel"/>
     <w:tmpl w:val="9FBECB1C"/>
@@ -47575,7 +47575,7 @@
       </w:pPr>
     </w:lvl>
   </w:abstractNum>
-  <w:abstractNum w:abstractNumId="28" ns2:restartNumberingAfterBreak="0">
+  <w:abstractNum w:abstractNumId="28">
     <w:nsid w:val="45230589"/>
     <w:multiLevelType w:val="hybridMultilevel"/>
     <w:tmpl w:val="7B52924E"/>
@@ -47661,7 +47661,7 @@
       </w:pPr>
     </w:lvl>
   </w:abstractNum>
-  <w:abstractNum w:abstractNumId="29" ns2:restartNumberingAfterBreak="0">
+  <w:abstractNum w:abstractNumId="29">
     <w:nsid w:val="45300FA7"/>
     <w:multiLevelType w:val="hybridMultilevel"/>
     <w:tmpl w:val="5C963A60"/>
@@ -47774,7 +47774,7 @@
       </w:rPr>
     </w:lvl>
   </w:abstractNum>
-  <w:abstractNum w:abstractNumId="30" ns2:restartNumberingAfterBreak="0">
+  <w:abstractNum w:abstractNumId="30">
     <w:nsid w:val="47071ED2"/>
     <w:multiLevelType w:val="hybridMultilevel"/>
     <w:tmpl w:val="088A0220"/>
@@ -47864,7 +47864,7 @@
       </w:pPr>
     </w:lvl>
   </w:abstractNum>
-  <w:abstractNum w:abstractNumId="31" ns2:restartNumberingAfterBreak="0">
+  <w:abstractNum w:abstractNumId="31">
     <w:nsid w:val="474E3477"/>
     <w:multiLevelType w:val="hybridMultilevel"/>
     <w:tmpl w:val="D5AA9BA8"/>
@@ -47979,7 +47979,7 @@
       </w:rPr>
     </w:lvl>
   </w:abstractNum>
-  <w:abstractNum w:abstractNumId="32" ns2:restartNumberingAfterBreak="0">
+  <w:abstractNum w:abstractNumId="32">
     <w:nsid w:val="4BBE7310"/>
     <w:multiLevelType w:val="hybridMultilevel"/>
     <w:tmpl w:val="17544138"/>
@@ -48065,7 +48065,7 @@
       </w:pPr>
     </w:lvl>
   </w:abstractNum>
-  <w:abstractNum w:abstractNumId="33" ns2:restartNumberingAfterBreak="0">
+  <w:abstractNum w:abstractNumId="33">
     <w:nsid w:val="4BF25962"/>
     <w:multiLevelType w:val="hybridMultilevel"/>
     <w:tmpl w:val="7CEA9ED6"/>
@@ -48178,7 +48178,7 @@
       </w:rPr>
     </w:lvl>
   </w:abstractNum>
-  <w:abstractNum w:abstractNumId="34" ns2:restartNumberingAfterBreak="0">
+  <w:abstractNum w:abstractNumId="34">
     <w:nsid w:val="4C756295"/>
     <w:multiLevelType w:val="hybridMultilevel"/>
     <w:tmpl w:val="59207EB0"/>
@@ -48293,7 +48293,7 @@
       </w:rPr>
     </w:lvl>
   </w:abstractNum>
-  <w:abstractNum w:abstractNumId="35" ns2:restartNumberingAfterBreak="0">
+  <w:abstractNum w:abstractNumId="35">
     <w:nsid w:val="4D6F5006"/>
     <w:multiLevelType w:val="hybridMultilevel"/>
     <w:tmpl w:val="CAF4A00E"/>
@@ -48382,7 +48382,7 @@
       </w:pPr>
     </w:lvl>
   </w:abstractNum>
-  <w:abstractNum w:abstractNumId="36" ns2:restartNumberingAfterBreak="0">
+  <w:abstractNum w:abstractNumId="36">
     <w:nsid w:val="4FB774DA"/>
     <w:multiLevelType w:val="hybridMultilevel"/>
     <w:tmpl w:val="E3049A0C"/>
@@ -48495,7 +48495,7 @@
       </w:rPr>
     </w:lvl>
   </w:abstractNum>
-  <w:abstractNum w:abstractNumId="37" ns2:restartNumberingAfterBreak="0">
+  <w:abstractNum w:abstractNumId="37">
     <w:nsid w:val="50453A38"/>
     <w:multiLevelType w:val="hybridMultilevel"/>
     <w:tmpl w:val="7CDEDC62"/>
@@ -48584,7 +48584,7 @@
       </w:pPr>
     </w:lvl>
   </w:abstractNum>
-  <w:abstractNum w:abstractNumId="38" ns2:restartNumberingAfterBreak="0">
+  <w:abstractNum w:abstractNumId="38">
     <w:nsid w:val="524F5593"/>
     <w:multiLevelType w:val="hybridMultilevel"/>
     <w:tmpl w:val="3E96878A"/>
@@ -48694,7 +48694,7 @@
       </w:rPr>
     </w:lvl>
   </w:abstractNum>
-  <w:abstractNum w:abstractNumId="39" ns2:restartNumberingAfterBreak="0">
+  <w:abstractNum w:abstractNumId="39">
     <w:nsid w:val="5A8E371E"/>
     <w:multiLevelType w:val="hybridMultilevel"/>
     <w:tmpl w:val="879CD67E"/>
@@ -48807,7 +48807,7 @@
       </w:rPr>
     </w:lvl>
   </w:abstractNum>
-  <w:abstractNum w:abstractNumId="40" ns2:restartNumberingAfterBreak="0">
+  <w:abstractNum w:abstractNumId="40">
     <w:nsid w:val="5B8B3938"/>
     <w:multiLevelType w:val="hybridMultilevel"/>
     <w:tmpl w:val="D0AC0F1A"/>
@@ -48922,7 +48922,7 @@
       </w:rPr>
     </w:lvl>
   </w:abstractNum>
-  <w:abstractNum w:abstractNumId="41" ns2:restartNumberingAfterBreak="0">
+  <w:abstractNum w:abstractNumId="41">
     <w:nsid w:val="5BEA73AF"/>
     <w:multiLevelType w:val="hybridMultilevel"/>
     <w:tmpl w:val="A02EB57E"/>
@@ -49008,7 +49008,7 @@
       </w:pPr>
     </w:lvl>
   </w:abstractNum>
-  <w:abstractNum w:abstractNumId="42" ns2:restartNumberingAfterBreak="0">
+  <w:abstractNum w:abstractNumId="42">
     <w:nsid w:val="65326A50"/>
     <w:multiLevelType w:val="hybridMultilevel"/>
     <w:tmpl w:val="BC3AB3A8"/>
@@ -49123,7 +49123,7 @@
       </w:rPr>
     </w:lvl>
   </w:abstractNum>
-  <w:abstractNum w:abstractNumId="43" ns2:restartNumberingAfterBreak="0">
+  <w:abstractNum w:abstractNumId="43">
     <w:nsid w:val="67532D19"/>
     <w:multiLevelType w:val="hybridMultilevel"/>
     <w:tmpl w:val="8F88EC1C"/>
@@ -49209,7 +49209,7 @@
       </w:pPr>
     </w:lvl>
   </w:abstractNum>
-  <w:abstractNum w:abstractNumId="44" ns2:restartNumberingAfterBreak="0">
+  <w:abstractNum w:abstractNumId="44">
     <w:nsid w:val="6A727646"/>
     <w:multiLevelType w:val="hybridMultilevel"/>
     <w:tmpl w:val="BB0664FA"/>
@@ -49298,7 +49298,7 @@
       </w:pPr>
     </w:lvl>
   </w:abstractNum>
-  <w:abstractNum w:abstractNumId="45" ns2:restartNumberingAfterBreak="0">
+  <w:abstractNum w:abstractNumId="45">
     <w:nsid w:val="6BA55E8E"/>
     <w:multiLevelType w:val="hybridMultilevel"/>
     <w:tmpl w:val="CB4A709A"/>
@@ -49387,7 +49387,7 @@
       </w:pPr>
     </w:lvl>
   </w:abstractNum>
-  <w:abstractNum w:abstractNumId="46" ns2:restartNumberingAfterBreak="0">
+  <w:abstractNum w:abstractNumId="46">
     <w:nsid w:val="6E1C7575"/>
     <w:multiLevelType w:val="multilevel"/>
     <w:tmpl w:val="D3701526"/>
@@ -49536,7 +49536,7 @@
       </w:rPr>
     </w:lvl>
   </w:abstractNum>
-  <w:abstractNum w:abstractNumId="47" ns2:restartNumberingAfterBreak="0">
+  <w:abstractNum w:abstractNumId="47">
     <w:nsid w:val="7127350E"/>
     <w:multiLevelType w:val="hybridMultilevel"/>
     <w:tmpl w:val="0F5A6652"/>
@@ -49622,7 +49622,7 @@
       </w:pPr>
     </w:lvl>
   </w:abstractNum>
-  <w:abstractNum w:abstractNumId="48" ns2:restartNumberingAfterBreak="0">
+  <w:abstractNum w:abstractNumId="48">
     <w:nsid w:val="71AE69B5"/>
     <w:multiLevelType w:val="hybridMultilevel"/>
     <w:tmpl w:val="C3DC4594"/>
@@ -49711,7 +49711,7 @@
       </w:pPr>
     </w:lvl>
   </w:abstractNum>
-  <w:abstractNum w:abstractNumId="49" ns2:restartNumberingAfterBreak="0">
+  <w:abstractNum w:abstractNumId="49">
     <w:nsid w:val="73FB35BF"/>
     <w:multiLevelType w:val="multilevel"/>
     <w:tmpl w:val="2D543368"/>
@@ -49860,7 +49860,7 @@
       </w:rPr>
     </w:lvl>
   </w:abstractNum>
-  <w:abstractNum w:abstractNumId="50" ns2:restartNumberingAfterBreak="0">
+  <w:abstractNum w:abstractNumId="50">
     <w:nsid w:val="75366E1B"/>
     <w:multiLevelType w:val="hybridMultilevel"/>
     <w:tmpl w:val="60204386"/>
@@ -49973,7 +49973,7 @@
       </w:rPr>
     </w:lvl>
   </w:abstractNum>
-  <w:abstractNum w:abstractNumId="51" ns2:restartNumberingAfterBreak="0">
+  <w:abstractNum w:abstractNumId="51">
     <w:nsid w:val="770F3AFF"/>
     <w:multiLevelType w:val="hybridMultilevel"/>
     <w:tmpl w:val="0AACD00E"/>
@@ -50086,7 +50086,7 @@
       </w:rPr>
     </w:lvl>
   </w:abstractNum>
-  <w:abstractNum w:abstractNumId="52" ns2:restartNumberingAfterBreak="0">
+  <w:abstractNum w:abstractNumId="52">
     <w:nsid w:val="7CE82879"/>
     <w:multiLevelType w:val="hybridMultilevel"/>
     <w:tmpl w:val="D758FDA4"/>
@@ -50172,7 +50172,7 @@
       </w:pPr>
     </w:lvl>
   </w:abstractNum>
-  <w:abstractNum w:abstractNumId="53" ns2:restartNumberingAfterBreak="0">
+  <w:abstractNum w:abstractNumId="53">
     <w:nsid w:val="7D697292"/>
     <w:multiLevelType w:val="multilevel"/>
     <w:tmpl w:val="1E226AD0"/>
@@ -50321,7 +50321,7 @@
       </w:rPr>
     </w:lvl>
   </w:abstractNum>
-  <w:abstractNum w:abstractNumId="54" ns2:restartNumberingAfterBreak="0">
+  <w:abstractNum w:abstractNumId="54">
     <w:nsid w:val="7E5D0E03"/>
     <w:multiLevelType w:val="multilevel"/>
     <w:tmpl w:val="5880B78C"/>
@@ -50470,7 +50470,7 @@
       </w:rPr>
     </w:lvl>
   </w:abstractNum>
-  <w:abstractNum w:abstractNumId="55" ns2:restartNumberingAfterBreak="0">
+  <w:abstractNum w:abstractNumId="55">
     <w:nsid w:val="7F813D73"/>
     <w:multiLevelType w:val="hybridMultilevel"/>
     <w:tmpl w:val="689479BE"/>
@@ -50583,7 +50583,7 @@
       </w:rPr>
     </w:lvl>
   </w:abstractNum>
-  <w:abstractNum w:abstractNumId="56" ns2:restartNumberingAfterBreak="0">
+  <w:abstractNum w:abstractNumId="56">
     <w:nsid w:val="7FCD2D3F"/>
     <w:multiLevelType w:val="multilevel"/>
     <w:tmpl w:val="88C21362"/>
@@ -50728,7 +50728,7 @@
       </w:rPr>
     </w:lvl>
   </w:abstractNum>
-  <w:abstractNum w:abstractNumId="57" ns2:restartNumberingAfterBreak="0">
+  <w:abstractNum w:abstractNumId="57">
     <w:nsid w:val="7FDB5BD9"/>
     <w:multiLevelType w:val="hybridMultilevel"/>
     <w:tmpl w:val="AA0C1A4E"/>

</xml_diff>

<commit_message>
Repair Word package namespace declarations
</commit_message>
<xml_diff>
--- a/doc.docx
+++ b/doc.docx
@@ -1,6 +1,6 @@
 
 <file path=word/document.xml><?xml version="1.0" encoding="utf-8"?>
-<w:document xmlns:a="http://schemas.openxmlformats.org/drawingml/2006/main" xmlns:mc="http://schemas.openxmlformats.org/markup-compatibility/2006" xmlns:ns11="urn:schemas-microsoft-com:vml" xmlns:ns12="urn:schemas-microsoft-com:office:office" xmlns:ns13="urn:schemas-microsoft-com:office:word" xmlns:ns2="http://schemas.microsoft.com/office/word/2010/wordml" xmlns:ns4="http://schemas.microsoft.com/office/word/2010/wordprocessingDrawing" xmlns:ns6="http://schemas.microsoft.com/office/word/2010/wordprocessingGroup" xmlns:ns7="http://schemas.microsoft.com/office/word/2010/wordprocessingShape" xmlns:ns8="http://schemas.microsoft.com/office/drawing/2010/main" xmlns:pic="http://schemas.openxmlformats.org/drawingml/2006/picture" xmlns:r="http://schemas.openxmlformats.org/officeDocument/2006/relationships" xmlns:w="http://schemas.openxmlformats.org/wordprocessingml/2006/main" xmlns:wp="http://schemas.openxmlformats.org/drawingml/2006/wordprocessingDrawing" mc:Ignorable="w14 w15 w16se wp14">
+<w:document xmlns:a="http://schemas.openxmlformats.org/drawingml/2006/main" xmlns:mc="http://schemas.openxmlformats.org/markup-compatibility/2006" xmlns:ns11="urn:schemas-microsoft-com:vml" xmlns:ns12="urn:schemas-microsoft-com:office:office" xmlns:ns13="urn:schemas-microsoft-com:office:word" xmlns:ns2="http://schemas.microsoft.com/office/word/2010/wordml" xmlns:ns4="http://schemas.microsoft.com/office/word/2010/wordprocessingDrawing" xmlns:ns6="http://schemas.microsoft.com/office/word/2010/wordprocessingGroup" xmlns:ns7="http://schemas.microsoft.com/office/word/2010/wordprocessingShape" xmlns:ns8="http://schemas.microsoft.com/office/drawing/2010/main" xmlns:pic="http://schemas.openxmlformats.org/drawingml/2006/picture" xmlns:r="http://schemas.openxmlformats.org/officeDocument/2006/relationships" xmlns:w="http://schemas.openxmlformats.org/wordprocessingml/2006/main" xmlns:wp="http://schemas.openxmlformats.org/drawingml/2006/wordprocessingDrawing" xmlns:w14="http://schemas.microsoft.com/office/word/2010/wordml" xmlns:w15="http://schemas.microsoft.com/office/word/2012/wordml" xmlns:w16se="http://schemas.microsoft.com/office/word/2015/wordml/symex" xmlns:wp14="http://schemas.microsoft.com/office/word/2010/wordprocessingDrawing" xmlns:wpg="http://schemas.microsoft.com/office/word/2010/wordprocessingGroup" xmlns:wps="http://schemas.microsoft.com/office/word/2010/wordprocessingShape" mc:Ignorable="w14 w15 w16se wp14">
   <w:body>
     <w:p ns2:paraId="7AB3675A" ns2:textId="77777777">
       <w:pPr>
@@ -44462,7 +44462,7 @@
 </file>
 
 <file path=word/footer1.xml><?xml version="1.0" encoding="utf-8"?>
-<w:ftr xmlns:ns1="http://schemas.openxmlformats.org/markup-compatibility/2006" xmlns:ns2="http://schemas.microsoft.com/office/word/2010/wordml" xmlns:w="http://schemas.openxmlformats.org/wordprocessingml/2006/main" ns1:Ignorable="w14 w15 w16se wp14">
+<w:ftr xmlns:ns1="http://schemas.openxmlformats.org/markup-compatibility/2006" xmlns:ns2="http://schemas.microsoft.com/office/word/2010/wordml" xmlns:w="http://schemas.openxmlformats.org/wordprocessingml/2006/main" xmlns:w14="http://schemas.microsoft.com/office/word/2010/wordml" xmlns:w15="http://schemas.microsoft.com/office/word/2012/wordml" xmlns:w16se="http://schemas.microsoft.com/office/word/2015/wordml/symex" xmlns:wp14="http://schemas.microsoft.com/office/word/2010/wordprocessingDrawing" ns1:Ignorable="w14 w15 w16se wp14">
   <w:p ns2:paraId="70947CFD" ns2:textId="36358DFB">
     <w:pPr>
       <w:pStyle w:val="Pieddepage"/>
@@ -44602,7 +44602,7 @@
 </file>
 
 <file path=word/header1.xml><?xml version="1.0" encoding="utf-8"?>
-<w:hdr xmlns:ns1="http://schemas.openxmlformats.org/markup-compatibility/2006" xmlns:ns2="http://schemas.microsoft.com/office/word/2010/wordml" xmlns:w="http://schemas.openxmlformats.org/wordprocessingml/2006/main" ns1:Ignorable="w14 w15 w16se wp14">
+<w:hdr xmlns:ns1="http://schemas.openxmlformats.org/markup-compatibility/2006" xmlns:ns2="http://schemas.microsoft.com/office/word/2010/wordml" xmlns:w="http://schemas.openxmlformats.org/wordprocessingml/2006/main" xmlns:w14="http://schemas.microsoft.com/office/word/2010/wordml" xmlns:w15="http://schemas.microsoft.com/office/word/2012/wordml" xmlns:w16se="http://schemas.microsoft.com/office/word/2015/wordml/symex" xmlns:wp14="http://schemas.microsoft.com/office/word/2010/wordprocessingDrawing" ns1:Ignorable="w14 w15 w16se wp14">
   <w:p ns2:paraId="27779F2E" ns2:textId="064B6002">
     <w:pPr>
       <w:pStyle w:val="En-tte"/>
@@ -51183,7 +51183,7 @@
 </file>
 
 <file path=word/styles.xml><?xml version="1.0" encoding="utf-8"?>
-<w:styles xmlns:ns1="http://schemas.openxmlformats.org/markup-compatibility/2006" xmlns:ns2="http://schemas.microsoft.com/office/word/2010/wordml" xmlns:w="http://schemas.openxmlformats.org/wordprocessingml/2006/main" ns1:Ignorable="w14 w15 w16se">
+<w:styles xmlns:ns1="http://schemas.openxmlformats.org/markup-compatibility/2006" xmlns:ns2="http://schemas.microsoft.com/office/word/2010/wordml" xmlns:w="http://schemas.openxmlformats.org/wordprocessingml/2006/main" xmlns:w14="http://schemas.microsoft.com/office/word/2010/wordml" xmlns:w15="http://schemas.microsoft.com/office/word/2012/wordml" xmlns:w16se="http://schemas.microsoft.com/office/word/2015/wordml/symex" ns1:Ignorable="w14 w15 w16se">
   <w:docDefaults>
     <w:rPrDefault>
       <w:rPr>

</xml_diff>